<commit_message>
Sync - 2026-08-13 15:57
</commit_message>
<xml_diff>
--- a/files/Daily_Helicopter_Schedule.docx
+++ b/files/Daily_Helicopter_Schedule.docx
@@ -540,7 +540,7 @@
               <w:rPr>
                 <w:rFonts w:cstheme="minorHAnsi"/>
               </w:rPr>
-              <w:t>GVHL169</w:t>
+              <w:t>GVHL 412</w:t>
             </w:r>
           </w:p>
         </w:tc>
@@ -567,7 +567,7 @@
                 <w:rFonts w:cstheme="minorHAnsi"/>
                 <w:lang w:val="en-IN"/>
               </w:rPr>
-              <w:t>RRL</w:t>
+              <w:t>RRF</w:t>
             </w:r>
           </w:p>
         </w:tc>
@@ -1127,7 +1127,7 @@
               <w:rPr>
                 <w:rFonts w:cstheme="minorHAnsi"/>
               </w:rPr>
-              <w:t>11:00</w:t>
+              <w:t>10:30</w:t>
             </w:r>
           </w:p>
         </w:tc>
@@ -1186,22 +1186,49 @@
             <w:r>
               <w:rPr>
                 <w:rFonts w:cstheme="minorHAnsi"/>
+              </w:rPr>
+              <w:t>HELIGO 145</w:t>
+            </w:r>
+          </w:p>
+        </w:tc>
+        <w:tc>
+          <w:tcPr>
+            <w:tcW w:w="908" w:type="dxa"/>
+            <w:tcBorders>
+              <w:top w:val="single" w:sz="4" w:space="0" w:color="auto"/>
+              <w:left w:val="single" w:sz="4" w:space="0" w:color="auto"/>
+              <w:bottom w:val="single" w:sz="4" w:space="0" w:color="auto"/>
+              <w:right w:val="single" w:sz="4" w:space="0" w:color="auto"/>
+            </w:tcBorders>
+            <w:shd w:val="clear" w:color="auto" w:fill="auto"/>
+          </w:tcPr>
+          <w:p>
+            <w:pPr>
+              <w:jc w:val="center"/>
+              <w:rPr>
+                <w:rFonts w:cstheme="minorHAnsi"/>
+                <w:lang w:val="en-IN"/>
+              </w:rPr>
+            </w:pPr>
+            <w:r>
+              <w:rPr>
+                <w:rFonts w:cstheme="minorHAnsi"/>
                 <w:b/>
               </w:rPr>
-              <w:t>NA</w:t>
-            </w:r>
-          </w:p>
-        </w:tc>
-        <w:tc>
-          <w:tcPr>
-            <w:tcW w:w="908" w:type="dxa"/>
-            <w:tcBorders>
-              <w:top w:val="single" w:sz="4" w:space="0" w:color="auto"/>
-              <w:left w:val="single" w:sz="4" w:space="0" w:color="auto"/>
-              <w:bottom w:val="single" w:sz="4" w:space="0" w:color="auto"/>
-              <w:right w:val="single" w:sz="4" w:space="0" w:color="auto"/>
-            </w:tcBorders>
-            <w:shd w:val="clear" w:color="auto" w:fill="auto"/>
+              <w:t>HLY</w:t>
+            </w:r>
+          </w:p>
+        </w:tc>
+        <w:tc>
+          <w:tcPr>
+            <w:tcW w:w="1363" w:type="dxa"/>
+            <w:tcBorders>
+              <w:top w:val="single" w:sz="4" w:space="0" w:color="auto"/>
+              <w:left w:val="single" w:sz="4" w:space="0" w:color="auto"/>
+              <w:bottom w:val="single" w:sz="4" w:space="0" w:color="auto"/>
+              <w:right w:val="single" w:sz="4" w:space="0" w:color="auto"/>
+            </w:tcBorders>
+            <w:noWrap/>
           </w:tcPr>
           <w:p>
             <w:pPr>
@@ -1214,37 +1241,9 @@
             <w:r>
               <w:rPr>
                 <w:rFonts w:cstheme="minorHAnsi"/>
-                <w:b/>
-              </w:rPr>
-              <w:t>NA</w:t>
-            </w:r>
-          </w:p>
-        </w:tc>
-        <w:tc>
-          <w:tcPr>
-            <w:tcW w:w="1363" w:type="dxa"/>
-            <w:tcBorders>
-              <w:top w:val="single" w:sz="4" w:space="0" w:color="auto"/>
-              <w:left w:val="single" w:sz="4" w:space="0" w:color="auto"/>
-              <w:bottom w:val="single" w:sz="4" w:space="0" w:color="auto"/>
-              <w:right w:val="single" w:sz="4" w:space="0" w:color="auto"/>
-            </w:tcBorders>
-            <w:noWrap/>
-          </w:tcPr>
-          <w:p>
-            <w:pPr>
-              <w:jc w:val="center"/>
-              <w:rPr>
-                <w:rFonts w:cstheme="minorHAnsi"/>
                 <w:lang w:val="en-IN"/>
               </w:rPr>
-            </w:pPr>
-            <w:r>
-              <w:rPr>
-                <w:rFonts w:cstheme="minorHAnsi"/>
-                <w:lang w:val="en-IN"/>
-              </w:rPr>
-              <w:t>06</w:t>
+              <w:t>07</w:t>
             </w:r>
           </w:p>
         </w:tc>
@@ -1397,13 +1396,15 @@
               <w:jc w:val="center"/>
               <w:rPr>
                 <w:rFonts w:cstheme="minorHAnsi"/>
-              </w:rPr>
-            </w:pPr>
-            <w:r>
-              <w:rPr>
-                <w:rFonts w:cstheme="minorHAnsi"/>
-              </w:rPr>
-              <w:t>HELIGO 145</w:t>
+                <w:b/>
+              </w:rPr>
+            </w:pPr>
+            <w:r>
+              <w:rPr>
+                <w:rFonts w:cstheme="minorHAnsi"/>
+                <w:b/>
+              </w:rPr>
+              <w:t>NA</w:t>
             </w:r>
           </w:p>
         </w:tc>
@@ -1423,15 +1424,17 @@
               <w:jc w:val="center"/>
               <w:rPr>
                 <w:rFonts w:cstheme="minorHAnsi"/>
+                <w:b/>
                 <w:lang w:val="en-IN"/>
               </w:rPr>
             </w:pPr>
             <w:r>
               <w:rPr>
                 <w:rFonts w:cstheme="minorHAnsi"/>
+                <w:b/>
                 <w:lang w:val="en-IN"/>
               </w:rPr>
-              <w:t>HLW</w:t>
+              <w:t>NA</w:t>
             </w:r>
           </w:p>
         </w:tc>
@@ -1459,7 +1462,7 @@
                 <w:rFonts w:cstheme="minorHAnsi"/>
                 <w:lang w:val="en-IN"/>
               </w:rPr>
-              <w:t>07</w:t>
+              <w:t>00</w:t>
             </w:r>
           </w:p>
         </w:tc>
@@ -2446,7 +2449,7 @@
               <w:jc w:val="center"/>
             </w:pPr>
             <w:r>
-              <w:t>SCHAL</w:t>
+              <w:t>B193</w:t>
             </w:r>
           </w:p>
         </w:tc>
@@ -2622,7 +2625,7 @@
               <w:jc w:val="center"/>
             </w:pPr>
             <w:r>
-              <w:t>MNW</w:t>
+              <w:t>B193</w:t>
             </w:r>
           </w:p>
         </w:tc>
@@ -3200,7 +3203,7 @@
               <w:rPr>
                 <w:rFonts w:cstheme="minorHAnsi"/>
               </w:rPr>
-              <w:t>HERA</w:t>
+              <w:t>FD9</w:t>
             </w:r>
           </w:p>
         </w:tc>
@@ -3709,7 +3712,10 @@
               <w:jc w:val="center"/>
             </w:pPr>
             <w:r>
-              <w:t>HERA</w:t>
+              <w:rPr>
+                <w:rFonts w:cstheme="minorHAnsi"/>
+              </w:rPr>
+              <w:t>J SUP</w:t>
             </w:r>
           </w:p>
         </w:tc>
@@ -3881,13 +3887,15 @@
               <w:jc w:val="center"/>
               <w:rPr>
                 <w:rFonts w:cstheme="minorHAnsi"/>
-              </w:rPr>
-            </w:pPr>
-            <w:r>
-              <w:rPr>
-                <w:rFonts w:cstheme="minorHAnsi"/>
-              </w:rPr>
-              <w:t>SSAK L\O</w:t>
+                <w:b/>
+              </w:rPr>
+            </w:pPr>
+            <w:r>
+              <w:rPr>
+                <w:rFonts w:cstheme="minorHAnsi"/>
+                <w:b/>
+              </w:rPr>
+              <w:t>NA</w:t>
             </w:r>
           </w:p>
         </w:tc>
@@ -4144,7 +4152,7 @@
               <w:rPr>
                 <w:rFonts w:cstheme="minorHAnsi"/>
               </w:rPr>
-              <w:t>SUDA</w:t>
+              <w:t>ICW</w:t>
             </w:r>
           </w:p>
         </w:tc>
@@ -4187,6 +4195,8 @@
                 <w:rFonts w:cstheme="minorHAnsi"/>
               </w:rPr>
             </w:pPr>
+            <w:bookmarkStart w:id="3" w:name="_GoBack"/>
+            <w:bookmarkEnd w:id="3"/>
           </w:p>
         </w:tc>
         <w:tc>
@@ -4327,7 +4337,13 @@
                 <w:rFonts w:cstheme="minorHAnsi"/>
                 <w:lang w:val="en-US"/>
               </w:rPr>
-              <w:t>SHQ</w:t>
+              <w:t>SLQ</w:t>
+            </w:r>
+            <w:r>
+              <w:rPr>
+                <w:rFonts w:cstheme="minorHAnsi"/>
+              </w:rPr>
+              <w:t xml:space="preserve"> </w:t>
             </w:r>
           </w:p>
         </w:tc>
@@ -4520,7 +4536,7 @@
               <w:rPr>
                 <w:rFonts w:cstheme="minorHAnsi"/>
               </w:rPr>
-              <w:t>ICP</w:t>
+              <w:t>SHQ</w:t>
             </w:r>
           </w:p>
         </w:tc>
@@ -4710,10 +4726,7 @@
               </w:rPr>
             </w:pPr>
             <w:r>
-              <w:rPr>
-                <w:rFonts w:cstheme="minorHAnsi"/>
-              </w:rPr>
-              <w:t>AD10</w:t>
+              <w:t>GAURAV</w:t>
             </w:r>
           </w:p>
         </w:tc>
@@ -4900,7 +4913,7 @@
               <w:rPr>
                 <w:rFonts w:cstheme="minorHAnsi"/>
               </w:rPr>
-              <w:t>WIN</w:t>
+              <w:t>MNW</w:t>
             </w:r>
           </w:p>
         </w:tc>
@@ -5075,7 +5088,7 @@
               <w:rPr>
                 <w:rFonts w:cstheme="minorHAnsi"/>
               </w:rPr>
-              <w:t>SF SPL</w:t>
+              <w:t>NQO</w:t>
             </w:r>
           </w:p>
         </w:tc>
@@ -5179,20 +5192,13 @@
                 <w:rFonts w:cstheme="minorHAnsi"/>
                 <w:b/>
               </w:rPr>
-              <w:t>WAITING</w:t>
-            </w:r>
-            <w:r>
-              <w:rPr>
-                <w:rFonts w:cstheme="minorHAnsi"/>
-                <w:b/>
-              </w:rPr>
-              <w:t>:</w:t>
-            </w:r>
-            <w:r>
-              <w:rPr>
-                <w:rFonts w:cstheme="minorHAnsi"/>
-              </w:rPr>
-              <w:t xml:space="preserve"> VND1, ADM9, FDIX, JTAN, AD11.</w:t>
+              <w:t>WAITING:</w:t>
+            </w:r>
+            <w:r>
+              <w:rPr>
+                <w:rFonts w:cstheme="minorHAnsi"/>
+              </w:rPr>
+              <w:t xml:space="preserve"> VND1, JTAN</w:t>
             </w:r>
           </w:p>
         </w:tc>
@@ -5264,8 +5270,6 @@
         </w:rPr>
         <w:t>TWO</w:t>
       </w:r>
-      <w:bookmarkStart w:id="3" w:name="_GoBack"/>
-      <w:bookmarkEnd w:id="3"/>
       <w:r>
         <w:rPr>
           <w:rFonts w:cstheme="minorHAnsi"/>
@@ -5880,6 +5884,14 @@
                 <w:szCs w:val="30"/>
               </w:rPr>
             </w:pPr>
+            <w:r>
+              <w:rPr>
+                <w:rFonts w:cstheme="minorHAnsi"/>
+                <w:sz w:val="30"/>
+                <w:szCs w:val="30"/>
+              </w:rPr>
+              <w:t>JYOTI</w:t>
+            </w:r>
           </w:p>
         </w:tc>
         <w:tc>
@@ -6076,6 +6088,14 @@
                 <w:szCs w:val="28"/>
               </w:rPr>
             </w:pPr>
+            <w:r>
+              <w:rPr>
+                <w:rFonts w:cstheme="minorHAnsi"/>
+                <w:sz w:val="28"/>
+                <w:szCs w:val="28"/>
+              </w:rPr>
+              <w:t>CET</w:t>
+            </w:r>
           </w:p>
         </w:tc>
         <w:tc>
@@ -6291,6 +6311,14 @@
                 <w:szCs w:val="30"/>
               </w:rPr>
             </w:pPr>
+            <w:r>
+              <w:rPr>
+                <w:rFonts w:cstheme="minorHAnsi"/>
+                <w:sz w:val="30"/>
+                <w:szCs w:val="30"/>
+              </w:rPr>
+              <w:t>L/O</w:t>
+            </w:r>
           </w:p>
         </w:tc>
         <w:tc>
@@ -6969,7 +6997,7 @@
           <w14:round/>
         </w14:textOutline>
       </w:rPr>
-      <w:t>13</w:t>
+      <w:t>14</w:t>
     </w:r>
     <w:r>
       <w:rPr>
@@ -7089,7 +7117,7 @@
           <w14:round/>
         </w14:textOutline>
       </w:rPr>
-      <w:t>(THURS</w:t>
+      <w:t>(FRI</w:t>
     </w:r>
     <w:r>
       <w:rPr>
@@ -8714,7 +8742,7 @@
 </file>
 
 <file path=customXml/itemProps1.xml><?xml version="1.0" encoding="utf-8"?>
-<ds:datastoreItem xmlns:ds="http://schemas.openxmlformats.org/officeDocument/2006/customXml" ds:itemID="{693AA48B-0B62-4060-9FE2-E8F884E98C58}">
+<ds:datastoreItem xmlns:ds="http://schemas.openxmlformats.org/officeDocument/2006/customXml" ds:itemID="{E06DF34B-0593-4EC3-B12B-1ED2C50333C5}">
   <ds:schemaRefs>
     <ds:schemaRef ds:uri="http://schemas.openxmlformats.org/officeDocument/2006/bibliography"/>
   </ds:schemaRefs>

</xml_diff>

<commit_message>
Sync - 2026-08-13 17:51
</commit_message>
<xml_diff>
--- a/files/Daily_Helicopter_Schedule.docx
+++ b/files/Daily_Helicopter_Schedule.docx
@@ -3203,7 +3203,7 @@
               <w:rPr>
                 <w:rFonts w:cstheme="minorHAnsi"/>
               </w:rPr>
-              <w:t>FD9</w:t>
+              <w:t>J SUP</w:t>
             </w:r>
           </w:p>
         </w:tc>
@@ -3715,8 +3715,10 @@
               <w:rPr>
                 <w:rFonts w:cstheme="minorHAnsi"/>
               </w:rPr>
-              <w:t>J SUP</w:t>
-            </w:r>
+              <w:t>PRABHA</w:t>
+            </w:r>
+            <w:bookmarkStart w:id="3" w:name="_GoBack"/>
+            <w:bookmarkEnd w:id="3"/>
           </w:p>
         </w:tc>
         <w:tc>
@@ -4195,8 +4197,6 @@
                 <w:rFonts w:cstheme="minorHAnsi"/>
               </w:rPr>
             </w:pPr>
-            <w:bookmarkStart w:id="3" w:name="_GoBack"/>
-            <w:bookmarkEnd w:id="3"/>
           </w:p>
         </w:tc>
         <w:tc>
@@ -8742,7 +8742,7 @@
 </file>
 
 <file path=customXml/itemProps1.xml><?xml version="1.0" encoding="utf-8"?>
-<ds:datastoreItem xmlns:ds="http://schemas.openxmlformats.org/officeDocument/2006/customXml" ds:itemID="{E06DF34B-0593-4EC3-B12B-1ED2C50333C5}">
+<ds:datastoreItem xmlns:ds="http://schemas.openxmlformats.org/officeDocument/2006/customXml" ds:itemID="{50D82287-4AF4-4470-BCB2-37EB8CB62679}">
   <ds:schemaRefs>
     <ds:schemaRef ds:uri="http://schemas.openxmlformats.org/officeDocument/2006/bibliography"/>
   </ds:schemaRefs>

</xml_diff>

<commit_message>
Sync - 2026-08-14 15:52
</commit_message>
<xml_diff>
--- a/files/Daily_Helicopter_Schedule.docx
+++ b/files/Daily_Helicopter_Schedule.docx
@@ -540,7 +540,13 @@
               <w:rPr>
                 <w:rFonts w:cstheme="minorHAnsi"/>
               </w:rPr>
-              <w:t>GVHL 412</w:t>
+              <w:t xml:space="preserve">GVHL </w:t>
+            </w:r>
+            <w:r>
+              <w:rPr>
+                <w:rFonts w:cstheme="minorHAnsi"/>
+              </w:rPr>
+              <w:t>169</w:t>
             </w:r>
           </w:p>
         </w:tc>
@@ -567,7 +573,14 @@
                 <w:rFonts w:cstheme="minorHAnsi"/>
                 <w:lang w:val="en-IN"/>
               </w:rPr>
-              <w:t>RRF</w:t>
+              <w:t>R</w:t>
+            </w:r>
+            <w:r>
+              <w:rPr>
+                <w:rFonts w:cstheme="minorHAnsi"/>
+                <w:lang w:val="en-IN"/>
+              </w:rPr>
+              <w:t>RL</w:t>
             </w:r>
           </w:p>
         </w:tc>
@@ -596,7 +609,7 @@
                 <w:rFonts w:cstheme="minorHAnsi"/>
                 <w:lang w:val="en-IN"/>
               </w:rPr>
-              <w:t>08</w:t>
+              <w:t>05</w:t>
             </w:r>
           </w:p>
         </w:tc>
@@ -796,7 +809,7 @@
                 <w:rFonts w:cstheme="minorHAnsi"/>
                 <w:lang w:val="en-IN"/>
               </w:rPr>
-              <w:t>08</w:t>
+              <w:t>05</w:t>
             </w:r>
           </w:p>
         </w:tc>
@@ -1127,7 +1140,7 @@
               <w:rPr>
                 <w:rFonts w:cstheme="minorHAnsi"/>
               </w:rPr>
-              <w:t>10:30</w:t>
+              <w:t>11:00</w:t>
             </w:r>
           </w:p>
         </w:tc>
@@ -1187,7 +1200,7 @@
               <w:rPr>
                 <w:rFonts w:cstheme="minorHAnsi"/>
               </w:rPr>
-              <w:t>HELIGO 145</w:t>
+              <w:t xml:space="preserve">NA </w:t>
             </w:r>
           </w:p>
         </w:tc>
@@ -1213,9 +1226,9 @@
             <w:r>
               <w:rPr>
                 <w:rFonts w:cstheme="minorHAnsi"/>
-                <w:b/>
-              </w:rPr>
-              <w:t>HLY</w:t>
+                <w:lang w:val="en-IN"/>
+              </w:rPr>
+              <w:t>NA</w:t>
             </w:r>
           </w:p>
         </w:tc>
@@ -1243,7 +1256,7 @@
                 <w:rFonts w:cstheme="minorHAnsi"/>
                 <w:lang w:val="en-IN"/>
               </w:rPr>
-              <w:t>07</w:t>
+              <w:t>00</w:t>
             </w:r>
           </w:p>
         </w:tc>
@@ -1338,7 +1351,13 @@
               <w:rPr>
                 <w:rFonts w:cstheme="minorHAnsi"/>
               </w:rPr>
-              <w:t>14:00</w:t>
+              <w:t>14</w:t>
+            </w:r>
+            <w:r>
+              <w:rPr>
+                <w:rFonts w:cstheme="minorHAnsi"/>
+              </w:rPr>
+              <w:t>:00</w:t>
             </w:r>
           </w:p>
         </w:tc>
@@ -1404,7 +1423,7 @@
                 <w:rFonts w:cstheme="minorHAnsi"/>
                 <w:b/>
               </w:rPr>
-              <w:t>NA</w:t>
+              <w:t>HELIGO 145</w:t>
             </w:r>
           </w:p>
         </w:tc>
@@ -1434,7 +1453,7 @@
                 <w:b/>
                 <w:lang w:val="en-IN"/>
               </w:rPr>
-              <w:t>NA</w:t>
+              <w:t>HLY</w:t>
             </w:r>
           </w:p>
         </w:tc>
@@ -1462,7 +1481,7 @@
                 <w:rFonts w:cstheme="minorHAnsi"/>
                 <w:lang w:val="en-IN"/>
               </w:rPr>
-              <w:t>00</w:t>
+              <w:t>07</w:t>
             </w:r>
           </w:p>
         </w:tc>
@@ -2449,7 +2468,10 @@
               <w:jc w:val="center"/>
             </w:pPr>
             <w:r>
-              <w:t>B193</w:t>
+              <w:t xml:space="preserve"> </w:t>
+            </w:r>
+            <w:r>
+              <w:t>NA</w:t>
             </w:r>
           </w:p>
         </w:tc>
@@ -2625,7 +2647,7 @@
               <w:jc w:val="center"/>
             </w:pPr>
             <w:r>
-              <w:t>B193</w:t>
+              <w:t xml:space="preserve"> NA</w:t>
             </w:r>
           </w:p>
         </w:tc>
@@ -3203,7 +3225,7 @@
               <w:rPr>
                 <w:rFonts w:cstheme="minorHAnsi"/>
               </w:rPr>
-              <w:t>J SUP</w:t>
+              <w:t>ARMADA2</w:t>
             </w:r>
           </w:p>
         </w:tc>
@@ -3540,15 +3562,13 @@
               <w:jc w:val="center"/>
               <w:rPr>
                 <w:rFonts w:cstheme="minorHAnsi"/>
-                <w:b/>
-              </w:rPr>
-            </w:pPr>
-            <w:r>
-              <w:rPr>
-                <w:rFonts w:cstheme="minorHAnsi"/>
-                <w:b/>
-              </w:rPr>
-              <w:t>NA</w:t>
+              </w:rPr>
+            </w:pPr>
+            <w:r>
+              <w:rPr>
+                <w:rFonts w:cstheme="minorHAnsi"/>
+              </w:rPr>
+              <w:t>DVDR/MNW</w:t>
             </w:r>
           </w:p>
         </w:tc>
@@ -3712,13 +3732,8 @@
               <w:jc w:val="center"/>
             </w:pPr>
             <w:r>
-              <w:rPr>
-                <w:rFonts w:cstheme="minorHAnsi"/>
-              </w:rPr>
-              <w:t>PRABHA</w:t>
-            </w:r>
-            <w:bookmarkStart w:id="3" w:name="_GoBack"/>
-            <w:bookmarkEnd w:id="3"/>
+              <w:t>NA</w:t>
+            </w:r>
           </w:p>
         </w:tc>
         <w:tc>
@@ -3897,7 +3912,7 @@
                 <w:rFonts w:cstheme="minorHAnsi"/>
                 <w:b/>
               </w:rPr>
-              <w:t>NA</w:t>
+              <w:t>TBD</w:t>
             </w:r>
           </w:p>
         </w:tc>
@@ -4154,7 +4169,7 @@
               <w:rPr>
                 <w:rFonts w:cstheme="minorHAnsi"/>
               </w:rPr>
-              <w:t>ICW</w:t>
+              <w:t>FD9</w:t>
             </w:r>
           </w:p>
         </w:tc>
@@ -4197,6 +4212,8 @@
                 <w:rFonts w:cstheme="minorHAnsi"/>
               </w:rPr>
             </w:pPr>
+            <w:bookmarkStart w:id="3" w:name="_GoBack"/>
+            <w:bookmarkEnd w:id="3"/>
           </w:p>
         </w:tc>
         <w:tc>
@@ -4337,13 +4354,7 @@
                 <w:rFonts w:cstheme="minorHAnsi"/>
                 <w:lang w:val="en-US"/>
               </w:rPr>
-              <w:t>SLQ</w:t>
-            </w:r>
-            <w:r>
-              <w:rPr>
-                <w:rFonts w:cstheme="minorHAnsi"/>
-              </w:rPr>
-              <w:t xml:space="preserve"> </w:t>
+              <w:t>DISC1</w:t>
             </w:r>
           </w:p>
         </w:tc>
@@ -4536,7 +4547,7 @@
               <w:rPr>
                 <w:rFonts w:cstheme="minorHAnsi"/>
               </w:rPr>
-              <w:t>SHQ</w:t>
+              <w:t>DVDR</w:t>
             </w:r>
           </w:p>
         </w:tc>
@@ -4726,7 +4737,10 @@
               </w:rPr>
             </w:pPr>
             <w:r>
-              <w:t>GAURAV</w:t>
+              <w:rPr>
+                <w:rFonts w:cstheme="minorHAnsi"/>
+              </w:rPr>
+              <w:t>ADM9</w:t>
             </w:r>
           </w:p>
         </w:tc>
@@ -4913,7 +4927,7 @@
               <w:rPr>
                 <w:rFonts w:cstheme="minorHAnsi"/>
               </w:rPr>
-              <w:t>MNW</w:t>
+              <w:t>MNW SPL</w:t>
             </w:r>
           </w:p>
         </w:tc>
@@ -5088,7 +5102,7 @@
               <w:rPr>
                 <w:rFonts w:cstheme="minorHAnsi"/>
               </w:rPr>
-              <w:t>NQO</w:t>
+              <w:t>SLQ SPL</w:t>
             </w:r>
           </w:p>
         </w:tc>
@@ -6094,7 +6108,7 @@
                 <w:sz w:val="28"/>
                 <w:szCs w:val="28"/>
               </w:rPr>
-              <w:t>CET</w:t>
+              <w:t>CHARU</w:t>
             </w:r>
           </w:p>
         </w:tc>
@@ -6997,7 +7011,7 @@
           <w14:round/>
         </w14:textOutline>
       </w:rPr>
-      <w:t>14</w:t>
+      <w:t>15</w:t>
     </w:r>
     <w:r>
       <w:rPr>
@@ -7117,7 +7131,7 @@
           <w14:round/>
         </w14:textOutline>
       </w:rPr>
-      <w:t>(FRI</w:t>
+      <w:t>(SATUR</w:t>
     </w:r>
     <w:r>
       <w:rPr>
@@ -8742,7 +8756,7 @@
 </file>
 
 <file path=customXml/itemProps1.xml><?xml version="1.0" encoding="utf-8"?>
-<ds:datastoreItem xmlns:ds="http://schemas.openxmlformats.org/officeDocument/2006/customXml" ds:itemID="{50D82287-4AF4-4470-BCB2-37EB8CB62679}">
+<ds:datastoreItem xmlns:ds="http://schemas.openxmlformats.org/officeDocument/2006/customXml" ds:itemID="{4A5AF93C-6C26-46B7-8F94-27A8EC6D4AB7}">
   <ds:schemaRefs>
     <ds:schemaRef ds:uri="http://schemas.openxmlformats.org/officeDocument/2006/bibliography"/>
   </ds:schemaRefs>

</xml_diff>

<commit_message>
Sync - 2026-08-14 16:01
</commit_message>
<xml_diff>
--- a/files/Daily_Helicopter_Schedule.docx
+++ b/files/Daily_Helicopter_Schedule.docx
@@ -4212,8 +4212,6 @@
                 <w:rFonts w:cstheme="minorHAnsi"/>
               </w:rPr>
             </w:pPr>
-            <w:bookmarkStart w:id="3" w:name="_GoBack"/>
-            <w:bookmarkEnd w:id="3"/>
           </w:p>
         </w:tc>
         <w:tc>
@@ -4927,7 +4925,13 @@
               <w:rPr>
                 <w:rFonts w:cstheme="minorHAnsi"/>
               </w:rPr>
-              <w:t>MNW SPL</w:t>
+              <w:t xml:space="preserve">NQO </w:t>
+            </w:r>
+            <w:r>
+              <w:rPr>
+                <w:rFonts w:cstheme="minorHAnsi"/>
+              </w:rPr>
+              <w:t xml:space="preserve"> SPL</w:t>
             </w:r>
           </w:p>
         </w:tc>
@@ -5102,7 +5106,21 @@
               <w:rPr>
                 <w:rFonts w:cstheme="minorHAnsi"/>
               </w:rPr>
-              <w:t>SLQ SPL</w:t>
+              <w:t>SLQ</w:t>
+            </w:r>
+            <w:r>
+              <w:rPr>
+                <w:rFonts w:cstheme="minorHAnsi"/>
+              </w:rPr>
+              <w:t xml:space="preserve">  </w:t>
+            </w:r>
+            <w:bookmarkStart w:id="3" w:name="_GoBack"/>
+            <w:bookmarkEnd w:id="3"/>
+            <w:r>
+              <w:rPr>
+                <w:rFonts w:cstheme="minorHAnsi"/>
+              </w:rPr>
+              <w:t xml:space="preserve"> SPL</w:t>
             </w:r>
           </w:p>
         </w:tc>
@@ -8756,7 +8774,7 @@
 </file>
 
 <file path=customXml/itemProps1.xml><?xml version="1.0" encoding="utf-8"?>
-<ds:datastoreItem xmlns:ds="http://schemas.openxmlformats.org/officeDocument/2006/customXml" ds:itemID="{4A5AF93C-6C26-46B7-8F94-27A8EC6D4AB7}">
+<ds:datastoreItem xmlns:ds="http://schemas.openxmlformats.org/officeDocument/2006/customXml" ds:itemID="{D859194D-28D2-40A7-9314-E635ED376C06}">
   <ds:schemaRefs>
     <ds:schemaRef ds:uri="http://schemas.openxmlformats.org/officeDocument/2006/bibliography"/>
   </ds:schemaRefs>

</xml_diff>

<commit_message>
Sync - 2026-08-14 16:53
</commit_message>
<xml_diff>
--- a/files/Daily_Helicopter_Schedule.docx
+++ b/files/Daily_Helicopter_Schedule.docx
@@ -580,7 +580,7 @@
                 <w:rFonts w:cstheme="minorHAnsi"/>
                 <w:lang w:val="en-IN"/>
               </w:rPr>
-              <w:t>RL</w:t>
+              <w:t>RF</w:t>
             </w:r>
           </w:p>
         </w:tc>
@@ -609,7 +609,7 @@
                 <w:rFonts w:cstheme="minorHAnsi"/>
                 <w:lang w:val="en-IN"/>
               </w:rPr>
-              <w:t>05</w:t>
+              <w:t>06</w:t>
             </w:r>
           </w:p>
         </w:tc>
@@ -1140,7 +1140,13 @@
               <w:rPr>
                 <w:rFonts w:cstheme="minorHAnsi"/>
               </w:rPr>
-              <w:t>11:00</w:t>
+              <w:t>10:3</w:t>
+            </w:r>
+            <w:r>
+              <w:rPr>
+                <w:rFonts w:cstheme="minorHAnsi"/>
+              </w:rPr>
+              <w:t>0</w:t>
             </w:r>
           </w:p>
         </w:tc>
@@ -1200,7 +1206,7 @@
               <w:rPr>
                 <w:rFonts w:cstheme="minorHAnsi"/>
               </w:rPr>
-              <w:t xml:space="preserve">NA </w:t>
+              <w:t>GVHL 169</w:t>
             </w:r>
           </w:p>
         </w:tc>
@@ -1228,7 +1234,7 @@
                 <w:rFonts w:cstheme="minorHAnsi"/>
                 <w:lang w:val="en-IN"/>
               </w:rPr>
-              <w:t>NA</w:t>
+              <w:t>RRL</w:t>
             </w:r>
           </w:p>
         </w:tc>
@@ -1256,7 +1262,7 @@
                 <w:rFonts w:cstheme="minorHAnsi"/>
                 <w:lang w:val="en-IN"/>
               </w:rPr>
-              <w:t>00</w:t>
+              <w:t>06</w:t>
             </w:r>
           </w:p>
         </w:tc>
@@ -3568,7 +3574,7 @@
               <w:rPr>
                 <w:rFonts w:cstheme="minorHAnsi"/>
               </w:rPr>
-              <w:t>DVDR/MNW</w:t>
+              <w:t>FD9</w:t>
             </w:r>
           </w:p>
         </w:tc>
@@ -4169,8 +4175,10 @@
               <w:rPr>
                 <w:rFonts w:cstheme="minorHAnsi"/>
               </w:rPr>
-              <w:t>FD9</w:t>
-            </w:r>
+              <w:t>UDAY</w:t>
+            </w:r>
+            <w:bookmarkStart w:id="3" w:name="_GoBack"/>
+            <w:bookmarkEnd w:id="3"/>
           </w:p>
         </w:tc>
         <w:tc>
@@ -5114,8 +5122,6 @@
               </w:rPr>
               <w:t xml:space="preserve">  </w:t>
             </w:r>
-            <w:bookmarkStart w:id="3" w:name="_GoBack"/>
-            <w:bookmarkEnd w:id="3"/>
             <w:r>
               <w:rPr>
                 <w:rFonts w:cstheme="minorHAnsi"/>
@@ -8774,7 +8780,7 @@
 </file>
 
 <file path=customXml/itemProps1.xml><?xml version="1.0" encoding="utf-8"?>
-<ds:datastoreItem xmlns:ds="http://schemas.openxmlformats.org/officeDocument/2006/customXml" ds:itemID="{D859194D-28D2-40A7-9314-E635ED376C06}">
+<ds:datastoreItem xmlns:ds="http://schemas.openxmlformats.org/officeDocument/2006/customXml" ds:itemID="{9E06B050-B0FC-498D-8290-A30D5EAEF332}">
   <ds:schemaRefs>
     <ds:schemaRef ds:uri="http://schemas.openxmlformats.org/officeDocument/2006/bibliography"/>
   </ds:schemaRefs>

</xml_diff>

<commit_message>
Sync - 2026-08-14 17:23
</commit_message>
<xml_diff>
--- a/files/Daily_Helicopter_Schedule.docx
+++ b/files/Daily_Helicopter_Schedule.docx
@@ -1421,13 +1421,11 @@
               <w:jc w:val="center"/>
               <w:rPr>
                 <w:rFonts w:cstheme="minorHAnsi"/>
-                <w:b/>
-              </w:rPr>
-            </w:pPr>
-            <w:r>
-              <w:rPr>
-                <w:rFonts w:cstheme="minorHAnsi"/>
-                <w:b/>
+              </w:rPr>
+            </w:pPr>
+            <w:r>
+              <w:rPr>
+                <w:rFonts w:cstheme="minorHAnsi"/>
               </w:rPr>
               <w:t>HELIGO 145</w:t>
             </w:r>
@@ -1449,14 +1447,12 @@
               <w:jc w:val="center"/>
               <w:rPr>
                 <w:rFonts w:cstheme="minorHAnsi"/>
-                <w:b/>
                 <w:lang w:val="en-IN"/>
               </w:rPr>
             </w:pPr>
             <w:r>
               <w:rPr>
                 <w:rFonts w:cstheme="minorHAnsi"/>
-                <w:b/>
                 <w:lang w:val="en-IN"/>
               </w:rPr>
               <w:t>HLY</w:t>
@@ -3736,8 +3732,14 @@
             <w:pPr>
               <w:pStyle w:val="NoSpacing"/>
               <w:jc w:val="center"/>
-            </w:pPr>
-            <w:r>
+              <w:rPr>
+                <w:b/>
+              </w:rPr>
+            </w:pPr>
+            <w:r>
+              <w:rPr>
+                <w:b/>
+              </w:rPr>
               <w:t>NA</w:t>
             </w:r>
           </w:p>
@@ -3779,6 +3781,8 @@
                 <w:rFonts w:cstheme="minorHAnsi"/>
               </w:rPr>
             </w:pPr>
+            <w:bookmarkStart w:id="3" w:name="_GoBack"/>
+            <w:bookmarkEnd w:id="3"/>
           </w:p>
         </w:tc>
         <w:tc>
@@ -3910,15 +3914,20 @@
               <w:jc w:val="center"/>
               <w:rPr>
                 <w:rFonts w:cstheme="minorHAnsi"/>
+              </w:rPr>
+            </w:pPr>
+            <w:r>
+              <w:rPr>
+                <w:rFonts w:cstheme="minorHAnsi"/>
                 <w:b/>
               </w:rPr>
-            </w:pPr>
-            <w:r>
-              <w:rPr>
-                <w:rFonts w:cstheme="minorHAnsi"/>
-                <w:b/>
-              </w:rPr>
-              <w:t>TBD</w:t>
+              <w:t xml:space="preserve"> </w:t>
+            </w:r>
+            <w:r>
+              <w:rPr>
+                <w:rFonts w:cstheme="minorHAnsi"/>
+              </w:rPr>
+              <w:t>NQO SPL</w:t>
             </w:r>
           </w:p>
         </w:tc>
@@ -4177,8 +4186,6 @@
               </w:rPr>
               <w:t>UDAY</w:t>
             </w:r>
-            <w:bookmarkStart w:id="3" w:name="_GoBack"/>
-            <w:bookmarkEnd w:id="3"/>
           </w:p>
         </w:tc>
         <w:tc>
@@ -4360,7 +4367,7 @@
                 <w:rFonts w:cstheme="minorHAnsi"/>
                 <w:lang w:val="en-US"/>
               </w:rPr>
-              <w:t>DISC1</w:t>
+              <w:t>SHAKTI</w:t>
             </w:r>
           </w:p>
         </w:tc>
@@ -4553,7 +4560,7 @@
               <w:rPr>
                 <w:rFonts w:cstheme="minorHAnsi"/>
               </w:rPr>
-              <w:t>DVDR</w:t>
+              <w:t>RATNA</w:t>
             </w:r>
           </w:p>
         </w:tc>
@@ -4932,14 +4939,9 @@
             <w:r>
               <w:rPr>
                 <w:rFonts w:cstheme="minorHAnsi"/>
-              </w:rPr>
-              <w:t xml:space="preserve">NQO </w:t>
-            </w:r>
-            <w:r>
-              <w:rPr>
-                <w:rFonts w:cstheme="minorHAnsi"/>
-              </w:rPr>
-              <w:t xml:space="preserve"> SPL</w:t>
+                <w:lang w:val="en-US"/>
+              </w:rPr>
+              <w:t>DISC1</w:t>
             </w:r>
           </w:p>
         </w:tc>
@@ -5114,19 +5116,7 @@
               <w:rPr>
                 <w:rFonts w:cstheme="minorHAnsi"/>
               </w:rPr>
-              <w:t>SLQ</w:t>
-            </w:r>
-            <w:r>
-              <w:rPr>
-                <w:rFonts w:cstheme="minorHAnsi"/>
-              </w:rPr>
-              <w:t xml:space="preserve">  </w:t>
-            </w:r>
-            <w:r>
-              <w:rPr>
-                <w:rFonts w:cstheme="minorHAnsi"/>
-              </w:rPr>
-              <w:t xml:space="preserve"> SPL</w:t>
+              <w:t>DVDR</w:t>
             </w:r>
           </w:p>
         </w:tc>
@@ -8780,7 +8770,7 @@
 </file>
 
 <file path=customXml/itemProps1.xml><?xml version="1.0" encoding="utf-8"?>
-<ds:datastoreItem xmlns:ds="http://schemas.openxmlformats.org/officeDocument/2006/customXml" ds:itemID="{9E06B050-B0FC-498D-8290-A30D5EAEF332}">
+<ds:datastoreItem xmlns:ds="http://schemas.openxmlformats.org/officeDocument/2006/customXml" ds:itemID="{36C87969-8F1F-496F-A1AE-8F12B8847C4B}">
   <ds:schemaRefs>
     <ds:schemaRef ds:uri="http://schemas.openxmlformats.org/officeDocument/2006/bibliography"/>
   </ds:schemaRefs>

</xml_diff>

<commit_message>
Sync - 2026-08-14 17:31
</commit_message>
<xml_diff>
--- a/files/Daily_Helicopter_Schedule.docx
+++ b/files/Daily_Helicopter_Schedule.docx
@@ -546,8 +546,10 @@
               <w:rPr>
                 <w:rFonts w:cstheme="minorHAnsi"/>
               </w:rPr>
-              <w:t>169</w:t>
-            </w:r>
+              <w:t>412</w:t>
+            </w:r>
+            <w:bookmarkStart w:id="3" w:name="_GoBack"/>
+            <w:bookmarkEnd w:id="3"/>
           </w:p>
         </w:tc>
         <w:tc>
@@ -3781,8 +3783,6 @@
                 <w:rFonts w:cstheme="minorHAnsi"/>
               </w:rPr>
             </w:pPr>
-            <w:bookmarkStart w:id="3" w:name="_GoBack"/>
-            <w:bookmarkEnd w:id="3"/>
           </w:p>
         </w:tc>
         <w:tc>
@@ -8770,7 +8770,7 @@
 </file>
 
 <file path=customXml/itemProps1.xml><?xml version="1.0" encoding="utf-8"?>
-<ds:datastoreItem xmlns:ds="http://schemas.openxmlformats.org/officeDocument/2006/customXml" ds:itemID="{36C87969-8F1F-496F-A1AE-8F12B8847C4B}">
+<ds:datastoreItem xmlns:ds="http://schemas.openxmlformats.org/officeDocument/2006/customXml" ds:itemID="{E37EDFE0-D911-4A83-8415-ADC1C7D4DFD5}">
   <ds:schemaRefs>
     <ds:schemaRef ds:uri="http://schemas.openxmlformats.org/officeDocument/2006/bibliography"/>
   </ds:schemaRefs>

</xml_diff>

<commit_message>
Sync - 2026-08-15 17:05
</commit_message>
<xml_diff>
--- a/files/Daily_Helicopter_Schedule.docx
+++ b/files/Daily_Helicopter_Schedule.docx
@@ -540,50 +540,37 @@
               <w:rPr>
                 <w:rFonts w:cstheme="minorHAnsi"/>
               </w:rPr>
-              <w:t xml:space="preserve">GVHL </w:t>
-            </w:r>
-            <w:r>
-              <w:rPr>
-                <w:rFonts w:cstheme="minorHAnsi"/>
-              </w:rPr>
-              <w:t>412</w:t>
+              <w:t>NA</w:t>
+            </w:r>
+          </w:p>
+        </w:tc>
+        <w:tc>
+          <w:tcPr>
+            <w:tcW w:w="908" w:type="dxa"/>
+            <w:tcBorders>
+              <w:top w:val="single" w:sz="4" w:space="0" w:color="auto"/>
+              <w:left w:val="single" w:sz="4" w:space="0" w:color="auto"/>
+              <w:bottom w:val="single" w:sz="4" w:space="0" w:color="auto"/>
+              <w:right w:val="single" w:sz="4" w:space="0" w:color="auto"/>
+            </w:tcBorders>
+          </w:tcPr>
+          <w:p>
+            <w:pPr>
+              <w:jc w:val="center"/>
+              <w:rPr>
+                <w:rFonts w:cstheme="minorHAnsi"/>
+                <w:lang w:val="en-IN"/>
+              </w:rPr>
+            </w:pPr>
+            <w:r>
+              <w:rPr>
+                <w:rFonts w:cstheme="minorHAnsi"/>
+                <w:lang w:val="en-IN"/>
+              </w:rPr>
+              <w:t>NA</w:t>
             </w:r>
             <w:bookmarkStart w:id="3" w:name="_GoBack"/>
             <w:bookmarkEnd w:id="3"/>
-          </w:p>
-        </w:tc>
-        <w:tc>
-          <w:tcPr>
-            <w:tcW w:w="908" w:type="dxa"/>
-            <w:tcBorders>
-              <w:top w:val="single" w:sz="4" w:space="0" w:color="auto"/>
-              <w:left w:val="single" w:sz="4" w:space="0" w:color="auto"/>
-              <w:bottom w:val="single" w:sz="4" w:space="0" w:color="auto"/>
-              <w:right w:val="single" w:sz="4" w:space="0" w:color="auto"/>
-            </w:tcBorders>
-          </w:tcPr>
-          <w:p>
-            <w:pPr>
-              <w:jc w:val="center"/>
-              <w:rPr>
-                <w:rFonts w:cstheme="minorHAnsi"/>
-                <w:lang w:val="en-IN"/>
-              </w:rPr>
-            </w:pPr>
-            <w:r>
-              <w:rPr>
-                <w:rFonts w:cstheme="minorHAnsi"/>
-                <w:lang w:val="en-IN"/>
-              </w:rPr>
-              <w:t>R</w:t>
-            </w:r>
-            <w:r>
-              <w:rPr>
-                <w:rFonts w:cstheme="minorHAnsi"/>
-                <w:lang w:val="en-IN"/>
-              </w:rPr>
-              <w:t>RF</w:t>
-            </w:r>
           </w:p>
         </w:tc>
         <w:tc>
@@ -782,7 +769,7 @@
                 <w:rFonts w:cstheme="minorHAnsi"/>
                 <w:lang w:val="en-IN"/>
               </w:rPr>
-              <w:t>GVZ</w:t>
+              <w:t>RRL</w:t>
             </w:r>
           </w:p>
         </w:tc>
@@ -980,7 +967,7 @@
                 <w:rFonts w:cstheme="minorHAnsi"/>
                 <w:lang w:val="en-IN"/>
               </w:rPr>
-              <w:t>RRN</w:t>
+              <w:t>GVZ</w:t>
             </w:r>
           </w:p>
         </w:tc>
@@ -1208,7 +1195,7 @@
               <w:rPr>
                 <w:rFonts w:cstheme="minorHAnsi"/>
               </w:rPr>
-              <w:t>GVHL 169</w:t>
+              <w:t>NA</w:t>
             </w:r>
           </w:p>
         </w:tc>
@@ -1236,7 +1223,7 @@
                 <w:rFonts w:cstheme="minorHAnsi"/>
                 <w:lang w:val="en-IN"/>
               </w:rPr>
-              <w:t>RRL</w:t>
+              <w:t>NA</w:t>
             </w:r>
           </w:p>
         </w:tc>
@@ -1659,7 +1646,7 @@
                 <w:rFonts w:cstheme="minorHAnsi"/>
                 <w:lang w:val="en-IN"/>
               </w:rPr>
-              <w:t>RRK</w:t>
+              <w:t>RRN</w:t>
             </w:r>
           </w:p>
         </w:tc>
@@ -2291,32 +2278,28 @@
               <w:jc w:val="center"/>
             </w:pPr>
             <w:r>
+              <w:t>DSFN</w:t>
+            </w:r>
+          </w:p>
+        </w:tc>
+        <w:tc>
+          <w:tcPr>
+            <w:tcW w:w="1745" w:type="dxa"/>
+            <w:tcBorders>
+              <w:top w:val="single" w:sz="4" w:space="0" w:color="auto"/>
+              <w:left w:val="single" w:sz="4" w:space="0" w:color="auto"/>
+              <w:bottom w:val="single" w:sz="4" w:space="0" w:color="auto"/>
+              <w:right w:val="single" w:sz="4" w:space="0" w:color="auto"/>
+            </w:tcBorders>
+          </w:tcPr>
+          <w:p>
+            <w:pPr>
+              <w:pStyle w:val="NoSpacing"/>
+              <w:jc w:val="center"/>
               <w:rPr>
                 <w:rFonts w:cstheme="minorHAnsi"/>
                 <w:b/>
               </w:rPr>
-              <w:t>NA</w:t>
-            </w:r>
-          </w:p>
-        </w:tc>
-        <w:tc>
-          <w:tcPr>
-            <w:tcW w:w="1745" w:type="dxa"/>
-            <w:tcBorders>
-              <w:top w:val="single" w:sz="4" w:space="0" w:color="auto"/>
-              <w:left w:val="single" w:sz="4" w:space="0" w:color="auto"/>
-              <w:bottom w:val="single" w:sz="4" w:space="0" w:color="auto"/>
-              <w:right w:val="single" w:sz="4" w:space="0" w:color="auto"/>
-            </w:tcBorders>
-          </w:tcPr>
-          <w:p>
-            <w:pPr>
-              <w:pStyle w:val="NoSpacing"/>
-              <w:jc w:val="center"/>
-              <w:rPr>
-                <w:rFonts w:cstheme="minorHAnsi"/>
-                <w:b/>
-              </w:rPr>
             </w:pPr>
           </w:p>
         </w:tc>
@@ -2338,6 +2321,13 @@
                 <w:lang w:val="en-IN"/>
               </w:rPr>
             </w:pPr>
+            <w:r>
+              <w:rPr>
+                <w:rFonts w:cstheme="minorHAnsi"/>
+                <w:lang w:val="en-IN"/>
+              </w:rPr>
+              <w:t>RRN</w:t>
+            </w:r>
           </w:p>
         </w:tc>
         <w:tc>
@@ -2472,10 +2462,7 @@
               <w:jc w:val="center"/>
             </w:pPr>
             <w:r>
-              <w:t xml:space="preserve"> </w:t>
-            </w:r>
-            <w:r>
-              <w:t>NA</w:t>
+              <w:t>SRAT(L/O)</w:t>
             </w:r>
           </w:p>
         </w:tc>
@@ -2517,6 +2504,190 @@
                 <w:lang w:val="en-IN"/>
               </w:rPr>
             </w:pPr>
+            <w:r>
+              <w:rPr>
+                <w:rFonts w:cstheme="minorHAnsi"/>
+                <w:lang w:val="en-IN"/>
+              </w:rPr>
+              <w:t>RRF</w:t>
+            </w:r>
+          </w:p>
+        </w:tc>
+        <w:tc>
+          <w:tcPr>
+            <w:tcW w:w="1363" w:type="dxa"/>
+            <w:tcBorders>
+              <w:top w:val="single" w:sz="4" w:space="0" w:color="auto"/>
+              <w:left w:val="single" w:sz="4" w:space="0" w:color="auto"/>
+              <w:bottom w:val="single" w:sz="4" w:space="0" w:color="auto"/>
+              <w:right w:val="single" w:sz="4" w:space="0" w:color="auto"/>
+            </w:tcBorders>
+            <w:noWrap/>
+          </w:tcPr>
+          <w:p>
+            <w:pPr>
+              <w:jc w:val="center"/>
+              <w:rPr>
+                <w:rFonts w:cstheme="minorHAnsi"/>
+                <w:lang w:val="en-IN"/>
+              </w:rPr>
+            </w:pPr>
+          </w:p>
+        </w:tc>
+      </w:tr>
+      <w:tr>
+        <w:trPr>
+          <w:trHeight w:val="152"/>
+        </w:trPr>
+        <w:tc>
+          <w:tcPr>
+            <w:tcW w:w="774" w:type="dxa"/>
+            <w:tcBorders>
+              <w:top w:val="single" w:sz="4" w:space="0" w:color="auto"/>
+              <w:left w:val="single" w:sz="4" w:space="0" w:color="auto"/>
+              <w:bottom w:val="single" w:sz="4" w:space="0" w:color="auto"/>
+              <w:right w:val="single" w:sz="4" w:space="0" w:color="auto"/>
+            </w:tcBorders>
+            <w:noWrap/>
+          </w:tcPr>
+          <w:p>
+            <w:pPr>
+              <w:pStyle w:val="NoSpacing"/>
+              <w:jc w:val="center"/>
+              <w:rPr>
+                <w:rFonts w:cstheme="minorHAnsi"/>
+              </w:rPr>
+            </w:pPr>
+            <w:r>
+              <w:rPr>
+                <w:rFonts w:cstheme="minorHAnsi"/>
+              </w:rPr>
+              <w:t>3</w:t>
+            </w:r>
+          </w:p>
+        </w:tc>
+        <w:tc>
+          <w:tcPr>
+            <w:tcW w:w="1555" w:type="dxa"/>
+            <w:tcBorders>
+              <w:top w:val="single" w:sz="4" w:space="0" w:color="auto"/>
+              <w:left w:val="single" w:sz="4" w:space="0" w:color="auto"/>
+              <w:bottom w:val="single" w:sz="4" w:space="0" w:color="auto"/>
+              <w:right w:val="single" w:sz="4" w:space="0" w:color="auto"/>
+            </w:tcBorders>
+          </w:tcPr>
+          <w:p>
+            <w:pPr>
+              <w:pStyle w:val="NoSpacing"/>
+              <w:jc w:val="center"/>
+              <w:rPr>
+                <w:rFonts w:cstheme="minorHAnsi"/>
+              </w:rPr>
+            </w:pPr>
+            <w:r>
+              <w:rPr>
+                <w:rFonts w:cstheme="minorHAnsi"/>
+              </w:rPr>
+              <w:t>07:30</w:t>
+            </w:r>
+          </w:p>
+        </w:tc>
+        <w:tc>
+          <w:tcPr>
+            <w:tcW w:w="1801" w:type="dxa"/>
+            <w:tcBorders>
+              <w:top w:val="single" w:sz="4" w:space="0" w:color="auto"/>
+              <w:left w:val="single" w:sz="4" w:space="0" w:color="auto"/>
+              <w:bottom w:val="single" w:sz="4" w:space="0" w:color="auto"/>
+              <w:right w:val="single" w:sz="4" w:space="0" w:color="auto"/>
+            </w:tcBorders>
+            <w:noWrap/>
+          </w:tcPr>
+          <w:p>
+            <w:pPr>
+              <w:pStyle w:val="NoSpacing"/>
+              <w:tabs>
+                <w:tab w:val="left" w:pos="368"/>
+                <w:tab w:val="center" w:pos="767"/>
+              </w:tabs>
+              <w:jc w:val="center"/>
+              <w:rPr>
+                <w:rFonts w:cstheme="minorHAnsi"/>
+              </w:rPr>
+            </w:pPr>
+            <w:r>
+              <w:rPr>
+                <w:rFonts w:cstheme="minorHAnsi"/>
+              </w:rPr>
+              <w:t>11:00</w:t>
+            </w:r>
+          </w:p>
+        </w:tc>
+        <w:tc>
+          <w:tcPr>
+            <w:tcW w:w="2993" w:type="dxa"/>
+            <w:tcBorders>
+              <w:top w:val="single" w:sz="4" w:space="0" w:color="auto"/>
+              <w:left w:val="single" w:sz="4" w:space="0" w:color="auto"/>
+              <w:bottom w:val="single" w:sz="4" w:space="0" w:color="auto"/>
+              <w:right w:val="single" w:sz="4" w:space="0" w:color="auto"/>
+            </w:tcBorders>
+            <w:noWrap/>
+          </w:tcPr>
+          <w:p>
+            <w:pPr>
+              <w:jc w:val="center"/>
+            </w:pPr>
+            <w:r>
+              <w:t>DSFN</w:t>
+            </w:r>
+          </w:p>
+        </w:tc>
+        <w:tc>
+          <w:tcPr>
+            <w:tcW w:w="1745" w:type="dxa"/>
+            <w:tcBorders>
+              <w:top w:val="single" w:sz="4" w:space="0" w:color="auto"/>
+              <w:left w:val="single" w:sz="4" w:space="0" w:color="auto"/>
+              <w:bottom w:val="single" w:sz="4" w:space="0" w:color="auto"/>
+              <w:right w:val="single" w:sz="4" w:space="0" w:color="auto"/>
+            </w:tcBorders>
+          </w:tcPr>
+          <w:p>
+            <w:pPr>
+              <w:pStyle w:val="NoSpacing"/>
+              <w:jc w:val="center"/>
+              <w:rPr>
+                <w:rFonts w:cstheme="minorHAnsi"/>
+              </w:rPr>
+            </w:pPr>
+          </w:p>
+        </w:tc>
+        <w:tc>
+          <w:tcPr>
+            <w:tcW w:w="908" w:type="dxa"/>
+            <w:tcBorders>
+              <w:top w:val="single" w:sz="4" w:space="0" w:color="auto"/>
+              <w:left w:val="single" w:sz="4" w:space="0" w:color="auto"/>
+              <w:bottom w:val="single" w:sz="4" w:space="0" w:color="auto"/>
+              <w:right w:val="single" w:sz="4" w:space="0" w:color="auto"/>
+            </w:tcBorders>
+          </w:tcPr>
+          <w:p>
+            <w:pPr>
+              <w:jc w:val="center"/>
+              <w:rPr>
+                <w:rFonts w:cstheme="minorHAnsi"/>
+                <w:lang w:val="en-IN"/>
+              </w:rPr>
+            </w:pPr>
+            <w:r>
+              <w:rPr>
+                <w:rFonts w:cstheme="minorHAnsi"/>
+                <w:lang w:val="en-IN"/>
+              </w:rPr>
+              <w:t>RRK</w:t>
+            </w:r>
           </w:p>
         </w:tc>
         <w:tc>
@@ -2568,7 +2739,7 @@
               <w:rPr>
                 <w:rFonts w:cstheme="minorHAnsi"/>
               </w:rPr>
-              <w:t>3</w:t>
+              <w:t>4</w:t>
             </w:r>
           </w:p>
         </w:tc>
@@ -2651,7 +2822,7 @@
               <w:jc w:val="center"/>
             </w:pPr>
             <w:r>
-              <w:t xml:space="preserve"> NA</w:t>
+              <w:t>SGAV</w:t>
             </w:r>
           </w:p>
         </w:tc>
@@ -2693,6 +2864,13 @@
                 <w:lang w:val="en-IN"/>
               </w:rPr>
             </w:pPr>
+            <w:r>
+              <w:rPr>
+                <w:rFonts w:cstheme="minorHAnsi"/>
+                <w:lang w:val="en-IN"/>
+              </w:rPr>
+              <w:t>RRF</w:t>
+            </w:r>
           </w:p>
         </w:tc>
         <w:tc>
@@ -2744,7 +2922,7 @@
               <w:rPr>
                 <w:rFonts w:cstheme="minorHAnsi"/>
               </w:rPr>
-              <w:t>4</w:t>
+              <w:t>5</w:t>
             </w:r>
           </w:p>
         </w:tc>
@@ -2827,11 +3005,7 @@
               <w:jc w:val="center"/>
             </w:pPr>
             <w:r>
-              <w:rPr>
-                <w:rFonts w:cstheme="minorHAnsi"/>
-                <w:b/>
-              </w:rPr>
-              <w:t>NA</w:t>
+              <w:t>SGAV</w:t>
             </w:r>
           </w:p>
         </w:tc>
@@ -2873,6 +3047,13 @@
                 <w:lang w:val="en-IN"/>
               </w:rPr>
             </w:pPr>
+            <w:r>
+              <w:rPr>
+                <w:rFonts w:cstheme="minorHAnsi"/>
+                <w:lang w:val="en-IN"/>
+              </w:rPr>
+              <w:t>RRF</w:t>
+            </w:r>
           </w:p>
         </w:tc>
         <w:tc>
@@ -3229,7 +3410,7 @@
               <w:rPr>
                 <w:rFonts w:cstheme="minorHAnsi"/>
               </w:rPr>
-              <w:t>ARMADA2</w:t>
+              <w:t>AS1</w:t>
             </w:r>
           </w:p>
         </w:tc>
@@ -3271,6 +3452,12 @@
                 <w:rFonts w:cstheme="minorHAnsi"/>
               </w:rPr>
             </w:pPr>
+            <w:r>
+              <w:rPr>
+                <w:rFonts w:cstheme="minorHAnsi"/>
+              </w:rPr>
+              <w:t>HLV</w:t>
+            </w:r>
           </w:p>
         </w:tc>
         <w:tc>
@@ -3572,7 +3759,7 @@
               <w:rPr>
                 <w:rFonts w:cstheme="minorHAnsi"/>
               </w:rPr>
-              <w:t>FD9</w:t>
+              <w:t>JTAN</w:t>
             </w:r>
           </w:p>
         </w:tc>
@@ -3614,6 +3801,12 @@
                 <w:rFonts w:cstheme="minorHAnsi"/>
               </w:rPr>
             </w:pPr>
+            <w:r>
+              <w:rPr>
+                <w:rFonts w:cstheme="minorHAnsi"/>
+              </w:rPr>
+              <w:t>HLV</w:t>
+            </w:r>
           </w:p>
         </w:tc>
         <w:tc>
@@ -3927,7 +4120,7 @@
               <w:rPr>
                 <w:rFonts w:cstheme="minorHAnsi"/>
               </w:rPr>
-              <w:t>NQO SPL</w:t>
+              <w:t>PANNA (L/O)</w:t>
             </w:r>
           </w:p>
         </w:tc>
@@ -3969,6 +4162,12 @@
                 <w:rFonts w:cstheme="minorHAnsi"/>
               </w:rPr>
             </w:pPr>
+            <w:r>
+              <w:rPr>
+                <w:rFonts w:cstheme="minorHAnsi"/>
+              </w:rPr>
+              <w:t>HLV</w:t>
+            </w:r>
           </w:p>
         </w:tc>
         <w:tc>
@@ -4184,7 +4383,7 @@
               <w:rPr>
                 <w:rFonts w:cstheme="minorHAnsi"/>
               </w:rPr>
-              <w:t>UDAY</w:t>
+              <w:t>DEFOS</w:t>
             </w:r>
           </w:p>
         </w:tc>
@@ -4367,7 +4566,7 @@
                 <w:rFonts w:cstheme="minorHAnsi"/>
                 <w:lang w:val="en-US"/>
               </w:rPr>
-              <w:t>SHAKTI</w:t>
+              <w:t>VND1</w:t>
             </w:r>
           </w:p>
         </w:tc>
@@ -4560,7 +4759,7 @@
               <w:rPr>
                 <w:rFonts w:cstheme="minorHAnsi"/>
               </w:rPr>
-              <w:t>RATNA</w:t>
+              <w:t>CHTR</w:t>
             </w:r>
           </w:p>
         </w:tc>
@@ -4753,7 +4952,7 @@
               <w:rPr>
                 <w:rFonts w:cstheme="minorHAnsi"/>
               </w:rPr>
-              <w:t>ADM9</w:t>
+              <w:t>ABN8</w:t>
             </w:r>
           </w:p>
         </w:tc>
@@ -4939,9 +5138,8 @@
             <w:r>
               <w:rPr>
                 <w:rFonts w:cstheme="minorHAnsi"/>
-                <w:lang w:val="en-US"/>
-              </w:rPr>
-              <w:t>DISC1</w:t>
+              </w:rPr>
+              <w:t>NQO</w:t>
             </w:r>
           </w:p>
         </w:tc>
@@ -5116,7 +5314,7 @@
               <w:rPr>
                 <w:rFonts w:cstheme="minorHAnsi"/>
               </w:rPr>
-              <w:t>DVDR</w:t>
+              <w:t>VND2</w:t>
             </w:r>
           </w:p>
         </w:tc>
@@ -5221,12 +5419,6 @@
                 <w:b/>
               </w:rPr>
               <w:t>WAITING:</w:t>
-            </w:r>
-            <w:r>
-              <w:rPr>
-                <w:rFonts w:cstheme="minorHAnsi"/>
-              </w:rPr>
-              <w:t xml:space="preserve"> VND1, JTAN</w:t>
             </w:r>
           </w:p>
         </w:tc>
@@ -5918,7 +6110,7 @@
                 <w:sz w:val="30"/>
                 <w:szCs w:val="30"/>
               </w:rPr>
-              <w:t>JYOTI</w:t>
+              <w:t>CHRU</w:t>
             </w:r>
           </w:p>
         </w:tc>
@@ -6122,7 +6314,7 @@
                 <w:sz w:val="28"/>
                 <w:szCs w:val="28"/>
               </w:rPr>
-              <w:t>CHARU</w:t>
+              <w:t>TCPP CC+PROD</w:t>
             </w:r>
           </w:p>
         </w:tc>
@@ -6339,14 +6531,6 @@
                 <w:szCs w:val="30"/>
               </w:rPr>
             </w:pPr>
-            <w:r>
-              <w:rPr>
-                <w:rFonts w:cstheme="minorHAnsi"/>
-                <w:sz w:val="30"/>
-                <w:szCs w:val="30"/>
-              </w:rPr>
-              <w:t>L/O</w:t>
-            </w:r>
           </w:p>
         </w:tc>
         <w:tc>
@@ -6675,6 +6859,7 @@
           <w:noProof/>
           <w:sz w:val="28"/>
           <w:szCs w:val="28"/>
+          <w:lang w:val="en-IN" w:eastAsia="en-IN"/>
         </w:rPr>
         <w:drawing>
           <wp:anchor distT="0" distB="0" distL="114300" distR="114300" simplePos="0" relativeHeight="251660288" behindDoc="0" locked="1" layoutInCell="1" allowOverlap="1" wp14:anchorId="378283CE" wp14:editId="16F4523F">
@@ -6898,6 +7083,7 @@
         <w:noProof/>
         <w:sz w:val="28"/>
         <w:szCs w:val="28"/>
+        <w:lang w:val="en-IN" w:eastAsia="en-IN"/>
       </w:rPr>
       <w:drawing>
         <wp:anchor distT="0" distB="0" distL="114300" distR="114300" simplePos="0" relativeHeight="251659264" behindDoc="0" locked="1" layoutInCell="1" allowOverlap="1" wp14:anchorId="18541E08" wp14:editId="3A982AD5">
@@ -7025,7 +7211,7 @@
           <w14:round/>
         </w14:textOutline>
       </w:rPr>
-      <w:t>15</w:t>
+      <w:t>16</w:t>
     </w:r>
     <w:r>
       <w:rPr>
@@ -7145,7 +7331,7 @@
           <w14:round/>
         </w14:textOutline>
       </w:rPr>
-      <w:t>(SATUR</w:t>
+      <w:t>(SUN</w:t>
     </w:r>
     <w:r>
       <w:rPr>
@@ -7198,7 +7384,7 @@
 
 <file path=word/numbering.xml><?xml version="1.0" encoding="utf-8"?>
 <w:numbering xmlns:wpc="http://schemas.microsoft.com/office/word/2010/wordprocessingCanvas" xmlns:mc="http://schemas.openxmlformats.org/markup-compatibility/2006" xmlns:o="urn:schemas-microsoft-com:office:office" xmlns:r="http://schemas.openxmlformats.org/officeDocument/2006/relationships" xmlns:m="http://schemas.openxmlformats.org/officeDocument/2006/math" xmlns:v="urn:schemas-microsoft-com:vml" xmlns:wp14="http://schemas.microsoft.com/office/word/2010/wordprocessingDrawing" xmlns:wp="http://schemas.openxmlformats.org/drawingml/2006/wordprocessingDrawing" xmlns:w10="urn:schemas-microsoft-com:office:word" xmlns:w="http://schemas.openxmlformats.org/wordprocessingml/2006/main" xmlns:w14="http://schemas.microsoft.com/office/word/2010/wordml" xmlns:w15="http://schemas.microsoft.com/office/word/2012/wordml" xmlns:wpg="http://schemas.microsoft.com/office/word/2010/wordprocessingGroup" xmlns:wpi="http://schemas.microsoft.com/office/word/2010/wordprocessingInk" xmlns:wne="http://schemas.microsoft.com/office/word/2006/wordml" xmlns:wps="http://schemas.microsoft.com/office/word/2010/wordprocessingShape" mc:Ignorable="w14 w15 wp14">
-  <w:abstractNum w:abstractNumId="0" w15:restartNumberingAfterBreak="0">
+  <w:abstractNum w:abstractNumId="0">
     <w:nsid w:val="26456C0C"/>
     <w:multiLevelType w:val="hybridMultilevel"/>
     <w:tmpl w:val="3184D9E8"/>
@@ -7310,7 +7496,7 @@
       </w:rPr>
     </w:lvl>
   </w:abstractNum>
-  <w:abstractNum w:abstractNumId="1" w15:restartNumberingAfterBreak="0">
+  <w:abstractNum w:abstractNumId="1">
     <w:nsid w:val="28050CBA"/>
     <w:multiLevelType w:val="hybridMultilevel"/>
     <w:tmpl w:val="27ECDD44"/>
@@ -7400,7 +7586,7 @@
       </w:pPr>
     </w:lvl>
   </w:abstractNum>
-  <w:abstractNum w:abstractNumId="2" w15:restartNumberingAfterBreak="0">
+  <w:abstractNum w:abstractNumId="2">
     <w:nsid w:val="4CA40254"/>
     <w:multiLevelType w:val="hybridMultilevel"/>
     <w:tmpl w:val="9D24E7DE"/>
@@ -7513,7 +7699,7 @@
       </w:rPr>
     </w:lvl>
   </w:abstractNum>
-  <w:abstractNum w:abstractNumId="3" w15:restartNumberingAfterBreak="0">
+  <w:abstractNum w:abstractNumId="3">
     <w:nsid w:val="668D00CE"/>
     <w:multiLevelType w:val="hybridMultilevel"/>
     <w:tmpl w:val="612C2D9A"/>
@@ -7626,7 +7812,7 @@
       </w:rPr>
     </w:lvl>
   </w:abstractNum>
-  <w:abstractNum w:abstractNumId="4" w15:restartNumberingAfterBreak="0">
+  <w:abstractNum w:abstractNumId="4">
     <w:nsid w:val="72FD1862"/>
     <w:multiLevelType w:val="hybridMultilevel"/>
     <w:tmpl w:val="BA502E62"/>
@@ -8248,6 +8434,7 @@
       <w:szCs w:val="24"/>
     </w:rPr>
     <w:tblPr>
+      <w:tblInd w:w="0" w:type="dxa"/>
       <w:tblBorders>
         <w:top w:val="single" w:sz="4" w:space="0" w:color="auto"/>
         <w:left w:val="single" w:sz="4" w:space="0" w:color="auto"/>
@@ -8256,6 +8443,12 @@
         <w:insideH w:val="single" w:sz="4" w:space="0" w:color="auto"/>
         <w:insideV w:val="single" w:sz="4" w:space="0" w:color="auto"/>
       </w:tblBorders>
+      <w:tblCellMar>
+        <w:top w:w="0" w:type="dxa"/>
+        <w:left w:w="108" w:type="dxa"/>
+        <w:bottom w:w="0" w:type="dxa"/>
+        <w:right w:w="108" w:type="dxa"/>
+      </w:tblCellMar>
     </w:tblPr>
   </w:style>
   <w:style w:type="paragraph" w:styleId="BalloonText">
@@ -8770,7 +8963,7 @@
 </file>
 
 <file path=customXml/itemProps1.xml><?xml version="1.0" encoding="utf-8"?>
-<ds:datastoreItem xmlns:ds="http://schemas.openxmlformats.org/officeDocument/2006/customXml" ds:itemID="{E37EDFE0-D911-4A83-8415-ADC1C7D4DFD5}">
+<ds:datastoreItem xmlns:ds="http://schemas.openxmlformats.org/officeDocument/2006/customXml" ds:itemID="{EF068286-8047-4878-A006-1DDA08D04FBC}">
   <ds:schemaRefs>
     <ds:schemaRef ds:uri="http://schemas.openxmlformats.org/officeDocument/2006/bibliography"/>
   </ds:schemaRefs>

</xml_diff>

<commit_message>
Sync - 2026-08-16 17:25
</commit_message>
<xml_diff>
--- a/files/Daily_Helicopter_Schedule.docx
+++ b/files/Daily_Helicopter_Schedule.docx
@@ -2,7 +2,10 @@
 <file path=word/document.xml><?xml version="1.0" encoding="utf-8"?>
 <w:document xmlns:wpc="http://schemas.microsoft.com/office/word/2010/wordprocessingCanvas" xmlns:mc="http://schemas.openxmlformats.org/markup-compatibility/2006" xmlns:o="urn:schemas-microsoft-com:office:office" xmlns:r="http://schemas.openxmlformats.org/officeDocument/2006/relationships" xmlns:m="http://schemas.openxmlformats.org/officeDocument/2006/math" xmlns:v="urn:schemas-microsoft-com:vml" xmlns:wp14="http://schemas.microsoft.com/office/word/2010/wordprocessingDrawing" xmlns:wp="http://schemas.openxmlformats.org/drawingml/2006/wordprocessingDrawing" xmlns:w10="urn:schemas-microsoft-com:office:word" xmlns:w="http://schemas.openxmlformats.org/wordprocessingml/2006/main" xmlns:w14="http://schemas.microsoft.com/office/word/2010/wordml" xmlns:w15="http://schemas.microsoft.com/office/word/2012/wordml" xmlns:wpg="http://schemas.microsoft.com/office/word/2010/wordprocessingGroup" xmlns:wpi="http://schemas.microsoft.com/office/word/2010/wordprocessingInk" xmlns:wne="http://schemas.microsoft.com/office/word/2006/wordml" xmlns:wps="http://schemas.microsoft.com/office/word/2010/wordprocessingShape" mc:Ignorable="w14 w15 wp14">
   <w:body>
-    <w:p/>
+    <w:p>
+      <w:bookmarkStart w:id="0" w:name="_GoBack"/>
+      <w:bookmarkEnd w:id="0"/>
+    </w:p>
     <w:tbl>
       <w:tblPr>
         <w:tblStyle w:val="TableGrid"/>
@@ -37,9 +40,9 @@
             <w:hideMark/>
           </w:tcPr>
           <w:p>
-            <w:bookmarkStart w:id="0" w:name="OLE_LINK3"/>
-            <w:bookmarkStart w:id="1" w:name="OLE_LINK2"/>
-            <w:bookmarkStart w:id="2" w:name="OLE_LINK1"/>
+            <w:bookmarkStart w:id="1" w:name="OLE_LINK3"/>
+            <w:bookmarkStart w:id="2" w:name="OLE_LINK2"/>
+            <w:bookmarkStart w:id="3" w:name="OLE_LINK1"/>
             <w:r>
               <w:t>SL. NO.</w:t>
             </w:r>
@@ -540,7 +543,7 @@
               <w:rPr>
                 <w:rFonts w:cstheme="minorHAnsi"/>
               </w:rPr>
-              <w:t>NA</w:t>
+              <w:t>GVHL 412</w:t>
             </w:r>
           </w:p>
         </w:tc>
@@ -567,10 +570,8 @@
                 <w:rFonts w:cstheme="minorHAnsi"/>
                 <w:lang w:val="en-IN"/>
               </w:rPr>
-              <w:t>NA</w:t>
-            </w:r>
-            <w:bookmarkStart w:id="3" w:name="_GoBack"/>
-            <w:bookmarkEnd w:id="3"/>
+              <w:t>RRF</w:t>
+            </w:r>
           </w:p>
         </w:tc>
         <w:tc>
@@ -598,7 +599,7 @@
                 <w:rFonts w:cstheme="minorHAnsi"/>
                 <w:lang w:val="en-IN"/>
               </w:rPr>
-              <w:t>06</w:t>
+              <w:t>08</w:t>
             </w:r>
           </w:p>
         </w:tc>
@@ -769,7 +770,7 @@
                 <w:rFonts w:cstheme="minorHAnsi"/>
                 <w:lang w:val="en-IN"/>
               </w:rPr>
-              <w:t>RRL</w:t>
+              <w:t>RRK</w:t>
             </w:r>
           </w:p>
         </w:tc>
@@ -2278,7 +2279,7 @@
               <w:jc w:val="center"/>
             </w:pPr>
             <w:r>
-              <w:t>DSFN</w:t>
+              <w:t>VIR-1</w:t>
             </w:r>
           </w:p>
         </w:tc>
@@ -2326,7 +2327,7 @@
                 <w:rFonts w:cstheme="minorHAnsi"/>
                 <w:lang w:val="en-IN"/>
               </w:rPr>
-              <w:t>RRN</w:t>
+              <w:t>RRL</w:t>
             </w:r>
           </w:p>
         </w:tc>
@@ -2462,7 +2463,7 @@
               <w:jc w:val="center"/>
             </w:pPr>
             <w:r>
-              <w:t>SRAT(L/O)</w:t>
+              <w:t>NA</w:t>
             </w:r>
           </w:p>
         </w:tc>
@@ -2504,13 +2505,6 @@
                 <w:lang w:val="en-IN"/>
               </w:rPr>
             </w:pPr>
-            <w:r>
-              <w:rPr>
-                <w:rFonts w:cstheme="minorHAnsi"/>
-                <w:lang w:val="en-IN"/>
-              </w:rPr>
-              <w:t>RRF</w:t>
-            </w:r>
           </w:p>
         </w:tc>
         <w:tc>
@@ -2639,7 +2633,7 @@
               <w:jc w:val="center"/>
             </w:pPr>
             <w:r>
-              <w:t>DSFN</w:t>
+              <w:t>VIR-1</w:t>
             </w:r>
           </w:p>
         </w:tc>
@@ -2686,7 +2680,7 @@
                 <w:rFonts w:cstheme="minorHAnsi"/>
                 <w:lang w:val="en-IN"/>
               </w:rPr>
-              <w:t>RRK</w:t>
+              <w:t>RRL</w:t>
             </w:r>
           </w:p>
         </w:tc>
@@ -2822,7 +2816,7 @@
               <w:jc w:val="center"/>
             </w:pPr>
             <w:r>
-              <w:t>SGAV</w:t>
+              <w:t>NA</w:t>
             </w:r>
           </w:p>
         </w:tc>
@@ -2864,196 +2858,6 @@
                 <w:lang w:val="en-IN"/>
               </w:rPr>
             </w:pPr>
-            <w:r>
-              <w:rPr>
-                <w:rFonts w:cstheme="minorHAnsi"/>
-                <w:lang w:val="en-IN"/>
-              </w:rPr>
-              <w:t>RRF</w:t>
-            </w:r>
-          </w:p>
-        </w:tc>
-        <w:tc>
-          <w:tcPr>
-            <w:tcW w:w="1363" w:type="dxa"/>
-            <w:tcBorders>
-              <w:top w:val="single" w:sz="4" w:space="0" w:color="auto"/>
-              <w:left w:val="single" w:sz="4" w:space="0" w:color="auto"/>
-              <w:bottom w:val="single" w:sz="4" w:space="0" w:color="auto"/>
-              <w:right w:val="single" w:sz="4" w:space="0" w:color="auto"/>
-            </w:tcBorders>
-            <w:noWrap/>
-          </w:tcPr>
-          <w:p>
-            <w:pPr>
-              <w:jc w:val="center"/>
-              <w:rPr>
-                <w:rFonts w:cstheme="minorHAnsi"/>
-                <w:lang w:val="en-IN"/>
-              </w:rPr>
-            </w:pPr>
-          </w:p>
-        </w:tc>
-      </w:tr>
-      <w:tr>
-        <w:trPr>
-          <w:trHeight w:val="152"/>
-        </w:trPr>
-        <w:tc>
-          <w:tcPr>
-            <w:tcW w:w="774" w:type="dxa"/>
-            <w:tcBorders>
-              <w:top w:val="single" w:sz="4" w:space="0" w:color="auto"/>
-              <w:left w:val="single" w:sz="4" w:space="0" w:color="auto"/>
-              <w:bottom w:val="single" w:sz="4" w:space="0" w:color="auto"/>
-              <w:right w:val="single" w:sz="4" w:space="0" w:color="auto"/>
-            </w:tcBorders>
-            <w:noWrap/>
-          </w:tcPr>
-          <w:p>
-            <w:pPr>
-              <w:pStyle w:val="NoSpacing"/>
-              <w:jc w:val="center"/>
-              <w:rPr>
-                <w:rFonts w:cstheme="minorHAnsi"/>
-              </w:rPr>
-            </w:pPr>
-            <w:r>
-              <w:rPr>
-                <w:rFonts w:cstheme="minorHAnsi"/>
-              </w:rPr>
-              <w:t>5</w:t>
-            </w:r>
-          </w:p>
-        </w:tc>
-        <w:tc>
-          <w:tcPr>
-            <w:tcW w:w="1555" w:type="dxa"/>
-            <w:tcBorders>
-              <w:top w:val="single" w:sz="4" w:space="0" w:color="auto"/>
-              <w:left w:val="single" w:sz="4" w:space="0" w:color="auto"/>
-              <w:bottom w:val="single" w:sz="4" w:space="0" w:color="auto"/>
-              <w:right w:val="single" w:sz="4" w:space="0" w:color="auto"/>
-            </w:tcBorders>
-          </w:tcPr>
-          <w:p>
-            <w:pPr>
-              <w:pStyle w:val="NoSpacing"/>
-              <w:jc w:val="center"/>
-              <w:rPr>
-                <w:rFonts w:cstheme="minorHAnsi"/>
-              </w:rPr>
-            </w:pPr>
-            <w:r>
-              <w:rPr>
-                <w:rFonts w:cstheme="minorHAnsi"/>
-              </w:rPr>
-              <w:t>08:05</w:t>
-            </w:r>
-          </w:p>
-        </w:tc>
-        <w:tc>
-          <w:tcPr>
-            <w:tcW w:w="1801" w:type="dxa"/>
-            <w:tcBorders>
-              <w:top w:val="single" w:sz="4" w:space="0" w:color="auto"/>
-              <w:left w:val="single" w:sz="4" w:space="0" w:color="auto"/>
-              <w:bottom w:val="single" w:sz="4" w:space="0" w:color="auto"/>
-              <w:right w:val="single" w:sz="4" w:space="0" w:color="auto"/>
-            </w:tcBorders>
-            <w:noWrap/>
-          </w:tcPr>
-          <w:p>
-            <w:pPr>
-              <w:pStyle w:val="NoSpacing"/>
-              <w:tabs>
-                <w:tab w:val="left" w:pos="368"/>
-                <w:tab w:val="center" w:pos="767"/>
-              </w:tabs>
-              <w:jc w:val="center"/>
-              <w:rPr>
-                <w:rFonts w:cstheme="minorHAnsi"/>
-              </w:rPr>
-            </w:pPr>
-            <w:r>
-              <w:rPr>
-                <w:rFonts w:cstheme="minorHAnsi"/>
-              </w:rPr>
-              <w:t>13:1</w:t>
-            </w:r>
-            <w:r>
-              <w:rPr>
-                <w:rFonts w:cstheme="minorHAnsi"/>
-              </w:rPr>
-              <w:t>5</w:t>
-            </w:r>
-          </w:p>
-        </w:tc>
-        <w:tc>
-          <w:tcPr>
-            <w:tcW w:w="2993" w:type="dxa"/>
-            <w:tcBorders>
-              <w:top w:val="single" w:sz="4" w:space="0" w:color="auto"/>
-              <w:left w:val="single" w:sz="4" w:space="0" w:color="auto"/>
-              <w:bottom w:val="single" w:sz="4" w:space="0" w:color="auto"/>
-              <w:right w:val="single" w:sz="4" w:space="0" w:color="auto"/>
-            </w:tcBorders>
-            <w:noWrap/>
-          </w:tcPr>
-          <w:p>
-            <w:pPr>
-              <w:jc w:val="center"/>
-            </w:pPr>
-            <w:r>
-              <w:t>SGAV</w:t>
-            </w:r>
-          </w:p>
-        </w:tc>
-        <w:tc>
-          <w:tcPr>
-            <w:tcW w:w="1745" w:type="dxa"/>
-            <w:tcBorders>
-              <w:top w:val="single" w:sz="4" w:space="0" w:color="auto"/>
-              <w:left w:val="single" w:sz="4" w:space="0" w:color="auto"/>
-              <w:bottom w:val="single" w:sz="4" w:space="0" w:color="auto"/>
-              <w:right w:val="single" w:sz="4" w:space="0" w:color="auto"/>
-            </w:tcBorders>
-          </w:tcPr>
-          <w:p>
-            <w:pPr>
-              <w:pStyle w:val="NoSpacing"/>
-              <w:jc w:val="center"/>
-              <w:rPr>
-                <w:rFonts w:cstheme="minorHAnsi"/>
-              </w:rPr>
-            </w:pPr>
-          </w:p>
-        </w:tc>
-        <w:tc>
-          <w:tcPr>
-            <w:tcW w:w="908" w:type="dxa"/>
-            <w:tcBorders>
-              <w:top w:val="single" w:sz="4" w:space="0" w:color="auto"/>
-              <w:left w:val="single" w:sz="4" w:space="0" w:color="auto"/>
-              <w:bottom w:val="single" w:sz="4" w:space="0" w:color="auto"/>
-              <w:right w:val="single" w:sz="4" w:space="0" w:color="auto"/>
-            </w:tcBorders>
-          </w:tcPr>
-          <w:p>
-            <w:pPr>
-              <w:jc w:val="center"/>
-              <w:rPr>
-                <w:rFonts w:cstheme="minorHAnsi"/>
-                <w:lang w:val="en-IN"/>
-              </w:rPr>
-            </w:pPr>
-            <w:r>
-              <w:rPr>
-                <w:rFonts w:cstheme="minorHAnsi"/>
-                <w:lang w:val="en-IN"/>
-              </w:rPr>
-              <w:t>RRF</w:t>
-            </w:r>
           </w:p>
         </w:tc>
         <w:tc>
@@ -3410,7 +3214,7 @@
               <w:rPr>
                 <w:rFonts w:cstheme="minorHAnsi"/>
               </w:rPr>
-              <w:t>AS1</w:t>
+              <w:t>SSAK</w:t>
             </w:r>
           </w:p>
         </w:tc>
@@ -3759,7 +3563,7 @@
               <w:rPr>
                 <w:rFonts w:cstheme="minorHAnsi"/>
               </w:rPr>
-              <w:t>JTAN</w:t>
+              <w:t>AS1</w:t>
             </w:r>
           </w:p>
         </w:tc>
@@ -4120,7 +3924,7 @@
               <w:rPr>
                 <w:rFonts w:cstheme="minorHAnsi"/>
               </w:rPr>
-              <w:t>PANNA (L/O)</w:t>
+              <w:t>TRI-2</w:t>
             </w:r>
           </w:p>
         </w:tc>
@@ -4383,7 +4187,7 @@
               <w:rPr>
                 <w:rFonts w:cstheme="minorHAnsi"/>
               </w:rPr>
-              <w:t>DEFOS</w:t>
+              <w:t>SRAT</w:t>
             </w:r>
           </w:p>
         </w:tc>
@@ -4426,6 +4230,12 @@
                 <w:rFonts w:cstheme="minorHAnsi"/>
               </w:rPr>
             </w:pPr>
+            <w:r>
+              <w:rPr>
+                <w:rFonts w:cstheme="minorHAnsi"/>
+              </w:rPr>
+              <w:t>HLU</w:t>
+            </w:r>
           </w:p>
         </w:tc>
         <w:tc>
@@ -4566,7 +4376,7 @@
                 <w:rFonts w:cstheme="minorHAnsi"/>
                 <w:lang w:val="en-US"/>
               </w:rPr>
-              <w:t>VND1</w:t>
+              <w:t>NQO</w:t>
             </w:r>
           </w:p>
         </w:tc>
@@ -4609,6 +4419,12 @@
                 <w:rFonts w:cstheme="minorHAnsi"/>
               </w:rPr>
             </w:pPr>
+            <w:r>
+              <w:rPr>
+                <w:rFonts w:cstheme="minorHAnsi"/>
+              </w:rPr>
+              <w:t>HLH</w:t>
+            </w:r>
           </w:p>
         </w:tc>
         <w:tc>
@@ -4753,13 +4569,15 @@
               <w:jc w:val="center"/>
               <w:rPr>
                 <w:rFonts w:cstheme="minorHAnsi"/>
-              </w:rPr>
-            </w:pPr>
-            <w:r>
-              <w:rPr>
-                <w:rFonts w:cstheme="minorHAnsi"/>
-              </w:rPr>
-              <w:t>CHTR</w:t>
+                <w:b/>
+              </w:rPr>
+            </w:pPr>
+            <w:r>
+              <w:rPr>
+                <w:rFonts w:cstheme="minorHAnsi"/>
+                <w:b/>
+              </w:rPr>
+              <w:t>NA</w:t>
             </w:r>
           </w:p>
         </w:tc>
@@ -4952,7 +4770,7 @@
               <w:rPr>
                 <w:rFonts w:cstheme="minorHAnsi"/>
               </w:rPr>
-              <w:t>ABN8</w:t>
+              <w:t>BHS</w:t>
             </w:r>
           </w:p>
         </w:tc>
@@ -4995,6 +4813,12 @@
                 <w:rFonts w:cstheme="minorHAnsi"/>
               </w:rPr>
             </w:pPr>
+            <w:r>
+              <w:rPr>
+                <w:rFonts w:cstheme="minorHAnsi"/>
+              </w:rPr>
+              <w:t>HLU</w:t>
+            </w:r>
           </w:p>
         </w:tc>
         <w:tc>
@@ -5139,7 +4963,7 @@
               <w:rPr>
                 <w:rFonts w:cstheme="minorHAnsi"/>
               </w:rPr>
-              <w:t>NQO</w:t>
+              <w:t>WIN+MNW</w:t>
             </w:r>
           </w:p>
         </w:tc>
@@ -5182,6 +5006,12 @@
                 <w:rFonts w:cstheme="minorHAnsi"/>
               </w:rPr>
             </w:pPr>
+            <w:r>
+              <w:rPr>
+                <w:rFonts w:cstheme="minorHAnsi"/>
+              </w:rPr>
+              <w:t>HLH</w:t>
+            </w:r>
           </w:p>
         </w:tc>
         <w:tc>
@@ -5308,13 +5138,15 @@
               <w:jc w:val="center"/>
               <w:rPr>
                 <w:rFonts w:cstheme="minorHAnsi"/>
-              </w:rPr>
-            </w:pPr>
-            <w:r>
-              <w:rPr>
-                <w:rFonts w:cstheme="minorHAnsi"/>
-              </w:rPr>
-              <w:t>VND2</w:t>
+                <w:b/>
+              </w:rPr>
+            </w:pPr>
+            <w:r>
+              <w:rPr>
+                <w:rFonts w:cstheme="minorHAnsi"/>
+                <w:b/>
+              </w:rPr>
+              <w:t>NA</w:t>
             </w:r>
           </w:p>
         </w:tc>
@@ -5420,13 +5252,19 @@
               </w:rPr>
               <w:t>WAITING:</w:t>
             </w:r>
+            <w:r>
+              <w:rPr>
+                <w:rFonts w:cstheme="minorHAnsi"/>
+              </w:rPr>
+              <w:t>VND2,JXLR</w:t>
+            </w:r>
           </w:p>
         </w:tc>
       </w:tr>
     </w:tbl>
-    <w:bookmarkEnd w:id="0"/>
     <w:bookmarkEnd w:id="1"/>
     <w:bookmarkEnd w:id="2"/>
+    <w:bookmarkEnd w:id="3"/>
     <w:p>
       <w:pPr>
         <w:rPr>
@@ -6110,7 +5948,7 @@
                 <w:sz w:val="30"/>
                 <w:szCs w:val="30"/>
               </w:rPr>
-              <w:t>CHRU</w:t>
+              <w:t>JIND</w:t>
             </w:r>
           </w:p>
         </w:tc>
@@ -6314,7 +6152,7 @@
                 <w:sz w:val="28"/>
                 <w:szCs w:val="28"/>
               </w:rPr>
-              <w:t>TCPP CC+PROD</w:t>
+              <w:t>SJOT</w:t>
             </w:r>
           </w:p>
         </w:tc>
@@ -6531,6 +6369,14 @@
                 <w:szCs w:val="30"/>
               </w:rPr>
             </w:pPr>
+            <w:r>
+              <w:rPr>
+                <w:rFonts w:cstheme="minorHAnsi"/>
+                <w:sz w:val="30"/>
+                <w:szCs w:val="30"/>
+              </w:rPr>
+              <w:t>TCPP CC+PROD</w:t>
+            </w:r>
           </w:p>
         </w:tc>
         <w:tc>
@@ -7211,7 +7057,7 @@
           <w14:round/>
         </w14:textOutline>
       </w:rPr>
-      <w:t>16</w:t>
+      <w:t>17</w:t>
     </w:r>
     <w:r>
       <w:rPr>
@@ -7331,7 +7177,27 @@
           <w14:round/>
         </w14:textOutline>
       </w:rPr>
-      <w:t>(SUN</w:t>
+      <w:t>(MO</w:t>
+    </w:r>
+    <w:r>
+      <w:rPr>
+        <w:rFonts w:ascii="Times New Roman" w:hAnsi="Times New Roman" w:cs="Times New Roman"/>
+        <w:b/>
+        <w:color w:val="000000" w:themeColor="text1"/>
+        <w:sz w:val="28"/>
+        <w:szCs w:val="28"/>
+        <w14:shadow w14:blurRad="38100" w14:dist="19050" w14:dir="2700000" w14:sx="100000" w14:sy="100000" w14:kx="0" w14:ky="0" w14:algn="tl">
+          <w14:schemeClr w14:val="dk1">
+            <w14:alpha w14:val="60000"/>
+          </w14:schemeClr>
+        </w14:shadow>
+        <w14:textOutline w14:w="0" w14:cap="flat" w14:cmpd="sng" w14:algn="ctr">
+          <w14:noFill/>
+          <w14:prstDash w14:val="solid"/>
+          <w14:round/>
+        </w14:textOutline>
+      </w:rPr>
+      <w:t>N</w:t>
     </w:r>
     <w:r>
       <w:rPr>
@@ -8963,7 +8829,7 @@
 </file>
 
 <file path=customXml/itemProps1.xml><?xml version="1.0" encoding="utf-8"?>
-<ds:datastoreItem xmlns:ds="http://schemas.openxmlformats.org/officeDocument/2006/customXml" ds:itemID="{EF068286-8047-4878-A006-1DDA08D04FBC}">
+<ds:datastoreItem xmlns:ds="http://schemas.openxmlformats.org/officeDocument/2006/customXml" ds:itemID="{A10A2032-E849-44C7-9678-679B10F1FE05}">
   <ds:schemaRefs>
     <ds:schemaRef ds:uri="http://schemas.openxmlformats.org/officeDocument/2006/bibliography"/>
   </ds:schemaRefs>

</xml_diff>

<commit_message>
Sync - 2026-08-17 17:28
</commit_message>
<xml_diff>
--- a/files/Daily_Helicopter_Schedule.docx
+++ b/files/Daily_Helicopter_Schedule.docx
@@ -53,8 +53,6 @@
         </w:rPr>
         <w:t>TUESDAY</w:t>
       </w:r>
-      <w:bookmarkStart w:id="0" w:name="_GoBack"/>
-      <w:bookmarkEnd w:id="0"/>
       <w:r>
         <w:rPr>
           <w:rFonts w:ascii="Times New Roman" w:hAnsi="Times New Roman" w:cs="Times New Roman"/>
@@ -723,7 +721,7 @@
                 <w:rFonts w:ascii="Calibri" w:eastAsia="Calibri" w:hAnsi="Calibri" w:cs="Calibri"/>
                 <w:sz w:val="24"/>
               </w:rPr>
-              <w:t>GVHL 412</w:t>
+              <w:t>GVHL 169</w:t>
             </w:r>
           </w:p>
         </w:tc>
@@ -755,7 +753,7 @@
                 <w:rFonts w:ascii="Calibri" w:eastAsia="Calibri" w:hAnsi="Calibri" w:cs="Calibri"/>
                 <w:sz w:val="24"/>
               </w:rPr>
-              <w:t>RRF</w:t>
+              <w:t>RRL</w:t>
             </w:r>
           </w:p>
         </w:tc>
@@ -787,7 +785,7 @@
                 <w:rFonts w:ascii="Calibri" w:eastAsia="Calibri" w:hAnsi="Calibri" w:cs="Calibri"/>
                 <w:sz w:val="24"/>
               </w:rPr>
-              <w:t>08</w:t>
+              <w:t>05</w:t>
             </w:r>
           </w:p>
         </w:tc>
@@ -2222,7 +2220,7 @@
                 <w:rFonts w:ascii="Calibri" w:eastAsia="Calibri" w:hAnsi="Calibri" w:cs="Calibri"/>
                 <w:sz w:val="24"/>
               </w:rPr>
-              <w:t>GVT</w:t>
+              <w:t>RRF</w:t>
             </w:r>
           </w:p>
         </w:tc>
@@ -2731,9 +2729,8 @@
             <w:r>
               <w:rPr>
                 <w:rFonts w:ascii="Calibri" w:eastAsia="Calibri" w:hAnsi="Calibri" w:cs="Calibri"/>
-                <w:sz w:val="24"/>
-              </w:rPr>
-              <w:t>VIR-1</w:t>
+              </w:rPr>
+              <w:t>SHQ</w:t>
             </w:r>
           </w:p>
         </w:tc>
@@ -3161,9 +3158,8 @@
             <w:r>
               <w:rPr>
                 <w:rFonts w:ascii="Calibri" w:eastAsia="Calibri" w:hAnsi="Calibri" w:cs="Calibri"/>
-                <w:sz w:val="24"/>
-              </w:rPr>
-              <w:t>VIR-1</w:t>
+              </w:rPr>
+              <w:t>NLM</w:t>
             </w:r>
           </w:p>
         </w:tc>
@@ -3853,9 +3849,8 @@
             <w:r>
               <w:rPr>
                 <w:rFonts w:ascii="Calibri" w:eastAsia="Calibri" w:hAnsi="Calibri" w:cs="Calibri"/>
-                <w:sz w:val="24"/>
-              </w:rPr>
-              <w:t>SSAK</w:t>
+              </w:rPr>
+              <w:t>GAURAV</w:t>
             </w:r>
           </w:p>
         </w:tc>
@@ -4276,9 +4271,8 @@
             <w:r>
               <w:rPr>
                 <w:rFonts w:ascii="Calibri" w:eastAsia="Calibri" w:hAnsi="Calibri" w:cs="Calibri"/>
-                <w:sz w:val="24"/>
-              </w:rPr>
-              <w:t>AS1</w:t>
+              </w:rPr>
+              <w:t>VKDN2</w:t>
             </w:r>
           </w:p>
         </w:tc>
@@ -4699,17 +4693,8 @@
             <w:r>
               <w:rPr>
                 <w:rFonts w:ascii="Calibri" w:eastAsia="Calibri" w:hAnsi="Calibri" w:cs="Calibri"/>
-                <w:b/>
-                <w:sz w:val="24"/>
-              </w:rPr>
-              <w:t xml:space="preserve"> </w:t>
-            </w:r>
-            <w:r>
-              <w:rPr>
-                <w:rFonts w:ascii="Calibri" w:eastAsia="Calibri" w:hAnsi="Calibri" w:cs="Calibri"/>
-                <w:sz w:val="24"/>
-              </w:rPr>
-              <w:t>TRI-2</w:t>
+              </w:rPr>
+              <w:t>KSPR</w:t>
             </w:r>
           </w:p>
         </w:tc>
@@ -4973,9 +4958,8 @@
             <w:r>
               <w:rPr>
                 <w:rFonts w:ascii="Calibri" w:eastAsia="Calibri" w:hAnsi="Calibri" w:cs="Calibri"/>
-                <w:sz w:val="24"/>
-              </w:rPr>
-              <w:t>SRAT</w:t>
+              </w:rPr>
+              <w:t>SHQ</w:t>
             </w:r>
           </w:p>
         </w:tc>
@@ -5185,9 +5169,8 @@
             <w:r>
               <w:rPr>
                 <w:rFonts w:ascii="Calibri" w:eastAsia="Calibri" w:hAnsi="Calibri" w:cs="Calibri"/>
-                <w:sz w:val="24"/>
-              </w:rPr>
-              <w:t>NQO</w:t>
+              </w:rPr>
+              <w:t>SLQ</w:t>
             </w:r>
           </w:p>
         </w:tc>
@@ -5610,9 +5593,8 @@
             <w:r>
               <w:rPr>
                 <w:rFonts w:ascii="Calibri" w:eastAsia="Calibri" w:hAnsi="Calibri" w:cs="Calibri"/>
-                <w:sz w:val="24"/>
-              </w:rPr>
-              <w:t>BHS</w:t>
+              </w:rPr>
+              <w:t>NQO</w:t>
             </w:r>
           </w:p>
         </w:tc>
@@ -5822,9 +5804,8 @@
             <w:r>
               <w:rPr>
                 <w:rFonts w:ascii="Calibri" w:eastAsia="Calibri" w:hAnsi="Calibri" w:cs="Calibri"/>
-                <w:sz w:val="24"/>
-              </w:rPr>
-              <w:t>WIN+MNW</w:t>
+              </w:rPr>
+              <w:t>ICW</w:t>
             </w:r>
           </w:p>
         </w:tc>
@@ -6170,8 +6151,10 @@
                 <w:rFonts w:ascii="Calibri" w:eastAsia="Calibri" w:hAnsi="Calibri" w:cs="Calibri"/>
                 <w:sz w:val="24"/>
               </w:rPr>
-              <w:t>VND2,JXLR</w:t>
-            </w:r>
+              <w:t>JXLR,TRI-2</w:t>
+            </w:r>
+            <w:bookmarkStart w:id="0" w:name="_GoBack"/>
+            <w:bookmarkEnd w:id="0"/>
           </w:p>
         </w:tc>
       </w:tr>
@@ -6252,6 +6235,14 @@
           <w:u w:val="single"/>
         </w:rPr>
       </w:pPr>
+      <w:r>
+        <w:object w:dxaOrig="1188" w:dyaOrig="900">
+          <v:rect id="_x0000_i1027" style="width:59.25pt;height:45pt" o:ole="" o:preferrelative="t" stroked="f">
+            <v:imagedata r:id="rId5" o:title=""/>
+          </v:rect>
+          <o:OLEObject Type="Embed" ProgID="StaticMetafile" ShapeID="_x0000_i1027" DrawAspect="Content" ObjectID="_1848491537" r:id="rId6"/>
+        </w:object>
+      </w:r>
     </w:p>
     <w:p>
       <w:pPr>
@@ -6799,9 +6790,8 @@
             <w:r>
               <w:rPr>
                 <w:rFonts w:ascii="Calibri" w:eastAsia="Calibri" w:hAnsi="Calibri" w:cs="Calibri"/>
-                <w:sz w:val="30"/>
-              </w:rPr>
-              <w:t>JIND</w:t>
+              </w:rPr>
+              <w:t>JYOTI</w:t>
             </w:r>
           </w:p>
         </w:tc>
@@ -7016,9 +7006,8 @@
             <w:r>
               <w:rPr>
                 <w:rFonts w:ascii="Calibri" w:eastAsia="Calibri" w:hAnsi="Calibri" w:cs="Calibri"/>
-                <w:sz w:val="28"/>
-              </w:rPr>
-              <w:t>SJOT</w:t>
+              </w:rPr>
+              <w:t>CET</w:t>
             </w:r>
           </w:p>
         </w:tc>
@@ -7234,9 +7223,8 @@
             <w:r>
               <w:rPr>
                 <w:rFonts w:ascii="Calibri" w:eastAsia="Calibri" w:hAnsi="Calibri" w:cs="Calibri"/>
-                <w:sz w:val="30"/>
-              </w:rPr>
-              <w:t>TCPP CC+PROD</w:t>
+              </w:rPr>
+              <w:t>L/O</w:t>
             </w:r>
           </w:p>
         </w:tc>
@@ -7559,14 +7547,6 @@
           <w:sz w:val="20"/>
         </w:rPr>
         <w:tab/>
-      </w:r>
-      <w:r>
-        <w:object w:dxaOrig="1188" w:dyaOrig="900">
-          <v:rect id="rectole0000000000" o:spid="_x0000_i1025" style="width:59.85pt;height:44.6pt" o:ole="" o:preferrelative="t" stroked="f">
-            <v:imagedata r:id="rId5" o:title=""/>
-          </v:rect>
-          <o:OLEObject Type="Embed" ProgID="StaticMetafile" ShapeID="rectole0000000000" DrawAspect="Content" ObjectID="_1848490959" r:id="rId6"/>
-        </w:object>
       </w:r>
       <w:r>
         <w:rPr>

</xml_diff>

<commit_message>
Sync - 2026-08-18 16:03
</commit_message>
<xml_diff>
--- a/files/Daily_Helicopter_Schedule.docx
+++ b/files/Daily_Helicopter_Schedule.docx
@@ -35,7 +35,15 @@
           <w:b/>
           <w:color w:val="000000" w:themeColor="text1"/>
         </w:rPr>
-        <w:t>18.08.2026</w:t>
+        <w:t>19</w:t>
+      </w:r>
+      <w:r>
+        <w:rPr>
+          <w:rFonts w:ascii="Times New Roman" w:hAnsi="Times New Roman" w:cs="Times New Roman"/>
+          <w:b/>
+          <w:color w:val="000000" w:themeColor="text1"/>
+        </w:rPr>
+        <w:t>.08.2026</w:t>
       </w:r>
       <w:r>
         <w:rPr>
@@ -51,7 +59,15 @@
           <w:b/>
           <w:color w:val="000000" w:themeColor="text1"/>
         </w:rPr>
-        <w:t>TUESDAY</w:t>
+        <w:t>WEDN</w:t>
+      </w:r>
+      <w:r>
+        <w:rPr>
+          <w:rFonts w:ascii="Times New Roman" w:hAnsi="Times New Roman" w:cs="Times New Roman"/>
+          <w:b/>
+          <w:color w:val="000000" w:themeColor="text1"/>
+        </w:rPr>
+        <w:t>ESDAY</w:t>
       </w:r>
       <w:r>
         <w:rPr>
@@ -169,12 +185,6 @@
         <w:gridCol w:w="1185"/>
       </w:tblGrid>
       <w:tr>
-        <w:tblPrEx>
-          <w:tblCellMar>
-            <w:top w:w="0" w:type="dxa"/>
-            <w:bottom w:w="0" w:type="dxa"/>
-          </w:tblCellMar>
-        </w:tblPrEx>
         <w:tc>
           <w:tcPr>
             <w:tcW w:w="774" w:type="dxa"/>
@@ -505,12 +515,6 @@
         </w:tc>
       </w:tr>
       <w:tr>
-        <w:tblPrEx>
-          <w:tblCellMar>
-            <w:top w:w="0" w:type="dxa"/>
-            <w:bottom w:w="0" w:type="dxa"/>
-          </w:tblCellMar>
-        </w:tblPrEx>
         <w:tc>
           <w:tcPr>
             <w:tcW w:w="11139" w:type="dxa"/>
@@ -559,12 +563,6 @@
         </w:tc>
       </w:tr>
       <w:tr>
-        <w:tblPrEx>
-          <w:tblCellMar>
-            <w:top w:w="0" w:type="dxa"/>
-            <w:bottom w:w="0" w:type="dxa"/>
-          </w:tblCellMar>
-        </w:tblPrEx>
         <w:tc>
           <w:tcPr>
             <w:tcW w:w="774" w:type="dxa"/>
@@ -753,7 +751,7 @@
                 <w:rFonts w:ascii="Calibri" w:eastAsia="Calibri" w:hAnsi="Calibri" w:cs="Calibri"/>
                 <w:sz w:val="24"/>
               </w:rPr>
-              <w:t>RRL</w:t>
+              <w:t>RRK</w:t>
             </w:r>
           </w:p>
         </w:tc>
@@ -791,12 +789,6 @@
         </w:tc>
       </w:tr>
       <w:tr>
-        <w:tblPrEx>
-          <w:tblCellMar>
-            <w:top w:w="0" w:type="dxa"/>
-            <w:bottom w:w="0" w:type="dxa"/>
-          </w:tblCellMar>
-        </w:tblPrEx>
         <w:tc>
           <w:tcPr>
             <w:tcW w:w="774" w:type="dxa"/>
@@ -985,7 +977,7 @@
                 <w:rFonts w:ascii="Calibri" w:eastAsia="Calibri" w:hAnsi="Calibri" w:cs="Calibri"/>
                 <w:sz w:val="24"/>
               </w:rPr>
-              <w:t>RRK</w:t>
+              <w:t>GVT</w:t>
             </w:r>
           </w:p>
         </w:tc>
@@ -1023,12 +1015,6 @@
         </w:tc>
       </w:tr>
       <w:tr>
-        <w:tblPrEx>
-          <w:tblCellMar>
-            <w:top w:w="0" w:type="dxa"/>
-            <w:bottom w:w="0" w:type="dxa"/>
-          </w:tblCellMar>
-        </w:tblPrEx>
         <w:tc>
           <w:tcPr>
             <w:tcW w:w="774" w:type="dxa"/>
@@ -1255,12 +1241,6 @@
         </w:tc>
       </w:tr>
       <w:tr>
-        <w:tblPrEx>
-          <w:tblCellMar>
-            <w:top w:w="0" w:type="dxa"/>
-            <w:bottom w:w="0" w:type="dxa"/>
-          </w:tblCellMar>
-        </w:tblPrEx>
         <w:tc>
           <w:tcPr>
             <w:tcW w:w="11139" w:type="dxa"/>
@@ -1304,12 +1284,6 @@
         </w:tc>
       </w:tr>
       <w:tr>
-        <w:tblPrEx>
-          <w:tblCellMar>
-            <w:top w:w="0" w:type="dxa"/>
-            <w:bottom w:w="0" w:type="dxa"/>
-          </w:tblCellMar>
-        </w:tblPrEx>
         <w:tc>
           <w:tcPr>
             <w:tcW w:w="774" w:type="dxa"/>
@@ -1463,11 +1437,13 @@
               <w:jc w:val="center"/>
               <w:rPr>
                 <w:rFonts w:ascii="Calibri" w:eastAsia="Calibri" w:hAnsi="Calibri" w:cs="Calibri"/>
-              </w:rPr>
-            </w:pPr>
-            <w:r>
-              <w:rPr>
-                <w:rFonts w:ascii="Calibri" w:eastAsia="Calibri" w:hAnsi="Calibri" w:cs="Calibri"/>
+                <w:b/>
+              </w:rPr>
+            </w:pPr>
+            <w:r>
+              <w:rPr>
+                <w:rFonts w:ascii="Calibri" w:eastAsia="Calibri" w:hAnsi="Calibri" w:cs="Calibri"/>
+                <w:b/>
                 <w:sz w:val="24"/>
               </w:rPr>
               <w:t>NA</w:t>
@@ -1495,11 +1471,13 @@
               <w:jc w:val="center"/>
               <w:rPr>
                 <w:rFonts w:ascii="Calibri" w:eastAsia="Calibri" w:hAnsi="Calibri" w:cs="Calibri"/>
-              </w:rPr>
-            </w:pPr>
-            <w:r>
-              <w:rPr>
-                <w:rFonts w:ascii="Calibri" w:eastAsia="Calibri" w:hAnsi="Calibri" w:cs="Calibri"/>
+                <w:b/>
+              </w:rPr>
+            </w:pPr>
+            <w:r>
+              <w:rPr>
+                <w:rFonts w:ascii="Calibri" w:eastAsia="Calibri" w:hAnsi="Calibri" w:cs="Calibri"/>
+                <w:b/>
                 <w:sz w:val="24"/>
               </w:rPr>
               <w:t>NA</w:t>
@@ -1534,18 +1512,12 @@
                 <w:rFonts w:ascii="Calibri" w:eastAsia="Calibri" w:hAnsi="Calibri" w:cs="Calibri"/>
                 <w:sz w:val="24"/>
               </w:rPr>
-              <w:t>06</w:t>
+              <w:t>00</w:t>
             </w:r>
           </w:p>
         </w:tc>
       </w:tr>
       <w:tr>
-        <w:tblPrEx>
-          <w:tblCellMar>
-            <w:top w:w="0" w:type="dxa"/>
-            <w:bottom w:w="0" w:type="dxa"/>
-          </w:tblCellMar>
-        </w:tblPrEx>
         <w:tc>
           <w:tcPr>
             <w:tcW w:w="774" w:type="dxa"/>
@@ -1780,12 +1752,6 @@
         </w:tc>
       </w:tr>
       <w:tr>
-        <w:tblPrEx>
-          <w:tblCellMar>
-            <w:top w:w="0" w:type="dxa"/>
-            <w:bottom w:w="0" w:type="dxa"/>
-          </w:tblCellMar>
-        </w:tblPrEx>
         <w:tc>
           <w:tcPr>
             <w:tcW w:w="774" w:type="dxa"/>
@@ -2019,12 +1985,6 @@
         </w:tc>
       </w:tr>
       <w:tr>
-        <w:tblPrEx>
-          <w:tblCellMar>
-            <w:top w:w="0" w:type="dxa"/>
-            <w:bottom w:w="0" w:type="dxa"/>
-          </w:tblCellMar>
-        </w:tblPrEx>
         <w:tc>
           <w:tcPr>
             <w:tcW w:w="774" w:type="dxa"/>
@@ -2186,9 +2146,8 @@
             <w:r>
               <w:rPr>
                 <w:rFonts w:ascii="Calibri" w:eastAsia="Calibri" w:hAnsi="Calibri" w:cs="Calibri"/>
-                <w:sz w:val="24"/>
-              </w:rPr>
-              <w:t>GVHL 412</w:t>
+              </w:rPr>
+              <w:t>NA</w:t>
             </w:r>
           </w:p>
         </w:tc>
@@ -2218,9 +2177,8 @@
             <w:r>
               <w:rPr>
                 <w:rFonts w:ascii="Calibri" w:eastAsia="Calibri" w:hAnsi="Calibri" w:cs="Calibri"/>
-                <w:sz w:val="24"/>
-              </w:rPr>
-              <w:t>RRF</w:t>
+              </w:rPr>
+              <w:t>NA</w:t>
             </w:r>
           </w:p>
         </w:tc>
@@ -2252,18 +2210,12 @@
                 <w:rFonts w:ascii="Calibri" w:eastAsia="Calibri" w:hAnsi="Calibri" w:cs="Calibri"/>
                 <w:sz w:val="24"/>
               </w:rPr>
-              <w:t>06</w:t>
+              <w:t>00</w:t>
             </w:r>
           </w:p>
         </w:tc>
       </w:tr>
       <w:tr>
-        <w:tblPrEx>
-          <w:tblCellMar>
-            <w:top w:w="0" w:type="dxa"/>
-            <w:bottom w:w="0" w:type="dxa"/>
-          </w:tblCellMar>
-        </w:tblPrEx>
         <w:tc>
           <w:tcPr>
             <w:tcW w:w="11139" w:type="dxa"/>
@@ -2307,12 +2259,6 @@
         </w:tc>
       </w:tr>
       <w:tr>
-        <w:tblPrEx>
-          <w:tblCellMar>
-            <w:top w:w="0" w:type="dxa"/>
-            <w:bottom w:w="0" w:type="dxa"/>
-          </w:tblCellMar>
-        </w:tblPrEx>
         <w:tc>
           <w:tcPr>
             <w:tcW w:w="774" w:type="dxa"/>
@@ -2539,12 +2485,6 @@
         </w:tc>
       </w:tr>
       <w:tr>
-        <w:tblPrEx>
-          <w:tblCellMar>
-            <w:top w:w="0" w:type="dxa"/>
-            <w:bottom w:w="0" w:type="dxa"/>
-          </w:tblCellMar>
-        </w:tblPrEx>
         <w:tc>
           <w:tcPr>
             <w:tcW w:w="11139" w:type="dxa"/>
@@ -2597,12 +2537,6 @@
         </w:tc>
       </w:tr>
       <w:tr>
-        <w:tblPrEx>
-          <w:tblCellMar>
-            <w:top w:w="0" w:type="dxa"/>
-            <w:bottom w:w="0" w:type="dxa"/>
-          </w:tblCellMar>
-        </w:tblPrEx>
         <w:tc>
           <w:tcPr>
             <w:tcW w:w="774" w:type="dxa"/>
@@ -2730,7 +2664,7 @@
               <w:rPr>
                 <w:rFonts w:ascii="Calibri" w:eastAsia="Calibri" w:hAnsi="Calibri" w:cs="Calibri"/>
               </w:rPr>
-              <w:t>SHQ</w:t>
+              <w:t>NLM</w:t>
             </w:r>
           </w:p>
         </w:tc>
@@ -2782,6 +2716,12 @@
                 <w:rFonts w:ascii="Calibri" w:eastAsia="Calibri" w:hAnsi="Calibri" w:cs="Calibri"/>
               </w:rPr>
             </w:pPr>
+            <w:r>
+              <w:rPr>
+                <w:rFonts w:ascii="Calibri" w:eastAsia="Calibri" w:hAnsi="Calibri" w:cs="Calibri"/>
+              </w:rPr>
+              <w:t>RRL</w:t>
+            </w:r>
           </w:p>
         </w:tc>
         <w:tc>
@@ -2811,12 +2751,6 @@
         </w:tc>
       </w:tr>
       <w:tr>
-        <w:tblPrEx>
-          <w:tblCellMar>
-            <w:top w:w="0" w:type="dxa"/>
-            <w:bottom w:w="0" w:type="dxa"/>
-          </w:tblCellMar>
-        </w:tblPrEx>
         <w:tc>
           <w:tcPr>
             <w:tcW w:w="774" w:type="dxa"/>
@@ -2938,11 +2872,13 @@
               <w:jc w:val="center"/>
               <w:rPr>
                 <w:rFonts w:ascii="Calibri" w:eastAsia="Calibri" w:hAnsi="Calibri" w:cs="Calibri"/>
-              </w:rPr>
-            </w:pPr>
-            <w:r>
-              <w:rPr>
-                <w:rFonts w:ascii="Calibri" w:eastAsia="Calibri" w:hAnsi="Calibri" w:cs="Calibri"/>
+                <w:b/>
+              </w:rPr>
+            </w:pPr>
+            <w:r>
+              <w:rPr>
+                <w:rFonts w:ascii="Calibri" w:eastAsia="Calibri" w:hAnsi="Calibri" w:cs="Calibri"/>
+                <w:b/>
                 <w:sz w:val="24"/>
               </w:rPr>
               <w:t>NA</w:t>
@@ -2997,6 +2933,12 @@
                 <w:rFonts w:ascii="Calibri" w:eastAsia="Calibri" w:hAnsi="Calibri" w:cs="Calibri"/>
               </w:rPr>
             </w:pPr>
+            <w:r>
+              <w:rPr>
+                <w:rFonts w:ascii="Calibri" w:eastAsia="Calibri" w:hAnsi="Calibri" w:cs="Calibri"/>
+              </w:rPr>
+              <w:t>NA</w:t>
+            </w:r>
           </w:p>
         </w:tc>
         <w:tc>
@@ -3026,12 +2968,6 @@
         </w:tc>
       </w:tr>
       <w:tr>
-        <w:tblPrEx>
-          <w:tblCellMar>
-            <w:top w:w="0" w:type="dxa"/>
-            <w:bottom w:w="0" w:type="dxa"/>
-          </w:tblCellMar>
-        </w:tblPrEx>
         <w:tc>
           <w:tcPr>
             <w:tcW w:w="774" w:type="dxa"/>
@@ -3211,6 +3147,12 @@
                 <w:rFonts w:ascii="Calibri" w:eastAsia="Calibri" w:hAnsi="Calibri" w:cs="Calibri"/>
               </w:rPr>
             </w:pPr>
+            <w:r>
+              <w:rPr>
+                <w:rFonts w:ascii="Calibri" w:eastAsia="Calibri" w:hAnsi="Calibri" w:cs="Calibri"/>
+              </w:rPr>
+              <w:t>RRL</w:t>
+            </w:r>
           </w:p>
         </w:tc>
         <w:tc>
@@ -3240,12 +3182,6 @@
         </w:tc>
       </w:tr>
       <w:tr>
-        <w:tblPrEx>
-          <w:tblCellMar>
-            <w:top w:w="0" w:type="dxa"/>
-            <w:bottom w:w="0" w:type="dxa"/>
-          </w:tblCellMar>
-        </w:tblPrEx>
         <w:tc>
           <w:tcPr>
             <w:tcW w:w="774" w:type="dxa"/>
@@ -3342,7 +3278,14 @@
                 <w:rFonts w:ascii="Calibri" w:eastAsia="Calibri" w:hAnsi="Calibri" w:cs="Calibri"/>
                 <w:sz w:val="24"/>
               </w:rPr>
-              <w:t>11:15</w:t>
+              <w:t>11:1</w:t>
+            </w:r>
+            <w:r>
+              <w:rPr>
+                <w:rFonts w:ascii="Calibri" w:eastAsia="Calibri" w:hAnsi="Calibri" w:cs="Calibri"/>
+                <w:sz w:val="24"/>
+              </w:rPr>
+              <w:t>0</w:t>
             </w:r>
           </w:p>
         </w:tc>
@@ -3372,9 +3315,8 @@
             <w:r>
               <w:rPr>
                 <w:rFonts w:ascii="Calibri" w:eastAsia="Calibri" w:hAnsi="Calibri" w:cs="Calibri"/>
-                <w:sz w:val="24"/>
-              </w:rPr>
-              <w:t>NA</w:t>
+              </w:rPr>
+              <w:t>J EXPLR</w:t>
             </w:r>
           </w:p>
         </w:tc>
@@ -3426,6 +3368,12 @@
                 <w:rFonts w:ascii="Calibri" w:eastAsia="Calibri" w:hAnsi="Calibri" w:cs="Calibri"/>
               </w:rPr>
             </w:pPr>
+            <w:r>
+              <w:rPr>
+                <w:rFonts w:ascii="Calibri" w:eastAsia="Calibri" w:hAnsi="Calibri" w:cs="Calibri"/>
+              </w:rPr>
+              <w:t>RRF</w:t>
+            </w:r>
           </w:p>
         </w:tc>
         <w:tc>
@@ -3455,12 +3403,440 @@
         </w:tc>
       </w:tr>
       <w:tr>
-        <w:tblPrEx>
-          <w:tblCellMar>
-            <w:top w:w="0" w:type="dxa"/>
-            <w:bottom w:w="0" w:type="dxa"/>
-          </w:tblCellMar>
-        </w:tblPrEx>
+        <w:tc>
+          <w:tcPr>
+            <w:tcW w:w="774" w:type="dxa"/>
+            <w:tcBorders>
+              <w:top w:val="single" w:sz="4" w:space="0" w:color="000000"/>
+              <w:left w:val="single" w:sz="4" w:space="0" w:color="000000"/>
+              <w:bottom w:val="single" w:sz="4" w:space="0" w:color="000000"/>
+              <w:right w:val="single" w:sz="4" w:space="0" w:color="000000"/>
+            </w:tcBorders>
+            <w:shd w:val="clear" w:color="000000" w:fill="FFFFFF"/>
+            <w:tcMar>
+              <w:left w:w="108" w:type="dxa"/>
+              <w:right w:w="108" w:type="dxa"/>
+            </w:tcMar>
+          </w:tcPr>
+          <w:p>
+            <w:pPr>
+              <w:spacing w:after="0" w:line="240" w:lineRule="auto"/>
+              <w:jc w:val="center"/>
+              <w:rPr>
+                <w:rFonts w:ascii="Calibri" w:eastAsia="Calibri" w:hAnsi="Calibri" w:cs="Calibri"/>
+                <w:sz w:val="24"/>
+              </w:rPr>
+            </w:pPr>
+            <w:r>
+              <w:rPr>
+                <w:rFonts w:ascii="Calibri" w:eastAsia="Calibri" w:hAnsi="Calibri" w:cs="Calibri"/>
+                <w:sz w:val="24"/>
+              </w:rPr>
+              <w:t>5</w:t>
+            </w:r>
+          </w:p>
+        </w:tc>
+        <w:tc>
+          <w:tcPr>
+            <w:tcW w:w="1555" w:type="dxa"/>
+            <w:tcBorders>
+              <w:top w:val="single" w:sz="4" w:space="0" w:color="000000"/>
+              <w:left w:val="single" w:sz="4" w:space="0" w:color="000000"/>
+              <w:bottom w:val="single" w:sz="4" w:space="0" w:color="000000"/>
+              <w:right w:val="single" w:sz="4" w:space="0" w:color="000000"/>
+            </w:tcBorders>
+            <w:shd w:val="clear" w:color="000000" w:fill="FFFFFF"/>
+            <w:tcMar>
+              <w:left w:w="108" w:type="dxa"/>
+              <w:right w:w="108" w:type="dxa"/>
+            </w:tcMar>
+          </w:tcPr>
+          <w:p>
+            <w:pPr>
+              <w:spacing w:after="0" w:line="240" w:lineRule="auto"/>
+              <w:jc w:val="center"/>
+              <w:rPr>
+                <w:rFonts w:ascii="Calibri" w:eastAsia="Calibri" w:hAnsi="Calibri" w:cs="Calibri"/>
+                <w:sz w:val="24"/>
+              </w:rPr>
+            </w:pPr>
+            <w:r>
+              <w:rPr>
+                <w:rFonts w:ascii="Calibri" w:eastAsia="Calibri" w:hAnsi="Calibri" w:cs="Calibri"/>
+                <w:sz w:val="24"/>
+              </w:rPr>
+              <w:t>08:00</w:t>
+            </w:r>
+          </w:p>
+        </w:tc>
+        <w:tc>
+          <w:tcPr>
+            <w:tcW w:w="1801" w:type="dxa"/>
+            <w:tcBorders>
+              <w:top w:val="single" w:sz="4" w:space="0" w:color="000000"/>
+              <w:left w:val="single" w:sz="4" w:space="0" w:color="000000"/>
+              <w:bottom w:val="single" w:sz="4" w:space="0" w:color="000000"/>
+              <w:right w:val="single" w:sz="4" w:space="0" w:color="000000"/>
+            </w:tcBorders>
+            <w:shd w:val="clear" w:color="000000" w:fill="FFFFFF"/>
+            <w:tcMar>
+              <w:left w:w="108" w:type="dxa"/>
+              <w:right w:w="108" w:type="dxa"/>
+            </w:tcMar>
+          </w:tcPr>
+          <w:p>
+            <w:pPr>
+              <w:tabs>
+                <w:tab w:val="left" w:pos="368"/>
+                <w:tab w:val="center" w:pos="767"/>
+              </w:tabs>
+              <w:spacing w:after="0" w:line="240" w:lineRule="auto"/>
+              <w:jc w:val="center"/>
+              <w:rPr>
+                <w:rFonts w:ascii="Calibri" w:eastAsia="Calibri" w:hAnsi="Calibri" w:cs="Calibri"/>
+                <w:sz w:val="24"/>
+              </w:rPr>
+            </w:pPr>
+            <w:r>
+              <w:rPr>
+                <w:rFonts w:ascii="Calibri" w:eastAsia="Calibri" w:hAnsi="Calibri" w:cs="Calibri"/>
+                <w:sz w:val="24"/>
+              </w:rPr>
+              <w:t>13:00</w:t>
+            </w:r>
+          </w:p>
+        </w:tc>
+        <w:tc>
+          <w:tcPr>
+            <w:tcW w:w="2993" w:type="dxa"/>
+            <w:tcBorders>
+              <w:top w:val="single" w:sz="4" w:space="0" w:color="000000"/>
+              <w:left w:val="single" w:sz="4" w:space="0" w:color="000000"/>
+              <w:bottom w:val="single" w:sz="4" w:space="0" w:color="000000"/>
+              <w:right w:val="single" w:sz="4" w:space="0" w:color="000000"/>
+            </w:tcBorders>
+            <w:shd w:val="clear" w:color="000000" w:fill="FFFFFF"/>
+            <w:tcMar>
+              <w:left w:w="108" w:type="dxa"/>
+              <w:right w:w="108" w:type="dxa"/>
+            </w:tcMar>
+          </w:tcPr>
+          <w:p>
+            <w:pPr>
+              <w:spacing w:after="0" w:line="240" w:lineRule="auto"/>
+              <w:jc w:val="center"/>
+              <w:rPr>
+                <w:rFonts w:ascii="Calibri" w:eastAsia="Calibri" w:hAnsi="Calibri" w:cs="Calibri"/>
+              </w:rPr>
+            </w:pPr>
+            <w:r>
+              <w:rPr>
+                <w:rFonts w:ascii="Calibri" w:eastAsia="Calibri" w:hAnsi="Calibri" w:cs="Calibri"/>
+              </w:rPr>
+              <w:t>NLM</w:t>
+            </w:r>
+          </w:p>
+        </w:tc>
+        <w:tc>
+          <w:tcPr>
+            <w:tcW w:w="1745" w:type="dxa"/>
+            <w:tcBorders>
+              <w:top w:val="single" w:sz="4" w:space="0" w:color="000000"/>
+              <w:left w:val="single" w:sz="4" w:space="0" w:color="000000"/>
+              <w:bottom w:val="single" w:sz="4" w:space="0" w:color="000000"/>
+              <w:right w:val="single" w:sz="4" w:space="0" w:color="000000"/>
+            </w:tcBorders>
+            <w:shd w:val="clear" w:color="000000" w:fill="FFFFFF"/>
+            <w:tcMar>
+              <w:left w:w="108" w:type="dxa"/>
+              <w:right w:w="108" w:type="dxa"/>
+            </w:tcMar>
+          </w:tcPr>
+          <w:p>
+            <w:pPr>
+              <w:spacing w:after="0" w:line="240" w:lineRule="auto"/>
+              <w:jc w:val="center"/>
+              <w:rPr>
+                <w:rFonts w:ascii="Calibri" w:eastAsia="Calibri" w:hAnsi="Calibri" w:cs="Calibri"/>
+              </w:rPr>
+            </w:pPr>
+          </w:p>
+        </w:tc>
+        <w:tc>
+          <w:tcPr>
+            <w:tcW w:w="908" w:type="dxa"/>
+            <w:tcBorders>
+              <w:top w:val="single" w:sz="4" w:space="0" w:color="000000"/>
+              <w:left w:val="single" w:sz="4" w:space="0" w:color="000000"/>
+              <w:bottom w:val="single" w:sz="4" w:space="0" w:color="000000"/>
+              <w:right w:val="single" w:sz="4" w:space="0" w:color="000000"/>
+            </w:tcBorders>
+            <w:shd w:val="clear" w:color="000000" w:fill="FFFFFF"/>
+            <w:tcMar>
+              <w:left w:w="108" w:type="dxa"/>
+              <w:right w:w="108" w:type="dxa"/>
+            </w:tcMar>
+          </w:tcPr>
+          <w:p>
+            <w:pPr>
+              <w:spacing w:after="0" w:line="240" w:lineRule="auto"/>
+              <w:jc w:val="center"/>
+              <w:rPr>
+                <w:rFonts w:ascii="Calibri" w:eastAsia="Calibri" w:hAnsi="Calibri" w:cs="Calibri"/>
+              </w:rPr>
+            </w:pPr>
+            <w:r>
+              <w:rPr>
+                <w:rFonts w:ascii="Calibri" w:eastAsia="Calibri" w:hAnsi="Calibri" w:cs="Calibri"/>
+              </w:rPr>
+              <w:t>RRL</w:t>
+            </w:r>
+          </w:p>
+        </w:tc>
+        <w:tc>
+          <w:tcPr>
+            <w:tcW w:w="1363" w:type="dxa"/>
+            <w:tcBorders>
+              <w:top w:val="single" w:sz="4" w:space="0" w:color="000000"/>
+              <w:left w:val="single" w:sz="4" w:space="0" w:color="000000"/>
+              <w:bottom w:val="single" w:sz="4" w:space="0" w:color="000000"/>
+              <w:right w:val="single" w:sz="4" w:space="0" w:color="000000"/>
+            </w:tcBorders>
+            <w:shd w:val="clear" w:color="000000" w:fill="FFFFFF"/>
+            <w:tcMar>
+              <w:left w:w="108" w:type="dxa"/>
+              <w:right w:w="108" w:type="dxa"/>
+            </w:tcMar>
+          </w:tcPr>
+          <w:p>
+            <w:pPr>
+              <w:spacing w:after="0" w:line="240" w:lineRule="auto"/>
+              <w:jc w:val="center"/>
+              <w:rPr>
+                <w:rFonts w:ascii="Calibri" w:eastAsia="Calibri" w:hAnsi="Calibri" w:cs="Calibri"/>
+              </w:rPr>
+            </w:pPr>
+          </w:p>
+        </w:tc>
+      </w:tr>
+      <w:tr>
+        <w:tc>
+          <w:tcPr>
+            <w:tcW w:w="774" w:type="dxa"/>
+            <w:tcBorders>
+              <w:top w:val="single" w:sz="4" w:space="0" w:color="000000"/>
+              <w:left w:val="single" w:sz="4" w:space="0" w:color="000000"/>
+              <w:bottom w:val="single" w:sz="4" w:space="0" w:color="000000"/>
+              <w:right w:val="single" w:sz="4" w:space="0" w:color="000000"/>
+            </w:tcBorders>
+            <w:shd w:val="clear" w:color="000000" w:fill="FFFFFF"/>
+            <w:tcMar>
+              <w:left w:w="108" w:type="dxa"/>
+              <w:right w:w="108" w:type="dxa"/>
+            </w:tcMar>
+          </w:tcPr>
+          <w:p>
+            <w:pPr>
+              <w:spacing w:after="0" w:line="240" w:lineRule="auto"/>
+              <w:jc w:val="center"/>
+              <w:rPr>
+                <w:rFonts w:ascii="Calibri" w:eastAsia="Calibri" w:hAnsi="Calibri" w:cs="Calibri"/>
+                <w:sz w:val="24"/>
+              </w:rPr>
+            </w:pPr>
+            <w:r>
+              <w:rPr>
+                <w:rFonts w:ascii="Calibri" w:eastAsia="Calibri" w:hAnsi="Calibri" w:cs="Calibri"/>
+                <w:sz w:val="24"/>
+              </w:rPr>
+              <w:t>6</w:t>
+            </w:r>
+          </w:p>
+        </w:tc>
+        <w:tc>
+          <w:tcPr>
+            <w:tcW w:w="1555" w:type="dxa"/>
+            <w:tcBorders>
+              <w:top w:val="single" w:sz="4" w:space="0" w:color="000000"/>
+              <w:left w:val="single" w:sz="4" w:space="0" w:color="000000"/>
+              <w:bottom w:val="single" w:sz="4" w:space="0" w:color="000000"/>
+              <w:right w:val="single" w:sz="4" w:space="0" w:color="000000"/>
+            </w:tcBorders>
+            <w:shd w:val="clear" w:color="000000" w:fill="FFFFFF"/>
+            <w:tcMar>
+              <w:left w:w="108" w:type="dxa"/>
+              <w:right w:w="108" w:type="dxa"/>
+            </w:tcMar>
+          </w:tcPr>
+          <w:p>
+            <w:pPr>
+              <w:spacing w:after="0" w:line="240" w:lineRule="auto"/>
+              <w:jc w:val="center"/>
+              <w:rPr>
+                <w:rFonts w:ascii="Calibri" w:eastAsia="Calibri" w:hAnsi="Calibri" w:cs="Calibri"/>
+                <w:sz w:val="24"/>
+              </w:rPr>
+            </w:pPr>
+            <w:r>
+              <w:rPr>
+                <w:rFonts w:ascii="Calibri" w:eastAsia="Calibri" w:hAnsi="Calibri" w:cs="Calibri"/>
+                <w:sz w:val="24"/>
+              </w:rPr>
+              <w:t>08:20</w:t>
+            </w:r>
+          </w:p>
+        </w:tc>
+        <w:tc>
+          <w:tcPr>
+            <w:tcW w:w="1801" w:type="dxa"/>
+            <w:tcBorders>
+              <w:top w:val="single" w:sz="4" w:space="0" w:color="000000"/>
+              <w:left w:val="single" w:sz="4" w:space="0" w:color="000000"/>
+              <w:bottom w:val="single" w:sz="4" w:space="0" w:color="000000"/>
+              <w:right w:val="single" w:sz="4" w:space="0" w:color="000000"/>
+            </w:tcBorders>
+            <w:shd w:val="clear" w:color="000000" w:fill="FFFFFF"/>
+            <w:tcMar>
+              <w:left w:w="108" w:type="dxa"/>
+              <w:right w:w="108" w:type="dxa"/>
+            </w:tcMar>
+          </w:tcPr>
+          <w:p>
+            <w:pPr>
+              <w:tabs>
+                <w:tab w:val="left" w:pos="368"/>
+                <w:tab w:val="center" w:pos="767"/>
+              </w:tabs>
+              <w:spacing w:after="0" w:line="240" w:lineRule="auto"/>
+              <w:jc w:val="center"/>
+              <w:rPr>
+                <w:rFonts w:ascii="Calibri" w:eastAsia="Calibri" w:hAnsi="Calibri" w:cs="Calibri"/>
+                <w:sz w:val="24"/>
+              </w:rPr>
+            </w:pPr>
+            <w:r>
+              <w:rPr>
+                <w:rFonts w:ascii="Calibri" w:eastAsia="Calibri" w:hAnsi="Calibri" w:cs="Calibri"/>
+                <w:sz w:val="24"/>
+              </w:rPr>
+              <w:t>13:10</w:t>
+            </w:r>
+          </w:p>
+        </w:tc>
+        <w:tc>
+          <w:tcPr>
+            <w:tcW w:w="2993" w:type="dxa"/>
+            <w:tcBorders>
+              <w:top w:val="single" w:sz="4" w:space="0" w:color="000000"/>
+              <w:left w:val="single" w:sz="4" w:space="0" w:color="000000"/>
+              <w:bottom w:val="single" w:sz="4" w:space="0" w:color="000000"/>
+              <w:right w:val="single" w:sz="4" w:space="0" w:color="000000"/>
+            </w:tcBorders>
+            <w:shd w:val="clear" w:color="000000" w:fill="FFFFFF"/>
+            <w:tcMar>
+              <w:left w:w="108" w:type="dxa"/>
+              <w:right w:w="108" w:type="dxa"/>
+            </w:tcMar>
+          </w:tcPr>
+          <w:p>
+            <w:pPr>
+              <w:spacing w:after="0" w:line="240" w:lineRule="auto"/>
+              <w:jc w:val="center"/>
+              <w:rPr>
+                <w:rFonts w:ascii="Calibri" w:eastAsia="Calibri" w:hAnsi="Calibri" w:cs="Calibri"/>
+              </w:rPr>
+            </w:pPr>
+            <w:r>
+              <w:rPr>
+                <w:rFonts w:ascii="Calibri" w:eastAsia="Calibri" w:hAnsi="Calibri" w:cs="Calibri"/>
+              </w:rPr>
+              <w:t>RATNA</w:t>
+            </w:r>
+          </w:p>
+        </w:tc>
+        <w:tc>
+          <w:tcPr>
+            <w:tcW w:w="1745" w:type="dxa"/>
+            <w:tcBorders>
+              <w:top w:val="single" w:sz="4" w:space="0" w:color="000000"/>
+              <w:left w:val="single" w:sz="4" w:space="0" w:color="000000"/>
+              <w:bottom w:val="single" w:sz="4" w:space="0" w:color="000000"/>
+              <w:right w:val="single" w:sz="4" w:space="0" w:color="000000"/>
+            </w:tcBorders>
+            <w:shd w:val="clear" w:color="000000" w:fill="FFFFFF"/>
+            <w:tcMar>
+              <w:left w:w="108" w:type="dxa"/>
+              <w:right w:w="108" w:type="dxa"/>
+            </w:tcMar>
+          </w:tcPr>
+          <w:p>
+            <w:pPr>
+              <w:spacing w:after="0" w:line="240" w:lineRule="auto"/>
+              <w:jc w:val="center"/>
+              <w:rPr>
+                <w:rFonts w:ascii="Calibri" w:eastAsia="Calibri" w:hAnsi="Calibri" w:cs="Calibri"/>
+              </w:rPr>
+            </w:pPr>
+          </w:p>
+        </w:tc>
+        <w:tc>
+          <w:tcPr>
+            <w:tcW w:w="908" w:type="dxa"/>
+            <w:tcBorders>
+              <w:top w:val="single" w:sz="4" w:space="0" w:color="000000"/>
+              <w:left w:val="single" w:sz="4" w:space="0" w:color="000000"/>
+              <w:bottom w:val="single" w:sz="4" w:space="0" w:color="000000"/>
+              <w:right w:val="single" w:sz="4" w:space="0" w:color="000000"/>
+            </w:tcBorders>
+            <w:shd w:val="clear" w:color="000000" w:fill="FFFFFF"/>
+            <w:tcMar>
+              <w:left w:w="108" w:type="dxa"/>
+              <w:right w:w="108" w:type="dxa"/>
+            </w:tcMar>
+          </w:tcPr>
+          <w:p>
+            <w:pPr>
+              <w:spacing w:after="0" w:line="240" w:lineRule="auto"/>
+              <w:jc w:val="center"/>
+              <w:rPr>
+                <w:rFonts w:ascii="Calibri" w:eastAsia="Calibri" w:hAnsi="Calibri" w:cs="Calibri"/>
+              </w:rPr>
+            </w:pPr>
+            <w:r>
+              <w:rPr>
+                <w:rFonts w:ascii="Calibri" w:eastAsia="Calibri" w:hAnsi="Calibri" w:cs="Calibri"/>
+              </w:rPr>
+              <w:t>RRF</w:t>
+            </w:r>
+          </w:p>
+        </w:tc>
+        <w:tc>
+          <w:tcPr>
+            <w:tcW w:w="1363" w:type="dxa"/>
+            <w:tcBorders>
+              <w:top w:val="single" w:sz="4" w:space="0" w:color="000000"/>
+              <w:left w:val="single" w:sz="4" w:space="0" w:color="000000"/>
+              <w:bottom w:val="single" w:sz="4" w:space="0" w:color="000000"/>
+              <w:right w:val="single" w:sz="4" w:space="0" w:color="000000"/>
+            </w:tcBorders>
+            <w:shd w:val="clear" w:color="000000" w:fill="FFFFFF"/>
+            <w:tcMar>
+              <w:left w:w="108" w:type="dxa"/>
+              <w:right w:w="108" w:type="dxa"/>
+            </w:tcMar>
+          </w:tcPr>
+          <w:p>
+            <w:pPr>
+              <w:spacing w:after="0" w:line="240" w:lineRule="auto"/>
+              <w:jc w:val="center"/>
+              <w:rPr>
+                <w:rFonts w:ascii="Calibri" w:eastAsia="Calibri" w:hAnsi="Calibri" w:cs="Calibri"/>
+              </w:rPr>
+            </w:pPr>
+          </w:p>
+        </w:tc>
+      </w:tr>
+      <w:tr>
         <w:tc>
           <w:tcPr>
             <w:tcW w:w="11139" w:type="dxa"/>
@@ -3509,12 +3885,6 @@
         </w:tc>
       </w:tr>
       <w:tr>
-        <w:tblPrEx>
-          <w:tblCellMar>
-            <w:top w:w="0" w:type="dxa"/>
-            <w:bottom w:w="0" w:type="dxa"/>
-          </w:tblCellMar>
-        </w:tblPrEx>
         <w:tc>
           <w:tcPr>
             <w:tcW w:w="774" w:type="dxa"/>
@@ -3721,12 +4091,6 @@
         </w:tc>
       </w:tr>
       <w:tr>
-        <w:tblPrEx>
-          <w:tblCellMar>
-            <w:top w:w="0" w:type="dxa"/>
-            <w:bottom w:w="0" w:type="dxa"/>
-          </w:tblCellMar>
-        </w:tblPrEx>
         <w:tc>
           <w:tcPr>
             <w:tcW w:w="774" w:type="dxa"/>
@@ -3850,7 +4214,7 @@
               <w:rPr>
                 <w:rFonts w:ascii="Calibri" w:eastAsia="Calibri" w:hAnsi="Calibri" w:cs="Calibri"/>
               </w:rPr>
-              <w:t>GAURAV</w:t>
+              <w:t>TRI-2</w:t>
             </w:r>
           </w:p>
         </w:tc>
@@ -3931,12 +4295,6 @@
         </w:tc>
       </w:tr>
       <w:tr>
-        <w:tblPrEx>
-          <w:tblCellMar>
-            <w:top w:w="0" w:type="dxa"/>
-            <w:bottom w:w="0" w:type="dxa"/>
-          </w:tblCellMar>
-        </w:tblPrEx>
         <w:tc>
           <w:tcPr>
             <w:tcW w:w="774" w:type="dxa"/>
@@ -4143,12 +4501,6 @@
         </w:tc>
       </w:tr>
       <w:tr>
-        <w:tblPrEx>
-          <w:tblCellMar>
-            <w:top w:w="0" w:type="dxa"/>
-            <w:bottom w:w="0" w:type="dxa"/>
-          </w:tblCellMar>
-        </w:tblPrEx>
         <w:tc>
           <w:tcPr>
             <w:tcW w:w="774" w:type="dxa"/>
@@ -4272,7 +4624,7 @@
               <w:rPr>
                 <w:rFonts w:ascii="Calibri" w:eastAsia="Calibri" w:hAnsi="Calibri" w:cs="Calibri"/>
               </w:rPr>
-              <w:t>VKDN2</w:t>
+              <w:t>ADM10</w:t>
             </w:r>
           </w:p>
         </w:tc>
@@ -4353,12 +4705,6 @@
         </w:tc>
       </w:tr>
       <w:tr>
-        <w:tblPrEx>
-          <w:tblCellMar>
-            <w:top w:w="0" w:type="dxa"/>
-            <w:bottom w:w="0" w:type="dxa"/>
-          </w:tblCellMar>
-        </w:tblPrEx>
         <w:tc>
           <w:tcPr>
             <w:tcW w:w="774" w:type="dxa"/>
@@ -4565,12 +4911,6 @@
         </w:tc>
       </w:tr>
       <w:tr>
-        <w:tblPrEx>
-          <w:tblCellMar>
-            <w:top w:w="0" w:type="dxa"/>
-            <w:bottom w:w="0" w:type="dxa"/>
-          </w:tblCellMar>
-        </w:tblPrEx>
         <w:tc>
           <w:tcPr>
             <w:tcW w:w="774" w:type="dxa"/>
@@ -4775,12 +5115,6 @@
         </w:tc>
       </w:tr>
       <w:tr>
-        <w:tblPrEx>
-          <w:tblCellMar>
-            <w:top w:w="0" w:type="dxa"/>
-            <w:bottom w:w="0" w:type="dxa"/>
-          </w:tblCellMar>
-        </w:tblPrEx>
         <w:tc>
           <w:tcPr>
             <w:tcW w:w="11139" w:type="dxa"/>
@@ -4825,12 +5159,6 @@
         </w:tc>
       </w:tr>
       <w:tr>
-        <w:tblPrEx>
-          <w:tblCellMar>
-            <w:top w:w="0" w:type="dxa"/>
-            <w:bottom w:w="0" w:type="dxa"/>
-          </w:tblCellMar>
-        </w:tblPrEx>
         <w:tc>
           <w:tcPr>
             <w:tcW w:w="774" w:type="dxa"/>
@@ -4959,7 +5287,7 @@
               <w:rPr>
                 <w:rFonts w:ascii="Calibri" w:eastAsia="Calibri" w:hAnsi="Calibri" w:cs="Calibri"/>
               </w:rPr>
-              <w:t>SHQ</w:t>
+              <w:t>SCA</w:t>
             </w:r>
           </w:p>
         </w:tc>
@@ -5040,12 +5368,6 @@
         </w:tc>
       </w:tr>
       <w:tr>
-        <w:tblPrEx>
-          <w:tblCellMar>
-            <w:top w:w="0" w:type="dxa"/>
-            <w:bottom w:w="0" w:type="dxa"/>
-          </w:tblCellMar>
-        </w:tblPrEx>
         <w:tc>
           <w:tcPr>
             <w:tcW w:w="774" w:type="dxa"/>
@@ -5170,7 +5492,7 @@
               <w:rPr>
                 <w:rFonts w:ascii="Calibri" w:eastAsia="Calibri" w:hAnsi="Calibri" w:cs="Calibri"/>
               </w:rPr>
-              <w:t>SLQ</w:t>
+              <w:t>SMRT</w:t>
             </w:r>
           </w:p>
         </w:tc>
@@ -5251,12 +5573,6 @@
         </w:tc>
       </w:tr>
       <w:tr>
-        <w:tblPrEx>
-          <w:tblCellMar>
-            <w:top w:w="0" w:type="dxa"/>
-            <w:bottom w:w="0" w:type="dxa"/>
-          </w:tblCellMar>
-        </w:tblPrEx>
         <w:tc>
           <w:tcPr>
             <w:tcW w:w="774" w:type="dxa"/>
@@ -5464,12 +5780,6 @@
         </w:tc>
       </w:tr>
       <w:tr>
-        <w:tblPrEx>
-          <w:tblCellMar>
-            <w:top w:w="0" w:type="dxa"/>
-            <w:bottom w:w="0" w:type="dxa"/>
-          </w:tblCellMar>
-        </w:tblPrEx>
         <w:tc>
           <w:tcPr>
             <w:tcW w:w="774" w:type="dxa"/>
@@ -5594,7 +5904,7 @@
               <w:rPr>
                 <w:rFonts w:ascii="Calibri" w:eastAsia="Calibri" w:hAnsi="Calibri" w:cs="Calibri"/>
               </w:rPr>
-              <w:t>NQO</w:t>
+              <w:t>MNW</w:t>
             </w:r>
           </w:p>
         </w:tc>
@@ -5675,12 +5985,6 @@
         </w:tc>
       </w:tr>
       <w:tr>
-        <w:tblPrEx>
-          <w:tblCellMar>
-            <w:top w:w="0" w:type="dxa"/>
-            <w:bottom w:w="0" w:type="dxa"/>
-          </w:tblCellMar>
-        </w:tblPrEx>
         <w:tc>
           <w:tcPr>
             <w:tcW w:w="774" w:type="dxa"/>
@@ -5805,7 +6109,7 @@
               <w:rPr>
                 <w:rFonts w:ascii="Calibri" w:eastAsia="Calibri" w:hAnsi="Calibri" w:cs="Calibri"/>
               </w:rPr>
-              <w:t>ICW</w:t>
+              <w:t>SHAKTI</w:t>
             </w:r>
           </w:p>
         </w:tc>
@@ -5886,12 +6190,6 @@
         </w:tc>
       </w:tr>
       <w:tr>
-        <w:tblPrEx>
-          <w:tblCellMar>
-            <w:top w:w="0" w:type="dxa"/>
-            <w:bottom w:w="0" w:type="dxa"/>
-          </w:tblCellMar>
-        </w:tblPrEx>
         <w:tc>
           <w:tcPr>
             <w:tcW w:w="774" w:type="dxa"/>
@@ -5985,7 +6283,7 @@
                 <w:rFonts w:ascii="Calibri" w:eastAsia="Calibri" w:hAnsi="Calibri" w:cs="Calibri"/>
                 <w:sz w:val="24"/>
               </w:rPr>
-              <w:t>11:30</w:t>
+              <w:t>13:00</w:t>
             </w:r>
           </w:p>
         </w:tc>
@@ -6010,13 +6308,13 @@
               <w:jc w:val="center"/>
               <w:rPr>
                 <w:rFonts w:ascii="Calibri" w:eastAsia="Calibri" w:hAnsi="Calibri" w:cs="Calibri"/>
-              </w:rPr>
-            </w:pPr>
-            <w:r>
-              <w:rPr>
-                <w:rFonts w:ascii="Calibri" w:eastAsia="Calibri" w:hAnsi="Calibri" w:cs="Calibri"/>
                 <w:b/>
-                <w:sz w:val="24"/>
+              </w:rPr>
+            </w:pPr>
+            <w:r>
+              <w:rPr>
+                <w:rFonts w:ascii="Calibri" w:eastAsia="Calibri" w:hAnsi="Calibri" w:cs="Calibri"/>
+                <w:b/>
               </w:rPr>
               <w:t>NA</w:t>
             </w:r>
@@ -6099,12 +6397,6 @@
         </w:tc>
       </w:tr>
       <w:tr>
-        <w:tblPrEx>
-          <w:tblCellMar>
-            <w:top w:w="0" w:type="dxa"/>
-            <w:bottom w:w="0" w:type="dxa"/>
-          </w:tblCellMar>
-        </w:tblPrEx>
         <w:tc>
           <w:tcPr>
             <w:tcW w:w="11139" w:type="dxa"/>
@@ -6149,12 +6441,34 @@
             <w:r>
               <w:rPr>
                 <w:rFonts w:ascii="Calibri" w:eastAsia="Calibri" w:hAnsi="Calibri" w:cs="Calibri"/>
-                <w:sz w:val="24"/>
-              </w:rPr>
-              <w:t>JXLR,TRI-2</w:t>
+                <w:b/>
+                <w:sz w:val="24"/>
+              </w:rPr>
+              <w:t>AS1,</w:t>
             </w:r>
             <w:bookmarkStart w:id="0" w:name="_GoBack"/>
             <w:bookmarkEnd w:id="0"/>
+            <w:r>
+              <w:rPr>
+                <w:rFonts w:ascii="Calibri" w:eastAsia="Calibri" w:hAnsi="Calibri" w:cs="Calibri"/>
+                <w:sz w:val="24"/>
+              </w:rPr>
+              <w:t>DISC1,</w:t>
+            </w:r>
+            <w:r>
+              <w:rPr>
+                <w:rFonts w:ascii="Calibri" w:eastAsia="Calibri" w:hAnsi="Calibri" w:cs="Calibri"/>
+                <w:sz w:val="24"/>
+              </w:rPr>
+              <w:t>FOSSIL,</w:t>
+            </w:r>
+            <w:r>
+              <w:rPr>
+                <w:rFonts w:ascii="Calibri" w:eastAsia="Calibri" w:hAnsi="Calibri" w:cs="Calibri"/>
+                <w:sz w:val="24"/>
+              </w:rPr>
+              <w:t>J SUP</w:t>
+            </w:r>
           </w:p>
         </w:tc>
       </w:tr>
@@ -6237,10 +6551,10 @@
       </w:pPr>
       <w:r>
         <w:object w:dxaOrig="1188" w:dyaOrig="900">
-          <v:rect id="_x0000_i1027" style="width:59.25pt;height:45pt" o:ole="" o:preferrelative="t" stroked="f">
+          <v:rect id="_x0000_i1025" style="width:59.35pt;height:45.1pt" o:ole="" o:preferrelative="t" stroked="f">
             <v:imagedata r:id="rId5" o:title=""/>
           </v:rect>
-          <o:OLEObject Type="Embed" ProgID="StaticMetafile" ShapeID="_x0000_i1027" DrawAspect="Content" ObjectID="_1848491537" r:id="rId6"/>
+          <o:OLEObject Type="Embed" ProgID="StaticMetafile" ShapeID="_x0000_i1025" DrawAspect="Content" ObjectID="_1848573282" r:id="rId6"/>
         </w:object>
       </w:r>
     </w:p>
@@ -6262,7 +6576,6 @@
           <w:sz w:val="40"/>
           <w:u w:val="single"/>
         </w:rPr>
-        <w:lastRenderedPageBreak/>
         <w:t>SURAT</w:t>
       </w:r>
     </w:p>
@@ -6286,12 +6599,6 @@
         <w:gridCol w:w="1294"/>
       </w:tblGrid>
       <w:tr>
-        <w:tblPrEx>
-          <w:tblCellMar>
-            <w:top w:w="0" w:type="dxa"/>
-            <w:bottom w:w="0" w:type="dxa"/>
-          </w:tblCellMar>
-        </w:tblPrEx>
         <w:tc>
           <w:tcPr>
             <w:tcW w:w="611" w:type="dxa"/>
@@ -6597,12 +6904,6 @@
         </w:tc>
       </w:tr>
       <w:tr>
-        <w:tblPrEx>
-          <w:tblCellMar>
-            <w:top w:w="0" w:type="dxa"/>
-            <w:bottom w:w="0" w:type="dxa"/>
-          </w:tblCellMar>
-        </w:tblPrEx>
         <w:tc>
           <w:tcPr>
             <w:tcW w:w="10695" w:type="dxa"/>
@@ -6662,12 +6963,6 @@
         </w:tc>
       </w:tr>
       <w:tr>
-        <w:tblPrEx>
-          <w:tblCellMar>
-            <w:top w:w="0" w:type="dxa"/>
-            <w:bottom w:w="0" w:type="dxa"/>
-          </w:tblCellMar>
-        </w:tblPrEx>
         <w:tc>
           <w:tcPr>
             <w:tcW w:w="611" w:type="dxa"/>
@@ -6791,7 +7086,7 @@
               <w:rPr>
                 <w:rFonts w:ascii="Calibri" w:eastAsia="Calibri" w:hAnsi="Calibri" w:cs="Calibri"/>
               </w:rPr>
-              <w:t>JYOTI</w:t>
+              <w:t>CHARU</w:t>
             </w:r>
           </w:p>
         </w:tc>
@@ -6878,12 +7173,6 @@
         </w:tc>
       </w:tr>
       <w:tr>
-        <w:tblPrEx>
-          <w:tblCellMar>
-            <w:top w:w="0" w:type="dxa"/>
-            <w:bottom w:w="0" w:type="dxa"/>
-          </w:tblCellMar>
-        </w:tblPrEx>
         <w:tc>
           <w:tcPr>
             <w:tcW w:w="611" w:type="dxa"/>
@@ -7007,7 +7296,7 @@
               <w:rPr>
                 <w:rFonts w:ascii="Calibri" w:eastAsia="Calibri" w:hAnsi="Calibri" w:cs="Calibri"/>
               </w:rPr>
-              <w:t>CET</w:t>
+              <w:t>J STAR</w:t>
             </w:r>
           </w:p>
         </w:tc>
@@ -7095,12 +7384,6 @@
         </w:tc>
       </w:tr>
       <w:tr>
-        <w:tblPrEx>
-          <w:tblCellMar>
-            <w:top w:w="0" w:type="dxa"/>
-            <w:bottom w:w="0" w:type="dxa"/>
-          </w:tblCellMar>
-        </w:tblPrEx>
         <w:tc>
           <w:tcPr>
             <w:tcW w:w="611" w:type="dxa"/>
@@ -7312,12 +7595,6 @@
         </w:tc>
       </w:tr>
       <w:tr>
-        <w:tblPrEx>
-          <w:tblCellMar>
-            <w:top w:w="0" w:type="dxa"/>
-            <w:bottom w:w="0" w:type="dxa"/>
-          </w:tblCellMar>
-        </w:tblPrEx>
         <w:tc>
           <w:tcPr>
             <w:tcW w:w="611" w:type="dxa"/>
@@ -8111,6 +8388,36 @@
       <w:lang w:val="en-US" w:eastAsia="en-US"/>
     </w:rPr>
   </w:style>
+  <w:style w:type="paragraph" w:styleId="BalloonText">
+    <w:name w:val="Balloon Text"/>
+    <w:basedOn w:val="Normal"/>
+    <w:link w:val="BalloonTextChar"/>
+    <w:uiPriority w:val="99"/>
+    <w:semiHidden/>
+    <w:unhideWhenUsed/>
+    <w:rsid w:val="00542091"/>
+    <w:pPr>
+      <w:spacing w:after="0" w:line="240" w:lineRule="auto"/>
+    </w:pPr>
+    <w:rPr>
+      <w:rFonts w:ascii="Segoe UI" w:hAnsi="Segoe UI" w:cs="Segoe UI"/>
+      <w:sz w:val="18"/>
+      <w:szCs w:val="18"/>
+    </w:rPr>
+  </w:style>
+  <w:style w:type="character" w:customStyle="1" w:styleId="BalloonTextChar">
+    <w:name w:val="Balloon Text Char"/>
+    <w:basedOn w:val="DefaultParagraphFont"/>
+    <w:link w:val="BalloonText"/>
+    <w:uiPriority w:val="99"/>
+    <w:semiHidden/>
+    <w:rsid w:val="00542091"/>
+    <w:rPr>
+      <w:rFonts w:ascii="Segoe UI" w:hAnsi="Segoe UI" w:cs="Segoe UI"/>
+      <w:sz w:val="18"/>
+      <w:szCs w:val="18"/>
+    </w:rPr>
+  </w:style>
 </w:styles>
 </file>
 

</xml_diff>

<commit_message>
Sync - 2026-08-19 16:07
</commit_message>
<xml_diff>
--- a/files/Daily_Helicopter_Schedule.docx
+++ b/files/Daily_Helicopter_Schedule.docx
@@ -35,7 +35,7 @@
           <w:b/>
           <w:color w:val="000000" w:themeColor="text1"/>
         </w:rPr>
-        <w:t>19</w:t>
+        <w:t>20</w:t>
       </w:r>
       <w:r>
         <w:rPr>
@@ -59,7 +59,7 @@
           <w:b/>
           <w:color w:val="000000" w:themeColor="text1"/>
         </w:rPr>
-        <w:t>WEDN</w:t>
+        <w:t>THUR</w:t>
       </w:r>
       <w:r>
         <w:rPr>
@@ -67,7 +67,7 @@
           <w:b/>
           <w:color w:val="000000" w:themeColor="text1"/>
         </w:rPr>
-        <w:t>ESDAY</w:t>
+        <w:t>SDAY</w:t>
       </w:r>
       <w:r>
         <w:rPr>
@@ -176,13 +176,13 @@
         <w:tblLook w:val="04A0" w:firstRow="1" w:lastRow="0" w:firstColumn="1" w:lastColumn="0" w:noHBand="0" w:noVBand="1"/>
       </w:tblPr>
       <w:tblGrid>
-        <w:gridCol w:w="634"/>
-        <w:gridCol w:w="1427"/>
-        <w:gridCol w:w="1381"/>
-        <w:gridCol w:w="1917"/>
-        <w:gridCol w:w="1420"/>
+        <w:gridCol w:w="620"/>
+        <w:gridCol w:w="1414"/>
+        <w:gridCol w:w="1339"/>
+        <w:gridCol w:w="1810"/>
+        <w:gridCol w:w="1387"/>
         <w:gridCol w:w="1180"/>
-        <w:gridCol w:w="1185"/>
+        <w:gridCol w:w="1168"/>
       </w:tblGrid>
       <w:tr>
         <w:tc>
@@ -712,14 +712,15 @@
               <w:jc w:val="center"/>
               <w:rPr>
                 <w:rFonts w:ascii="Calibri" w:eastAsia="Calibri" w:hAnsi="Calibri" w:cs="Calibri"/>
-              </w:rPr>
-            </w:pPr>
-            <w:r>
-              <w:rPr>
-                <w:rFonts w:ascii="Calibri" w:eastAsia="Calibri" w:hAnsi="Calibri" w:cs="Calibri"/>
-                <w:sz w:val="24"/>
-              </w:rPr>
-              <w:t>GVHL 169</w:t>
+                <w:b/>
+              </w:rPr>
+            </w:pPr>
+            <w:r>
+              <w:rPr>
+                <w:rFonts w:ascii="Calibri" w:eastAsia="Calibri" w:hAnsi="Calibri" w:cs="Calibri"/>
+                <w:b/>
+              </w:rPr>
+              <w:t>NA</w:t>
             </w:r>
           </w:p>
         </w:tc>
@@ -744,14 +745,15 @@
               <w:jc w:val="center"/>
               <w:rPr>
                 <w:rFonts w:ascii="Calibri" w:eastAsia="Calibri" w:hAnsi="Calibri" w:cs="Calibri"/>
-              </w:rPr>
-            </w:pPr>
-            <w:r>
-              <w:rPr>
-                <w:rFonts w:ascii="Calibri" w:eastAsia="Calibri" w:hAnsi="Calibri" w:cs="Calibri"/>
-                <w:sz w:val="24"/>
-              </w:rPr>
-              <w:t>RRK</w:t>
+                <w:b/>
+              </w:rPr>
+            </w:pPr>
+            <w:r>
+              <w:rPr>
+                <w:rFonts w:ascii="Calibri" w:eastAsia="Calibri" w:hAnsi="Calibri" w:cs="Calibri"/>
+                <w:b/>
+              </w:rPr>
+              <w:t>NA</w:t>
             </w:r>
           </w:p>
         </w:tc>
@@ -778,13 +780,6 @@
                 <w:rFonts w:ascii="Calibri" w:eastAsia="Calibri" w:hAnsi="Calibri" w:cs="Calibri"/>
               </w:rPr>
             </w:pPr>
-            <w:r>
-              <w:rPr>
-                <w:rFonts w:ascii="Calibri" w:eastAsia="Calibri" w:hAnsi="Calibri" w:cs="Calibri"/>
-                <w:sz w:val="24"/>
-              </w:rPr>
-              <w:t>05</w:t>
-            </w:r>
           </w:p>
         </w:tc>
       </w:tr>
@@ -977,7 +972,7 @@
                 <w:rFonts w:ascii="Calibri" w:eastAsia="Calibri" w:hAnsi="Calibri" w:cs="Calibri"/>
                 <w:sz w:val="24"/>
               </w:rPr>
-              <w:t>GVT</w:t>
+              <w:t>RRK</w:t>
             </w:r>
           </w:p>
         </w:tc>
@@ -2147,7 +2142,7 @@
               <w:rPr>
                 <w:rFonts w:ascii="Calibri" w:eastAsia="Calibri" w:hAnsi="Calibri" w:cs="Calibri"/>
               </w:rPr>
-              <w:t>NA</w:t>
+              <w:t>GVHL 412</w:t>
             </w:r>
           </w:p>
         </w:tc>
@@ -2178,7 +2173,7 @@
               <w:rPr>
                 <w:rFonts w:ascii="Calibri" w:eastAsia="Calibri" w:hAnsi="Calibri" w:cs="Calibri"/>
               </w:rPr>
-              <w:t>NA</w:t>
+              <w:t>RRF</w:t>
             </w:r>
           </w:p>
         </w:tc>
@@ -2664,7 +2659,7 @@
               <w:rPr>
                 <w:rFonts w:ascii="Calibri" w:eastAsia="Calibri" w:hAnsi="Calibri" w:cs="Calibri"/>
               </w:rPr>
-              <w:t>NLM</w:t>
+              <w:t>BPB</w:t>
             </w:r>
           </w:p>
         </w:tc>
@@ -2847,7 +2842,7 @@
                 <w:rFonts w:ascii="Calibri" w:eastAsia="Calibri" w:hAnsi="Calibri" w:cs="Calibri"/>
                 <w:sz w:val="24"/>
               </w:rPr>
-              <w:t>09:15</w:t>
+              <w:t>09:10</w:t>
             </w:r>
           </w:p>
         </w:tc>
@@ -2872,16 +2867,13 @@
               <w:jc w:val="center"/>
               <w:rPr>
                 <w:rFonts w:ascii="Calibri" w:eastAsia="Calibri" w:hAnsi="Calibri" w:cs="Calibri"/>
-                <w:b/>
-              </w:rPr>
-            </w:pPr>
-            <w:r>
-              <w:rPr>
-                <w:rFonts w:ascii="Calibri" w:eastAsia="Calibri" w:hAnsi="Calibri" w:cs="Calibri"/>
-                <w:b/>
-                <w:sz w:val="24"/>
-              </w:rPr>
-              <w:t>NA</w:t>
+              </w:rPr>
+            </w:pPr>
+            <w:r>
+              <w:rPr>
+                <w:rFonts w:ascii="Calibri" w:eastAsia="Calibri" w:hAnsi="Calibri" w:cs="Calibri"/>
+              </w:rPr>
+              <w:t>MNW</w:t>
             </w:r>
           </w:p>
         </w:tc>
@@ -2937,7 +2929,7 @@
               <w:rPr>
                 <w:rFonts w:ascii="Calibri" w:eastAsia="Calibri" w:hAnsi="Calibri" w:cs="Calibri"/>
               </w:rPr>
-              <w:t>NA</w:t>
+              <w:t>RRF</w:t>
             </w:r>
           </w:p>
         </w:tc>
@@ -3064,7 +3056,7 @@
                 <w:rFonts w:ascii="Calibri" w:eastAsia="Calibri" w:hAnsi="Calibri" w:cs="Calibri"/>
                 <w:sz w:val="24"/>
               </w:rPr>
-              <w:t>11:00</w:t>
+              <w:t>09:15</w:t>
             </w:r>
           </w:p>
         </w:tc>
@@ -3095,7 +3087,7 @@
               <w:rPr>
                 <w:rFonts w:ascii="Calibri" w:eastAsia="Calibri" w:hAnsi="Calibri" w:cs="Calibri"/>
               </w:rPr>
-              <w:t>NLM</w:t>
+              <w:t>WIN</w:t>
             </w:r>
           </w:p>
         </w:tc>
@@ -3151,7 +3143,7 @@
               <w:rPr>
                 <w:rFonts w:ascii="Calibri" w:eastAsia="Calibri" w:hAnsi="Calibri" w:cs="Calibri"/>
               </w:rPr>
-              <w:t>RRL</w:t>
+              <w:t>GVT</w:t>
             </w:r>
           </w:p>
         </w:tc>
@@ -3278,14 +3270,7 @@
                 <w:rFonts w:ascii="Calibri" w:eastAsia="Calibri" w:hAnsi="Calibri" w:cs="Calibri"/>
                 <w:sz w:val="24"/>
               </w:rPr>
-              <w:t>11:1</w:t>
-            </w:r>
-            <w:r>
-              <w:rPr>
-                <w:rFonts w:ascii="Calibri" w:eastAsia="Calibri" w:hAnsi="Calibri" w:cs="Calibri"/>
-                <w:sz w:val="24"/>
-              </w:rPr>
-              <w:t>0</w:t>
+              <w:t>11:00</w:t>
             </w:r>
           </w:p>
         </w:tc>
@@ -3316,7 +3301,7 @@
               <w:rPr>
                 <w:rFonts w:ascii="Calibri" w:eastAsia="Calibri" w:hAnsi="Calibri" w:cs="Calibri"/>
               </w:rPr>
-              <w:t>J EXPLR</w:t>
+              <w:t>BPB</w:t>
             </w:r>
           </w:p>
         </w:tc>
@@ -3372,7 +3357,7 @@
               <w:rPr>
                 <w:rFonts w:ascii="Calibri" w:eastAsia="Calibri" w:hAnsi="Calibri" w:cs="Calibri"/>
               </w:rPr>
-              <w:t>RRF</w:t>
+              <w:t>RRL</w:t>
             </w:r>
           </w:p>
         </w:tc>
@@ -3502,7 +3487,14 @@
                 <w:rFonts w:ascii="Calibri" w:eastAsia="Calibri" w:hAnsi="Calibri" w:cs="Calibri"/>
                 <w:sz w:val="24"/>
               </w:rPr>
-              <w:t>13:00</w:t>
+              <w:t>11:1</w:t>
+            </w:r>
+            <w:r>
+              <w:rPr>
+                <w:rFonts w:ascii="Calibri" w:eastAsia="Calibri" w:hAnsi="Calibri" w:cs="Calibri"/>
+                <w:sz w:val="24"/>
+              </w:rPr>
+              <w:t>0</w:t>
             </w:r>
           </w:p>
         </w:tc>
@@ -3533,7 +3525,7 @@
               <w:rPr>
                 <w:rFonts w:ascii="Calibri" w:eastAsia="Calibri" w:hAnsi="Calibri" w:cs="Calibri"/>
               </w:rPr>
-              <w:t>NLM</w:t>
+              <w:t>BPB</w:t>
             </w:r>
           </w:p>
         </w:tc>
@@ -3719,7 +3711,7 @@
                 <w:rFonts w:ascii="Calibri" w:eastAsia="Calibri" w:hAnsi="Calibri" w:cs="Calibri"/>
                 <w:sz w:val="24"/>
               </w:rPr>
-              <w:t>13:10</w:t>
+              <w:t>11:15</w:t>
             </w:r>
           </w:p>
         </w:tc>
@@ -3750,7 +3742,7 @@
               <w:rPr>
                 <w:rFonts w:ascii="Calibri" w:eastAsia="Calibri" w:hAnsi="Calibri" w:cs="Calibri"/>
               </w:rPr>
-              <w:t>RATNA</w:t>
+              <w:t>SUDA</w:t>
             </w:r>
           </w:p>
         </w:tc>
@@ -3806,7 +3798,7 @@
               <w:rPr>
                 <w:rFonts w:ascii="Calibri" w:eastAsia="Calibri" w:hAnsi="Calibri" w:cs="Calibri"/>
               </w:rPr>
-              <w:t>RRF</w:t>
+              <w:t>GVT</w:t>
             </w:r>
           </w:p>
         </w:tc>
@@ -4214,7 +4206,7 @@
               <w:rPr>
                 <w:rFonts w:ascii="Calibri" w:eastAsia="Calibri" w:hAnsi="Calibri" w:cs="Calibri"/>
               </w:rPr>
-              <w:t>TRI-2</w:t>
+              <w:t>AS1</w:t>
             </w:r>
           </w:p>
         </w:tc>
@@ -4266,6 +4258,12 @@
                 <w:rFonts w:ascii="Calibri" w:eastAsia="Calibri" w:hAnsi="Calibri" w:cs="Calibri"/>
               </w:rPr>
             </w:pPr>
+            <w:r>
+              <w:rPr>
+                <w:rFonts w:ascii="Calibri" w:eastAsia="Calibri" w:hAnsi="Calibri" w:cs="Calibri"/>
+              </w:rPr>
+              <w:t>HLV</w:t>
+            </w:r>
           </w:p>
         </w:tc>
         <w:tc>
@@ -4624,7 +4622,7 @@
               <w:rPr>
                 <w:rFonts w:ascii="Calibri" w:eastAsia="Calibri" w:hAnsi="Calibri" w:cs="Calibri"/>
               </w:rPr>
-              <w:t>ADM10</w:t>
+              <w:t>DISC-1</w:t>
             </w:r>
           </w:p>
         </w:tc>
@@ -4676,6 +4674,12 @@
                 <w:rFonts w:ascii="Calibri" w:eastAsia="Calibri" w:hAnsi="Calibri" w:cs="Calibri"/>
               </w:rPr>
             </w:pPr>
+            <w:r>
+              <w:rPr>
+                <w:rFonts w:ascii="Calibri" w:eastAsia="Calibri" w:hAnsi="Calibri" w:cs="Calibri"/>
+              </w:rPr>
+              <w:t>HLV</w:t>
+            </w:r>
           </w:p>
         </w:tc>
         <w:tc>
@@ -5030,12 +5034,6 @@
                 <w:rFonts w:ascii="Calibri" w:eastAsia="Calibri" w:hAnsi="Calibri" w:cs="Calibri"/>
               </w:rPr>
             </w:pPr>
-            <w:r>
-              <w:rPr>
-                <w:rFonts w:ascii="Calibri" w:eastAsia="Calibri" w:hAnsi="Calibri" w:cs="Calibri"/>
-              </w:rPr>
-              <w:t>KSPR</w:t>
-            </w:r>
           </w:p>
         </w:tc>
         <w:tc>
@@ -5061,6 +5059,8 @@
                 <w:rFonts w:ascii="Calibri" w:eastAsia="Calibri" w:hAnsi="Calibri" w:cs="Calibri"/>
               </w:rPr>
             </w:pPr>
+            <w:bookmarkStart w:id="0" w:name="_GoBack"/>
+            <w:bookmarkEnd w:id="0"/>
           </w:p>
         </w:tc>
         <w:tc>
@@ -5287,7 +5287,7 @@
               <w:rPr>
                 <w:rFonts w:ascii="Calibri" w:eastAsia="Calibri" w:hAnsi="Calibri" w:cs="Calibri"/>
               </w:rPr>
-              <w:t>SCA</w:t>
+              <w:t>ICP</w:t>
             </w:r>
           </w:p>
         </w:tc>
@@ -5339,6 +5339,12 @@
                 <w:rFonts w:ascii="Calibri" w:eastAsia="Calibri" w:hAnsi="Calibri" w:cs="Calibri"/>
               </w:rPr>
             </w:pPr>
+            <w:r>
+              <w:rPr>
+                <w:rFonts w:ascii="Calibri" w:eastAsia="Calibri" w:hAnsi="Calibri" w:cs="Calibri"/>
+              </w:rPr>
+              <w:t>HLU</w:t>
+            </w:r>
           </w:p>
         </w:tc>
         <w:tc>
@@ -5492,7 +5498,7 @@
               <w:rPr>
                 <w:rFonts w:ascii="Calibri" w:eastAsia="Calibri" w:hAnsi="Calibri" w:cs="Calibri"/>
               </w:rPr>
-              <w:t>SMRT</w:t>
+              <w:t>SJOT</w:t>
             </w:r>
           </w:p>
         </w:tc>
@@ -5544,6 +5550,12 @@
                 <w:rFonts w:ascii="Calibri" w:eastAsia="Calibri" w:hAnsi="Calibri" w:cs="Calibri"/>
               </w:rPr>
             </w:pPr>
+            <w:r>
+              <w:rPr>
+                <w:rFonts w:ascii="Calibri" w:eastAsia="Calibri" w:hAnsi="Calibri" w:cs="Calibri"/>
+              </w:rPr>
+              <w:t>HLH</w:t>
+            </w:r>
           </w:p>
         </w:tc>
         <w:tc>
@@ -5904,7 +5916,7 @@
               <w:rPr>
                 <w:rFonts w:ascii="Calibri" w:eastAsia="Calibri" w:hAnsi="Calibri" w:cs="Calibri"/>
               </w:rPr>
-              <w:t>MNW</w:t>
+              <w:t>DEFOS</w:t>
             </w:r>
           </w:p>
         </w:tc>
@@ -5956,6 +5968,12 @@
                 <w:rFonts w:ascii="Calibri" w:eastAsia="Calibri" w:hAnsi="Calibri" w:cs="Calibri"/>
               </w:rPr>
             </w:pPr>
+            <w:r>
+              <w:rPr>
+                <w:rFonts w:ascii="Calibri" w:eastAsia="Calibri" w:hAnsi="Calibri" w:cs="Calibri"/>
+              </w:rPr>
+              <w:t>HLU</w:t>
+            </w:r>
           </w:p>
         </w:tc>
         <w:tc>
@@ -6109,7 +6127,7 @@
               <w:rPr>
                 <w:rFonts w:ascii="Calibri" w:eastAsia="Calibri" w:hAnsi="Calibri" w:cs="Calibri"/>
               </w:rPr>
-              <w:t>SHAKTI</w:t>
+              <w:t>SHP</w:t>
             </w:r>
           </w:p>
         </w:tc>
@@ -6161,6 +6179,12 @@
                 <w:rFonts w:ascii="Calibri" w:eastAsia="Calibri" w:hAnsi="Calibri" w:cs="Calibri"/>
               </w:rPr>
             </w:pPr>
+            <w:r>
+              <w:rPr>
+                <w:rFonts w:ascii="Calibri" w:eastAsia="Calibri" w:hAnsi="Calibri" w:cs="Calibri"/>
+              </w:rPr>
+              <w:t>HLH</w:t>
+            </w:r>
           </w:p>
         </w:tc>
         <w:tc>
@@ -6441,23 +6465,6 @@
             <w:r>
               <w:rPr>
                 <w:rFonts w:ascii="Calibri" w:eastAsia="Calibri" w:hAnsi="Calibri" w:cs="Calibri"/>
-                <w:b/>
-                <w:sz w:val="24"/>
-              </w:rPr>
-              <w:t>AS1,</w:t>
-            </w:r>
-            <w:bookmarkStart w:id="0" w:name="_GoBack"/>
-            <w:bookmarkEnd w:id="0"/>
-            <w:r>
-              <w:rPr>
-                <w:rFonts w:ascii="Calibri" w:eastAsia="Calibri" w:hAnsi="Calibri" w:cs="Calibri"/>
-                <w:sz w:val="24"/>
-              </w:rPr>
-              <w:t>DISC1,</w:t>
-            </w:r>
-            <w:r>
-              <w:rPr>
-                <w:rFonts w:ascii="Calibri" w:eastAsia="Calibri" w:hAnsi="Calibri" w:cs="Calibri"/>
                 <w:sz w:val="24"/>
               </w:rPr>
               <w:t>FOSSIL,</w:t>
@@ -6468,6 +6475,13 @@
                 <w:sz w:val="24"/>
               </w:rPr>
               <w:t>J SUP</w:t>
+            </w:r>
+            <w:r>
+              <w:rPr>
+                <w:rFonts w:ascii="Calibri" w:eastAsia="Calibri" w:hAnsi="Calibri" w:cs="Calibri"/>
+                <w:sz w:val="24"/>
+              </w:rPr>
+              <w:t>,CHTR</w:t>
             </w:r>
           </w:p>
         </w:tc>
@@ -6551,10 +6565,10 @@
       </w:pPr>
       <w:r>
         <w:object w:dxaOrig="1188" w:dyaOrig="900">
-          <v:rect id="_x0000_i1025" style="width:59.35pt;height:45.1pt" o:ole="" o:preferrelative="t" stroked="f">
+          <v:rect id="_x0000_i1025" style="width:59.85pt;height:44.6pt" o:ole="" o:preferrelative="t" stroked="f">
             <v:imagedata r:id="rId5" o:title=""/>
           </v:rect>
-          <o:OLEObject Type="Embed" ProgID="StaticMetafile" ShapeID="_x0000_i1025" DrawAspect="Content" ObjectID="_1848573282" r:id="rId6"/>
+          <o:OLEObject Type="Embed" ProgID="StaticMetafile" ShapeID="_x0000_i1025" DrawAspect="Content" ObjectID="_1848659449" r:id="rId6"/>
         </w:object>
       </w:r>
     </w:p>
@@ -6590,13 +6604,13 @@
         <w:tblLook w:val="04A0" w:firstRow="1" w:lastRow="0" w:firstColumn="1" w:lastColumn="0" w:noHBand="0" w:noVBand="1"/>
       </w:tblPr>
       <w:tblGrid>
-        <w:gridCol w:w="671"/>
-        <w:gridCol w:w="1597"/>
-        <w:gridCol w:w="1438"/>
-        <w:gridCol w:w="1834"/>
-        <w:gridCol w:w="1518"/>
-        <w:gridCol w:w="792"/>
-        <w:gridCol w:w="1294"/>
+        <w:gridCol w:w="657"/>
+        <w:gridCol w:w="1557"/>
+        <w:gridCol w:w="1402"/>
+        <w:gridCol w:w="1786"/>
+        <w:gridCol w:w="1479"/>
+        <w:gridCol w:w="775"/>
+        <w:gridCol w:w="1262"/>
       </w:tblGrid>
       <w:tr>
         <w:tc>
@@ -7086,7 +7100,7 @@
               <w:rPr>
                 <w:rFonts w:ascii="Calibri" w:eastAsia="Calibri" w:hAnsi="Calibri" w:cs="Calibri"/>
               </w:rPr>
-              <w:t>CHARU</w:t>
+              <w:t>TCPP CC +PROD</w:t>
             </w:r>
           </w:p>
         </w:tc>
@@ -7296,7 +7310,7 @@
               <w:rPr>
                 <w:rFonts w:ascii="Calibri" w:eastAsia="Calibri" w:hAnsi="Calibri" w:cs="Calibri"/>
               </w:rPr>
-              <w:t>J STAR</w:t>
+              <w:t>CHRU</w:t>
             </w:r>
           </w:p>
         </w:tc>
@@ -7503,12 +7517,6 @@
                 <w:rFonts w:ascii="Calibri" w:eastAsia="Calibri" w:hAnsi="Calibri" w:cs="Calibri"/>
               </w:rPr>
             </w:pPr>
-            <w:r>
-              <w:rPr>
-                <w:rFonts w:ascii="Calibri" w:eastAsia="Calibri" w:hAnsi="Calibri" w:cs="Calibri"/>
-              </w:rPr>
-              <w:t>L/O</w:t>
-            </w:r>
           </w:p>
         </w:tc>
         <w:tc>

</xml_diff>

<commit_message>
Sync - 2026-08-19 16:37
</commit_message>
<xml_diff>
--- a/files/Daily_Helicopter_Schedule.docx
+++ b/files/Daily_Helicopter_Schedule.docx
@@ -4622,7 +4622,7 @@
               <w:rPr>
                 <w:rFonts w:ascii="Calibri" w:eastAsia="Calibri" w:hAnsi="Calibri" w:cs="Calibri"/>
               </w:rPr>
-              <w:t>DISC-1</w:t>
+              <w:t>JSUP</w:t>
             </w:r>
           </w:p>
         </w:tc>
@@ -5059,8 +5059,6 @@
                 <w:rFonts w:ascii="Calibri" w:eastAsia="Calibri" w:hAnsi="Calibri" w:cs="Calibri"/>
               </w:rPr>
             </w:pPr>
-            <w:bookmarkStart w:id="0" w:name="_GoBack"/>
-            <w:bookmarkEnd w:id="0"/>
           </w:p>
         </w:tc>
         <w:tc>
@@ -5916,7 +5914,7 @@
               <w:rPr>
                 <w:rFonts w:ascii="Calibri" w:eastAsia="Calibri" w:hAnsi="Calibri" w:cs="Calibri"/>
               </w:rPr>
-              <w:t>DEFOS</w:t>
+              <w:t>VND2</w:t>
             </w:r>
           </w:p>
         </w:tc>
@@ -6467,21 +6465,22 @@
                 <w:rFonts w:ascii="Calibri" w:eastAsia="Calibri" w:hAnsi="Calibri" w:cs="Calibri"/>
                 <w:sz w:val="24"/>
               </w:rPr>
-              <w:t>FOSSIL,</w:t>
-            </w:r>
-            <w:r>
-              <w:rPr>
-                <w:rFonts w:ascii="Calibri" w:eastAsia="Calibri" w:hAnsi="Calibri" w:cs="Calibri"/>
-                <w:sz w:val="24"/>
-              </w:rPr>
-              <w:t>J SUP</w:t>
-            </w:r>
-            <w:r>
-              <w:rPr>
-                <w:rFonts w:ascii="Calibri" w:eastAsia="Calibri" w:hAnsi="Calibri" w:cs="Calibri"/>
-                <w:sz w:val="24"/>
-              </w:rPr>
-              <w:t>,CHTR</w:t>
+              <w:t>CHTR</w:t>
+            </w:r>
+            <w:r>
+              <w:rPr>
+                <w:rFonts w:ascii="Calibri" w:eastAsia="Calibri" w:hAnsi="Calibri" w:cs="Calibri"/>
+                <w:b/>
+                <w:sz w:val="24"/>
+              </w:rPr>
+              <w:t>,</w:t>
+            </w:r>
+            <w:r>
+              <w:rPr>
+                <w:rFonts w:ascii="Calibri" w:eastAsia="Calibri" w:hAnsi="Calibri" w:cs="Calibri"/>
+                <w:sz w:val="24"/>
+              </w:rPr>
+              <w:t>DSFN,SCHAL</w:t>
             </w:r>
           </w:p>
         </w:tc>
@@ -6527,6 +6526,8 @@
           <w:u w:val="single"/>
         </w:rPr>
       </w:pPr>
+      <w:bookmarkStart w:id="0" w:name="_GoBack"/>
+      <w:bookmarkEnd w:id="0"/>
     </w:p>
     <w:p>
       <w:pPr>
@@ -6568,7 +6569,7 @@
           <v:rect id="_x0000_i1025" style="width:59.85pt;height:44.6pt" o:ole="" o:preferrelative="t" stroked="f">
             <v:imagedata r:id="rId5" o:title=""/>
           </v:rect>
-          <o:OLEObject Type="Embed" ProgID="StaticMetafile" ShapeID="_x0000_i1025" DrawAspect="Content" ObjectID="_1848659449" r:id="rId6"/>
+          <o:OLEObject Type="Embed" ProgID="StaticMetafile" ShapeID="_x0000_i1025" DrawAspect="Content" ObjectID="_1848661867" r:id="rId6"/>
         </w:object>
       </w:r>
     </w:p>
@@ -7094,11 +7095,15 @@
               <w:jc w:val="center"/>
               <w:rPr>
                 <w:rFonts w:ascii="Calibri" w:eastAsia="Calibri" w:hAnsi="Calibri" w:cs="Calibri"/>
-              </w:rPr>
-            </w:pPr>
-            <w:r>
-              <w:rPr>
-                <w:rFonts w:ascii="Calibri" w:eastAsia="Calibri" w:hAnsi="Calibri" w:cs="Calibri"/>
+                <w:sz w:val="24"/>
+                <w:szCs w:val="24"/>
+              </w:rPr>
+            </w:pPr>
+            <w:r>
+              <w:rPr>
+                <w:rFonts w:ascii="Calibri" w:eastAsia="Calibri" w:hAnsi="Calibri" w:cs="Calibri"/>
+                <w:sz w:val="24"/>
+                <w:szCs w:val="24"/>
               </w:rPr>
               <w:t>TCPP CC +PROD</w:t>
             </w:r>
@@ -7304,11 +7309,15 @@
               <w:jc w:val="center"/>
               <w:rPr>
                 <w:rFonts w:ascii="Calibri" w:eastAsia="Calibri" w:hAnsi="Calibri" w:cs="Calibri"/>
-              </w:rPr>
-            </w:pPr>
-            <w:r>
-              <w:rPr>
-                <w:rFonts w:ascii="Calibri" w:eastAsia="Calibri" w:hAnsi="Calibri" w:cs="Calibri"/>
+                <w:sz w:val="24"/>
+                <w:szCs w:val="24"/>
+              </w:rPr>
+            </w:pPr>
+            <w:r>
+              <w:rPr>
+                <w:rFonts w:ascii="Calibri" w:eastAsia="Calibri" w:hAnsi="Calibri" w:cs="Calibri"/>
+                <w:sz w:val="24"/>
+                <w:szCs w:val="24"/>
               </w:rPr>
               <w:t>CHRU</w:t>
             </w:r>

</xml_diff>

<commit_message>
Sync - 2026-08-19 17:37
</commit_message>
<xml_diff>
--- a/files/Daily_Helicopter_Schedule.docx
+++ b/files/Daily_Helicopter_Schedule.docx
@@ -5916,6 +5916,8 @@
               </w:rPr>
               <w:t>VND2</w:t>
             </w:r>
+            <w:bookmarkStart w:id="0" w:name="_GoBack"/>
+            <w:bookmarkEnd w:id="0"/>
           </w:p>
         </w:tc>
         <w:tc>
@@ -6526,8 +6528,6 @@
           <w:u w:val="single"/>
         </w:rPr>
       </w:pPr>
-      <w:bookmarkStart w:id="0" w:name="_GoBack"/>
-      <w:bookmarkEnd w:id="0"/>
     </w:p>
     <w:p>
       <w:pPr>
@@ -6569,7 +6569,7 @@
           <v:rect id="_x0000_i1025" style="width:59.85pt;height:44.6pt" o:ole="" o:preferrelative="t" stroked="f">
             <v:imagedata r:id="rId5" o:title=""/>
           </v:rect>
-          <o:OLEObject Type="Embed" ProgID="StaticMetafile" ShapeID="_x0000_i1025" DrawAspect="Content" ObjectID="_1848661867" r:id="rId6"/>
+          <o:OLEObject Type="Embed" ProgID="StaticMetafile" ShapeID="_x0000_i1025" DrawAspect="Content" ObjectID="_1848664853" r:id="rId6"/>
         </w:object>
       </w:r>
     </w:p>

</xml_diff>

<commit_message>
Sync - 2026-08-20 17:12
</commit_message>
<xml_diff>
--- a/files/Daily_Helicopter_Schedule.docx
+++ b/files/Daily_Helicopter_Schedule.docx
@@ -35,7 +35,7 @@
           <w:b/>
           <w:color w:val="000000" w:themeColor="text1"/>
         </w:rPr>
-        <w:t>20</w:t>
+        <w:t>21</w:t>
       </w:r>
       <w:r>
         <w:rPr>
@@ -59,7 +59,7 @@
           <w:b/>
           <w:color w:val="000000" w:themeColor="text1"/>
         </w:rPr>
-        <w:t>THUR</w:t>
+        <w:t>FRI</w:t>
       </w:r>
       <w:r>
         <w:rPr>
@@ -67,7 +67,7 @@
           <w:b/>
           <w:color w:val="000000" w:themeColor="text1"/>
         </w:rPr>
-        <w:t>SDAY</w:t>
+        <w:t>DAY</w:t>
       </w:r>
       <w:r>
         <w:rPr>
@@ -187,7 +187,7 @@
       <w:tr>
         <w:tc>
           <w:tcPr>
-            <w:tcW w:w="774" w:type="dxa"/>
+            <w:tcW w:w="620" w:type="dxa"/>
             <w:tcBorders>
               <w:top w:val="single" w:sz="4" w:space="0" w:color="000000"/>
               <w:left w:val="single" w:sz="4" w:space="0" w:color="000000"/>
@@ -218,7 +218,7 @@
         </w:tc>
         <w:tc>
           <w:tcPr>
-            <w:tcW w:w="1555" w:type="dxa"/>
+            <w:tcW w:w="1414" w:type="dxa"/>
             <w:tcBorders>
               <w:top w:val="single" w:sz="4" w:space="0" w:color="000000"/>
               <w:left w:val="single" w:sz="4" w:space="0" w:color="000000"/>
@@ -273,7 +273,7 @@
         </w:tc>
         <w:tc>
           <w:tcPr>
-            <w:tcW w:w="1801" w:type="dxa"/>
+            <w:tcW w:w="1339" w:type="dxa"/>
             <w:tcBorders>
               <w:top w:val="single" w:sz="4" w:space="0" w:color="000000"/>
               <w:left w:val="single" w:sz="4" w:space="0" w:color="000000"/>
@@ -307,7 +307,7 @@
         </w:tc>
         <w:tc>
           <w:tcPr>
-            <w:tcW w:w="2993" w:type="dxa"/>
+            <w:tcW w:w="1810" w:type="dxa"/>
             <w:tcBorders>
               <w:top w:val="single" w:sz="4" w:space="0" w:color="000000"/>
               <w:left w:val="single" w:sz="4" w:space="0" w:color="000000"/>
@@ -371,7 +371,7 @@
         </w:tc>
         <w:tc>
           <w:tcPr>
-            <w:tcW w:w="1745" w:type="dxa"/>
+            <w:tcW w:w="1387" w:type="dxa"/>
             <w:tcBorders>
               <w:top w:val="single" w:sz="4" w:space="0" w:color="000000"/>
               <w:left w:val="single" w:sz="4" w:space="0" w:color="000000"/>
@@ -416,7 +416,7 @@
         </w:tc>
         <w:tc>
           <w:tcPr>
-            <w:tcW w:w="908" w:type="dxa"/>
+            <w:tcW w:w="1180" w:type="dxa"/>
             <w:tcBorders>
               <w:top w:val="single" w:sz="4" w:space="0" w:color="000000"/>
               <w:left w:val="single" w:sz="4" w:space="0" w:color="000000"/>
@@ -449,7 +449,7 @@
         </w:tc>
         <w:tc>
           <w:tcPr>
-            <w:tcW w:w="1363" w:type="dxa"/>
+            <w:tcW w:w="1168" w:type="dxa"/>
             <w:tcBorders>
               <w:top w:val="single" w:sz="4" w:space="0" w:color="000000"/>
               <w:left w:val="single" w:sz="4" w:space="0" w:color="000000"/>
@@ -517,7 +517,7 @@
       <w:tr>
         <w:tc>
           <w:tcPr>
-            <w:tcW w:w="11139" w:type="dxa"/>
+            <w:tcW w:w="8918" w:type="dxa"/>
             <w:gridSpan w:val="7"/>
             <w:tcBorders>
               <w:top w:val="single" w:sz="4" w:space="0" w:color="000000"/>
@@ -565,7 +565,7 @@
       <w:tr>
         <w:tc>
           <w:tcPr>
-            <w:tcW w:w="774" w:type="dxa"/>
+            <w:tcW w:w="620" w:type="dxa"/>
             <w:tcBorders>
               <w:top w:val="single" w:sz="4" w:space="0" w:color="000000"/>
               <w:left w:val="single" w:sz="4" w:space="0" w:color="000000"/>
@@ -597,7 +597,7 @@
         </w:tc>
         <w:tc>
           <w:tcPr>
-            <w:tcW w:w="1555" w:type="dxa"/>
+            <w:tcW w:w="1414" w:type="dxa"/>
             <w:tcBorders>
               <w:top w:val="single" w:sz="4" w:space="0" w:color="000000"/>
               <w:left w:val="single" w:sz="4" w:space="0" w:color="000000"/>
@@ -629,7 +629,7 @@
         </w:tc>
         <w:tc>
           <w:tcPr>
-            <w:tcW w:w="1801" w:type="dxa"/>
+            <w:tcW w:w="1339" w:type="dxa"/>
             <w:tcBorders>
               <w:top w:val="single" w:sz="4" w:space="0" w:color="000000"/>
               <w:left w:val="single" w:sz="4" w:space="0" w:color="000000"/>
@@ -661,7 +661,7 @@
         </w:tc>
         <w:tc>
           <w:tcPr>
-            <w:tcW w:w="2993" w:type="dxa"/>
+            <w:tcW w:w="1810" w:type="dxa"/>
             <w:tcBorders>
               <w:top w:val="single" w:sz="4" w:space="0" w:color="000000"/>
               <w:left w:val="single" w:sz="4" w:space="0" w:color="000000"/>
@@ -693,73 +693,69 @@
         </w:tc>
         <w:tc>
           <w:tcPr>
-            <w:tcW w:w="1745" w:type="dxa"/>
-            <w:tcBorders>
-              <w:top w:val="single" w:sz="4" w:space="0" w:color="000000"/>
-              <w:left w:val="single" w:sz="4" w:space="0" w:color="000000"/>
-              <w:bottom w:val="single" w:sz="4" w:space="0" w:color="000000"/>
-              <w:right w:val="single" w:sz="4" w:space="0" w:color="000000"/>
-            </w:tcBorders>
-            <w:shd w:val="clear" w:color="000000" w:fill="FFFFFF"/>
-            <w:tcMar>
-              <w:left w:w="108" w:type="dxa"/>
-              <w:right w:w="108" w:type="dxa"/>
-            </w:tcMar>
-          </w:tcPr>
-          <w:p>
-            <w:pPr>
-              <w:spacing w:after="0" w:line="240" w:lineRule="auto"/>
-              <w:jc w:val="center"/>
-              <w:rPr>
-                <w:rFonts w:ascii="Calibri" w:eastAsia="Calibri" w:hAnsi="Calibri" w:cs="Calibri"/>
-                <w:b/>
-              </w:rPr>
-            </w:pPr>
-            <w:r>
-              <w:rPr>
-                <w:rFonts w:ascii="Calibri" w:eastAsia="Calibri" w:hAnsi="Calibri" w:cs="Calibri"/>
-                <w:b/>
-              </w:rPr>
-              <w:t>NA</w:t>
-            </w:r>
-          </w:p>
-        </w:tc>
-        <w:tc>
-          <w:tcPr>
-            <w:tcW w:w="908" w:type="dxa"/>
-            <w:tcBorders>
-              <w:top w:val="single" w:sz="4" w:space="0" w:color="000000"/>
-              <w:left w:val="single" w:sz="4" w:space="0" w:color="000000"/>
-              <w:bottom w:val="single" w:sz="4" w:space="0" w:color="000000"/>
-              <w:right w:val="single" w:sz="4" w:space="0" w:color="000000"/>
-            </w:tcBorders>
-            <w:shd w:val="clear" w:color="000000" w:fill="FFFFFF"/>
-            <w:tcMar>
-              <w:left w:w="108" w:type="dxa"/>
-              <w:right w:w="108" w:type="dxa"/>
-            </w:tcMar>
-          </w:tcPr>
-          <w:p>
-            <w:pPr>
-              <w:spacing w:after="0" w:line="240" w:lineRule="auto"/>
-              <w:jc w:val="center"/>
-              <w:rPr>
-                <w:rFonts w:ascii="Calibri" w:eastAsia="Calibri" w:hAnsi="Calibri" w:cs="Calibri"/>
-                <w:b/>
-              </w:rPr>
-            </w:pPr>
-            <w:r>
-              <w:rPr>
-                <w:rFonts w:ascii="Calibri" w:eastAsia="Calibri" w:hAnsi="Calibri" w:cs="Calibri"/>
-                <w:b/>
-              </w:rPr>
-              <w:t>NA</w:t>
-            </w:r>
-          </w:p>
-        </w:tc>
-        <w:tc>
-          <w:tcPr>
-            <w:tcW w:w="1363" w:type="dxa"/>
+            <w:tcW w:w="1387" w:type="dxa"/>
+            <w:tcBorders>
+              <w:top w:val="single" w:sz="4" w:space="0" w:color="000000"/>
+              <w:left w:val="single" w:sz="4" w:space="0" w:color="000000"/>
+              <w:bottom w:val="single" w:sz="4" w:space="0" w:color="000000"/>
+              <w:right w:val="single" w:sz="4" w:space="0" w:color="000000"/>
+            </w:tcBorders>
+            <w:shd w:val="clear" w:color="000000" w:fill="FFFFFF"/>
+            <w:tcMar>
+              <w:left w:w="108" w:type="dxa"/>
+              <w:right w:w="108" w:type="dxa"/>
+            </w:tcMar>
+          </w:tcPr>
+          <w:p>
+            <w:pPr>
+              <w:spacing w:after="0" w:line="240" w:lineRule="auto"/>
+              <w:jc w:val="center"/>
+              <w:rPr>
+                <w:rFonts w:ascii="Calibri" w:eastAsia="Calibri" w:hAnsi="Calibri" w:cs="Calibri"/>
+              </w:rPr>
+            </w:pPr>
+            <w:r>
+              <w:rPr>
+                <w:rFonts w:ascii="Calibri" w:eastAsia="Calibri" w:hAnsi="Calibri" w:cs="Calibri"/>
+              </w:rPr>
+              <w:t>GVHL 412</w:t>
+            </w:r>
+          </w:p>
+        </w:tc>
+        <w:tc>
+          <w:tcPr>
+            <w:tcW w:w="1180" w:type="dxa"/>
+            <w:tcBorders>
+              <w:top w:val="single" w:sz="4" w:space="0" w:color="000000"/>
+              <w:left w:val="single" w:sz="4" w:space="0" w:color="000000"/>
+              <w:bottom w:val="single" w:sz="4" w:space="0" w:color="000000"/>
+              <w:right w:val="single" w:sz="4" w:space="0" w:color="000000"/>
+            </w:tcBorders>
+            <w:shd w:val="clear" w:color="000000" w:fill="FFFFFF"/>
+            <w:tcMar>
+              <w:left w:w="108" w:type="dxa"/>
+              <w:right w:w="108" w:type="dxa"/>
+            </w:tcMar>
+          </w:tcPr>
+          <w:p>
+            <w:pPr>
+              <w:spacing w:after="0" w:line="240" w:lineRule="auto"/>
+              <w:jc w:val="center"/>
+              <w:rPr>
+                <w:rFonts w:ascii="Calibri" w:eastAsia="Calibri" w:hAnsi="Calibri" w:cs="Calibri"/>
+              </w:rPr>
+            </w:pPr>
+            <w:r>
+              <w:rPr>
+                <w:rFonts w:ascii="Calibri" w:eastAsia="Calibri" w:hAnsi="Calibri" w:cs="Calibri"/>
+              </w:rPr>
+              <w:t>GVT</w:t>
+            </w:r>
+          </w:p>
+        </w:tc>
+        <w:tc>
+          <w:tcPr>
+            <w:tcW w:w="1168" w:type="dxa"/>
             <w:tcBorders>
               <w:top w:val="single" w:sz="4" w:space="0" w:color="000000"/>
               <w:left w:val="single" w:sz="4" w:space="0" w:color="000000"/>
@@ -780,13 +776,19 @@
                 <w:rFonts w:ascii="Calibri" w:eastAsia="Calibri" w:hAnsi="Calibri" w:cs="Calibri"/>
               </w:rPr>
             </w:pPr>
+            <w:r>
+              <w:rPr>
+                <w:rFonts w:ascii="Calibri" w:eastAsia="Calibri" w:hAnsi="Calibri" w:cs="Calibri"/>
+              </w:rPr>
+              <w:t>08</w:t>
+            </w:r>
           </w:p>
         </w:tc>
       </w:tr>
       <w:tr>
         <w:tc>
           <w:tcPr>
-            <w:tcW w:w="774" w:type="dxa"/>
+            <w:tcW w:w="620" w:type="dxa"/>
             <w:tcBorders>
               <w:top w:val="single" w:sz="4" w:space="0" w:color="000000"/>
               <w:left w:val="single" w:sz="4" w:space="0" w:color="000000"/>
@@ -818,7 +820,7 @@
         </w:tc>
         <w:tc>
           <w:tcPr>
-            <w:tcW w:w="1555" w:type="dxa"/>
+            <w:tcW w:w="1414" w:type="dxa"/>
             <w:tcBorders>
               <w:top w:val="single" w:sz="4" w:space="0" w:color="000000"/>
               <w:left w:val="single" w:sz="4" w:space="0" w:color="000000"/>
@@ -850,7 +852,7 @@
         </w:tc>
         <w:tc>
           <w:tcPr>
-            <w:tcW w:w="1801" w:type="dxa"/>
+            <w:tcW w:w="1339" w:type="dxa"/>
             <w:tcBorders>
               <w:top w:val="single" w:sz="4" w:space="0" w:color="000000"/>
               <w:left w:val="single" w:sz="4" w:space="0" w:color="000000"/>
@@ -882,7 +884,7 @@
         </w:tc>
         <w:tc>
           <w:tcPr>
-            <w:tcW w:w="2993" w:type="dxa"/>
+            <w:tcW w:w="1810" w:type="dxa"/>
             <w:tcBorders>
               <w:top w:val="single" w:sz="4" w:space="0" w:color="000000"/>
               <w:left w:val="single" w:sz="4" w:space="0" w:color="000000"/>
@@ -914,7 +916,7 @@
         </w:tc>
         <w:tc>
           <w:tcPr>
-            <w:tcW w:w="1745" w:type="dxa"/>
+            <w:tcW w:w="1387" w:type="dxa"/>
             <w:tcBorders>
               <w:top w:val="single" w:sz="4" w:space="0" w:color="000000"/>
               <w:left w:val="single" w:sz="4" w:space="0" w:color="000000"/>
@@ -946,7 +948,7 @@
         </w:tc>
         <w:tc>
           <w:tcPr>
-            <w:tcW w:w="908" w:type="dxa"/>
+            <w:tcW w:w="1180" w:type="dxa"/>
             <w:tcBorders>
               <w:top w:val="single" w:sz="4" w:space="0" w:color="000000"/>
               <w:left w:val="single" w:sz="4" w:space="0" w:color="000000"/>
@@ -978,7 +980,7 @@
         </w:tc>
         <w:tc>
           <w:tcPr>
-            <w:tcW w:w="1363" w:type="dxa"/>
+            <w:tcW w:w="1168" w:type="dxa"/>
             <w:tcBorders>
               <w:top w:val="single" w:sz="4" w:space="0" w:color="000000"/>
               <w:left w:val="single" w:sz="4" w:space="0" w:color="000000"/>
@@ -1012,7 +1014,7 @@
       <w:tr>
         <w:tc>
           <w:tcPr>
-            <w:tcW w:w="774" w:type="dxa"/>
+            <w:tcW w:w="620" w:type="dxa"/>
             <w:tcBorders>
               <w:top w:val="single" w:sz="4" w:space="0" w:color="000000"/>
               <w:left w:val="single" w:sz="4" w:space="0" w:color="000000"/>
@@ -1044,7 +1046,7 @@
         </w:tc>
         <w:tc>
           <w:tcPr>
-            <w:tcW w:w="1555" w:type="dxa"/>
+            <w:tcW w:w="1414" w:type="dxa"/>
             <w:tcBorders>
               <w:top w:val="single" w:sz="4" w:space="0" w:color="000000"/>
               <w:left w:val="single" w:sz="4" w:space="0" w:color="000000"/>
@@ -1076,7 +1078,7 @@
         </w:tc>
         <w:tc>
           <w:tcPr>
-            <w:tcW w:w="1801" w:type="dxa"/>
+            <w:tcW w:w="1339" w:type="dxa"/>
             <w:tcBorders>
               <w:top w:val="single" w:sz="4" w:space="0" w:color="000000"/>
               <w:left w:val="single" w:sz="4" w:space="0" w:color="000000"/>
@@ -1108,7 +1110,7 @@
         </w:tc>
         <w:tc>
           <w:tcPr>
-            <w:tcW w:w="2993" w:type="dxa"/>
+            <w:tcW w:w="1810" w:type="dxa"/>
             <w:tcBorders>
               <w:top w:val="single" w:sz="4" w:space="0" w:color="000000"/>
               <w:left w:val="single" w:sz="4" w:space="0" w:color="000000"/>
@@ -1140,7 +1142,7 @@
         </w:tc>
         <w:tc>
           <w:tcPr>
-            <w:tcW w:w="1745" w:type="dxa"/>
+            <w:tcW w:w="1387" w:type="dxa"/>
             <w:tcBorders>
               <w:top w:val="single" w:sz="4" w:space="0" w:color="000000"/>
               <w:left w:val="single" w:sz="4" w:space="0" w:color="000000"/>
@@ -1172,7 +1174,7 @@
         </w:tc>
         <w:tc>
           <w:tcPr>
-            <w:tcW w:w="908" w:type="dxa"/>
+            <w:tcW w:w="1180" w:type="dxa"/>
             <w:tcBorders>
               <w:top w:val="single" w:sz="4" w:space="0" w:color="000000"/>
               <w:left w:val="single" w:sz="4" w:space="0" w:color="000000"/>
@@ -1204,7 +1206,7 @@
         </w:tc>
         <w:tc>
           <w:tcPr>
-            <w:tcW w:w="1363" w:type="dxa"/>
+            <w:tcW w:w="1168" w:type="dxa"/>
             <w:tcBorders>
               <w:top w:val="single" w:sz="4" w:space="0" w:color="000000"/>
               <w:left w:val="single" w:sz="4" w:space="0" w:color="000000"/>
@@ -1238,7 +1240,7 @@
       <w:tr>
         <w:tc>
           <w:tcPr>
-            <w:tcW w:w="11139" w:type="dxa"/>
+            <w:tcW w:w="8918" w:type="dxa"/>
             <w:gridSpan w:val="7"/>
             <w:tcBorders>
               <w:top w:val="single" w:sz="4" w:space="0" w:color="000000"/>
@@ -1281,7 +1283,7 @@
       <w:tr>
         <w:tc>
           <w:tcPr>
-            <w:tcW w:w="774" w:type="dxa"/>
+            <w:tcW w:w="620" w:type="dxa"/>
             <w:tcBorders>
               <w:top w:val="single" w:sz="4" w:space="0" w:color="000000"/>
               <w:left w:val="single" w:sz="4" w:space="0" w:color="000000"/>
@@ -1313,7 +1315,7 @@
         </w:tc>
         <w:tc>
           <w:tcPr>
-            <w:tcW w:w="1555" w:type="dxa"/>
+            <w:tcW w:w="1414" w:type="dxa"/>
             <w:tcBorders>
               <w:top w:val="single" w:sz="4" w:space="0" w:color="000000"/>
               <w:left w:val="single" w:sz="4" w:space="0" w:color="000000"/>
@@ -1345,7 +1347,7 @@
         </w:tc>
         <w:tc>
           <w:tcPr>
-            <w:tcW w:w="1801" w:type="dxa"/>
+            <w:tcW w:w="1339" w:type="dxa"/>
             <w:tcBorders>
               <w:top w:val="single" w:sz="4" w:space="0" w:color="000000"/>
               <w:left w:val="single" w:sz="4" w:space="0" w:color="000000"/>
@@ -1381,7 +1383,7 @@
         </w:tc>
         <w:tc>
           <w:tcPr>
-            <w:tcW w:w="2993" w:type="dxa"/>
+            <w:tcW w:w="1810" w:type="dxa"/>
             <w:tcBorders>
               <w:top w:val="single" w:sz="4" w:space="0" w:color="000000"/>
               <w:left w:val="single" w:sz="4" w:space="0" w:color="000000"/>
@@ -1413,7 +1415,7 @@
         </w:tc>
         <w:tc>
           <w:tcPr>
-            <w:tcW w:w="1745" w:type="dxa"/>
+            <w:tcW w:w="1387" w:type="dxa"/>
             <w:tcBorders>
               <w:top w:val="single" w:sz="4" w:space="0" w:color="000000"/>
               <w:left w:val="single" w:sz="4" w:space="0" w:color="000000"/>
@@ -1447,7 +1449,7 @@
         </w:tc>
         <w:tc>
           <w:tcPr>
-            <w:tcW w:w="908" w:type="dxa"/>
+            <w:tcW w:w="1180" w:type="dxa"/>
             <w:tcBorders>
               <w:top w:val="single" w:sz="4" w:space="0" w:color="000000"/>
               <w:left w:val="single" w:sz="4" w:space="0" w:color="000000"/>
@@ -1481,7 +1483,7 @@
         </w:tc>
         <w:tc>
           <w:tcPr>
-            <w:tcW w:w="1363" w:type="dxa"/>
+            <w:tcW w:w="1168" w:type="dxa"/>
             <w:tcBorders>
               <w:top w:val="single" w:sz="4" w:space="0" w:color="000000"/>
               <w:left w:val="single" w:sz="4" w:space="0" w:color="000000"/>
@@ -1515,7 +1517,7 @@
       <w:tr>
         <w:tc>
           <w:tcPr>
-            <w:tcW w:w="774" w:type="dxa"/>
+            <w:tcW w:w="620" w:type="dxa"/>
             <w:tcBorders>
               <w:top w:val="single" w:sz="4" w:space="0" w:color="000000"/>
               <w:left w:val="single" w:sz="4" w:space="0" w:color="000000"/>
@@ -1547,7 +1549,7 @@
         </w:tc>
         <w:tc>
           <w:tcPr>
-            <w:tcW w:w="1555" w:type="dxa"/>
+            <w:tcW w:w="1414" w:type="dxa"/>
             <w:tcBorders>
               <w:top w:val="single" w:sz="4" w:space="0" w:color="000000"/>
               <w:left w:val="single" w:sz="4" w:space="0" w:color="000000"/>
@@ -1579,7 +1581,7 @@
         </w:tc>
         <w:tc>
           <w:tcPr>
-            <w:tcW w:w="1801" w:type="dxa"/>
+            <w:tcW w:w="1339" w:type="dxa"/>
             <w:tcBorders>
               <w:top w:val="single" w:sz="4" w:space="0" w:color="000000"/>
               <w:left w:val="single" w:sz="4" w:space="0" w:color="000000"/>
@@ -1615,7 +1617,7 @@
         </w:tc>
         <w:tc>
           <w:tcPr>
-            <w:tcW w:w="2993" w:type="dxa"/>
+            <w:tcW w:w="1810" w:type="dxa"/>
             <w:tcBorders>
               <w:top w:val="single" w:sz="4" w:space="0" w:color="000000"/>
               <w:left w:val="single" w:sz="4" w:space="0" w:color="000000"/>
@@ -1651,7 +1653,7 @@
         </w:tc>
         <w:tc>
           <w:tcPr>
-            <w:tcW w:w="1745" w:type="dxa"/>
+            <w:tcW w:w="1387" w:type="dxa"/>
             <w:tcBorders>
               <w:top w:val="single" w:sz="4" w:space="0" w:color="000000"/>
               <w:left w:val="single" w:sz="4" w:space="0" w:color="000000"/>
@@ -1683,7 +1685,7 @@
         </w:tc>
         <w:tc>
           <w:tcPr>
-            <w:tcW w:w="908" w:type="dxa"/>
+            <w:tcW w:w="1180" w:type="dxa"/>
             <w:tcBorders>
               <w:top w:val="single" w:sz="4" w:space="0" w:color="000000"/>
               <w:left w:val="single" w:sz="4" w:space="0" w:color="000000"/>
@@ -1715,7 +1717,7 @@
         </w:tc>
         <w:tc>
           <w:tcPr>
-            <w:tcW w:w="1363" w:type="dxa"/>
+            <w:tcW w:w="1168" w:type="dxa"/>
             <w:tcBorders>
               <w:top w:val="single" w:sz="4" w:space="0" w:color="000000"/>
               <w:left w:val="single" w:sz="4" w:space="0" w:color="000000"/>
@@ -1749,7 +1751,7 @@
       <w:tr>
         <w:tc>
           <w:tcPr>
-            <w:tcW w:w="774" w:type="dxa"/>
+            <w:tcW w:w="620" w:type="dxa"/>
             <w:tcBorders>
               <w:top w:val="single" w:sz="4" w:space="0" w:color="000000"/>
               <w:left w:val="single" w:sz="4" w:space="0" w:color="000000"/>
@@ -1781,7 +1783,7 @@
         </w:tc>
         <w:tc>
           <w:tcPr>
-            <w:tcW w:w="1555" w:type="dxa"/>
+            <w:tcW w:w="1414" w:type="dxa"/>
             <w:tcBorders>
               <w:top w:val="single" w:sz="4" w:space="0" w:color="000000"/>
               <w:left w:val="single" w:sz="4" w:space="0" w:color="000000"/>
@@ -1813,7 +1815,7 @@
         </w:tc>
         <w:tc>
           <w:tcPr>
-            <w:tcW w:w="1801" w:type="dxa"/>
+            <w:tcW w:w="1339" w:type="dxa"/>
             <w:tcBorders>
               <w:top w:val="single" w:sz="4" w:space="0" w:color="000000"/>
               <w:left w:val="single" w:sz="4" w:space="0" w:color="000000"/>
@@ -1849,7 +1851,7 @@
         </w:tc>
         <w:tc>
           <w:tcPr>
-            <w:tcW w:w="2993" w:type="dxa"/>
+            <w:tcW w:w="1810" w:type="dxa"/>
             <w:tcBorders>
               <w:top w:val="single" w:sz="4" w:space="0" w:color="000000"/>
               <w:left w:val="single" w:sz="4" w:space="0" w:color="000000"/>
@@ -1881,7 +1883,7 @@
         </w:tc>
         <w:tc>
           <w:tcPr>
-            <w:tcW w:w="1745" w:type="dxa"/>
+            <w:tcW w:w="1387" w:type="dxa"/>
             <w:tcBorders>
               <w:top w:val="single" w:sz="4" w:space="0" w:color="000000"/>
               <w:left w:val="single" w:sz="4" w:space="0" w:color="000000"/>
@@ -1916,7 +1918,7 @@
         </w:tc>
         <w:tc>
           <w:tcPr>
-            <w:tcW w:w="908" w:type="dxa"/>
+            <w:tcW w:w="1180" w:type="dxa"/>
             <w:tcBorders>
               <w:top w:val="single" w:sz="4" w:space="0" w:color="000000"/>
               <w:left w:val="single" w:sz="4" w:space="0" w:color="000000"/>
@@ -1948,7 +1950,7 @@
         </w:tc>
         <w:tc>
           <w:tcPr>
-            <w:tcW w:w="1363" w:type="dxa"/>
+            <w:tcW w:w="1168" w:type="dxa"/>
             <w:tcBorders>
               <w:top w:val="single" w:sz="4" w:space="0" w:color="000000"/>
               <w:left w:val="single" w:sz="4" w:space="0" w:color="000000"/>
@@ -1982,7 +1984,7 @@
       <w:tr>
         <w:tc>
           <w:tcPr>
-            <w:tcW w:w="774" w:type="dxa"/>
+            <w:tcW w:w="620" w:type="dxa"/>
             <w:tcBorders>
               <w:top w:val="single" w:sz="4" w:space="0" w:color="000000"/>
               <w:left w:val="single" w:sz="4" w:space="0" w:color="000000"/>
@@ -2014,7 +2016,7 @@
         </w:tc>
         <w:tc>
           <w:tcPr>
-            <w:tcW w:w="1555" w:type="dxa"/>
+            <w:tcW w:w="1414" w:type="dxa"/>
             <w:tcBorders>
               <w:top w:val="single" w:sz="4" w:space="0" w:color="000000"/>
               <w:left w:val="single" w:sz="4" w:space="0" w:color="000000"/>
@@ -2046,7 +2048,7 @@
         </w:tc>
         <w:tc>
           <w:tcPr>
-            <w:tcW w:w="1801" w:type="dxa"/>
+            <w:tcW w:w="1339" w:type="dxa"/>
             <w:tcBorders>
               <w:top w:val="single" w:sz="4" w:space="0" w:color="000000"/>
               <w:left w:val="single" w:sz="4" w:space="0" w:color="000000"/>
@@ -2082,7 +2084,7 @@
         </w:tc>
         <w:tc>
           <w:tcPr>
-            <w:tcW w:w="2993" w:type="dxa"/>
+            <w:tcW w:w="1810" w:type="dxa"/>
             <w:tcBorders>
               <w:top w:val="single" w:sz="4" w:space="0" w:color="000000"/>
               <w:left w:val="single" w:sz="4" w:space="0" w:color="000000"/>
@@ -2114,7 +2116,7 @@
         </w:tc>
         <w:tc>
           <w:tcPr>
-            <w:tcW w:w="1745" w:type="dxa"/>
+            <w:tcW w:w="1387" w:type="dxa"/>
             <w:tcBorders>
               <w:top w:val="single" w:sz="4" w:space="0" w:color="000000"/>
               <w:left w:val="single" w:sz="4" w:space="0" w:color="000000"/>
@@ -2148,7 +2150,7 @@
         </w:tc>
         <w:tc>
           <w:tcPr>
-            <w:tcW w:w="908" w:type="dxa"/>
+            <w:tcW w:w="1180" w:type="dxa"/>
             <w:tcBorders>
               <w:top w:val="single" w:sz="4" w:space="0" w:color="000000"/>
               <w:left w:val="single" w:sz="4" w:space="0" w:color="000000"/>
@@ -2179,7 +2181,7 @@
         </w:tc>
         <w:tc>
           <w:tcPr>
-            <w:tcW w:w="1363" w:type="dxa"/>
+            <w:tcW w:w="1168" w:type="dxa"/>
             <w:tcBorders>
               <w:top w:val="single" w:sz="4" w:space="0" w:color="000000"/>
               <w:left w:val="single" w:sz="4" w:space="0" w:color="000000"/>
@@ -2213,7 +2215,7 @@
       <w:tr>
         <w:tc>
           <w:tcPr>
-            <w:tcW w:w="11139" w:type="dxa"/>
+            <w:tcW w:w="8918" w:type="dxa"/>
             <w:gridSpan w:val="7"/>
             <w:tcBorders>
               <w:top w:val="single" w:sz="4" w:space="0" w:color="000000"/>
@@ -2256,7 +2258,7 @@
       <w:tr>
         <w:tc>
           <w:tcPr>
-            <w:tcW w:w="774" w:type="dxa"/>
+            <w:tcW w:w="620" w:type="dxa"/>
             <w:tcBorders>
               <w:top w:val="single" w:sz="4" w:space="0" w:color="000000"/>
               <w:left w:val="single" w:sz="4" w:space="0" w:color="000000"/>
@@ -2288,7 +2290,7 @@
         </w:tc>
         <w:tc>
           <w:tcPr>
-            <w:tcW w:w="1555" w:type="dxa"/>
+            <w:tcW w:w="1414" w:type="dxa"/>
             <w:tcBorders>
               <w:top w:val="single" w:sz="4" w:space="0" w:color="000000"/>
               <w:left w:val="single" w:sz="4" w:space="0" w:color="000000"/>
@@ -2320,7 +2322,7 @@
         </w:tc>
         <w:tc>
           <w:tcPr>
-            <w:tcW w:w="1801" w:type="dxa"/>
+            <w:tcW w:w="1339" w:type="dxa"/>
             <w:tcBorders>
               <w:top w:val="single" w:sz="4" w:space="0" w:color="000000"/>
               <w:left w:val="single" w:sz="4" w:space="0" w:color="000000"/>
@@ -2352,7 +2354,7 @@
         </w:tc>
         <w:tc>
           <w:tcPr>
-            <w:tcW w:w="2993" w:type="dxa"/>
+            <w:tcW w:w="1810" w:type="dxa"/>
             <w:tcBorders>
               <w:top w:val="single" w:sz="4" w:space="0" w:color="000000"/>
               <w:left w:val="single" w:sz="4" w:space="0" w:color="000000"/>
@@ -2384,7 +2386,7 @@
         </w:tc>
         <w:tc>
           <w:tcPr>
-            <w:tcW w:w="1745" w:type="dxa"/>
+            <w:tcW w:w="1387" w:type="dxa"/>
             <w:tcBorders>
               <w:top w:val="single" w:sz="4" w:space="0" w:color="000000"/>
               <w:left w:val="single" w:sz="4" w:space="0" w:color="000000"/>
@@ -2416,7 +2418,7 @@
         </w:tc>
         <w:tc>
           <w:tcPr>
-            <w:tcW w:w="908" w:type="dxa"/>
+            <w:tcW w:w="1180" w:type="dxa"/>
             <w:tcBorders>
               <w:top w:val="single" w:sz="4" w:space="0" w:color="000000"/>
               <w:left w:val="single" w:sz="4" w:space="0" w:color="000000"/>
@@ -2448,7 +2450,7 @@
         </w:tc>
         <w:tc>
           <w:tcPr>
-            <w:tcW w:w="1363" w:type="dxa"/>
+            <w:tcW w:w="1168" w:type="dxa"/>
             <w:tcBorders>
               <w:top w:val="single" w:sz="4" w:space="0" w:color="000000"/>
               <w:left w:val="single" w:sz="4" w:space="0" w:color="000000"/>
@@ -2482,7 +2484,7 @@
       <w:tr>
         <w:tc>
           <w:tcPr>
-            <w:tcW w:w="11139" w:type="dxa"/>
+            <w:tcW w:w="8918" w:type="dxa"/>
             <w:gridSpan w:val="7"/>
             <w:tcBorders>
               <w:top w:val="single" w:sz="4" w:space="0" w:color="000000"/>
@@ -2534,7 +2536,7 @@
       <w:tr>
         <w:tc>
           <w:tcPr>
-            <w:tcW w:w="774" w:type="dxa"/>
+            <w:tcW w:w="620" w:type="dxa"/>
             <w:tcBorders>
               <w:top w:val="single" w:sz="4" w:space="0" w:color="000000"/>
               <w:left w:val="single" w:sz="4" w:space="0" w:color="000000"/>
@@ -2566,7 +2568,7 @@
         </w:tc>
         <w:tc>
           <w:tcPr>
-            <w:tcW w:w="1555" w:type="dxa"/>
+            <w:tcW w:w="1414" w:type="dxa"/>
             <w:tcBorders>
               <w:top w:val="single" w:sz="4" w:space="0" w:color="000000"/>
               <w:left w:val="single" w:sz="4" w:space="0" w:color="000000"/>
@@ -2598,7 +2600,7 @@
         </w:tc>
         <w:tc>
           <w:tcPr>
-            <w:tcW w:w="1801" w:type="dxa"/>
+            <w:tcW w:w="1339" w:type="dxa"/>
             <w:tcBorders>
               <w:top w:val="single" w:sz="4" w:space="0" w:color="000000"/>
               <w:left w:val="single" w:sz="4" w:space="0" w:color="000000"/>
@@ -2634,7 +2636,7 @@
         </w:tc>
         <w:tc>
           <w:tcPr>
-            <w:tcW w:w="2993" w:type="dxa"/>
+            <w:tcW w:w="1810" w:type="dxa"/>
             <w:tcBorders>
               <w:top w:val="single" w:sz="4" w:space="0" w:color="000000"/>
               <w:left w:val="single" w:sz="4" w:space="0" w:color="000000"/>
@@ -2665,63 +2667,57 @@
         </w:tc>
         <w:tc>
           <w:tcPr>
-            <w:tcW w:w="1745" w:type="dxa"/>
-            <w:tcBorders>
-              <w:top w:val="single" w:sz="4" w:space="0" w:color="000000"/>
-              <w:left w:val="single" w:sz="4" w:space="0" w:color="000000"/>
-              <w:bottom w:val="single" w:sz="4" w:space="0" w:color="000000"/>
-              <w:right w:val="single" w:sz="4" w:space="0" w:color="000000"/>
-            </w:tcBorders>
-            <w:shd w:val="clear" w:color="000000" w:fill="FFFFFF"/>
-            <w:tcMar>
-              <w:left w:w="108" w:type="dxa"/>
-              <w:right w:w="108" w:type="dxa"/>
-            </w:tcMar>
-          </w:tcPr>
-          <w:p>
-            <w:pPr>
-              <w:spacing w:after="0" w:line="240" w:lineRule="auto"/>
-              <w:jc w:val="center"/>
-              <w:rPr>
-                <w:rFonts w:ascii="Calibri" w:eastAsia="Calibri" w:hAnsi="Calibri" w:cs="Calibri"/>
-              </w:rPr>
-            </w:pPr>
-          </w:p>
-        </w:tc>
-        <w:tc>
-          <w:tcPr>
-            <w:tcW w:w="908" w:type="dxa"/>
-            <w:tcBorders>
-              <w:top w:val="single" w:sz="4" w:space="0" w:color="000000"/>
-              <w:left w:val="single" w:sz="4" w:space="0" w:color="000000"/>
-              <w:bottom w:val="single" w:sz="4" w:space="0" w:color="000000"/>
-              <w:right w:val="single" w:sz="4" w:space="0" w:color="000000"/>
-            </w:tcBorders>
-            <w:shd w:val="clear" w:color="000000" w:fill="FFFFFF"/>
-            <w:tcMar>
-              <w:left w:w="108" w:type="dxa"/>
-              <w:right w:w="108" w:type="dxa"/>
-            </w:tcMar>
-          </w:tcPr>
-          <w:p>
-            <w:pPr>
-              <w:spacing w:after="0" w:line="240" w:lineRule="auto"/>
-              <w:jc w:val="center"/>
-              <w:rPr>
-                <w:rFonts w:ascii="Calibri" w:eastAsia="Calibri" w:hAnsi="Calibri" w:cs="Calibri"/>
-              </w:rPr>
-            </w:pPr>
-            <w:r>
-              <w:rPr>
-                <w:rFonts w:ascii="Calibri" w:eastAsia="Calibri" w:hAnsi="Calibri" w:cs="Calibri"/>
-              </w:rPr>
-              <w:t>RRL</w:t>
-            </w:r>
-          </w:p>
-        </w:tc>
-        <w:tc>
-          <w:tcPr>
-            <w:tcW w:w="1363" w:type="dxa"/>
+            <w:tcW w:w="1387" w:type="dxa"/>
+            <w:tcBorders>
+              <w:top w:val="single" w:sz="4" w:space="0" w:color="000000"/>
+              <w:left w:val="single" w:sz="4" w:space="0" w:color="000000"/>
+              <w:bottom w:val="single" w:sz="4" w:space="0" w:color="000000"/>
+              <w:right w:val="single" w:sz="4" w:space="0" w:color="000000"/>
+            </w:tcBorders>
+            <w:shd w:val="clear" w:color="000000" w:fill="FFFFFF"/>
+            <w:tcMar>
+              <w:left w:w="108" w:type="dxa"/>
+              <w:right w:w="108" w:type="dxa"/>
+            </w:tcMar>
+          </w:tcPr>
+          <w:p>
+            <w:pPr>
+              <w:spacing w:after="0" w:line="240" w:lineRule="auto"/>
+              <w:jc w:val="center"/>
+              <w:rPr>
+                <w:rFonts w:ascii="Calibri" w:eastAsia="Calibri" w:hAnsi="Calibri" w:cs="Calibri"/>
+              </w:rPr>
+            </w:pPr>
+          </w:p>
+        </w:tc>
+        <w:tc>
+          <w:tcPr>
+            <w:tcW w:w="1180" w:type="dxa"/>
+            <w:tcBorders>
+              <w:top w:val="single" w:sz="4" w:space="0" w:color="000000"/>
+              <w:left w:val="single" w:sz="4" w:space="0" w:color="000000"/>
+              <w:bottom w:val="single" w:sz="4" w:space="0" w:color="000000"/>
+              <w:right w:val="single" w:sz="4" w:space="0" w:color="000000"/>
+            </w:tcBorders>
+            <w:shd w:val="clear" w:color="000000" w:fill="FFFFFF"/>
+            <w:tcMar>
+              <w:left w:w="108" w:type="dxa"/>
+              <w:right w:w="108" w:type="dxa"/>
+            </w:tcMar>
+          </w:tcPr>
+          <w:p>
+            <w:pPr>
+              <w:spacing w:after="0" w:line="240" w:lineRule="auto"/>
+              <w:jc w:val="center"/>
+              <w:rPr>
+                <w:rFonts w:ascii="Calibri" w:eastAsia="Calibri" w:hAnsi="Calibri" w:cs="Calibri"/>
+              </w:rPr>
+            </w:pPr>
+          </w:p>
+        </w:tc>
+        <w:tc>
+          <w:tcPr>
+            <w:tcW w:w="1168" w:type="dxa"/>
             <w:tcBorders>
               <w:top w:val="single" w:sz="4" w:space="0" w:color="000000"/>
               <w:left w:val="single" w:sz="4" w:space="0" w:color="000000"/>
@@ -2748,71 +2744,71 @@
       <w:tr>
         <w:tc>
           <w:tcPr>
-            <w:tcW w:w="774" w:type="dxa"/>
-            <w:tcBorders>
-              <w:top w:val="single" w:sz="4" w:space="0" w:color="000000"/>
-              <w:left w:val="single" w:sz="4" w:space="0" w:color="000000"/>
-              <w:bottom w:val="single" w:sz="4" w:space="0" w:color="000000"/>
-              <w:right w:val="single" w:sz="4" w:space="0" w:color="000000"/>
-            </w:tcBorders>
-            <w:shd w:val="clear" w:color="000000" w:fill="FFFFFF"/>
-            <w:tcMar>
-              <w:left w:w="108" w:type="dxa"/>
-              <w:right w:w="108" w:type="dxa"/>
-            </w:tcMar>
-          </w:tcPr>
-          <w:p>
-            <w:pPr>
-              <w:spacing w:after="0" w:line="240" w:lineRule="auto"/>
-              <w:jc w:val="center"/>
-              <w:rPr>
-                <w:rFonts w:ascii="Calibri" w:eastAsia="Calibri" w:hAnsi="Calibri" w:cs="Calibri"/>
-              </w:rPr>
-            </w:pPr>
-            <w:r>
-              <w:rPr>
-                <w:rFonts w:ascii="Calibri" w:eastAsia="Calibri" w:hAnsi="Calibri" w:cs="Calibri"/>
-                <w:sz w:val="24"/>
-              </w:rPr>
-              <w:t>2</w:t>
-            </w:r>
-          </w:p>
-        </w:tc>
-        <w:tc>
-          <w:tcPr>
-            <w:tcW w:w="1555" w:type="dxa"/>
-            <w:tcBorders>
-              <w:top w:val="single" w:sz="4" w:space="0" w:color="000000"/>
-              <w:left w:val="single" w:sz="4" w:space="0" w:color="000000"/>
-              <w:bottom w:val="single" w:sz="4" w:space="0" w:color="000000"/>
-              <w:right w:val="single" w:sz="4" w:space="0" w:color="000000"/>
-            </w:tcBorders>
-            <w:shd w:val="clear" w:color="000000" w:fill="FFFFFF"/>
-            <w:tcMar>
-              <w:left w:w="108" w:type="dxa"/>
-              <w:right w:w="108" w:type="dxa"/>
-            </w:tcMar>
-          </w:tcPr>
-          <w:p>
-            <w:pPr>
-              <w:spacing w:after="0" w:line="240" w:lineRule="auto"/>
-              <w:jc w:val="center"/>
-              <w:rPr>
-                <w:rFonts w:ascii="Calibri" w:eastAsia="Calibri" w:hAnsi="Calibri" w:cs="Calibri"/>
-              </w:rPr>
-            </w:pPr>
-            <w:r>
-              <w:rPr>
-                <w:rFonts w:ascii="Calibri" w:eastAsia="Calibri" w:hAnsi="Calibri" w:cs="Calibri"/>
-                <w:sz w:val="24"/>
-              </w:rPr>
-              <w:t>07:05</w:t>
-            </w:r>
-          </w:p>
-        </w:tc>
-        <w:tc>
-          <w:tcPr>
-            <w:tcW w:w="1801" w:type="dxa"/>
+            <w:tcW w:w="620" w:type="dxa"/>
+            <w:tcBorders>
+              <w:top w:val="single" w:sz="4" w:space="0" w:color="000000"/>
+              <w:left w:val="single" w:sz="4" w:space="0" w:color="000000"/>
+              <w:bottom w:val="single" w:sz="4" w:space="0" w:color="000000"/>
+              <w:right w:val="single" w:sz="4" w:space="0" w:color="000000"/>
+            </w:tcBorders>
+            <w:shd w:val="clear" w:color="000000" w:fill="FFFFFF"/>
+            <w:tcMar>
+              <w:left w:w="108" w:type="dxa"/>
+              <w:right w:w="108" w:type="dxa"/>
+            </w:tcMar>
+          </w:tcPr>
+          <w:p>
+            <w:pPr>
+              <w:spacing w:after="0" w:line="240" w:lineRule="auto"/>
+              <w:jc w:val="center"/>
+              <w:rPr>
+                <w:rFonts w:ascii="Calibri" w:eastAsia="Calibri" w:hAnsi="Calibri" w:cs="Calibri"/>
+              </w:rPr>
+            </w:pPr>
+            <w:r>
+              <w:rPr>
+                <w:rFonts w:ascii="Calibri" w:eastAsia="Calibri" w:hAnsi="Calibri" w:cs="Calibri"/>
+                <w:sz w:val="24"/>
+              </w:rPr>
+              <w:t>3</w:t>
+            </w:r>
+          </w:p>
+        </w:tc>
+        <w:tc>
+          <w:tcPr>
+            <w:tcW w:w="1414" w:type="dxa"/>
+            <w:tcBorders>
+              <w:top w:val="single" w:sz="4" w:space="0" w:color="000000"/>
+              <w:left w:val="single" w:sz="4" w:space="0" w:color="000000"/>
+              <w:bottom w:val="single" w:sz="4" w:space="0" w:color="000000"/>
+              <w:right w:val="single" w:sz="4" w:space="0" w:color="000000"/>
+            </w:tcBorders>
+            <w:shd w:val="clear" w:color="000000" w:fill="FFFFFF"/>
+            <w:tcMar>
+              <w:left w:w="108" w:type="dxa"/>
+              <w:right w:w="108" w:type="dxa"/>
+            </w:tcMar>
+          </w:tcPr>
+          <w:p>
+            <w:pPr>
+              <w:spacing w:after="0" w:line="240" w:lineRule="auto"/>
+              <w:jc w:val="center"/>
+              <w:rPr>
+                <w:rFonts w:ascii="Calibri" w:eastAsia="Calibri" w:hAnsi="Calibri" w:cs="Calibri"/>
+              </w:rPr>
+            </w:pPr>
+            <w:r>
+              <w:rPr>
+                <w:rFonts w:ascii="Calibri" w:eastAsia="Calibri" w:hAnsi="Calibri" w:cs="Calibri"/>
+                <w:sz w:val="24"/>
+              </w:rPr>
+              <w:t>07:30</w:t>
+            </w:r>
+          </w:p>
+        </w:tc>
+        <w:tc>
+          <w:tcPr>
+            <w:tcW w:w="1339" w:type="dxa"/>
             <w:tcBorders>
               <w:top w:val="single" w:sz="4" w:space="0" w:color="000000"/>
               <w:left w:val="single" w:sz="4" w:space="0" w:color="000000"/>
@@ -2842,100 +2838,94 @@
                 <w:rFonts w:ascii="Calibri" w:eastAsia="Calibri" w:hAnsi="Calibri" w:cs="Calibri"/>
                 <w:sz w:val="24"/>
               </w:rPr>
-              <w:t>09:10</w:t>
-            </w:r>
-          </w:p>
-        </w:tc>
-        <w:tc>
-          <w:tcPr>
-            <w:tcW w:w="2993" w:type="dxa"/>
-            <w:tcBorders>
-              <w:top w:val="single" w:sz="4" w:space="0" w:color="000000"/>
-              <w:left w:val="single" w:sz="4" w:space="0" w:color="000000"/>
-              <w:bottom w:val="single" w:sz="4" w:space="0" w:color="000000"/>
-              <w:right w:val="single" w:sz="4" w:space="0" w:color="000000"/>
-            </w:tcBorders>
-            <w:shd w:val="clear" w:color="000000" w:fill="FFFFFF"/>
-            <w:tcMar>
-              <w:left w:w="108" w:type="dxa"/>
-              <w:right w:w="108" w:type="dxa"/>
-            </w:tcMar>
-          </w:tcPr>
-          <w:p>
-            <w:pPr>
-              <w:spacing w:after="0" w:line="240" w:lineRule="auto"/>
-              <w:jc w:val="center"/>
-              <w:rPr>
-                <w:rFonts w:ascii="Calibri" w:eastAsia="Calibri" w:hAnsi="Calibri" w:cs="Calibri"/>
-              </w:rPr>
-            </w:pPr>
-            <w:r>
-              <w:rPr>
-                <w:rFonts w:ascii="Calibri" w:eastAsia="Calibri" w:hAnsi="Calibri" w:cs="Calibri"/>
-              </w:rPr>
-              <w:t>MNW</w:t>
-            </w:r>
-          </w:p>
-        </w:tc>
-        <w:tc>
-          <w:tcPr>
-            <w:tcW w:w="1745" w:type="dxa"/>
-            <w:tcBorders>
-              <w:top w:val="single" w:sz="4" w:space="0" w:color="000000"/>
-              <w:left w:val="single" w:sz="4" w:space="0" w:color="000000"/>
-              <w:bottom w:val="single" w:sz="4" w:space="0" w:color="000000"/>
-              <w:right w:val="single" w:sz="4" w:space="0" w:color="000000"/>
-            </w:tcBorders>
-            <w:shd w:val="clear" w:color="000000" w:fill="FFFFFF"/>
-            <w:tcMar>
-              <w:left w:w="108" w:type="dxa"/>
-              <w:right w:w="108" w:type="dxa"/>
-            </w:tcMar>
-          </w:tcPr>
-          <w:p>
-            <w:pPr>
-              <w:spacing w:after="0" w:line="240" w:lineRule="auto"/>
-              <w:jc w:val="center"/>
-              <w:rPr>
-                <w:rFonts w:ascii="Calibri" w:eastAsia="Calibri" w:hAnsi="Calibri" w:cs="Calibri"/>
-              </w:rPr>
-            </w:pPr>
-          </w:p>
-        </w:tc>
-        <w:tc>
-          <w:tcPr>
-            <w:tcW w:w="908" w:type="dxa"/>
-            <w:tcBorders>
-              <w:top w:val="single" w:sz="4" w:space="0" w:color="000000"/>
-              <w:left w:val="single" w:sz="4" w:space="0" w:color="000000"/>
-              <w:bottom w:val="single" w:sz="4" w:space="0" w:color="000000"/>
-              <w:right w:val="single" w:sz="4" w:space="0" w:color="000000"/>
-            </w:tcBorders>
-            <w:shd w:val="clear" w:color="000000" w:fill="FFFFFF"/>
-            <w:tcMar>
-              <w:left w:w="108" w:type="dxa"/>
-              <w:right w:w="108" w:type="dxa"/>
-            </w:tcMar>
-          </w:tcPr>
-          <w:p>
-            <w:pPr>
-              <w:spacing w:after="0" w:line="240" w:lineRule="auto"/>
-              <w:jc w:val="center"/>
-              <w:rPr>
-                <w:rFonts w:ascii="Calibri" w:eastAsia="Calibri" w:hAnsi="Calibri" w:cs="Calibri"/>
-              </w:rPr>
-            </w:pPr>
-            <w:r>
-              <w:rPr>
-                <w:rFonts w:ascii="Calibri" w:eastAsia="Calibri" w:hAnsi="Calibri" w:cs="Calibri"/>
-              </w:rPr>
-              <w:t>RRF</w:t>
-            </w:r>
-          </w:p>
-        </w:tc>
-        <w:tc>
-          <w:tcPr>
-            <w:tcW w:w="1363" w:type="dxa"/>
+              <w:t>09:15</w:t>
+            </w:r>
+          </w:p>
+        </w:tc>
+        <w:tc>
+          <w:tcPr>
+            <w:tcW w:w="1810" w:type="dxa"/>
+            <w:tcBorders>
+              <w:top w:val="single" w:sz="4" w:space="0" w:color="000000"/>
+              <w:left w:val="single" w:sz="4" w:space="0" w:color="000000"/>
+              <w:bottom w:val="single" w:sz="4" w:space="0" w:color="000000"/>
+              <w:right w:val="single" w:sz="4" w:space="0" w:color="000000"/>
+            </w:tcBorders>
+            <w:shd w:val="clear" w:color="000000" w:fill="FFFFFF"/>
+            <w:tcMar>
+              <w:left w:w="108" w:type="dxa"/>
+              <w:right w:w="108" w:type="dxa"/>
+            </w:tcMar>
+          </w:tcPr>
+          <w:p>
+            <w:pPr>
+              <w:spacing w:after="0" w:line="240" w:lineRule="auto"/>
+              <w:jc w:val="center"/>
+              <w:rPr>
+                <w:rFonts w:ascii="Calibri" w:eastAsia="Calibri" w:hAnsi="Calibri" w:cs="Calibri"/>
+              </w:rPr>
+            </w:pPr>
+            <w:r>
+              <w:rPr>
+                <w:rFonts w:ascii="Calibri" w:eastAsia="Calibri" w:hAnsi="Calibri" w:cs="Calibri"/>
+              </w:rPr>
+              <w:t>NA</w:t>
+            </w:r>
+          </w:p>
+        </w:tc>
+        <w:tc>
+          <w:tcPr>
+            <w:tcW w:w="1387" w:type="dxa"/>
+            <w:tcBorders>
+              <w:top w:val="single" w:sz="4" w:space="0" w:color="000000"/>
+              <w:left w:val="single" w:sz="4" w:space="0" w:color="000000"/>
+              <w:bottom w:val="single" w:sz="4" w:space="0" w:color="000000"/>
+              <w:right w:val="single" w:sz="4" w:space="0" w:color="000000"/>
+            </w:tcBorders>
+            <w:shd w:val="clear" w:color="000000" w:fill="FFFFFF"/>
+            <w:tcMar>
+              <w:left w:w="108" w:type="dxa"/>
+              <w:right w:w="108" w:type="dxa"/>
+            </w:tcMar>
+          </w:tcPr>
+          <w:p>
+            <w:pPr>
+              <w:spacing w:after="0" w:line="240" w:lineRule="auto"/>
+              <w:jc w:val="center"/>
+              <w:rPr>
+                <w:rFonts w:ascii="Calibri" w:eastAsia="Calibri" w:hAnsi="Calibri" w:cs="Calibri"/>
+              </w:rPr>
+            </w:pPr>
+          </w:p>
+        </w:tc>
+        <w:tc>
+          <w:tcPr>
+            <w:tcW w:w="1180" w:type="dxa"/>
+            <w:tcBorders>
+              <w:top w:val="single" w:sz="4" w:space="0" w:color="000000"/>
+              <w:left w:val="single" w:sz="4" w:space="0" w:color="000000"/>
+              <w:bottom w:val="single" w:sz="4" w:space="0" w:color="000000"/>
+              <w:right w:val="single" w:sz="4" w:space="0" w:color="000000"/>
+            </w:tcBorders>
+            <w:shd w:val="clear" w:color="000000" w:fill="FFFFFF"/>
+            <w:tcMar>
+              <w:left w:w="108" w:type="dxa"/>
+              <w:right w:w="108" w:type="dxa"/>
+            </w:tcMar>
+          </w:tcPr>
+          <w:p>
+            <w:pPr>
+              <w:spacing w:after="0" w:line="240" w:lineRule="auto"/>
+              <w:jc w:val="center"/>
+              <w:rPr>
+                <w:rFonts w:ascii="Calibri" w:eastAsia="Calibri" w:hAnsi="Calibri" w:cs="Calibri"/>
+              </w:rPr>
+            </w:pPr>
+          </w:p>
+        </w:tc>
+        <w:tc>
+          <w:tcPr>
+            <w:tcW w:w="1168" w:type="dxa"/>
             <w:tcBorders>
               <w:top w:val="single" w:sz="4" w:space="0" w:color="000000"/>
               <w:left w:val="single" w:sz="4" w:space="0" w:color="000000"/>
@@ -2962,71 +2952,71 @@
       <w:tr>
         <w:tc>
           <w:tcPr>
-            <w:tcW w:w="774" w:type="dxa"/>
-            <w:tcBorders>
-              <w:top w:val="single" w:sz="4" w:space="0" w:color="000000"/>
-              <w:left w:val="single" w:sz="4" w:space="0" w:color="000000"/>
-              <w:bottom w:val="single" w:sz="4" w:space="0" w:color="000000"/>
-              <w:right w:val="single" w:sz="4" w:space="0" w:color="000000"/>
-            </w:tcBorders>
-            <w:shd w:val="clear" w:color="000000" w:fill="FFFFFF"/>
-            <w:tcMar>
-              <w:left w:w="108" w:type="dxa"/>
-              <w:right w:w="108" w:type="dxa"/>
-            </w:tcMar>
-          </w:tcPr>
-          <w:p>
-            <w:pPr>
-              <w:spacing w:after="0" w:line="240" w:lineRule="auto"/>
-              <w:jc w:val="center"/>
-              <w:rPr>
-                <w:rFonts w:ascii="Calibri" w:eastAsia="Calibri" w:hAnsi="Calibri" w:cs="Calibri"/>
-              </w:rPr>
-            </w:pPr>
-            <w:r>
-              <w:rPr>
-                <w:rFonts w:ascii="Calibri" w:eastAsia="Calibri" w:hAnsi="Calibri" w:cs="Calibri"/>
-                <w:sz w:val="24"/>
-              </w:rPr>
-              <w:t>3</w:t>
-            </w:r>
-          </w:p>
-        </w:tc>
-        <w:tc>
-          <w:tcPr>
-            <w:tcW w:w="1555" w:type="dxa"/>
-            <w:tcBorders>
-              <w:top w:val="single" w:sz="4" w:space="0" w:color="000000"/>
-              <w:left w:val="single" w:sz="4" w:space="0" w:color="000000"/>
-              <w:bottom w:val="single" w:sz="4" w:space="0" w:color="000000"/>
-              <w:right w:val="single" w:sz="4" w:space="0" w:color="000000"/>
-            </w:tcBorders>
-            <w:shd w:val="clear" w:color="000000" w:fill="FFFFFF"/>
-            <w:tcMar>
-              <w:left w:w="108" w:type="dxa"/>
-              <w:right w:w="108" w:type="dxa"/>
-            </w:tcMar>
-          </w:tcPr>
-          <w:p>
-            <w:pPr>
-              <w:spacing w:after="0" w:line="240" w:lineRule="auto"/>
-              <w:jc w:val="center"/>
-              <w:rPr>
-                <w:rFonts w:ascii="Calibri" w:eastAsia="Calibri" w:hAnsi="Calibri" w:cs="Calibri"/>
-              </w:rPr>
-            </w:pPr>
-            <w:r>
-              <w:rPr>
-                <w:rFonts w:ascii="Calibri" w:eastAsia="Calibri" w:hAnsi="Calibri" w:cs="Calibri"/>
-                <w:sz w:val="24"/>
-              </w:rPr>
-              <w:t>07:30</w:t>
-            </w:r>
-          </w:p>
-        </w:tc>
-        <w:tc>
-          <w:tcPr>
-            <w:tcW w:w="1801" w:type="dxa"/>
+            <w:tcW w:w="620" w:type="dxa"/>
+            <w:tcBorders>
+              <w:top w:val="single" w:sz="4" w:space="0" w:color="000000"/>
+              <w:left w:val="single" w:sz="4" w:space="0" w:color="000000"/>
+              <w:bottom w:val="single" w:sz="4" w:space="0" w:color="000000"/>
+              <w:right w:val="single" w:sz="4" w:space="0" w:color="000000"/>
+            </w:tcBorders>
+            <w:shd w:val="clear" w:color="000000" w:fill="FFFFFF"/>
+            <w:tcMar>
+              <w:left w:w="108" w:type="dxa"/>
+              <w:right w:w="108" w:type="dxa"/>
+            </w:tcMar>
+          </w:tcPr>
+          <w:p>
+            <w:pPr>
+              <w:spacing w:after="0" w:line="240" w:lineRule="auto"/>
+              <w:jc w:val="center"/>
+              <w:rPr>
+                <w:rFonts w:ascii="Calibri" w:eastAsia="Calibri" w:hAnsi="Calibri" w:cs="Calibri"/>
+              </w:rPr>
+            </w:pPr>
+            <w:r>
+              <w:rPr>
+                <w:rFonts w:ascii="Calibri" w:eastAsia="Calibri" w:hAnsi="Calibri" w:cs="Calibri"/>
+                <w:sz w:val="24"/>
+              </w:rPr>
+              <w:t>4</w:t>
+            </w:r>
+          </w:p>
+        </w:tc>
+        <w:tc>
+          <w:tcPr>
+            <w:tcW w:w="1414" w:type="dxa"/>
+            <w:tcBorders>
+              <w:top w:val="single" w:sz="4" w:space="0" w:color="000000"/>
+              <w:left w:val="single" w:sz="4" w:space="0" w:color="000000"/>
+              <w:bottom w:val="single" w:sz="4" w:space="0" w:color="000000"/>
+              <w:right w:val="single" w:sz="4" w:space="0" w:color="000000"/>
+            </w:tcBorders>
+            <w:shd w:val="clear" w:color="000000" w:fill="FFFFFF"/>
+            <w:tcMar>
+              <w:left w:w="108" w:type="dxa"/>
+              <w:right w:w="108" w:type="dxa"/>
+            </w:tcMar>
+          </w:tcPr>
+          <w:p>
+            <w:pPr>
+              <w:spacing w:after="0" w:line="240" w:lineRule="auto"/>
+              <w:jc w:val="center"/>
+              <w:rPr>
+                <w:rFonts w:ascii="Calibri" w:eastAsia="Calibri" w:hAnsi="Calibri" w:cs="Calibri"/>
+              </w:rPr>
+            </w:pPr>
+            <w:r>
+              <w:rPr>
+                <w:rFonts w:ascii="Calibri" w:eastAsia="Calibri" w:hAnsi="Calibri" w:cs="Calibri"/>
+                <w:sz w:val="24"/>
+              </w:rPr>
+              <w:t>08:00</w:t>
+            </w:r>
+          </w:p>
+        </w:tc>
+        <w:tc>
+          <w:tcPr>
+            <w:tcW w:w="1339" w:type="dxa"/>
             <w:tcBorders>
               <w:top w:val="single" w:sz="4" w:space="0" w:color="000000"/>
               <w:left w:val="single" w:sz="4" w:space="0" w:color="000000"/>
@@ -3056,100 +3046,94 @@
                 <w:rFonts w:ascii="Calibri" w:eastAsia="Calibri" w:hAnsi="Calibri" w:cs="Calibri"/>
                 <w:sz w:val="24"/>
               </w:rPr>
-              <w:t>09:15</w:t>
-            </w:r>
-          </w:p>
-        </w:tc>
-        <w:tc>
-          <w:tcPr>
-            <w:tcW w:w="2993" w:type="dxa"/>
-            <w:tcBorders>
-              <w:top w:val="single" w:sz="4" w:space="0" w:color="000000"/>
-              <w:left w:val="single" w:sz="4" w:space="0" w:color="000000"/>
-              <w:bottom w:val="single" w:sz="4" w:space="0" w:color="000000"/>
-              <w:right w:val="single" w:sz="4" w:space="0" w:color="000000"/>
-            </w:tcBorders>
-            <w:shd w:val="clear" w:color="000000" w:fill="FFFFFF"/>
-            <w:tcMar>
-              <w:left w:w="108" w:type="dxa"/>
-              <w:right w:w="108" w:type="dxa"/>
-            </w:tcMar>
-          </w:tcPr>
-          <w:p>
-            <w:pPr>
-              <w:spacing w:after="0" w:line="240" w:lineRule="auto"/>
-              <w:jc w:val="center"/>
-              <w:rPr>
-                <w:rFonts w:ascii="Calibri" w:eastAsia="Calibri" w:hAnsi="Calibri" w:cs="Calibri"/>
-              </w:rPr>
-            </w:pPr>
-            <w:r>
-              <w:rPr>
-                <w:rFonts w:ascii="Calibri" w:eastAsia="Calibri" w:hAnsi="Calibri" w:cs="Calibri"/>
-              </w:rPr>
-              <w:t>WIN</w:t>
-            </w:r>
-          </w:p>
-        </w:tc>
-        <w:tc>
-          <w:tcPr>
-            <w:tcW w:w="1745" w:type="dxa"/>
-            <w:tcBorders>
-              <w:top w:val="single" w:sz="4" w:space="0" w:color="000000"/>
-              <w:left w:val="single" w:sz="4" w:space="0" w:color="000000"/>
-              <w:bottom w:val="single" w:sz="4" w:space="0" w:color="000000"/>
-              <w:right w:val="single" w:sz="4" w:space="0" w:color="000000"/>
-            </w:tcBorders>
-            <w:shd w:val="clear" w:color="000000" w:fill="FFFFFF"/>
-            <w:tcMar>
-              <w:left w:w="108" w:type="dxa"/>
-              <w:right w:w="108" w:type="dxa"/>
-            </w:tcMar>
-          </w:tcPr>
-          <w:p>
-            <w:pPr>
-              <w:spacing w:after="0" w:line="240" w:lineRule="auto"/>
-              <w:jc w:val="center"/>
-              <w:rPr>
-                <w:rFonts w:ascii="Calibri" w:eastAsia="Calibri" w:hAnsi="Calibri" w:cs="Calibri"/>
-              </w:rPr>
-            </w:pPr>
-          </w:p>
-        </w:tc>
-        <w:tc>
-          <w:tcPr>
-            <w:tcW w:w="908" w:type="dxa"/>
-            <w:tcBorders>
-              <w:top w:val="single" w:sz="4" w:space="0" w:color="000000"/>
-              <w:left w:val="single" w:sz="4" w:space="0" w:color="000000"/>
-              <w:bottom w:val="single" w:sz="4" w:space="0" w:color="000000"/>
-              <w:right w:val="single" w:sz="4" w:space="0" w:color="000000"/>
-            </w:tcBorders>
-            <w:shd w:val="clear" w:color="000000" w:fill="FFFFFF"/>
-            <w:tcMar>
-              <w:left w:w="108" w:type="dxa"/>
-              <w:right w:w="108" w:type="dxa"/>
-            </w:tcMar>
-          </w:tcPr>
-          <w:p>
-            <w:pPr>
-              <w:spacing w:after="0" w:line="240" w:lineRule="auto"/>
-              <w:jc w:val="center"/>
-              <w:rPr>
-                <w:rFonts w:ascii="Calibri" w:eastAsia="Calibri" w:hAnsi="Calibri" w:cs="Calibri"/>
-              </w:rPr>
-            </w:pPr>
-            <w:r>
-              <w:rPr>
-                <w:rFonts w:ascii="Calibri" w:eastAsia="Calibri" w:hAnsi="Calibri" w:cs="Calibri"/>
-              </w:rPr>
-              <w:t>GVT</w:t>
-            </w:r>
-          </w:p>
-        </w:tc>
-        <w:tc>
-          <w:tcPr>
-            <w:tcW w:w="1363" w:type="dxa"/>
+              <w:t>11:00</w:t>
+            </w:r>
+          </w:p>
+        </w:tc>
+        <w:tc>
+          <w:tcPr>
+            <w:tcW w:w="1810" w:type="dxa"/>
+            <w:tcBorders>
+              <w:top w:val="single" w:sz="4" w:space="0" w:color="000000"/>
+              <w:left w:val="single" w:sz="4" w:space="0" w:color="000000"/>
+              <w:bottom w:val="single" w:sz="4" w:space="0" w:color="000000"/>
+              <w:right w:val="single" w:sz="4" w:space="0" w:color="000000"/>
+            </w:tcBorders>
+            <w:shd w:val="clear" w:color="000000" w:fill="FFFFFF"/>
+            <w:tcMar>
+              <w:left w:w="108" w:type="dxa"/>
+              <w:right w:w="108" w:type="dxa"/>
+            </w:tcMar>
+          </w:tcPr>
+          <w:p>
+            <w:pPr>
+              <w:spacing w:after="0" w:line="240" w:lineRule="auto"/>
+              <w:jc w:val="center"/>
+              <w:rPr>
+                <w:rFonts w:ascii="Calibri" w:eastAsia="Calibri" w:hAnsi="Calibri" w:cs="Calibri"/>
+              </w:rPr>
+            </w:pPr>
+            <w:r>
+              <w:rPr>
+                <w:rFonts w:ascii="Calibri" w:eastAsia="Calibri" w:hAnsi="Calibri" w:cs="Calibri"/>
+              </w:rPr>
+              <w:t>BPB</w:t>
+            </w:r>
+          </w:p>
+        </w:tc>
+        <w:tc>
+          <w:tcPr>
+            <w:tcW w:w="1387" w:type="dxa"/>
+            <w:tcBorders>
+              <w:top w:val="single" w:sz="4" w:space="0" w:color="000000"/>
+              <w:left w:val="single" w:sz="4" w:space="0" w:color="000000"/>
+              <w:bottom w:val="single" w:sz="4" w:space="0" w:color="000000"/>
+              <w:right w:val="single" w:sz="4" w:space="0" w:color="000000"/>
+            </w:tcBorders>
+            <w:shd w:val="clear" w:color="000000" w:fill="FFFFFF"/>
+            <w:tcMar>
+              <w:left w:w="108" w:type="dxa"/>
+              <w:right w:w="108" w:type="dxa"/>
+            </w:tcMar>
+          </w:tcPr>
+          <w:p>
+            <w:pPr>
+              <w:spacing w:after="0" w:line="240" w:lineRule="auto"/>
+              <w:jc w:val="center"/>
+              <w:rPr>
+                <w:rFonts w:ascii="Calibri" w:eastAsia="Calibri" w:hAnsi="Calibri" w:cs="Calibri"/>
+              </w:rPr>
+            </w:pPr>
+          </w:p>
+        </w:tc>
+        <w:tc>
+          <w:tcPr>
+            <w:tcW w:w="1180" w:type="dxa"/>
+            <w:tcBorders>
+              <w:top w:val="single" w:sz="4" w:space="0" w:color="000000"/>
+              <w:left w:val="single" w:sz="4" w:space="0" w:color="000000"/>
+              <w:bottom w:val="single" w:sz="4" w:space="0" w:color="000000"/>
+              <w:right w:val="single" w:sz="4" w:space="0" w:color="000000"/>
+            </w:tcBorders>
+            <w:shd w:val="clear" w:color="000000" w:fill="FFFFFF"/>
+            <w:tcMar>
+              <w:left w:w="108" w:type="dxa"/>
+              <w:right w:w="108" w:type="dxa"/>
+            </w:tcMar>
+          </w:tcPr>
+          <w:p>
+            <w:pPr>
+              <w:spacing w:after="0" w:line="240" w:lineRule="auto"/>
+              <w:jc w:val="center"/>
+              <w:rPr>
+                <w:rFonts w:ascii="Calibri" w:eastAsia="Calibri" w:hAnsi="Calibri" w:cs="Calibri"/>
+              </w:rPr>
+            </w:pPr>
+          </w:p>
+        </w:tc>
+        <w:tc>
+          <w:tcPr>
+            <w:tcW w:w="1168" w:type="dxa"/>
             <w:tcBorders>
               <w:top w:val="single" w:sz="4" w:space="0" w:color="000000"/>
               <w:left w:val="single" w:sz="4" w:space="0" w:color="000000"/>
@@ -3176,71 +3160,73 @@
       <w:tr>
         <w:tc>
           <w:tcPr>
-            <w:tcW w:w="774" w:type="dxa"/>
-            <w:tcBorders>
-              <w:top w:val="single" w:sz="4" w:space="0" w:color="000000"/>
-              <w:left w:val="single" w:sz="4" w:space="0" w:color="000000"/>
-              <w:bottom w:val="single" w:sz="4" w:space="0" w:color="000000"/>
-              <w:right w:val="single" w:sz="4" w:space="0" w:color="000000"/>
-            </w:tcBorders>
-            <w:shd w:val="clear" w:color="000000" w:fill="FFFFFF"/>
-            <w:tcMar>
-              <w:left w:w="108" w:type="dxa"/>
-              <w:right w:w="108" w:type="dxa"/>
-            </w:tcMar>
-          </w:tcPr>
-          <w:p>
-            <w:pPr>
-              <w:spacing w:after="0" w:line="240" w:lineRule="auto"/>
-              <w:jc w:val="center"/>
-              <w:rPr>
-                <w:rFonts w:ascii="Calibri" w:eastAsia="Calibri" w:hAnsi="Calibri" w:cs="Calibri"/>
-              </w:rPr>
-            </w:pPr>
-            <w:r>
-              <w:rPr>
-                <w:rFonts w:ascii="Calibri" w:eastAsia="Calibri" w:hAnsi="Calibri" w:cs="Calibri"/>
-                <w:sz w:val="24"/>
-              </w:rPr>
-              <w:t>4</w:t>
-            </w:r>
-          </w:p>
-        </w:tc>
-        <w:tc>
-          <w:tcPr>
-            <w:tcW w:w="1555" w:type="dxa"/>
-            <w:tcBorders>
-              <w:top w:val="single" w:sz="4" w:space="0" w:color="000000"/>
-              <w:left w:val="single" w:sz="4" w:space="0" w:color="000000"/>
-              <w:bottom w:val="single" w:sz="4" w:space="0" w:color="000000"/>
-              <w:right w:val="single" w:sz="4" w:space="0" w:color="000000"/>
-            </w:tcBorders>
-            <w:shd w:val="clear" w:color="000000" w:fill="FFFFFF"/>
-            <w:tcMar>
-              <w:left w:w="108" w:type="dxa"/>
-              <w:right w:w="108" w:type="dxa"/>
-            </w:tcMar>
-          </w:tcPr>
-          <w:p>
-            <w:pPr>
-              <w:spacing w:after="0" w:line="240" w:lineRule="auto"/>
-              <w:jc w:val="center"/>
-              <w:rPr>
-                <w:rFonts w:ascii="Calibri" w:eastAsia="Calibri" w:hAnsi="Calibri" w:cs="Calibri"/>
-              </w:rPr>
-            </w:pPr>
-            <w:r>
-              <w:rPr>
-                <w:rFonts w:ascii="Calibri" w:eastAsia="Calibri" w:hAnsi="Calibri" w:cs="Calibri"/>
-                <w:sz w:val="24"/>
-              </w:rPr>
-              <w:t>08:00</w:t>
-            </w:r>
-          </w:p>
-        </w:tc>
-        <w:tc>
-          <w:tcPr>
-            <w:tcW w:w="1801" w:type="dxa"/>
+            <w:tcW w:w="620" w:type="dxa"/>
+            <w:tcBorders>
+              <w:top w:val="single" w:sz="4" w:space="0" w:color="000000"/>
+              <w:left w:val="single" w:sz="4" w:space="0" w:color="000000"/>
+              <w:bottom w:val="single" w:sz="4" w:space="0" w:color="000000"/>
+              <w:right w:val="single" w:sz="4" w:space="0" w:color="000000"/>
+            </w:tcBorders>
+            <w:shd w:val="clear" w:color="000000" w:fill="FFFFFF"/>
+            <w:tcMar>
+              <w:left w:w="108" w:type="dxa"/>
+              <w:right w:w="108" w:type="dxa"/>
+            </w:tcMar>
+          </w:tcPr>
+          <w:p>
+            <w:pPr>
+              <w:spacing w:after="0" w:line="240" w:lineRule="auto"/>
+              <w:jc w:val="center"/>
+              <w:rPr>
+                <w:rFonts w:ascii="Calibri" w:eastAsia="Calibri" w:hAnsi="Calibri" w:cs="Calibri"/>
+                <w:sz w:val="24"/>
+              </w:rPr>
+            </w:pPr>
+            <w:r>
+              <w:rPr>
+                <w:rFonts w:ascii="Calibri" w:eastAsia="Calibri" w:hAnsi="Calibri" w:cs="Calibri"/>
+                <w:sz w:val="24"/>
+              </w:rPr>
+              <w:t>6</w:t>
+            </w:r>
+          </w:p>
+        </w:tc>
+        <w:tc>
+          <w:tcPr>
+            <w:tcW w:w="1414" w:type="dxa"/>
+            <w:tcBorders>
+              <w:top w:val="single" w:sz="4" w:space="0" w:color="000000"/>
+              <w:left w:val="single" w:sz="4" w:space="0" w:color="000000"/>
+              <w:bottom w:val="single" w:sz="4" w:space="0" w:color="000000"/>
+              <w:right w:val="single" w:sz="4" w:space="0" w:color="000000"/>
+            </w:tcBorders>
+            <w:shd w:val="clear" w:color="000000" w:fill="FFFFFF"/>
+            <w:tcMar>
+              <w:left w:w="108" w:type="dxa"/>
+              <w:right w:w="108" w:type="dxa"/>
+            </w:tcMar>
+          </w:tcPr>
+          <w:p>
+            <w:pPr>
+              <w:spacing w:after="0" w:line="240" w:lineRule="auto"/>
+              <w:jc w:val="center"/>
+              <w:rPr>
+                <w:rFonts w:ascii="Calibri" w:eastAsia="Calibri" w:hAnsi="Calibri" w:cs="Calibri"/>
+                <w:sz w:val="24"/>
+              </w:rPr>
+            </w:pPr>
+            <w:r>
+              <w:rPr>
+                <w:rFonts w:ascii="Calibri" w:eastAsia="Calibri" w:hAnsi="Calibri" w:cs="Calibri"/>
+                <w:sz w:val="24"/>
+              </w:rPr>
+              <w:t>08:20</w:t>
+            </w:r>
+          </w:p>
+        </w:tc>
+        <w:tc>
+          <w:tcPr>
+            <w:tcW w:w="1339" w:type="dxa"/>
             <w:tcBorders>
               <w:top w:val="single" w:sz="4" w:space="0" w:color="000000"/>
               <w:left w:val="single" w:sz="4" w:space="0" w:color="000000"/>
@@ -3263,107 +3249,102 @@
               <w:jc w:val="center"/>
               <w:rPr>
                 <w:rFonts w:ascii="Calibri" w:eastAsia="Calibri" w:hAnsi="Calibri" w:cs="Calibri"/>
-              </w:rPr>
-            </w:pPr>
-            <w:r>
-              <w:rPr>
-                <w:rFonts w:ascii="Calibri" w:eastAsia="Calibri" w:hAnsi="Calibri" w:cs="Calibri"/>
-                <w:sz w:val="24"/>
-              </w:rPr>
-              <w:t>11:00</w:t>
-            </w:r>
-          </w:p>
-        </w:tc>
-        <w:tc>
-          <w:tcPr>
-            <w:tcW w:w="2993" w:type="dxa"/>
-            <w:tcBorders>
-              <w:top w:val="single" w:sz="4" w:space="0" w:color="000000"/>
-              <w:left w:val="single" w:sz="4" w:space="0" w:color="000000"/>
-              <w:bottom w:val="single" w:sz="4" w:space="0" w:color="000000"/>
-              <w:right w:val="single" w:sz="4" w:space="0" w:color="000000"/>
-            </w:tcBorders>
-            <w:shd w:val="clear" w:color="000000" w:fill="FFFFFF"/>
-            <w:tcMar>
-              <w:left w:w="108" w:type="dxa"/>
-              <w:right w:w="108" w:type="dxa"/>
-            </w:tcMar>
-          </w:tcPr>
-          <w:p>
-            <w:pPr>
-              <w:spacing w:after="0" w:line="240" w:lineRule="auto"/>
-              <w:jc w:val="center"/>
-              <w:rPr>
-                <w:rFonts w:ascii="Calibri" w:eastAsia="Calibri" w:hAnsi="Calibri" w:cs="Calibri"/>
-              </w:rPr>
-            </w:pPr>
-            <w:r>
-              <w:rPr>
-                <w:rFonts w:ascii="Calibri" w:eastAsia="Calibri" w:hAnsi="Calibri" w:cs="Calibri"/>
-              </w:rPr>
-              <w:t>BPB</w:t>
-            </w:r>
-          </w:p>
-        </w:tc>
-        <w:tc>
-          <w:tcPr>
-            <w:tcW w:w="1745" w:type="dxa"/>
-            <w:tcBorders>
-              <w:top w:val="single" w:sz="4" w:space="0" w:color="000000"/>
-              <w:left w:val="single" w:sz="4" w:space="0" w:color="000000"/>
-              <w:bottom w:val="single" w:sz="4" w:space="0" w:color="000000"/>
-              <w:right w:val="single" w:sz="4" w:space="0" w:color="000000"/>
-            </w:tcBorders>
-            <w:shd w:val="clear" w:color="000000" w:fill="FFFFFF"/>
-            <w:tcMar>
-              <w:left w:w="108" w:type="dxa"/>
-              <w:right w:w="108" w:type="dxa"/>
-            </w:tcMar>
-          </w:tcPr>
-          <w:p>
-            <w:pPr>
-              <w:spacing w:after="0" w:line="240" w:lineRule="auto"/>
-              <w:jc w:val="center"/>
-              <w:rPr>
-                <w:rFonts w:ascii="Calibri" w:eastAsia="Calibri" w:hAnsi="Calibri" w:cs="Calibri"/>
-              </w:rPr>
-            </w:pPr>
-          </w:p>
-        </w:tc>
-        <w:tc>
-          <w:tcPr>
-            <w:tcW w:w="908" w:type="dxa"/>
-            <w:tcBorders>
-              <w:top w:val="single" w:sz="4" w:space="0" w:color="000000"/>
-              <w:left w:val="single" w:sz="4" w:space="0" w:color="000000"/>
-              <w:bottom w:val="single" w:sz="4" w:space="0" w:color="000000"/>
-              <w:right w:val="single" w:sz="4" w:space="0" w:color="000000"/>
-            </w:tcBorders>
-            <w:shd w:val="clear" w:color="000000" w:fill="FFFFFF"/>
-            <w:tcMar>
-              <w:left w:w="108" w:type="dxa"/>
-              <w:right w:w="108" w:type="dxa"/>
-            </w:tcMar>
-          </w:tcPr>
-          <w:p>
-            <w:pPr>
-              <w:spacing w:after="0" w:line="240" w:lineRule="auto"/>
-              <w:jc w:val="center"/>
-              <w:rPr>
-                <w:rFonts w:ascii="Calibri" w:eastAsia="Calibri" w:hAnsi="Calibri" w:cs="Calibri"/>
-              </w:rPr>
-            </w:pPr>
-            <w:r>
-              <w:rPr>
-                <w:rFonts w:ascii="Calibri" w:eastAsia="Calibri" w:hAnsi="Calibri" w:cs="Calibri"/>
-              </w:rPr>
-              <w:t>RRL</w:t>
-            </w:r>
-          </w:p>
-        </w:tc>
-        <w:tc>
-          <w:tcPr>
-            <w:tcW w:w="1363" w:type="dxa"/>
+                <w:sz w:val="24"/>
+              </w:rPr>
+            </w:pPr>
+            <w:r>
+              <w:rPr>
+                <w:rFonts w:ascii="Calibri" w:eastAsia="Calibri" w:hAnsi="Calibri" w:cs="Calibri"/>
+                <w:sz w:val="24"/>
+              </w:rPr>
+              <w:t>11:15</w:t>
+            </w:r>
+          </w:p>
+        </w:tc>
+        <w:tc>
+          <w:tcPr>
+            <w:tcW w:w="1810" w:type="dxa"/>
+            <w:tcBorders>
+              <w:top w:val="single" w:sz="4" w:space="0" w:color="000000"/>
+              <w:left w:val="single" w:sz="4" w:space="0" w:color="000000"/>
+              <w:bottom w:val="single" w:sz="4" w:space="0" w:color="000000"/>
+              <w:right w:val="single" w:sz="4" w:space="0" w:color="000000"/>
+            </w:tcBorders>
+            <w:shd w:val="clear" w:color="000000" w:fill="FFFFFF"/>
+            <w:tcMar>
+              <w:left w:w="108" w:type="dxa"/>
+              <w:right w:w="108" w:type="dxa"/>
+            </w:tcMar>
+          </w:tcPr>
+          <w:p>
+            <w:pPr>
+              <w:spacing w:after="0" w:line="240" w:lineRule="auto"/>
+              <w:jc w:val="center"/>
+              <w:rPr>
+                <w:rFonts w:ascii="Calibri" w:eastAsia="Calibri" w:hAnsi="Calibri" w:cs="Calibri"/>
+              </w:rPr>
+            </w:pPr>
+            <w:r>
+              <w:rPr>
+                <w:rFonts w:ascii="Calibri" w:eastAsia="Calibri" w:hAnsi="Calibri" w:cs="Calibri"/>
+              </w:rPr>
+              <w:t>SSAK</w:t>
+            </w:r>
+          </w:p>
+        </w:tc>
+        <w:tc>
+          <w:tcPr>
+            <w:tcW w:w="1387" w:type="dxa"/>
+            <w:tcBorders>
+              <w:top w:val="single" w:sz="4" w:space="0" w:color="000000"/>
+              <w:left w:val="single" w:sz="4" w:space="0" w:color="000000"/>
+              <w:bottom w:val="single" w:sz="4" w:space="0" w:color="000000"/>
+              <w:right w:val="single" w:sz="4" w:space="0" w:color="000000"/>
+            </w:tcBorders>
+            <w:shd w:val="clear" w:color="000000" w:fill="FFFFFF"/>
+            <w:tcMar>
+              <w:left w:w="108" w:type="dxa"/>
+              <w:right w:w="108" w:type="dxa"/>
+            </w:tcMar>
+          </w:tcPr>
+          <w:p>
+            <w:pPr>
+              <w:spacing w:after="0" w:line="240" w:lineRule="auto"/>
+              <w:jc w:val="center"/>
+              <w:rPr>
+                <w:rFonts w:ascii="Calibri" w:eastAsia="Calibri" w:hAnsi="Calibri" w:cs="Calibri"/>
+              </w:rPr>
+            </w:pPr>
+          </w:p>
+        </w:tc>
+        <w:tc>
+          <w:tcPr>
+            <w:tcW w:w="1180" w:type="dxa"/>
+            <w:tcBorders>
+              <w:top w:val="single" w:sz="4" w:space="0" w:color="000000"/>
+              <w:left w:val="single" w:sz="4" w:space="0" w:color="000000"/>
+              <w:bottom w:val="single" w:sz="4" w:space="0" w:color="000000"/>
+              <w:right w:val="single" w:sz="4" w:space="0" w:color="000000"/>
+            </w:tcBorders>
+            <w:shd w:val="clear" w:color="000000" w:fill="FFFFFF"/>
+            <w:tcMar>
+              <w:left w:w="108" w:type="dxa"/>
+              <w:right w:w="108" w:type="dxa"/>
+            </w:tcMar>
+          </w:tcPr>
+          <w:p>
+            <w:pPr>
+              <w:spacing w:after="0" w:line="240" w:lineRule="auto"/>
+              <w:jc w:val="center"/>
+              <w:rPr>
+                <w:rFonts w:ascii="Calibri" w:eastAsia="Calibri" w:hAnsi="Calibri" w:cs="Calibri"/>
+              </w:rPr>
+            </w:pPr>
+          </w:p>
+        </w:tc>
+        <w:tc>
+          <w:tcPr>
+            <w:tcW w:w="1168" w:type="dxa"/>
             <w:tcBorders>
               <w:top w:val="single" w:sz="4" w:space="0" w:color="000000"/>
               <w:left w:val="single" w:sz="4" w:space="0" w:color="000000"/>
@@ -3390,448 +3371,7 @@
       <w:tr>
         <w:tc>
           <w:tcPr>
-            <w:tcW w:w="774" w:type="dxa"/>
-            <w:tcBorders>
-              <w:top w:val="single" w:sz="4" w:space="0" w:color="000000"/>
-              <w:left w:val="single" w:sz="4" w:space="0" w:color="000000"/>
-              <w:bottom w:val="single" w:sz="4" w:space="0" w:color="000000"/>
-              <w:right w:val="single" w:sz="4" w:space="0" w:color="000000"/>
-            </w:tcBorders>
-            <w:shd w:val="clear" w:color="000000" w:fill="FFFFFF"/>
-            <w:tcMar>
-              <w:left w:w="108" w:type="dxa"/>
-              <w:right w:w="108" w:type="dxa"/>
-            </w:tcMar>
-          </w:tcPr>
-          <w:p>
-            <w:pPr>
-              <w:spacing w:after="0" w:line="240" w:lineRule="auto"/>
-              <w:jc w:val="center"/>
-              <w:rPr>
-                <w:rFonts w:ascii="Calibri" w:eastAsia="Calibri" w:hAnsi="Calibri" w:cs="Calibri"/>
-                <w:sz w:val="24"/>
-              </w:rPr>
-            </w:pPr>
-            <w:r>
-              <w:rPr>
-                <w:rFonts w:ascii="Calibri" w:eastAsia="Calibri" w:hAnsi="Calibri" w:cs="Calibri"/>
-                <w:sz w:val="24"/>
-              </w:rPr>
-              <w:t>5</w:t>
-            </w:r>
-          </w:p>
-        </w:tc>
-        <w:tc>
-          <w:tcPr>
-            <w:tcW w:w="1555" w:type="dxa"/>
-            <w:tcBorders>
-              <w:top w:val="single" w:sz="4" w:space="0" w:color="000000"/>
-              <w:left w:val="single" w:sz="4" w:space="0" w:color="000000"/>
-              <w:bottom w:val="single" w:sz="4" w:space="0" w:color="000000"/>
-              <w:right w:val="single" w:sz="4" w:space="0" w:color="000000"/>
-            </w:tcBorders>
-            <w:shd w:val="clear" w:color="000000" w:fill="FFFFFF"/>
-            <w:tcMar>
-              <w:left w:w="108" w:type="dxa"/>
-              <w:right w:w="108" w:type="dxa"/>
-            </w:tcMar>
-          </w:tcPr>
-          <w:p>
-            <w:pPr>
-              <w:spacing w:after="0" w:line="240" w:lineRule="auto"/>
-              <w:jc w:val="center"/>
-              <w:rPr>
-                <w:rFonts w:ascii="Calibri" w:eastAsia="Calibri" w:hAnsi="Calibri" w:cs="Calibri"/>
-                <w:sz w:val="24"/>
-              </w:rPr>
-            </w:pPr>
-            <w:r>
-              <w:rPr>
-                <w:rFonts w:ascii="Calibri" w:eastAsia="Calibri" w:hAnsi="Calibri" w:cs="Calibri"/>
-                <w:sz w:val="24"/>
-              </w:rPr>
-              <w:t>08:00</w:t>
-            </w:r>
-          </w:p>
-        </w:tc>
-        <w:tc>
-          <w:tcPr>
-            <w:tcW w:w="1801" w:type="dxa"/>
-            <w:tcBorders>
-              <w:top w:val="single" w:sz="4" w:space="0" w:color="000000"/>
-              <w:left w:val="single" w:sz="4" w:space="0" w:color="000000"/>
-              <w:bottom w:val="single" w:sz="4" w:space="0" w:color="000000"/>
-              <w:right w:val="single" w:sz="4" w:space="0" w:color="000000"/>
-            </w:tcBorders>
-            <w:shd w:val="clear" w:color="000000" w:fill="FFFFFF"/>
-            <w:tcMar>
-              <w:left w:w="108" w:type="dxa"/>
-              <w:right w:w="108" w:type="dxa"/>
-            </w:tcMar>
-          </w:tcPr>
-          <w:p>
-            <w:pPr>
-              <w:tabs>
-                <w:tab w:val="left" w:pos="368"/>
-                <w:tab w:val="center" w:pos="767"/>
-              </w:tabs>
-              <w:spacing w:after="0" w:line="240" w:lineRule="auto"/>
-              <w:jc w:val="center"/>
-              <w:rPr>
-                <w:rFonts w:ascii="Calibri" w:eastAsia="Calibri" w:hAnsi="Calibri" w:cs="Calibri"/>
-                <w:sz w:val="24"/>
-              </w:rPr>
-            </w:pPr>
-            <w:r>
-              <w:rPr>
-                <w:rFonts w:ascii="Calibri" w:eastAsia="Calibri" w:hAnsi="Calibri" w:cs="Calibri"/>
-                <w:sz w:val="24"/>
-              </w:rPr>
-              <w:t>11:1</w:t>
-            </w:r>
-            <w:r>
-              <w:rPr>
-                <w:rFonts w:ascii="Calibri" w:eastAsia="Calibri" w:hAnsi="Calibri" w:cs="Calibri"/>
-                <w:sz w:val="24"/>
-              </w:rPr>
-              <w:t>0</w:t>
-            </w:r>
-          </w:p>
-        </w:tc>
-        <w:tc>
-          <w:tcPr>
-            <w:tcW w:w="2993" w:type="dxa"/>
-            <w:tcBorders>
-              <w:top w:val="single" w:sz="4" w:space="0" w:color="000000"/>
-              <w:left w:val="single" w:sz="4" w:space="0" w:color="000000"/>
-              <w:bottom w:val="single" w:sz="4" w:space="0" w:color="000000"/>
-              <w:right w:val="single" w:sz="4" w:space="0" w:color="000000"/>
-            </w:tcBorders>
-            <w:shd w:val="clear" w:color="000000" w:fill="FFFFFF"/>
-            <w:tcMar>
-              <w:left w:w="108" w:type="dxa"/>
-              <w:right w:w="108" w:type="dxa"/>
-            </w:tcMar>
-          </w:tcPr>
-          <w:p>
-            <w:pPr>
-              <w:spacing w:after="0" w:line="240" w:lineRule="auto"/>
-              <w:jc w:val="center"/>
-              <w:rPr>
-                <w:rFonts w:ascii="Calibri" w:eastAsia="Calibri" w:hAnsi="Calibri" w:cs="Calibri"/>
-              </w:rPr>
-            </w:pPr>
-            <w:r>
-              <w:rPr>
-                <w:rFonts w:ascii="Calibri" w:eastAsia="Calibri" w:hAnsi="Calibri" w:cs="Calibri"/>
-              </w:rPr>
-              <w:t>BPB</w:t>
-            </w:r>
-          </w:p>
-        </w:tc>
-        <w:tc>
-          <w:tcPr>
-            <w:tcW w:w="1745" w:type="dxa"/>
-            <w:tcBorders>
-              <w:top w:val="single" w:sz="4" w:space="0" w:color="000000"/>
-              <w:left w:val="single" w:sz="4" w:space="0" w:color="000000"/>
-              <w:bottom w:val="single" w:sz="4" w:space="0" w:color="000000"/>
-              <w:right w:val="single" w:sz="4" w:space="0" w:color="000000"/>
-            </w:tcBorders>
-            <w:shd w:val="clear" w:color="000000" w:fill="FFFFFF"/>
-            <w:tcMar>
-              <w:left w:w="108" w:type="dxa"/>
-              <w:right w:w="108" w:type="dxa"/>
-            </w:tcMar>
-          </w:tcPr>
-          <w:p>
-            <w:pPr>
-              <w:spacing w:after="0" w:line="240" w:lineRule="auto"/>
-              <w:jc w:val="center"/>
-              <w:rPr>
-                <w:rFonts w:ascii="Calibri" w:eastAsia="Calibri" w:hAnsi="Calibri" w:cs="Calibri"/>
-              </w:rPr>
-            </w:pPr>
-          </w:p>
-        </w:tc>
-        <w:tc>
-          <w:tcPr>
-            <w:tcW w:w="908" w:type="dxa"/>
-            <w:tcBorders>
-              <w:top w:val="single" w:sz="4" w:space="0" w:color="000000"/>
-              <w:left w:val="single" w:sz="4" w:space="0" w:color="000000"/>
-              <w:bottom w:val="single" w:sz="4" w:space="0" w:color="000000"/>
-              <w:right w:val="single" w:sz="4" w:space="0" w:color="000000"/>
-            </w:tcBorders>
-            <w:shd w:val="clear" w:color="000000" w:fill="FFFFFF"/>
-            <w:tcMar>
-              <w:left w:w="108" w:type="dxa"/>
-              <w:right w:w="108" w:type="dxa"/>
-            </w:tcMar>
-          </w:tcPr>
-          <w:p>
-            <w:pPr>
-              <w:spacing w:after="0" w:line="240" w:lineRule="auto"/>
-              <w:jc w:val="center"/>
-              <w:rPr>
-                <w:rFonts w:ascii="Calibri" w:eastAsia="Calibri" w:hAnsi="Calibri" w:cs="Calibri"/>
-              </w:rPr>
-            </w:pPr>
-            <w:r>
-              <w:rPr>
-                <w:rFonts w:ascii="Calibri" w:eastAsia="Calibri" w:hAnsi="Calibri" w:cs="Calibri"/>
-              </w:rPr>
-              <w:t>RRL</w:t>
-            </w:r>
-          </w:p>
-        </w:tc>
-        <w:tc>
-          <w:tcPr>
-            <w:tcW w:w="1363" w:type="dxa"/>
-            <w:tcBorders>
-              <w:top w:val="single" w:sz="4" w:space="0" w:color="000000"/>
-              <w:left w:val="single" w:sz="4" w:space="0" w:color="000000"/>
-              <w:bottom w:val="single" w:sz="4" w:space="0" w:color="000000"/>
-              <w:right w:val="single" w:sz="4" w:space="0" w:color="000000"/>
-            </w:tcBorders>
-            <w:shd w:val="clear" w:color="000000" w:fill="FFFFFF"/>
-            <w:tcMar>
-              <w:left w:w="108" w:type="dxa"/>
-              <w:right w:w="108" w:type="dxa"/>
-            </w:tcMar>
-          </w:tcPr>
-          <w:p>
-            <w:pPr>
-              <w:spacing w:after="0" w:line="240" w:lineRule="auto"/>
-              <w:jc w:val="center"/>
-              <w:rPr>
-                <w:rFonts w:ascii="Calibri" w:eastAsia="Calibri" w:hAnsi="Calibri" w:cs="Calibri"/>
-              </w:rPr>
-            </w:pPr>
-          </w:p>
-        </w:tc>
-      </w:tr>
-      <w:tr>
-        <w:tc>
-          <w:tcPr>
-            <w:tcW w:w="774" w:type="dxa"/>
-            <w:tcBorders>
-              <w:top w:val="single" w:sz="4" w:space="0" w:color="000000"/>
-              <w:left w:val="single" w:sz="4" w:space="0" w:color="000000"/>
-              <w:bottom w:val="single" w:sz="4" w:space="0" w:color="000000"/>
-              <w:right w:val="single" w:sz="4" w:space="0" w:color="000000"/>
-            </w:tcBorders>
-            <w:shd w:val="clear" w:color="000000" w:fill="FFFFFF"/>
-            <w:tcMar>
-              <w:left w:w="108" w:type="dxa"/>
-              <w:right w:w="108" w:type="dxa"/>
-            </w:tcMar>
-          </w:tcPr>
-          <w:p>
-            <w:pPr>
-              <w:spacing w:after="0" w:line="240" w:lineRule="auto"/>
-              <w:jc w:val="center"/>
-              <w:rPr>
-                <w:rFonts w:ascii="Calibri" w:eastAsia="Calibri" w:hAnsi="Calibri" w:cs="Calibri"/>
-                <w:sz w:val="24"/>
-              </w:rPr>
-            </w:pPr>
-            <w:r>
-              <w:rPr>
-                <w:rFonts w:ascii="Calibri" w:eastAsia="Calibri" w:hAnsi="Calibri" w:cs="Calibri"/>
-                <w:sz w:val="24"/>
-              </w:rPr>
-              <w:t>6</w:t>
-            </w:r>
-          </w:p>
-        </w:tc>
-        <w:tc>
-          <w:tcPr>
-            <w:tcW w:w="1555" w:type="dxa"/>
-            <w:tcBorders>
-              <w:top w:val="single" w:sz="4" w:space="0" w:color="000000"/>
-              <w:left w:val="single" w:sz="4" w:space="0" w:color="000000"/>
-              <w:bottom w:val="single" w:sz="4" w:space="0" w:color="000000"/>
-              <w:right w:val="single" w:sz="4" w:space="0" w:color="000000"/>
-            </w:tcBorders>
-            <w:shd w:val="clear" w:color="000000" w:fill="FFFFFF"/>
-            <w:tcMar>
-              <w:left w:w="108" w:type="dxa"/>
-              <w:right w:w="108" w:type="dxa"/>
-            </w:tcMar>
-          </w:tcPr>
-          <w:p>
-            <w:pPr>
-              <w:spacing w:after="0" w:line="240" w:lineRule="auto"/>
-              <w:jc w:val="center"/>
-              <w:rPr>
-                <w:rFonts w:ascii="Calibri" w:eastAsia="Calibri" w:hAnsi="Calibri" w:cs="Calibri"/>
-                <w:sz w:val="24"/>
-              </w:rPr>
-            </w:pPr>
-            <w:r>
-              <w:rPr>
-                <w:rFonts w:ascii="Calibri" w:eastAsia="Calibri" w:hAnsi="Calibri" w:cs="Calibri"/>
-                <w:sz w:val="24"/>
-              </w:rPr>
-              <w:t>08:20</w:t>
-            </w:r>
-          </w:p>
-        </w:tc>
-        <w:tc>
-          <w:tcPr>
-            <w:tcW w:w="1801" w:type="dxa"/>
-            <w:tcBorders>
-              <w:top w:val="single" w:sz="4" w:space="0" w:color="000000"/>
-              <w:left w:val="single" w:sz="4" w:space="0" w:color="000000"/>
-              <w:bottom w:val="single" w:sz="4" w:space="0" w:color="000000"/>
-              <w:right w:val="single" w:sz="4" w:space="0" w:color="000000"/>
-            </w:tcBorders>
-            <w:shd w:val="clear" w:color="000000" w:fill="FFFFFF"/>
-            <w:tcMar>
-              <w:left w:w="108" w:type="dxa"/>
-              <w:right w:w="108" w:type="dxa"/>
-            </w:tcMar>
-          </w:tcPr>
-          <w:p>
-            <w:pPr>
-              <w:tabs>
-                <w:tab w:val="left" w:pos="368"/>
-                <w:tab w:val="center" w:pos="767"/>
-              </w:tabs>
-              <w:spacing w:after="0" w:line="240" w:lineRule="auto"/>
-              <w:jc w:val="center"/>
-              <w:rPr>
-                <w:rFonts w:ascii="Calibri" w:eastAsia="Calibri" w:hAnsi="Calibri" w:cs="Calibri"/>
-                <w:sz w:val="24"/>
-              </w:rPr>
-            </w:pPr>
-            <w:r>
-              <w:rPr>
-                <w:rFonts w:ascii="Calibri" w:eastAsia="Calibri" w:hAnsi="Calibri" w:cs="Calibri"/>
-                <w:sz w:val="24"/>
-              </w:rPr>
-              <w:t>11:15</w:t>
-            </w:r>
-          </w:p>
-        </w:tc>
-        <w:tc>
-          <w:tcPr>
-            <w:tcW w:w="2993" w:type="dxa"/>
-            <w:tcBorders>
-              <w:top w:val="single" w:sz="4" w:space="0" w:color="000000"/>
-              <w:left w:val="single" w:sz="4" w:space="0" w:color="000000"/>
-              <w:bottom w:val="single" w:sz="4" w:space="0" w:color="000000"/>
-              <w:right w:val="single" w:sz="4" w:space="0" w:color="000000"/>
-            </w:tcBorders>
-            <w:shd w:val="clear" w:color="000000" w:fill="FFFFFF"/>
-            <w:tcMar>
-              <w:left w:w="108" w:type="dxa"/>
-              <w:right w:w="108" w:type="dxa"/>
-            </w:tcMar>
-          </w:tcPr>
-          <w:p>
-            <w:pPr>
-              <w:spacing w:after="0" w:line="240" w:lineRule="auto"/>
-              <w:jc w:val="center"/>
-              <w:rPr>
-                <w:rFonts w:ascii="Calibri" w:eastAsia="Calibri" w:hAnsi="Calibri" w:cs="Calibri"/>
-              </w:rPr>
-            </w:pPr>
-            <w:r>
-              <w:rPr>
-                <w:rFonts w:ascii="Calibri" w:eastAsia="Calibri" w:hAnsi="Calibri" w:cs="Calibri"/>
-              </w:rPr>
-              <w:t>SUDA</w:t>
-            </w:r>
-          </w:p>
-        </w:tc>
-        <w:tc>
-          <w:tcPr>
-            <w:tcW w:w="1745" w:type="dxa"/>
-            <w:tcBorders>
-              <w:top w:val="single" w:sz="4" w:space="0" w:color="000000"/>
-              <w:left w:val="single" w:sz="4" w:space="0" w:color="000000"/>
-              <w:bottom w:val="single" w:sz="4" w:space="0" w:color="000000"/>
-              <w:right w:val="single" w:sz="4" w:space="0" w:color="000000"/>
-            </w:tcBorders>
-            <w:shd w:val="clear" w:color="000000" w:fill="FFFFFF"/>
-            <w:tcMar>
-              <w:left w:w="108" w:type="dxa"/>
-              <w:right w:w="108" w:type="dxa"/>
-            </w:tcMar>
-          </w:tcPr>
-          <w:p>
-            <w:pPr>
-              <w:spacing w:after="0" w:line="240" w:lineRule="auto"/>
-              <w:jc w:val="center"/>
-              <w:rPr>
-                <w:rFonts w:ascii="Calibri" w:eastAsia="Calibri" w:hAnsi="Calibri" w:cs="Calibri"/>
-              </w:rPr>
-            </w:pPr>
-          </w:p>
-        </w:tc>
-        <w:tc>
-          <w:tcPr>
-            <w:tcW w:w="908" w:type="dxa"/>
-            <w:tcBorders>
-              <w:top w:val="single" w:sz="4" w:space="0" w:color="000000"/>
-              <w:left w:val="single" w:sz="4" w:space="0" w:color="000000"/>
-              <w:bottom w:val="single" w:sz="4" w:space="0" w:color="000000"/>
-              <w:right w:val="single" w:sz="4" w:space="0" w:color="000000"/>
-            </w:tcBorders>
-            <w:shd w:val="clear" w:color="000000" w:fill="FFFFFF"/>
-            <w:tcMar>
-              <w:left w:w="108" w:type="dxa"/>
-              <w:right w:w="108" w:type="dxa"/>
-            </w:tcMar>
-          </w:tcPr>
-          <w:p>
-            <w:pPr>
-              <w:spacing w:after="0" w:line="240" w:lineRule="auto"/>
-              <w:jc w:val="center"/>
-              <w:rPr>
-                <w:rFonts w:ascii="Calibri" w:eastAsia="Calibri" w:hAnsi="Calibri" w:cs="Calibri"/>
-              </w:rPr>
-            </w:pPr>
-            <w:r>
-              <w:rPr>
-                <w:rFonts w:ascii="Calibri" w:eastAsia="Calibri" w:hAnsi="Calibri" w:cs="Calibri"/>
-              </w:rPr>
-              <w:t>GVT</w:t>
-            </w:r>
-          </w:p>
-        </w:tc>
-        <w:tc>
-          <w:tcPr>
-            <w:tcW w:w="1363" w:type="dxa"/>
-            <w:tcBorders>
-              <w:top w:val="single" w:sz="4" w:space="0" w:color="000000"/>
-              <w:left w:val="single" w:sz="4" w:space="0" w:color="000000"/>
-              <w:bottom w:val="single" w:sz="4" w:space="0" w:color="000000"/>
-              <w:right w:val="single" w:sz="4" w:space="0" w:color="000000"/>
-            </w:tcBorders>
-            <w:shd w:val="clear" w:color="000000" w:fill="FFFFFF"/>
-            <w:tcMar>
-              <w:left w:w="108" w:type="dxa"/>
-              <w:right w:w="108" w:type="dxa"/>
-            </w:tcMar>
-          </w:tcPr>
-          <w:p>
-            <w:pPr>
-              <w:spacing w:after="0" w:line="240" w:lineRule="auto"/>
-              <w:jc w:val="center"/>
-              <w:rPr>
-                <w:rFonts w:ascii="Calibri" w:eastAsia="Calibri" w:hAnsi="Calibri" w:cs="Calibri"/>
-              </w:rPr>
-            </w:pPr>
-          </w:p>
-        </w:tc>
-      </w:tr>
-      <w:tr>
-        <w:tc>
-          <w:tcPr>
-            <w:tcW w:w="11139" w:type="dxa"/>
+            <w:tcW w:w="8918" w:type="dxa"/>
             <w:gridSpan w:val="7"/>
             <w:tcBorders>
               <w:top w:val="single" w:sz="4" w:space="0" w:color="000000"/>
@@ -3879,7 +3419,7 @@
       <w:tr>
         <w:tc>
           <w:tcPr>
-            <w:tcW w:w="774" w:type="dxa"/>
+            <w:tcW w:w="620" w:type="dxa"/>
             <w:tcBorders>
               <w:top w:val="single" w:sz="4" w:space="0" w:color="000000"/>
               <w:left w:val="single" w:sz="4" w:space="0" w:color="000000"/>
@@ -3911,7 +3451,7 @@
         </w:tc>
         <w:tc>
           <w:tcPr>
-            <w:tcW w:w="1555" w:type="dxa"/>
+            <w:tcW w:w="1414" w:type="dxa"/>
             <w:tcBorders>
               <w:top w:val="single" w:sz="4" w:space="0" w:color="000000"/>
               <w:left w:val="single" w:sz="4" w:space="0" w:color="000000"/>
@@ -3943,7 +3483,7 @@
         </w:tc>
         <w:tc>
           <w:tcPr>
-            <w:tcW w:w="1801" w:type="dxa"/>
+            <w:tcW w:w="1339" w:type="dxa"/>
             <w:tcBorders>
               <w:top w:val="single" w:sz="4" w:space="0" w:color="000000"/>
               <w:left w:val="single" w:sz="4" w:space="0" w:color="000000"/>
@@ -3975,7 +3515,7 @@
         </w:tc>
         <w:tc>
           <w:tcPr>
-            <w:tcW w:w="2993" w:type="dxa"/>
+            <w:tcW w:w="1810" w:type="dxa"/>
             <w:tcBorders>
               <w:top w:val="single" w:sz="4" w:space="0" w:color="000000"/>
               <w:left w:val="single" w:sz="4" w:space="0" w:color="000000"/>
@@ -4008,57 +3548,57 @@
         </w:tc>
         <w:tc>
           <w:tcPr>
-            <w:tcW w:w="1745" w:type="dxa"/>
-            <w:tcBorders>
-              <w:top w:val="single" w:sz="4" w:space="0" w:color="000000"/>
-              <w:left w:val="single" w:sz="4" w:space="0" w:color="000000"/>
-              <w:bottom w:val="single" w:sz="4" w:space="0" w:color="000000"/>
-              <w:right w:val="single" w:sz="4" w:space="0" w:color="000000"/>
-            </w:tcBorders>
-            <w:shd w:val="clear" w:color="000000" w:fill="FFFFFF"/>
-            <w:tcMar>
-              <w:left w:w="108" w:type="dxa"/>
-              <w:right w:w="108" w:type="dxa"/>
-            </w:tcMar>
-          </w:tcPr>
-          <w:p>
-            <w:pPr>
-              <w:spacing w:after="0" w:line="240" w:lineRule="auto"/>
-              <w:jc w:val="center"/>
-              <w:rPr>
-                <w:rFonts w:ascii="Calibri" w:eastAsia="Calibri" w:hAnsi="Calibri" w:cs="Calibri"/>
-              </w:rPr>
-            </w:pPr>
-          </w:p>
-        </w:tc>
-        <w:tc>
-          <w:tcPr>
-            <w:tcW w:w="908" w:type="dxa"/>
-            <w:tcBorders>
-              <w:top w:val="single" w:sz="4" w:space="0" w:color="000000"/>
-              <w:left w:val="single" w:sz="4" w:space="0" w:color="000000"/>
-              <w:bottom w:val="single" w:sz="4" w:space="0" w:color="000000"/>
-              <w:right w:val="single" w:sz="4" w:space="0" w:color="000000"/>
-            </w:tcBorders>
-            <w:shd w:val="clear" w:color="000000" w:fill="FFFFFF"/>
-            <w:tcMar>
-              <w:left w:w="108" w:type="dxa"/>
-              <w:right w:w="108" w:type="dxa"/>
-            </w:tcMar>
-          </w:tcPr>
-          <w:p>
-            <w:pPr>
-              <w:spacing w:after="0" w:line="240" w:lineRule="auto"/>
-              <w:jc w:val="center"/>
-              <w:rPr>
-                <w:rFonts w:ascii="Calibri" w:eastAsia="Calibri" w:hAnsi="Calibri" w:cs="Calibri"/>
-              </w:rPr>
-            </w:pPr>
-          </w:p>
-        </w:tc>
-        <w:tc>
-          <w:tcPr>
-            <w:tcW w:w="1363" w:type="dxa"/>
+            <w:tcW w:w="1387" w:type="dxa"/>
+            <w:tcBorders>
+              <w:top w:val="single" w:sz="4" w:space="0" w:color="000000"/>
+              <w:left w:val="single" w:sz="4" w:space="0" w:color="000000"/>
+              <w:bottom w:val="single" w:sz="4" w:space="0" w:color="000000"/>
+              <w:right w:val="single" w:sz="4" w:space="0" w:color="000000"/>
+            </w:tcBorders>
+            <w:shd w:val="clear" w:color="000000" w:fill="FFFFFF"/>
+            <w:tcMar>
+              <w:left w:w="108" w:type="dxa"/>
+              <w:right w:w="108" w:type="dxa"/>
+            </w:tcMar>
+          </w:tcPr>
+          <w:p>
+            <w:pPr>
+              <w:spacing w:after="0" w:line="240" w:lineRule="auto"/>
+              <w:jc w:val="center"/>
+              <w:rPr>
+                <w:rFonts w:ascii="Calibri" w:eastAsia="Calibri" w:hAnsi="Calibri" w:cs="Calibri"/>
+              </w:rPr>
+            </w:pPr>
+          </w:p>
+        </w:tc>
+        <w:tc>
+          <w:tcPr>
+            <w:tcW w:w="1180" w:type="dxa"/>
+            <w:tcBorders>
+              <w:top w:val="single" w:sz="4" w:space="0" w:color="000000"/>
+              <w:left w:val="single" w:sz="4" w:space="0" w:color="000000"/>
+              <w:bottom w:val="single" w:sz="4" w:space="0" w:color="000000"/>
+              <w:right w:val="single" w:sz="4" w:space="0" w:color="000000"/>
+            </w:tcBorders>
+            <w:shd w:val="clear" w:color="000000" w:fill="FFFFFF"/>
+            <w:tcMar>
+              <w:left w:w="108" w:type="dxa"/>
+              <w:right w:w="108" w:type="dxa"/>
+            </w:tcMar>
+          </w:tcPr>
+          <w:p>
+            <w:pPr>
+              <w:spacing w:after="0" w:line="240" w:lineRule="auto"/>
+              <w:jc w:val="center"/>
+              <w:rPr>
+                <w:rFonts w:ascii="Calibri" w:eastAsia="Calibri" w:hAnsi="Calibri" w:cs="Calibri"/>
+              </w:rPr>
+            </w:pPr>
+          </w:p>
+        </w:tc>
+        <w:tc>
+          <w:tcPr>
+            <w:tcW w:w="1168" w:type="dxa"/>
             <w:tcBorders>
               <w:top w:val="single" w:sz="4" w:space="0" w:color="000000"/>
               <w:left w:val="single" w:sz="4" w:space="0" w:color="000000"/>
@@ -4085,7 +3625,7 @@
       <w:tr>
         <w:tc>
           <w:tcPr>
-            <w:tcW w:w="774" w:type="dxa"/>
+            <w:tcW w:w="620" w:type="dxa"/>
             <w:tcBorders>
               <w:top w:val="single" w:sz="4" w:space="0" w:color="000000"/>
               <w:left w:val="single" w:sz="4" w:space="0" w:color="000000"/>
@@ -4117,7 +3657,7 @@
         </w:tc>
         <w:tc>
           <w:tcPr>
-            <w:tcW w:w="1555" w:type="dxa"/>
+            <w:tcW w:w="1414" w:type="dxa"/>
             <w:tcBorders>
               <w:top w:val="single" w:sz="4" w:space="0" w:color="000000"/>
               <w:left w:val="single" w:sz="4" w:space="0" w:color="000000"/>
@@ -4149,7 +3689,7 @@
         </w:tc>
         <w:tc>
           <w:tcPr>
-            <w:tcW w:w="1801" w:type="dxa"/>
+            <w:tcW w:w="1339" w:type="dxa"/>
             <w:tcBorders>
               <w:top w:val="single" w:sz="4" w:space="0" w:color="000000"/>
               <w:left w:val="single" w:sz="4" w:space="0" w:color="000000"/>
@@ -4181,94 +3721,88 @@
         </w:tc>
         <w:tc>
           <w:tcPr>
-            <w:tcW w:w="2993" w:type="dxa"/>
-            <w:tcBorders>
-              <w:top w:val="single" w:sz="4" w:space="0" w:color="000000"/>
-              <w:left w:val="single" w:sz="4" w:space="0" w:color="000000"/>
-              <w:bottom w:val="single" w:sz="4" w:space="0" w:color="000000"/>
-              <w:right w:val="single" w:sz="4" w:space="0" w:color="000000"/>
-            </w:tcBorders>
-            <w:shd w:val="clear" w:color="000000" w:fill="FFFFFF"/>
-            <w:tcMar>
-              <w:left w:w="108" w:type="dxa"/>
-              <w:right w:w="108" w:type="dxa"/>
-            </w:tcMar>
-          </w:tcPr>
-          <w:p>
-            <w:pPr>
-              <w:spacing w:after="0" w:line="240" w:lineRule="auto"/>
-              <w:jc w:val="center"/>
-              <w:rPr>
-                <w:rFonts w:ascii="Calibri" w:eastAsia="Calibri" w:hAnsi="Calibri" w:cs="Calibri"/>
-              </w:rPr>
-            </w:pPr>
-            <w:r>
-              <w:rPr>
-                <w:rFonts w:ascii="Calibri" w:eastAsia="Calibri" w:hAnsi="Calibri" w:cs="Calibri"/>
-              </w:rPr>
-              <w:t>AS1</w:t>
-            </w:r>
-          </w:p>
-        </w:tc>
-        <w:tc>
-          <w:tcPr>
-            <w:tcW w:w="1745" w:type="dxa"/>
-            <w:tcBorders>
-              <w:top w:val="single" w:sz="4" w:space="0" w:color="000000"/>
-              <w:left w:val="single" w:sz="4" w:space="0" w:color="000000"/>
-              <w:bottom w:val="single" w:sz="4" w:space="0" w:color="000000"/>
-              <w:right w:val="single" w:sz="4" w:space="0" w:color="000000"/>
-            </w:tcBorders>
-            <w:shd w:val="clear" w:color="000000" w:fill="FFFFFF"/>
-            <w:tcMar>
-              <w:left w:w="108" w:type="dxa"/>
-              <w:right w:w="108" w:type="dxa"/>
-            </w:tcMar>
-          </w:tcPr>
-          <w:p>
-            <w:pPr>
-              <w:spacing w:after="0" w:line="240" w:lineRule="auto"/>
-              <w:jc w:val="center"/>
-              <w:rPr>
-                <w:rFonts w:ascii="Calibri" w:eastAsia="Calibri" w:hAnsi="Calibri" w:cs="Calibri"/>
-              </w:rPr>
-            </w:pPr>
-          </w:p>
-        </w:tc>
-        <w:tc>
-          <w:tcPr>
-            <w:tcW w:w="908" w:type="dxa"/>
-            <w:tcBorders>
-              <w:top w:val="single" w:sz="4" w:space="0" w:color="000000"/>
-              <w:left w:val="single" w:sz="4" w:space="0" w:color="000000"/>
-              <w:bottom w:val="single" w:sz="4" w:space="0" w:color="000000"/>
-              <w:right w:val="single" w:sz="4" w:space="0" w:color="000000"/>
-            </w:tcBorders>
-            <w:shd w:val="clear" w:color="000000" w:fill="FFFFFF"/>
-            <w:tcMar>
-              <w:left w:w="108" w:type="dxa"/>
-              <w:right w:w="108" w:type="dxa"/>
-            </w:tcMar>
-          </w:tcPr>
-          <w:p>
-            <w:pPr>
-              <w:spacing w:after="0" w:line="240" w:lineRule="auto"/>
-              <w:jc w:val="center"/>
-              <w:rPr>
-                <w:rFonts w:ascii="Calibri" w:eastAsia="Calibri" w:hAnsi="Calibri" w:cs="Calibri"/>
-              </w:rPr>
-            </w:pPr>
-            <w:r>
-              <w:rPr>
-                <w:rFonts w:ascii="Calibri" w:eastAsia="Calibri" w:hAnsi="Calibri" w:cs="Calibri"/>
-              </w:rPr>
-              <w:t>HLV</w:t>
-            </w:r>
-          </w:p>
-        </w:tc>
-        <w:tc>
-          <w:tcPr>
-            <w:tcW w:w="1363" w:type="dxa"/>
+            <w:tcW w:w="1810" w:type="dxa"/>
+            <w:tcBorders>
+              <w:top w:val="single" w:sz="4" w:space="0" w:color="000000"/>
+              <w:left w:val="single" w:sz="4" w:space="0" w:color="000000"/>
+              <w:bottom w:val="single" w:sz="4" w:space="0" w:color="000000"/>
+              <w:right w:val="single" w:sz="4" w:space="0" w:color="000000"/>
+            </w:tcBorders>
+            <w:shd w:val="clear" w:color="000000" w:fill="FFFFFF"/>
+            <w:tcMar>
+              <w:left w:w="108" w:type="dxa"/>
+              <w:right w:w="108" w:type="dxa"/>
+            </w:tcMar>
+          </w:tcPr>
+          <w:p>
+            <w:pPr>
+              <w:spacing w:after="0" w:line="240" w:lineRule="auto"/>
+              <w:jc w:val="center"/>
+              <w:rPr>
+                <w:rFonts w:ascii="Calibri" w:eastAsia="Calibri" w:hAnsi="Calibri" w:cs="Calibri"/>
+              </w:rPr>
+            </w:pPr>
+            <w:r>
+              <w:rPr>
+                <w:rFonts w:ascii="Calibri" w:eastAsia="Calibri" w:hAnsi="Calibri" w:cs="Calibri"/>
+              </w:rPr>
+              <w:t>SGAV</w:t>
+            </w:r>
+          </w:p>
+        </w:tc>
+        <w:tc>
+          <w:tcPr>
+            <w:tcW w:w="1387" w:type="dxa"/>
+            <w:tcBorders>
+              <w:top w:val="single" w:sz="4" w:space="0" w:color="000000"/>
+              <w:left w:val="single" w:sz="4" w:space="0" w:color="000000"/>
+              <w:bottom w:val="single" w:sz="4" w:space="0" w:color="000000"/>
+              <w:right w:val="single" w:sz="4" w:space="0" w:color="000000"/>
+            </w:tcBorders>
+            <w:shd w:val="clear" w:color="000000" w:fill="FFFFFF"/>
+            <w:tcMar>
+              <w:left w:w="108" w:type="dxa"/>
+              <w:right w:w="108" w:type="dxa"/>
+            </w:tcMar>
+          </w:tcPr>
+          <w:p>
+            <w:pPr>
+              <w:spacing w:after="0" w:line="240" w:lineRule="auto"/>
+              <w:jc w:val="center"/>
+              <w:rPr>
+                <w:rFonts w:ascii="Calibri" w:eastAsia="Calibri" w:hAnsi="Calibri" w:cs="Calibri"/>
+              </w:rPr>
+            </w:pPr>
+          </w:p>
+        </w:tc>
+        <w:tc>
+          <w:tcPr>
+            <w:tcW w:w="1180" w:type="dxa"/>
+            <w:tcBorders>
+              <w:top w:val="single" w:sz="4" w:space="0" w:color="000000"/>
+              <w:left w:val="single" w:sz="4" w:space="0" w:color="000000"/>
+              <w:bottom w:val="single" w:sz="4" w:space="0" w:color="000000"/>
+              <w:right w:val="single" w:sz="4" w:space="0" w:color="000000"/>
+            </w:tcBorders>
+            <w:shd w:val="clear" w:color="000000" w:fill="FFFFFF"/>
+            <w:tcMar>
+              <w:left w:w="108" w:type="dxa"/>
+              <w:right w:w="108" w:type="dxa"/>
+            </w:tcMar>
+          </w:tcPr>
+          <w:p>
+            <w:pPr>
+              <w:spacing w:after="0" w:line="240" w:lineRule="auto"/>
+              <w:jc w:val="center"/>
+              <w:rPr>
+                <w:rFonts w:ascii="Calibri" w:eastAsia="Calibri" w:hAnsi="Calibri" w:cs="Calibri"/>
+              </w:rPr>
+            </w:pPr>
+          </w:p>
+        </w:tc>
+        <w:tc>
+          <w:tcPr>
+            <w:tcW w:w="1168" w:type="dxa"/>
             <w:tcBorders>
               <w:top w:val="single" w:sz="4" w:space="0" w:color="000000"/>
               <w:left w:val="single" w:sz="4" w:space="0" w:color="000000"/>
@@ -4295,7 +3829,7 @@
       <w:tr>
         <w:tc>
           <w:tcPr>
-            <w:tcW w:w="774" w:type="dxa"/>
+            <w:tcW w:w="620" w:type="dxa"/>
             <w:tcBorders>
               <w:top w:val="single" w:sz="4" w:space="0" w:color="000000"/>
               <w:left w:val="single" w:sz="4" w:space="0" w:color="000000"/>
@@ -4327,7 +3861,7 @@
         </w:tc>
         <w:tc>
           <w:tcPr>
-            <w:tcW w:w="1555" w:type="dxa"/>
+            <w:tcW w:w="1414" w:type="dxa"/>
             <w:tcBorders>
               <w:top w:val="single" w:sz="4" w:space="0" w:color="000000"/>
               <w:left w:val="single" w:sz="4" w:space="0" w:color="000000"/>
@@ -4359,7 +3893,7 @@
         </w:tc>
         <w:tc>
           <w:tcPr>
-            <w:tcW w:w="1801" w:type="dxa"/>
+            <w:tcW w:w="1339" w:type="dxa"/>
             <w:tcBorders>
               <w:top w:val="single" w:sz="4" w:space="0" w:color="000000"/>
               <w:left w:val="single" w:sz="4" w:space="0" w:color="000000"/>
@@ -4391,7 +3925,7 @@
         </w:tc>
         <w:tc>
           <w:tcPr>
-            <w:tcW w:w="2993" w:type="dxa"/>
+            <w:tcW w:w="1810" w:type="dxa"/>
             <w:tcBorders>
               <w:top w:val="single" w:sz="4" w:space="0" w:color="000000"/>
               <w:left w:val="single" w:sz="4" w:space="0" w:color="000000"/>
@@ -4424,57 +3958,57 @@
         </w:tc>
         <w:tc>
           <w:tcPr>
-            <w:tcW w:w="1745" w:type="dxa"/>
-            <w:tcBorders>
-              <w:top w:val="single" w:sz="4" w:space="0" w:color="000000"/>
-              <w:left w:val="single" w:sz="4" w:space="0" w:color="000000"/>
-              <w:bottom w:val="single" w:sz="4" w:space="0" w:color="000000"/>
-              <w:right w:val="single" w:sz="4" w:space="0" w:color="000000"/>
-            </w:tcBorders>
-            <w:shd w:val="clear" w:color="000000" w:fill="FFFFFF"/>
-            <w:tcMar>
-              <w:left w:w="108" w:type="dxa"/>
-              <w:right w:w="108" w:type="dxa"/>
-            </w:tcMar>
-          </w:tcPr>
-          <w:p>
-            <w:pPr>
-              <w:spacing w:after="0" w:line="240" w:lineRule="auto"/>
-              <w:jc w:val="center"/>
-              <w:rPr>
-                <w:rFonts w:ascii="Calibri" w:eastAsia="Calibri" w:hAnsi="Calibri" w:cs="Calibri"/>
-              </w:rPr>
-            </w:pPr>
-          </w:p>
-        </w:tc>
-        <w:tc>
-          <w:tcPr>
-            <w:tcW w:w="908" w:type="dxa"/>
-            <w:tcBorders>
-              <w:top w:val="single" w:sz="4" w:space="0" w:color="000000"/>
-              <w:left w:val="single" w:sz="4" w:space="0" w:color="000000"/>
-              <w:bottom w:val="single" w:sz="4" w:space="0" w:color="000000"/>
-              <w:right w:val="single" w:sz="4" w:space="0" w:color="000000"/>
-            </w:tcBorders>
-            <w:shd w:val="clear" w:color="000000" w:fill="FFFFFF"/>
-            <w:tcMar>
-              <w:left w:w="108" w:type="dxa"/>
-              <w:right w:w="108" w:type="dxa"/>
-            </w:tcMar>
-          </w:tcPr>
-          <w:p>
-            <w:pPr>
-              <w:spacing w:after="0" w:line="240" w:lineRule="auto"/>
-              <w:jc w:val="center"/>
-              <w:rPr>
-                <w:rFonts w:ascii="Calibri" w:eastAsia="Calibri" w:hAnsi="Calibri" w:cs="Calibri"/>
-              </w:rPr>
-            </w:pPr>
-          </w:p>
-        </w:tc>
-        <w:tc>
-          <w:tcPr>
-            <w:tcW w:w="1363" w:type="dxa"/>
+            <w:tcW w:w="1387" w:type="dxa"/>
+            <w:tcBorders>
+              <w:top w:val="single" w:sz="4" w:space="0" w:color="000000"/>
+              <w:left w:val="single" w:sz="4" w:space="0" w:color="000000"/>
+              <w:bottom w:val="single" w:sz="4" w:space="0" w:color="000000"/>
+              <w:right w:val="single" w:sz="4" w:space="0" w:color="000000"/>
+            </w:tcBorders>
+            <w:shd w:val="clear" w:color="000000" w:fill="FFFFFF"/>
+            <w:tcMar>
+              <w:left w:w="108" w:type="dxa"/>
+              <w:right w:w="108" w:type="dxa"/>
+            </w:tcMar>
+          </w:tcPr>
+          <w:p>
+            <w:pPr>
+              <w:spacing w:after="0" w:line="240" w:lineRule="auto"/>
+              <w:jc w:val="center"/>
+              <w:rPr>
+                <w:rFonts w:ascii="Calibri" w:eastAsia="Calibri" w:hAnsi="Calibri" w:cs="Calibri"/>
+              </w:rPr>
+            </w:pPr>
+          </w:p>
+        </w:tc>
+        <w:tc>
+          <w:tcPr>
+            <w:tcW w:w="1180" w:type="dxa"/>
+            <w:tcBorders>
+              <w:top w:val="single" w:sz="4" w:space="0" w:color="000000"/>
+              <w:left w:val="single" w:sz="4" w:space="0" w:color="000000"/>
+              <w:bottom w:val="single" w:sz="4" w:space="0" w:color="000000"/>
+              <w:right w:val="single" w:sz="4" w:space="0" w:color="000000"/>
+            </w:tcBorders>
+            <w:shd w:val="clear" w:color="000000" w:fill="FFFFFF"/>
+            <w:tcMar>
+              <w:left w:w="108" w:type="dxa"/>
+              <w:right w:w="108" w:type="dxa"/>
+            </w:tcMar>
+          </w:tcPr>
+          <w:p>
+            <w:pPr>
+              <w:spacing w:after="0" w:line="240" w:lineRule="auto"/>
+              <w:jc w:val="center"/>
+              <w:rPr>
+                <w:rFonts w:ascii="Calibri" w:eastAsia="Calibri" w:hAnsi="Calibri" w:cs="Calibri"/>
+              </w:rPr>
+            </w:pPr>
+          </w:p>
+        </w:tc>
+        <w:tc>
+          <w:tcPr>
+            <w:tcW w:w="1168" w:type="dxa"/>
             <w:tcBorders>
               <w:top w:val="single" w:sz="4" w:space="0" w:color="000000"/>
               <w:left w:val="single" w:sz="4" w:space="0" w:color="000000"/>
@@ -4501,7 +4035,7 @@
       <w:tr>
         <w:tc>
           <w:tcPr>
-            <w:tcW w:w="774" w:type="dxa"/>
+            <w:tcW w:w="620" w:type="dxa"/>
             <w:tcBorders>
               <w:top w:val="single" w:sz="4" w:space="0" w:color="000000"/>
               <w:left w:val="single" w:sz="4" w:space="0" w:color="000000"/>
@@ -4533,7 +4067,7 @@
         </w:tc>
         <w:tc>
           <w:tcPr>
-            <w:tcW w:w="1555" w:type="dxa"/>
+            <w:tcW w:w="1414" w:type="dxa"/>
             <w:tcBorders>
               <w:top w:val="single" w:sz="4" w:space="0" w:color="000000"/>
               <w:left w:val="single" w:sz="4" w:space="0" w:color="000000"/>
@@ -4565,7 +4099,7 @@
         </w:tc>
         <w:tc>
           <w:tcPr>
-            <w:tcW w:w="1801" w:type="dxa"/>
+            <w:tcW w:w="1339" w:type="dxa"/>
             <w:tcBorders>
               <w:top w:val="single" w:sz="4" w:space="0" w:color="000000"/>
               <w:left w:val="single" w:sz="4" w:space="0" w:color="000000"/>
@@ -4597,94 +4131,88 @@
         </w:tc>
         <w:tc>
           <w:tcPr>
-            <w:tcW w:w="2993" w:type="dxa"/>
-            <w:tcBorders>
-              <w:top w:val="single" w:sz="4" w:space="0" w:color="000000"/>
-              <w:left w:val="single" w:sz="4" w:space="0" w:color="000000"/>
-              <w:bottom w:val="single" w:sz="4" w:space="0" w:color="000000"/>
-              <w:right w:val="single" w:sz="4" w:space="0" w:color="000000"/>
-            </w:tcBorders>
-            <w:shd w:val="clear" w:color="000000" w:fill="FFFFFF"/>
-            <w:tcMar>
-              <w:left w:w="108" w:type="dxa"/>
-              <w:right w:w="108" w:type="dxa"/>
-            </w:tcMar>
-          </w:tcPr>
-          <w:p>
-            <w:pPr>
-              <w:spacing w:after="0" w:line="240" w:lineRule="auto"/>
-              <w:jc w:val="center"/>
-              <w:rPr>
-                <w:rFonts w:ascii="Calibri" w:eastAsia="Calibri" w:hAnsi="Calibri" w:cs="Calibri"/>
-              </w:rPr>
-            </w:pPr>
-            <w:r>
-              <w:rPr>
-                <w:rFonts w:ascii="Calibri" w:eastAsia="Calibri" w:hAnsi="Calibri" w:cs="Calibri"/>
-              </w:rPr>
-              <w:t>JSUP</w:t>
-            </w:r>
-          </w:p>
-        </w:tc>
-        <w:tc>
-          <w:tcPr>
-            <w:tcW w:w="1745" w:type="dxa"/>
-            <w:tcBorders>
-              <w:top w:val="single" w:sz="4" w:space="0" w:color="000000"/>
-              <w:left w:val="single" w:sz="4" w:space="0" w:color="000000"/>
-              <w:bottom w:val="single" w:sz="4" w:space="0" w:color="000000"/>
-              <w:right w:val="single" w:sz="4" w:space="0" w:color="000000"/>
-            </w:tcBorders>
-            <w:shd w:val="clear" w:color="000000" w:fill="FFFFFF"/>
-            <w:tcMar>
-              <w:left w:w="108" w:type="dxa"/>
-              <w:right w:w="108" w:type="dxa"/>
-            </w:tcMar>
-          </w:tcPr>
-          <w:p>
-            <w:pPr>
-              <w:spacing w:after="0" w:line="240" w:lineRule="auto"/>
-              <w:jc w:val="center"/>
-              <w:rPr>
-                <w:rFonts w:ascii="Calibri" w:eastAsia="Calibri" w:hAnsi="Calibri" w:cs="Calibri"/>
-              </w:rPr>
-            </w:pPr>
-          </w:p>
-        </w:tc>
-        <w:tc>
-          <w:tcPr>
-            <w:tcW w:w="908" w:type="dxa"/>
-            <w:tcBorders>
-              <w:top w:val="single" w:sz="4" w:space="0" w:color="000000"/>
-              <w:left w:val="single" w:sz="4" w:space="0" w:color="000000"/>
-              <w:bottom w:val="single" w:sz="4" w:space="0" w:color="000000"/>
-              <w:right w:val="single" w:sz="4" w:space="0" w:color="000000"/>
-            </w:tcBorders>
-            <w:shd w:val="clear" w:color="000000" w:fill="FFFFFF"/>
-            <w:tcMar>
-              <w:left w:w="108" w:type="dxa"/>
-              <w:right w:w="108" w:type="dxa"/>
-            </w:tcMar>
-          </w:tcPr>
-          <w:p>
-            <w:pPr>
-              <w:spacing w:after="0" w:line="240" w:lineRule="auto"/>
-              <w:jc w:val="center"/>
-              <w:rPr>
-                <w:rFonts w:ascii="Calibri" w:eastAsia="Calibri" w:hAnsi="Calibri" w:cs="Calibri"/>
-              </w:rPr>
-            </w:pPr>
-            <w:r>
-              <w:rPr>
-                <w:rFonts w:ascii="Calibri" w:eastAsia="Calibri" w:hAnsi="Calibri" w:cs="Calibri"/>
-              </w:rPr>
-              <w:t>HLV</w:t>
-            </w:r>
-          </w:p>
-        </w:tc>
-        <w:tc>
-          <w:tcPr>
-            <w:tcW w:w="1363" w:type="dxa"/>
+            <w:tcW w:w="1810" w:type="dxa"/>
+            <w:tcBorders>
+              <w:top w:val="single" w:sz="4" w:space="0" w:color="000000"/>
+              <w:left w:val="single" w:sz="4" w:space="0" w:color="000000"/>
+              <w:bottom w:val="single" w:sz="4" w:space="0" w:color="000000"/>
+              <w:right w:val="single" w:sz="4" w:space="0" w:color="000000"/>
+            </w:tcBorders>
+            <w:shd w:val="clear" w:color="000000" w:fill="FFFFFF"/>
+            <w:tcMar>
+              <w:left w:w="108" w:type="dxa"/>
+              <w:right w:w="108" w:type="dxa"/>
+            </w:tcMar>
+          </w:tcPr>
+          <w:p>
+            <w:pPr>
+              <w:spacing w:after="0" w:line="240" w:lineRule="auto"/>
+              <w:jc w:val="center"/>
+              <w:rPr>
+                <w:rFonts w:ascii="Calibri" w:eastAsia="Calibri" w:hAnsi="Calibri" w:cs="Calibri"/>
+              </w:rPr>
+            </w:pPr>
+            <w:r>
+              <w:rPr>
+                <w:rFonts w:ascii="Calibri" w:eastAsia="Calibri" w:hAnsi="Calibri" w:cs="Calibri"/>
+              </w:rPr>
+              <w:t>CHTR</w:t>
+            </w:r>
+          </w:p>
+        </w:tc>
+        <w:tc>
+          <w:tcPr>
+            <w:tcW w:w="1387" w:type="dxa"/>
+            <w:tcBorders>
+              <w:top w:val="single" w:sz="4" w:space="0" w:color="000000"/>
+              <w:left w:val="single" w:sz="4" w:space="0" w:color="000000"/>
+              <w:bottom w:val="single" w:sz="4" w:space="0" w:color="000000"/>
+              <w:right w:val="single" w:sz="4" w:space="0" w:color="000000"/>
+            </w:tcBorders>
+            <w:shd w:val="clear" w:color="000000" w:fill="FFFFFF"/>
+            <w:tcMar>
+              <w:left w:w="108" w:type="dxa"/>
+              <w:right w:w="108" w:type="dxa"/>
+            </w:tcMar>
+          </w:tcPr>
+          <w:p>
+            <w:pPr>
+              <w:spacing w:after="0" w:line="240" w:lineRule="auto"/>
+              <w:jc w:val="center"/>
+              <w:rPr>
+                <w:rFonts w:ascii="Calibri" w:eastAsia="Calibri" w:hAnsi="Calibri" w:cs="Calibri"/>
+              </w:rPr>
+            </w:pPr>
+          </w:p>
+        </w:tc>
+        <w:tc>
+          <w:tcPr>
+            <w:tcW w:w="1180" w:type="dxa"/>
+            <w:tcBorders>
+              <w:top w:val="single" w:sz="4" w:space="0" w:color="000000"/>
+              <w:left w:val="single" w:sz="4" w:space="0" w:color="000000"/>
+              <w:bottom w:val="single" w:sz="4" w:space="0" w:color="000000"/>
+              <w:right w:val="single" w:sz="4" w:space="0" w:color="000000"/>
+            </w:tcBorders>
+            <w:shd w:val="clear" w:color="000000" w:fill="FFFFFF"/>
+            <w:tcMar>
+              <w:left w:w="108" w:type="dxa"/>
+              <w:right w:w="108" w:type="dxa"/>
+            </w:tcMar>
+          </w:tcPr>
+          <w:p>
+            <w:pPr>
+              <w:spacing w:after="0" w:line="240" w:lineRule="auto"/>
+              <w:jc w:val="center"/>
+              <w:rPr>
+                <w:rFonts w:ascii="Calibri" w:eastAsia="Calibri" w:hAnsi="Calibri" w:cs="Calibri"/>
+              </w:rPr>
+            </w:pPr>
+          </w:p>
+        </w:tc>
+        <w:tc>
+          <w:tcPr>
+            <w:tcW w:w="1168" w:type="dxa"/>
             <w:tcBorders>
               <w:top w:val="single" w:sz="4" w:space="0" w:color="000000"/>
               <w:left w:val="single" w:sz="4" w:space="0" w:color="000000"/>
@@ -4711,7 +4239,7 @@
       <w:tr>
         <w:tc>
           <w:tcPr>
-            <w:tcW w:w="774" w:type="dxa"/>
+            <w:tcW w:w="620" w:type="dxa"/>
             <w:tcBorders>
               <w:top w:val="single" w:sz="4" w:space="0" w:color="000000"/>
               <w:left w:val="single" w:sz="4" w:space="0" w:color="000000"/>
@@ -4743,7 +4271,7 @@
         </w:tc>
         <w:tc>
           <w:tcPr>
-            <w:tcW w:w="1555" w:type="dxa"/>
+            <w:tcW w:w="1414" w:type="dxa"/>
             <w:tcBorders>
               <w:top w:val="single" w:sz="4" w:space="0" w:color="000000"/>
               <w:left w:val="single" w:sz="4" w:space="0" w:color="000000"/>
@@ -4775,7 +4303,7 @@
         </w:tc>
         <w:tc>
           <w:tcPr>
-            <w:tcW w:w="1801" w:type="dxa"/>
+            <w:tcW w:w="1339" w:type="dxa"/>
             <w:tcBorders>
               <w:top w:val="single" w:sz="4" w:space="0" w:color="000000"/>
               <w:left w:val="single" w:sz="4" w:space="0" w:color="000000"/>
@@ -4807,7 +4335,7 @@
         </w:tc>
         <w:tc>
           <w:tcPr>
-            <w:tcW w:w="2993" w:type="dxa"/>
+            <w:tcW w:w="1810" w:type="dxa"/>
             <w:tcBorders>
               <w:top w:val="single" w:sz="4" w:space="0" w:color="000000"/>
               <w:left w:val="single" w:sz="4" w:space="0" w:color="000000"/>
@@ -4840,57 +4368,57 @@
         </w:tc>
         <w:tc>
           <w:tcPr>
-            <w:tcW w:w="1745" w:type="dxa"/>
-            <w:tcBorders>
-              <w:top w:val="single" w:sz="4" w:space="0" w:color="000000"/>
-              <w:left w:val="single" w:sz="4" w:space="0" w:color="000000"/>
-              <w:bottom w:val="single" w:sz="4" w:space="0" w:color="000000"/>
-              <w:right w:val="single" w:sz="4" w:space="0" w:color="000000"/>
-            </w:tcBorders>
-            <w:shd w:val="clear" w:color="000000" w:fill="FFFFFF"/>
-            <w:tcMar>
-              <w:left w:w="108" w:type="dxa"/>
-              <w:right w:w="108" w:type="dxa"/>
-            </w:tcMar>
-          </w:tcPr>
-          <w:p>
-            <w:pPr>
-              <w:spacing w:after="0" w:line="240" w:lineRule="auto"/>
-              <w:jc w:val="center"/>
-              <w:rPr>
-                <w:rFonts w:ascii="Calibri" w:eastAsia="Calibri" w:hAnsi="Calibri" w:cs="Calibri"/>
-              </w:rPr>
-            </w:pPr>
-          </w:p>
-        </w:tc>
-        <w:tc>
-          <w:tcPr>
-            <w:tcW w:w="908" w:type="dxa"/>
-            <w:tcBorders>
-              <w:top w:val="single" w:sz="4" w:space="0" w:color="000000"/>
-              <w:left w:val="single" w:sz="4" w:space="0" w:color="000000"/>
-              <w:bottom w:val="single" w:sz="4" w:space="0" w:color="000000"/>
-              <w:right w:val="single" w:sz="4" w:space="0" w:color="000000"/>
-            </w:tcBorders>
-            <w:shd w:val="clear" w:color="000000" w:fill="FFFFFF"/>
-            <w:tcMar>
-              <w:left w:w="108" w:type="dxa"/>
-              <w:right w:w="108" w:type="dxa"/>
-            </w:tcMar>
-          </w:tcPr>
-          <w:p>
-            <w:pPr>
-              <w:spacing w:after="0" w:line="240" w:lineRule="auto"/>
-              <w:jc w:val="center"/>
-              <w:rPr>
-                <w:rFonts w:ascii="Calibri" w:eastAsia="Calibri" w:hAnsi="Calibri" w:cs="Calibri"/>
-              </w:rPr>
-            </w:pPr>
-          </w:p>
-        </w:tc>
-        <w:tc>
-          <w:tcPr>
-            <w:tcW w:w="1363" w:type="dxa"/>
+            <w:tcW w:w="1387" w:type="dxa"/>
+            <w:tcBorders>
+              <w:top w:val="single" w:sz="4" w:space="0" w:color="000000"/>
+              <w:left w:val="single" w:sz="4" w:space="0" w:color="000000"/>
+              <w:bottom w:val="single" w:sz="4" w:space="0" w:color="000000"/>
+              <w:right w:val="single" w:sz="4" w:space="0" w:color="000000"/>
+            </w:tcBorders>
+            <w:shd w:val="clear" w:color="000000" w:fill="FFFFFF"/>
+            <w:tcMar>
+              <w:left w:w="108" w:type="dxa"/>
+              <w:right w:w="108" w:type="dxa"/>
+            </w:tcMar>
+          </w:tcPr>
+          <w:p>
+            <w:pPr>
+              <w:spacing w:after="0" w:line="240" w:lineRule="auto"/>
+              <w:jc w:val="center"/>
+              <w:rPr>
+                <w:rFonts w:ascii="Calibri" w:eastAsia="Calibri" w:hAnsi="Calibri" w:cs="Calibri"/>
+              </w:rPr>
+            </w:pPr>
+          </w:p>
+        </w:tc>
+        <w:tc>
+          <w:tcPr>
+            <w:tcW w:w="1180" w:type="dxa"/>
+            <w:tcBorders>
+              <w:top w:val="single" w:sz="4" w:space="0" w:color="000000"/>
+              <w:left w:val="single" w:sz="4" w:space="0" w:color="000000"/>
+              <w:bottom w:val="single" w:sz="4" w:space="0" w:color="000000"/>
+              <w:right w:val="single" w:sz="4" w:space="0" w:color="000000"/>
+            </w:tcBorders>
+            <w:shd w:val="clear" w:color="000000" w:fill="FFFFFF"/>
+            <w:tcMar>
+              <w:left w:w="108" w:type="dxa"/>
+              <w:right w:w="108" w:type="dxa"/>
+            </w:tcMar>
+          </w:tcPr>
+          <w:p>
+            <w:pPr>
+              <w:spacing w:after="0" w:line="240" w:lineRule="auto"/>
+              <w:jc w:val="center"/>
+              <w:rPr>
+                <w:rFonts w:ascii="Calibri" w:eastAsia="Calibri" w:hAnsi="Calibri" w:cs="Calibri"/>
+              </w:rPr>
+            </w:pPr>
+          </w:p>
+        </w:tc>
+        <w:tc>
+          <w:tcPr>
+            <w:tcW w:w="1168" w:type="dxa"/>
             <w:tcBorders>
               <w:top w:val="single" w:sz="4" w:space="0" w:color="000000"/>
               <w:left w:val="single" w:sz="4" w:space="0" w:color="000000"/>
@@ -4917,249 +4445,51 @@
       <w:tr>
         <w:tc>
           <w:tcPr>
-            <w:tcW w:w="774" w:type="dxa"/>
-            <w:tcBorders>
-              <w:top w:val="single" w:sz="4" w:space="0" w:color="000000"/>
-              <w:left w:val="single" w:sz="4" w:space="0" w:color="000000"/>
-              <w:bottom w:val="single" w:sz="4" w:space="0" w:color="000000"/>
-              <w:right w:val="single" w:sz="4" w:space="0" w:color="000000"/>
-            </w:tcBorders>
-            <w:shd w:val="clear" w:color="000000" w:fill="FFFFFF"/>
-            <w:tcMar>
-              <w:left w:w="108" w:type="dxa"/>
-              <w:right w:w="108" w:type="dxa"/>
-            </w:tcMar>
-          </w:tcPr>
-          <w:p>
-            <w:pPr>
-              <w:spacing w:after="0" w:line="240" w:lineRule="auto"/>
-              <w:jc w:val="center"/>
-              <w:rPr>
-                <w:rFonts w:ascii="Calibri" w:eastAsia="Calibri" w:hAnsi="Calibri" w:cs="Calibri"/>
-              </w:rPr>
-            </w:pPr>
-            <w:r>
-              <w:rPr>
-                <w:rFonts w:ascii="Calibri" w:eastAsia="Calibri" w:hAnsi="Calibri" w:cs="Calibri"/>
-                <w:sz w:val="24"/>
-              </w:rPr>
-              <w:t>6</w:t>
-            </w:r>
-          </w:p>
-        </w:tc>
-        <w:tc>
-          <w:tcPr>
-            <w:tcW w:w="1555" w:type="dxa"/>
-            <w:tcBorders>
-              <w:top w:val="single" w:sz="4" w:space="0" w:color="000000"/>
-              <w:left w:val="single" w:sz="4" w:space="0" w:color="000000"/>
-              <w:bottom w:val="single" w:sz="4" w:space="0" w:color="000000"/>
-              <w:right w:val="single" w:sz="4" w:space="0" w:color="000000"/>
-            </w:tcBorders>
-            <w:shd w:val="clear" w:color="000000" w:fill="FFFFFF"/>
-            <w:tcMar>
-              <w:left w:w="108" w:type="dxa"/>
-              <w:right w:w="108" w:type="dxa"/>
-            </w:tcMar>
-          </w:tcPr>
-          <w:p>
-            <w:pPr>
-              <w:spacing w:after="0" w:line="240" w:lineRule="auto"/>
-              <w:jc w:val="center"/>
-              <w:rPr>
-                <w:rFonts w:ascii="Calibri" w:eastAsia="Calibri" w:hAnsi="Calibri" w:cs="Calibri"/>
-              </w:rPr>
-            </w:pPr>
-            <w:r>
-              <w:rPr>
-                <w:rFonts w:ascii="Calibri" w:eastAsia="Calibri" w:hAnsi="Calibri" w:cs="Calibri"/>
-                <w:sz w:val="24"/>
-              </w:rPr>
-              <w:t>09:45</w:t>
-            </w:r>
-          </w:p>
-        </w:tc>
-        <w:tc>
-          <w:tcPr>
-            <w:tcW w:w="1801" w:type="dxa"/>
-            <w:tcBorders>
-              <w:top w:val="single" w:sz="4" w:space="0" w:color="000000"/>
-              <w:left w:val="single" w:sz="4" w:space="0" w:color="000000"/>
-              <w:bottom w:val="single" w:sz="4" w:space="0" w:color="000000"/>
-              <w:right w:val="single" w:sz="4" w:space="0" w:color="000000"/>
-            </w:tcBorders>
-            <w:shd w:val="clear" w:color="000000" w:fill="FFFFFF"/>
-            <w:tcMar>
-              <w:left w:w="108" w:type="dxa"/>
-              <w:right w:w="108" w:type="dxa"/>
-            </w:tcMar>
-          </w:tcPr>
-          <w:p>
-            <w:pPr>
-              <w:spacing w:after="0" w:line="240" w:lineRule="auto"/>
-              <w:jc w:val="center"/>
-              <w:rPr>
-                <w:rFonts w:ascii="Calibri" w:eastAsia="Calibri" w:hAnsi="Calibri" w:cs="Calibri"/>
-              </w:rPr>
-            </w:pPr>
-            <w:r>
-              <w:rPr>
-                <w:rFonts w:ascii="Calibri" w:eastAsia="Calibri" w:hAnsi="Calibri" w:cs="Calibri"/>
-                <w:sz w:val="24"/>
-              </w:rPr>
-              <w:t>13:05</w:t>
-            </w:r>
-          </w:p>
-        </w:tc>
-        <w:tc>
-          <w:tcPr>
-            <w:tcW w:w="2993" w:type="dxa"/>
-            <w:tcBorders>
-              <w:top w:val="single" w:sz="4" w:space="0" w:color="000000"/>
-              <w:left w:val="single" w:sz="4" w:space="0" w:color="000000"/>
-              <w:bottom w:val="single" w:sz="4" w:space="0" w:color="000000"/>
-              <w:right w:val="single" w:sz="4" w:space="0" w:color="000000"/>
-            </w:tcBorders>
-            <w:shd w:val="clear" w:color="000000" w:fill="FFFFFF"/>
-            <w:tcMar>
-              <w:left w:w="108" w:type="dxa"/>
-              <w:right w:w="108" w:type="dxa"/>
-            </w:tcMar>
-          </w:tcPr>
-          <w:p>
-            <w:pPr>
-              <w:spacing w:after="0" w:line="240" w:lineRule="auto"/>
-              <w:jc w:val="center"/>
-              <w:rPr>
-                <w:rFonts w:ascii="Calibri" w:eastAsia="Calibri" w:hAnsi="Calibri" w:cs="Calibri"/>
-              </w:rPr>
-            </w:pPr>
-          </w:p>
-        </w:tc>
-        <w:tc>
-          <w:tcPr>
-            <w:tcW w:w="1745" w:type="dxa"/>
-            <w:tcBorders>
-              <w:top w:val="single" w:sz="4" w:space="0" w:color="000000"/>
-              <w:left w:val="single" w:sz="4" w:space="0" w:color="000000"/>
-              <w:bottom w:val="single" w:sz="4" w:space="0" w:color="000000"/>
-              <w:right w:val="single" w:sz="4" w:space="0" w:color="000000"/>
-            </w:tcBorders>
-            <w:shd w:val="clear" w:color="000000" w:fill="FFFFFF"/>
-            <w:tcMar>
-              <w:left w:w="108" w:type="dxa"/>
-              <w:right w:w="108" w:type="dxa"/>
-            </w:tcMar>
-          </w:tcPr>
-          <w:p>
-            <w:pPr>
-              <w:spacing w:after="0" w:line="240" w:lineRule="auto"/>
-              <w:jc w:val="center"/>
-              <w:rPr>
-                <w:rFonts w:ascii="Calibri" w:eastAsia="Calibri" w:hAnsi="Calibri" w:cs="Calibri"/>
-              </w:rPr>
-            </w:pPr>
-          </w:p>
-        </w:tc>
-        <w:tc>
-          <w:tcPr>
-            <w:tcW w:w="908" w:type="dxa"/>
-            <w:tcBorders>
-              <w:top w:val="single" w:sz="4" w:space="0" w:color="000000"/>
-              <w:left w:val="single" w:sz="4" w:space="0" w:color="000000"/>
-              <w:bottom w:val="single" w:sz="4" w:space="0" w:color="000000"/>
-              <w:right w:val="single" w:sz="4" w:space="0" w:color="000000"/>
-            </w:tcBorders>
-            <w:shd w:val="clear" w:color="000000" w:fill="FFFFFF"/>
-            <w:tcMar>
-              <w:left w:w="108" w:type="dxa"/>
-              <w:right w:w="108" w:type="dxa"/>
-            </w:tcMar>
-          </w:tcPr>
-          <w:p>
-            <w:pPr>
-              <w:spacing w:after="0" w:line="240" w:lineRule="auto"/>
-              <w:jc w:val="center"/>
-              <w:rPr>
-                <w:rFonts w:ascii="Calibri" w:eastAsia="Calibri" w:hAnsi="Calibri" w:cs="Calibri"/>
-              </w:rPr>
-            </w:pPr>
-          </w:p>
-        </w:tc>
-        <w:tc>
-          <w:tcPr>
-            <w:tcW w:w="1363" w:type="dxa"/>
-            <w:tcBorders>
-              <w:top w:val="single" w:sz="4" w:space="0" w:color="000000"/>
-              <w:left w:val="single" w:sz="4" w:space="0" w:color="000000"/>
-              <w:bottom w:val="single" w:sz="4" w:space="0" w:color="000000"/>
-              <w:right w:val="single" w:sz="4" w:space="0" w:color="000000"/>
-            </w:tcBorders>
-            <w:shd w:val="clear" w:color="000000" w:fill="FFFFFF"/>
-            <w:tcMar>
-              <w:left w:w="108" w:type="dxa"/>
-              <w:right w:w="108" w:type="dxa"/>
-            </w:tcMar>
-          </w:tcPr>
-          <w:p>
-            <w:pPr>
-              <w:spacing w:after="0" w:line="240" w:lineRule="auto"/>
-              <w:jc w:val="center"/>
-              <w:rPr>
-                <w:rFonts w:ascii="Calibri" w:eastAsia="Calibri" w:hAnsi="Calibri" w:cs="Calibri"/>
-              </w:rPr>
-            </w:pPr>
+            <w:tcW w:w="8918" w:type="dxa"/>
+            <w:gridSpan w:val="7"/>
+            <w:tcBorders>
+              <w:top w:val="single" w:sz="4" w:space="0" w:color="000000"/>
+              <w:left w:val="single" w:sz="4" w:space="0" w:color="000000"/>
+              <w:bottom w:val="single" w:sz="4" w:space="0" w:color="000000"/>
+              <w:right w:val="single" w:sz="4" w:space="0" w:color="000000"/>
+            </w:tcBorders>
+            <w:shd w:val="clear" w:color="000000" w:fill="FFFFFF"/>
+            <w:tcMar>
+              <w:left w:w="108" w:type="dxa"/>
+              <w:right w:w="108" w:type="dxa"/>
+            </w:tcMar>
+          </w:tcPr>
+          <w:p>
+            <w:pPr>
+              <w:spacing w:after="0" w:line="240" w:lineRule="auto"/>
+              <w:rPr>
+                <w:rFonts w:ascii="Calibri" w:eastAsia="Calibri" w:hAnsi="Calibri" w:cs="Calibri"/>
+              </w:rPr>
+            </w:pPr>
+            <w:r>
+              <w:rPr>
+                <w:rFonts w:ascii="Calibri" w:eastAsia="Calibri" w:hAnsi="Calibri" w:cs="Calibri"/>
+                <w:b/>
+                <w:color w:val="000000"/>
+                <w:sz w:val="24"/>
+              </w:rPr>
+              <w:t>(F) CREW CHANGE HELIGO (139)</w:t>
+            </w:r>
+            <w:r>
+              <w:rPr>
+                <w:rFonts w:ascii="Calibri" w:eastAsia="Calibri" w:hAnsi="Calibri" w:cs="Calibri"/>
+                <w:b/>
+                <w:sz w:val="24"/>
+              </w:rPr>
+              <w:t xml:space="preserve"> </w:t>
+            </w:r>
           </w:p>
         </w:tc>
       </w:tr>
       <w:tr>
         <w:tc>
           <w:tcPr>
-            <w:tcW w:w="11139" w:type="dxa"/>
-            <w:gridSpan w:val="7"/>
-            <w:tcBorders>
-              <w:top w:val="single" w:sz="4" w:space="0" w:color="000000"/>
-              <w:left w:val="single" w:sz="4" w:space="0" w:color="000000"/>
-              <w:bottom w:val="single" w:sz="4" w:space="0" w:color="000000"/>
-              <w:right w:val="single" w:sz="4" w:space="0" w:color="000000"/>
-            </w:tcBorders>
-            <w:shd w:val="clear" w:color="000000" w:fill="FFFFFF"/>
-            <w:tcMar>
-              <w:left w:w="108" w:type="dxa"/>
-              <w:right w:w="108" w:type="dxa"/>
-            </w:tcMar>
-          </w:tcPr>
-          <w:p>
-            <w:pPr>
-              <w:spacing w:after="0" w:line="240" w:lineRule="auto"/>
-              <w:rPr>
-                <w:rFonts w:ascii="Calibri" w:eastAsia="Calibri" w:hAnsi="Calibri" w:cs="Calibri"/>
-              </w:rPr>
-            </w:pPr>
-            <w:r>
-              <w:rPr>
-                <w:rFonts w:ascii="Calibri" w:eastAsia="Calibri" w:hAnsi="Calibri" w:cs="Calibri"/>
-                <w:b/>
-                <w:color w:val="000000"/>
-                <w:sz w:val="24"/>
-              </w:rPr>
-              <w:t>(F) CREW CHANGE HELIGO (139)</w:t>
-            </w:r>
-            <w:r>
-              <w:rPr>
-                <w:rFonts w:ascii="Calibri" w:eastAsia="Calibri" w:hAnsi="Calibri" w:cs="Calibri"/>
-                <w:b/>
-                <w:sz w:val="24"/>
-              </w:rPr>
-              <w:t xml:space="preserve"> </w:t>
-            </w:r>
-          </w:p>
-        </w:tc>
-      </w:tr>
-      <w:tr>
-        <w:tc>
-          <w:tcPr>
-            <w:tcW w:w="774" w:type="dxa"/>
+            <w:tcW w:w="620" w:type="dxa"/>
             <w:tcBorders>
               <w:top w:val="single" w:sz="4" w:space="0" w:color="000000"/>
               <w:left w:val="single" w:sz="4" w:space="0" w:color="000000"/>
@@ -5192,7 +4522,7 @@
         </w:tc>
         <w:tc>
           <w:tcPr>
-            <w:tcW w:w="1555" w:type="dxa"/>
+            <w:tcW w:w="1414" w:type="dxa"/>
             <w:tcBorders>
               <w:top w:val="single" w:sz="4" w:space="0" w:color="000000"/>
               <w:left w:val="single" w:sz="4" w:space="0" w:color="000000"/>
@@ -5224,7 +4554,7 @@
         </w:tc>
         <w:tc>
           <w:tcPr>
-            <w:tcW w:w="1801" w:type="dxa"/>
+            <w:tcW w:w="1339" w:type="dxa"/>
             <w:tcBorders>
               <w:top w:val="single" w:sz="4" w:space="0" w:color="000000"/>
               <w:left w:val="single" w:sz="4" w:space="0" w:color="000000"/>
@@ -5256,7 +4586,7 @@
         </w:tc>
         <w:tc>
           <w:tcPr>
-            <w:tcW w:w="2993" w:type="dxa"/>
+            <w:tcW w:w="1810" w:type="dxa"/>
             <w:tcBorders>
               <w:top w:val="single" w:sz="4" w:space="0" w:color="000000"/>
               <w:left w:val="single" w:sz="4" w:space="0" w:color="000000"/>
@@ -5285,69 +4615,65 @@
               <w:rPr>
                 <w:rFonts w:ascii="Calibri" w:eastAsia="Calibri" w:hAnsi="Calibri" w:cs="Calibri"/>
               </w:rPr>
-              <w:t>ICP</w:t>
-            </w:r>
-          </w:p>
-        </w:tc>
-        <w:tc>
-          <w:tcPr>
-            <w:tcW w:w="1745" w:type="dxa"/>
-            <w:tcBorders>
-              <w:top w:val="single" w:sz="4" w:space="0" w:color="000000"/>
-              <w:left w:val="single" w:sz="4" w:space="0" w:color="000000"/>
-              <w:bottom w:val="single" w:sz="4" w:space="0" w:color="000000"/>
-              <w:right w:val="single" w:sz="4" w:space="0" w:color="000000"/>
-            </w:tcBorders>
-            <w:shd w:val="clear" w:color="000000" w:fill="FFFFFF"/>
-            <w:tcMar>
-              <w:left w:w="108" w:type="dxa"/>
-              <w:right w:w="108" w:type="dxa"/>
-            </w:tcMar>
-          </w:tcPr>
-          <w:p>
-            <w:pPr>
-              <w:spacing w:after="0" w:line="240" w:lineRule="auto"/>
-              <w:jc w:val="center"/>
-              <w:rPr>
-                <w:rFonts w:ascii="Calibri" w:eastAsia="Calibri" w:hAnsi="Calibri" w:cs="Calibri"/>
-              </w:rPr>
-            </w:pPr>
-          </w:p>
-        </w:tc>
-        <w:tc>
-          <w:tcPr>
-            <w:tcW w:w="908" w:type="dxa"/>
-            <w:tcBorders>
-              <w:top w:val="single" w:sz="4" w:space="0" w:color="000000"/>
-              <w:left w:val="single" w:sz="4" w:space="0" w:color="000000"/>
-              <w:bottom w:val="single" w:sz="4" w:space="0" w:color="000000"/>
-              <w:right w:val="single" w:sz="4" w:space="0" w:color="000000"/>
-            </w:tcBorders>
-            <w:shd w:val="clear" w:color="000000" w:fill="FFFFFF"/>
-            <w:tcMar>
-              <w:left w:w="108" w:type="dxa"/>
-              <w:right w:w="108" w:type="dxa"/>
-            </w:tcMar>
-          </w:tcPr>
-          <w:p>
-            <w:pPr>
-              <w:spacing w:after="0" w:line="240" w:lineRule="auto"/>
-              <w:jc w:val="center"/>
-              <w:rPr>
-                <w:rFonts w:ascii="Calibri" w:eastAsia="Calibri" w:hAnsi="Calibri" w:cs="Calibri"/>
-              </w:rPr>
-            </w:pPr>
-            <w:r>
-              <w:rPr>
-                <w:rFonts w:ascii="Calibri" w:eastAsia="Calibri" w:hAnsi="Calibri" w:cs="Calibri"/>
-              </w:rPr>
-              <w:t>HLU</w:t>
-            </w:r>
-          </w:p>
-        </w:tc>
-        <w:tc>
-          <w:tcPr>
-            <w:tcW w:w="1363" w:type="dxa"/>
+              <w:t>VIR-1</w:t>
+            </w:r>
+          </w:p>
+        </w:tc>
+        <w:tc>
+          <w:tcPr>
+            <w:tcW w:w="1387" w:type="dxa"/>
+            <w:tcBorders>
+              <w:top w:val="single" w:sz="4" w:space="0" w:color="000000"/>
+              <w:left w:val="single" w:sz="4" w:space="0" w:color="000000"/>
+              <w:bottom w:val="single" w:sz="4" w:space="0" w:color="000000"/>
+              <w:right w:val="single" w:sz="4" w:space="0" w:color="000000"/>
+            </w:tcBorders>
+            <w:shd w:val="clear" w:color="000000" w:fill="FFFFFF"/>
+            <w:tcMar>
+              <w:left w:w="108" w:type="dxa"/>
+              <w:right w:w="108" w:type="dxa"/>
+            </w:tcMar>
+          </w:tcPr>
+          <w:p>
+            <w:pPr>
+              <w:spacing w:after="0" w:line="240" w:lineRule="auto"/>
+              <w:jc w:val="center"/>
+              <w:rPr>
+                <w:rFonts w:ascii="Calibri" w:eastAsia="Calibri" w:hAnsi="Calibri" w:cs="Calibri"/>
+              </w:rPr>
+            </w:pPr>
+          </w:p>
+        </w:tc>
+        <w:tc>
+          <w:tcPr>
+            <w:tcW w:w="1180" w:type="dxa"/>
+            <w:tcBorders>
+              <w:top w:val="single" w:sz="4" w:space="0" w:color="000000"/>
+              <w:left w:val="single" w:sz="4" w:space="0" w:color="000000"/>
+              <w:bottom w:val="single" w:sz="4" w:space="0" w:color="000000"/>
+              <w:right w:val="single" w:sz="4" w:space="0" w:color="000000"/>
+            </w:tcBorders>
+            <w:shd w:val="clear" w:color="000000" w:fill="FFFFFF"/>
+            <w:tcMar>
+              <w:left w:w="108" w:type="dxa"/>
+              <w:right w:w="108" w:type="dxa"/>
+            </w:tcMar>
+          </w:tcPr>
+          <w:p>
+            <w:pPr>
+              <w:spacing w:after="0" w:line="240" w:lineRule="auto"/>
+              <w:jc w:val="center"/>
+              <w:rPr>
+                <w:rFonts w:ascii="Calibri" w:eastAsia="Calibri" w:hAnsi="Calibri" w:cs="Calibri"/>
+              </w:rPr>
+            </w:pPr>
+            <w:bookmarkStart w:id="0" w:name="_GoBack"/>
+            <w:bookmarkEnd w:id="0"/>
+          </w:p>
+        </w:tc>
+        <w:tc>
+          <w:tcPr>
+            <w:tcW w:w="1168" w:type="dxa"/>
             <w:tcBorders>
               <w:top w:val="single" w:sz="4" w:space="0" w:color="000000"/>
               <w:left w:val="single" w:sz="4" w:space="0" w:color="000000"/>
@@ -5374,7 +4700,7 @@
       <w:tr>
         <w:tc>
           <w:tcPr>
-            <w:tcW w:w="774" w:type="dxa"/>
+            <w:tcW w:w="620" w:type="dxa"/>
             <w:tcBorders>
               <w:top w:val="single" w:sz="4" w:space="0" w:color="000000"/>
               <w:left w:val="single" w:sz="4" w:space="0" w:color="000000"/>
@@ -5407,7 +4733,7 @@
         </w:tc>
         <w:tc>
           <w:tcPr>
-            <w:tcW w:w="1555" w:type="dxa"/>
+            <w:tcW w:w="1414" w:type="dxa"/>
             <w:tcBorders>
               <w:top w:val="single" w:sz="4" w:space="0" w:color="000000"/>
               <w:left w:val="single" w:sz="4" w:space="0" w:color="000000"/>
@@ -5439,7 +4765,7 @@
         </w:tc>
         <w:tc>
           <w:tcPr>
-            <w:tcW w:w="1801" w:type="dxa"/>
+            <w:tcW w:w="1339" w:type="dxa"/>
             <w:tcBorders>
               <w:top w:val="single" w:sz="4" w:space="0" w:color="000000"/>
               <w:left w:val="single" w:sz="4" w:space="0" w:color="000000"/>
@@ -5471,94 +4797,88 @@
         </w:tc>
         <w:tc>
           <w:tcPr>
-            <w:tcW w:w="2993" w:type="dxa"/>
-            <w:tcBorders>
-              <w:top w:val="single" w:sz="4" w:space="0" w:color="000000"/>
-              <w:left w:val="single" w:sz="4" w:space="0" w:color="000000"/>
-              <w:bottom w:val="single" w:sz="4" w:space="0" w:color="000000"/>
-              <w:right w:val="single" w:sz="4" w:space="0" w:color="000000"/>
-            </w:tcBorders>
-            <w:shd w:val="clear" w:color="000000" w:fill="FFFFFF"/>
-            <w:tcMar>
-              <w:left w:w="108" w:type="dxa"/>
-              <w:right w:w="108" w:type="dxa"/>
-            </w:tcMar>
-          </w:tcPr>
-          <w:p>
-            <w:pPr>
-              <w:spacing w:after="0" w:line="240" w:lineRule="auto"/>
-              <w:jc w:val="center"/>
-              <w:rPr>
-                <w:rFonts w:ascii="Calibri" w:eastAsia="Calibri" w:hAnsi="Calibri" w:cs="Calibri"/>
-              </w:rPr>
-            </w:pPr>
-            <w:r>
-              <w:rPr>
-                <w:rFonts w:ascii="Calibri" w:eastAsia="Calibri" w:hAnsi="Calibri" w:cs="Calibri"/>
-              </w:rPr>
-              <w:t>SJOT</w:t>
-            </w:r>
-          </w:p>
-        </w:tc>
-        <w:tc>
-          <w:tcPr>
-            <w:tcW w:w="1745" w:type="dxa"/>
-            <w:tcBorders>
-              <w:top w:val="single" w:sz="4" w:space="0" w:color="000000"/>
-              <w:left w:val="single" w:sz="4" w:space="0" w:color="000000"/>
-              <w:bottom w:val="single" w:sz="4" w:space="0" w:color="000000"/>
-              <w:right w:val="single" w:sz="4" w:space="0" w:color="000000"/>
-            </w:tcBorders>
-            <w:shd w:val="clear" w:color="000000" w:fill="FFFFFF"/>
-            <w:tcMar>
-              <w:left w:w="108" w:type="dxa"/>
-              <w:right w:w="108" w:type="dxa"/>
-            </w:tcMar>
-          </w:tcPr>
-          <w:p>
-            <w:pPr>
-              <w:spacing w:after="0" w:line="240" w:lineRule="auto"/>
-              <w:jc w:val="center"/>
-              <w:rPr>
-                <w:rFonts w:ascii="Calibri" w:eastAsia="Calibri" w:hAnsi="Calibri" w:cs="Calibri"/>
-              </w:rPr>
-            </w:pPr>
-          </w:p>
-        </w:tc>
-        <w:tc>
-          <w:tcPr>
-            <w:tcW w:w="908" w:type="dxa"/>
-            <w:tcBorders>
-              <w:top w:val="single" w:sz="4" w:space="0" w:color="000000"/>
-              <w:left w:val="single" w:sz="4" w:space="0" w:color="000000"/>
-              <w:bottom w:val="single" w:sz="4" w:space="0" w:color="000000"/>
-              <w:right w:val="single" w:sz="4" w:space="0" w:color="000000"/>
-            </w:tcBorders>
-            <w:shd w:val="clear" w:color="000000" w:fill="FFFFFF"/>
-            <w:tcMar>
-              <w:left w:w="108" w:type="dxa"/>
-              <w:right w:w="108" w:type="dxa"/>
-            </w:tcMar>
-          </w:tcPr>
-          <w:p>
-            <w:pPr>
-              <w:spacing w:after="0" w:line="240" w:lineRule="auto"/>
-              <w:jc w:val="center"/>
-              <w:rPr>
-                <w:rFonts w:ascii="Calibri" w:eastAsia="Calibri" w:hAnsi="Calibri" w:cs="Calibri"/>
-              </w:rPr>
-            </w:pPr>
-            <w:r>
-              <w:rPr>
-                <w:rFonts w:ascii="Calibri" w:eastAsia="Calibri" w:hAnsi="Calibri" w:cs="Calibri"/>
-              </w:rPr>
-              <w:t>HLH</w:t>
-            </w:r>
-          </w:p>
-        </w:tc>
-        <w:tc>
-          <w:tcPr>
-            <w:tcW w:w="1363" w:type="dxa"/>
+            <w:tcW w:w="1810" w:type="dxa"/>
+            <w:tcBorders>
+              <w:top w:val="single" w:sz="4" w:space="0" w:color="000000"/>
+              <w:left w:val="single" w:sz="4" w:space="0" w:color="000000"/>
+              <w:bottom w:val="single" w:sz="4" w:space="0" w:color="000000"/>
+              <w:right w:val="single" w:sz="4" w:space="0" w:color="000000"/>
+            </w:tcBorders>
+            <w:shd w:val="clear" w:color="000000" w:fill="FFFFFF"/>
+            <w:tcMar>
+              <w:left w:w="108" w:type="dxa"/>
+              <w:right w:w="108" w:type="dxa"/>
+            </w:tcMar>
+          </w:tcPr>
+          <w:p>
+            <w:pPr>
+              <w:spacing w:after="0" w:line="240" w:lineRule="auto"/>
+              <w:jc w:val="center"/>
+              <w:rPr>
+                <w:rFonts w:ascii="Calibri" w:eastAsia="Calibri" w:hAnsi="Calibri" w:cs="Calibri"/>
+              </w:rPr>
+            </w:pPr>
+            <w:r>
+              <w:rPr>
+                <w:rFonts w:ascii="Calibri" w:eastAsia="Calibri" w:hAnsi="Calibri" w:cs="Calibri"/>
+              </w:rPr>
+              <w:t>ADM10</w:t>
+            </w:r>
+          </w:p>
+        </w:tc>
+        <w:tc>
+          <w:tcPr>
+            <w:tcW w:w="1387" w:type="dxa"/>
+            <w:tcBorders>
+              <w:top w:val="single" w:sz="4" w:space="0" w:color="000000"/>
+              <w:left w:val="single" w:sz="4" w:space="0" w:color="000000"/>
+              <w:bottom w:val="single" w:sz="4" w:space="0" w:color="000000"/>
+              <w:right w:val="single" w:sz="4" w:space="0" w:color="000000"/>
+            </w:tcBorders>
+            <w:shd w:val="clear" w:color="000000" w:fill="FFFFFF"/>
+            <w:tcMar>
+              <w:left w:w="108" w:type="dxa"/>
+              <w:right w:w="108" w:type="dxa"/>
+            </w:tcMar>
+          </w:tcPr>
+          <w:p>
+            <w:pPr>
+              <w:spacing w:after="0" w:line="240" w:lineRule="auto"/>
+              <w:jc w:val="center"/>
+              <w:rPr>
+                <w:rFonts w:ascii="Calibri" w:eastAsia="Calibri" w:hAnsi="Calibri" w:cs="Calibri"/>
+              </w:rPr>
+            </w:pPr>
+          </w:p>
+        </w:tc>
+        <w:tc>
+          <w:tcPr>
+            <w:tcW w:w="1180" w:type="dxa"/>
+            <w:tcBorders>
+              <w:top w:val="single" w:sz="4" w:space="0" w:color="000000"/>
+              <w:left w:val="single" w:sz="4" w:space="0" w:color="000000"/>
+              <w:bottom w:val="single" w:sz="4" w:space="0" w:color="000000"/>
+              <w:right w:val="single" w:sz="4" w:space="0" w:color="000000"/>
+            </w:tcBorders>
+            <w:shd w:val="clear" w:color="000000" w:fill="FFFFFF"/>
+            <w:tcMar>
+              <w:left w:w="108" w:type="dxa"/>
+              <w:right w:w="108" w:type="dxa"/>
+            </w:tcMar>
+          </w:tcPr>
+          <w:p>
+            <w:pPr>
+              <w:spacing w:after="0" w:line="240" w:lineRule="auto"/>
+              <w:jc w:val="center"/>
+              <w:rPr>
+                <w:rFonts w:ascii="Calibri" w:eastAsia="Calibri" w:hAnsi="Calibri" w:cs="Calibri"/>
+              </w:rPr>
+            </w:pPr>
+          </w:p>
+        </w:tc>
+        <w:tc>
+          <w:tcPr>
+            <w:tcW w:w="1168" w:type="dxa"/>
             <w:tcBorders>
               <w:top w:val="single" w:sz="4" w:space="0" w:color="000000"/>
               <w:left w:val="single" w:sz="4" w:space="0" w:color="000000"/>
@@ -5585,7 +4905,7 @@
       <w:tr>
         <w:tc>
           <w:tcPr>
-            <w:tcW w:w="774" w:type="dxa"/>
+            <w:tcW w:w="620" w:type="dxa"/>
             <w:tcBorders>
               <w:top w:val="single" w:sz="4" w:space="0" w:color="000000"/>
               <w:left w:val="single" w:sz="4" w:space="0" w:color="000000"/>
@@ -5618,7 +4938,7 @@
         </w:tc>
         <w:tc>
           <w:tcPr>
-            <w:tcW w:w="1555" w:type="dxa"/>
+            <w:tcW w:w="1414" w:type="dxa"/>
             <w:tcBorders>
               <w:top w:val="single" w:sz="4" w:space="0" w:color="000000"/>
               <w:left w:val="single" w:sz="4" w:space="0" w:color="000000"/>
@@ -5650,7 +4970,7 @@
         </w:tc>
         <w:tc>
           <w:tcPr>
-            <w:tcW w:w="1801" w:type="dxa"/>
+            <w:tcW w:w="1339" w:type="dxa"/>
             <w:tcBorders>
               <w:top w:val="single" w:sz="4" w:space="0" w:color="000000"/>
               <w:left w:val="single" w:sz="4" w:space="0" w:color="000000"/>
@@ -5682,90 +5002,100 @@
         </w:tc>
         <w:tc>
           <w:tcPr>
-            <w:tcW w:w="2993" w:type="dxa"/>
-            <w:tcBorders>
-              <w:top w:val="single" w:sz="4" w:space="0" w:color="000000"/>
-              <w:left w:val="single" w:sz="4" w:space="0" w:color="000000"/>
-              <w:bottom w:val="single" w:sz="4" w:space="0" w:color="000000"/>
-              <w:right w:val="single" w:sz="4" w:space="0" w:color="000000"/>
-            </w:tcBorders>
-            <w:shd w:val="clear" w:color="000000" w:fill="FFFFFF"/>
-            <w:tcMar>
-              <w:left w:w="108" w:type="dxa"/>
-              <w:right w:w="108" w:type="dxa"/>
-            </w:tcMar>
-          </w:tcPr>
-          <w:p>
-            <w:pPr>
-              <w:spacing w:after="0" w:line="240" w:lineRule="auto"/>
-              <w:jc w:val="center"/>
-              <w:rPr>
-                <w:rFonts w:ascii="Calibri" w:eastAsia="Calibri" w:hAnsi="Calibri" w:cs="Calibri"/>
-              </w:rPr>
-            </w:pPr>
-            <w:r>
-              <w:rPr>
-                <w:rFonts w:ascii="Calibri" w:eastAsia="Calibri" w:hAnsi="Calibri" w:cs="Calibri"/>
-                <w:b/>
-                <w:sz w:val="24"/>
-              </w:rPr>
-              <w:t>NA</w:t>
-            </w:r>
-          </w:p>
-        </w:tc>
-        <w:tc>
-          <w:tcPr>
-            <w:tcW w:w="1745" w:type="dxa"/>
-            <w:tcBorders>
-              <w:top w:val="single" w:sz="4" w:space="0" w:color="000000"/>
-              <w:left w:val="single" w:sz="4" w:space="0" w:color="000000"/>
-              <w:bottom w:val="single" w:sz="4" w:space="0" w:color="000000"/>
-              <w:right w:val="single" w:sz="4" w:space="0" w:color="000000"/>
-            </w:tcBorders>
-            <w:shd w:val="clear" w:color="000000" w:fill="FFFFFF"/>
-            <w:tcMar>
-              <w:left w:w="108" w:type="dxa"/>
-              <w:right w:w="108" w:type="dxa"/>
-            </w:tcMar>
-          </w:tcPr>
-          <w:p>
-            <w:pPr>
-              <w:spacing w:after="0" w:line="240" w:lineRule="auto"/>
-              <w:jc w:val="center"/>
-              <w:rPr>
-                <w:rFonts w:ascii="Calibri" w:eastAsia="Calibri" w:hAnsi="Calibri" w:cs="Calibri"/>
-              </w:rPr>
-            </w:pPr>
-          </w:p>
-        </w:tc>
-        <w:tc>
-          <w:tcPr>
-            <w:tcW w:w="908" w:type="dxa"/>
-            <w:tcBorders>
-              <w:top w:val="single" w:sz="4" w:space="0" w:color="000000"/>
-              <w:left w:val="single" w:sz="4" w:space="0" w:color="000000"/>
-              <w:bottom w:val="single" w:sz="4" w:space="0" w:color="000000"/>
-              <w:right w:val="single" w:sz="4" w:space="0" w:color="000000"/>
-            </w:tcBorders>
-            <w:shd w:val="clear" w:color="000000" w:fill="FFFFFF"/>
-            <w:tcMar>
-              <w:left w:w="108" w:type="dxa"/>
-              <w:right w:w="108" w:type="dxa"/>
-            </w:tcMar>
-          </w:tcPr>
-          <w:p>
-            <w:pPr>
-              <w:spacing w:after="0" w:line="240" w:lineRule="auto"/>
-              <w:jc w:val="center"/>
-              <w:rPr>
-                <w:rFonts w:ascii="Calibri" w:eastAsia="Calibri" w:hAnsi="Calibri" w:cs="Calibri"/>
-              </w:rPr>
-            </w:pPr>
-          </w:p>
-        </w:tc>
-        <w:tc>
-          <w:tcPr>
-            <w:tcW w:w="1363" w:type="dxa"/>
+            <w:tcW w:w="1810" w:type="dxa"/>
+            <w:tcBorders>
+              <w:top w:val="single" w:sz="4" w:space="0" w:color="000000"/>
+              <w:left w:val="single" w:sz="4" w:space="0" w:color="000000"/>
+              <w:bottom w:val="single" w:sz="4" w:space="0" w:color="000000"/>
+              <w:right w:val="single" w:sz="4" w:space="0" w:color="000000"/>
+            </w:tcBorders>
+            <w:shd w:val="clear" w:color="000000" w:fill="FFFFFF"/>
+            <w:tcMar>
+              <w:left w:w="108" w:type="dxa"/>
+              <w:right w:w="108" w:type="dxa"/>
+            </w:tcMar>
+          </w:tcPr>
+          <w:p>
+            <w:pPr>
+              <w:spacing w:after="0" w:line="240" w:lineRule="auto"/>
+              <w:jc w:val="center"/>
+              <w:rPr>
+                <w:rFonts w:ascii="Calibri" w:eastAsia="Calibri" w:hAnsi="Calibri" w:cs="Calibri"/>
+              </w:rPr>
+            </w:pPr>
+            <w:r>
+              <w:rPr>
+                <w:rFonts w:ascii="Calibri" w:eastAsia="Calibri" w:hAnsi="Calibri" w:cs="Calibri"/>
+              </w:rPr>
+              <w:t>SF</w:t>
+            </w:r>
+            <w:r>
+              <w:rPr>
+                <w:rFonts w:ascii="Calibri" w:eastAsia="Calibri" w:hAnsi="Calibri" w:cs="Calibri"/>
+              </w:rPr>
+              <w:t xml:space="preserve"> </w:t>
+            </w:r>
+            <w:r>
+              <w:rPr>
+                <w:rFonts w:ascii="Calibri" w:eastAsia="Calibri" w:hAnsi="Calibri" w:cs="Calibri"/>
+              </w:rPr>
+              <w:t xml:space="preserve"> SPL</w:t>
+            </w:r>
+          </w:p>
+        </w:tc>
+        <w:tc>
+          <w:tcPr>
+            <w:tcW w:w="1387" w:type="dxa"/>
+            <w:tcBorders>
+              <w:top w:val="single" w:sz="4" w:space="0" w:color="000000"/>
+              <w:left w:val="single" w:sz="4" w:space="0" w:color="000000"/>
+              <w:bottom w:val="single" w:sz="4" w:space="0" w:color="000000"/>
+              <w:right w:val="single" w:sz="4" w:space="0" w:color="000000"/>
+            </w:tcBorders>
+            <w:shd w:val="clear" w:color="000000" w:fill="FFFFFF"/>
+            <w:tcMar>
+              <w:left w:w="108" w:type="dxa"/>
+              <w:right w:w="108" w:type="dxa"/>
+            </w:tcMar>
+          </w:tcPr>
+          <w:p>
+            <w:pPr>
+              <w:spacing w:after="0" w:line="240" w:lineRule="auto"/>
+              <w:jc w:val="center"/>
+              <w:rPr>
+                <w:rFonts w:ascii="Calibri" w:eastAsia="Calibri" w:hAnsi="Calibri" w:cs="Calibri"/>
+              </w:rPr>
+            </w:pPr>
+          </w:p>
+        </w:tc>
+        <w:tc>
+          <w:tcPr>
+            <w:tcW w:w="1180" w:type="dxa"/>
+            <w:tcBorders>
+              <w:top w:val="single" w:sz="4" w:space="0" w:color="000000"/>
+              <w:left w:val="single" w:sz="4" w:space="0" w:color="000000"/>
+              <w:bottom w:val="single" w:sz="4" w:space="0" w:color="000000"/>
+              <w:right w:val="single" w:sz="4" w:space="0" w:color="000000"/>
+            </w:tcBorders>
+            <w:shd w:val="clear" w:color="000000" w:fill="FFFFFF"/>
+            <w:tcMar>
+              <w:left w:w="108" w:type="dxa"/>
+              <w:right w:w="108" w:type="dxa"/>
+            </w:tcMar>
+          </w:tcPr>
+          <w:p>
+            <w:pPr>
+              <w:spacing w:after="0" w:line="240" w:lineRule="auto"/>
+              <w:jc w:val="center"/>
+              <w:rPr>
+                <w:rFonts w:ascii="Calibri" w:eastAsia="Calibri" w:hAnsi="Calibri" w:cs="Calibri"/>
+              </w:rPr>
+            </w:pPr>
+          </w:p>
+        </w:tc>
+        <w:tc>
+          <w:tcPr>
+            <w:tcW w:w="1168" w:type="dxa"/>
             <w:tcBorders>
               <w:top w:val="single" w:sz="4" w:space="0" w:color="000000"/>
               <w:left w:val="single" w:sz="4" w:space="0" w:color="000000"/>
@@ -5792,7 +5122,7 @@
       <w:tr>
         <w:tc>
           <w:tcPr>
-            <w:tcW w:w="774" w:type="dxa"/>
+            <w:tcW w:w="620" w:type="dxa"/>
             <w:tcBorders>
               <w:top w:val="single" w:sz="4" w:space="0" w:color="000000"/>
               <w:left w:val="single" w:sz="4" w:space="0" w:color="000000"/>
@@ -5825,7 +5155,7 @@
         </w:tc>
         <w:tc>
           <w:tcPr>
-            <w:tcW w:w="1555" w:type="dxa"/>
+            <w:tcW w:w="1414" w:type="dxa"/>
             <w:tcBorders>
               <w:top w:val="single" w:sz="4" w:space="0" w:color="000000"/>
               <w:left w:val="single" w:sz="4" w:space="0" w:color="000000"/>
@@ -5857,7 +5187,7 @@
         </w:tc>
         <w:tc>
           <w:tcPr>
-            <w:tcW w:w="1801" w:type="dxa"/>
+            <w:tcW w:w="1339" w:type="dxa"/>
             <w:tcBorders>
               <w:top w:val="single" w:sz="4" w:space="0" w:color="000000"/>
               <w:left w:val="single" w:sz="4" w:space="0" w:color="000000"/>
@@ -5889,96 +5219,88 @@
         </w:tc>
         <w:tc>
           <w:tcPr>
-            <w:tcW w:w="2993" w:type="dxa"/>
-            <w:tcBorders>
-              <w:top w:val="single" w:sz="4" w:space="0" w:color="000000"/>
-              <w:left w:val="single" w:sz="4" w:space="0" w:color="000000"/>
-              <w:bottom w:val="single" w:sz="4" w:space="0" w:color="000000"/>
-              <w:right w:val="single" w:sz="4" w:space="0" w:color="000000"/>
-            </w:tcBorders>
-            <w:shd w:val="clear" w:color="000000" w:fill="FFFFFF"/>
-            <w:tcMar>
-              <w:left w:w="108" w:type="dxa"/>
-              <w:right w:w="108" w:type="dxa"/>
-            </w:tcMar>
-          </w:tcPr>
-          <w:p>
-            <w:pPr>
-              <w:spacing w:after="0" w:line="240" w:lineRule="auto"/>
-              <w:jc w:val="center"/>
-              <w:rPr>
-                <w:rFonts w:ascii="Calibri" w:eastAsia="Calibri" w:hAnsi="Calibri" w:cs="Calibri"/>
-              </w:rPr>
-            </w:pPr>
-            <w:r>
-              <w:rPr>
-                <w:rFonts w:ascii="Calibri" w:eastAsia="Calibri" w:hAnsi="Calibri" w:cs="Calibri"/>
-              </w:rPr>
-              <w:t>VND2</w:t>
-            </w:r>
-            <w:bookmarkStart w:id="0" w:name="_GoBack"/>
-            <w:bookmarkEnd w:id="0"/>
-          </w:p>
-        </w:tc>
-        <w:tc>
-          <w:tcPr>
-            <w:tcW w:w="1745" w:type="dxa"/>
-            <w:tcBorders>
-              <w:top w:val="single" w:sz="4" w:space="0" w:color="000000"/>
-              <w:left w:val="single" w:sz="4" w:space="0" w:color="000000"/>
-              <w:bottom w:val="single" w:sz="4" w:space="0" w:color="000000"/>
-              <w:right w:val="single" w:sz="4" w:space="0" w:color="000000"/>
-            </w:tcBorders>
-            <w:shd w:val="clear" w:color="000000" w:fill="FFFFFF"/>
-            <w:tcMar>
-              <w:left w:w="108" w:type="dxa"/>
-              <w:right w:w="108" w:type="dxa"/>
-            </w:tcMar>
-          </w:tcPr>
-          <w:p>
-            <w:pPr>
-              <w:spacing w:after="0" w:line="240" w:lineRule="auto"/>
-              <w:jc w:val="center"/>
-              <w:rPr>
-                <w:rFonts w:ascii="Calibri" w:eastAsia="Calibri" w:hAnsi="Calibri" w:cs="Calibri"/>
-              </w:rPr>
-            </w:pPr>
-          </w:p>
-        </w:tc>
-        <w:tc>
-          <w:tcPr>
-            <w:tcW w:w="908" w:type="dxa"/>
-            <w:tcBorders>
-              <w:top w:val="single" w:sz="4" w:space="0" w:color="000000"/>
-              <w:left w:val="single" w:sz="4" w:space="0" w:color="000000"/>
-              <w:bottom w:val="single" w:sz="4" w:space="0" w:color="000000"/>
-              <w:right w:val="single" w:sz="4" w:space="0" w:color="000000"/>
-            </w:tcBorders>
-            <w:shd w:val="clear" w:color="000000" w:fill="FFFFFF"/>
-            <w:tcMar>
-              <w:left w:w="108" w:type="dxa"/>
-              <w:right w:w="108" w:type="dxa"/>
-            </w:tcMar>
-          </w:tcPr>
-          <w:p>
-            <w:pPr>
-              <w:spacing w:after="0" w:line="240" w:lineRule="auto"/>
-              <w:jc w:val="center"/>
-              <w:rPr>
-                <w:rFonts w:ascii="Calibri" w:eastAsia="Calibri" w:hAnsi="Calibri" w:cs="Calibri"/>
-              </w:rPr>
-            </w:pPr>
-            <w:r>
-              <w:rPr>
-                <w:rFonts w:ascii="Calibri" w:eastAsia="Calibri" w:hAnsi="Calibri" w:cs="Calibri"/>
-              </w:rPr>
-              <w:t>HLU</w:t>
-            </w:r>
-          </w:p>
-        </w:tc>
-        <w:tc>
-          <w:tcPr>
-            <w:tcW w:w="1363" w:type="dxa"/>
+            <w:tcW w:w="1810" w:type="dxa"/>
+            <w:tcBorders>
+              <w:top w:val="single" w:sz="4" w:space="0" w:color="000000"/>
+              <w:left w:val="single" w:sz="4" w:space="0" w:color="000000"/>
+              <w:bottom w:val="single" w:sz="4" w:space="0" w:color="000000"/>
+              <w:right w:val="single" w:sz="4" w:space="0" w:color="000000"/>
+            </w:tcBorders>
+            <w:shd w:val="clear" w:color="000000" w:fill="FFFFFF"/>
+            <w:tcMar>
+              <w:left w:w="108" w:type="dxa"/>
+              <w:right w:w="108" w:type="dxa"/>
+            </w:tcMar>
+          </w:tcPr>
+          <w:p>
+            <w:pPr>
+              <w:spacing w:after="0" w:line="240" w:lineRule="auto"/>
+              <w:jc w:val="center"/>
+              <w:rPr>
+                <w:rFonts w:ascii="Calibri" w:eastAsia="Calibri" w:hAnsi="Calibri" w:cs="Calibri"/>
+              </w:rPr>
+            </w:pPr>
+            <w:r>
+              <w:rPr>
+                <w:rFonts w:ascii="Calibri" w:eastAsia="Calibri" w:hAnsi="Calibri" w:cs="Calibri"/>
+              </w:rPr>
+              <w:t>DSFN</w:t>
+            </w:r>
+          </w:p>
+        </w:tc>
+        <w:tc>
+          <w:tcPr>
+            <w:tcW w:w="1387" w:type="dxa"/>
+            <w:tcBorders>
+              <w:top w:val="single" w:sz="4" w:space="0" w:color="000000"/>
+              <w:left w:val="single" w:sz="4" w:space="0" w:color="000000"/>
+              <w:bottom w:val="single" w:sz="4" w:space="0" w:color="000000"/>
+              <w:right w:val="single" w:sz="4" w:space="0" w:color="000000"/>
+            </w:tcBorders>
+            <w:shd w:val="clear" w:color="000000" w:fill="FFFFFF"/>
+            <w:tcMar>
+              <w:left w:w="108" w:type="dxa"/>
+              <w:right w:w="108" w:type="dxa"/>
+            </w:tcMar>
+          </w:tcPr>
+          <w:p>
+            <w:pPr>
+              <w:spacing w:after="0" w:line="240" w:lineRule="auto"/>
+              <w:jc w:val="center"/>
+              <w:rPr>
+                <w:rFonts w:ascii="Calibri" w:eastAsia="Calibri" w:hAnsi="Calibri" w:cs="Calibri"/>
+              </w:rPr>
+            </w:pPr>
+          </w:p>
+        </w:tc>
+        <w:tc>
+          <w:tcPr>
+            <w:tcW w:w="1180" w:type="dxa"/>
+            <w:tcBorders>
+              <w:top w:val="single" w:sz="4" w:space="0" w:color="000000"/>
+              <w:left w:val="single" w:sz="4" w:space="0" w:color="000000"/>
+              <w:bottom w:val="single" w:sz="4" w:space="0" w:color="000000"/>
+              <w:right w:val="single" w:sz="4" w:space="0" w:color="000000"/>
+            </w:tcBorders>
+            <w:shd w:val="clear" w:color="000000" w:fill="FFFFFF"/>
+            <w:tcMar>
+              <w:left w:w="108" w:type="dxa"/>
+              <w:right w:w="108" w:type="dxa"/>
+            </w:tcMar>
+          </w:tcPr>
+          <w:p>
+            <w:pPr>
+              <w:spacing w:after="0" w:line="240" w:lineRule="auto"/>
+              <w:jc w:val="center"/>
+              <w:rPr>
+                <w:rFonts w:ascii="Calibri" w:eastAsia="Calibri" w:hAnsi="Calibri" w:cs="Calibri"/>
+              </w:rPr>
+            </w:pPr>
+          </w:p>
+        </w:tc>
+        <w:tc>
+          <w:tcPr>
+            <w:tcW w:w="1168" w:type="dxa"/>
             <w:tcBorders>
               <w:top w:val="single" w:sz="4" w:space="0" w:color="000000"/>
               <w:left w:val="single" w:sz="4" w:space="0" w:color="000000"/>
@@ -6005,7 +5327,7 @@
       <w:tr>
         <w:tc>
           <w:tcPr>
-            <w:tcW w:w="774" w:type="dxa"/>
+            <w:tcW w:w="620" w:type="dxa"/>
             <w:tcBorders>
               <w:top w:val="single" w:sz="4" w:space="0" w:color="000000"/>
               <w:left w:val="single" w:sz="4" w:space="0" w:color="000000"/>
@@ -6038,7 +5360,7 @@
         </w:tc>
         <w:tc>
           <w:tcPr>
-            <w:tcW w:w="1555" w:type="dxa"/>
+            <w:tcW w:w="1414" w:type="dxa"/>
             <w:tcBorders>
               <w:top w:val="single" w:sz="4" w:space="0" w:color="000000"/>
               <w:left w:val="single" w:sz="4" w:space="0" w:color="000000"/>
@@ -6070,7 +5392,7 @@
         </w:tc>
         <w:tc>
           <w:tcPr>
-            <w:tcW w:w="1801" w:type="dxa"/>
+            <w:tcW w:w="1339" w:type="dxa"/>
             <w:tcBorders>
               <w:top w:val="single" w:sz="4" w:space="0" w:color="000000"/>
               <w:left w:val="single" w:sz="4" w:space="0" w:color="000000"/>
@@ -6102,94 +5424,88 @@
         </w:tc>
         <w:tc>
           <w:tcPr>
-            <w:tcW w:w="2993" w:type="dxa"/>
-            <w:tcBorders>
-              <w:top w:val="single" w:sz="4" w:space="0" w:color="000000"/>
-              <w:left w:val="single" w:sz="4" w:space="0" w:color="000000"/>
-              <w:bottom w:val="single" w:sz="4" w:space="0" w:color="000000"/>
-              <w:right w:val="single" w:sz="4" w:space="0" w:color="000000"/>
-            </w:tcBorders>
-            <w:shd w:val="clear" w:color="000000" w:fill="FFFFFF"/>
-            <w:tcMar>
-              <w:left w:w="108" w:type="dxa"/>
-              <w:right w:w="108" w:type="dxa"/>
-            </w:tcMar>
-          </w:tcPr>
-          <w:p>
-            <w:pPr>
-              <w:spacing w:after="0" w:line="240" w:lineRule="auto"/>
-              <w:jc w:val="center"/>
-              <w:rPr>
-                <w:rFonts w:ascii="Calibri" w:eastAsia="Calibri" w:hAnsi="Calibri" w:cs="Calibri"/>
-              </w:rPr>
-            </w:pPr>
-            <w:r>
-              <w:rPr>
-                <w:rFonts w:ascii="Calibri" w:eastAsia="Calibri" w:hAnsi="Calibri" w:cs="Calibri"/>
-              </w:rPr>
-              <w:t>SHP</w:t>
-            </w:r>
-          </w:p>
-        </w:tc>
-        <w:tc>
-          <w:tcPr>
-            <w:tcW w:w="1745" w:type="dxa"/>
-            <w:tcBorders>
-              <w:top w:val="single" w:sz="4" w:space="0" w:color="000000"/>
-              <w:left w:val="single" w:sz="4" w:space="0" w:color="000000"/>
-              <w:bottom w:val="single" w:sz="4" w:space="0" w:color="000000"/>
-              <w:right w:val="single" w:sz="4" w:space="0" w:color="000000"/>
-            </w:tcBorders>
-            <w:shd w:val="clear" w:color="000000" w:fill="FFFFFF"/>
-            <w:tcMar>
-              <w:left w:w="108" w:type="dxa"/>
-              <w:right w:w="108" w:type="dxa"/>
-            </w:tcMar>
-          </w:tcPr>
-          <w:p>
-            <w:pPr>
-              <w:spacing w:after="0" w:line="240" w:lineRule="auto"/>
-              <w:jc w:val="center"/>
-              <w:rPr>
-                <w:rFonts w:ascii="Calibri" w:eastAsia="Calibri" w:hAnsi="Calibri" w:cs="Calibri"/>
-              </w:rPr>
-            </w:pPr>
-          </w:p>
-        </w:tc>
-        <w:tc>
-          <w:tcPr>
-            <w:tcW w:w="908" w:type="dxa"/>
-            <w:tcBorders>
-              <w:top w:val="single" w:sz="4" w:space="0" w:color="000000"/>
-              <w:left w:val="single" w:sz="4" w:space="0" w:color="000000"/>
-              <w:bottom w:val="single" w:sz="4" w:space="0" w:color="000000"/>
-              <w:right w:val="single" w:sz="4" w:space="0" w:color="000000"/>
-            </w:tcBorders>
-            <w:shd w:val="clear" w:color="000000" w:fill="FFFFFF"/>
-            <w:tcMar>
-              <w:left w:w="108" w:type="dxa"/>
-              <w:right w:w="108" w:type="dxa"/>
-            </w:tcMar>
-          </w:tcPr>
-          <w:p>
-            <w:pPr>
-              <w:spacing w:after="0" w:line="240" w:lineRule="auto"/>
-              <w:jc w:val="center"/>
-              <w:rPr>
-                <w:rFonts w:ascii="Calibri" w:eastAsia="Calibri" w:hAnsi="Calibri" w:cs="Calibri"/>
-              </w:rPr>
-            </w:pPr>
-            <w:r>
-              <w:rPr>
-                <w:rFonts w:ascii="Calibri" w:eastAsia="Calibri" w:hAnsi="Calibri" w:cs="Calibri"/>
-              </w:rPr>
-              <w:t>HLH</w:t>
-            </w:r>
-          </w:p>
-        </w:tc>
-        <w:tc>
-          <w:tcPr>
-            <w:tcW w:w="1363" w:type="dxa"/>
+            <w:tcW w:w="1810" w:type="dxa"/>
+            <w:tcBorders>
+              <w:top w:val="single" w:sz="4" w:space="0" w:color="000000"/>
+              <w:left w:val="single" w:sz="4" w:space="0" w:color="000000"/>
+              <w:bottom w:val="single" w:sz="4" w:space="0" w:color="000000"/>
+              <w:right w:val="single" w:sz="4" w:space="0" w:color="000000"/>
+            </w:tcBorders>
+            <w:shd w:val="clear" w:color="000000" w:fill="FFFFFF"/>
+            <w:tcMar>
+              <w:left w:w="108" w:type="dxa"/>
+              <w:right w:w="108" w:type="dxa"/>
+            </w:tcMar>
+          </w:tcPr>
+          <w:p>
+            <w:pPr>
+              <w:spacing w:after="0" w:line="240" w:lineRule="auto"/>
+              <w:jc w:val="center"/>
+              <w:rPr>
+                <w:rFonts w:ascii="Calibri" w:eastAsia="Calibri" w:hAnsi="Calibri" w:cs="Calibri"/>
+              </w:rPr>
+            </w:pPr>
+            <w:r>
+              <w:rPr>
+                <w:rFonts w:ascii="Calibri" w:eastAsia="Calibri" w:hAnsi="Calibri" w:cs="Calibri"/>
+              </w:rPr>
+              <w:t>VND1</w:t>
+            </w:r>
+          </w:p>
+        </w:tc>
+        <w:tc>
+          <w:tcPr>
+            <w:tcW w:w="1387" w:type="dxa"/>
+            <w:tcBorders>
+              <w:top w:val="single" w:sz="4" w:space="0" w:color="000000"/>
+              <w:left w:val="single" w:sz="4" w:space="0" w:color="000000"/>
+              <w:bottom w:val="single" w:sz="4" w:space="0" w:color="000000"/>
+              <w:right w:val="single" w:sz="4" w:space="0" w:color="000000"/>
+            </w:tcBorders>
+            <w:shd w:val="clear" w:color="000000" w:fill="FFFFFF"/>
+            <w:tcMar>
+              <w:left w:w="108" w:type="dxa"/>
+              <w:right w:w="108" w:type="dxa"/>
+            </w:tcMar>
+          </w:tcPr>
+          <w:p>
+            <w:pPr>
+              <w:spacing w:after="0" w:line="240" w:lineRule="auto"/>
+              <w:jc w:val="center"/>
+              <w:rPr>
+                <w:rFonts w:ascii="Calibri" w:eastAsia="Calibri" w:hAnsi="Calibri" w:cs="Calibri"/>
+              </w:rPr>
+            </w:pPr>
+          </w:p>
+        </w:tc>
+        <w:tc>
+          <w:tcPr>
+            <w:tcW w:w="1180" w:type="dxa"/>
+            <w:tcBorders>
+              <w:top w:val="single" w:sz="4" w:space="0" w:color="000000"/>
+              <w:left w:val="single" w:sz="4" w:space="0" w:color="000000"/>
+              <w:bottom w:val="single" w:sz="4" w:space="0" w:color="000000"/>
+              <w:right w:val="single" w:sz="4" w:space="0" w:color="000000"/>
+            </w:tcBorders>
+            <w:shd w:val="clear" w:color="000000" w:fill="FFFFFF"/>
+            <w:tcMar>
+              <w:left w:w="108" w:type="dxa"/>
+              <w:right w:w="108" w:type="dxa"/>
+            </w:tcMar>
+          </w:tcPr>
+          <w:p>
+            <w:pPr>
+              <w:spacing w:after="0" w:line="240" w:lineRule="auto"/>
+              <w:jc w:val="center"/>
+              <w:rPr>
+                <w:rFonts w:ascii="Calibri" w:eastAsia="Calibri" w:hAnsi="Calibri" w:cs="Calibri"/>
+              </w:rPr>
+            </w:pPr>
+          </w:p>
+        </w:tc>
+        <w:tc>
+          <w:tcPr>
+            <w:tcW w:w="1168" w:type="dxa"/>
             <w:tcBorders>
               <w:top w:val="single" w:sz="4" w:space="0" w:color="000000"/>
               <w:left w:val="single" w:sz="4" w:space="0" w:color="000000"/>
@@ -6216,7 +5532,7 @@
       <w:tr>
         <w:tc>
           <w:tcPr>
-            <w:tcW w:w="774" w:type="dxa"/>
+            <w:tcW w:w="620" w:type="dxa"/>
             <w:tcBorders>
               <w:top w:val="single" w:sz="4" w:space="0" w:color="000000"/>
               <w:left w:val="single" w:sz="4" w:space="0" w:color="000000"/>
@@ -6249,7 +5565,7 @@
         </w:tc>
         <w:tc>
           <w:tcPr>
-            <w:tcW w:w="1555" w:type="dxa"/>
+            <w:tcW w:w="1414" w:type="dxa"/>
             <w:tcBorders>
               <w:top w:val="single" w:sz="4" w:space="0" w:color="000000"/>
               <w:left w:val="single" w:sz="4" w:space="0" w:color="000000"/>
@@ -6281,39 +5597,46 @@
         </w:tc>
         <w:tc>
           <w:tcPr>
-            <w:tcW w:w="1801" w:type="dxa"/>
-            <w:tcBorders>
-              <w:top w:val="single" w:sz="4" w:space="0" w:color="000000"/>
-              <w:left w:val="single" w:sz="4" w:space="0" w:color="000000"/>
-              <w:bottom w:val="single" w:sz="4" w:space="0" w:color="000000"/>
-              <w:right w:val="single" w:sz="4" w:space="0" w:color="000000"/>
-            </w:tcBorders>
-            <w:shd w:val="clear" w:color="000000" w:fill="FFFFFF"/>
-            <w:tcMar>
-              <w:left w:w="108" w:type="dxa"/>
-              <w:right w:w="108" w:type="dxa"/>
-            </w:tcMar>
-          </w:tcPr>
-          <w:p>
-            <w:pPr>
-              <w:spacing w:after="0" w:line="240" w:lineRule="auto"/>
-              <w:jc w:val="center"/>
-              <w:rPr>
-                <w:rFonts w:ascii="Calibri" w:eastAsia="Calibri" w:hAnsi="Calibri" w:cs="Calibri"/>
-              </w:rPr>
-            </w:pPr>
-            <w:r>
-              <w:rPr>
-                <w:rFonts w:ascii="Calibri" w:eastAsia="Calibri" w:hAnsi="Calibri" w:cs="Calibri"/>
-                <w:sz w:val="24"/>
-              </w:rPr>
-              <w:t>13:00</w:t>
-            </w:r>
-          </w:p>
-        </w:tc>
-        <w:tc>
-          <w:tcPr>
-            <w:tcW w:w="2993" w:type="dxa"/>
+            <w:tcW w:w="1339" w:type="dxa"/>
+            <w:tcBorders>
+              <w:top w:val="single" w:sz="4" w:space="0" w:color="000000"/>
+              <w:left w:val="single" w:sz="4" w:space="0" w:color="000000"/>
+              <w:bottom w:val="single" w:sz="4" w:space="0" w:color="000000"/>
+              <w:right w:val="single" w:sz="4" w:space="0" w:color="000000"/>
+            </w:tcBorders>
+            <w:shd w:val="clear" w:color="000000" w:fill="FFFFFF"/>
+            <w:tcMar>
+              <w:left w:w="108" w:type="dxa"/>
+              <w:right w:w="108" w:type="dxa"/>
+            </w:tcMar>
+          </w:tcPr>
+          <w:p>
+            <w:pPr>
+              <w:spacing w:after="0" w:line="240" w:lineRule="auto"/>
+              <w:jc w:val="center"/>
+              <w:rPr>
+                <w:rFonts w:ascii="Calibri" w:eastAsia="Calibri" w:hAnsi="Calibri" w:cs="Calibri"/>
+              </w:rPr>
+            </w:pPr>
+            <w:r>
+              <w:rPr>
+                <w:rFonts w:ascii="Calibri" w:eastAsia="Calibri" w:hAnsi="Calibri" w:cs="Calibri"/>
+                <w:sz w:val="24"/>
+              </w:rPr>
+              <w:t>11:3</w:t>
+            </w:r>
+            <w:r>
+              <w:rPr>
+                <w:rFonts w:ascii="Calibri" w:eastAsia="Calibri" w:hAnsi="Calibri" w:cs="Calibri"/>
+                <w:sz w:val="24"/>
+              </w:rPr>
+              <w:t>0</w:t>
+            </w:r>
+          </w:p>
+        </w:tc>
+        <w:tc>
+          <w:tcPr>
+            <w:tcW w:w="1810" w:type="dxa"/>
             <w:tcBorders>
               <w:top w:val="single" w:sz="4" w:space="0" w:color="000000"/>
               <w:left w:val="single" w:sz="4" w:space="0" w:color="000000"/>
@@ -6338,65 +5661,76 @@
             <w:r>
               <w:rPr>
                 <w:rFonts w:ascii="Calibri" w:eastAsia="Calibri" w:hAnsi="Calibri" w:cs="Calibri"/>
-                <w:b/>
-              </w:rPr>
-              <w:t>NA</w:t>
-            </w:r>
-          </w:p>
-        </w:tc>
-        <w:tc>
-          <w:tcPr>
-            <w:tcW w:w="1745" w:type="dxa"/>
-            <w:tcBorders>
-              <w:top w:val="single" w:sz="4" w:space="0" w:color="000000"/>
-              <w:left w:val="single" w:sz="4" w:space="0" w:color="000000"/>
-              <w:bottom w:val="single" w:sz="4" w:space="0" w:color="000000"/>
-              <w:right w:val="single" w:sz="4" w:space="0" w:color="000000"/>
-            </w:tcBorders>
-            <w:shd w:val="clear" w:color="000000" w:fill="FFFFFF"/>
-            <w:tcMar>
-              <w:left w:w="108" w:type="dxa"/>
-              <w:right w:w="108" w:type="dxa"/>
-            </w:tcMar>
-          </w:tcPr>
-          <w:p>
-            <w:pPr>
-              <w:spacing w:after="0" w:line="240" w:lineRule="auto"/>
-              <w:jc w:val="center"/>
-              <w:rPr>
-                <w:rFonts w:ascii="Calibri" w:eastAsia="Calibri" w:hAnsi="Calibri" w:cs="Calibri"/>
-              </w:rPr>
-            </w:pPr>
-          </w:p>
-        </w:tc>
-        <w:tc>
-          <w:tcPr>
-            <w:tcW w:w="908" w:type="dxa"/>
-            <w:tcBorders>
-              <w:top w:val="single" w:sz="4" w:space="0" w:color="000000"/>
-              <w:left w:val="single" w:sz="4" w:space="0" w:color="000000"/>
-              <w:bottom w:val="single" w:sz="4" w:space="0" w:color="000000"/>
-              <w:right w:val="single" w:sz="4" w:space="0" w:color="000000"/>
-            </w:tcBorders>
-            <w:shd w:val="clear" w:color="000000" w:fill="FFFFFF"/>
-            <w:tcMar>
-              <w:left w:w="108" w:type="dxa"/>
-              <w:right w:w="108" w:type="dxa"/>
-            </w:tcMar>
-          </w:tcPr>
-          <w:p>
-            <w:pPr>
-              <w:spacing w:after="0" w:line="240" w:lineRule="auto"/>
-              <w:jc w:val="center"/>
-              <w:rPr>
-                <w:rFonts w:ascii="Calibri" w:eastAsia="Calibri" w:hAnsi="Calibri" w:cs="Calibri"/>
-              </w:rPr>
-            </w:pPr>
-          </w:p>
-        </w:tc>
-        <w:tc>
-          <w:tcPr>
-            <w:tcW w:w="1363" w:type="dxa"/>
+              </w:rPr>
+              <w:t>NF</w:t>
+            </w:r>
+            <w:r>
+              <w:rPr>
+                <w:rFonts w:ascii="Calibri" w:eastAsia="Calibri" w:hAnsi="Calibri" w:cs="Calibri"/>
+              </w:rPr>
+              <w:t xml:space="preserve"> </w:t>
+            </w:r>
+            <w:r>
+              <w:rPr>
+                <w:rFonts w:ascii="Calibri" w:eastAsia="Calibri" w:hAnsi="Calibri" w:cs="Calibri"/>
+              </w:rPr>
+              <w:t xml:space="preserve"> SPL</w:t>
+            </w:r>
+          </w:p>
+        </w:tc>
+        <w:tc>
+          <w:tcPr>
+            <w:tcW w:w="1387" w:type="dxa"/>
+            <w:tcBorders>
+              <w:top w:val="single" w:sz="4" w:space="0" w:color="000000"/>
+              <w:left w:val="single" w:sz="4" w:space="0" w:color="000000"/>
+              <w:bottom w:val="single" w:sz="4" w:space="0" w:color="000000"/>
+              <w:right w:val="single" w:sz="4" w:space="0" w:color="000000"/>
+            </w:tcBorders>
+            <w:shd w:val="clear" w:color="000000" w:fill="FFFFFF"/>
+            <w:tcMar>
+              <w:left w:w="108" w:type="dxa"/>
+              <w:right w:w="108" w:type="dxa"/>
+            </w:tcMar>
+          </w:tcPr>
+          <w:p>
+            <w:pPr>
+              <w:spacing w:after="0" w:line="240" w:lineRule="auto"/>
+              <w:jc w:val="center"/>
+              <w:rPr>
+                <w:rFonts w:ascii="Calibri" w:eastAsia="Calibri" w:hAnsi="Calibri" w:cs="Calibri"/>
+              </w:rPr>
+            </w:pPr>
+          </w:p>
+        </w:tc>
+        <w:tc>
+          <w:tcPr>
+            <w:tcW w:w="1180" w:type="dxa"/>
+            <w:tcBorders>
+              <w:top w:val="single" w:sz="4" w:space="0" w:color="000000"/>
+              <w:left w:val="single" w:sz="4" w:space="0" w:color="000000"/>
+              <w:bottom w:val="single" w:sz="4" w:space="0" w:color="000000"/>
+              <w:right w:val="single" w:sz="4" w:space="0" w:color="000000"/>
+            </w:tcBorders>
+            <w:shd w:val="clear" w:color="000000" w:fill="FFFFFF"/>
+            <w:tcMar>
+              <w:left w:w="108" w:type="dxa"/>
+              <w:right w:w="108" w:type="dxa"/>
+            </w:tcMar>
+          </w:tcPr>
+          <w:p>
+            <w:pPr>
+              <w:spacing w:after="0" w:line="240" w:lineRule="auto"/>
+              <w:jc w:val="center"/>
+              <w:rPr>
+                <w:rFonts w:ascii="Calibri" w:eastAsia="Calibri" w:hAnsi="Calibri" w:cs="Calibri"/>
+              </w:rPr>
+            </w:pPr>
+          </w:p>
+        </w:tc>
+        <w:tc>
+          <w:tcPr>
+            <w:tcW w:w="1168" w:type="dxa"/>
             <w:tcBorders>
               <w:top w:val="single" w:sz="4" w:space="0" w:color="000000"/>
               <w:left w:val="single" w:sz="4" w:space="0" w:color="000000"/>
@@ -6423,7 +5757,7 @@
       <w:tr>
         <w:tc>
           <w:tcPr>
-            <w:tcW w:w="11139" w:type="dxa"/>
+            <w:tcW w:w="8918" w:type="dxa"/>
             <w:gridSpan w:val="7"/>
             <w:tcBorders>
               <w:top w:val="single" w:sz="4" w:space="0" w:color="000000"/>
@@ -6467,22 +5801,21 @@
                 <w:rFonts w:ascii="Calibri" w:eastAsia="Calibri" w:hAnsi="Calibri" w:cs="Calibri"/>
                 <w:sz w:val="24"/>
               </w:rPr>
-              <w:t>CHTR</w:t>
-            </w:r>
-            <w:r>
-              <w:rPr>
-                <w:rFonts w:ascii="Calibri" w:eastAsia="Calibri" w:hAnsi="Calibri" w:cs="Calibri"/>
-                <w:b/>
-                <w:sz w:val="24"/>
-              </w:rPr>
-              <w:t>,</w:t>
-            </w:r>
-            <w:r>
-              <w:rPr>
-                <w:rFonts w:ascii="Calibri" w:eastAsia="Calibri" w:hAnsi="Calibri" w:cs="Calibri"/>
-                <w:sz w:val="24"/>
-              </w:rPr>
-              <w:t>DSFN,SCHAL</w:t>
+              <w:t>SCHAL</w:t>
+            </w:r>
+            <w:r>
+              <w:rPr>
+                <w:rFonts w:ascii="Calibri" w:eastAsia="Calibri" w:hAnsi="Calibri" w:cs="Calibri"/>
+                <w:sz w:val="24"/>
+              </w:rPr>
+              <w:t>,ADM9,</w:t>
+            </w:r>
+            <w:r>
+              <w:rPr>
+                <w:rFonts w:ascii="Calibri" w:eastAsia="Calibri" w:hAnsi="Calibri" w:cs="Calibri"/>
+                <w:sz w:val="24"/>
+              </w:rPr>
+              <w:t>JXLR</w:t>
             </w:r>
           </w:p>
         </w:tc>
@@ -6566,10 +5899,10 @@
       </w:pPr>
       <w:r>
         <w:object w:dxaOrig="1188" w:dyaOrig="900">
-          <v:rect id="_x0000_i1025" style="width:59.85pt;height:44.6pt" o:ole="" o:preferrelative="t" stroked="f">
+          <v:rect id="_x0000_i1025" style="width:60pt;height:44.25pt" o:ole="" o:preferrelative="t" stroked="f">
             <v:imagedata r:id="rId5" o:title=""/>
           </v:rect>
-          <o:OLEObject Type="Embed" ProgID="StaticMetafile" ShapeID="_x0000_i1025" DrawAspect="Content" ObjectID="_1848664853" r:id="rId6"/>
+          <o:OLEObject Type="Embed" ProgID="StaticMetafile" ShapeID="_x0000_i1025" DrawAspect="Content" ObjectID="_1848749834" r:id="rId6"/>
         </w:object>
       </w:r>
     </w:p>
@@ -7105,7 +6438,7 @@
                 <w:sz w:val="24"/>
                 <w:szCs w:val="24"/>
               </w:rPr>
-              <w:t>TCPP CC +PROD</w:t>
+              <w:t>JIND</w:t>
             </w:r>
           </w:p>
         </w:tc>
@@ -7526,6 +6859,12 @@
                 <w:rFonts w:ascii="Calibri" w:eastAsia="Calibri" w:hAnsi="Calibri" w:cs="Calibri"/>
               </w:rPr>
             </w:pPr>
+            <w:r>
+              <w:rPr>
+                <w:rFonts w:ascii="Calibri" w:eastAsia="Calibri" w:hAnsi="Calibri" w:cs="Calibri"/>
+              </w:rPr>
+              <w:t>FERRY TO JJ</w:t>
+            </w:r>
           </w:p>
         </w:tc>
         <w:tc>
@@ -7574,12 +6913,15 @@
               <w:jc w:val="center"/>
               <w:rPr>
                 <w:rFonts w:ascii="Calibri" w:eastAsia="Calibri" w:hAnsi="Calibri" w:cs="Calibri"/>
-              </w:rPr>
-            </w:pPr>
-            <w:r>
-              <w:rPr>
-                <w:rFonts w:ascii="Calibri" w:eastAsia="Calibri" w:hAnsi="Calibri" w:cs="Calibri"/>
-                <w:sz w:val="30"/>
+                <w:sz w:val="28"/>
+                <w:szCs w:val="28"/>
+              </w:rPr>
+            </w:pPr>
+            <w:r>
+              <w:rPr>
+                <w:rFonts w:ascii="Calibri" w:eastAsia="Calibri" w:hAnsi="Calibri" w:cs="Calibri"/>
+                <w:sz w:val="28"/>
+                <w:szCs w:val="28"/>
               </w:rPr>
               <w:t>RRI</w:t>
             </w:r>
@@ -7781,13 +7123,6 @@
                 <w:rFonts w:ascii="Calibri" w:eastAsia="Calibri" w:hAnsi="Calibri" w:cs="Calibri"/>
               </w:rPr>
             </w:pPr>
-            <w:r>
-              <w:rPr>
-                <w:rFonts w:ascii="Calibri" w:eastAsia="Calibri" w:hAnsi="Calibri" w:cs="Calibri"/>
-                <w:sz w:val="30"/>
-              </w:rPr>
-              <w:t>RRI</w:t>
-            </w:r>
           </w:p>
         </w:tc>
         <w:tc>

</xml_diff>

<commit_message>
Sync - 2026-08-20 18:12
</commit_message>
<xml_diff>
--- a/files/Daily_Helicopter_Schedule.docx
+++ b/files/Daily_Helicopter_Schedule.docx
@@ -4615,60 +4615,60 @@
               <w:rPr>
                 <w:rFonts w:ascii="Calibri" w:eastAsia="Calibri" w:hAnsi="Calibri" w:cs="Calibri"/>
               </w:rPr>
-              <w:t>VIR-1</w:t>
-            </w:r>
-          </w:p>
-        </w:tc>
-        <w:tc>
-          <w:tcPr>
-            <w:tcW w:w="1387" w:type="dxa"/>
-            <w:tcBorders>
-              <w:top w:val="single" w:sz="4" w:space="0" w:color="000000"/>
-              <w:left w:val="single" w:sz="4" w:space="0" w:color="000000"/>
-              <w:bottom w:val="single" w:sz="4" w:space="0" w:color="000000"/>
-              <w:right w:val="single" w:sz="4" w:space="0" w:color="000000"/>
-            </w:tcBorders>
-            <w:shd w:val="clear" w:color="000000" w:fill="FFFFFF"/>
-            <w:tcMar>
-              <w:left w:w="108" w:type="dxa"/>
-              <w:right w:w="108" w:type="dxa"/>
-            </w:tcMar>
-          </w:tcPr>
-          <w:p>
-            <w:pPr>
-              <w:spacing w:after="0" w:line="240" w:lineRule="auto"/>
-              <w:jc w:val="center"/>
-              <w:rPr>
-                <w:rFonts w:ascii="Calibri" w:eastAsia="Calibri" w:hAnsi="Calibri" w:cs="Calibri"/>
-              </w:rPr>
-            </w:pPr>
-          </w:p>
-        </w:tc>
-        <w:tc>
-          <w:tcPr>
-            <w:tcW w:w="1180" w:type="dxa"/>
-            <w:tcBorders>
-              <w:top w:val="single" w:sz="4" w:space="0" w:color="000000"/>
-              <w:left w:val="single" w:sz="4" w:space="0" w:color="000000"/>
-              <w:bottom w:val="single" w:sz="4" w:space="0" w:color="000000"/>
-              <w:right w:val="single" w:sz="4" w:space="0" w:color="000000"/>
-            </w:tcBorders>
-            <w:shd w:val="clear" w:color="000000" w:fill="FFFFFF"/>
-            <w:tcMar>
-              <w:left w:w="108" w:type="dxa"/>
-              <w:right w:w="108" w:type="dxa"/>
-            </w:tcMar>
-          </w:tcPr>
-          <w:p>
-            <w:pPr>
-              <w:spacing w:after="0" w:line="240" w:lineRule="auto"/>
-              <w:jc w:val="center"/>
-              <w:rPr>
-                <w:rFonts w:ascii="Calibri" w:eastAsia="Calibri" w:hAnsi="Calibri" w:cs="Calibri"/>
-              </w:rPr>
-            </w:pPr>
+              <w:t>JXLR</w:t>
+            </w:r>
             <w:bookmarkStart w:id="0" w:name="_GoBack"/>
             <w:bookmarkEnd w:id="0"/>
+          </w:p>
+        </w:tc>
+        <w:tc>
+          <w:tcPr>
+            <w:tcW w:w="1387" w:type="dxa"/>
+            <w:tcBorders>
+              <w:top w:val="single" w:sz="4" w:space="0" w:color="000000"/>
+              <w:left w:val="single" w:sz="4" w:space="0" w:color="000000"/>
+              <w:bottom w:val="single" w:sz="4" w:space="0" w:color="000000"/>
+              <w:right w:val="single" w:sz="4" w:space="0" w:color="000000"/>
+            </w:tcBorders>
+            <w:shd w:val="clear" w:color="000000" w:fill="FFFFFF"/>
+            <w:tcMar>
+              <w:left w:w="108" w:type="dxa"/>
+              <w:right w:w="108" w:type="dxa"/>
+            </w:tcMar>
+          </w:tcPr>
+          <w:p>
+            <w:pPr>
+              <w:spacing w:after="0" w:line="240" w:lineRule="auto"/>
+              <w:jc w:val="center"/>
+              <w:rPr>
+                <w:rFonts w:ascii="Calibri" w:eastAsia="Calibri" w:hAnsi="Calibri" w:cs="Calibri"/>
+              </w:rPr>
+            </w:pPr>
+          </w:p>
+        </w:tc>
+        <w:tc>
+          <w:tcPr>
+            <w:tcW w:w="1180" w:type="dxa"/>
+            <w:tcBorders>
+              <w:top w:val="single" w:sz="4" w:space="0" w:color="000000"/>
+              <w:left w:val="single" w:sz="4" w:space="0" w:color="000000"/>
+              <w:bottom w:val="single" w:sz="4" w:space="0" w:color="000000"/>
+              <w:right w:val="single" w:sz="4" w:space="0" w:color="000000"/>
+            </w:tcBorders>
+            <w:shd w:val="clear" w:color="000000" w:fill="FFFFFF"/>
+            <w:tcMar>
+              <w:left w:w="108" w:type="dxa"/>
+              <w:right w:w="108" w:type="dxa"/>
+            </w:tcMar>
+          </w:tcPr>
+          <w:p>
+            <w:pPr>
+              <w:spacing w:after="0" w:line="240" w:lineRule="auto"/>
+              <w:jc w:val="center"/>
+              <w:rPr>
+                <w:rFonts w:ascii="Calibri" w:eastAsia="Calibri" w:hAnsi="Calibri" w:cs="Calibri"/>
+              </w:rPr>
+            </w:pPr>
           </w:p>
         </w:tc>
         <w:tc>
@@ -5902,7 +5902,7 @@
           <v:rect id="_x0000_i1025" style="width:60pt;height:44.25pt" o:ole="" o:preferrelative="t" stroked="f">
             <v:imagedata r:id="rId5" o:title=""/>
           </v:rect>
-          <o:OLEObject Type="Embed" ProgID="StaticMetafile" ShapeID="_x0000_i1025" DrawAspect="Content" ObjectID="_1848749834" r:id="rId6"/>
+          <o:OLEObject Type="Embed" ProgID="StaticMetafile" ShapeID="_x0000_i1025" DrawAspect="Content" ObjectID="_1848753080" r:id="rId6"/>
         </w:object>
       </w:r>
     </w:p>

</xml_diff>

<commit_message>
Sync - 2026-08-21 15:45
</commit_message>
<xml_diff>
--- a/files/Daily_Helicopter_Schedule.docx
+++ b/files/Daily_Helicopter_Schedule.docx
@@ -35,7 +35,7 @@
           <w:b/>
           <w:color w:val="000000" w:themeColor="text1"/>
         </w:rPr>
-        <w:t>21</w:t>
+        <w:t>22</w:t>
       </w:r>
       <w:r>
         <w:rPr>
@@ -59,7 +59,7 @@
           <w:b/>
           <w:color w:val="000000" w:themeColor="text1"/>
         </w:rPr>
-        <w:t>FRI</w:t>
+        <w:t>SATUR</w:t>
       </w:r>
       <w:r>
         <w:rPr>
@@ -718,7 +718,7 @@
               <w:rPr>
                 <w:rFonts w:ascii="Calibri" w:eastAsia="Calibri" w:hAnsi="Calibri" w:cs="Calibri"/>
               </w:rPr>
-              <w:t>GVHL 412</w:t>
+              <w:t>GVHL 169</w:t>
             </w:r>
           </w:p>
         </w:tc>
@@ -749,7 +749,7 @@
               <w:rPr>
                 <w:rFonts w:ascii="Calibri" w:eastAsia="Calibri" w:hAnsi="Calibri" w:cs="Calibri"/>
               </w:rPr>
-              <w:t>GVT</w:t>
+              <w:t>RRK</w:t>
             </w:r>
           </w:p>
         </w:tc>
@@ -780,7 +780,7 @@
               <w:rPr>
                 <w:rFonts w:ascii="Calibri" w:eastAsia="Calibri" w:hAnsi="Calibri" w:cs="Calibri"/>
               </w:rPr>
-              <w:t>08</w:t>
+              <w:t>06</w:t>
             </w:r>
           </w:p>
         </w:tc>
@@ -942,7 +942,7 @@
                 <w:rFonts w:ascii="Calibri" w:eastAsia="Calibri" w:hAnsi="Calibri" w:cs="Calibri"/>
                 <w:sz w:val="24"/>
               </w:rPr>
-              <w:t>GVHL169</w:t>
+              <w:t>GVHL412</w:t>
             </w:r>
           </w:p>
         </w:tc>
@@ -974,7 +974,7 @@
                 <w:rFonts w:ascii="Calibri" w:eastAsia="Calibri" w:hAnsi="Calibri" w:cs="Calibri"/>
                 <w:sz w:val="24"/>
               </w:rPr>
-              <w:t>RRK</w:t>
+              <w:t>GVT</w:t>
             </w:r>
           </w:p>
         </w:tc>
@@ -1006,7 +1006,7 @@
                 <w:rFonts w:ascii="Calibri" w:eastAsia="Calibri" w:hAnsi="Calibri" w:cs="Calibri"/>
                 <w:sz w:val="24"/>
               </w:rPr>
-              <w:t>05</w:t>
+              <w:t>08</w:t>
             </w:r>
           </w:p>
         </w:tc>
@@ -1136,7 +1136,7 @@
                 <w:rFonts w:ascii="Calibri" w:eastAsia="Calibri" w:hAnsi="Calibri" w:cs="Calibri"/>
                 <w:sz w:val="24"/>
               </w:rPr>
-              <w:t>SF(D)+NF(D)</w:t>
+              <w:t>SF(D)</w:t>
             </w:r>
           </w:p>
         </w:tc>
@@ -1225,6 +1225,239 @@
               <w:jc w:val="center"/>
               <w:rPr>
                 <w:rFonts w:ascii="Calibri" w:eastAsia="Calibri" w:hAnsi="Calibri" w:cs="Calibri"/>
+              </w:rPr>
+            </w:pPr>
+            <w:r>
+              <w:rPr>
+                <w:rFonts w:ascii="Calibri" w:eastAsia="Calibri" w:hAnsi="Calibri" w:cs="Calibri"/>
+                <w:sz w:val="24"/>
+              </w:rPr>
+              <w:t>05</w:t>
+            </w:r>
+          </w:p>
+        </w:tc>
+      </w:tr>
+      <w:tr>
+        <w:tc>
+          <w:tcPr>
+            <w:tcW w:w="620" w:type="dxa"/>
+            <w:tcBorders>
+              <w:top w:val="single" w:sz="4" w:space="0" w:color="000000"/>
+              <w:left w:val="single" w:sz="4" w:space="0" w:color="000000"/>
+              <w:bottom w:val="single" w:sz="4" w:space="0" w:color="000000"/>
+              <w:right w:val="single" w:sz="4" w:space="0" w:color="000000"/>
+            </w:tcBorders>
+            <w:shd w:val="clear" w:color="auto" w:fill="auto"/>
+            <w:tcMar>
+              <w:left w:w="108" w:type="dxa"/>
+              <w:right w:w="108" w:type="dxa"/>
+            </w:tcMar>
+          </w:tcPr>
+          <w:p>
+            <w:pPr>
+              <w:spacing w:after="0" w:line="240" w:lineRule="auto"/>
+              <w:jc w:val="center"/>
+              <w:rPr>
+                <w:rFonts w:ascii="Calibri" w:eastAsia="Calibri" w:hAnsi="Calibri" w:cs="Calibri"/>
+                <w:sz w:val="24"/>
+              </w:rPr>
+            </w:pPr>
+            <w:r>
+              <w:rPr>
+                <w:rFonts w:ascii="Calibri" w:eastAsia="Calibri" w:hAnsi="Calibri" w:cs="Calibri"/>
+                <w:sz w:val="24"/>
+              </w:rPr>
+              <w:t>4</w:t>
+            </w:r>
+          </w:p>
+        </w:tc>
+        <w:tc>
+          <w:tcPr>
+            <w:tcW w:w="1414" w:type="dxa"/>
+            <w:tcBorders>
+              <w:top w:val="single" w:sz="4" w:space="0" w:color="000000"/>
+              <w:left w:val="single" w:sz="4" w:space="0" w:color="000000"/>
+              <w:bottom w:val="single" w:sz="4" w:space="0" w:color="000000"/>
+              <w:right w:val="single" w:sz="4" w:space="0" w:color="000000"/>
+            </w:tcBorders>
+            <w:shd w:val="clear" w:color="auto" w:fill="auto"/>
+            <w:tcMar>
+              <w:left w:w="108" w:type="dxa"/>
+              <w:right w:w="108" w:type="dxa"/>
+            </w:tcMar>
+          </w:tcPr>
+          <w:p>
+            <w:pPr>
+              <w:spacing w:after="0" w:line="240" w:lineRule="auto"/>
+              <w:jc w:val="center"/>
+              <w:rPr>
+                <w:rFonts w:ascii="Calibri" w:eastAsia="Calibri" w:hAnsi="Calibri" w:cs="Calibri"/>
+                <w:sz w:val="24"/>
+              </w:rPr>
+            </w:pPr>
+            <w:r>
+              <w:rPr>
+                <w:rFonts w:ascii="Calibri" w:eastAsia="Calibri" w:hAnsi="Calibri" w:cs="Calibri"/>
+                <w:sz w:val="24"/>
+              </w:rPr>
+              <w:t>06:30</w:t>
+            </w:r>
+          </w:p>
+        </w:tc>
+        <w:tc>
+          <w:tcPr>
+            <w:tcW w:w="1339" w:type="dxa"/>
+            <w:tcBorders>
+              <w:top w:val="single" w:sz="4" w:space="0" w:color="000000"/>
+              <w:left w:val="single" w:sz="4" w:space="0" w:color="000000"/>
+              <w:bottom w:val="single" w:sz="4" w:space="0" w:color="000000"/>
+              <w:right w:val="single" w:sz="4" w:space="0" w:color="000000"/>
+            </w:tcBorders>
+            <w:shd w:val="clear" w:color="auto" w:fill="auto"/>
+            <w:tcMar>
+              <w:left w:w="108" w:type="dxa"/>
+              <w:right w:w="108" w:type="dxa"/>
+            </w:tcMar>
+          </w:tcPr>
+          <w:p>
+            <w:pPr>
+              <w:spacing w:after="0" w:line="240" w:lineRule="auto"/>
+              <w:jc w:val="center"/>
+              <w:rPr>
+                <w:rFonts w:ascii="Calibri" w:eastAsia="Calibri" w:hAnsi="Calibri" w:cs="Calibri"/>
+                <w:sz w:val="24"/>
+              </w:rPr>
+            </w:pPr>
+            <w:r>
+              <w:rPr>
+                <w:rFonts w:ascii="Calibri" w:eastAsia="Calibri" w:hAnsi="Calibri" w:cs="Calibri"/>
+                <w:sz w:val="24"/>
+              </w:rPr>
+              <w:t>08:20</w:t>
+            </w:r>
+          </w:p>
+        </w:tc>
+        <w:tc>
+          <w:tcPr>
+            <w:tcW w:w="1810" w:type="dxa"/>
+            <w:tcBorders>
+              <w:top w:val="single" w:sz="4" w:space="0" w:color="000000"/>
+              <w:left w:val="single" w:sz="4" w:space="0" w:color="000000"/>
+              <w:bottom w:val="single" w:sz="4" w:space="0" w:color="000000"/>
+              <w:right w:val="single" w:sz="4" w:space="0" w:color="000000"/>
+            </w:tcBorders>
+            <w:shd w:val="clear" w:color="auto" w:fill="auto"/>
+            <w:tcMar>
+              <w:left w:w="108" w:type="dxa"/>
+              <w:right w:w="108" w:type="dxa"/>
+            </w:tcMar>
+          </w:tcPr>
+          <w:p>
+            <w:pPr>
+              <w:spacing w:after="0" w:line="240" w:lineRule="auto"/>
+              <w:jc w:val="center"/>
+              <w:rPr>
+                <w:rFonts w:ascii="Calibri" w:eastAsia="Calibri" w:hAnsi="Calibri" w:cs="Calibri"/>
+                <w:sz w:val="24"/>
+              </w:rPr>
+            </w:pPr>
+            <w:r>
+              <w:rPr>
+                <w:rFonts w:ascii="Calibri" w:eastAsia="Calibri" w:hAnsi="Calibri" w:cs="Calibri"/>
+                <w:sz w:val="24"/>
+              </w:rPr>
+              <w:t>NF[D]</w:t>
+            </w:r>
+          </w:p>
+        </w:tc>
+        <w:tc>
+          <w:tcPr>
+            <w:tcW w:w="1387" w:type="dxa"/>
+            <w:tcBorders>
+              <w:top w:val="single" w:sz="4" w:space="0" w:color="000000"/>
+              <w:left w:val="single" w:sz="4" w:space="0" w:color="000000"/>
+              <w:bottom w:val="single" w:sz="4" w:space="0" w:color="000000"/>
+              <w:right w:val="single" w:sz="4" w:space="0" w:color="000000"/>
+            </w:tcBorders>
+            <w:shd w:val="clear" w:color="000000" w:fill="FFFFFF"/>
+            <w:tcMar>
+              <w:left w:w="108" w:type="dxa"/>
+              <w:right w:w="108" w:type="dxa"/>
+            </w:tcMar>
+          </w:tcPr>
+          <w:p>
+            <w:pPr>
+              <w:spacing w:after="0" w:line="240" w:lineRule="auto"/>
+              <w:jc w:val="center"/>
+              <w:rPr>
+                <w:rFonts w:ascii="Calibri" w:eastAsia="Calibri" w:hAnsi="Calibri" w:cs="Calibri"/>
+                <w:sz w:val="24"/>
+              </w:rPr>
+            </w:pPr>
+            <w:r>
+              <w:rPr>
+                <w:rFonts w:ascii="Calibri" w:eastAsia="Calibri" w:hAnsi="Calibri" w:cs="Calibri"/>
+                <w:sz w:val="24"/>
+              </w:rPr>
+              <w:t>GVHL 169</w:t>
+            </w:r>
+          </w:p>
+        </w:tc>
+        <w:tc>
+          <w:tcPr>
+            <w:tcW w:w="1180" w:type="dxa"/>
+            <w:tcBorders>
+              <w:top w:val="single" w:sz="4" w:space="0" w:color="000000"/>
+              <w:left w:val="single" w:sz="4" w:space="0" w:color="000000"/>
+              <w:bottom w:val="single" w:sz="4" w:space="0" w:color="000000"/>
+              <w:right w:val="single" w:sz="4" w:space="0" w:color="000000"/>
+            </w:tcBorders>
+            <w:shd w:val="clear" w:color="000000" w:fill="FFFFFF"/>
+            <w:tcMar>
+              <w:left w:w="108" w:type="dxa"/>
+              <w:right w:w="108" w:type="dxa"/>
+            </w:tcMar>
+          </w:tcPr>
+          <w:p>
+            <w:pPr>
+              <w:spacing w:after="0" w:line="240" w:lineRule="auto"/>
+              <w:jc w:val="center"/>
+              <w:rPr>
+                <w:rFonts w:ascii="Calibri" w:eastAsia="Calibri" w:hAnsi="Calibri" w:cs="Calibri"/>
+                <w:sz w:val="24"/>
+              </w:rPr>
+            </w:pPr>
+            <w:r>
+              <w:rPr>
+                <w:rFonts w:ascii="Calibri" w:eastAsia="Calibri" w:hAnsi="Calibri" w:cs="Calibri"/>
+                <w:sz w:val="24"/>
+              </w:rPr>
+              <w:t>RRL</w:t>
+            </w:r>
+          </w:p>
+        </w:tc>
+        <w:tc>
+          <w:tcPr>
+            <w:tcW w:w="1168" w:type="dxa"/>
+            <w:tcBorders>
+              <w:top w:val="single" w:sz="4" w:space="0" w:color="000000"/>
+              <w:left w:val="single" w:sz="4" w:space="0" w:color="000000"/>
+              <w:bottom w:val="single" w:sz="4" w:space="0" w:color="000000"/>
+              <w:right w:val="single" w:sz="4" w:space="0" w:color="000000"/>
+            </w:tcBorders>
+            <w:shd w:val="clear" w:color="auto" w:fill="auto"/>
+            <w:tcMar>
+              <w:left w:w="108" w:type="dxa"/>
+              <w:right w:w="108" w:type="dxa"/>
+            </w:tcMar>
+          </w:tcPr>
+          <w:p>
+            <w:pPr>
+              <w:spacing w:after="0" w:line="240" w:lineRule="auto"/>
+              <w:jc w:val="center"/>
+              <w:rPr>
+                <w:rFonts w:ascii="Calibri" w:eastAsia="Calibri" w:hAnsi="Calibri" w:cs="Calibri"/>
+                <w:sz w:val="24"/>
               </w:rPr>
             </w:pPr>
             <w:r>
@@ -2661,7 +2894,7 @@
               <w:rPr>
                 <w:rFonts w:ascii="Calibri" w:eastAsia="Calibri" w:hAnsi="Calibri" w:cs="Calibri"/>
               </w:rPr>
-              <w:t>BPB</w:t>
+              <w:t>NA</w:t>
             </w:r>
           </w:p>
         </w:tc>
@@ -2713,6 +2946,12 @@
                 <w:rFonts w:ascii="Calibri" w:eastAsia="Calibri" w:hAnsi="Calibri" w:cs="Calibri"/>
               </w:rPr>
             </w:pPr>
+            <w:r>
+              <w:rPr>
+                <w:rFonts w:ascii="Calibri" w:eastAsia="Calibri" w:hAnsi="Calibri" w:cs="Calibri"/>
+              </w:rPr>
+              <w:t>NA</w:t>
+            </w:r>
           </w:p>
         </w:tc>
         <w:tc>
@@ -2921,6 +3160,12 @@
                 <w:rFonts w:ascii="Calibri" w:eastAsia="Calibri" w:hAnsi="Calibri" w:cs="Calibri"/>
               </w:rPr>
             </w:pPr>
+            <w:r>
+              <w:rPr>
+                <w:rFonts w:ascii="Calibri" w:eastAsia="Calibri" w:hAnsi="Calibri" w:cs="Calibri"/>
+              </w:rPr>
+              <w:t>NA</w:t>
+            </w:r>
           </w:p>
         </w:tc>
         <w:tc>
@@ -3077,7 +3322,7 @@
               <w:rPr>
                 <w:rFonts w:ascii="Calibri" w:eastAsia="Calibri" w:hAnsi="Calibri" w:cs="Calibri"/>
               </w:rPr>
-              <w:t>BPB</w:t>
+              <w:t>NA</w:t>
             </w:r>
           </w:p>
         </w:tc>
@@ -3129,6 +3374,12 @@
                 <w:rFonts w:ascii="Calibri" w:eastAsia="Calibri" w:hAnsi="Calibri" w:cs="Calibri"/>
               </w:rPr>
             </w:pPr>
+            <w:r>
+              <w:rPr>
+                <w:rFonts w:ascii="Calibri" w:eastAsia="Calibri" w:hAnsi="Calibri" w:cs="Calibri"/>
+              </w:rPr>
+              <w:t>NA</w:t>
+            </w:r>
           </w:p>
         </w:tc>
         <w:tc>
@@ -3288,7 +3539,7 @@
               <w:rPr>
                 <w:rFonts w:ascii="Calibri" w:eastAsia="Calibri" w:hAnsi="Calibri" w:cs="Calibri"/>
               </w:rPr>
-              <w:t>SSAK</w:t>
+              <w:t>NA</w:t>
             </w:r>
           </w:p>
         </w:tc>
@@ -3340,6 +3591,12 @@
                 <w:rFonts w:ascii="Calibri" w:eastAsia="Calibri" w:hAnsi="Calibri" w:cs="Calibri"/>
               </w:rPr>
             </w:pPr>
+            <w:r>
+              <w:rPr>
+                <w:rFonts w:ascii="Calibri" w:eastAsia="Calibri" w:hAnsi="Calibri" w:cs="Calibri"/>
+              </w:rPr>
+              <w:t>NA</w:t>
+            </w:r>
           </w:p>
         </w:tc>
         <w:tc>
@@ -3746,7 +4003,13 @@
               <w:rPr>
                 <w:rFonts w:ascii="Calibri" w:eastAsia="Calibri" w:hAnsi="Calibri" w:cs="Calibri"/>
               </w:rPr>
-              <w:t>SGAV</w:t>
+              <w:t>UDAY</w:t>
+            </w:r>
+            <w:r>
+              <w:rPr>
+                <w:rFonts w:ascii="Calibri" w:eastAsia="Calibri" w:hAnsi="Calibri" w:cs="Calibri"/>
+              </w:rPr>
+              <w:t xml:space="preserve"> </w:t>
             </w:r>
           </w:p>
         </w:tc>
@@ -4156,7 +4419,13 @@
               <w:rPr>
                 <w:rFonts w:ascii="Calibri" w:eastAsia="Calibri" w:hAnsi="Calibri" w:cs="Calibri"/>
               </w:rPr>
-              <w:t>CHTR</w:t>
+              <w:t>ARMADA2</w:t>
+            </w:r>
+            <w:r>
+              <w:rPr>
+                <w:rFonts w:ascii="Calibri" w:eastAsia="Calibri" w:hAnsi="Calibri" w:cs="Calibri"/>
+              </w:rPr>
+              <w:t xml:space="preserve"> </w:t>
             </w:r>
           </w:p>
         </w:tc>
@@ -4329,7 +4598,14 @@
                 <w:rFonts w:ascii="Calibri" w:eastAsia="Calibri" w:hAnsi="Calibri" w:cs="Calibri"/>
                 <w:sz w:val="24"/>
               </w:rPr>
-              <w:t>11:05</w:t>
+              <w:t>12:5</w:t>
+            </w:r>
+            <w:r>
+              <w:rPr>
+                <w:rFonts w:ascii="Calibri" w:eastAsia="Calibri" w:hAnsi="Calibri" w:cs="Calibri"/>
+                <w:sz w:val="24"/>
+              </w:rPr>
+              <w:t>5</w:t>
             </w:r>
           </w:p>
         </w:tc>
@@ -4359,10 +4635,9 @@
             <w:r>
               <w:rPr>
                 <w:rFonts w:ascii="Calibri" w:eastAsia="Calibri" w:hAnsi="Calibri" w:cs="Calibri"/>
-                <w:b/>
-                <w:sz w:val="24"/>
-              </w:rPr>
-              <w:t>NA</w:t>
+                <w:sz w:val="24"/>
+              </w:rPr>
+              <w:t>SMRT</w:t>
             </w:r>
           </w:p>
         </w:tc>
@@ -4615,64 +4890,64 @@
               <w:rPr>
                 <w:rFonts w:ascii="Calibri" w:eastAsia="Calibri" w:hAnsi="Calibri" w:cs="Calibri"/>
               </w:rPr>
-              <w:t>JXLR</w:t>
-            </w:r>
+              <w:t>RATNA</w:t>
+            </w:r>
+          </w:p>
+        </w:tc>
+        <w:tc>
+          <w:tcPr>
+            <w:tcW w:w="1387" w:type="dxa"/>
+            <w:tcBorders>
+              <w:top w:val="single" w:sz="4" w:space="0" w:color="000000"/>
+              <w:left w:val="single" w:sz="4" w:space="0" w:color="000000"/>
+              <w:bottom w:val="single" w:sz="4" w:space="0" w:color="000000"/>
+              <w:right w:val="single" w:sz="4" w:space="0" w:color="000000"/>
+            </w:tcBorders>
+            <w:shd w:val="clear" w:color="000000" w:fill="FFFFFF"/>
+            <w:tcMar>
+              <w:left w:w="108" w:type="dxa"/>
+              <w:right w:w="108" w:type="dxa"/>
+            </w:tcMar>
+          </w:tcPr>
+          <w:p>
+            <w:pPr>
+              <w:spacing w:after="0" w:line="240" w:lineRule="auto"/>
+              <w:jc w:val="center"/>
+              <w:rPr>
+                <w:rFonts w:ascii="Calibri" w:eastAsia="Calibri" w:hAnsi="Calibri" w:cs="Calibri"/>
+              </w:rPr>
+            </w:pPr>
+          </w:p>
+        </w:tc>
+        <w:tc>
+          <w:tcPr>
+            <w:tcW w:w="1180" w:type="dxa"/>
+            <w:tcBorders>
+              <w:top w:val="single" w:sz="4" w:space="0" w:color="000000"/>
+              <w:left w:val="single" w:sz="4" w:space="0" w:color="000000"/>
+              <w:bottom w:val="single" w:sz="4" w:space="0" w:color="000000"/>
+              <w:right w:val="single" w:sz="4" w:space="0" w:color="000000"/>
+            </w:tcBorders>
+            <w:shd w:val="clear" w:color="000000" w:fill="FFFFFF"/>
+            <w:tcMar>
+              <w:left w:w="108" w:type="dxa"/>
+              <w:right w:w="108" w:type="dxa"/>
+            </w:tcMar>
+          </w:tcPr>
+          <w:p>
+            <w:pPr>
+              <w:spacing w:after="0" w:line="240" w:lineRule="auto"/>
+              <w:jc w:val="center"/>
+              <w:rPr>
+                <w:rFonts w:ascii="Calibri" w:eastAsia="Calibri" w:hAnsi="Calibri" w:cs="Calibri"/>
+              </w:rPr>
+            </w:pPr>
             <w:bookmarkStart w:id="0" w:name="_GoBack"/>
             <w:bookmarkEnd w:id="0"/>
           </w:p>
         </w:tc>
         <w:tc>
           <w:tcPr>
-            <w:tcW w:w="1387" w:type="dxa"/>
-            <w:tcBorders>
-              <w:top w:val="single" w:sz="4" w:space="0" w:color="000000"/>
-              <w:left w:val="single" w:sz="4" w:space="0" w:color="000000"/>
-              <w:bottom w:val="single" w:sz="4" w:space="0" w:color="000000"/>
-              <w:right w:val="single" w:sz="4" w:space="0" w:color="000000"/>
-            </w:tcBorders>
-            <w:shd w:val="clear" w:color="000000" w:fill="FFFFFF"/>
-            <w:tcMar>
-              <w:left w:w="108" w:type="dxa"/>
-              <w:right w:w="108" w:type="dxa"/>
-            </w:tcMar>
-          </w:tcPr>
-          <w:p>
-            <w:pPr>
-              <w:spacing w:after="0" w:line="240" w:lineRule="auto"/>
-              <w:jc w:val="center"/>
-              <w:rPr>
-                <w:rFonts w:ascii="Calibri" w:eastAsia="Calibri" w:hAnsi="Calibri" w:cs="Calibri"/>
-              </w:rPr>
-            </w:pPr>
-          </w:p>
-        </w:tc>
-        <w:tc>
-          <w:tcPr>
-            <w:tcW w:w="1180" w:type="dxa"/>
-            <w:tcBorders>
-              <w:top w:val="single" w:sz="4" w:space="0" w:color="000000"/>
-              <w:left w:val="single" w:sz="4" w:space="0" w:color="000000"/>
-              <w:bottom w:val="single" w:sz="4" w:space="0" w:color="000000"/>
-              <w:right w:val="single" w:sz="4" w:space="0" w:color="000000"/>
-            </w:tcBorders>
-            <w:shd w:val="clear" w:color="000000" w:fill="FFFFFF"/>
-            <w:tcMar>
-              <w:left w:w="108" w:type="dxa"/>
-              <w:right w:w="108" w:type="dxa"/>
-            </w:tcMar>
-          </w:tcPr>
-          <w:p>
-            <w:pPr>
-              <w:spacing w:after="0" w:line="240" w:lineRule="auto"/>
-              <w:jc w:val="center"/>
-              <w:rPr>
-                <w:rFonts w:ascii="Calibri" w:eastAsia="Calibri" w:hAnsi="Calibri" w:cs="Calibri"/>
-              </w:rPr>
-            </w:pPr>
-          </w:p>
-        </w:tc>
-        <w:tc>
-          <w:tcPr>
             <w:tcW w:w="1168" w:type="dxa"/>
             <w:tcBorders>
               <w:top w:val="single" w:sz="4" w:space="0" w:color="000000"/>
@@ -4822,7 +5097,7 @@
               <w:rPr>
                 <w:rFonts w:ascii="Calibri" w:eastAsia="Calibri" w:hAnsi="Calibri" w:cs="Calibri"/>
               </w:rPr>
-              <w:t>ADM10</w:t>
+              <w:t>JYOTI</w:t>
             </w:r>
           </w:p>
         </w:tc>
@@ -5027,19 +5302,7 @@
               <w:rPr>
                 <w:rFonts w:ascii="Calibri" w:eastAsia="Calibri" w:hAnsi="Calibri" w:cs="Calibri"/>
               </w:rPr>
-              <w:t>SF</w:t>
-            </w:r>
-            <w:r>
-              <w:rPr>
-                <w:rFonts w:ascii="Calibri" w:eastAsia="Calibri" w:hAnsi="Calibri" w:cs="Calibri"/>
-              </w:rPr>
-              <w:t xml:space="preserve"> </w:t>
-            </w:r>
-            <w:r>
-              <w:rPr>
-                <w:rFonts w:ascii="Calibri" w:eastAsia="Calibri" w:hAnsi="Calibri" w:cs="Calibri"/>
-              </w:rPr>
-              <w:t xml:space="preserve"> SPL</w:t>
+              <w:t>DISC1</w:t>
             </w:r>
           </w:p>
         </w:tc>
@@ -5244,7 +5507,7 @@
               <w:rPr>
                 <w:rFonts w:ascii="Calibri" w:eastAsia="Calibri" w:hAnsi="Calibri" w:cs="Calibri"/>
               </w:rPr>
-              <w:t>DSFN</w:t>
+              <w:t>ADM9</w:t>
             </w:r>
           </w:p>
         </w:tc>
@@ -5449,7 +5712,13 @@
               <w:rPr>
                 <w:rFonts w:ascii="Calibri" w:eastAsia="Calibri" w:hAnsi="Calibri" w:cs="Calibri"/>
               </w:rPr>
-              <w:t>VND1</w:t>
+              <w:t>DVDR</w:t>
+            </w:r>
+            <w:r>
+              <w:rPr>
+                <w:rFonts w:ascii="Calibri" w:eastAsia="Calibri" w:hAnsi="Calibri" w:cs="Calibri"/>
+              </w:rPr>
+              <w:t xml:space="preserve"> </w:t>
             </w:r>
           </w:p>
         </w:tc>
@@ -5623,14 +5892,7 @@
                 <w:rFonts w:ascii="Calibri" w:eastAsia="Calibri" w:hAnsi="Calibri" w:cs="Calibri"/>
                 <w:sz w:val="24"/>
               </w:rPr>
-              <w:t>11:3</w:t>
-            </w:r>
-            <w:r>
-              <w:rPr>
-                <w:rFonts w:ascii="Calibri" w:eastAsia="Calibri" w:hAnsi="Calibri" w:cs="Calibri"/>
-                <w:sz w:val="24"/>
-              </w:rPr>
-              <w:t>0</w:t>
+              <w:t>11:30</w:t>
             </w:r>
           </w:p>
         </w:tc>
@@ -5662,19 +5924,7 @@
               <w:rPr>
                 <w:rFonts w:ascii="Calibri" w:eastAsia="Calibri" w:hAnsi="Calibri" w:cs="Calibri"/>
               </w:rPr>
-              <w:t>NF</w:t>
-            </w:r>
-            <w:r>
-              <w:rPr>
-                <w:rFonts w:ascii="Calibri" w:eastAsia="Calibri" w:hAnsi="Calibri" w:cs="Calibri"/>
-              </w:rPr>
-              <w:t xml:space="preserve"> </w:t>
-            </w:r>
-            <w:r>
-              <w:rPr>
-                <w:rFonts w:ascii="Calibri" w:eastAsia="Calibri" w:hAnsi="Calibri" w:cs="Calibri"/>
-              </w:rPr>
-              <w:t xml:space="preserve"> SPL</w:t>
+              <w:t>FD9</w:t>
             </w:r>
           </w:p>
         </w:tc>
@@ -5757,6 +6007,214 @@
       <w:tr>
         <w:tc>
           <w:tcPr>
+            <w:tcW w:w="620" w:type="dxa"/>
+            <w:tcBorders>
+              <w:top w:val="single" w:sz="4" w:space="0" w:color="000000"/>
+              <w:left w:val="single" w:sz="4" w:space="0" w:color="000000"/>
+              <w:bottom w:val="single" w:sz="4" w:space="0" w:color="000000"/>
+              <w:right w:val="single" w:sz="4" w:space="0" w:color="000000"/>
+            </w:tcBorders>
+            <w:shd w:val="clear" w:color="000000" w:fill="FFFFFF"/>
+            <w:tcMar>
+              <w:left w:w="108" w:type="dxa"/>
+              <w:right w:w="108" w:type="dxa"/>
+            </w:tcMar>
+            <w:vAlign w:val="center"/>
+          </w:tcPr>
+          <w:p>
+            <w:pPr>
+              <w:spacing w:after="0" w:line="240" w:lineRule="auto"/>
+              <w:jc w:val="center"/>
+              <w:rPr>
+                <w:rFonts w:ascii="Calibri" w:eastAsia="Calibri" w:hAnsi="Calibri" w:cs="Calibri"/>
+                <w:sz w:val="24"/>
+              </w:rPr>
+            </w:pPr>
+            <w:r>
+              <w:rPr>
+                <w:rFonts w:ascii="Calibri" w:eastAsia="Calibri" w:hAnsi="Calibri" w:cs="Calibri"/>
+                <w:sz w:val="24"/>
+              </w:rPr>
+              <w:t>7</w:t>
+            </w:r>
+          </w:p>
+        </w:tc>
+        <w:tc>
+          <w:tcPr>
+            <w:tcW w:w="1414" w:type="dxa"/>
+            <w:tcBorders>
+              <w:top w:val="single" w:sz="4" w:space="0" w:color="000000"/>
+              <w:left w:val="single" w:sz="4" w:space="0" w:color="000000"/>
+              <w:bottom w:val="single" w:sz="4" w:space="0" w:color="000000"/>
+              <w:right w:val="single" w:sz="4" w:space="0" w:color="000000"/>
+            </w:tcBorders>
+            <w:shd w:val="clear" w:color="000000" w:fill="FFFFFF"/>
+            <w:tcMar>
+              <w:left w:w="108" w:type="dxa"/>
+              <w:right w:w="108" w:type="dxa"/>
+            </w:tcMar>
+          </w:tcPr>
+          <w:p>
+            <w:pPr>
+              <w:spacing w:after="0" w:line="240" w:lineRule="auto"/>
+              <w:jc w:val="center"/>
+              <w:rPr>
+                <w:rFonts w:ascii="Calibri" w:eastAsia="Calibri" w:hAnsi="Calibri" w:cs="Calibri"/>
+                <w:sz w:val="24"/>
+              </w:rPr>
+            </w:pPr>
+            <w:r>
+              <w:rPr>
+                <w:rFonts w:ascii="Calibri" w:eastAsia="Calibri" w:hAnsi="Calibri" w:cs="Calibri"/>
+                <w:sz w:val="24"/>
+              </w:rPr>
+              <w:t>10:30</w:t>
+            </w:r>
+          </w:p>
+        </w:tc>
+        <w:tc>
+          <w:tcPr>
+            <w:tcW w:w="1339" w:type="dxa"/>
+            <w:tcBorders>
+              <w:top w:val="single" w:sz="4" w:space="0" w:color="000000"/>
+              <w:left w:val="single" w:sz="4" w:space="0" w:color="000000"/>
+              <w:bottom w:val="single" w:sz="4" w:space="0" w:color="000000"/>
+              <w:right w:val="single" w:sz="4" w:space="0" w:color="000000"/>
+            </w:tcBorders>
+            <w:shd w:val="clear" w:color="000000" w:fill="FFFFFF"/>
+            <w:tcMar>
+              <w:left w:w="108" w:type="dxa"/>
+              <w:right w:w="108" w:type="dxa"/>
+            </w:tcMar>
+          </w:tcPr>
+          <w:p>
+            <w:pPr>
+              <w:spacing w:after="0" w:line="240" w:lineRule="auto"/>
+              <w:jc w:val="center"/>
+              <w:rPr>
+                <w:rFonts w:ascii="Calibri" w:eastAsia="Calibri" w:hAnsi="Calibri" w:cs="Calibri"/>
+                <w:sz w:val="24"/>
+              </w:rPr>
+            </w:pPr>
+            <w:r>
+              <w:rPr>
+                <w:rFonts w:ascii="Calibri" w:eastAsia="Calibri" w:hAnsi="Calibri" w:cs="Calibri"/>
+                <w:sz w:val="24"/>
+              </w:rPr>
+              <w:t>13:30</w:t>
+            </w:r>
+          </w:p>
+        </w:tc>
+        <w:tc>
+          <w:tcPr>
+            <w:tcW w:w="1810" w:type="dxa"/>
+            <w:tcBorders>
+              <w:top w:val="single" w:sz="4" w:space="0" w:color="000000"/>
+              <w:left w:val="single" w:sz="4" w:space="0" w:color="000000"/>
+              <w:bottom w:val="single" w:sz="4" w:space="0" w:color="000000"/>
+              <w:right w:val="single" w:sz="4" w:space="0" w:color="000000"/>
+            </w:tcBorders>
+            <w:shd w:val="clear" w:color="000000" w:fill="FFFFFF"/>
+            <w:tcMar>
+              <w:left w:w="108" w:type="dxa"/>
+              <w:right w:w="108" w:type="dxa"/>
+            </w:tcMar>
+          </w:tcPr>
+          <w:p>
+            <w:pPr>
+              <w:spacing w:after="0" w:line="240" w:lineRule="auto"/>
+              <w:jc w:val="center"/>
+              <w:rPr>
+                <w:rFonts w:ascii="Calibri" w:eastAsia="Calibri" w:hAnsi="Calibri" w:cs="Calibri"/>
+              </w:rPr>
+            </w:pPr>
+            <w:r>
+              <w:rPr>
+                <w:rFonts w:ascii="Calibri" w:eastAsia="Calibri" w:hAnsi="Calibri" w:cs="Calibri"/>
+              </w:rPr>
+              <w:t>SMRT</w:t>
+            </w:r>
+          </w:p>
+        </w:tc>
+        <w:tc>
+          <w:tcPr>
+            <w:tcW w:w="1387" w:type="dxa"/>
+            <w:tcBorders>
+              <w:top w:val="single" w:sz="4" w:space="0" w:color="000000"/>
+              <w:left w:val="single" w:sz="4" w:space="0" w:color="000000"/>
+              <w:bottom w:val="single" w:sz="4" w:space="0" w:color="000000"/>
+              <w:right w:val="single" w:sz="4" w:space="0" w:color="000000"/>
+            </w:tcBorders>
+            <w:shd w:val="clear" w:color="000000" w:fill="FFFFFF"/>
+            <w:tcMar>
+              <w:left w:w="108" w:type="dxa"/>
+              <w:right w:w="108" w:type="dxa"/>
+            </w:tcMar>
+          </w:tcPr>
+          <w:p>
+            <w:pPr>
+              <w:spacing w:after="0" w:line="240" w:lineRule="auto"/>
+              <w:jc w:val="center"/>
+              <w:rPr>
+                <w:rFonts w:ascii="Calibri" w:eastAsia="Calibri" w:hAnsi="Calibri" w:cs="Calibri"/>
+              </w:rPr>
+            </w:pPr>
+          </w:p>
+        </w:tc>
+        <w:tc>
+          <w:tcPr>
+            <w:tcW w:w="1180" w:type="dxa"/>
+            <w:tcBorders>
+              <w:top w:val="single" w:sz="4" w:space="0" w:color="000000"/>
+              <w:left w:val="single" w:sz="4" w:space="0" w:color="000000"/>
+              <w:bottom w:val="single" w:sz="4" w:space="0" w:color="000000"/>
+              <w:right w:val="single" w:sz="4" w:space="0" w:color="000000"/>
+            </w:tcBorders>
+            <w:shd w:val="clear" w:color="000000" w:fill="FFFFFF"/>
+            <w:tcMar>
+              <w:left w:w="108" w:type="dxa"/>
+              <w:right w:w="108" w:type="dxa"/>
+            </w:tcMar>
+          </w:tcPr>
+          <w:p>
+            <w:pPr>
+              <w:spacing w:after="0" w:line="240" w:lineRule="auto"/>
+              <w:jc w:val="center"/>
+              <w:rPr>
+                <w:rFonts w:ascii="Calibri" w:eastAsia="Calibri" w:hAnsi="Calibri" w:cs="Calibri"/>
+              </w:rPr>
+            </w:pPr>
+          </w:p>
+        </w:tc>
+        <w:tc>
+          <w:tcPr>
+            <w:tcW w:w="1168" w:type="dxa"/>
+            <w:tcBorders>
+              <w:top w:val="single" w:sz="4" w:space="0" w:color="000000"/>
+              <w:left w:val="single" w:sz="4" w:space="0" w:color="000000"/>
+              <w:bottom w:val="single" w:sz="4" w:space="0" w:color="000000"/>
+              <w:right w:val="single" w:sz="4" w:space="0" w:color="000000"/>
+            </w:tcBorders>
+            <w:shd w:val="clear" w:color="000000" w:fill="FFFFFF"/>
+            <w:tcMar>
+              <w:left w:w="108" w:type="dxa"/>
+              <w:right w:w="108" w:type="dxa"/>
+            </w:tcMar>
+          </w:tcPr>
+          <w:p>
+            <w:pPr>
+              <w:spacing w:after="0" w:line="240" w:lineRule="auto"/>
+              <w:jc w:val="center"/>
+              <w:rPr>
+                <w:rFonts w:ascii="Calibri" w:eastAsia="Calibri" w:hAnsi="Calibri" w:cs="Calibri"/>
+              </w:rPr>
+            </w:pPr>
+          </w:p>
+        </w:tc>
+      </w:tr>
+      <w:tr>
+        <w:tc>
+          <w:tcPr>
             <w:tcW w:w="8918" w:type="dxa"/>
             <w:gridSpan w:val="7"/>
             <w:tcBorders>
@@ -5801,21 +6259,7 @@
                 <w:rFonts w:ascii="Calibri" w:eastAsia="Calibri" w:hAnsi="Calibri" w:cs="Calibri"/>
                 <w:sz w:val="24"/>
               </w:rPr>
-              <w:t>SCHAL</w:t>
-            </w:r>
-            <w:r>
-              <w:rPr>
-                <w:rFonts w:ascii="Calibri" w:eastAsia="Calibri" w:hAnsi="Calibri" w:cs="Calibri"/>
-                <w:sz w:val="24"/>
-              </w:rPr>
-              <w:t>,ADM9,</w:t>
-            </w:r>
-            <w:r>
-              <w:rPr>
-                <w:rFonts w:ascii="Calibri" w:eastAsia="Calibri" w:hAnsi="Calibri" w:cs="Calibri"/>
-                <w:sz w:val="24"/>
-              </w:rPr>
-              <w:t>JXLR</w:t>
+              <w:t>TRI2,JTA, ADM11,ADM10</w:t>
             </w:r>
           </w:p>
         </w:tc>
@@ -5899,10 +6343,10 @@
       </w:pPr>
       <w:r>
         <w:object w:dxaOrig="1188" w:dyaOrig="900">
-          <v:rect id="_x0000_i1025" style="width:60pt;height:44.25pt" o:ole="" o:preferrelative="t" stroked="f">
+          <v:rect id="_x0000_i1025" style="width:59.75pt;height:44.45pt" o:ole="" o:preferrelative="t" stroked="f">
             <v:imagedata r:id="rId5" o:title=""/>
           </v:rect>
-          <o:OLEObject Type="Embed" ProgID="StaticMetafile" ShapeID="_x0000_i1025" DrawAspect="Content" ObjectID="_1848753080" r:id="rId6"/>
+          <o:OLEObject Type="Embed" ProgID="StaticMetafile" ShapeID="_x0000_i1025" DrawAspect="Content" ObjectID="_1848831666" r:id="rId6"/>
         </w:object>
       </w:r>
     </w:p>
@@ -6438,7 +6882,7 @@
                 <w:sz w:val="24"/>
                 <w:szCs w:val="24"/>
               </w:rPr>
-              <w:t>JIND</w:t>
+              <w:t>JYOTI</w:t>
             </w:r>
           </w:p>
         </w:tc>
@@ -6654,6 +7098,14 @@
               </w:rPr>
               <w:t>CHRU</w:t>
             </w:r>
+            <w:r>
+              <w:rPr>
+                <w:rFonts w:ascii="Calibri" w:eastAsia="Calibri" w:hAnsi="Calibri" w:cs="Calibri"/>
+                <w:sz w:val="24"/>
+                <w:szCs w:val="24"/>
+              </w:rPr>
+              <w:t xml:space="preserve"> </w:t>
+            </w:r>
           </w:p>
         </w:tc>
         <w:tc>
@@ -6863,7 +7315,7 @@
               <w:rPr>
                 <w:rFonts w:ascii="Calibri" w:eastAsia="Calibri" w:hAnsi="Calibri" w:cs="Calibri"/>
               </w:rPr>
-              <w:t>FERRY TO JJ</w:t>
+              <w:t>L/O</w:t>
             </w:r>
           </w:p>
         </w:tc>

</xml_diff>

<commit_message>
Sync - 2026-08-22 15:50
</commit_message>
<xml_diff>
--- a/files/Daily_Helicopter_Schedule.docx
+++ b/files/Daily_Helicopter_Schedule.docx
@@ -35,7 +35,7 @@
           <w:b/>
           <w:color w:val="000000" w:themeColor="text1"/>
         </w:rPr>
-        <w:t>22</w:t>
+        <w:t>23</w:t>
       </w:r>
       <w:r>
         <w:rPr>
@@ -59,7 +59,7 @@
           <w:b/>
           <w:color w:val="000000" w:themeColor="text1"/>
         </w:rPr>
-        <w:t>SATUR</w:t>
+        <w:t>SUN</w:t>
       </w:r>
       <w:r>
         <w:rPr>
@@ -700,25 +700,26 @@
               <w:bottom w:val="single" w:sz="4" w:space="0" w:color="000000"/>
               <w:right w:val="single" w:sz="4" w:space="0" w:color="000000"/>
             </w:tcBorders>
-            <w:shd w:val="clear" w:color="000000" w:fill="FFFFFF"/>
-            <w:tcMar>
-              <w:left w:w="108" w:type="dxa"/>
-              <w:right w:w="108" w:type="dxa"/>
-            </w:tcMar>
-          </w:tcPr>
-          <w:p>
-            <w:pPr>
-              <w:spacing w:after="0" w:line="240" w:lineRule="auto"/>
-              <w:jc w:val="center"/>
-              <w:rPr>
-                <w:rFonts w:ascii="Calibri" w:eastAsia="Calibri" w:hAnsi="Calibri" w:cs="Calibri"/>
-              </w:rPr>
-            </w:pPr>
-            <w:r>
-              <w:rPr>
-                <w:rFonts w:ascii="Calibri" w:eastAsia="Calibri" w:hAnsi="Calibri" w:cs="Calibri"/>
-              </w:rPr>
-              <w:t>GVHL 169</w:t>
+            <w:shd w:val="clear" w:color="auto" w:fill="auto"/>
+            <w:tcMar>
+              <w:left w:w="108" w:type="dxa"/>
+              <w:right w:w="108" w:type="dxa"/>
+            </w:tcMar>
+          </w:tcPr>
+          <w:p>
+            <w:pPr>
+              <w:spacing w:after="0" w:line="240" w:lineRule="auto"/>
+              <w:jc w:val="center"/>
+              <w:rPr>
+                <w:rFonts w:ascii="Calibri" w:eastAsia="Calibri" w:hAnsi="Calibri" w:cs="Calibri"/>
+              </w:rPr>
+            </w:pPr>
+            <w:r>
+              <w:rPr>
+                <w:rFonts w:ascii="Calibri" w:eastAsia="Calibri" w:hAnsi="Calibri" w:cs="Calibri"/>
+                <w:sz w:val="24"/>
+              </w:rPr>
+              <w:t>GVHL412</w:t>
             </w:r>
           </w:p>
         </w:tc>
@@ -731,25 +732,26 @@
               <w:bottom w:val="single" w:sz="4" w:space="0" w:color="000000"/>
               <w:right w:val="single" w:sz="4" w:space="0" w:color="000000"/>
             </w:tcBorders>
-            <w:shd w:val="clear" w:color="000000" w:fill="FFFFFF"/>
-            <w:tcMar>
-              <w:left w:w="108" w:type="dxa"/>
-              <w:right w:w="108" w:type="dxa"/>
-            </w:tcMar>
-          </w:tcPr>
-          <w:p>
-            <w:pPr>
-              <w:spacing w:after="0" w:line="240" w:lineRule="auto"/>
-              <w:jc w:val="center"/>
-              <w:rPr>
-                <w:rFonts w:ascii="Calibri" w:eastAsia="Calibri" w:hAnsi="Calibri" w:cs="Calibri"/>
-              </w:rPr>
-            </w:pPr>
-            <w:r>
-              <w:rPr>
-                <w:rFonts w:ascii="Calibri" w:eastAsia="Calibri" w:hAnsi="Calibri" w:cs="Calibri"/>
-              </w:rPr>
-              <w:t>RRK</w:t>
+            <w:shd w:val="clear" w:color="auto" w:fill="auto"/>
+            <w:tcMar>
+              <w:left w:w="108" w:type="dxa"/>
+              <w:right w:w="108" w:type="dxa"/>
+            </w:tcMar>
+          </w:tcPr>
+          <w:p>
+            <w:pPr>
+              <w:spacing w:after="0" w:line="240" w:lineRule="auto"/>
+              <w:jc w:val="center"/>
+              <w:rPr>
+                <w:rFonts w:ascii="Calibri" w:eastAsia="Calibri" w:hAnsi="Calibri" w:cs="Calibri"/>
+              </w:rPr>
+            </w:pPr>
+            <w:r>
+              <w:rPr>
+                <w:rFonts w:ascii="Calibri" w:eastAsia="Calibri" w:hAnsi="Calibri" w:cs="Calibri"/>
+                <w:sz w:val="24"/>
+              </w:rPr>
+              <w:t>GVT</w:t>
             </w:r>
           </w:p>
         </w:tc>
@@ -942,7 +944,7 @@
                 <w:rFonts w:ascii="Calibri" w:eastAsia="Calibri" w:hAnsi="Calibri" w:cs="Calibri"/>
                 <w:sz w:val="24"/>
               </w:rPr>
-              <w:t>GVHL412</w:t>
+              <w:t>GVHL 169</w:t>
             </w:r>
           </w:p>
         </w:tc>
@@ -972,9 +974,8 @@
             <w:r>
               <w:rPr>
                 <w:rFonts w:ascii="Calibri" w:eastAsia="Calibri" w:hAnsi="Calibri" w:cs="Calibri"/>
-                <w:sz w:val="24"/>
-              </w:rPr>
-              <w:t>GVT</w:t>
+              </w:rPr>
+              <w:t>RRK</w:t>
             </w:r>
           </w:p>
         </w:tc>
@@ -1200,7 +1201,14 @@
                 <w:rFonts w:ascii="Calibri" w:eastAsia="Calibri" w:hAnsi="Calibri" w:cs="Calibri"/>
                 <w:sz w:val="24"/>
               </w:rPr>
-              <w:t>GVZ</w:t>
+              <w:t xml:space="preserve"> </w:t>
+            </w:r>
+            <w:r>
+              <w:rPr>
+                <w:rFonts w:ascii="Calibri" w:eastAsia="Calibri" w:hAnsi="Calibri" w:cs="Calibri"/>
+                <w:sz w:val="24"/>
+              </w:rPr>
+              <w:t>RRL</w:t>
             </w:r>
           </w:p>
         </w:tc>
@@ -1399,7 +1407,7 @@
                 <w:rFonts w:ascii="Calibri" w:eastAsia="Calibri" w:hAnsi="Calibri" w:cs="Calibri"/>
                 <w:sz w:val="24"/>
               </w:rPr>
-              <w:t>GVHL 169</w:t>
+              <w:t>GVHL 412</w:t>
             </w:r>
           </w:p>
         </w:tc>
@@ -1432,7 +1440,7 @@
                 <w:rFonts w:ascii="Calibri" w:eastAsia="Calibri" w:hAnsi="Calibri" w:cs="Calibri"/>
                 <w:sz w:val="24"/>
               </w:rPr>
-              <w:t>RRL</w:t>
+              <w:t>RRI</w:t>
             </w:r>
           </w:p>
         </w:tc>
@@ -2894,7 +2902,7 @@
               <w:rPr>
                 <w:rFonts w:ascii="Calibri" w:eastAsia="Calibri" w:hAnsi="Calibri" w:cs="Calibri"/>
               </w:rPr>
-              <w:t>NA</w:t>
+              <w:t>PANNA</w:t>
             </w:r>
           </w:p>
         </w:tc>
@@ -2946,12 +2954,6 @@
                 <w:rFonts w:ascii="Calibri" w:eastAsia="Calibri" w:hAnsi="Calibri" w:cs="Calibri"/>
               </w:rPr>
             </w:pPr>
-            <w:r>
-              <w:rPr>
-                <w:rFonts w:ascii="Calibri" w:eastAsia="Calibri" w:hAnsi="Calibri" w:cs="Calibri"/>
-              </w:rPr>
-              <w:t>NA</w:t>
-            </w:r>
           </w:p>
         </w:tc>
         <w:tc>
@@ -3102,11 +3104,13 @@
               <w:jc w:val="center"/>
               <w:rPr>
                 <w:rFonts w:ascii="Calibri" w:eastAsia="Calibri" w:hAnsi="Calibri" w:cs="Calibri"/>
-              </w:rPr>
-            </w:pPr>
-            <w:r>
-              <w:rPr>
-                <w:rFonts w:ascii="Calibri" w:eastAsia="Calibri" w:hAnsi="Calibri" w:cs="Calibri"/>
+                <w:b/>
+              </w:rPr>
+            </w:pPr>
+            <w:r>
+              <w:rPr>
+                <w:rFonts w:ascii="Calibri" w:eastAsia="Calibri" w:hAnsi="Calibri" w:cs="Calibri"/>
+                <w:b/>
               </w:rPr>
               <w:t>NA</w:t>
             </w:r>
@@ -3133,8 +3137,16 @@
               <w:jc w:val="center"/>
               <w:rPr>
                 <w:rFonts w:ascii="Calibri" w:eastAsia="Calibri" w:hAnsi="Calibri" w:cs="Calibri"/>
-              </w:rPr>
-            </w:pPr>
+                <w:b/>
+              </w:rPr>
+            </w:pPr>
+            <w:r>
+              <w:rPr>
+                <w:rFonts w:ascii="Calibri" w:eastAsia="Calibri" w:hAnsi="Calibri" w:cs="Calibri"/>
+                <w:b/>
+              </w:rPr>
+              <w:t>NA</w:t>
+            </w:r>
           </w:p>
         </w:tc>
         <w:tc>
@@ -3158,11 +3170,13 @@
               <w:jc w:val="center"/>
               <w:rPr>
                 <w:rFonts w:ascii="Calibri" w:eastAsia="Calibri" w:hAnsi="Calibri" w:cs="Calibri"/>
-              </w:rPr>
-            </w:pPr>
-            <w:r>
-              <w:rPr>
-                <w:rFonts w:ascii="Calibri" w:eastAsia="Calibri" w:hAnsi="Calibri" w:cs="Calibri"/>
+                <w:b/>
+              </w:rPr>
+            </w:pPr>
+            <w:r>
+              <w:rPr>
+                <w:rFonts w:ascii="Calibri" w:eastAsia="Calibri" w:hAnsi="Calibri" w:cs="Calibri"/>
+                <w:b/>
               </w:rPr>
               <w:t>NA</w:t>
             </w:r>
@@ -3322,7 +3336,7 @@
               <w:rPr>
                 <w:rFonts w:ascii="Calibri" w:eastAsia="Calibri" w:hAnsi="Calibri" w:cs="Calibri"/>
               </w:rPr>
-              <w:t>NA</w:t>
+              <w:t>PANNA</w:t>
             </w:r>
           </w:p>
         </w:tc>
@@ -3374,12 +3388,6 @@
                 <w:rFonts w:ascii="Calibri" w:eastAsia="Calibri" w:hAnsi="Calibri" w:cs="Calibri"/>
               </w:rPr>
             </w:pPr>
-            <w:r>
-              <w:rPr>
-                <w:rFonts w:ascii="Calibri" w:eastAsia="Calibri" w:hAnsi="Calibri" w:cs="Calibri"/>
-              </w:rPr>
-              <w:t>NA</w:t>
-            </w:r>
           </w:p>
         </w:tc>
         <w:tc>
@@ -3508,7 +3516,7 @@
                 <w:rFonts w:ascii="Calibri" w:eastAsia="Calibri" w:hAnsi="Calibri" w:cs="Calibri"/>
                 <w:sz w:val="24"/>
               </w:rPr>
-              <w:t>11:15</w:t>
+              <w:t>13:00</w:t>
             </w:r>
           </w:p>
         </w:tc>
@@ -3539,7 +3547,7 @@
               <w:rPr>
                 <w:rFonts w:ascii="Calibri" w:eastAsia="Calibri" w:hAnsi="Calibri" w:cs="Calibri"/>
               </w:rPr>
-              <w:t>NA</w:t>
+              <w:t>PANNA</w:t>
             </w:r>
           </w:p>
         </w:tc>
@@ -3591,12 +3599,6 @@
                 <w:rFonts w:ascii="Calibri" w:eastAsia="Calibri" w:hAnsi="Calibri" w:cs="Calibri"/>
               </w:rPr>
             </w:pPr>
-            <w:r>
-              <w:rPr>
-                <w:rFonts w:ascii="Calibri" w:eastAsia="Calibri" w:hAnsi="Calibri" w:cs="Calibri"/>
-              </w:rPr>
-              <w:t>NA</w:t>
-            </w:r>
           </w:p>
         </w:tc>
         <w:tc>
@@ -4003,13 +4005,7 @@
               <w:rPr>
                 <w:rFonts w:ascii="Calibri" w:eastAsia="Calibri" w:hAnsi="Calibri" w:cs="Calibri"/>
               </w:rPr>
-              <w:t>UDAY</w:t>
-            </w:r>
-            <w:r>
-              <w:rPr>
-                <w:rFonts w:ascii="Calibri" w:eastAsia="Calibri" w:hAnsi="Calibri" w:cs="Calibri"/>
-              </w:rPr>
-              <w:t xml:space="preserve"> </w:t>
+              <w:t>GAURAV</w:t>
             </w:r>
           </w:p>
         </w:tc>
@@ -4419,13 +4415,7 @@
               <w:rPr>
                 <w:rFonts w:ascii="Calibri" w:eastAsia="Calibri" w:hAnsi="Calibri" w:cs="Calibri"/>
               </w:rPr>
-              <w:t>ARMADA2</w:t>
-            </w:r>
-            <w:r>
-              <w:rPr>
-                <w:rFonts w:ascii="Calibri" w:eastAsia="Calibri" w:hAnsi="Calibri" w:cs="Calibri"/>
-              </w:rPr>
-              <w:t xml:space="preserve"> </w:t>
+              <w:t>JTA</w:t>
             </w:r>
           </w:p>
         </w:tc>
@@ -4598,14 +4588,7 @@
                 <w:rFonts w:ascii="Calibri" w:eastAsia="Calibri" w:hAnsi="Calibri" w:cs="Calibri"/>
                 <w:sz w:val="24"/>
               </w:rPr>
-              <w:t>12:5</w:t>
-            </w:r>
-            <w:r>
-              <w:rPr>
-                <w:rFonts w:ascii="Calibri" w:eastAsia="Calibri" w:hAnsi="Calibri" w:cs="Calibri"/>
-                <w:sz w:val="24"/>
-              </w:rPr>
-              <w:t>5</w:t>
+              <w:t>12:55</w:t>
             </w:r>
           </w:p>
         </w:tc>
@@ -4635,9 +4618,8 @@
             <w:r>
               <w:rPr>
                 <w:rFonts w:ascii="Calibri" w:eastAsia="Calibri" w:hAnsi="Calibri" w:cs="Calibri"/>
-                <w:sz w:val="24"/>
-              </w:rPr>
-              <w:t>SMRT</w:t>
+              </w:rPr>
+              <w:t>NA</w:t>
             </w:r>
           </w:p>
         </w:tc>
@@ -4890,7 +4872,14 @@
               <w:rPr>
                 <w:rFonts w:ascii="Calibri" w:eastAsia="Calibri" w:hAnsi="Calibri" w:cs="Calibri"/>
               </w:rPr>
-              <w:t>RATNA</w:t>
+              <w:t>SMRT</w:t>
+            </w:r>
+            <w:r>
+              <w:rPr>
+                <w:rFonts w:ascii="Calibri" w:eastAsia="Calibri" w:hAnsi="Calibri" w:cs="Calibri"/>
+                <w:sz w:val="24"/>
+              </w:rPr>
+              <w:t xml:space="preserve"> </w:t>
             </w:r>
           </w:p>
         </w:tc>
@@ -5097,7 +5086,7 @@
               <w:rPr>
                 <w:rFonts w:ascii="Calibri" w:eastAsia="Calibri" w:hAnsi="Calibri" w:cs="Calibri"/>
               </w:rPr>
-              <w:t>JYOTI</w:t>
+              <w:t>ADM11</w:t>
             </w:r>
           </w:p>
         </w:tc>
@@ -5302,7 +5291,7 @@
               <w:rPr>
                 <w:rFonts w:ascii="Calibri" w:eastAsia="Calibri" w:hAnsi="Calibri" w:cs="Calibri"/>
               </w:rPr>
-              <w:t>DISC1</w:t>
+              <w:t>SCHLR</w:t>
             </w:r>
           </w:p>
         </w:tc>
@@ -5506,8 +5495,9 @@
             <w:r>
               <w:rPr>
                 <w:rFonts w:ascii="Calibri" w:eastAsia="Calibri" w:hAnsi="Calibri" w:cs="Calibri"/>
-              </w:rPr>
-              <w:t>ADM9</w:t>
+                <w:sz w:val="24"/>
+              </w:rPr>
+              <w:t>CHTRA</w:t>
             </w:r>
           </w:p>
         </w:tc>
@@ -5712,13 +5702,7 @@
               <w:rPr>
                 <w:rFonts w:ascii="Calibri" w:eastAsia="Calibri" w:hAnsi="Calibri" w:cs="Calibri"/>
               </w:rPr>
-              <w:t>DVDR</w:t>
-            </w:r>
-            <w:r>
-              <w:rPr>
-                <w:rFonts w:ascii="Calibri" w:eastAsia="Calibri" w:hAnsi="Calibri" w:cs="Calibri"/>
-              </w:rPr>
-              <w:t xml:space="preserve"> </w:t>
+              <w:t>ABAN4</w:t>
             </w:r>
           </w:p>
         </w:tc>
@@ -5917,14 +5901,13 @@
               <w:jc w:val="center"/>
               <w:rPr>
                 <w:rFonts w:ascii="Calibri" w:eastAsia="Calibri" w:hAnsi="Calibri" w:cs="Calibri"/>
-                <w:b/>
-              </w:rPr>
-            </w:pPr>
-            <w:r>
-              <w:rPr>
-                <w:rFonts w:ascii="Calibri" w:eastAsia="Calibri" w:hAnsi="Calibri" w:cs="Calibri"/>
-              </w:rPr>
-              <w:t>FD9</w:t>
+              </w:rPr>
+            </w:pPr>
+            <w:r>
+              <w:rPr>
+                <w:rFonts w:ascii="Calibri" w:eastAsia="Calibri" w:hAnsi="Calibri" w:cs="Calibri"/>
+              </w:rPr>
+              <w:t>TRI-2</w:t>
             </w:r>
           </w:p>
         </w:tc>
@@ -6007,214 +5990,6 @@
       <w:tr>
         <w:tc>
           <w:tcPr>
-            <w:tcW w:w="620" w:type="dxa"/>
-            <w:tcBorders>
-              <w:top w:val="single" w:sz="4" w:space="0" w:color="000000"/>
-              <w:left w:val="single" w:sz="4" w:space="0" w:color="000000"/>
-              <w:bottom w:val="single" w:sz="4" w:space="0" w:color="000000"/>
-              <w:right w:val="single" w:sz="4" w:space="0" w:color="000000"/>
-            </w:tcBorders>
-            <w:shd w:val="clear" w:color="000000" w:fill="FFFFFF"/>
-            <w:tcMar>
-              <w:left w:w="108" w:type="dxa"/>
-              <w:right w:w="108" w:type="dxa"/>
-            </w:tcMar>
-            <w:vAlign w:val="center"/>
-          </w:tcPr>
-          <w:p>
-            <w:pPr>
-              <w:spacing w:after="0" w:line="240" w:lineRule="auto"/>
-              <w:jc w:val="center"/>
-              <w:rPr>
-                <w:rFonts w:ascii="Calibri" w:eastAsia="Calibri" w:hAnsi="Calibri" w:cs="Calibri"/>
-                <w:sz w:val="24"/>
-              </w:rPr>
-            </w:pPr>
-            <w:r>
-              <w:rPr>
-                <w:rFonts w:ascii="Calibri" w:eastAsia="Calibri" w:hAnsi="Calibri" w:cs="Calibri"/>
-                <w:sz w:val="24"/>
-              </w:rPr>
-              <w:t>7</w:t>
-            </w:r>
-          </w:p>
-        </w:tc>
-        <w:tc>
-          <w:tcPr>
-            <w:tcW w:w="1414" w:type="dxa"/>
-            <w:tcBorders>
-              <w:top w:val="single" w:sz="4" w:space="0" w:color="000000"/>
-              <w:left w:val="single" w:sz="4" w:space="0" w:color="000000"/>
-              <w:bottom w:val="single" w:sz="4" w:space="0" w:color="000000"/>
-              <w:right w:val="single" w:sz="4" w:space="0" w:color="000000"/>
-            </w:tcBorders>
-            <w:shd w:val="clear" w:color="000000" w:fill="FFFFFF"/>
-            <w:tcMar>
-              <w:left w:w="108" w:type="dxa"/>
-              <w:right w:w="108" w:type="dxa"/>
-            </w:tcMar>
-          </w:tcPr>
-          <w:p>
-            <w:pPr>
-              <w:spacing w:after="0" w:line="240" w:lineRule="auto"/>
-              <w:jc w:val="center"/>
-              <w:rPr>
-                <w:rFonts w:ascii="Calibri" w:eastAsia="Calibri" w:hAnsi="Calibri" w:cs="Calibri"/>
-                <w:sz w:val="24"/>
-              </w:rPr>
-            </w:pPr>
-            <w:r>
-              <w:rPr>
-                <w:rFonts w:ascii="Calibri" w:eastAsia="Calibri" w:hAnsi="Calibri" w:cs="Calibri"/>
-                <w:sz w:val="24"/>
-              </w:rPr>
-              <w:t>10:30</w:t>
-            </w:r>
-          </w:p>
-        </w:tc>
-        <w:tc>
-          <w:tcPr>
-            <w:tcW w:w="1339" w:type="dxa"/>
-            <w:tcBorders>
-              <w:top w:val="single" w:sz="4" w:space="0" w:color="000000"/>
-              <w:left w:val="single" w:sz="4" w:space="0" w:color="000000"/>
-              <w:bottom w:val="single" w:sz="4" w:space="0" w:color="000000"/>
-              <w:right w:val="single" w:sz="4" w:space="0" w:color="000000"/>
-            </w:tcBorders>
-            <w:shd w:val="clear" w:color="000000" w:fill="FFFFFF"/>
-            <w:tcMar>
-              <w:left w:w="108" w:type="dxa"/>
-              <w:right w:w="108" w:type="dxa"/>
-            </w:tcMar>
-          </w:tcPr>
-          <w:p>
-            <w:pPr>
-              <w:spacing w:after="0" w:line="240" w:lineRule="auto"/>
-              <w:jc w:val="center"/>
-              <w:rPr>
-                <w:rFonts w:ascii="Calibri" w:eastAsia="Calibri" w:hAnsi="Calibri" w:cs="Calibri"/>
-                <w:sz w:val="24"/>
-              </w:rPr>
-            </w:pPr>
-            <w:r>
-              <w:rPr>
-                <w:rFonts w:ascii="Calibri" w:eastAsia="Calibri" w:hAnsi="Calibri" w:cs="Calibri"/>
-                <w:sz w:val="24"/>
-              </w:rPr>
-              <w:t>13:30</w:t>
-            </w:r>
-          </w:p>
-        </w:tc>
-        <w:tc>
-          <w:tcPr>
-            <w:tcW w:w="1810" w:type="dxa"/>
-            <w:tcBorders>
-              <w:top w:val="single" w:sz="4" w:space="0" w:color="000000"/>
-              <w:left w:val="single" w:sz="4" w:space="0" w:color="000000"/>
-              <w:bottom w:val="single" w:sz="4" w:space="0" w:color="000000"/>
-              <w:right w:val="single" w:sz="4" w:space="0" w:color="000000"/>
-            </w:tcBorders>
-            <w:shd w:val="clear" w:color="000000" w:fill="FFFFFF"/>
-            <w:tcMar>
-              <w:left w:w="108" w:type="dxa"/>
-              <w:right w:w="108" w:type="dxa"/>
-            </w:tcMar>
-          </w:tcPr>
-          <w:p>
-            <w:pPr>
-              <w:spacing w:after="0" w:line="240" w:lineRule="auto"/>
-              <w:jc w:val="center"/>
-              <w:rPr>
-                <w:rFonts w:ascii="Calibri" w:eastAsia="Calibri" w:hAnsi="Calibri" w:cs="Calibri"/>
-              </w:rPr>
-            </w:pPr>
-            <w:r>
-              <w:rPr>
-                <w:rFonts w:ascii="Calibri" w:eastAsia="Calibri" w:hAnsi="Calibri" w:cs="Calibri"/>
-              </w:rPr>
-              <w:t>SMRT</w:t>
-            </w:r>
-          </w:p>
-        </w:tc>
-        <w:tc>
-          <w:tcPr>
-            <w:tcW w:w="1387" w:type="dxa"/>
-            <w:tcBorders>
-              <w:top w:val="single" w:sz="4" w:space="0" w:color="000000"/>
-              <w:left w:val="single" w:sz="4" w:space="0" w:color="000000"/>
-              <w:bottom w:val="single" w:sz="4" w:space="0" w:color="000000"/>
-              <w:right w:val="single" w:sz="4" w:space="0" w:color="000000"/>
-            </w:tcBorders>
-            <w:shd w:val="clear" w:color="000000" w:fill="FFFFFF"/>
-            <w:tcMar>
-              <w:left w:w="108" w:type="dxa"/>
-              <w:right w:w="108" w:type="dxa"/>
-            </w:tcMar>
-          </w:tcPr>
-          <w:p>
-            <w:pPr>
-              <w:spacing w:after="0" w:line="240" w:lineRule="auto"/>
-              <w:jc w:val="center"/>
-              <w:rPr>
-                <w:rFonts w:ascii="Calibri" w:eastAsia="Calibri" w:hAnsi="Calibri" w:cs="Calibri"/>
-              </w:rPr>
-            </w:pPr>
-          </w:p>
-        </w:tc>
-        <w:tc>
-          <w:tcPr>
-            <w:tcW w:w="1180" w:type="dxa"/>
-            <w:tcBorders>
-              <w:top w:val="single" w:sz="4" w:space="0" w:color="000000"/>
-              <w:left w:val="single" w:sz="4" w:space="0" w:color="000000"/>
-              <w:bottom w:val="single" w:sz="4" w:space="0" w:color="000000"/>
-              <w:right w:val="single" w:sz="4" w:space="0" w:color="000000"/>
-            </w:tcBorders>
-            <w:shd w:val="clear" w:color="000000" w:fill="FFFFFF"/>
-            <w:tcMar>
-              <w:left w:w="108" w:type="dxa"/>
-              <w:right w:w="108" w:type="dxa"/>
-            </w:tcMar>
-          </w:tcPr>
-          <w:p>
-            <w:pPr>
-              <w:spacing w:after="0" w:line="240" w:lineRule="auto"/>
-              <w:jc w:val="center"/>
-              <w:rPr>
-                <w:rFonts w:ascii="Calibri" w:eastAsia="Calibri" w:hAnsi="Calibri" w:cs="Calibri"/>
-              </w:rPr>
-            </w:pPr>
-          </w:p>
-        </w:tc>
-        <w:tc>
-          <w:tcPr>
-            <w:tcW w:w="1168" w:type="dxa"/>
-            <w:tcBorders>
-              <w:top w:val="single" w:sz="4" w:space="0" w:color="000000"/>
-              <w:left w:val="single" w:sz="4" w:space="0" w:color="000000"/>
-              <w:bottom w:val="single" w:sz="4" w:space="0" w:color="000000"/>
-              <w:right w:val="single" w:sz="4" w:space="0" w:color="000000"/>
-            </w:tcBorders>
-            <w:shd w:val="clear" w:color="000000" w:fill="FFFFFF"/>
-            <w:tcMar>
-              <w:left w:w="108" w:type="dxa"/>
-              <w:right w:w="108" w:type="dxa"/>
-            </w:tcMar>
-          </w:tcPr>
-          <w:p>
-            <w:pPr>
-              <w:spacing w:after="0" w:line="240" w:lineRule="auto"/>
-              <w:jc w:val="center"/>
-              <w:rPr>
-                <w:rFonts w:ascii="Calibri" w:eastAsia="Calibri" w:hAnsi="Calibri" w:cs="Calibri"/>
-              </w:rPr>
-            </w:pPr>
-          </w:p>
-        </w:tc>
-      </w:tr>
-      <w:tr>
-        <w:tc>
-          <w:tcPr>
             <w:tcW w:w="8918" w:type="dxa"/>
             <w:gridSpan w:val="7"/>
             <w:tcBorders>
@@ -6259,7 +6034,35 @@
                 <w:rFonts w:ascii="Calibri" w:eastAsia="Calibri" w:hAnsi="Calibri" w:cs="Calibri"/>
                 <w:sz w:val="24"/>
               </w:rPr>
-              <w:t>TRI2,JTA, ADM11,ADM10</w:t>
+              <w:t>AS1</w:t>
+            </w:r>
+            <w:r>
+              <w:rPr>
+                <w:rFonts w:ascii="Calibri" w:eastAsia="Calibri" w:hAnsi="Calibri" w:cs="Calibri"/>
+                <w:b/>
+                <w:sz w:val="24"/>
+              </w:rPr>
+              <w:t>,</w:t>
+            </w:r>
+            <w:r>
+              <w:rPr>
+                <w:rFonts w:ascii="Calibri" w:eastAsia="Calibri" w:hAnsi="Calibri" w:cs="Calibri"/>
+                <w:sz w:val="24"/>
+              </w:rPr>
+              <w:t>ADM10,</w:t>
+            </w:r>
+            <w:r>
+              <w:rPr>
+                <w:rFonts w:ascii="Calibri" w:eastAsia="Calibri" w:hAnsi="Calibri" w:cs="Calibri"/>
+              </w:rPr>
+              <w:t xml:space="preserve"> FOSSIL</w:t>
+            </w:r>
+            <w:r>
+              <w:rPr>
+                <w:rFonts w:ascii="Calibri" w:eastAsia="Calibri" w:hAnsi="Calibri" w:cs="Calibri"/>
+                <w:sz w:val="24"/>
+              </w:rPr>
+              <w:t xml:space="preserve"> VKDN1,VKDN2,ABN8</w:t>
             </w:r>
           </w:p>
         </w:tc>
@@ -6343,10 +6146,10 @@
       </w:pPr>
       <w:r>
         <w:object w:dxaOrig="1188" w:dyaOrig="900">
-          <v:rect id="_x0000_i1025" style="width:59.75pt;height:44.45pt" o:ole="" o:preferrelative="t" stroked="f">
+          <v:rect id="_x0000_i1025" style="width:59.9pt;height:44.15pt" o:ole="" o:preferrelative="t" stroked="f">
             <v:imagedata r:id="rId5" o:title=""/>
           </v:rect>
-          <o:OLEObject Type="Embed" ProgID="StaticMetafile" ShapeID="_x0000_i1025" DrawAspect="Content" ObjectID="_1848831666" r:id="rId6"/>
+          <o:OLEObject Type="Embed" ProgID="StaticMetafile" ShapeID="_x0000_i1025" DrawAspect="Content" ObjectID="_1848918822" r:id="rId6"/>
         </w:object>
       </w:r>
     </w:p>
@@ -6882,7 +6685,7 @@
                 <w:sz w:val="24"/>
                 <w:szCs w:val="24"/>
               </w:rPr>
-              <w:t>JYOTI</w:t>
+              <w:t>TAPTI</w:t>
             </w:r>
           </w:p>
         </w:tc>
@@ -6931,14 +6734,17 @@
               <w:jc w:val="center"/>
               <w:rPr>
                 <w:rFonts w:ascii="Calibri" w:eastAsia="Calibri" w:hAnsi="Calibri" w:cs="Calibri"/>
-              </w:rPr>
-            </w:pPr>
-            <w:r>
-              <w:rPr>
-                <w:rFonts w:ascii="Calibri" w:eastAsia="Calibri" w:hAnsi="Calibri" w:cs="Calibri"/>
-                <w:sz w:val="30"/>
-              </w:rPr>
-              <w:t>RRI</w:t>
+                <w:sz w:val="28"/>
+                <w:szCs w:val="28"/>
+              </w:rPr>
+            </w:pPr>
+            <w:r>
+              <w:rPr>
+                <w:rFonts w:ascii="Calibri" w:eastAsia="Calibri" w:hAnsi="Calibri" w:cs="Calibri"/>
+                <w:sz w:val="28"/>
+                <w:szCs w:val="28"/>
+              </w:rPr>
+              <w:t>GVX</w:t>
             </w:r>
           </w:p>
         </w:tc>
@@ -7096,15 +6902,7 @@
                 <w:sz w:val="24"/>
                 <w:szCs w:val="24"/>
               </w:rPr>
-              <w:t>CHRU</w:t>
-            </w:r>
-            <w:r>
-              <w:rPr>
-                <w:rFonts w:ascii="Calibri" w:eastAsia="Calibri" w:hAnsi="Calibri" w:cs="Calibri"/>
-                <w:sz w:val="24"/>
-                <w:szCs w:val="24"/>
-              </w:rPr>
-              <w:t xml:space="preserve"> </w:t>
+              <w:t>CHARU</w:t>
             </w:r>
           </w:p>
         </w:tc>
@@ -7154,14 +6952,17 @@
               <w:jc w:val="center"/>
               <w:rPr>
                 <w:rFonts w:ascii="Calibri" w:eastAsia="Calibri" w:hAnsi="Calibri" w:cs="Calibri"/>
-              </w:rPr>
-            </w:pPr>
-            <w:r>
-              <w:rPr>
-                <w:rFonts w:ascii="Calibri" w:eastAsia="Calibri" w:hAnsi="Calibri" w:cs="Calibri"/>
-                <w:sz w:val="30"/>
-              </w:rPr>
-              <w:t>RRI</w:t>
+                <w:sz w:val="28"/>
+                <w:szCs w:val="28"/>
+              </w:rPr>
+            </w:pPr>
+            <w:r>
+              <w:rPr>
+                <w:rFonts w:ascii="Calibri" w:eastAsia="Calibri" w:hAnsi="Calibri" w:cs="Calibri"/>
+                <w:sz w:val="28"/>
+                <w:szCs w:val="28"/>
+              </w:rPr>
+              <w:t>GVX</w:t>
             </w:r>
           </w:p>
         </w:tc>
@@ -7375,7 +7176,7 @@
                 <w:sz w:val="28"/>
                 <w:szCs w:val="28"/>
               </w:rPr>
-              <w:t>RRI</w:t>
+              <w:t>GVX</w:t>
             </w:r>
           </w:p>
         </w:tc>

</xml_diff>

<commit_message>
Sync - 2026-08-23 17:23
</commit_message>
<xml_diff>
--- a/files/Daily_Helicopter_Schedule.docx
+++ b/files/Daily_Helicopter_Schedule.docx
@@ -35,7 +35,7 @@
           <w:b/>
           <w:color w:val="000000" w:themeColor="text1"/>
         </w:rPr>
-        <w:t>23</w:t>
+        <w:t>24</w:t>
       </w:r>
       <w:r>
         <w:rPr>
@@ -59,7 +59,7 @@
           <w:b/>
           <w:color w:val="000000" w:themeColor="text1"/>
         </w:rPr>
-        <w:t>SUN</w:t>
+        <w:t>MON</w:t>
       </w:r>
       <w:r>
         <w:rPr>
@@ -589,7 +589,6 @@
             <w:r>
               <w:rPr>
                 <w:rFonts w:ascii="Calibri" w:eastAsia="Calibri" w:hAnsi="Calibri" w:cs="Calibri"/>
-                <w:sz w:val="24"/>
               </w:rPr>
               <w:t>1</w:t>
             </w:r>
@@ -621,7 +620,6 @@
             <w:r>
               <w:rPr>
                 <w:rFonts w:ascii="Calibri" w:eastAsia="Calibri" w:hAnsi="Calibri" w:cs="Calibri"/>
-                <w:sz w:val="24"/>
               </w:rPr>
               <w:t>06:30</w:t>
             </w:r>
@@ -653,7 +651,6 @@
             <w:r>
               <w:rPr>
                 <w:rFonts w:ascii="Calibri" w:eastAsia="Calibri" w:hAnsi="Calibri" w:cs="Calibri"/>
-                <w:sz w:val="24"/>
               </w:rPr>
               <w:t>08:00</w:t>
             </w:r>
@@ -685,7 +682,6 @@
             <w:r>
               <w:rPr>
                 <w:rFonts w:ascii="Calibri" w:eastAsia="Calibri" w:hAnsi="Calibri" w:cs="Calibri"/>
-                <w:sz w:val="24"/>
               </w:rPr>
               <w:t>BLQ (D)</w:t>
             </w:r>
@@ -717,9 +713,20 @@
             <w:r>
               <w:rPr>
                 <w:rFonts w:ascii="Calibri" w:eastAsia="Calibri" w:hAnsi="Calibri" w:cs="Calibri"/>
-                <w:sz w:val="24"/>
-              </w:rPr>
-              <w:t>GVHL412</w:t>
+              </w:rPr>
+              <w:t>GVHL</w:t>
+            </w:r>
+            <w:r>
+              <w:rPr>
+                <w:rFonts w:ascii="Calibri" w:eastAsia="Calibri" w:hAnsi="Calibri" w:cs="Calibri"/>
+              </w:rPr>
+              <w:t xml:space="preserve"> </w:t>
+            </w:r>
+            <w:r>
+              <w:rPr>
+                <w:rFonts w:ascii="Calibri" w:eastAsia="Calibri" w:hAnsi="Calibri" w:cs="Calibri"/>
+              </w:rPr>
+              <w:t>412</w:t>
             </w:r>
           </w:p>
         </w:tc>
@@ -749,7 +756,6 @@
             <w:r>
               <w:rPr>
                 <w:rFonts w:ascii="Calibri" w:eastAsia="Calibri" w:hAnsi="Calibri" w:cs="Calibri"/>
-                <w:sz w:val="24"/>
               </w:rPr>
               <w:t>GVT</w:t>
             </w:r>
@@ -814,7 +820,6 @@
             <w:r>
               <w:rPr>
                 <w:rFonts w:ascii="Calibri" w:eastAsia="Calibri" w:hAnsi="Calibri" w:cs="Calibri"/>
-                <w:sz w:val="24"/>
               </w:rPr>
               <w:t>2</w:t>
             </w:r>
@@ -846,7 +851,6 @@
             <w:r>
               <w:rPr>
                 <w:rFonts w:ascii="Calibri" w:eastAsia="Calibri" w:hAnsi="Calibri" w:cs="Calibri"/>
-                <w:sz w:val="24"/>
               </w:rPr>
               <w:t>06:30</w:t>
             </w:r>
@@ -878,7 +882,6 @@
             <w:r>
               <w:rPr>
                 <w:rFonts w:ascii="Calibri" w:eastAsia="Calibri" w:hAnsi="Calibri" w:cs="Calibri"/>
-                <w:sz w:val="24"/>
               </w:rPr>
               <w:t>08:10</w:t>
             </w:r>
@@ -910,7 +913,6 @@
             <w:r>
               <w:rPr>
                 <w:rFonts w:ascii="Calibri" w:eastAsia="Calibri" w:hAnsi="Calibri" w:cs="Calibri"/>
-                <w:sz w:val="24"/>
               </w:rPr>
               <w:t>HF (D)</w:t>
             </w:r>
@@ -942,7 +944,6 @@
             <w:r>
               <w:rPr>
                 <w:rFonts w:ascii="Calibri" w:eastAsia="Calibri" w:hAnsi="Calibri" w:cs="Calibri"/>
-                <w:sz w:val="24"/>
               </w:rPr>
               <w:t>GVHL 169</w:t>
             </w:r>
@@ -1005,7 +1006,6 @@
             <w:r>
               <w:rPr>
                 <w:rFonts w:ascii="Calibri" w:eastAsia="Calibri" w:hAnsi="Calibri" w:cs="Calibri"/>
-                <w:sz w:val="24"/>
               </w:rPr>
               <w:t>08</w:t>
             </w:r>
@@ -1039,7 +1039,6 @@
             <w:r>
               <w:rPr>
                 <w:rFonts w:ascii="Calibri" w:eastAsia="Calibri" w:hAnsi="Calibri" w:cs="Calibri"/>
-                <w:sz w:val="24"/>
               </w:rPr>
               <w:t>3</w:t>
             </w:r>
@@ -1071,7 +1070,6 @@
             <w:r>
               <w:rPr>
                 <w:rFonts w:ascii="Calibri" w:eastAsia="Calibri" w:hAnsi="Calibri" w:cs="Calibri"/>
-                <w:sz w:val="24"/>
               </w:rPr>
               <w:t>06:30</w:t>
             </w:r>
@@ -1103,7 +1101,6 @@
             <w:r>
               <w:rPr>
                 <w:rFonts w:ascii="Calibri" w:eastAsia="Calibri" w:hAnsi="Calibri" w:cs="Calibri"/>
-                <w:sz w:val="24"/>
               </w:rPr>
               <w:t>08:15</w:t>
             </w:r>
@@ -1135,9 +1132,26 @@
             <w:r>
               <w:rPr>
                 <w:rFonts w:ascii="Calibri" w:eastAsia="Calibri" w:hAnsi="Calibri" w:cs="Calibri"/>
-                <w:sz w:val="24"/>
-              </w:rPr>
-              <w:t>SF(D)</w:t>
+              </w:rPr>
+              <w:t>SF</w:t>
+            </w:r>
+            <w:r>
+              <w:rPr>
+                <w:rFonts w:ascii="Calibri" w:eastAsia="Calibri" w:hAnsi="Calibri" w:cs="Calibri"/>
+              </w:rPr>
+              <w:t xml:space="preserve"> </w:t>
+            </w:r>
+            <w:r>
+              <w:rPr>
+                <w:rFonts w:ascii="Calibri" w:eastAsia="Calibri" w:hAnsi="Calibri" w:cs="Calibri"/>
+              </w:rPr>
+              <w:t>(D)</w:t>
+            </w:r>
+            <w:r>
+              <w:rPr>
+                <w:rFonts w:ascii="Calibri" w:eastAsia="Calibri" w:hAnsi="Calibri" w:cs="Calibri"/>
+              </w:rPr>
+              <w:t xml:space="preserve"> + NF (D)</w:t>
             </w:r>
           </w:p>
         </w:tc>
@@ -1167,7 +1181,6 @@
             <w:r>
               <w:rPr>
                 <w:rFonts w:ascii="Calibri" w:eastAsia="Calibri" w:hAnsi="Calibri" w:cs="Calibri"/>
-                <w:sz w:val="24"/>
               </w:rPr>
               <w:t>GVHL 169</w:t>
             </w:r>
@@ -1199,16 +1212,8 @@
             <w:r>
               <w:rPr>
                 <w:rFonts w:ascii="Calibri" w:eastAsia="Calibri" w:hAnsi="Calibri" w:cs="Calibri"/>
-                <w:sz w:val="24"/>
-              </w:rPr>
-              <w:t xml:space="preserve"> </w:t>
-            </w:r>
-            <w:r>
-              <w:rPr>
-                <w:rFonts w:ascii="Calibri" w:eastAsia="Calibri" w:hAnsi="Calibri" w:cs="Calibri"/>
-                <w:sz w:val="24"/>
-              </w:rPr>
-              <w:t>RRL</w:t>
+              </w:rPr>
+              <w:t xml:space="preserve"> RRL</w:t>
             </w:r>
           </w:p>
         </w:tc>
@@ -1238,240 +1243,6 @@
             <w:r>
               <w:rPr>
                 <w:rFonts w:ascii="Calibri" w:eastAsia="Calibri" w:hAnsi="Calibri" w:cs="Calibri"/>
-                <w:sz w:val="24"/>
-              </w:rPr>
-              <w:t>05</w:t>
-            </w:r>
-          </w:p>
-        </w:tc>
-      </w:tr>
-      <w:tr>
-        <w:tc>
-          <w:tcPr>
-            <w:tcW w:w="620" w:type="dxa"/>
-            <w:tcBorders>
-              <w:top w:val="single" w:sz="4" w:space="0" w:color="000000"/>
-              <w:left w:val="single" w:sz="4" w:space="0" w:color="000000"/>
-              <w:bottom w:val="single" w:sz="4" w:space="0" w:color="000000"/>
-              <w:right w:val="single" w:sz="4" w:space="0" w:color="000000"/>
-            </w:tcBorders>
-            <w:shd w:val="clear" w:color="auto" w:fill="auto"/>
-            <w:tcMar>
-              <w:left w:w="108" w:type="dxa"/>
-              <w:right w:w="108" w:type="dxa"/>
-            </w:tcMar>
-          </w:tcPr>
-          <w:p>
-            <w:pPr>
-              <w:spacing w:after="0" w:line="240" w:lineRule="auto"/>
-              <w:jc w:val="center"/>
-              <w:rPr>
-                <w:rFonts w:ascii="Calibri" w:eastAsia="Calibri" w:hAnsi="Calibri" w:cs="Calibri"/>
-                <w:sz w:val="24"/>
-              </w:rPr>
-            </w:pPr>
-            <w:r>
-              <w:rPr>
-                <w:rFonts w:ascii="Calibri" w:eastAsia="Calibri" w:hAnsi="Calibri" w:cs="Calibri"/>
-                <w:sz w:val="24"/>
-              </w:rPr>
-              <w:t>4</w:t>
-            </w:r>
-          </w:p>
-        </w:tc>
-        <w:tc>
-          <w:tcPr>
-            <w:tcW w:w="1414" w:type="dxa"/>
-            <w:tcBorders>
-              <w:top w:val="single" w:sz="4" w:space="0" w:color="000000"/>
-              <w:left w:val="single" w:sz="4" w:space="0" w:color="000000"/>
-              <w:bottom w:val="single" w:sz="4" w:space="0" w:color="000000"/>
-              <w:right w:val="single" w:sz="4" w:space="0" w:color="000000"/>
-            </w:tcBorders>
-            <w:shd w:val="clear" w:color="auto" w:fill="auto"/>
-            <w:tcMar>
-              <w:left w:w="108" w:type="dxa"/>
-              <w:right w:w="108" w:type="dxa"/>
-            </w:tcMar>
-          </w:tcPr>
-          <w:p>
-            <w:pPr>
-              <w:spacing w:after="0" w:line="240" w:lineRule="auto"/>
-              <w:jc w:val="center"/>
-              <w:rPr>
-                <w:rFonts w:ascii="Calibri" w:eastAsia="Calibri" w:hAnsi="Calibri" w:cs="Calibri"/>
-                <w:sz w:val="24"/>
-              </w:rPr>
-            </w:pPr>
-            <w:r>
-              <w:rPr>
-                <w:rFonts w:ascii="Calibri" w:eastAsia="Calibri" w:hAnsi="Calibri" w:cs="Calibri"/>
-                <w:sz w:val="24"/>
-              </w:rPr>
-              <w:t>06:30</w:t>
-            </w:r>
-          </w:p>
-        </w:tc>
-        <w:tc>
-          <w:tcPr>
-            <w:tcW w:w="1339" w:type="dxa"/>
-            <w:tcBorders>
-              <w:top w:val="single" w:sz="4" w:space="0" w:color="000000"/>
-              <w:left w:val="single" w:sz="4" w:space="0" w:color="000000"/>
-              <w:bottom w:val="single" w:sz="4" w:space="0" w:color="000000"/>
-              <w:right w:val="single" w:sz="4" w:space="0" w:color="000000"/>
-            </w:tcBorders>
-            <w:shd w:val="clear" w:color="auto" w:fill="auto"/>
-            <w:tcMar>
-              <w:left w:w="108" w:type="dxa"/>
-              <w:right w:w="108" w:type="dxa"/>
-            </w:tcMar>
-          </w:tcPr>
-          <w:p>
-            <w:pPr>
-              <w:spacing w:after="0" w:line="240" w:lineRule="auto"/>
-              <w:jc w:val="center"/>
-              <w:rPr>
-                <w:rFonts w:ascii="Calibri" w:eastAsia="Calibri" w:hAnsi="Calibri" w:cs="Calibri"/>
-                <w:sz w:val="24"/>
-              </w:rPr>
-            </w:pPr>
-            <w:r>
-              <w:rPr>
-                <w:rFonts w:ascii="Calibri" w:eastAsia="Calibri" w:hAnsi="Calibri" w:cs="Calibri"/>
-                <w:sz w:val="24"/>
-              </w:rPr>
-              <w:t>08:20</w:t>
-            </w:r>
-          </w:p>
-        </w:tc>
-        <w:tc>
-          <w:tcPr>
-            <w:tcW w:w="1810" w:type="dxa"/>
-            <w:tcBorders>
-              <w:top w:val="single" w:sz="4" w:space="0" w:color="000000"/>
-              <w:left w:val="single" w:sz="4" w:space="0" w:color="000000"/>
-              <w:bottom w:val="single" w:sz="4" w:space="0" w:color="000000"/>
-              <w:right w:val="single" w:sz="4" w:space="0" w:color="000000"/>
-            </w:tcBorders>
-            <w:shd w:val="clear" w:color="auto" w:fill="auto"/>
-            <w:tcMar>
-              <w:left w:w="108" w:type="dxa"/>
-              <w:right w:w="108" w:type="dxa"/>
-            </w:tcMar>
-          </w:tcPr>
-          <w:p>
-            <w:pPr>
-              <w:spacing w:after="0" w:line="240" w:lineRule="auto"/>
-              <w:jc w:val="center"/>
-              <w:rPr>
-                <w:rFonts w:ascii="Calibri" w:eastAsia="Calibri" w:hAnsi="Calibri" w:cs="Calibri"/>
-                <w:sz w:val="24"/>
-              </w:rPr>
-            </w:pPr>
-            <w:r>
-              <w:rPr>
-                <w:rFonts w:ascii="Calibri" w:eastAsia="Calibri" w:hAnsi="Calibri" w:cs="Calibri"/>
-                <w:sz w:val="24"/>
-              </w:rPr>
-              <w:t>NF[D]</w:t>
-            </w:r>
-          </w:p>
-        </w:tc>
-        <w:tc>
-          <w:tcPr>
-            <w:tcW w:w="1387" w:type="dxa"/>
-            <w:tcBorders>
-              <w:top w:val="single" w:sz="4" w:space="0" w:color="000000"/>
-              <w:left w:val="single" w:sz="4" w:space="0" w:color="000000"/>
-              <w:bottom w:val="single" w:sz="4" w:space="0" w:color="000000"/>
-              <w:right w:val="single" w:sz="4" w:space="0" w:color="000000"/>
-            </w:tcBorders>
-            <w:shd w:val="clear" w:color="000000" w:fill="FFFFFF"/>
-            <w:tcMar>
-              <w:left w:w="108" w:type="dxa"/>
-              <w:right w:w="108" w:type="dxa"/>
-            </w:tcMar>
-          </w:tcPr>
-          <w:p>
-            <w:pPr>
-              <w:spacing w:after="0" w:line="240" w:lineRule="auto"/>
-              <w:jc w:val="center"/>
-              <w:rPr>
-                <w:rFonts w:ascii="Calibri" w:eastAsia="Calibri" w:hAnsi="Calibri" w:cs="Calibri"/>
-                <w:sz w:val="24"/>
-              </w:rPr>
-            </w:pPr>
-            <w:r>
-              <w:rPr>
-                <w:rFonts w:ascii="Calibri" w:eastAsia="Calibri" w:hAnsi="Calibri" w:cs="Calibri"/>
-                <w:sz w:val="24"/>
-              </w:rPr>
-              <w:t>GVHL 412</w:t>
-            </w:r>
-          </w:p>
-        </w:tc>
-        <w:tc>
-          <w:tcPr>
-            <w:tcW w:w="1180" w:type="dxa"/>
-            <w:tcBorders>
-              <w:top w:val="single" w:sz="4" w:space="0" w:color="000000"/>
-              <w:left w:val="single" w:sz="4" w:space="0" w:color="000000"/>
-              <w:bottom w:val="single" w:sz="4" w:space="0" w:color="000000"/>
-              <w:right w:val="single" w:sz="4" w:space="0" w:color="000000"/>
-            </w:tcBorders>
-            <w:shd w:val="clear" w:color="000000" w:fill="FFFFFF"/>
-            <w:tcMar>
-              <w:left w:w="108" w:type="dxa"/>
-              <w:right w:w="108" w:type="dxa"/>
-            </w:tcMar>
-          </w:tcPr>
-          <w:p>
-            <w:pPr>
-              <w:spacing w:after="0" w:line="240" w:lineRule="auto"/>
-              <w:jc w:val="center"/>
-              <w:rPr>
-                <w:rFonts w:ascii="Calibri" w:eastAsia="Calibri" w:hAnsi="Calibri" w:cs="Calibri"/>
-                <w:sz w:val="24"/>
-              </w:rPr>
-            </w:pPr>
-            <w:r>
-              <w:rPr>
-                <w:rFonts w:ascii="Calibri" w:eastAsia="Calibri" w:hAnsi="Calibri" w:cs="Calibri"/>
-                <w:sz w:val="24"/>
-              </w:rPr>
-              <w:t>RRI</w:t>
-            </w:r>
-          </w:p>
-        </w:tc>
-        <w:tc>
-          <w:tcPr>
-            <w:tcW w:w="1168" w:type="dxa"/>
-            <w:tcBorders>
-              <w:top w:val="single" w:sz="4" w:space="0" w:color="000000"/>
-              <w:left w:val="single" w:sz="4" w:space="0" w:color="000000"/>
-              <w:bottom w:val="single" w:sz="4" w:space="0" w:color="000000"/>
-              <w:right w:val="single" w:sz="4" w:space="0" w:color="000000"/>
-            </w:tcBorders>
-            <w:shd w:val="clear" w:color="auto" w:fill="auto"/>
-            <w:tcMar>
-              <w:left w:w="108" w:type="dxa"/>
-              <w:right w:w="108" w:type="dxa"/>
-            </w:tcMar>
-          </w:tcPr>
-          <w:p>
-            <w:pPr>
-              <w:spacing w:after="0" w:line="240" w:lineRule="auto"/>
-              <w:jc w:val="center"/>
-              <w:rPr>
-                <w:rFonts w:ascii="Calibri" w:eastAsia="Calibri" w:hAnsi="Calibri" w:cs="Calibri"/>
-                <w:sz w:val="24"/>
-              </w:rPr>
-            </w:pPr>
-            <w:r>
-              <w:rPr>
-                <w:rFonts w:ascii="Calibri" w:eastAsia="Calibri" w:hAnsi="Calibri" w:cs="Calibri"/>
-                <w:sz w:val="24"/>
               </w:rPr>
               <w:t>05</w:t>
             </w:r>
@@ -1548,7 +1319,6 @@
             <w:r>
               <w:rPr>
                 <w:rFonts w:ascii="Calibri" w:eastAsia="Calibri" w:hAnsi="Calibri" w:cs="Calibri"/>
-                <w:sz w:val="24"/>
               </w:rPr>
               <w:t>1</w:t>
             </w:r>
@@ -1580,7 +1350,6 @@
             <w:r>
               <w:rPr>
                 <w:rFonts w:ascii="Calibri" w:eastAsia="Calibri" w:hAnsi="Calibri" w:cs="Calibri"/>
-                <w:sz w:val="24"/>
               </w:rPr>
               <w:t>08:00</w:t>
             </w:r>
@@ -1616,7 +1385,6 @@
             <w:r>
               <w:rPr>
                 <w:rFonts w:ascii="Calibri" w:eastAsia="Calibri" w:hAnsi="Calibri" w:cs="Calibri"/>
-                <w:sz w:val="24"/>
               </w:rPr>
               <w:t>10:30</w:t>
             </w:r>
@@ -1648,7 +1416,6 @@
             <w:r>
               <w:rPr>
                 <w:rFonts w:ascii="Calibri" w:eastAsia="Calibri" w:hAnsi="Calibri" w:cs="Calibri"/>
-                <w:sz w:val="24"/>
               </w:rPr>
               <w:t>HF (PM)</w:t>
             </w:r>
@@ -1681,10 +1448,20 @@
             <w:r>
               <w:rPr>
                 <w:rFonts w:ascii="Calibri" w:eastAsia="Calibri" w:hAnsi="Calibri" w:cs="Calibri"/>
-                <w:b/>
-                <w:sz w:val="24"/>
-              </w:rPr>
-              <w:t>NA</w:t>
+              </w:rPr>
+              <w:t>GVHL</w:t>
+            </w:r>
+            <w:r>
+              <w:rPr>
+                <w:rFonts w:ascii="Calibri" w:eastAsia="Calibri" w:hAnsi="Calibri" w:cs="Calibri"/>
+              </w:rPr>
+              <w:t xml:space="preserve"> </w:t>
+            </w:r>
+            <w:r>
+              <w:rPr>
+                <w:rFonts w:ascii="Calibri" w:eastAsia="Calibri" w:hAnsi="Calibri" w:cs="Calibri"/>
+              </w:rPr>
+              <w:t>412</w:t>
             </w:r>
           </w:p>
         </w:tc>
@@ -1709,16 +1486,13 @@
               <w:jc w:val="center"/>
               <w:rPr>
                 <w:rFonts w:ascii="Calibri" w:eastAsia="Calibri" w:hAnsi="Calibri" w:cs="Calibri"/>
-                <w:b/>
-              </w:rPr>
-            </w:pPr>
-            <w:r>
-              <w:rPr>
-                <w:rFonts w:ascii="Calibri" w:eastAsia="Calibri" w:hAnsi="Calibri" w:cs="Calibri"/>
-                <w:b/>
-                <w:sz w:val="24"/>
-              </w:rPr>
-              <w:t>NA</w:t>
+              </w:rPr>
+            </w:pPr>
+            <w:r>
+              <w:rPr>
+                <w:rFonts w:ascii="Calibri" w:eastAsia="Calibri" w:hAnsi="Calibri" w:cs="Calibri"/>
+              </w:rPr>
+              <w:t>RRI</w:t>
             </w:r>
           </w:p>
         </w:tc>
@@ -1748,9 +1522,14 @@
             <w:r>
               <w:rPr>
                 <w:rFonts w:ascii="Calibri" w:eastAsia="Calibri" w:hAnsi="Calibri" w:cs="Calibri"/>
-                <w:sz w:val="24"/>
-              </w:rPr>
-              <w:t>00</w:t>
+              </w:rPr>
+              <w:t>0</w:t>
+            </w:r>
+            <w:r>
+              <w:rPr>
+                <w:rFonts w:ascii="Calibri" w:eastAsia="Calibri" w:hAnsi="Calibri" w:cs="Calibri"/>
+              </w:rPr>
+              <w:t>8</w:t>
             </w:r>
           </w:p>
         </w:tc>
@@ -1782,7 +1561,6 @@
             <w:r>
               <w:rPr>
                 <w:rFonts w:ascii="Calibri" w:eastAsia="Calibri" w:hAnsi="Calibri" w:cs="Calibri"/>
-                <w:sz w:val="24"/>
               </w:rPr>
               <w:t>2</w:t>
             </w:r>
@@ -1814,7 +1592,6 @@
             <w:r>
               <w:rPr>
                 <w:rFonts w:ascii="Calibri" w:eastAsia="Calibri" w:hAnsi="Calibri" w:cs="Calibri"/>
-                <w:sz w:val="24"/>
               </w:rPr>
               <w:t>08:30</w:t>
             </w:r>
@@ -1850,7 +1627,6 @@
             <w:r>
               <w:rPr>
                 <w:rFonts w:ascii="Calibri" w:eastAsia="Calibri" w:hAnsi="Calibri" w:cs="Calibri"/>
-                <w:sz w:val="24"/>
               </w:rPr>
               <w:t>14:00</w:t>
             </w:r>
@@ -1886,7 +1662,6 @@
             <w:r>
               <w:rPr>
                 <w:rFonts w:ascii="Calibri" w:eastAsia="Calibri" w:hAnsi="Calibri" w:cs="Calibri"/>
-                <w:sz w:val="24"/>
               </w:rPr>
               <w:t>BLQ (N)</w:t>
             </w:r>
@@ -1918,7 +1693,6 @@
             <w:r>
               <w:rPr>
                 <w:rFonts w:ascii="Calibri" w:eastAsia="Calibri" w:hAnsi="Calibri" w:cs="Calibri"/>
-                <w:sz w:val="24"/>
               </w:rPr>
               <w:t>HELIGO 145</w:t>
             </w:r>
@@ -1950,7 +1724,6 @@
             <w:r>
               <w:rPr>
                 <w:rFonts w:ascii="Calibri" w:eastAsia="Calibri" w:hAnsi="Calibri" w:cs="Calibri"/>
-                <w:sz w:val="24"/>
               </w:rPr>
               <w:t>HLY</w:t>
             </w:r>
@@ -1982,7 +1755,6 @@
             <w:r>
               <w:rPr>
                 <w:rFonts w:ascii="Calibri" w:eastAsia="Calibri" w:hAnsi="Calibri" w:cs="Calibri"/>
-                <w:sz w:val="24"/>
               </w:rPr>
               <w:t>07</w:t>
             </w:r>
@@ -2016,7 +1788,6 @@
             <w:r>
               <w:rPr>
                 <w:rFonts w:ascii="Calibri" w:eastAsia="Calibri" w:hAnsi="Calibri" w:cs="Calibri"/>
-                <w:sz w:val="24"/>
               </w:rPr>
               <w:t>3</w:t>
             </w:r>
@@ -2048,7 +1819,6 @@
             <w:r>
               <w:rPr>
                 <w:rFonts w:ascii="Calibri" w:eastAsia="Calibri" w:hAnsi="Calibri" w:cs="Calibri"/>
-                <w:sz w:val="24"/>
               </w:rPr>
               <w:t>12:10</w:t>
             </w:r>
@@ -2084,7 +1854,6 @@
             <w:r>
               <w:rPr>
                 <w:rFonts w:ascii="Calibri" w:eastAsia="Calibri" w:hAnsi="Calibri" w:cs="Calibri"/>
-                <w:sz w:val="24"/>
               </w:rPr>
               <w:t>14:10</w:t>
             </w:r>
@@ -2116,7 +1885,6 @@
             <w:r>
               <w:rPr>
                 <w:rFonts w:ascii="Calibri" w:eastAsia="Calibri" w:hAnsi="Calibri" w:cs="Calibri"/>
-                <w:sz w:val="24"/>
               </w:rPr>
               <w:t>SF (N)</w:t>
             </w:r>
@@ -2151,7 +1919,6 @@
             <w:r>
               <w:rPr>
                 <w:rFonts w:ascii="Calibri" w:eastAsia="Calibri" w:hAnsi="Calibri" w:cs="Calibri"/>
-                <w:sz w:val="24"/>
               </w:rPr>
               <w:t>GVHL 169</w:t>
             </w:r>
@@ -2183,7 +1950,6 @@
             <w:r>
               <w:rPr>
                 <w:rFonts w:ascii="Calibri" w:eastAsia="Calibri" w:hAnsi="Calibri" w:cs="Calibri"/>
-                <w:sz w:val="24"/>
               </w:rPr>
               <w:t>RRN</w:t>
             </w:r>
@@ -2215,7 +1981,6 @@
             <w:r>
               <w:rPr>
                 <w:rFonts w:ascii="Calibri" w:eastAsia="Calibri" w:hAnsi="Calibri" w:cs="Calibri"/>
-                <w:sz w:val="24"/>
               </w:rPr>
               <w:t>05</w:t>
             </w:r>
@@ -2249,7 +2014,6 @@
             <w:r>
               <w:rPr>
                 <w:rFonts w:ascii="Calibri" w:eastAsia="Calibri" w:hAnsi="Calibri" w:cs="Calibri"/>
-                <w:sz w:val="24"/>
               </w:rPr>
               <w:t>4</w:t>
             </w:r>
@@ -2281,7 +2045,6 @@
             <w:r>
               <w:rPr>
                 <w:rFonts w:ascii="Calibri" w:eastAsia="Calibri" w:hAnsi="Calibri" w:cs="Calibri"/>
-                <w:sz w:val="24"/>
               </w:rPr>
               <w:t>12:15</w:t>
             </w:r>
@@ -2317,7 +2080,6 @@
             <w:r>
               <w:rPr>
                 <w:rFonts w:ascii="Calibri" w:eastAsia="Calibri" w:hAnsi="Calibri" w:cs="Calibri"/>
-                <w:sz w:val="24"/>
               </w:rPr>
               <w:t>14:15</w:t>
             </w:r>
@@ -2349,7 +2111,6 @@
             <w:r>
               <w:rPr>
                 <w:rFonts w:ascii="Calibri" w:eastAsia="Calibri" w:hAnsi="Calibri" w:cs="Calibri"/>
-                <w:sz w:val="24"/>
               </w:rPr>
               <w:t>NF (N)</w:t>
             </w:r>
@@ -2446,7 +2207,6 @@
             <w:r>
               <w:rPr>
                 <w:rFonts w:ascii="Calibri" w:eastAsia="Calibri" w:hAnsi="Calibri" w:cs="Calibri"/>
-                <w:sz w:val="24"/>
               </w:rPr>
               <w:t>00</w:t>
             </w:r>
@@ -2523,7 +2283,6 @@
             <w:r>
               <w:rPr>
                 <w:rFonts w:ascii="Calibri" w:eastAsia="Calibri" w:hAnsi="Calibri" w:cs="Calibri"/>
-                <w:sz w:val="24"/>
               </w:rPr>
               <w:t>1</w:t>
             </w:r>
@@ -2555,7 +2314,6 @@
             <w:r>
               <w:rPr>
                 <w:rFonts w:ascii="Calibri" w:eastAsia="Calibri" w:hAnsi="Calibri" w:cs="Calibri"/>
-                <w:sz w:val="24"/>
               </w:rPr>
               <w:t>14:00</w:t>
             </w:r>
@@ -2587,7 +2345,6 @@
             <w:r>
               <w:rPr>
                 <w:rFonts w:ascii="Calibri" w:eastAsia="Calibri" w:hAnsi="Calibri" w:cs="Calibri"/>
-                <w:sz w:val="24"/>
               </w:rPr>
               <w:t>16:30</w:t>
             </w:r>
@@ -2619,7 +2376,6 @@
             <w:r>
               <w:rPr>
                 <w:rFonts w:ascii="Calibri" w:eastAsia="Calibri" w:hAnsi="Calibri" w:cs="Calibri"/>
-                <w:sz w:val="24"/>
               </w:rPr>
               <w:t>MEDEVAC</w:t>
             </w:r>
@@ -2651,7 +2407,6 @@
             <w:r>
               <w:rPr>
                 <w:rFonts w:ascii="Calibri" w:eastAsia="Calibri" w:hAnsi="Calibri" w:cs="Calibri"/>
-                <w:sz w:val="24"/>
               </w:rPr>
               <w:t>GVHL 169</w:t>
             </w:r>
@@ -2683,7 +2438,6 @@
             <w:r>
               <w:rPr>
                 <w:rFonts w:ascii="Calibri" w:eastAsia="Calibri" w:hAnsi="Calibri" w:cs="Calibri"/>
-                <w:sz w:val="24"/>
               </w:rPr>
               <w:t>RRG</w:t>
             </w:r>
@@ -2715,7 +2469,6 @@
             <w:r>
               <w:rPr>
                 <w:rFonts w:ascii="Calibri" w:eastAsia="Calibri" w:hAnsi="Calibri" w:cs="Calibri"/>
-                <w:sz w:val="24"/>
               </w:rPr>
               <w:t>02</w:t>
             </w:r>
@@ -2801,7 +2554,6 @@
             <w:r>
               <w:rPr>
                 <w:rFonts w:ascii="Calibri" w:eastAsia="Calibri" w:hAnsi="Calibri" w:cs="Calibri"/>
-                <w:sz w:val="24"/>
               </w:rPr>
               <w:t>1</w:t>
             </w:r>
@@ -2833,7 +2585,6 @@
             <w:r>
               <w:rPr>
                 <w:rFonts w:ascii="Calibri" w:eastAsia="Calibri" w:hAnsi="Calibri" w:cs="Calibri"/>
-                <w:sz w:val="24"/>
               </w:rPr>
               <w:t>07:00</w:t>
             </w:r>
@@ -2869,7 +2620,6 @@
             <w:r>
               <w:rPr>
                 <w:rFonts w:ascii="Calibri" w:eastAsia="Calibri" w:hAnsi="Calibri" w:cs="Calibri"/>
-                <w:sz w:val="24"/>
               </w:rPr>
               <w:t>09:00</w:t>
             </w:r>
@@ -2902,7 +2652,7 @@
               <w:rPr>
                 <w:rFonts w:ascii="Calibri" w:eastAsia="Calibri" w:hAnsi="Calibri" w:cs="Calibri"/>
               </w:rPr>
-              <w:t>PANNA</w:t>
+              <w:t>BPA</w:t>
             </w:r>
           </w:p>
         </w:tc>
@@ -3009,9 +2759,8 @@
             <w:r>
               <w:rPr>
                 <w:rFonts w:ascii="Calibri" w:eastAsia="Calibri" w:hAnsi="Calibri" w:cs="Calibri"/>
-                <w:sz w:val="24"/>
-              </w:rPr>
-              <w:t>3</w:t>
+              </w:rPr>
+              <w:t>2</w:t>
             </w:r>
           </w:p>
         </w:tc>
@@ -3041,7 +2790,6 @@
             <w:r>
               <w:rPr>
                 <w:rFonts w:ascii="Calibri" w:eastAsia="Calibri" w:hAnsi="Calibri" w:cs="Calibri"/>
-                <w:sz w:val="24"/>
               </w:rPr>
               <w:t>07:30</w:t>
             </w:r>
@@ -3077,7 +2825,6 @@
             <w:r>
               <w:rPr>
                 <w:rFonts w:ascii="Calibri" w:eastAsia="Calibri" w:hAnsi="Calibri" w:cs="Calibri"/>
-                <w:sz w:val="24"/>
               </w:rPr>
               <w:t>09:15</w:t>
             </w:r>
@@ -3104,82 +2851,66 @@
               <w:jc w:val="center"/>
               <w:rPr>
                 <w:rFonts w:ascii="Calibri" w:eastAsia="Calibri" w:hAnsi="Calibri" w:cs="Calibri"/>
+              </w:rPr>
+            </w:pPr>
+            <w:r>
+              <w:rPr>
+                <w:rFonts w:ascii="Calibri" w:eastAsia="Calibri" w:hAnsi="Calibri" w:cs="Calibri"/>
+              </w:rPr>
+              <w:t>BPA</w:t>
+            </w:r>
+          </w:p>
+        </w:tc>
+        <w:tc>
+          <w:tcPr>
+            <w:tcW w:w="1387" w:type="dxa"/>
+            <w:tcBorders>
+              <w:top w:val="single" w:sz="4" w:space="0" w:color="000000"/>
+              <w:left w:val="single" w:sz="4" w:space="0" w:color="000000"/>
+              <w:bottom w:val="single" w:sz="4" w:space="0" w:color="000000"/>
+              <w:right w:val="single" w:sz="4" w:space="0" w:color="000000"/>
+            </w:tcBorders>
+            <w:shd w:val="clear" w:color="000000" w:fill="FFFFFF"/>
+            <w:tcMar>
+              <w:left w:w="108" w:type="dxa"/>
+              <w:right w:w="108" w:type="dxa"/>
+            </w:tcMar>
+          </w:tcPr>
+          <w:p>
+            <w:pPr>
+              <w:spacing w:after="0" w:line="240" w:lineRule="auto"/>
+              <w:jc w:val="center"/>
+              <w:rPr>
+                <w:rFonts w:ascii="Calibri" w:eastAsia="Calibri" w:hAnsi="Calibri" w:cs="Calibri"/>
                 <w:b/>
               </w:rPr>
             </w:pPr>
-            <w:r>
+          </w:p>
+        </w:tc>
+        <w:tc>
+          <w:tcPr>
+            <w:tcW w:w="1180" w:type="dxa"/>
+            <w:tcBorders>
+              <w:top w:val="single" w:sz="4" w:space="0" w:color="000000"/>
+              <w:left w:val="single" w:sz="4" w:space="0" w:color="000000"/>
+              <w:bottom w:val="single" w:sz="4" w:space="0" w:color="000000"/>
+              <w:right w:val="single" w:sz="4" w:space="0" w:color="000000"/>
+            </w:tcBorders>
+            <w:shd w:val="clear" w:color="000000" w:fill="FFFFFF"/>
+            <w:tcMar>
+              <w:left w:w="108" w:type="dxa"/>
+              <w:right w:w="108" w:type="dxa"/>
+            </w:tcMar>
+          </w:tcPr>
+          <w:p>
+            <w:pPr>
+              <w:spacing w:after="0" w:line="240" w:lineRule="auto"/>
+              <w:jc w:val="center"/>
               <w:rPr>
                 <w:rFonts w:ascii="Calibri" w:eastAsia="Calibri" w:hAnsi="Calibri" w:cs="Calibri"/>
                 <w:b/>
               </w:rPr>
-              <w:t>NA</w:t>
-            </w:r>
-          </w:p>
-        </w:tc>
-        <w:tc>
-          <w:tcPr>
-            <w:tcW w:w="1387" w:type="dxa"/>
-            <w:tcBorders>
-              <w:top w:val="single" w:sz="4" w:space="0" w:color="000000"/>
-              <w:left w:val="single" w:sz="4" w:space="0" w:color="000000"/>
-              <w:bottom w:val="single" w:sz="4" w:space="0" w:color="000000"/>
-              <w:right w:val="single" w:sz="4" w:space="0" w:color="000000"/>
-            </w:tcBorders>
-            <w:shd w:val="clear" w:color="000000" w:fill="FFFFFF"/>
-            <w:tcMar>
-              <w:left w:w="108" w:type="dxa"/>
-              <w:right w:w="108" w:type="dxa"/>
-            </w:tcMar>
-          </w:tcPr>
-          <w:p>
-            <w:pPr>
-              <w:spacing w:after="0" w:line="240" w:lineRule="auto"/>
-              <w:jc w:val="center"/>
-              <w:rPr>
-                <w:rFonts w:ascii="Calibri" w:eastAsia="Calibri" w:hAnsi="Calibri" w:cs="Calibri"/>
-                <w:b/>
-              </w:rPr>
-            </w:pPr>
-            <w:r>
-              <w:rPr>
-                <w:rFonts w:ascii="Calibri" w:eastAsia="Calibri" w:hAnsi="Calibri" w:cs="Calibri"/>
-                <w:b/>
-              </w:rPr>
-              <w:t>NA</w:t>
-            </w:r>
-          </w:p>
-        </w:tc>
-        <w:tc>
-          <w:tcPr>
-            <w:tcW w:w="1180" w:type="dxa"/>
-            <w:tcBorders>
-              <w:top w:val="single" w:sz="4" w:space="0" w:color="000000"/>
-              <w:left w:val="single" w:sz="4" w:space="0" w:color="000000"/>
-              <w:bottom w:val="single" w:sz="4" w:space="0" w:color="000000"/>
-              <w:right w:val="single" w:sz="4" w:space="0" w:color="000000"/>
-            </w:tcBorders>
-            <w:shd w:val="clear" w:color="000000" w:fill="FFFFFF"/>
-            <w:tcMar>
-              <w:left w:w="108" w:type="dxa"/>
-              <w:right w:w="108" w:type="dxa"/>
-            </w:tcMar>
-          </w:tcPr>
-          <w:p>
-            <w:pPr>
-              <w:spacing w:after="0" w:line="240" w:lineRule="auto"/>
-              <w:jc w:val="center"/>
-              <w:rPr>
-                <w:rFonts w:ascii="Calibri" w:eastAsia="Calibri" w:hAnsi="Calibri" w:cs="Calibri"/>
-                <w:b/>
-              </w:rPr>
-            </w:pPr>
-            <w:r>
-              <w:rPr>
-                <w:rFonts w:ascii="Calibri" w:eastAsia="Calibri" w:hAnsi="Calibri" w:cs="Calibri"/>
-                <w:b/>
-              </w:rPr>
-              <w:t>NA</w:t>
-            </w:r>
+            </w:pPr>
           </w:p>
         </w:tc>
         <w:tc>
@@ -3235,9 +2966,8 @@
             <w:r>
               <w:rPr>
                 <w:rFonts w:ascii="Calibri" w:eastAsia="Calibri" w:hAnsi="Calibri" w:cs="Calibri"/>
-                <w:sz w:val="24"/>
-              </w:rPr>
-              <w:t>4</w:t>
+              </w:rPr>
+              <w:t>3</w:t>
             </w:r>
           </w:p>
         </w:tc>
@@ -3267,7 +2997,6 @@
             <w:r>
               <w:rPr>
                 <w:rFonts w:ascii="Calibri" w:eastAsia="Calibri" w:hAnsi="Calibri" w:cs="Calibri"/>
-                <w:sz w:val="24"/>
               </w:rPr>
               <w:t>08:00</w:t>
             </w:r>
@@ -3303,7 +3032,6 @@
             <w:r>
               <w:rPr>
                 <w:rFonts w:ascii="Calibri" w:eastAsia="Calibri" w:hAnsi="Calibri" w:cs="Calibri"/>
-                <w:sz w:val="24"/>
               </w:rPr>
               <w:t>11:00</w:t>
             </w:r>
@@ -3336,7 +3064,7 @@
               <w:rPr>
                 <w:rFonts w:ascii="Calibri" w:eastAsia="Calibri" w:hAnsi="Calibri" w:cs="Calibri"/>
               </w:rPr>
-              <w:t>PANNA</w:t>
+              <w:t>BPA</w:t>
             </w:r>
           </w:p>
         </w:tc>
@@ -3438,15 +3166,13 @@
               <w:jc w:val="center"/>
               <w:rPr>
                 <w:rFonts w:ascii="Calibri" w:eastAsia="Calibri" w:hAnsi="Calibri" w:cs="Calibri"/>
-                <w:sz w:val="24"/>
-              </w:rPr>
-            </w:pPr>
-            <w:r>
-              <w:rPr>
-                <w:rFonts w:ascii="Calibri" w:eastAsia="Calibri" w:hAnsi="Calibri" w:cs="Calibri"/>
-                <w:sz w:val="24"/>
-              </w:rPr>
-              <w:t>6</w:t>
+              </w:rPr>
+            </w:pPr>
+            <w:r>
+              <w:rPr>
+                <w:rFonts w:ascii="Calibri" w:eastAsia="Calibri" w:hAnsi="Calibri" w:cs="Calibri"/>
+              </w:rPr>
+              <w:t>4</w:t>
             </w:r>
           </w:p>
         </w:tc>
@@ -3471,13 +3197,11 @@
               <w:jc w:val="center"/>
               <w:rPr>
                 <w:rFonts w:ascii="Calibri" w:eastAsia="Calibri" w:hAnsi="Calibri" w:cs="Calibri"/>
-                <w:sz w:val="24"/>
-              </w:rPr>
-            </w:pPr>
-            <w:r>
-              <w:rPr>
-                <w:rFonts w:ascii="Calibri" w:eastAsia="Calibri" w:hAnsi="Calibri" w:cs="Calibri"/>
-                <w:sz w:val="24"/>
+              </w:rPr>
+            </w:pPr>
+            <w:r>
+              <w:rPr>
+                <w:rFonts w:ascii="Calibri" w:eastAsia="Calibri" w:hAnsi="Calibri" w:cs="Calibri"/>
               </w:rPr>
               <w:t>08:20</w:t>
             </w:r>
@@ -3508,13 +3232,11 @@
               <w:jc w:val="center"/>
               <w:rPr>
                 <w:rFonts w:ascii="Calibri" w:eastAsia="Calibri" w:hAnsi="Calibri" w:cs="Calibri"/>
-                <w:sz w:val="24"/>
-              </w:rPr>
-            </w:pPr>
-            <w:r>
-              <w:rPr>
-                <w:rFonts w:ascii="Calibri" w:eastAsia="Calibri" w:hAnsi="Calibri" w:cs="Calibri"/>
-                <w:sz w:val="24"/>
+              </w:rPr>
+            </w:pPr>
+            <w:r>
+              <w:rPr>
+                <w:rFonts w:ascii="Calibri" w:eastAsia="Calibri" w:hAnsi="Calibri" w:cs="Calibri"/>
               </w:rPr>
               <w:t>13:00</w:t>
             </w:r>
@@ -3547,7 +3269,7 @@
               <w:rPr>
                 <w:rFonts w:ascii="Calibri" w:eastAsia="Calibri" w:hAnsi="Calibri" w:cs="Calibri"/>
               </w:rPr>
-              <w:t>PANNA</w:t>
+              <w:t>NA</w:t>
             </w:r>
           </w:p>
         </w:tc>
@@ -3702,7 +3424,6 @@
             <w:r>
               <w:rPr>
                 <w:rFonts w:ascii="Calibri" w:eastAsia="Calibri" w:hAnsi="Calibri" w:cs="Calibri"/>
-                <w:sz w:val="24"/>
               </w:rPr>
               <w:t>1</w:t>
             </w:r>
@@ -3734,7 +3455,6 @@
             <w:r>
               <w:rPr>
                 <w:rFonts w:ascii="Calibri" w:eastAsia="Calibri" w:hAnsi="Calibri" w:cs="Calibri"/>
-                <w:sz w:val="24"/>
               </w:rPr>
               <w:t>07:25</w:t>
             </w:r>
@@ -3766,7 +3486,6 @@
             <w:r>
               <w:rPr>
                 <w:rFonts w:ascii="Calibri" w:eastAsia="Calibri" w:hAnsi="Calibri" w:cs="Calibri"/>
-                <w:sz w:val="24"/>
               </w:rPr>
               <w:t>08:55</w:t>
             </w:r>
@@ -3799,7 +3518,6 @@
               <w:rPr>
                 <w:rFonts w:ascii="Calibri" w:eastAsia="Calibri" w:hAnsi="Calibri" w:cs="Calibri"/>
                 <w:b/>
-                <w:sz w:val="24"/>
               </w:rPr>
               <w:t>NA</w:t>
             </w:r>
@@ -3908,7 +3626,6 @@
             <w:r>
               <w:rPr>
                 <w:rFonts w:ascii="Calibri" w:eastAsia="Calibri" w:hAnsi="Calibri" w:cs="Calibri"/>
-                <w:sz w:val="24"/>
               </w:rPr>
               <w:t>2</w:t>
             </w:r>
@@ -3940,7 +3657,6 @@
             <w:r>
               <w:rPr>
                 <w:rFonts w:ascii="Calibri" w:eastAsia="Calibri" w:hAnsi="Calibri" w:cs="Calibri"/>
-                <w:sz w:val="24"/>
               </w:rPr>
               <w:t>07:30</w:t>
             </w:r>
@@ -3972,7 +3688,6 @@
             <w:r>
               <w:rPr>
                 <w:rFonts w:ascii="Calibri" w:eastAsia="Calibri" w:hAnsi="Calibri" w:cs="Calibri"/>
-                <w:sz w:val="24"/>
               </w:rPr>
               <w:t>09:05</w:t>
             </w:r>
@@ -4005,7 +3720,7 @@
               <w:rPr>
                 <w:rFonts w:ascii="Calibri" w:eastAsia="Calibri" w:hAnsi="Calibri" w:cs="Calibri"/>
               </w:rPr>
-              <w:t>GAURAV</w:t>
+              <w:t>AS1</w:t>
             </w:r>
           </w:p>
         </w:tc>
@@ -4112,7 +3827,6 @@
             <w:r>
               <w:rPr>
                 <w:rFonts w:ascii="Calibri" w:eastAsia="Calibri" w:hAnsi="Calibri" w:cs="Calibri"/>
-                <w:sz w:val="24"/>
               </w:rPr>
               <w:t>3</w:t>
             </w:r>
@@ -4144,7 +3858,6 @@
             <w:r>
               <w:rPr>
                 <w:rFonts w:ascii="Calibri" w:eastAsia="Calibri" w:hAnsi="Calibri" w:cs="Calibri"/>
-                <w:sz w:val="24"/>
               </w:rPr>
               <w:t>07:45</w:t>
             </w:r>
@@ -4176,7 +3889,6 @@
             <w:r>
               <w:rPr>
                 <w:rFonts w:ascii="Calibri" w:eastAsia="Calibri" w:hAnsi="Calibri" w:cs="Calibri"/>
-                <w:sz w:val="24"/>
               </w:rPr>
               <w:t>09:15</w:t>
             </w:r>
@@ -4209,7 +3921,6 @@
               <w:rPr>
                 <w:rFonts w:ascii="Calibri" w:eastAsia="Calibri" w:hAnsi="Calibri" w:cs="Calibri"/>
                 <w:b/>
-                <w:sz w:val="24"/>
               </w:rPr>
               <w:t>NA</w:t>
             </w:r>
@@ -4318,7 +4029,6 @@
             <w:r>
               <w:rPr>
                 <w:rFonts w:ascii="Calibri" w:eastAsia="Calibri" w:hAnsi="Calibri" w:cs="Calibri"/>
-                <w:sz w:val="24"/>
               </w:rPr>
               <w:t>4</w:t>
             </w:r>
@@ -4350,7 +4060,6 @@
             <w:r>
               <w:rPr>
                 <w:rFonts w:ascii="Calibri" w:eastAsia="Calibri" w:hAnsi="Calibri" w:cs="Calibri"/>
-                <w:sz w:val="24"/>
               </w:rPr>
               <w:t>09:25</w:t>
             </w:r>
@@ -4382,7 +4091,6 @@
             <w:r>
               <w:rPr>
                 <w:rFonts w:ascii="Calibri" w:eastAsia="Calibri" w:hAnsi="Calibri" w:cs="Calibri"/>
-                <w:sz w:val="24"/>
               </w:rPr>
               <w:t>10:55</w:t>
             </w:r>
@@ -4415,7 +4123,7 @@
               <w:rPr>
                 <w:rFonts w:ascii="Calibri" w:eastAsia="Calibri" w:hAnsi="Calibri" w:cs="Calibri"/>
               </w:rPr>
-              <w:t>JTA</w:t>
+              <w:t>AS2</w:t>
             </w:r>
           </w:p>
         </w:tc>
@@ -4522,7 +4230,6 @@
             <w:r>
               <w:rPr>
                 <w:rFonts w:ascii="Calibri" w:eastAsia="Calibri" w:hAnsi="Calibri" w:cs="Calibri"/>
-                <w:sz w:val="24"/>
               </w:rPr>
               <w:t>5</w:t>
             </w:r>
@@ -4554,7 +4261,6 @@
             <w:r>
               <w:rPr>
                 <w:rFonts w:ascii="Calibri" w:eastAsia="Calibri" w:hAnsi="Calibri" w:cs="Calibri"/>
-                <w:sz w:val="24"/>
               </w:rPr>
               <w:t>09:30</w:t>
             </w:r>
@@ -4586,7 +4292,6 @@
             <w:r>
               <w:rPr>
                 <w:rFonts w:ascii="Calibri" w:eastAsia="Calibri" w:hAnsi="Calibri" w:cs="Calibri"/>
-                <w:sz w:val="24"/>
               </w:rPr>
               <w:t>12:55</w:t>
             </w:r>
@@ -4771,7 +4476,6 @@
             <w:r>
               <w:rPr>
                 <w:rFonts w:ascii="Calibri" w:eastAsia="Calibri" w:hAnsi="Calibri" w:cs="Calibri"/>
-                <w:sz w:val="24"/>
               </w:rPr>
               <w:t>1</w:t>
             </w:r>
@@ -4803,7 +4507,6 @@
             <w:r>
               <w:rPr>
                 <w:rFonts w:ascii="Calibri" w:eastAsia="Calibri" w:hAnsi="Calibri" w:cs="Calibri"/>
-                <w:sz w:val="24"/>
               </w:rPr>
               <w:t>07:40</w:t>
             </w:r>
@@ -4835,7 +4538,6 @@
             <w:r>
               <w:rPr>
                 <w:rFonts w:ascii="Calibri" w:eastAsia="Calibri" w:hAnsi="Calibri" w:cs="Calibri"/>
-                <w:sz w:val="24"/>
               </w:rPr>
               <w:t>09:10</w:t>
             </w:r>
@@ -4872,14 +4574,7 @@
               <w:rPr>
                 <w:rFonts w:ascii="Calibri" w:eastAsia="Calibri" w:hAnsi="Calibri" w:cs="Calibri"/>
               </w:rPr>
-              <w:t>SMRT</w:t>
-            </w:r>
-            <w:r>
-              <w:rPr>
-                <w:rFonts w:ascii="Calibri" w:eastAsia="Calibri" w:hAnsi="Calibri" w:cs="Calibri"/>
-                <w:sz w:val="24"/>
-              </w:rPr>
-              <w:t xml:space="preserve"> </w:t>
+              <w:t>DEFOS</w:t>
             </w:r>
           </w:p>
         </w:tc>
@@ -4931,8 +4626,6 @@
                 <w:rFonts w:ascii="Calibri" w:eastAsia="Calibri" w:hAnsi="Calibri" w:cs="Calibri"/>
               </w:rPr>
             </w:pPr>
-            <w:bookmarkStart w:id="0" w:name="_GoBack"/>
-            <w:bookmarkEnd w:id="0"/>
           </w:p>
         </w:tc>
         <w:tc>
@@ -4989,7 +4682,6 @@
             <w:r>
               <w:rPr>
                 <w:rFonts w:ascii="Calibri" w:eastAsia="Calibri" w:hAnsi="Calibri" w:cs="Calibri"/>
-                <w:sz w:val="24"/>
               </w:rPr>
               <w:t>2</w:t>
             </w:r>
@@ -5021,7 +4713,6 @@
             <w:r>
               <w:rPr>
                 <w:rFonts w:ascii="Calibri" w:eastAsia="Calibri" w:hAnsi="Calibri" w:cs="Calibri"/>
-                <w:sz w:val="24"/>
               </w:rPr>
               <w:t>07:50</w:t>
             </w:r>
@@ -5053,7 +4744,6 @@
             <w:r>
               <w:rPr>
                 <w:rFonts w:ascii="Calibri" w:eastAsia="Calibri" w:hAnsi="Calibri" w:cs="Calibri"/>
-                <w:sz w:val="24"/>
               </w:rPr>
               <w:t>09:20</w:t>
             </w:r>
@@ -5086,7 +4776,7 @@
               <w:rPr>
                 <w:rFonts w:ascii="Calibri" w:eastAsia="Calibri" w:hAnsi="Calibri" w:cs="Calibri"/>
               </w:rPr>
-              <w:t>ADM11</w:t>
+              <w:t>SUDA</w:t>
             </w:r>
           </w:p>
         </w:tc>
@@ -5194,7 +4884,6 @@
             <w:r>
               <w:rPr>
                 <w:rFonts w:ascii="Calibri" w:eastAsia="Calibri" w:hAnsi="Calibri" w:cs="Calibri"/>
-                <w:sz w:val="24"/>
               </w:rPr>
               <w:t>3</w:t>
             </w:r>
@@ -5226,7 +4915,6 @@
             <w:r>
               <w:rPr>
                 <w:rFonts w:ascii="Calibri" w:eastAsia="Calibri" w:hAnsi="Calibri" w:cs="Calibri"/>
-                <w:sz w:val="24"/>
               </w:rPr>
               <w:t>08:00</w:t>
             </w:r>
@@ -5258,7 +4946,6 @@
             <w:r>
               <w:rPr>
                 <w:rFonts w:ascii="Calibri" w:eastAsia="Calibri" w:hAnsi="Calibri" w:cs="Calibri"/>
-                <w:sz w:val="24"/>
               </w:rPr>
               <w:t>09:30</w:t>
             </w:r>
@@ -5291,7 +4978,7 @@
               <w:rPr>
                 <w:rFonts w:ascii="Calibri" w:eastAsia="Calibri" w:hAnsi="Calibri" w:cs="Calibri"/>
               </w:rPr>
-              <w:t>SCHLR</w:t>
+              <w:t>SRAT</w:t>
             </w:r>
           </w:p>
         </w:tc>
@@ -5399,7 +5086,6 @@
             <w:r>
               <w:rPr>
                 <w:rFonts w:ascii="Calibri" w:eastAsia="Calibri" w:hAnsi="Calibri" w:cs="Calibri"/>
-                <w:sz w:val="24"/>
               </w:rPr>
               <w:t>4</w:t>
             </w:r>
@@ -5431,7 +5117,6 @@
             <w:r>
               <w:rPr>
                 <w:rFonts w:ascii="Calibri" w:eastAsia="Calibri" w:hAnsi="Calibri" w:cs="Calibri"/>
-                <w:sz w:val="24"/>
               </w:rPr>
               <w:t>09:40</w:t>
             </w:r>
@@ -5463,7 +5148,6 @@
             <w:r>
               <w:rPr>
                 <w:rFonts w:ascii="Calibri" w:eastAsia="Calibri" w:hAnsi="Calibri" w:cs="Calibri"/>
-                <w:sz w:val="24"/>
               </w:rPr>
               <w:t>11:10</w:t>
             </w:r>
@@ -5495,9 +5179,8 @@
             <w:r>
               <w:rPr>
                 <w:rFonts w:ascii="Calibri" w:eastAsia="Calibri" w:hAnsi="Calibri" w:cs="Calibri"/>
-                <w:sz w:val="24"/>
-              </w:rPr>
-              <w:t>CHTRA</w:t>
+              </w:rPr>
+              <w:t>VND1</w:t>
             </w:r>
           </w:p>
         </w:tc>
@@ -5605,7 +5288,6 @@
             <w:r>
               <w:rPr>
                 <w:rFonts w:ascii="Calibri" w:eastAsia="Calibri" w:hAnsi="Calibri" w:cs="Calibri"/>
-                <w:sz w:val="24"/>
               </w:rPr>
               <w:t>5</w:t>
             </w:r>
@@ -5637,7 +5319,6 @@
             <w:r>
               <w:rPr>
                 <w:rFonts w:ascii="Calibri" w:eastAsia="Calibri" w:hAnsi="Calibri" w:cs="Calibri"/>
-                <w:sz w:val="24"/>
               </w:rPr>
               <w:t>09:50</w:t>
             </w:r>
@@ -5669,7 +5350,6 @@
             <w:r>
               <w:rPr>
                 <w:rFonts w:ascii="Calibri" w:eastAsia="Calibri" w:hAnsi="Calibri" w:cs="Calibri"/>
-                <w:sz w:val="24"/>
               </w:rPr>
               <w:t>11:20</w:t>
             </w:r>
@@ -5702,7 +5382,7 @@
               <w:rPr>
                 <w:rFonts w:ascii="Calibri" w:eastAsia="Calibri" w:hAnsi="Calibri" w:cs="Calibri"/>
               </w:rPr>
-              <w:t>ABAN4</w:t>
+              <w:t>AD10</w:t>
             </w:r>
           </w:p>
         </w:tc>
@@ -5810,7 +5490,6 @@
             <w:r>
               <w:rPr>
                 <w:rFonts w:ascii="Calibri" w:eastAsia="Calibri" w:hAnsi="Calibri" w:cs="Calibri"/>
-                <w:sz w:val="24"/>
               </w:rPr>
               <w:t>6</w:t>
             </w:r>
@@ -5842,7 +5521,6 @@
             <w:r>
               <w:rPr>
                 <w:rFonts w:ascii="Calibri" w:eastAsia="Calibri" w:hAnsi="Calibri" w:cs="Calibri"/>
-                <w:sz w:val="24"/>
               </w:rPr>
               <w:t>10:00</w:t>
             </w:r>
@@ -5874,7 +5552,6 @@
             <w:r>
               <w:rPr>
                 <w:rFonts w:ascii="Calibri" w:eastAsia="Calibri" w:hAnsi="Calibri" w:cs="Calibri"/>
-                <w:sz w:val="24"/>
               </w:rPr>
               <w:t>11:30</w:t>
             </w:r>
@@ -5907,7 +5584,7 @@
               <w:rPr>
                 <w:rFonts w:ascii="Calibri" w:eastAsia="Calibri" w:hAnsi="Calibri" w:cs="Calibri"/>
               </w:rPr>
-              <w:t>TRI-2</w:t>
+              <w:t>VND2</w:t>
             </w:r>
           </w:p>
         </w:tc>
@@ -6007,62 +5684,38 @@
           <w:p>
             <w:pPr>
               <w:spacing w:after="0" w:line="240" w:lineRule="auto"/>
+              <w:jc w:val="both"/>
+              <w:rPr>
+                <w:rFonts w:ascii="Calibri" w:eastAsia="Calibri" w:hAnsi="Calibri" w:cs="Calibri"/>
+              </w:rPr>
+            </w:pPr>
+            <w:r>
               <w:rPr>
                 <w:rFonts w:ascii="Calibri" w:eastAsia="Calibri" w:hAnsi="Calibri" w:cs="Calibri"/>
                 <w:b/>
                 <w:sz w:val="24"/>
               </w:rPr>
-            </w:pPr>
-          </w:p>
-          <w:p>
-            <w:pPr>
-              <w:spacing w:after="0" w:line="240" w:lineRule="auto"/>
-              <w:rPr>
-                <w:rFonts w:ascii="Calibri" w:eastAsia="Calibri" w:hAnsi="Calibri" w:cs="Calibri"/>
-              </w:rPr>
-            </w:pPr>
+              <w:t>WAITING:</w:t>
+            </w:r>
             <w:r>
               <w:rPr>
                 <w:rFonts w:ascii="Calibri" w:eastAsia="Calibri" w:hAnsi="Calibri" w:cs="Calibri"/>
                 <w:b/>
                 <w:sz w:val="24"/>
               </w:rPr>
-              <w:t>WAITING:</w:t>
-            </w:r>
-            <w:r>
-              <w:rPr>
-                <w:rFonts w:ascii="Calibri" w:eastAsia="Calibri" w:hAnsi="Calibri" w:cs="Calibri"/>
-                <w:sz w:val="24"/>
-              </w:rPr>
-              <w:t>AS1</w:t>
-            </w:r>
-            <w:r>
-              <w:rPr>
-                <w:rFonts w:ascii="Calibri" w:eastAsia="Calibri" w:hAnsi="Calibri" w:cs="Calibri"/>
-                <w:b/>
-                <w:sz w:val="24"/>
-              </w:rPr>
-              <w:t>,</w:t>
-            </w:r>
-            <w:r>
-              <w:rPr>
-                <w:rFonts w:ascii="Calibri" w:eastAsia="Calibri" w:hAnsi="Calibri" w:cs="Calibri"/>
-                <w:sz w:val="24"/>
-              </w:rPr>
-              <w:t>ADM10,</w:t>
-            </w:r>
-            <w:r>
-              <w:rPr>
-                <w:rFonts w:ascii="Calibri" w:eastAsia="Calibri" w:hAnsi="Calibri" w:cs="Calibri"/>
-              </w:rPr>
-              <w:t xml:space="preserve"> FOSSIL</w:t>
-            </w:r>
-            <w:r>
-              <w:rPr>
-                <w:rFonts w:ascii="Calibri" w:eastAsia="Calibri" w:hAnsi="Calibri" w:cs="Calibri"/>
-                <w:sz w:val="24"/>
-              </w:rPr>
-              <w:t xml:space="preserve"> VKDN1,VKDN2,ABN8</w:t>
+              <w:t xml:space="preserve"> </w:t>
+            </w:r>
+            <w:r>
+              <w:rPr>
+                <w:rFonts w:ascii="Calibri" w:eastAsia="Calibri" w:hAnsi="Calibri" w:cs="Calibri"/>
+              </w:rPr>
+              <w:t>ABN8</w:t>
+            </w:r>
+            <w:r>
+              <w:rPr>
+                <w:rFonts w:ascii="Calibri" w:eastAsia="Calibri" w:hAnsi="Calibri" w:cs="Calibri"/>
+              </w:rPr>
+              <w:t>,VIR1</w:t>
             </w:r>
           </w:p>
         </w:tc>
@@ -6146,10 +5799,10 @@
       </w:pPr>
       <w:r>
         <w:object w:dxaOrig="1188" w:dyaOrig="900">
-          <v:rect id="_x0000_i1025" style="width:59.9pt;height:44.15pt" o:ole="" o:preferrelative="t" stroked="f">
+          <v:rect id="_x0000_i1025" style="width:57.75pt;height:43.5pt" o:ole="" o:preferrelative="t" stroked="f">
             <v:imagedata r:id="rId5" o:title=""/>
           </v:rect>
-          <o:OLEObject Type="Embed" ProgID="StaticMetafile" ShapeID="_x0000_i1025" DrawAspect="Content" ObjectID="_1848918822" r:id="rId6"/>
+          <o:OLEObject Type="Embed" ProgID="StaticMetafile" ShapeID="_x0000_i1025" DrawAspect="Content" ObjectID="_1849009637" r:id="rId6"/>
         </w:object>
       </w:r>
     </w:p>
@@ -6584,7 +6237,6 @@
             <w:r>
               <w:rPr>
                 <w:rFonts w:ascii="Calibri" w:eastAsia="Calibri" w:hAnsi="Calibri" w:cs="Calibri"/>
-                <w:sz w:val="30"/>
               </w:rPr>
               <w:t>1</w:t>
             </w:r>
@@ -6616,7 +6268,6 @@
             <w:r>
               <w:rPr>
                 <w:rFonts w:ascii="Calibri" w:eastAsia="Calibri" w:hAnsi="Calibri" w:cs="Calibri"/>
-                <w:sz w:val="30"/>
               </w:rPr>
               <w:t>07:00</w:t>
             </w:r>
@@ -6648,7 +6299,6 @@
             <w:r>
               <w:rPr>
                 <w:rFonts w:ascii="Calibri" w:eastAsia="Calibri" w:hAnsi="Calibri" w:cs="Calibri"/>
-                <w:sz w:val="30"/>
               </w:rPr>
               <w:t>08:00</w:t>
             </w:r>
@@ -6675,17 +6325,13 @@
               <w:jc w:val="center"/>
               <w:rPr>
                 <w:rFonts w:ascii="Calibri" w:eastAsia="Calibri" w:hAnsi="Calibri" w:cs="Calibri"/>
-                <w:sz w:val="24"/>
-                <w:szCs w:val="24"/>
-              </w:rPr>
-            </w:pPr>
-            <w:r>
-              <w:rPr>
-                <w:rFonts w:ascii="Calibri" w:eastAsia="Calibri" w:hAnsi="Calibri" w:cs="Calibri"/>
-                <w:sz w:val="24"/>
-                <w:szCs w:val="24"/>
-              </w:rPr>
-              <w:t>TAPTI</w:t>
+              </w:rPr>
+            </w:pPr>
+            <w:r>
+              <w:rPr>
+                <w:rFonts w:ascii="Calibri" w:eastAsia="Calibri" w:hAnsi="Calibri" w:cs="Calibri"/>
+              </w:rPr>
+              <w:t>JIND</w:t>
             </w:r>
           </w:p>
         </w:tc>
@@ -6734,15 +6380,11 @@
               <w:jc w:val="center"/>
               <w:rPr>
                 <w:rFonts w:ascii="Calibri" w:eastAsia="Calibri" w:hAnsi="Calibri" w:cs="Calibri"/>
-                <w:sz w:val="28"/>
-                <w:szCs w:val="28"/>
-              </w:rPr>
-            </w:pPr>
-            <w:r>
-              <w:rPr>
-                <w:rFonts w:ascii="Calibri" w:eastAsia="Calibri" w:hAnsi="Calibri" w:cs="Calibri"/>
-                <w:sz w:val="28"/>
-                <w:szCs w:val="28"/>
+              </w:rPr>
+            </w:pPr>
+            <w:r>
+              <w:rPr>
+                <w:rFonts w:ascii="Calibri" w:eastAsia="Calibri" w:hAnsi="Calibri" w:cs="Calibri"/>
               </w:rPr>
               <w:t>GVX</w:t>
             </w:r>
@@ -6801,7 +6443,6 @@
             <w:r>
               <w:rPr>
                 <w:rFonts w:ascii="Calibri" w:eastAsia="Calibri" w:hAnsi="Calibri" w:cs="Calibri"/>
-                <w:sz w:val="30"/>
               </w:rPr>
               <w:t>2</w:t>
             </w:r>
@@ -6833,7 +6474,6 @@
             <w:r>
               <w:rPr>
                 <w:rFonts w:ascii="Calibri" w:eastAsia="Calibri" w:hAnsi="Calibri" w:cs="Calibri"/>
-                <w:sz w:val="30"/>
               </w:rPr>
               <w:t>09:00</w:t>
             </w:r>
@@ -6865,7 +6505,6 @@
             <w:r>
               <w:rPr>
                 <w:rFonts w:ascii="Calibri" w:eastAsia="Calibri" w:hAnsi="Calibri" w:cs="Calibri"/>
-                <w:sz w:val="30"/>
               </w:rPr>
               <w:t>10:00</w:t>
             </w:r>
@@ -6892,17 +6531,13 @@
               <w:jc w:val="center"/>
               <w:rPr>
                 <w:rFonts w:ascii="Calibri" w:eastAsia="Calibri" w:hAnsi="Calibri" w:cs="Calibri"/>
-                <w:sz w:val="24"/>
-                <w:szCs w:val="24"/>
-              </w:rPr>
-            </w:pPr>
-            <w:r>
-              <w:rPr>
-                <w:rFonts w:ascii="Calibri" w:eastAsia="Calibri" w:hAnsi="Calibri" w:cs="Calibri"/>
-                <w:sz w:val="24"/>
-                <w:szCs w:val="24"/>
-              </w:rPr>
-              <w:t>CHARU</w:t>
+              </w:rPr>
+            </w:pPr>
+            <w:r>
+              <w:rPr>
+                <w:rFonts w:ascii="Calibri" w:eastAsia="Calibri" w:hAnsi="Calibri" w:cs="Calibri"/>
+              </w:rPr>
+              <w:t>TCPP</w:t>
             </w:r>
           </w:p>
         </w:tc>
@@ -6952,15 +6587,11 @@
               <w:jc w:val="center"/>
               <w:rPr>
                 <w:rFonts w:ascii="Calibri" w:eastAsia="Calibri" w:hAnsi="Calibri" w:cs="Calibri"/>
-                <w:sz w:val="28"/>
-                <w:szCs w:val="28"/>
-              </w:rPr>
-            </w:pPr>
-            <w:r>
-              <w:rPr>
-                <w:rFonts w:ascii="Calibri" w:eastAsia="Calibri" w:hAnsi="Calibri" w:cs="Calibri"/>
-                <w:sz w:val="28"/>
-                <w:szCs w:val="28"/>
+              </w:rPr>
+            </w:pPr>
+            <w:r>
+              <w:rPr>
+                <w:rFonts w:ascii="Calibri" w:eastAsia="Calibri" w:hAnsi="Calibri" w:cs="Calibri"/>
               </w:rPr>
               <w:t>GVX</w:t>
             </w:r>
@@ -7019,7 +6650,6 @@
             <w:r>
               <w:rPr>
                 <w:rFonts w:ascii="Calibri" w:eastAsia="Calibri" w:hAnsi="Calibri" w:cs="Calibri"/>
-                <w:sz w:val="30"/>
               </w:rPr>
               <w:t>3</w:t>
             </w:r>
@@ -7051,7 +6681,6 @@
             <w:r>
               <w:rPr>
                 <w:rFonts w:ascii="Calibri" w:eastAsia="Calibri" w:hAnsi="Calibri" w:cs="Calibri"/>
-                <w:sz w:val="30"/>
               </w:rPr>
               <w:t>11:00</w:t>
             </w:r>
@@ -7083,7 +6712,6 @@
             <w:r>
               <w:rPr>
                 <w:rFonts w:ascii="Calibri" w:eastAsia="Calibri" w:hAnsi="Calibri" w:cs="Calibri"/>
-                <w:sz w:val="30"/>
               </w:rPr>
               <w:t>12:30</w:t>
             </w:r>
@@ -7116,8 +6744,10 @@
               <w:rPr>
                 <w:rFonts w:ascii="Calibri" w:eastAsia="Calibri" w:hAnsi="Calibri" w:cs="Calibri"/>
               </w:rPr>
-              <w:t>L/O</w:t>
-            </w:r>
+              <w:t>SJOT</w:t>
+            </w:r>
+            <w:bookmarkStart w:id="0" w:name="_GoBack"/>
+            <w:bookmarkEnd w:id="0"/>
           </w:p>
         </w:tc>
         <w:tc>
@@ -7166,15 +6796,11 @@
               <w:jc w:val="center"/>
               <w:rPr>
                 <w:rFonts w:ascii="Calibri" w:eastAsia="Calibri" w:hAnsi="Calibri" w:cs="Calibri"/>
-                <w:sz w:val="28"/>
-                <w:szCs w:val="28"/>
-              </w:rPr>
-            </w:pPr>
-            <w:r>
-              <w:rPr>
-                <w:rFonts w:ascii="Calibri" w:eastAsia="Calibri" w:hAnsi="Calibri" w:cs="Calibri"/>
-                <w:sz w:val="28"/>
-                <w:szCs w:val="28"/>
+              </w:rPr>
+            </w:pPr>
+            <w:r>
+              <w:rPr>
+                <w:rFonts w:ascii="Calibri" w:eastAsia="Calibri" w:hAnsi="Calibri" w:cs="Calibri"/>
               </w:rPr>
               <w:t>GVX</w:t>
             </w:r>
@@ -7233,7 +6859,6 @@
             <w:r>
               <w:rPr>
                 <w:rFonts w:ascii="Calibri" w:eastAsia="Calibri" w:hAnsi="Calibri" w:cs="Calibri"/>
-                <w:sz w:val="30"/>
               </w:rPr>
               <w:t>4</w:t>
             </w:r>
@@ -7265,7 +6890,6 @@
             <w:r>
               <w:rPr>
                 <w:rFonts w:ascii="Calibri" w:eastAsia="Calibri" w:hAnsi="Calibri" w:cs="Calibri"/>
-                <w:sz w:val="30"/>
               </w:rPr>
               <w:t>13:00</w:t>
             </w:r>
@@ -7297,7 +6921,6 @@
             <w:r>
               <w:rPr>
                 <w:rFonts w:ascii="Calibri" w:eastAsia="Calibri" w:hAnsi="Calibri" w:cs="Calibri"/>
-                <w:sz w:val="30"/>
               </w:rPr>
               <w:t>14:00</w:t>
             </w:r>

</xml_diff>

<commit_message>
Sync - 2026-08-24 17:27
</commit_message>
<xml_diff>
--- a/files/Daily_Helicopter_Schedule.docx
+++ b/files/Daily_Helicopter_Schedule.docx
@@ -35,7 +35,7 @@
           <w:b/>
           <w:color w:val="000000" w:themeColor="text1"/>
         </w:rPr>
-        <w:t>24</w:t>
+        <w:t>25</w:t>
       </w:r>
       <w:r>
         <w:rPr>
@@ -59,7 +59,7 @@
           <w:b/>
           <w:color w:val="000000" w:themeColor="text1"/>
         </w:rPr>
-        <w:t>MON</w:t>
+        <w:t>TUES</w:t>
       </w:r>
       <w:r>
         <w:rPr>
@@ -883,7 +883,7 @@
               <w:rPr>
                 <w:rFonts w:ascii="Calibri" w:eastAsia="Calibri" w:hAnsi="Calibri" w:cs="Calibri"/>
               </w:rPr>
-              <w:t>08:10</w:t>
+              <w:t>08:05</w:t>
             </w:r>
           </w:p>
         </w:tc>
@@ -1102,6 +1102,243 @@
               <w:rPr>
                 <w:rFonts w:ascii="Calibri" w:eastAsia="Calibri" w:hAnsi="Calibri" w:cs="Calibri"/>
               </w:rPr>
+              <w:t>08:10</w:t>
+            </w:r>
+          </w:p>
+        </w:tc>
+        <w:tc>
+          <w:tcPr>
+            <w:tcW w:w="1810" w:type="dxa"/>
+            <w:tcBorders>
+              <w:top w:val="single" w:sz="4" w:space="0" w:color="000000"/>
+              <w:left w:val="single" w:sz="4" w:space="0" w:color="000000"/>
+              <w:bottom w:val="single" w:sz="4" w:space="0" w:color="000000"/>
+              <w:right w:val="single" w:sz="4" w:space="0" w:color="000000"/>
+            </w:tcBorders>
+            <w:shd w:val="clear" w:color="auto" w:fill="auto"/>
+            <w:tcMar>
+              <w:left w:w="108" w:type="dxa"/>
+              <w:right w:w="108" w:type="dxa"/>
+            </w:tcMar>
+          </w:tcPr>
+          <w:p>
+            <w:pPr>
+              <w:spacing w:after="0" w:line="240" w:lineRule="auto"/>
+              <w:jc w:val="center"/>
+              <w:rPr>
+                <w:rFonts w:ascii="Calibri" w:eastAsia="Calibri" w:hAnsi="Calibri" w:cs="Calibri"/>
+              </w:rPr>
+            </w:pPr>
+            <w:r>
+              <w:rPr>
+                <w:rFonts w:ascii="Calibri" w:eastAsia="Calibri" w:hAnsi="Calibri" w:cs="Calibri"/>
+              </w:rPr>
+              <w:t>SF</w:t>
+            </w:r>
+            <w:r>
+              <w:rPr>
+                <w:rFonts w:ascii="Calibri" w:eastAsia="Calibri" w:hAnsi="Calibri" w:cs="Calibri"/>
+              </w:rPr>
+              <w:t xml:space="preserve"> </w:t>
+            </w:r>
+            <w:r>
+              <w:rPr>
+                <w:rFonts w:ascii="Calibri" w:eastAsia="Calibri" w:hAnsi="Calibri" w:cs="Calibri"/>
+              </w:rPr>
+              <w:t>(D)</w:t>
+            </w:r>
+            <w:r>
+              <w:rPr>
+                <w:rFonts w:ascii="Calibri" w:eastAsia="Calibri" w:hAnsi="Calibri" w:cs="Calibri"/>
+              </w:rPr>
+              <w:t xml:space="preserve"> </w:t>
+            </w:r>
+          </w:p>
+        </w:tc>
+        <w:tc>
+          <w:tcPr>
+            <w:tcW w:w="1387" w:type="dxa"/>
+            <w:tcBorders>
+              <w:top w:val="single" w:sz="4" w:space="0" w:color="000000"/>
+              <w:left w:val="single" w:sz="4" w:space="0" w:color="000000"/>
+              <w:bottom w:val="single" w:sz="4" w:space="0" w:color="000000"/>
+              <w:right w:val="single" w:sz="4" w:space="0" w:color="000000"/>
+            </w:tcBorders>
+            <w:shd w:val="clear" w:color="000000" w:fill="FFFFFF"/>
+            <w:tcMar>
+              <w:left w:w="108" w:type="dxa"/>
+              <w:right w:w="108" w:type="dxa"/>
+            </w:tcMar>
+          </w:tcPr>
+          <w:p>
+            <w:pPr>
+              <w:spacing w:after="0" w:line="240" w:lineRule="auto"/>
+              <w:jc w:val="center"/>
+              <w:rPr>
+                <w:rFonts w:ascii="Calibri" w:eastAsia="Calibri" w:hAnsi="Calibri" w:cs="Calibri"/>
+              </w:rPr>
+            </w:pPr>
+            <w:r>
+              <w:rPr>
+                <w:rFonts w:ascii="Calibri" w:eastAsia="Calibri" w:hAnsi="Calibri" w:cs="Calibri"/>
+              </w:rPr>
+              <w:t>GVHL 169</w:t>
+            </w:r>
+          </w:p>
+        </w:tc>
+        <w:tc>
+          <w:tcPr>
+            <w:tcW w:w="1180" w:type="dxa"/>
+            <w:tcBorders>
+              <w:top w:val="single" w:sz="4" w:space="0" w:color="000000"/>
+              <w:left w:val="single" w:sz="4" w:space="0" w:color="000000"/>
+              <w:bottom w:val="single" w:sz="4" w:space="0" w:color="000000"/>
+              <w:right w:val="single" w:sz="4" w:space="0" w:color="000000"/>
+            </w:tcBorders>
+            <w:shd w:val="clear" w:color="000000" w:fill="FFFFFF"/>
+            <w:tcMar>
+              <w:left w:w="108" w:type="dxa"/>
+              <w:right w:w="108" w:type="dxa"/>
+            </w:tcMar>
+          </w:tcPr>
+          <w:p>
+            <w:pPr>
+              <w:spacing w:after="0" w:line="240" w:lineRule="auto"/>
+              <w:jc w:val="center"/>
+              <w:rPr>
+                <w:rFonts w:ascii="Calibri" w:eastAsia="Calibri" w:hAnsi="Calibri" w:cs="Calibri"/>
+              </w:rPr>
+            </w:pPr>
+            <w:r>
+              <w:rPr>
+                <w:rFonts w:ascii="Calibri" w:eastAsia="Calibri" w:hAnsi="Calibri" w:cs="Calibri"/>
+              </w:rPr>
+              <w:t xml:space="preserve"> RRL</w:t>
+            </w:r>
+          </w:p>
+        </w:tc>
+        <w:tc>
+          <w:tcPr>
+            <w:tcW w:w="1168" w:type="dxa"/>
+            <w:tcBorders>
+              <w:top w:val="single" w:sz="4" w:space="0" w:color="000000"/>
+              <w:left w:val="single" w:sz="4" w:space="0" w:color="000000"/>
+              <w:bottom w:val="single" w:sz="4" w:space="0" w:color="000000"/>
+              <w:right w:val="single" w:sz="4" w:space="0" w:color="000000"/>
+            </w:tcBorders>
+            <w:shd w:val="clear" w:color="auto" w:fill="auto"/>
+            <w:tcMar>
+              <w:left w:w="108" w:type="dxa"/>
+              <w:right w:w="108" w:type="dxa"/>
+            </w:tcMar>
+          </w:tcPr>
+          <w:p>
+            <w:pPr>
+              <w:spacing w:after="0" w:line="240" w:lineRule="auto"/>
+              <w:jc w:val="center"/>
+              <w:rPr>
+                <w:rFonts w:ascii="Calibri" w:eastAsia="Calibri" w:hAnsi="Calibri" w:cs="Calibri"/>
+              </w:rPr>
+            </w:pPr>
+            <w:r>
+              <w:rPr>
+                <w:rFonts w:ascii="Calibri" w:eastAsia="Calibri" w:hAnsi="Calibri" w:cs="Calibri"/>
+              </w:rPr>
+              <w:t>05</w:t>
+            </w:r>
+          </w:p>
+        </w:tc>
+      </w:tr>
+      <w:tr>
+        <w:tc>
+          <w:tcPr>
+            <w:tcW w:w="620" w:type="dxa"/>
+            <w:tcBorders>
+              <w:top w:val="single" w:sz="4" w:space="0" w:color="000000"/>
+              <w:left w:val="single" w:sz="4" w:space="0" w:color="000000"/>
+              <w:bottom w:val="single" w:sz="4" w:space="0" w:color="000000"/>
+              <w:right w:val="single" w:sz="4" w:space="0" w:color="000000"/>
+            </w:tcBorders>
+            <w:shd w:val="clear" w:color="auto" w:fill="auto"/>
+            <w:tcMar>
+              <w:left w:w="108" w:type="dxa"/>
+              <w:right w:w="108" w:type="dxa"/>
+            </w:tcMar>
+          </w:tcPr>
+          <w:p>
+            <w:pPr>
+              <w:spacing w:after="0" w:line="240" w:lineRule="auto"/>
+              <w:jc w:val="center"/>
+              <w:rPr>
+                <w:rFonts w:ascii="Calibri" w:eastAsia="Calibri" w:hAnsi="Calibri" w:cs="Calibri"/>
+              </w:rPr>
+            </w:pPr>
+            <w:r>
+              <w:rPr>
+                <w:rFonts w:ascii="Calibri" w:eastAsia="Calibri" w:hAnsi="Calibri" w:cs="Calibri"/>
+              </w:rPr>
+              <w:t>4</w:t>
+            </w:r>
+          </w:p>
+        </w:tc>
+        <w:tc>
+          <w:tcPr>
+            <w:tcW w:w="1414" w:type="dxa"/>
+            <w:tcBorders>
+              <w:top w:val="single" w:sz="4" w:space="0" w:color="000000"/>
+              <w:left w:val="single" w:sz="4" w:space="0" w:color="000000"/>
+              <w:bottom w:val="single" w:sz="4" w:space="0" w:color="000000"/>
+              <w:right w:val="single" w:sz="4" w:space="0" w:color="000000"/>
+            </w:tcBorders>
+            <w:shd w:val="clear" w:color="auto" w:fill="auto"/>
+            <w:tcMar>
+              <w:left w:w="108" w:type="dxa"/>
+              <w:right w:w="108" w:type="dxa"/>
+            </w:tcMar>
+          </w:tcPr>
+          <w:p>
+            <w:pPr>
+              <w:spacing w:after="0" w:line="240" w:lineRule="auto"/>
+              <w:jc w:val="center"/>
+              <w:rPr>
+                <w:rFonts w:ascii="Calibri" w:eastAsia="Calibri" w:hAnsi="Calibri" w:cs="Calibri"/>
+              </w:rPr>
+            </w:pPr>
+            <w:r>
+              <w:rPr>
+                <w:rFonts w:ascii="Calibri" w:eastAsia="Calibri" w:hAnsi="Calibri" w:cs="Calibri"/>
+              </w:rPr>
+              <w:t>06:30</w:t>
+            </w:r>
+          </w:p>
+        </w:tc>
+        <w:tc>
+          <w:tcPr>
+            <w:tcW w:w="1339" w:type="dxa"/>
+            <w:tcBorders>
+              <w:top w:val="single" w:sz="4" w:space="0" w:color="000000"/>
+              <w:left w:val="single" w:sz="4" w:space="0" w:color="000000"/>
+              <w:bottom w:val="single" w:sz="4" w:space="0" w:color="000000"/>
+              <w:right w:val="single" w:sz="4" w:space="0" w:color="000000"/>
+            </w:tcBorders>
+            <w:shd w:val="clear" w:color="auto" w:fill="auto"/>
+            <w:tcMar>
+              <w:left w:w="108" w:type="dxa"/>
+              <w:right w:w="108" w:type="dxa"/>
+            </w:tcMar>
+          </w:tcPr>
+          <w:p>
+            <w:pPr>
+              <w:spacing w:after="0" w:line="240" w:lineRule="auto"/>
+              <w:jc w:val="center"/>
+              <w:rPr>
+                <w:rFonts w:ascii="Calibri" w:eastAsia="Calibri" w:hAnsi="Calibri" w:cs="Calibri"/>
+              </w:rPr>
+            </w:pPr>
+            <w:r>
+              <w:rPr>
+                <w:rFonts w:ascii="Calibri" w:eastAsia="Calibri" w:hAnsi="Calibri" w:cs="Calibri"/>
+              </w:rPr>
               <w:t>08:15</w:t>
             </w:r>
           </w:p>
@@ -1133,25 +1370,7 @@
               <w:rPr>
                 <w:rFonts w:ascii="Calibri" w:eastAsia="Calibri" w:hAnsi="Calibri" w:cs="Calibri"/>
               </w:rPr>
-              <w:t>SF</w:t>
-            </w:r>
-            <w:r>
-              <w:rPr>
-                <w:rFonts w:ascii="Calibri" w:eastAsia="Calibri" w:hAnsi="Calibri" w:cs="Calibri"/>
-              </w:rPr>
-              <w:t xml:space="preserve"> </w:t>
-            </w:r>
-            <w:r>
-              <w:rPr>
-                <w:rFonts w:ascii="Calibri" w:eastAsia="Calibri" w:hAnsi="Calibri" w:cs="Calibri"/>
-              </w:rPr>
-              <w:t>(D)</w:t>
-            </w:r>
-            <w:r>
-              <w:rPr>
-                <w:rFonts w:ascii="Calibri" w:eastAsia="Calibri" w:hAnsi="Calibri" w:cs="Calibri"/>
-              </w:rPr>
-              <w:t xml:space="preserve"> + NF (D)</w:t>
+              <w:t>NF (D)</w:t>
             </w:r>
           </w:p>
         </w:tc>
@@ -1182,7 +1401,7 @@
               <w:rPr>
                 <w:rFonts w:ascii="Calibri" w:eastAsia="Calibri" w:hAnsi="Calibri" w:cs="Calibri"/>
               </w:rPr>
-              <w:t>GVHL 169</w:t>
+              <w:t>GVHL 412</w:t>
             </w:r>
           </w:p>
         </w:tc>
@@ -1213,7 +1432,7 @@
               <w:rPr>
                 <w:rFonts w:ascii="Calibri" w:eastAsia="Calibri" w:hAnsi="Calibri" w:cs="Calibri"/>
               </w:rPr>
-              <w:t xml:space="preserve"> RRL</w:t>
+              <w:t>RRI</w:t>
             </w:r>
           </w:p>
         </w:tc>
@@ -1244,7 +1463,7 @@
               <w:rPr>
                 <w:rFonts w:ascii="Calibri" w:eastAsia="Calibri" w:hAnsi="Calibri" w:cs="Calibri"/>
               </w:rPr>
-              <w:t>05</w:t>
+              <w:t>06</w:t>
             </w:r>
           </w:p>
         </w:tc>
@@ -1448,20 +1667,9 @@
             <w:r>
               <w:rPr>
                 <w:rFonts w:ascii="Calibri" w:eastAsia="Calibri" w:hAnsi="Calibri" w:cs="Calibri"/>
-              </w:rPr>
-              <w:t>GVHL</w:t>
-            </w:r>
-            <w:r>
-              <w:rPr>
-                <w:rFonts w:ascii="Calibri" w:eastAsia="Calibri" w:hAnsi="Calibri" w:cs="Calibri"/>
-              </w:rPr>
-              <w:t xml:space="preserve"> </w:t>
-            </w:r>
-            <w:r>
-              <w:rPr>
-                <w:rFonts w:ascii="Calibri" w:eastAsia="Calibri" w:hAnsi="Calibri" w:cs="Calibri"/>
-              </w:rPr>
-              <w:t>412</w:t>
+                <w:b/>
+              </w:rPr>
+              <w:t>NA</w:t>
             </w:r>
           </w:p>
         </w:tc>
@@ -1492,7 +1700,7 @@
               <w:rPr>
                 <w:rFonts w:ascii="Calibri" w:eastAsia="Calibri" w:hAnsi="Calibri" w:cs="Calibri"/>
               </w:rPr>
-              <w:t>RRI</w:t>
+              <w:t>NA</w:t>
             </w:r>
           </w:p>
         </w:tc>
@@ -2704,6 +2912,8 @@
                 <w:rFonts w:ascii="Calibri" w:eastAsia="Calibri" w:hAnsi="Calibri" w:cs="Calibri"/>
               </w:rPr>
             </w:pPr>
+            <w:bookmarkStart w:id="0" w:name="_GoBack"/>
+            <w:bookmarkEnd w:id="0"/>
           </w:p>
         </w:tc>
         <w:tc>
@@ -2857,7 +3067,7 @@
               <w:rPr>
                 <w:rFonts w:ascii="Calibri" w:eastAsia="Calibri" w:hAnsi="Calibri" w:cs="Calibri"/>
               </w:rPr>
-              <w:t>BPA</w:t>
+              <w:t>NA</w:t>
             </w:r>
           </w:p>
         </w:tc>
@@ -3720,7 +3930,7 @@
               <w:rPr>
                 <w:rFonts w:ascii="Calibri" w:eastAsia="Calibri" w:hAnsi="Calibri" w:cs="Calibri"/>
               </w:rPr>
-              <w:t>AS1</w:t>
+              <w:t>R09A+R12A</w:t>
             </w:r>
           </w:p>
         </w:tc>
@@ -4123,7 +4333,7 @@
               <w:rPr>
                 <w:rFonts w:ascii="Calibri" w:eastAsia="Calibri" w:hAnsi="Calibri" w:cs="Calibri"/>
               </w:rPr>
-              <w:t>AS2</w:t>
+              <w:t>SSAK</w:t>
             </w:r>
           </w:p>
         </w:tc>
@@ -4324,7 +4534,7 @@
               <w:rPr>
                 <w:rFonts w:ascii="Calibri" w:eastAsia="Calibri" w:hAnsi="Calibri" w:cs="Calibri"/>
               </w:rPr>
-              <w:t>NA</w:t>
+              <w:t>KSPR</w:t>
             </w:r>
           </w:p>
         </w:tc>
@@ -4574,7 +4784,7 @@
               <w:rPr>
                 <w:rFonts w:ascii="Calibri" w:eastAsia="Calibri" w:hAnsi="Calibri" w:cs="Calibri"/>
               </w:rPr>
-              <w:t>DEFOS</w:t>
+              <w:t>HERA</w:t>
             </w:r>
           </w:p>
         </w:tc>
@@ -4776,7 +4986,7 @@
               <w:rPr>
                 <w:rFonts w:ascii="Calibri" w:eastAsia="Calibri" w:hAnsi="Calibri" w:cs="Calibri"/>
               </w:rPr>
-              <w:t>SUDA</w:t>
+              <w:t>NF SPL</w:t>
             </w:r>
           </w:p>
         </w:tc>
@@ -4978,7 +5188,7 @@
               <w:rPr>
                 <w:rFonts w:ascii="Calibri" w:eastAsia="Calibri" w:hAnsi="Calibri" w:cs="Calibri"/>
               </w:rPr>
-              <w:t>SRAT</w:t>
+              <w:t>ABN8</w:t>
             </w:r>
           </w:p>
         </w:tc>
@@ -5180,7 +5390,7 @@
               <w:rPr>
                 <w:rFonts w:ascii="Calibri" w:eastAsia="Calibri" w:hAnsi="Calibri" w:cs="Calibri"/>
               </w:rPr>
-              <w:t>VND1</w:t>
+              <w:t>ADM10 (L/O)</w:t>
             </w:r>
           </w:p>
         </w:tc>
@@ -5382,7 +5592,7 @@
               <w:rPr>
                 <w:rFonts w:ascii="Calibri" w:eastAsia="Calibri" w:hAnsi="Calibri" w:cs="Calibri"/>
               </w:rPr>
-              <w:t>AD10</w:t>
+              <w:t>SF SPL</w:t>
             </w:r>
           </w:p>
         </w:tc>
@@ -5584,7 +5794,7 @@
               <w:rPr>
                 <w:rFonts w:ascii="Calibri" w:eastAsia="Calibri" w:hAnsi="Calibri" w:cs="Calibri"/>
               </w:rPr>
-              <w:t>VND2</w:t>
+              <w:t>SF SPL</w:t>
             </w:r>
           </w:p>
         </w:tc>
@@ -5700,22 +5910,9 @@
             <w:r>
               <w:rPr>
                 <w:rFonts w:ascii="Calibri" w:eastAsia="Calibri" w:hAnsi="Calibri" w:cs="Calibri"/>
-                <w:b/>
                 <w:sz w:val="24"/>
               </w:rPr>
-              <w:t xml:space="preserve"> </w:t>
-            </w:r>
-            <w:r>
-              <w:rPr>
-                <w:rFonts w:ascii="Calibri" w:eastAsia="Calibri" w:hAnsi="Calibri" w:cs="Calibri"/>
-              </w:rPr>
-              <w:t>ABN8</w:t>
-            </w:r>
-            <w:r>
-              <w:rPr>
-                <w:rFonts w:ascii="Calibri" w:eastAsia="Calibri" w:hAnsi="Calibri" w:cs="Calibri"/>
-              </w:rPr>
-              <w:t>,VIR1</w:t>
+              <w:t>VIR-1</w:t>
             </w:r>
           </w:p>
         </w:tc>
@@ -5802,7 +5999,7 @@
           <v:rect id="_x0000_i1025" style="width:57.75pt;height:43.5pt" o:ole="" o:preferrelative="t" stroked="f">
             <v:imagedata r:id="rId5" o:title=""/>
           </v:rect>
-          <o:OLEObject Type="Embed" ProgID="StaticMetafile" ShapeID="_x0000_i1025" DrawAspect="Content" ObjectID="_1849009637" r:id="rId6"/>
+          <o:OLEObject Type="Embed" ProgID="StaticMetafile" ShapeID="_x0000_i1025" DrawAspect="Content" ObjectID="_1849096396" r:id="rId6"/>
         </w:object>
       </w:r>
     </w:p>
@@ -6331,7 +6528,7 @@
               <w:rPr>
                 <w:rFonts w:ascii="Calibri" w:eastAsia="Calibri" w:hAnsi="Calibri" w:cs="Calibri"/>
               </w:rPr>
-              <w:t>JIND</w:t>
+              <w:t>SJOT</w:t>
             </w:r>
           </w:p>
         </w:tc>
@@ -6533,12 +6730,6 @@
                 <w:rFonts w:ascii="Calibri" w:eastAsia="Calibri" w:hAnsi="Calibri" w:cs="Calibri"/>
               </w:rPr>
             </w:pPr>
-            <w:r>
-              <w:rPr>
-                <w:rFonts w:ascii="Calibri" w:eastAsia="Calibri" w:hAnsi="Calibri" w:cs="Calibri"/>
-              </w:rPr>
-              <w:t>TCPP</w:t>
-            </w:r>
           </w:p>
         </w:tc>
         <w:tc>
@@ -6740,14 +6931,6 @@
                 <w:rFonts w:ascii="Calibri" w:eastAsia="Calibri" w:hAnsi="Calibri" w:cs="Calibri"/>
               </w:rPr>
             </w:pPr>
-            <w:r>
-              <w:rPr>
-                <w:rFonts w:ascii="Calibri" w:eastAsia="Calibri" w:hAnsi="Calibri" w:cs="Calibri"/>
-              </w:rPr>
-              <w:t>SJOT</w:t>
-            </w:r>
-            <w:bookmarkStart w:id="0" w:name="_GoBack"/>
-            <w:bookmarkEnd w:id="0"/>
           </w:p>
         </w:tc>
         <w:tc>

</xml_diff>

<commit_message>
Sync - 2026-08-25 16:30
</commit_message>
<xml_diff>
--- a/files/Daily_Helicopter_Schedule.docx
+++ b/files/Daily_Helicopter_Schedule.docx
@@ -35,7 +35,7 @@
           <w:b/>
           <w:color w:val="000000" w:themeColor="text1"/>
         </w:rPr>
-        <w:t>25</w:t>
+        <w:t>26</w:t>
       </w:r>
       <w:r>
         <w:rPr>
@@ -59,7 +59,15 @@
           <w:b/>
           <w:color w:val="000000" w:themeColor="text1"/>
         </w:rPr>
-        <w:t>TUES</w:t>
+        <w:t>WEDN</w:t>
+      </w:r>
+      <w:r>
+        <w:rPr>
+          <w:rFonts w:ascii="Times New Roman" w:hAnsi="Times New Roman" w:cs="Times New Roman"/>
+          <w:b/>
+          <w:color w:val="000000" w:themeColor="text1"/>
+        </w:rPr>
+        <w:t>ES</w:t>
       </w:r>
       <w:r>
         <w:rPr>
@@ -726,7 +734,7 @@
               <w:rPr>
                 <w:rFonts w:ascii="Calibri" w:eastAsia="Calibri" w:hAnsi="Calibri" w:cs="Calibri"/>
               </w:rPr>
-              <w:t>412</w:t>
+              <w:t>169</w:t>
             </w:r>
           </w:p>
         </w:tc>
@@ -757,7 +765,7 @@
               <w:rPr>
                 <w:rFonts w:ascii="Calibri" w:eastAsia="Calibri" w:hAnsi="Calibri" w:cs="Calibri"/>
               </w:rPr>
-              <w:t>GVT</w:t>
+              <w:t xml:space="preserve"> RRK</w:t>
             </w:r>
           </w:p>
         </w:tc>
@@ -945,7 +953,13 @@
               <w:rPr>
                 <w:rFonts w:ascii="Calibri" w:eastAsia="Calibri" w:hAnsi="Calibri" w:cs="Calibri"/>
               </w:rPr>
-              <w:t>GVHL 169</w:t>
+              <w:t xml:space="preserve">GVHL </w:t>
+            </w:r>
+            <w:r>
+              <w:rPr>
+                <w:rFonts w:ascii="Calibri" w:eastAsia="Calibri" w:hAnsi="Calibri" w:cs="Calibri"/>
+              </w:rPr>
+              <w:t>412</w:t>
             </w:r>
           </w:p>
         </w:tc>
@@ -976,7 +990,7 @@
               <w:rPr>
                 <w:rFonts w:ascii="Calibri" w:eastAsia="Calibri" w:hAnsi="Calibri" w:cs="Calibri"/>
               </w:rPr>
-              <w:t>RRK</w:t>
+              <w:t>GVT</w:t>
             </w:r>
           </w:p>
         </w:tc>
@@ -1153,6 +1167,12 @@
               </w:rPr>
               <w:t xml:space="preserve"> </w:t>
             </w:r>
+            <w:r>
+              <w:rPr>
+                <w:rFonts w:ascii="Calibri" w:eastAsia="Calibri" w:hAnsi="Calibri" w:cs="Calibri"/>
+              </w:rPr>
+              <w:t>+NF[D]</w:t>
+            </w:r>
           </w:p>
         </w:tc>
         <w:tc>
@@ -1182,7 +1202,7 @@
               <w:rPr>
                 <w:rFonts w:ascii="Calibri" w:eastAsia="Calibri" w:hAnsi="Calibri" w:cs="Calibri"/>
               </w:rPr>
-              <w:t>GVHL 169</w:t>
+              <w:t>GVHL 412</w:t>
             </w:r>
           </w:p>
         </w:tc>
@@ -1213,7 +1233,7 @@
               <w:rPr>
                 <w:rFonts w:ascii="Calibri" w:eastAsia="Calibri" w:hAnsi="Calibri" w:cs="Calibri"/>
               </w:rPr>
-              <w:t xml:space="preserve"> RRL</w:t>
+              <w:t xml:space="preserve"> RRI</w:t>
             </w:r>
           </w:p>
         </w:tc>
@@ -1370,7 +1390,7 @@
               <w:rPr>
                 <w:rFonts w:ascii="Calibri" w:eastAsia="Calibri" w:hAnsi="Calibri" w:cs="Calibri"/>
               </w:rPr>
-              <w:t>NF (D)</w:t>
+              <w:t>NA</w:t>
             </w:r>
           </w:p>
         </w:tc>
@@ -1401,7 +1421,7 @@
               <w:rPr>
                 <w:rFonts w:ascii="Calibri" w:eastAsia="Calibri" w:hAnsi="Calibri" w:cs="Calibri"/>
               </w:rPr>
-              <w:t>GVHL 412</w:t>
+              <w:t>NA</w:t>
             </w:r>
           </w:p>
         </w:tc>
@@ -1432,7 +1452,7 @@
               <w:rPr>
                 <w:rFonts w:ascii="Calibri" w:eastAsia="Calibri" w:hAnsi="Calibri" w:cs="Calibri"/>
               </w:rPr>
-              <w:t>RRI</w:t>
+              <w:t>NA</w:t>
             </w:r>
           </w:p>
         </w:tc>
@@ -1463,7 +1483,7 @@
               <w:rPr>
                 <w:rFonts w:ascii="Calibri" w:eastAsia="Calibri" w:hAnsi="Calibri" w:cs="Calibri"/>
               </w:rPr>
-              <w:t>06</w:t>
+              <w:t>00</w:t>
             </w:r>
           </w:p>
         </w:tc>
@@ -2159,7 +2179,7 @@
               <w:rPr>
                 <w:rFonts w:ascii="Calibri" w:eastAsia="Calibri" w:hAnsi="Calibri" w:cs="Calibri"/>
               </w:rPr>
-              <w:t>RRN</w:t>
+              <w:t>RRL</w:t>
             </w:r>
           </w:p>
         </w:tc>
@@ -2860,60 +2880,72 @@
               <w:rPr>
                 <w:rFonts w:ascii="Calibri" w:eastAsia="Calibri" w:hAnsi="Calibri" w:cs="Calibri"/>
               </w:rPr>
-              <w:t>BPA</w:t>
-            </w:r>
-          </w:p>
-        </w:tc>
-        <w:tc>
-          <w:tcPr>
-            <w:tcW w:w="1387" w:type="dxa"/>
-            <w:tcBorders>
-              <w:top w:val="single" w:sz="4" w:space="0" w:color="000000"/>
-              <w:left w:val="single" w:sz="4" w:space="0" w:color="000000"/>
-              <w:bottom w:val="single" w:sz="4" w:space="0" w:color="000000"/>
-              <w:right w:val="single" w:sz="4" w:space="0" w:color="000000"/>
-            </w:tcBorders>
-            <w:shd w:val="clear" w:color="000000" w:fill="FFFFFF"/>
-            <w:tcMar>
-              <w:left w:w="108" w:type="dxa"/>
-              <w:right w:w="108" w:type="dxa"/>
-            </w:tcMar>
-          </w:tcPr>
-          <w:p>
-            <w:pPr>
-              <w:spacing w:after="0" w:line="240" w:lineRule="auto"/>
-              <w:jc w:val="center"/>
-              <w:rPr>
-                <w:rFonts w:ascii="Calibri" w:eastAsia="Calibri" w:hAnsi="Calibri" w:cs="Calibri"/>
-              </w:rPr>
-            </w:pPr>
-          </w:p>
-        </w:tc>
-        <w:tc>
-          <w:tcPr>
-            <w:tcW w:w="1180" w:type="dxa"/>
-            <w:tcBorders>
-              <w:top w:val="single" w:sz="4" w:space="0" w:color="000000"/>
-              <w:left w:val="single" w:sz="4" w:space="0" w:color="000000"/>
-              <w:bottom w:val="single" w:sz="4" w:space="0" w:color="000000"/>
-              <w:right w:val="single" w:sz="4" w:space="0" w:color="000000"/>
-            </w:tcBorders>
-            <w:shd w:val="clear" w:color="000000" w:fill="FFFFFF"/>
-            <w:tcMar>
-              <w:left w:w="108" w:type="dxa"/>
-              <w:right w:w="108" w:type="dxa"/>
-            </w:tcMar>
-          </w:tcPr>
-          <w:p>
-            <w:pPr>
-              <w:spacing w:after="0" w:line="240" w:lineRule="auto"/>
-              <w:jc w:val="center"/>
-              <w:rPr>
-                <w:rFonts w:ascii="Calibri" w:eastAsia="Calibri" w:hAnsi="Calibri" w:cs="Calibri"/>
-              </w:rPr>
-            </w:pPr>
+              <w:t>SLQ</w:t>
+            </w:r>
+            <w:r>
+              <w:rPr>
+                <w:rFonts w:ascii="Calibri" w:eastAsia="Calibri" w:hAnsi="Calibri" w:cs="Calibri"/>
+              </w:rPr>
+              <w:t xml:space="preserve"> SPL</w:t>
+            </w:r>
             <w:bookmarkStart w:id="0" w:name="_GoBack"/>
             <w:bookmarkEnd w:id="0"/>
+          </w:p>
+        </w:tc>
+        <w:tc>
+          <w:tcPr>
+            <w:tcW w:w="1387" w:type="dxa"/>
+            <w:tcBorders>
+              <w:top w:val="single" w:sz="4" w:space="0" w:color="000000"/>
+              <w:left w:val="single" w:sz="4" w:space="0" w:color="000000"/>
+              <w:bottom w:val="single" w:sz="4" w:space="0" w:color="000000"/>
+              <w:right w:val="single" w:sz="4" w:space="0" w:color="000000"/>
+            </w:tcBorders>
+            <w:shd w:val="clear" w:color="000000" w:fill="FFFFFF"/>
+            <w:tcMar>
+              <w:left w:w="108" w:type="dxa"/>
+              <w:right w:w="108" w:type="dxa"/>
+            </w:tcMar>
+          </w:tcPr>
+          <w:p>
+            <w:pPr>
+              <w:spacing w:after="0" w:line="240" w:lineRule="auto"/>
+              <w:jc w:val="center"/>
+              <w:rPr>
+                <w:rFonts w:ascii="Calibri" w:eastAsia="Calibri" w:hAnsi="Calibri" w:cs="Calibri"/>
+              </w:rPr>
+            </w:pPr>
+          </w:p>
+        </w:tc>
+        <w:tc>
+          <w:tcPr>
+            <w:tcW w:w="1180" w:type="dxa"/>
+            <w:tcBorders>
+              <w:top w:val="single" w:sz="4" w:space="0" w:color="000000"/>
+              <w:left w:val="single" w:sz="4" w:space="0" w:color="000000"/>
+              <w:bottom w:val="single" w:sz="4" w:space="0" w:color="000000"/>
+              <w:right w:val="single" w:sz="4" w:space="0" w:color="000000"/>
+            </w:tcBorders>
+            <w:shd w:val="clear" w:color="000000" w:fill="FFFFFF"/>
+            <w:tcMar>
+              <w:left w:w="108" w:type="dxa"/>
+              <w:right w:w="108" w:type="dxa"/>
+            </w:tcMar>
+          </w:tcPr>
+          <w:p>
+            <w:pPr>
+              <w:spacing w:after="0" w:line="240" w:lineRule="auto"/>
+              <w:jc w:val="center"/>
+              <w:rPr>
+                <w:rFonts w:ascii="Calibri" w:eastAsia="Calibri" w:hAnsi="Calibri" w:cs="Calibri"/>
+              </w:rPr>
+            </w:pPr>
+            <w:r>
+              <w:rPr>
+                <w:rFonts w:ascii="Calibri" w:eastAsia="Calibri" w:hAnsi="Calibri" w:cs="Calibri"/>
+              </w:rPr>
+              <w:t>RRL</w:t>
+            </w:r>
           </w:p>
         </w:tc>
         <w:tc>
@@ -3067,7 +3099,7 @@
               <w:rPr>
                 <w:rFonts w:ascii="Calibri" w:eastAsia="Calibri" w:hAnsi="Calibri" w:cs="Calibri"/>
               </w:rPr>
-              <w:t>NA</w:t>
+              <w:t>BPA</w:t>
             </w:r>
           </w:p>
         </w:tc>
@@ -3118,9 +3150,14 @@
               <w:jc w:val="center"/>
               <w:rPr>
                 <w:rFonts w:ascii="Calibri" w:eastAsia="Calibri" w:hAnsi="Calibri" w:cs="Calibri"/>
-                <w:b/>
-              </w:rPr>
-            </w:pPr>
+              </w:rPr>
+            </w:pPr>
+            <w:r>
+              <w:rPr>
+                <w:rFonts w:ascii="Calibri" w:eastAsia="Calibri" w:hAnsi="Calibri" w:cs="Calibri"/>
+              </w:rPr>
+              <w:t>GVZ</w:t>
+            </w:r>
           </w:p>
         </w:tc>
         <w:tc>
@@ -3274,7 +3311,13 @@
               <w:rPr>
                 <w:rFonts w:ascii="Calibri" w:eastAsia="Calibri" w:hAnsi="Calibri" w:cs="Calibri"/>
               </w:rPr>
-              <w:t>BPA</w:t>
+              <w:t>B193</w:t>
+            </w:r>
+            <w:r>
+              <w:rPr>
+                <w:rFonts w:ascii="Calibri" w:eastAsia="Calibri" w:hAnsi="Calibri" w:cs="Calibri"/>
+              </w:rPr>
+              <w:t xml:space="preserve"> </w:t>
             </w:r>
           </w:p>
         </w:tc>
@@ -3326,6 +3369,12 @@
                 <w:rFonts w:ascii="Calibri" w:eastAsia="Calibri" w:hAnsi="Calibri" w:cs="Calibri"/>
               </w:rPr>
             </w:pPr>
+            <w:r>
+              <w:rPr>
+                <w:rFonts w:ascii="Calibri" w:eastAsia="Calibri" w:hAnsi="Calibri" w:cs="Calibri"/>
+              </w:rPr>
+              <w:t>RRN</w:t>
+            </w:r>
           </w:p>
         </w:tc>
         <w:tc>
@@ -3448,7 +3497,7 @@
               <w:rPr>
                 <w:rFonts w:ascii="Calibri" w:eastAsia="Calibri" w:hAnsi="Calibri" w:cs="Calibri"/>
               </w:rPr>
-              <w:t>13:00</w:t>
+              <w:t>11:15</w:t>
             </w:r>
           </w:p>
         </w:tc>
@@ -3479,7 +3528,7 @@
               <w:rPr>
                 <w:rFonts w:ascii="Calibri" w:eastAsia="Calibri" w:hAnsi="Calibri" w:cs="Calibri"/>
               </w:rPr>
-              <w:t>NA</w:t>
+              <w:t>BPA</w:t>
             </w:r>
           </w:p>
         </w:tc>
@@ -3531,6 +3580,12 @@
                 <w:rFonts w:ascii="Calibri" w:eastAsia="Calibri" w:hAnsi="Calibri" w:cs="Calibri"/>
               </w:rPr>
             </w:pPr>
+            <w:r>
+              <w:rPr>
+                <w:rFonts w:ascii="Calibri" w:eastAsia="Calibri" w:hAnsi="Calibri" w:cs="Calibri"/>
+              </w:rPr>
+              <w:t>GVZ</w:t>
+            </w:r>
           </w:p>
         </w:tc>
         <w:tc>
@@ -3930,7 +3985,7 @@
               <w:rPr>
                 <w:rFonts w:ascii="Calibri" w:eastAsia="Calibri" w:hAnsi="Calibri" w:cs="Calibri"/>
               </w:rPr>
-              <w:t>R09A+R12A</w:t>
+              <w:t>ARMADA1</w:t>
             </w:r>
           </w:p>
         </w:tc>
@@ -4333,7 +4388,7 @@
               <w:rPr>
                 <w:rFonts w:ascii="Calibri" w:eastAsia="Calibri" w:hAnsi="Calibri" w:cs="Calibri"/>
               </w:rPr>
-              <w:t>SSAK</w:t>
+              <w:t>SHAKTI</w:t>
             </w:r>
           </w:p>
         </w:tc>
@@ -4534,7 +4589,7 @@
               <w:rPr>
                 <w:rFonts w:ascii="Calibri" w:eastAsia="Calibri" w:hAnsi="Calibri" w:cs="Calibri"/>
               </w:rPr>
-              <w:t>KSPR</w:t>
+              <w:t>NA</w:t>
             </w:r>
           </w:p>
         </w:tc>
@@ -4784,7 +4839,7 @@
               <w:rPr>
                 <w:rFonts w:ascii="Calibri" w:eastAsia="Calibri" w:hAnsi="Calibri" w:cs="Calibri"/>
               </w:rPr>
-              <w:t>HERA</w:t>
+              <w:t>RATNA</w:t>
             </w:r>
           </w:p>
         </w:tc>
@@ -4986,7 +5041,7 @@
               <w:rPr>
                 <w:rFonts w:ascii="Calibri" w:eastAsia="Calibri" w:hAnsi="Calibri" w:cs="Calibri"/>
               </w:rPr>
-              <w:t>NF SPL</w:t>
+              <w:t>VIR-1</w:t>
             </w:r>
           </w:p>
         </w:tc>
@@ -5188,7 +5243,7 @@
               <w:rPr>
                 <w:rFonts w:ascii="Calibri" w:eastAsia="Calibri" w:hAnsi="Calibri" w:cs="Calibri"/>
               </w:rPr>
-              <w:t>ABN8</w:t>
+              <w:t>B193</w:t>
             </w:r>
           </w:p>
         </w:tc>
@@ -5390,7 +5445,7 @@
               <w:rPr>
                 <w:rFonts w:ascii="Calibri" w:eastAsia="Calibri" w:hAnsi="Calibri" w:cs="Calibri"/>
               </w:rPr>
-              <w:t>ADM10 (L/O)</w:t>
+              <w:t>SMRT</w:t>
             </w:r>
           </w:p>
         </w:tc>
@@ -5592,7 +5647,7 @@
               <w:rPr>
                 <w:rFonts w:ascii="Calibri" w:eastAsia="Calibri" w:hAnsi="Calibri" w:cs="Calibri"/>
               </w:rPr>
-              <w:t>SF SPL</w:t>
+              <w:t>VKDN2</w:t>
             </w:r>
           </w:p>
         </w:tc>
@@ -5794,7 +5849,7 @@
               <w:rPr>
                 <w:rFonts w:ascii="Calibri" w:eastAsia="Calibri" w:hAnsi="Calibri" w:cs="Calibri"/>
               </w:rPr>
-              <w:t>SF SPL</w:t>
+              <w:t>SHQ SPL</w:t>
             </w:r>
           </w:p>
         </w:tc>
@@ -5912,7 +5967,7 @@
                 <w:rFonts w:ascii="Calibri" w:eastAsia="Calibri" w:hAnsi="Calibri" w:cs="Calibri"/>
                 <w:sz w:val="24"/>
               </w:rPr>
-              <w:t>VIR-1</w:t>
+              <w:t>NIL</w:t>
             </w:r>
           </w:p>
         </w:tc>
@@ -5996,10 +6051,10 @@
       </w:pPr>
       <w:r>
         <w:object w:dxaOrig="1188" w:dyaOrig="900">
-          <v:rect id="_x0000_i1025" style="width:57.75pt;height:43.5pt" o:ole="" o:preferrelative="t" stroked="f">
+          <v:rect id="_x0000_i1025" style="width:57.95pt;height:43.85pt" o:ole="" o:preferrelative="t" stroked="f">
             <v:imagedata r:id="rId5" o:title=""/>
           </v:rect>
-          <o:OLEObject Type="Embed" ProgID="StaticMetafile" ShapeID="_x0000_i1025" DrawAspect="Content" ObjectID="_1849096396" r:id="rId6"/>
+          <o:OLEObject Type="Embed" ProgID="StaticMetafile" ShapeID="_x0000_i1025" DrawAspect="Content" ObjectID="_1849178281" r:id="rId6"/>
         </w:object>
       </w:r>
     </w:p>
@@ -6528,7 +6583,7 @@
               <w:rPr>
                 <w:rFonts w:ascii="Calibri" w:eastAsia="Calibri" w:hAnsi="Calibri" w:cs="Calibri"/>
               </w:rPr>
-              <w:t>SJOT</w:t>
+              <w:t>CHARU</w:t>
             </w:r>
           </w:p>
         </w:tc>
@@ -6730,6 +6785,12 @@
                 <w:rFonts w:ascii="Calibri" w:eastAsia="Calibri" w:hAnsi="Calibri" w:cs="Calibri"/>
               </w:rPr>
             </w:pPr>
+            <w:r>
+              <w:rPr>
+                <w:rFonts w:ascii="Calibri" w:eastAsia="Calibri" w:hAnsi="Calibri" w:cs="Calibri"/>
+              </w:rPr>
+              <w:t>J STAR</w:t>
+            </w:r>
           </w:p>
         </w:tc>
         <w:tc>
@@ -6931,6 +6992,12 @@
                 <w:rFonts w:ascii="Calibri" w:eastAsia="Calibri" w:hAnsi="Calibri" w:cs="Calibri"/>
               </w:rPr>
             </w:pPr>
+            <w:r>
+              <w:rPr>
+                <w:rFonts w:ascii="Calibri" w:eastAsia="Calibri" w:hAnsi="Calibri" w:cs="Calibri"/>
+              </w:rPr>
+              <w:t>L/O</w:t>
+            </w:r>
           </w:p>
         </w:tc>
         <w:tc>

</xml_diff>

<commit_message>
Sync - 2026-08-26 15:34
</commit_message>
<xml_diff>
--- a/files/Daily_Helicopter_Schedule.docx
+++ b/files/Daily_Helicopter_Schedule.docx
@@ -35,7 +35,7 @@
           <w:b/>
           <w:color w:val="000000" w:themeColor="text1"/>
         </w:rPr>
-        <w:t>26</w:t>
+        <w:t>27</w:t>
       </w:r>
       <w:r>
         <w:rPr>
@@ -59,7 +59,7 @@
           <w:b/>
           <w:color w:val="000000" w:themeColor="text1"/>
         </w:rPr>
-        <w:t>WEDN</w:t>
+        <w:t>THUR</w:t>
       </w:r>
       <w:r>
         <w:rPr>
@@ -67,7 +67,7 @@
           <w:b/>
           <w:color w:val="000000" w:themeColor="text1"/>
         </w:rPr>
-        <w:t>ES</w:t>
+        <w:t>S</w:t>
       </w:r>
       <w:r>
         <w:rPr>
@@ -722,19 +722,7 @@
               <w:rPr>
                 <w:rFonts w:ascii="Calibri" w:eastAsia="Calibri" w:hAnsi="Calibri" w:cs="Calibri"/>
               </w:rPr>
-              <w:t>GVHL</w:t>
-            </w:r>
-            <w:r>
-              <w:rPr>
-                <w:rFonts w:ascii="Calibri" w:eastAsia="Calibri" w:hAnsi="Calibri" w:cs="Calibri"/>
-              </w:rPr>
-              <w:t xml:space="preserve"> </w:t>
-            </w:r>
-            <w:r>
-              <w:rPr>
-                <w:rFonts w:ascii="Calibri" w:eastAsia="Calibri" w:hAnsi="Calibri" w:cs="Calibri"/>
-              </w:rPr>
-              <w:t>169</w:t>
+              <w:t>NA</w:t>
             </w:r>
           </w:p>
         </w:tc>
@@ -765,7 +753,7 @@
               <w:rPr>
                 <w:rFonts w:ascii="Calibri" w:eastAsia="Calibri" w:hAnsi="Calibri" w:cs="Calibri"/>
               </w:rPr>
-              <w:t xml:space="preserve"> RRK</w:t>
+              <w:t>NA</w:t>
             </w:r>
           </w:p>
         </w:tc>
@@ -796,7 +784,7 @@
               <w:rPr>
                 <w:rFonts w:ascii="Calibri" w:eastAsia="Calibri" w:hAnsi="Calibri" w:cs="Calibri"/>
               </w:rPr>
-              <w:t>06</w:t>
+              <w:t>00</w:t>
             </w:r>
           </w:p>
         </w:tc>
@@ -959,7 +947,7 @@
               <w:rPr>
                 <w:rFonts w:ascii="Calibri" w:eastAsia="Calibri" w:hAnsi="Calibri" w:cs="Calibri"/>
               </w:rPr>
-              <w:t>412</w:t>
+              <w:t>169</w:t>
             </w:r>
           </w:p>
         </w:tc>
@@ -990,7 +978,7 @@
               <w:rPr>
                 <w:rFonts w:ascii="Calibri" w:eastAsia="Calibri" w:hAnsi="Calibri" w:cs="Calibri"/>
               </w:rPr>
-              <w:t>GVT</w:t>
+              <w:t>RRK</w:t>
             </w:r>
           </w:p>
         </w:tc>
@@ -1167,12 +1155,6 @@
               </w:rPr>
               <w:t xml:space="preserve"> </w:t>
             </w:r>
-            <w:r>
-              <w:rPr>
-                <w:rFonts w:ascii="Calibri" w:eastAsia="Calibri" w:hAnsi="Calibri" w:cs="Calibri"/>
-              </w:rPr>
-              <w:t>+NF[D]</w:t>
-            </w:r>
           </w:p>
         </w:tc>
         <w:tc>
@@ -1202,7 +1184,7 @@
               <w:rPr>
                 <w:rFonts w:ascii="Calibri" w:eastAsia="Calibri" w:hAnsi="Calibri" w:cs="Calibri"/>
               </w:rPr>
-              <w:t>GVHL 412</w:t>
+              <w:t>GVHL 169</w:t>
             </w:r>
           </w:p>
         </w:tc>
@@ -1233,7 +1215,7 @@
               <w:rPr>
                 <w:rFonts w:ascii="Calibri" w:eastAsia="Calibri" w:hAnsi="Calibri" w:cs="Calibri"/>
               </w:rPr>
-              <w:t xml:space="preserve"> RRI</w:t>
+              <w:t xml:space="preserve"> RRN</w:t>
             </w:r>
           </w:p>
         </w:tc>
@@ -1390,7 +1372,7 @@
               <w:rPr>
                 <w:rFonts w:ascii="Calibri" w:eastAsia="Calibri" w:hAnsi="Calibri" w:cs="Calibri"/>
               </w:rPr>
-              <w:t>NA</w:t>
+              <w:t>NF[D]</w:t>
             </w:r>
           </w:p>
         </w:tc>
@@ -1421,7 +1403,7 @@
               <w:rPr>
                 <w:rFonts w:ascii="Calibri" w:eastAsia="Calibri" w:hAnsi="Calibri" w:cs="Calibri"/>
               </w:rPr>
-              <w:t>NA</w:t>
+              <w:t>HELIGO 412</w:t>
             </w:r>
           </w:p>
         </w:tc>
@@ -1452,7 +1434,7 @@
               <w:rPr>
                 <w:rFonts w:ascii="Calibri" w:eastAsia="Calibri" w:hAnsi="Calibri" w:cs="Calibri"/>
               </w:rPr>
-              <w:t>NA</w:t>
+              <w:t>HLV</w:t>
             </w:r>
           </w:p>
         </w:tc>
@@ -1483,7 +1465,7 @@
               <w:rPr>
                 <w:rFonts w:ascii="Calibri" w:eastAsia="Calibri" w:hAnsi="Calibri" w:cs="Calibri"/>
               </w:rPr>
-              <w:t>00</w:t>
+              <w:t>08</w:t>
             </w:r>
           </w:p>
         </w:tc>
@@ -1687,9 +1669,8 @@
             <w:r>
               <w:rPr>
                 <w:rFonts w:ascii="Calibri" w:eastAsia="Calibri" w:hAnsi="Calibri" w:cs="Calibri"/>
-                <w:b/>
-              </w:rPr>
-              <w:t>NA</w:t>
+              </w:rPr>
+              <w:t>GVHL 412</w:t>
             </w:r>
           </w:p>
         </w:tc>
@@ -1720,7 +1701,7 @@
               <w:rPr>
                 <w:rFonts w:ascii="Calibri" w:eastAsia="Calibri" w:hAnsi="Calibri" w:cs="Calibri"/>
               </w:rPr>
-              <w:t>NA</w:t>
+              <w:t>GVT</w:t>
             </w:r>
           </w:p>
         </w:tc>
@@ -2880,16 +2861,8 @@
               <w:rPr>
                 <w:rFonts w:ascii="Calibri" w:eastAsia="Calibri" w:hAnsi="Calibri" w:cs="Calibri"/>
               </w:rPr>
-              <w:t>SLQ</w:t>
-            </w:r>
-            <w:r>
-              <w:rPr>
-                <w:rFonts w:ascii="Calibri" w:eastAsia="Calibri" w:hAnsi="Calibri" w:cs="Calibri"/>
-              </w:rPr>
-              <w:t xml:space="preserve"> SPL</w:t>
-            </w:r>
-            <w:bookmarkStart w:id="0" w:name="_GoBack"/>
-            <w:bookmarkEnd w:id="0"/>
+              <w:t>BLQ2</w:t>
+            </w:r>
           </w:p>
         </w:tc>
         <w:tc>
@@ -2944,7 +2917,7 @@
               <w:rPr>
                 <w:rFonts w:ascii="Calibri" w:eastAsia="Calibri" w:hAnsi="Calibri" w:cs="Calibri"/>
               </w:rPr>
-              <w:t>RRL</w:t>
+              <w:t xml:space="preserve">GVT </w:t>
             </w:r>
           </w:p>
         </w:tc>
@@ -3099,7 +3072,7 @@
               <w:rPr>
                 <w:rFonts w:ascii="Calibri" w:eastAsia="Calibri" w:hAnsi="Calibri" w:cs="Calibri"/>
               </w:rPr>
-              <w:t>BPA</w:t>
+              <w:t>J SUP</w:t>
             </w:r>
           </w:p>
         </w:tc>
@@ -3124,7 +3097,6 @@
               <w:jc w:val="center"/>
               <w:rPr>
                 <w:rFonts w:ascii="Calibri" w:eastAsia="Calibri" w:hAnsi="Calibri" w:cs="Calibri"/>
-                <w:b/>
               </w:rPr>
             </w:pPr>
           </w:p>
@@ -3156,7 +3128,7 @@
               <w:rPr>
                 <w:rFonts w:ascii="Calibri" w:eastAsia="Calibri" w:hAnsi="Calibri" w:cs="Calibri"/>
               </w:rPr>
-              <w:t>GVZ</w:t>
+              <w:t>RRI</w:t>
             </w:r>
           </w:p>
         </w:tc>
@@ -3280,7 +3252,7 @@
               <w:rPr>
                 <w:rFonts w:ascii="Calibri" w:eastAsia="Calibri" w:hAnsi="Calibri" w:cs="Calibri"/>
               </w:rPr>
-              <w:t>11:00</w:t>
+              <w:t>09:30</w:t>
             </w:r>
           </w:p>
         </w:tc>
@@ -3311,13 +3283,7 @@
               <w:rPr>
                 <w:rFonts w:ascii="Calibri" w:eastAsia="Calibri" w:hAnsi="Calibri" w:cs="Calibri"/>
               </w:rPr>
-              <w:t>B193</w:t>
-            </w:r>
-            <w:r>
-              <w:rPr>
-                <w:rFonts w:ascii="Calibri" w:eastAsia="Calibri" w:hAnsi="Calibri" w:cs="Calibri"/>
-              </w:rPr>
-              <w:t xml:space="preserve"> </w:t>
+              <w:t>HRA</w:t>
             </w:r>
           </w:p>
         </w:tc>
@@ -3373,7 +3339,7 @@
               <w:rPr>
                 <w:rFonts w:ascii="Calibri" w:eastAsia="Calibri" w:hAnsi="Calibri" w:cs="Calibri"/>
               </w:rPr>
-              <w:t>RRN</w:t>
+              <w:t>GVZ</w:t>
             </w:r>
           </w:p>
         </w:tc>
@@ -3528,7 +3494,218 @@
               <w:rPr>
                 <w:rFonts w:ascii="Calibri" w:eastAsia="Calibri" w:hAnsi="Calibri" w:cs="Calibri"/>
               </w:rPr>
-              <w:t>BPA</w:t>
+              <w:t>SLQ SPL</w:t>
+            </w:r>
+          </w:p>
+        </w:tc>
+        <w:tc>
+          <w:tcPr>
+            <w:tcW w:w="1387" w:type="dxa"/>
+            <w:tcBorders>
+              <w:top w:val="single" w:sz="4" w:space="0" w:color="000000"/>
+              <w:left w:val="single" w:sz="4" w:space="0" w:color="000000"/>
+              <w:bottom w:val="single" w:sz="4" w:space="0" w:color="000000"/>
+              <w:right w:val="single" w:sz="4" w:space="0" w:color="000000"/>
+            </w:tcBorders>
+            <w:shd w:val="clear" w:color="000000" w:fill="FFFFFF"/>
+            <w:tcMar>
+              <w:left w:w="108" w:type="dxa"/>
+              <w:right w:w="108" w:type="dxa"/>
+            </w:tcMar>
+          </w:tcPr>
+          <w:p>
+            <w:pPr>
+              <w:spacing w:after="0" w:line="240" w:lineRule="auto"/>
+              <w:jc w:val="center"/>
+              <w:rPr>
+                <w:rFonts w:ascii="Calibri" w:eastAsia="Calibri" w:hAnsi="Calibri" w:cs="Calibri"/>
+              </w:rPr>
+            </w:pPr>
+          </w:p>
+        </w:tc>
+        <w:tc>
+          <w:tcPr>
+            <w:tcW w:w="1180" w:type="dxa"/>
+            <w:tcBorders>
+              <w:top w:val="single" w:sz="4" w:space="0" w:color="000000"/>
+              <w:left w:val="single" w:sz="4" w:space="0" w:color="000000"/>
+              <w:bottom w:val="single" w:sz="4" w:space="0" w:color="000000"/>
+              <w:right w:val="single" w:sz="4" w:space="0" w:color="000000"/>
+            </w:tcBorders>
+            <w:shd w:val="clear" w:color="000000" w:fill="FFFFFF"/>
+            <w:tcMar>
+              <w:left w:w="108" w:type="dxa"/>
+              <w:right w:w="108" w:type="dxa"/>
+            </w:tcMar>
+          </w:tcPr>
+          <w:p>
+            <w:pPr>
+              <w:spacing w:after="0" w:line="240" w:lineRule="auto"/>
+              <w:jc w:val="center"/>
+              <w:rPr>
+                <w:rFonts w:ascii="Calibri" w:eastAsia="Calibri" w:hAnsi="Calibri" w:cs="Calibri"/>
+              </w:rPr>
+            </w:pPr>
+            <w:r>
+              <w:rPr>
+                <w:rFonts w:ascii="Calibri" w:eastAsia="Calibri" w:hAnsi="Calibri" w:cs="Calibri"/>
+              </w:rPr>
+              <w:t>RRI</w:t>
+            </w:r>
+          </w:p>
+        </w:tc>
+        <w:tc>
+          <w:tcPr>
+            <w:tcW w:w="1168" w:type="dxa"/>
+            <w:tcBorders>
+              <w:top w:val="single" w:sz="4" w:space="0" w:color="000000"/>
+              <w:left w:val="single" w:sz="4" w:space="0" w:color="000000"/>
+              <w:bottom w:val="single" w:sz="4" w:space="0" w:color="000000"/>
+              <w:right w:val="single" w:sz="4" w:space="0" w:color="000000"/>
+            </w:tcBorders>
+            <w:shd w:val="clear" w:color="000000" w:fill="FFFFFF"/>
+            <w:tcMar>
+              <w:left w:w="108" w:type="dxa"/>
+              <w:right w:w="108" w:type="dxa"/>
+            </w:tcMar>
+          </w:tcPr>
+          <w:p>
+            <w:pPr>
+              <w:spacing w:after="0" w:line="240" w:lineRule="auto"/>
+              <w:jc w:val="center"/>
+              <w:rPr>
+                <w:rFonts w:ascii="Calibri" w:eastAsia="Calibri" w:hAnsi="Calibri" w:cs="Calibri"/>
+              </w:rPr>
+            </w:pPr>
+          </w:p>
+        </w:tc>
+      </w:tr>
+      <w:tr>
+        <w:tc>
+          <w:tcPr>
+            <w:tcW w:w="620" w:type="dxa"/>
+            <w:tcBorders>
+              <w:top w:val="single" w:sz="4" w:space="0" w:color="000000"/>
+              <w:left w:val="single" w:sz="4" w:space="0" w:color="000000"/>
+              <w:bottom w:val="single" w:sz="4" w:space="0" w:color="000000"/>
+              <w:right w:val="single" w:sz="4" w:space="0" w:color="000000"/>
+            </w:tcBorders>
+            <w:shd w:val="clear" w:color="000000" w:fill="FFFFFF"/>
+            <w:tcMar>
+              <w:left w:w="108" w:type="dxa"/>
+              <w:right w:w="108" w:type="dxa"/>
+            </w:tcMar>
+          </w:tcPr>
+          <w:p>
+            <w:pPr>
+              <w:spacing w:after="0" w:line="240" w:lineRule="auto"/>
+              <w:jc w:val="center"/>
+              <w:rPr>
+                <w:rFonts w:ascii="Calibri" w:eastAsia="Calibri" w:hAnsi="Calibri" w:cs="Calibri"/>
+              </w:rPr>
+            </w:pPr>
+            <w:r>
+              <w:rPr>
+                <w:rFonts w:ascii="Calibri" w:eastAsia="Calibri" w:hAnsi="Calibri" w:cs="Calibri"/>
+              </w:rPr>
+              <w:t>5</w:t>
+            </w:r>
+          </w:p>
+        </w:tc>
+        <w:tc>
+          <w:tcPr>
+            <w:tcW w:w="1414" w:type="dxa"/>
+            <w:tcBorders>
+              <w:top w:val="single" w:sz="4" w:space="0" w:color="000000"/>
+              <w:left w:val="single" w:sz="4" w:space="0" w:color="000000"/>
+              <w:bottom w:val="single" w:sz="4" w:space="0" w:color="000000"/>
+              <w:right w:val="single" w:sz="4" w:space="0" w:color="000000"/>
+            </w:tcBorders>
+            <w:shd w:val="clear" w:color="000000" w:fill="FFFFFF"/>
+            <w:tcMar>
+              <w:left w:w="108" w:type="dxa"/>
+              <w:right w:w="108" w:type="dxa"/>
+            </w:tcMar>
+          </w:tcPr>
+          <w:p>
+            <w:pPr>
+              <w:spacing w:after="0" w:line="240" w:lineRule="auto"/>
+              <w:jc w:val="center"/>
+              <w:rPr>
+                <w:rFonts w:ascii="Calibri" w:eastAsia="Calibri" w:hAnsi="Calibri" w:cs="Calibri"/>
+              </w:rPr>
+            </w:pPr>
+            <w:r>
+              <w:rPr>
+                <w:rFonts w:ascii="Calibri" w:eastAsia="Calibri" w:hAnsi="Calibri" w:cs="Calibri"/>
+              </w:rPr>
+              <w:t>08:30</w:t>
+            </w:r>
+          </w:p>
+        </w:tc>
+        <w:tc>
+          <w:tcPr>
+            <w:tcW w:w="1339" w:type="dxa"/>
+            <w:tcBorders>
+              <w:top w:val="single" w:sz="4" w:space="0" w:color="000000"/>
+              <w:left w:val="single" w:sz="4" w:space="0" w:color="000000"/>
+              <w:bottom w:val="single" w:sz="4" w:space="0" w:color="000000"/>
+              <w:right w:val="single" w:sz="4" w:space="0" w:color="000000"/>
+            </w:tcBorders>
+            <w:shd w:val="clear" w:color="000000" w:fill="FFFFFF"/>
+            <w:tcMar>
+              <w:left w:w="108" w:type="dxa"/>
+              <w:right w:w="108" w:type="dxa"/>
+            </w:tcMar>
+          </w:tcPr>
+          <w:p>
+            <w:pPr>
+              <w:tabs>
+                <w:tab w:val="left" w:pos="368"/>
+                <w:tab w:val="center" w:pos="767"/>
+              </w:tabs>
+              <w:spacing w:after="0" w:line="240" w:lineRule="auto"/>
+              <w:jc w:val="center"/>
+              <w:rPr>
+                <w:rFonts w:ascii="Calibri" w:eastAsia="Calibri" w:hAnsi="Calibri" w:cs="Calibri"/>
+              </w:rPr>
+            </w:pPr>
+            <w:r>
+              <w:rPr>
+                <w:rFonts w:ascii="Calibri" w:eastAsia="Calibri" w:hAnsi="Calibri" w:cs="Calibri"/>
+              </w:rPr>
+              <w:t>11:30</w:t>
+            </w:r>
+          </w:p>
+        </w:tc>
+        <w:tc>
+          <w:tcPr>
+            <w:tcW w:w="1810" w:type="dxa"/>
+            <w:tcBorders>
+              <w:top w:val="single" w:sz="4" w:space="0" w:color="000000"/>
+              <w:left w:val="single" w:sz="4" w:space="0" w:color="000000"/>
+              <w:bottom w:val="single" w:sz="4" w:space="0" w:color="000000"/>
+              <w:right w:val="single" w:sz="4" w:space="0" w:color="000000"/>
+            </w:tcBorders>
+            <w:shd w:val="clear" w:color="000000" w:fill="FFFFFF"/>
+            <w:tcMar>
+              <w:left w:w="108" w:type="dxa"/>
+              <w:right w:w="108" w:type="dxa"/>
+            </w:tcMar>
+          </w:tcPr>
+          <w:p>
+            <w:pPr>
+              <w:spacing w:after="0" w:line="240" w:lineRule="auto"/>
+              <w:jc w:val="center"/>
+              <w:rPr>
+                <w:rFonts w:ascii="Calibri" w:eastAsia="Calibri" w:hAnsi="Calibri" w:cs="Calibri"/>
+              </w:rPr>
+            </w:pPr>
+            <w:r>
+              <w:rPr>
+                <w:rFonts w:ascii="Calibri" w:eastAsia="Calibri" w:hAnsi="Calibri" w:cs="Calibri"/>
+              </w:rPr>
+              <w:t>BLQ2</w:t>
             </w:r>
           </w:p>
         </w:tc>
@@ -3985,7 +4162,7 @@
               <w:rPr>
                 <w:rFonts w:ascii="Calibri" w:eastAsia="Calibri" w:hAnsi="Calibri" w:cs="Calibri"/>
               </w:rPr>
-              <w:t>ARMADA1</w:t>
+              <w:t>NA</w:t>
             </w:r>
           </w:p>
         </w:tc>
@@ -4388,7 +4565,7 @@
               <w:rPr>
                 <w:rFonts w:ascii="Calibri" w:eastAsia="Calibri" w:hAnsi="Calibri" w:cs="Calibri"/>
               </w:rPr>
-              <w:t>SHAKTI</w:t>
+              <w:t>NA</w:t>
             </w:r>
           </w:p>
         </w:tc>
@@ -4839,7 +5016,7 @@
               <w:rPr>
                 <w:rFonts w:ascii="Calibri" w:eastAsia="Calibri" w:hAnsi="Calibri" w:cs="Calibri"/>
               </w:rPr>
-              <w:t>RATNA</w:t>
+              <w:t>UDAY</w:t>
             </w:r>
           </w:p>
         </w:tc>
@@ -5041,7 +5218,7 @@
               <w:rPr>
                 <w:rFonts w:ascii="Calibri" w:eastAsia="Calibri" w:hAnsi="Calibri" w:cs="Calibri"/>
               </w:rPr>
-              <w:t>VIR-1</w:t>
+              <w:t>J EXPLR</w:t>
             </w:r>
           </w:p>
         </w:tc>
@@ -5243,7 +5420,7 @@
               <w:rPr>
                 <w:rFonts w:ascii="Calibri" w:eastAsia="Calibri" w:hAnsi="Calibri" w:cs="Calibri"/>
               </w:rPr>
-              <w:t>B193</w:t>
+              <w:t xml:space="preserve"> HRA</w:t>
             </w:r>
           </w:p>
         </w:tc>
@@ -5445,7 +5622,13 @@
               <w:rPr>
                 <w:rFonts w:ascii="Calibri" w:eastAsia="Calibri" w:hAnsi="Calibri" w:cs="Calibri"/>
               </w:rPr>
-              <w:t>SMRT</w:t>
+              <w:t>J SUP</w:t>
+            </w:r>
+            <w:r>
+              <w:rPr>
+                <w:rFonts w:ascii="Calibri" w:eastAsia="Calibri" w:hAnsi="Calibri" w:cs="Calibri"/>
+              </w:rPr>
+              <w:t xml:space="preserve"> </w:t>
             </w:r>
           </w:p>
         </w:tc>
@@ -5647,7 +5830,7 @@
               <w:rPr>
                 <w:rFonts w:ascii="Calibri" w:eastAsia="Calibri" w:hAnsi="Calibri" w:cs="Calibri"/>
               </w:rPr>
-              <w:t>VKDN2</w:t>
+              <w:t>DSFN</w:t>
             </w:r>
           </w:p>
         </w:tc>
@@ -5849,7 +6032,7 @@
               <w:rPr>
                 <w:rFonts w:ascii="Calibri" w:eastAsia="Calibri" w:hAnsi="Calibri" w:cs="Calibri"/>
               </w:rPr>
-              <w:t>SHQ SPL</w:t>
+              <w:t>SCHLR</w:t>
             </w:r>
           </w:p>
         </w:tc>
@@ -6054,7 +6237,7 @@
           <v:rect id="_x0000_i1025" style="width:57.95pt;height:43.85pt" o:ole="" o:preferrelative="t" stroked="f">
             <v:imagedata r:id="rId5" o:title=""/>
           </v:rect>
-          <o:OLEObject Type="Embed" ProgID="StaticMetafile" ShapeID="_x0000_i1025" DrawAspect="Content" ObjectID="_1849178281" r:id="rId6"/>
+          <o:OLEObject Type="Embed" ProgID="StaticMetafile" ShapeID="_x0000_i1025" DrawAspect="Content" ObjectID="_1849262178" r:id="rId6"/>
         </w:object>
       </w:r>
     </w:p>
@@ -6583,7 +6766,7 @@
               <w:rPr>
                 <w:rFonts w:ascii="Calibri" w:eastAsia="Calibri" w:hAnsi="Calibri" w:cs="Calibri"/>
               </w:rPr>
-              <w:t>CHARU</w:t>
+              <w:t>TAPTI</w:t>
             </w:r>
           </w:p>
         </w:tc>
@@ -6789,8 +6972,10 @@
               <w:rPr>
                 <w:rFonts w:ascii="Calibri" w:eastAsia="Calibri" w:hAnsi="Calibri" w:cs="Calibri"/>
               </w:rPr>
-              <w:t>J STAR</w:t>
-            </w:r>
+              <w:t>L/O</w:t>
+            </w:r>
+            <w:bookmarkStart w:id="0" w:name="_GoBack"/>
+            <w:bookmarkEnd w:id="0"/>
           </w:p>
         </w:tc>
         <w:tc>

</xml_diff>

<commit_message>
Sync - 2026-08-28 17:40
</commit_message>
<xml_diff>
--- a/files/Daily_Helicopter_Schedule.docx
+++ b/files/Daily_Helicopter_Schedule.docx
@@ -6,7 +6,7 @@
       <w:pPr>
         <w:pStyle w:val="Heading2"/>
         <w:spacing w:before="0"/>
-        <w:ind w:left="-426" w:right="-1039"/>
+        <w:ind w:left="-709" w:right="-1039"/>
         <w:rPr>
           <w:rFonts w:ascii="Times New Roman" w:hAnsi="Times New Roman" w:cs="Times New Roman"/>
           <w:b/>
@@ -18,7 +18,7 @@
           <v:rect id="_x0000_i1025" style="width:57.75pt;height:43.5pt" o:ole="" o:preferrelative="t" stroked="f">
             <v:imagedata r:id="rId4" o:title=""/>
           </v:rect>
-          <o:OLEObject Type="Embed" ProgID="StaticMetafile" ShapeID="_x0000_i1025" DrawAspect="Content" ObjectID="_1849355253" r:id="rId5"/>
+          <o:OLEObject Type="Embed" ProgID="StaticMetafile" ShapeID="_x0000_i1025" DrawAspect="Content" ObjectID="_1849442605" r:id="rId5"/>
         </w:object>
       </w:r>
       <w:r>
@@ -51,7 +51,7 @@
           <w:b/>
           <w:color w:val="000000" w:themeColor="text1"/>
         </w:rPr>
-        <w:t>28</w:t>
+        <w:t>29</w:t>
       </w:r>
       <w:r>
         <w:rPr>
@@ -83,7 +83,7 @@
           <w:b/>
           <w:color w:val="000000" w:themeColor="text1"/>
         </w:rPr>
-        <w:t>FRI</w:t>
+        <w:t>SATUR</w:t>
       </w:r>
       <w:r>
         <w:rPr>
@@ -737,7 +737,7 @@
                 <w:sz w:val="26"/>
                 <w:szCs w:val="26"/>
               </w:rPr>
-              <w:t>412</w:t>
+              <w:t>169</w:t>
             </w:r>
           </w:p>
         </w:tc>
@@ -772,7 +772,7 @@
                 <w:sz w:val="26"/>
                 <w:szCs w:val="26"/>
               </w:rPr>
-              <w:t>GVT</w:t>
+              <w:t>GVZ</w:t>
             </w:r>
           </w:p>
         </w:tc>
@@ -1484,17 +1484,7 @@
                 <w:sz w:val="26"/>
                 <w:szCs w:val="26"/>
               </w:rPr>
-              <w:t xml:space="preserve">NF </w:t>
-            </w:r>
-            <w:bookmarkStart w:id="0" w:name="_GoBack"/>
-            <w:bookmarkEnd w:id="0"/>
-            <w:r>
-              <w:rPr>
-                <w:rFonts w:ascii="Calibri" w:eastAsia="Calibri" w:hAnsi="Calibri" w:cs="Calibri"/>
-                <w:sz w:val="26"/>
-                <w:szCs w:val="26"/>
-              </w:rPr>
-              <w:t>(D)</w:t>
+              <w:t>NF (D)</w:t>
             </w:r>
           </w:p>
         </w:tc>
@@ -1572,7 +1562,7 @@
                 <w:sz w:val="26"/>
                 <w:szCs w:val="26"/>
               </w:rPr>
-              <w:t>RRI</w:t>
+              <w:t>GVT</w:t>
             </w:r>
           </w:p>
         </w:tc>
@@ -3202,7 +3192,7 @@
                 <w:sz w:val="26"/>
                 <w:szCs w:val="26"/>
               </w:rPr>
-              <w:t>BPB</w:t>
+              <w:t>SUDA</w:t>
             </w:r>
           </w:p>
         </w:tc>
@@ -3891,7 +3881,7 @@
                 <w:sz w:val="26"/>
                 <w:szCs w:val="26"/>
               </w:rPr>
-              <w:t>BPB</w:t>
+              <w:t>SUDA</w:t>
             </w:r>
           </w:p>
         </w:tc>
@@ -4129,7 +4119,7 @@
                 <w:sz w:val="26"/>
                 <w:szCs w:val="26"/>
               </w:rPr>
-              <w:t>NA</w:t>
+              <w:t>SUDA</w:t>
             </w:r>
           </w:p>
         </w:tc>
@@ -4636,7 +4626,7 @@
                 <w:sz w:val="26"/>
                 <w:szCs w:val="26"/>
               </w:rPr>
-              <w:t>SJOT</w:t>
+              <w:t>SSAK</w:t>
             </w:r>
           </w:p>
         </w:tc>
@@ -5097,7 +5087,7 @@
                 <w:sz w:val="26"/>
                 <w:szCs w:val="26"/>
               </w:rPr>
-              <w:t>SGAV</w:t>
+              <w:t>SRAT</w:t>
             </w:r>
           </w:p>
         </w:tc>
@@ -5288,7 +5278,15 @@
                 <w:sz w:val="26"/>
                 <w:szCs w:val="26"/>
               </w:rPr>
-              <w:t>12:55</w:t>
+              <w:t>13:0</w:t>
+            </w:r>
+            <w:r>
+              <w:rPr>
+                <w:rFonts w:ascii="Calibri" w:eastAsia="Calibri" w:hAnsi="Calibri" w:cs="Calibri"/>
+                <w:sz w:val="26"/>
+                <w:szCs w:val="26"/>
+              </w:rPr>
+              <w:t>5</w:t>
             </w:r>
           </w:p>
         </w:tc>
@@ -5323,7 +5321,7 @@
                 <w:sz w:val="26"/>
                 <w:szCs w:val="26"/>
               </w:rPr>
-              <w:t>ADM9</w:t>
+              <w:t>SMRT</w:t>
             </w:r>
           </w:p>
         </w:tc>
@@ -5605,7 +5603,7 @@
                 <w:sz w:val="26"/>
                 <w:szCs w:val="26"/>
               </w:rPr>
-              <w:t>SHP</w:t>
+              <w:t>FDIX</w:t>
             </w:r>
           </w:p>
         </w:tc>
@@ -5661,6 +5659,8 @@
                 <w:szCs w:val="26"/>
               </w:rPr>
             </w:pPr>
+            <w:bookmarkStart w:id="0" w:name="_GoBack"/>
+            <w:bookmarkEnd w:id="0"/>
           </w:p>
         </w:tc>
         <w:tc>
@@ -5832,7 +5832,7 @@
                 <w:sz w:val="26"/>
                 <w:szCs w:val="26"/>
               </w:rPr>
-              <w:t>ICP</w:t>
+              <w:t>DVDR</w:t>
             </w:r>
           </w:p>
         </w:tc>
@@ -6059,7 +6059,7 @@
                 <w:sz w:val="26"/>
                 <w:szCs w:val="26"/>
               </w:rPr>
-              <w:t>SLQ</w:t>
+              <w:t>ADM11</w:t>
             </w:r>
           </w:p>
         </w:tc>
@@ -6286,7 +6286,7 @@
                 <w:sz w:val="26"/>
                 <w:szCs w:val="26"/>
               </w:rPr>
-              <w:t>B193</w:t>
+              <w:t>SCHAL</w:t>
             </w:r>
           </w:p>
         </w:tc>
@@ -6513,7 +6513,7 @@
                 <w:sz w:val="26"/>
                 <w:szCs w:val="26"/>
               </w:rPr>
-              <w:t>NQO</w:t>
+              <w:t>DEFOS</w:t>
             </w:r>
           </w:p>
         </w:tc>
@@ -6740,7 +6740,7 @@
                 <w:sz w:val="26"/>
                 <w:szCs w:val="26"/>
               </w:rPr>
-              <w:t>MNW</w:t>
+              <w:t>DISC-1</w:t>
             </w:r>
           </w:p>
         </w:tc>
@@ -6975,7 +6975,7 @@
           <v:rect id="_x0000_i1026" style="width:57.75pt;height:43.5pt" o:ole="" o:preferrelative="t" stroked="f">
             <v:imagedata r:id="rId4" o:title=""/>
           </v:rect>
-          <o:OLEObject Type="Embed" ProgID="StaticMetafile" ShapeID="_x0000_i1026" DrawAspect="Content" ObjectID="_1849355254" r:id="rId6"/>
+          <o:OLEObject Type="Embed" ProgID="StaticMetafile" ShapeID="_x0000_i1026" DrawAspect="Content" ObjectID="_1849442606" r:id="rId6"/>
         </w:object>
       </w:r>
       <w:r>
@@ -7003,6 +7003,17 @@
         <w:t>SURAT</w:t>
       </w:r>
     </w:p>
+    <w:p>
+      <w:pPr>
+        <w:spacing w:after="0" w:line="240" w:lineRule="auto"/>
+        <w:rPr>
+          <w:rFonts w:ascii="Calibri" w:eastAsia="Calibri" w:hAnsi="Calibri" w:cs="Calibri"/>
+          <w:b/>
+          <w:sz w:val="40"/>
+          <w:u w:val="single"/>
+        </w:rPr>
+      </w:pPr>
+    </w:p>
     <w:tbl>
       <w:tblPr>
         <w:tblpPr w:leftFromText="180" w:rightFromText="180" w:vertAnchor="text" w:horzAnchor="margin" w:tblpY="137"/>
@@ -7517,14 +7528,6 @@
                 <w:szCs w:val="26"/>
               </w:rPr>
             </w:pPr>
-            <w:r>
-              <w:rPr>
-                <w:rFonts w:ascii="Calibri" w:eastAsia="Calibri" w:hAnsi="Calibri" w:cs="Calibri"/>
-                <w:sz w:val="26"/>
-                <w:szCs w:val="26"/>
-              </w:rPr>
-              <w:t>TCPP</w:t>
-            </w:r>
           </w:p>
         </w:tc>
         <w:tc>
@@ -7747,14 +7750,6 @@
                 <w:szCs w:val="26"/>
               </w:rPr>
             </w:pPr>
-            <w:r>
-              <w:rPr>
-                <w:rFonts w:ascii="Calibri" w:eastAsia="Calibri" w:hAnsi="Calibri" w:cs="Calibri"/>
-                <w:sz w:val="26"/>
-                <w:szCs w:val="26"/>
-              </w:rPr>
-              <w:t>CHRU</w:t>
-            </w:r>
           </w:p>
         </w:tc>
         <w:tc>

</xml_diff>

<commit_message>
Sync - 2026-08-29 15:43
</commit_message>
<xml_diff>
--- a/files/Daily_Helicopter_Schedule.docx
+++ b/files/Daily_Helicopter_Schedule.docx
@@ -15,10 +15,10 @@
       </w:pPr>
       <w:r>
         <w:object w:dxaOrig="1188" w:dyaOrig="900">
-          <v:rect id="_x0000_i1025" style="width:57.75pt;height:43.5pt" o:ole="" o:preferrelative="t" stroked="f">
+          <v:rect id="_x0000_i1025" style="width:57.95pt;height:43.85pt" o:ole="" o:preferrelative="t" stroked="f">
             <v:imagedata r:id="rId4" o:title=""/>
           </v:rect>
-          <o:OLEObject Type="Embed" ProgID="StaticMetafile" ShapeID="_x0000_i1025" DrawAspect="Content" ObjectID="_1849442605" r:id="rId5"/>
+          <o:OLEObject Type="Embed" ProgID="StaticMetafile" ShapeID="_x0000_i1025" DrawAspect="Content" ObjectID="_1849521954" r:id="rId5"/>
         </w:object>
       </w:r>
       <w:r>
@@ -51,7 +51,7 @@
           <w:b/>
           <w:color w:val="000000" w:themeColor="text1"/>
         </w:rPr>
-        <w:t>29</w:t>
+        <w:t>30</w:t>
       </w:r>
       <w:r>
         <w:rPr>
@@ -83,7 +83,7 @@
           <w:b/>
           <w:color w:val="000000" w:themeColor="text1"/>
         </w:rPr>
-        <w:t>SATUR</w:t>
+        <w:t>SUN</w:t>
       </w:r>
       <w:r>
         <w:rPr>
@@ -737,7 +737,7 @@
                 <w:sz w:val="26"/>
                 <w:szCs w:val="26"/>
               </w:rPr>
-              <w:t>169</w:t>
+              <w:t>412</w:t>
             </w:r>
           </w:p>
         </w:tc>
@@ -772,7 +772,7 @@
                 <w:sz w:val="26"/>
                 <w:szCs w:val="26"/>
               </w:rPr>
-              <w:t>GVZ</w:t>
+              <w:t>GVT</w:t>
             </w:r>
           </w:p>
         </w:tc>
@@ -807,7 +807,7 @@
                 <w:sz w:val="26"/>
                 <w:szCs w:val="26"/>
               </w:rPr>
-              <w:t>06</w:t>
+              <w:t>08</w:t>
             </w:r>
           </w:p>
         </w:tc>
@@ -1236,6 +1236,14 @@
               </w:rPr>
               <w:t xml:space="preserve"> </w:t>
             </w:r>
+            <w:r>
+              <w:rPr>
+                <w:rFonts w:ascii="Calibri" w:eastAsia="Calibri" w:hAnsi="Calibri" w:cs="Calibri"/>
+                <w:sz w:val="26"/>
+                <w:szCs w:val="26"/>
+              </w:rPr>
+              <w:t>+NF[D]</w:t>
+            </w:r>
           </w:p>
         </w:tc>
         <w:tc>
@@ -1474,17 +1482,19 @@
               <w:jc w:val="center"/>
               <w:rPr>
                 <w:rFonts w:ascii="Calibri" w:eastAsia="Calibri" w:hAnsi="Calibri" w:cs="Calibri"/>
-                <w:sz w:val="26"/>
-                <w:szCs w:val="26"/>
-              </w:rPr>
-            </w:pPr>
-            <w:r>
-              <w:rPr>
-                <w:rFonts w:ascii="Calibri" w:eastAsia="Calibri" w:hAnsi="Calibri" w:cs="Calibri"/>
-                <w:sz w:val="26"/>
-                <w:szCs w:val="26"/>
-              </w:rPr>
-              <w:t>NF (D)</w:t>
+                <w:b/>
+                <w:sz w:val="26"/>
+                <w:szCs w:val="26"/>
+              </w:rPr>
+            </w:pPr>
+            <w:r>
+              <w:rPr>
+                <w:rFonts w:ascii="Calibri" w:eastAsia="Calibri" w:hAnsi="Calibri" w:cs="Calibri"/>
+                <w:b/>
+                <w:sz w:val="26"/>
+                <w:szCs w:val="26"/>
+              </w:rPr>
+              <w:t>NA</w:t>
             </w:r>
           </w:p>
         </w:tc>
@@ -1509,25 +1519,19 @@
               <w:jc w:val="center"/>
               <w:rPr>
                 <w:rFonts w:ascii="Calibri" w:eastAsia="Calibri" w:hAnsi="Calibri" w:cs="Calibri"/>
-                <w:sz w:val="26"/>
-                <w:szCs w:val="26"/>
-              </w:rPr>
-            </w:pPr>
-            <w:r>
-              <w:rPr>
-                <w:rFonts w:ascii="Calibri" w:eastAsia="Calibri" w:hAnsi="Calibri" w:cs="Calibri"/>
-                <w:sz w:val="26"/>
-                <w:szCs w:val="26"/>
-              </w:rPr>
-              <w:t xml:space="preserve">GVHL </w:t>
-            </w:r>
-            <w:r>
-              <w:rPr>
-                <w:rFonts w:ascii="Calibri" w:eastAsia="Calibri" w:hAnsi="Calibri" w:cs="Calibri"/>
-                <w:sz w:val="26"/>
-                <w:szCs w:val="26"/>
-              </w:rPr>
-              <w:t>412</w:t>
+                <w:b/>
+                <w:sz w:val="26"/>
+                <w:szCs w:val="26"/>
+              </w:rPr>
+            </w:pPr>
+            <w:r>
+              <w:rPr>
+                <w:rFonts w:ascii="Calibri" w:eastAsia="Calibri" w:hAnsi="Calibri" w:cs="Calibri"/>
+                <w:b/>
+                <w:sz w:val="26"/>
+                <w:szCs w:val="26"/>
+              </w:rPr>
+              <w:t>NA</w:t>
             </w:r>
           </w:p>
         </w:tc>
@@ -1552,17 +1556,19 @@
               <w:jc w:val="center"/>
               <w:rPr>
                 <w:rFonts w:ascii="Calibri" w:eastAsia="Calibri" w:hAnsi="Calibri" w:cs="Calibri"/>
-                <w:sz w:val="26"/>
-                <w:szCs w:val="26"/>
-              </w:rPr>
-            </w:pPr>
-            <w:r>
-              <w:rPr>
-                <w:rFonts w:ascii="Calibri" w:eastAsia="Calibri" w:hAnsi="Calibri" w:cs="Calibri"/>
-                <w:sz w:val="26"/>
-                <w:szCs w:val="26"/>
-              </w:rPr>
-              <w:t>GVT</w:t>
+                <w:b/>
+                <w:sz w:val="26"/>
+                <w:szCs w:val="26"/>
+              </w:rPr>
+            </w:pPr>
+            <w:r>
+              <w:rPr>
+                <w:rFonts w:ascii="Calibri" w:eastAsia="Calibri" w:hAnsi="Calibri" w:cs="Calibri"/>
+                <w:b/>
+                <w:sz w:val="26"/>
+                <w:szCs w:val="26"/>
+              </w:rPr>
+              <w:t>NA</w:t>
             </w:r>
           </w:p>
         </w:tc>
@@ -1597,7 +1603,7 @@
                 <w:sz w:val="26"/>
                 <w:szCs w:val="26"/>
               </w:rPr>
-              <w:t>08</w:t>
+              <w:t>00</w:t>
             </w:r>
           </w:p>
         </w:tc>
@@ -1858,13 +1864,15 @@
               <w:jc w:val="center"/>
               <w:rPr>
                 <w:rFonts w:ascii="Calibri" w:eastAsia="Calibri" w:hAnsi="Calibri" w:cs="Calibri"/>
-                <w:sz w:val="26"/>
-                <w:szCs w:val="26"/>
-              </w:rPr>
-            </w:pPr>
-            <w:r>
-              <w:rPr>
-                <w:rFonts w:ascii="Calibri" w:eastAsia="Calibri" w:hAnsi="Calibri" w:cs="Calibri"/>
+                <w:b/>
+                <w:sz w:val="26"/>
+                <w:szCs w:val="26"/>
+              </w:rPr>
+            </w:pPr>
+            <w:r>
+              <w:rPr>
+                <w:rFonts w:ascii="Calibri" w:eastAsia="Calibri" w:hAnsi="Calibri" w:cs="Calibri"/>
+                <w:b/>
                 <w:sz w:val="26"/>
                 <w:szCs w:val="26"/>
               </w:rPr>
@@ -2025,7 +2033,15 @@
                 <w:sz w:val="26"/>
                 <w:szCs w:val="26"/>
               </w:rPr>
-              <w:t>14:00</w:t>
+              <w:t>11</w:t>
+            </w:r>
+            <w:r>
+              <w:rPr>
+                <w:rFonts w:ascii="Calibri" w:eastAsia="Calibri" w:hAnsi="Calibri" w:cs="Calibri"/>
+                <w:sz w:val="26"/>
+                <w:szCs w:val="26"/>
+              </w:rPr>
+              <w:t>:00</w:t>
             </w:r>
           </w:p>
         </w:tc>
@@ -2064,7 +2080,15 @@
                 <w:sz w:val="26"/>
                 <w:szCs w:val="26"/>
               </w:rPr>
-              <w:t>BLQ (N)</w:t>
+              <w:t>BLQ (PM</w:t>
+            </w:r>
+            <w:r>
+              <w:rPr>
+                <w:rFonts w:ascii="Calibri" w:eastAsia="Calibri" w:hAnsi="Calibri" w:cs="Calibri"/>
+                <w:sz w:val="26"/>
+                <w:szCs w:val="26"/>
+              </w:rPr>
+              <w:t>)</w:t>
             </w:r>
           </w:p>
         </w:tc>
@@ -2099,7 +2123,7 @@
                 <w:sz w:val="26"/>
                 <w:szCs w:val="26"/>
               </w:rPr>
-              <w:t>HELIGO 145</w:t>
+              <w:t>GVHL 169</w:t>
             </w:r>
           </w:p>
         </w:tc>
@@ -2134,7 +2158,7 @@
                 <w:sz w:val="26"/>
                 <w:szCs w:val="26"/>
               </w:rPr>
-              <w:t>HLY</w:t>
+              <w:t>GVZ</w:t>
             </w:r>
           </w:p>
         </w:tc>
@@ -3192,7 +3216,7 @@
                 <w:sz w:val="26"/>
                 <w:szCs w:val="26"/>
               </w:rPr>
-              <w:t>SUDA</w:t>
+              <w:t>PANNA</w:t>
             </w:r>
           </w:p>
         </w:tc>
@@ -3248,6 +3272,14 @@
                 <w:szCs w:val="26"/>
               </w:rPr>
             </w:pPr>
+            <w:r>
+              <w:rPr>
+                <w:rFonts w:ascii="Calibri" w:eastAsia="Calibri" w:hAnsi="Calibri" w:cs="Calibri"/>
+                <w:sz w:val="26"/>
+                <w:szCs w:val="26"/>
+              </w:rPr>
+              <w:t>GVZ</w:t>
+            </w:r>
           </w:p>
         </w:tc>
         <w:tc>
@@ -3422,7 +3454,7 @@
                 <w:sz w:val="26"/>
                 <w:szCs w:val="26"/>
               </w:rPr>
-              <w:t>NA</w:t>
+              <w:t>GAURAV</w:t>
             </w:r>
           </w:p>
         </w:tc>
@@ -3471,12 +3503,21 @@
           <w:p>
             <w:pPr>
               <w:spacing w:after="0" w:line="240" w:lineRule="auto"/>
-              <w:rPr>
-                <w:rFonts w:ascii="Calibri" w:eastAsia="Calibri" w:hAnsi="Calibri" w:cs="Calibri"/>
-                <w:sz w:val="26"/>
-                <w:szCs w:val="26"/>
-              </w:rPr>
-            </w:pPr>
+              <w:jc w:val="center"/>
+              <w:rPr>
+                <w:rFonts w:ascii="Calibri" w:eastAsia="Calibri" w:hAnsi="Calibri" w:cs="Calibri"/>
+                <w:sz w:val="26"/>
+                <w:szCs w:val="26"/>
+              </w:rPr>
+            </w:pPr>
+            <w:r>
+              <w:rPr>
+                <w:rFonts w:ascii="Calibri" w:eastAsia="Calibri" w:hAnsi="Calibri" w:cs="Calibri"/>
+                <w:sz w:val="26"/>
+                <w:szCs w:val="26"/>
+              </w:rPr>
+              <w:t>RRI</w:t>
+            </w:r>
           </w:p>
         </w:tc>
         <w:tc>
@@ -3707,6 +3748,14 @@
                 <w:szCs w:val="26"/>
               </w:rPr>
             </w:pPr>
+            <w:r>
+              <w:rPr>
+                <w:rFonts w:ascii="Calibri" w:eastAsia="Calibri" w:hAnsi="Calibri" w:cs="Calibri"/>
+                <w:sz w:val="26"/>
+                <w:szCs w:val="26"/>
+              </w:rPr>
+              <w:t>NA</w:t>
+            </w:r>
           </w:p>
         </w:tc>
         <w:tc>
@@ -3846,7 +3895,7 @@
                 <w:sz w:val="26"/>
                 <w:szCs w:val="26"/>
               </w:rPr>
-              <w:t>11:00</w:t>
+              <w:t>11:15</w:t>
             </w:r>
           </w:p>
         </w:tc>
@@ -3881,7 +3930,7 @@
                 <w:sz w:val="26"/>
                 <w:szCs w:val="26"/>
               </w:rPr>
-              <w:t>SUDA</w:t>
+              <w:t>DSF</w:t>
             </w:r>
           </w:p>
         </w:tc>
@@ -3937,6 +3986,14 @@
                 <w:szCs w:val="26"/>
               </w:rPr>
             </w:pPr>
+            <w:r>
+              <w:rPr>
+                <w:rFonts w:ascii="Calibri" w:eastAsia="Calibri" w:hAnsi="Calibri" w:cs="Calibri"/>
+                <w:sz w:val="26"/>
+                <w:szCs w:val="26"/>
+              </w:rPr>
+              <w:t>RRI</w:t>
+            </w:r>
           </w:p>
         </w:tc>
         <w:tc>
@@ -4119,7 +4176,7 @@
                 <w:sz w:val="26"/>
                 <w:szCs w:val="26"/>
               </w:rPr>
-              <w:t>SUDA</w:t>
+              <w:t>PANNA</w:t>
             </w:r>
           </w:p>
         </w:tc>
@@ -4175,6 +4232,14 @@
                 <w:szCs w:val="26"/>
               </w:rPr>
             </w:pPr>
+            <w:r>
+              <w:rPr>
+                <w:rFonts w:ascii="Calibri" w:eastAsia="Calibri" w:hAnsi="Calibri" w:cs="Calibri"/>
+                <w:sz w:val="26"/>
+                <w:szCs w:val="26"/>
+              </w:rPr>
+              <w:t>RRI</w:t>
+            </w:r>
           </w:p>
         </w:tc>
         <w:tc>
@@ -4390,17 +4455,19 @@
               <w:jc w:val="center"/>
               <w:rPr>
                 <w:rFonts w:ascii="Calibri" w:eastAsia="Calibri" w:hAnsi="Calibri" w:cs="Calibri"/>
-                <w:sz w:val="26"/>
-                <w:szCs w:val="26"/>
-              </w:rPr>
-            </w:pPr>
-            <w:r>
-              <w:rPr>
-                <w:rFonts w:ascii="Calibri" w:eastAsia="Calibri" w:hAnsi="Calibri" w:cs="Calibri"/>
-                <w:sz w:val="26"/>
-                <w:szCs w:val="26"/>
-              </w:rPr>
-              <w:t>DSFN</w:t>
+                <w:b/>
+                <w:sz w:val="26"/>
+                <w:szCs w:val="26"/>
+              </w:rPr>
+            </w:pPr>
+            <w:r>
+              <w:rPr>
+                <w:rFonts w:ascii="Calibri" w:eastAsia="Calibri" w:hAnsi="Calibri" w:cs="Calibri"/>
+                <w:b/>
+                <w:sz w:val="26"/>
+                <w:szCs w:val="26"/>
+              </w:rPr>
+              <w:t>NA</w:t>
             </w:r>
           </w:p>
         </w:tc>
@@ -4425,6 +4492,7 @@
               <w:jc w:val="center"/>
               <w:rPr>
                 <w:rFonts w:ascii="Calibri" w:eastAsia="Calibri" w:hAnsi="Calibri" w:cs="Calibri"/>
+                <w:b/>
                 <w:sz w:val="26"/>
                 <w:szCs w:val="26"/>
               </w:rPr>
@@ -4452,10 +4520,20 @@
               <w:jc w:val="center"/>
               <w:rPr>
                 <w:rFonts w:ascii="Calibri" w:eastAsia="Calibri" w:hAnsi="Calibri" w:cs="Calibri"/>
-                <w:sz w:val="26"/>
-                <w:szCs w:val="26"/>
-              </w:rPr>
-            </w:pPr>
+                <w:b/>
+                <w:sz w:val="26"/>
+                <w:szCs w:val="26"/>
+              </w:rPr>
+            </w:pPr>
+            <w:r>
+              <w:rPr>
+                <w:rFonts w:ascii="Calibri" w:eastAsia="Calibri" w:hAnsi="Calibri" w:cs="Calibri"/>
+                <w:b/>
+                <w:sz w:val="26"/>
+                <w:szCs w:val="26"/>
+              </w:rPr>
+              <w:t>NA</w:t>
+            </w:r>
           </w:p>
         </w:tc>
         <w:tc>
@@ -4626,7 +4704,7 @@
                 <w:sz w:val="26"/>
                 <w:szCs w:val="26"/>
               </w:rPr>
-              <w:t>SSAK</w:t>
+              <w:t>ARMADA1</w:t>
             </w:r>
           </w:p>
         </w:tc>
@@ -4682,6 +4760,14 @@
                 <w:szCs w:val="26"/>
               </w:rPr>
             </w:pPr>
+            <w:r>
+              <w:rPr>
+                <w:rFonts w:ascii="Calibri" w:eastAsia="Calibri" w:hAnsi="Calibri" w:cs="Calibri"/>
+                <w:sz w:val="26"/>
+                <w:szCs w:val="26"/>
+              </w:rPr>
+              <w:t>HLV</w:t>
+            </w:r>
           </w:p>
         </w:tc>
         <w:tc>
@@ -4905,10 +4991,20 @@
               <w:jc w:val="center"/>
               <w:rPr>
                 <w:rFonts w:ascii="Calibri" w:eastAsia="Calibri" w:hAnsi="Calibri" w:cs="Calibri"/>
-                <w:sz w:val="26"/>
-                <w:szCs w:val="26"/>
-              </w:rPr>
-            </w:pPr>
+                <w:b/>
+                <w:sz w:val="26"/>
+                <w:szCs w:val="26"/>
+              </w:rPr>
+            </w:pPr>
+            <w:r>
+              <w:rPr>
+                <w:rFonts w:ascii="Calibri" w:eastAsia="Calibri" w:hAnsi="Calibri" w:cs="Calibri"/>
+                <w:b/>
+                <w:sz w:val="26"/>
+                <w:szCs w:val="26"/>
+              </w:rPr>
+              <w:t>NA</w:t>
+            </w:r>
           </w:p>
         </w:tc>
         <w:tc>
@@ -5087,7 +5183,7 @@
                 <w:sz w:val="26"/>
                 <w:szCs w:val="26"/>
               </w:rPr>
-              <w:t>SRAT</w:t>
+              <w:t>ABAN4</w:t>
             </w:r>
           </w:p>
         </w:tc>
@@ -5143,6 +5239,14 @@
                 <w:szCs w:val="26"/>
               </w:rPr>
             </w:pPr>
+            <w:r>
+              <w:rPr>
+                <w:rFonts w:ascii="Calibri" w:eastAsia="Calibri" w:hAnsi="Calibri" w:cs="Calibri"/>
+                <w:sz w:val="26"/>
+                <w:szCs w:val="26"/>
+              </w:rPr>
+              <w:t>HLV</w:t>
+            </w:r>
           </w:p>
         </w:tc>
         <w:tc>
@@ -5311,17 +5415,19 @@
               <w:jc w:val="center"/>
               <w:rPr>
                 <w:rFonts w:ascii="Calibri" w:eastAsia="Calibri" w:hAnsi="Calibri" w:cs="Calibri"/>
-                <w:sz w:val="26"/>
-                <w:szCs w:val="26"/>
-              </w:rPr>
-            </w:pPr>
-            <w:r>
-              <w:rPr>
-                <w:rFonts w:ascii="Calibri" w:eastAsia="Calibri" w:hAnsi="Calibri" w:cs="Calibri"/>
-                <w:sz w:val="26"/>
-                <w:szCs w:val="26"/>
-              </w:rPr>
-              <w:t>SMRT</w:t>
+                <w:b/>
+                <w:sz w:val="26"/>
+                <w:szCs w:val="26"/>
+              </w:rPr>
+            </w:pPr>
+            <w:r>
+              <w:rPr>
+                <w:rFonts w:ascii="Calibri" w:eastAsia="Calibri" w:hAnsi="Calibri" w:cs="Calibri"/>
+                <w:b/>
+                <w:sz w:val="26"/>
+                <w:szCs w:val="26"/>
+              </w:rPr>
+              <w:t>NA</w:t>
             </w:r>
           </w:p>
         </w:tc>
@@ -5346,6 +5452,7 @@
               <w:jc w:val="center"/>
               <w:rPr>
                 <w:rFonts w:ascii="Calibri" w:eastAsia="Calibri" w:hAnsi="Calibri" w:cs="Calibri"/>
+                <w:b/>
                 <w:sz w:val="26"/>
                 <w:szCs w:val="26"/>
               </w:rPr>
@@ -5373,10 +5480,20 @@
               <w:jc w:val="center"/>
               <w:rPr>
                 <w:rFonts w:ascii="Calibri" w:eastAsia="Calibri" w:hAnsi="Calibri" w:cs="Calibri"/>
-                <w:sz w:val="26"/>
-                <w:szCs w:val="26"/>
-              </w:rPr>
-            </w:pPr>
+                <w:b/>
+                <w:sz w:val="26"/>
+                <w:szCs w:val="26"/>
+              </w:rPr>
+            </w:pPr>
+            <w:r>
+              <w:rPr>
+                <w:rFonts w:ascii="Calibri" w:eastAsia="Calibri" w:hAnsi="Calibri" w:cs="Calibri"/>
+                <w:b/>
+                <w:sz w:val="26"/>
+                <w:szCs w:val="26"/>
+              </w:rPr>
+              <w:t>NA</w:t>
+            </w:r>
           </w:p>
         </w:tc>
         <w:tc>
@@ -5603,7 +5720,7 @@
                 <w:sz w:val="26"/>
                 <w:szCs w:val="26"/>
               </w:rPr>
-              <w:t>FDIX</w:t>
+              <w:t>VKDN1</w:t>
             </w:r>
           </w:p>
         </w:tc>
@@ -5659,8 +5776,14 @@
                 <w:szCs w:val="26"/>
               </w:rPr>
             </w:pPr>
-            <w:bookmarkStart w:id="0" w:name="_GoBack"/>
-            <w:bookmarkEnd w:id="0"/>
+            <w:r>
+              <w:rPr>
+                <w:rFonts w:ascii="Calibri" w:eastAsia="Calibri" w:hAnsi="Calibri" w:cs="Calibri"/>
+                <w:sz w:val="26"/>
+                <w:szCs w:val="26"/>
+              </w:rPr>
+              <w:t>HLU</w:t>
+            </w:r>
           </w:p>
         </w:tc>
         <w:tc>
@@ -5832,7 +5955,7 @@
                 <w:sz w:val="26"/>
                 <w:szCs w:val="26"/>
               </w:rPr>
-              <w:t>DVDR</w:t>
+              <w:t>ABAN8</w:t>
             </w:r>
           </w:p>
         </w:tc>
@@ -5888,6 +6011,14 @@
                 <w:szCs w:val="26"/>
               </w:rPr>
             </w:pPr>
+            <w:r>
+              <w:rPr>
+                <w:rFonts w:ascii="Calibri" w:eastAsia="Calibri" w:hAnsi="Calibri" w:cs="Calibri"/>
+                <w:sz w:val="26"/>
+                <w:szCs w:val="26"/>
+              </w:rPr>
+              <w:t>HLH</w:t>
+            </w:r>
           </w:p>
         </w:tc>
         <w:tc>
@@ -6059,7 +6190,7 @@
                 <w:sz w:val="26"/>
                 <w:szCs w:val="26"/>
               </w:rPr>
-              <w:t>ADM11</w:t>
+              <w:t>VKDN2</w:t>
             </w:r>
           </w:p>
         </w:tc>
@@ -6115,6 +6246,14 @@
                 <w:szCs w:val="26"/>
               </w:rPr>
             </w:pPr>
+            <w:r>
+              <w:rPr>
+                <w:rFonts w:ascii="Calibri" w:eastAsia="Calibri" w:hAnsi="Calibri" w:cs="Calibri"/>
+                <w:sz w:val="26"/>
+                <w:szCs w:val="26"/>
+              </w:rPr>
+              <w:t>HNB</w:t>
+            </w:r>
           </w:p>
         </w:tc>
         <w:tc>
@@ -6286,7 +6425,7 @@
                 <w:sz w:val="26"/>
                 <w:szCs w:val="26"/>
               </w:rPr>
-              <w:t>SCHAL</w:t>
+              <w:t>JTA</w:t>
             </w:r>
           </w:p>
         </w:tc>
@@ -6342,6 +6481,14 @@
                 <w:szCs w:val="26"/>
               </w:rPr>
             </w:pPr>
+            <w:r>
+              <w:rPr>
+                <w:rFonts w:ascii="Calibri" w:eastAsia="Calibri" w:hAnsi="Calibri" w:cs="Calibri"/>
+                <w:sz w:val="26"/>
+                <w:szCs w:val="26"/>
+              </w:rPr>
+              <w:t>HLU</w:t>
+            </w:r>
           </w:p>
         </w:tc>
         <w:tc>
@@ -6513,7 +6660,15 @@
                 <w:sz w:val="26"/>
                 <w:szCs w:val="26"/>
               </w:rPr>
-              <w:t>DEFOS</w:t>
+              <w:t>ADM10</w:t>
+            </w:r>
+            <w:r>
+              <w:rPr>
+                <w:rFonts w:ascii="Calibri" w:eastAsia="Calibri" w:hAnsi="Calibri" w:cs="Calibri"/>
+                <w:sz w:val="26"/>
+                <w:szCs w:val="26"/>
+              </w:rPr>
+              <w:t xml:space="preserve"> </w:t>
             </w:r>
           </w:p>
         </w:tc>
@@ -6569,6 +6724,14 @@
                 <w:szCs w:val="26"/>
               </w:rPr>
             </w:pPr>
+            <w:r>
+              <w:rPr>
+                <w:rFonts w:ascii="Calibri" w:eastAsia="Calibri" w:hAnsi="Calibri" w:cs="Calibri"/>
+                <w:sz w:val="26"/>
+                <w:szCs w:val="26"/>
+              </w:rPr>
+              <w:t>HLH</w:t>
+            </w:r>
           </w:p>
         </w:tc>
         <w:tc>
@@ -6740,7 +6903,7 @@
                 <w:sz w:val="26"/>
                 <w:szCs w:val="26"/>
               </w:rPr>
-              <w:t>DISC-1</w:t>
+              <w:t>CHITRA</w:t>
             </w:r>
           </w:p>
         </w:tc>
@@ -6796,6 +6959,14 @@
                 <w:szCs w:val="26"/>
               </w:rPr>
             </w:pPr>
+            <w:r>
+              <w:rPr>
+                <w:rFonts w:ascii="Calibri" w:eastAsia="Calibri" w:hAnsi="Calibri" w:cs="Calibri"/>
+                <w:sz w:val="26"/>
+                <w:szCs w:val="26"/>
+              </w:rPr>
+              <w:t>HNB</w:t>
+            </w:r>
           </w:p>
         </w:tc>
         <w:tc>
@@ -6823,6 +6994,8 @@
                 <w:szCs w:val="26"/>
               </w:rPr>
             </w:pPr>
+            <w:bookmarkStart w:id="0" w:name="_GoBack"/>
+            <w:bookmarkEnd w:id="0"/>
           </w:p>
         </w:tc>
       </w:tr>
@@ -6861,13 +7034,6 @@
                 <w:sz w:val="24"/>
               </w:rPr>
               <w:t>WAITING:</w:t>
-            </w:r>
-            <w:r>
-              <w:rPr>
-                <w:rFonts w:ascii="Calibri" w:eastAsia="Calibri" w:hAnsi="Calibri" w:cs="Calibri"/>
-                <w:sz w:val="24"/>
-              </w:rPr>
-              <w:t>NIL</w:t>
             </w:r>
           </w:p>
         </w:tc>
@@ -6972,10 +7138,10 @@
       </w:pPr>
       <w:r>
         <w:object w:dxaOrig="1188" w:dyaOrig="900">
-          <v:rect id="_x0000_i1026" style="width:57.75pt;height:43.5pt" o:ole="" o:preferrelative="t" stroked="f">
+          <v:rect id="_x0000_i1026" style="width:57.95pt;height:43.85pt" o:ole="" o:preferrelative="t" stroked="f">
             <v:imagedata r:id="rId4" o:title=""/>
           </v:rect>
-          <o:OLEObject Type="Embed" ProgID="StaticMetafile" ShapeID="_x0000_i1026" DrawAspect="Content" ObjectID="_1849442606" r:id="rId6"/>
+          <o:OLEObject Type="Embed" ProgID="StaticMetafile" ShapeID="_x0000_i1026" DrawAspect="Content" ObjectID="_1849521955" r:id="rId6"/>
         </w:object>
       </w:r>
       <w:r>
@@ -7528,6 +7694,14 @@
                 <w:szCs w:val="26"/>
               </w:rPr>
             </w:pPr>
+            <w:r>
+              <w:rPr>
+                <w:rFonts w:ascii="Calibri" w:eastAsia="Calibri" w:hAnsi="Calibri" w:cs="Calibri"/>
+                <w:sz w:val="26"/>
+                <w:szCs w:val="26"/>
+              </w:rPr>
+              <w:t>TAPTI [D]</w:t>
+            </w:r>
           </w:p>
         </w:tc>
         <w:tc>

</xml_diff>

<commit_message>
Sync - 2026-08-30 16:16
</commit_message>
<xml_diff>
--- a/files/Daily_Helicopter_Schedule.docx
+++ b/files/Daily_Helicopter_Schedule.docx
@@ -15,10 +15,10 @@
       </w:pPr>
       <w:r>
         <w:object w:dxaOrig="1188" w:dyaOrig="900">
-          <v:rect id="_x0000_i1025" style="width:57.95pt;height:43.85pt" o:ole="" o:preferrelative="t" stroked="f">
+          <v:rect id="_x0000_i1025" style="width:58.3pt;height:43.7pt" o:ole="" o:preferrelative="t" stroked="f">
             <v:imagedata r:id="rId4" o:title=""/>
           </v:rect>
-          <o:OLEObject Type="Embed" ProgID="StaticMetafile" ShapeID="_x0000_i1025" DrawAspect="Content" ObjectID="_1849521954" r:id="rId5"/>
+          <o:OLEObject Type="Embed" ProgID="StaticMetafile" ShapeID="_x0000_i1025" DrawAspect="Content" ObjectID="_1849609971" r:id="rId5"/>
         </w:object>
       </w:r>
       <w:r>
@@ -51,7 +51,7 @@
           <w:b/>
           <w:color w:val="000000" w:themeColor="text1"/>
         </w:rPr>
-        <w:t>30</w:t>
+        <w:t>31</w:t>
       </w:r>
       <w:r>
         <w:rPr>
@@ -83,7 +83,15 @@
           <w:b/>
           <w:color w:val="000000" w:themeColor="text1"/>
         </w:rPr>
-        <w:t>SUN</w:t>
+        <w:t>MO</w:t>
+      </w:r>
+      <w:r>
+        <w:rPr>
+          <w:rFonts w:ascii="Times New Roman" w:hAnsi="Times New Roman" w:cs="Times New Roman"/>
+          <w:b/>
+          <w:color w:val="000000" w:themeColor="text1"/>
+        </w:rPr>
+        <w:t>N</w:t>
       </w:r>
       <w:r>
         <w:rPr>
@@ -707,37 +715,29 @@
               <w:bottom w:val="single" w:sz="4" w:space="0" w:color="000000"/>
               <w:right w:val="single" w:sz="4" w:space="0" w:color="000000"/>
             </w:tcBorders>
-            <w:shd w:val="clear" w:color="auto" w:fill="auto"/>
-            <w:tcMar>
-              <w:left w:w="108" w:type="dxa"/>
-              <w:right w:w="108" w:type="dxa"/>
-            </w:tcMar>
-          </w:tcPr>
-          <w:p>
-            <w:pPr>
-              <w:spacing w:after="0" w:line="240" w:lineRule="auto"/>
-              <w:jc w:val="center"/>
-              <w:rPr>
-                <w:rFonts w:ascii="Calibri" w:eastAsia="Calibri" w:hAnsi="Calibri" w:cs="Calibri"/>
-                <w:sz w:val="26"/>
-                <w:szCs w:val="26"/>
-              </w:rPr>
-            </w:pPr>
-            <w:r>
-              <w:rPr>
-                <w:rFonts w:ascii="Calibri" w:eastAsia="Calibri" w:hAnsi="Calibri" w:cs="Calibri"/>
-                <w:sz w:val="26"/>
-                <w:szCs w:val="26"/>
-              </w:rPr>
-              <w:t xml:space="preserve">GVHL </w:t>
-            </w:r>
-            <w:r>
-              <w:rPr>
-                <w:rFonts w:ascii="Calibri" w:eastAsia="Calibri" w:hAnsi="Calibri" w:cs="Calibri"/>
-                <w:sz w:val="26"/>
-                <w:szCs w:val="26"/>
-              </w:rPr>
-              <w:t>412</w:t>
+            <w:shd w:val="clear" w:color="000000" w:fill="FFFFFF"/>
+            <w:tcMar>
+              <w:left w:w="108" w:type="dxa"/>
+              <w:right w:w="108" w:type="dxa"/>
+            </w:tcMar>
+          </w:tcPr>
+          <w:p>
+            <w:pPr>
+              <w:spacing w:after="0" w:line="240" w:lineRule="auto"/>
+              <w:jc w:val="center"/>
+              <w:rPr>
+                <w:rFonts w:ascii="Calibri" w:eastAsia="Calibri" w:hAnsi="Calibri" w:cs="Calibri"/>
+                <w:sz w:val="26"/>
+                <w:szCs w:val="26"/>
+              </w:rPr>
+            </w:pPr>
+            <w:r>
+              <w:rPr>
+                <w:rFonts w:ascii="Calibri" w:eastAsia="Calibri" w:hAnsi="Calibri" w:cs="Calibri"/>
+                <w:sz w:val="26"/>
+                <w:szCs w:val="26"/>
+              </w:rPr>
+              <w:t>GVHL 412</w:t>
             </w:r>
           </w:p>
         </w:tc>
@@ -750,7 +750,7 @@
               <w:bottom w:val="single" w:sz="4" w:space="0" w:color="000000"/>
               <w:right w:val="single" w:sz="4" w:space="0" w:color="000000"/>
             </w:tcBorders>
-            <w:shd w:val="clear" w:color="auto" w:fill="auto"/>
+            <w:shd w:val="clear" w:color="000000" w:fill="FFFFFF"/>
             <w:tcMar>
               <w:left w:w="108" w:type="dxa"/>
               <w:right w:w="108" w:type="dxa"/>
@@ -987,15 +987,7 @@
                 <w:sz w:val="26"/>
                 <w:szCs w:val="26"/>
               </w:rPr>
-              <w:t xml:space="preserve">GVHL </w:t>
-            </w:r>
-            <w:r>
-              <w:rPr>
-                <w:rFonts w:ascii="Calibri" w:eastAsia="Calibri" w:hAnsi="Calibri" w:cs="Calibri"/>
-                <w:sz w:val="26"/>
-                <w:szCs w:val="26"/>
-              </w:rPr>
-              <w:t>169</w:t>
+              <w:t>GVHL 169</w:t>
             </w:r>
           </w:p>
         </w:tc>
@@ -1065,7 +1057,7 @@
                 <w:sz w:val="26"/>
                 <w:szCs w:val="26"/>
               </w:rPr>
-              <w:t>08</w:t>
+              <w:t>05</w:t>
             </w:r>
           </w:p>
         </w:tc>
@@ -1210,39 +1202,7 @@
                 <w:sz w:val="26"/>
                 <w:szCs w:val="26"/>
               </w:rPr>
-              <w:t>SF</w:t>
-            </w:r>
-            <w:r>
-              <w:rPr>
-                <w:rFonts w:ascii="Calibri" w:eastAsia="Calibri" w:hAnsi="Calibri" w:cs="Calibri"/>
-                <w:sz w:val="26"/>
-                <w:szCs w:val="26"/>
-              </w:rPr>
-              <w:t xml:space="preserve"> </w:t>
-            </w:r>
-            <w:r>
-              <w:rPr>
-                <w:rFonts w:ascii="Calibri" w:eastAsia="Calibri" w:hAnsi="Calibri" w:cs="Calibri"/>
-                <w:sz w:val="26"/>
-                <w:szCs w:val="26"/>
-              </w:rPr>
-              <w:t>(D)</w:t>
-            </w:r>
-            <w:r>
-              <w:rPr>
-                <w:rFonts w:ascii="Calibri" w:eastAsia="Calibri" w:hAnsi="Calibri" w:cs="Calibri"/>
-                <w:sz w:val="26"/>
-                <w:szCs w:val="26"/>
-              </w:rPr>
-              <w:t xml:space="preserve"> </w:t>
-            </w:r>
-            <w:r>
-              <w:rPr>
-                <w:rFonts w:ascii="Calibri" w:eastAsia="Calibri" w:hAnsi="Calibri" w:cs="Calibri"/>
-                <w:sz w:val="26"/>
-                <w:szCs w:val="26"/>
-              </w:rPr>
-              <w:t>+NF[D]</w:t>
+              <w:t xml:space="preserve">SF (D) </w:t>
             </w:r>
           </w:p>
         </w:tc>
@@ -1482,6 +1442,41 @@
               <w:jc w:val="center"/>
               <w:rPr>
                 <w:rFonts w:ascii="Calibri" w:eastAsia="Calibri" w:hAnsi="Calibri" w:cs="Calibri"/>
+                <w:sz w:val="26"/>
+                <w:szCs w:val="26"/>
+              </w:rPr>
+            </w:pPr>
+            <w:r>
+              <w:rPr>
+                <w:rFonts w:ascii="Calibri" w:eastAsia="Calibri" w:hAnsi="Calibri" w:cs="Calibri"/>
+                <w:sz w:val="26"/>
+                <w:szCs w:val="26"/>
+              </w:rPr>
+              <w:t>NF[D]</w:t>
+            </w:r>
+          </w:p>
+        </w:tc>
+        <w:tc>
+          <w:tcPr>
+            <w:tcW w:w="1510" w:type="dxa"/>
+            <w:tcBorders>
+              <w:top w:val="single" w:sz="4" w:space="0" w:color="000000"/>
+              <w:left w:val="single" w:sz="4" w:space="0" w:color="000000"/>
+              <w:bottom w:val="single" w:sz="4" w:space="0" w:color="000000"/>
+              <w:right w:val="single" w:sz="4" w:space="0" w:color="000000"/>
+            </w:tcBorders>
+            <w:shd w:val="clear" w:color="000000" w:fill="FFFFFF"/>
+            <w:tcMar>
+              <w:left w:w="108" w:type="dxa"/>
+              <w:right w:w="108" w:type="dxa"/>
+            </w:tcMar>
+          </w:tcPr>
+          <w:p>
+            <w:pPr>
+              <w:spacing w:after="0" w:line="240" w:lineRule="auto"/>
+              <w:jc w:val="center"/>
+              <w:rPr>
+                <w:rFonts w:ascii="Calibri" w:eastAsia="Calibri" w:hAnsi="Calibri" w:cs="Calibri"/>
                 <w:b/>
                 <w:sz w:val="26"/>
                 <w:szCs w:val="26"/>
@@ -1490,48 +1485,10 @@
             <w:r>
               <w:rPr>
                 <w:rFonts w:ascii="Calibri" w:eastAsia="Calibri" w:hAnsi="Calibri" w:cs="Calibri"/>
-                <w:b/>
-                <w:sz w:val="26"/>
-                <w:szCs w:val="26"/>
-              </w:rPr>
-              <w:t>NA</w:t>
-            </w:r>
-          </w:p>
-        </w:tc>
-        <w:tc>
-          <w:tcPr>
-            <w:tcW w:w="1510" w:type="dxa"/>
-            <w:tcBorders>
-              <w:top w:val="single" w:sz="4" w:space="0" w:color="000000"/>
-              <w:left w:val="single" w:sz="4" w:space="0" w:color="000000"/>
-              <w:bottom w:val="single" w:sz="4" w:space="0" w:color="000000"/>
-              <w:right w:val="single" w:sz="4" w:space="0" w:color="000000"/>
-            </w:tcBorders>
-            <w:shd w:val="clear" w:color="000000" w:fill="FFFFFF"/>
-            <w:tcMar>
-              <w:left w:w="108" w:type="dxa"/>
-              <w:right w:w="108" w:type="dxa"/>
-            </w:tcMar>
-          </w:tcPr>
-          <w:p>
-            <w:pPr>
-              <w:spacing w:after="0" w:line="240" w:lineRule="auto"/>
-              <w:jc w:val="center"/>
-              <w:rPr>
-                <w:rFonts w:ascii="Calibri" w:eastAsia="Calibri" w:hAnsi="Calibri" w:cs="Calibri"/>
-                <w:b/>
-                <w:sz w:val="26"/>
-                <w:szCs w:val="26"/>
-              </w:rPr>
-            </w:pPr>
-            <w:r>
-              <w:rPr>
-                <w:rFonts w:ascii="Calibri" w:eastAsia="Calibri" w:hAnsi="Calibri" w:cs="Calibri"/>
-                <w:b/>
-                <w:sz w:val="26"/>
-                <w:szCs w:val="26"/>
-              </w:rPr>
-              <w:t>NA</w:t>
+                <w:sz w:val="26"/>
+                <w:szCs w:val="26"/>
+              </w:rPr>
+              <w:t>GVHL 169</w:t>
             </w:r>
           </w:p>
         </w:tc>
@@ -1556,19 +1513,17 @@
               <w:jc w:val="center"/>
               <w:rPr>
                 <w:rFonts w:ascii="Calibri" w:eastAsia="Calibri" w:hAnsi="Calibri" w:cs="Calibri"/>
-                <w:b/>
-                <w:sz w:val="26"/>
-                <w:szCs w:val="26"/>
-              </w:rPr>
-            </w:pPr>
-            <w:r>
-              <w:rPr>
-                <w:rFonts w:ascii="Calibri" w:eastAsia="Calibri" w:hAnsi="Calibri" w:cs="Calibri"/>
-                <w:b/>
-                <w:sz w:val="26"/>
-                <w:szCs w:val="26"/>
-              </w:rPr>
-              <w:t>NA</w:t>
+                <w:sz w:val="26"/>
+                <w:szCs w:val="26"/>
+              </w:rPr>
+            </w:pPr>
+            <w:r>
+              <w:rPr>
+                <w:rFonts w:ascii="Calibri" w:eastAsia="Calibri" w:hAnsi="Calibri" w:cs="Calibri"/>
+                <w:sz w:val="26"/>
+                <w:szCs w:val="26"/>
+              </w:rPr>
+              <w:t>GVZ</w:t>
             </w:r>
           </w:p>
         </w:tc>
@@ -1603,7 +1558,7 @@
                 <w:sz w:val="26"/>
                 <w:szCs w:val="26"/>
               </w:rPr>
-              <w:t>00</w:t>
+              <w:t>05</w:t>
             </w:r>
           </w:p>
         </w:tc>
@@ -1919,7 +1874,7 @@
                 <w:sz w:val="26"/>
                 <w:szCs w:val="26"/>
               </w:rPr>
-              <w:t>8</w:t>
+              <w:t>0</w:t>
             </w:r>
           </w:p>
         </w:tc>
@@ -2033,7 +1988,7 @@
                 <w:sz w:val="26"/>
                 <w:szCs w:val="26"/>
               </w:rPr>
-              <w:t>11</w:t>
+              <w:t>14</w:t>
             </w:r>
             <w:r>
               <w:rPr>
@@ -2080,7 +2035,7 @@
                 <w:sz w:val="26"/>
                 <w:szCs w:val="26"/>
               </w:rPr>
-              <w:t>BLQ (PM</w:t>
+              <w:t>BLQ (N</w:t>
             </w:r>
             <w:r>
               <w:rPr>
@@ -2123,7 +2078,7 @@
                 <w:sz w:val="26"/>
                 <w:szCs w:val="26"/>
               </w:rPr>
-              <w:t>GVHL 169</w:t>
+              <w:t>HELIGO 145</w:t>
             </w:r>
           </w:p>
         </w:tc>
@@ -2158,7 +2113,7 @@
                 <w:sz w:val="26"/>
                 <w:szCs w:val="26"/>
               </w:rPr>
-              <w:t>GVZ</w:t>
+              <w:t>HLY</w:t>
             </w:r>
           </w:p>
         </w:tc>
@@ -2707,7 +2662,7 @@
                 <w:sz w:val="26"/>
                 <w:szCs w:val="26"/>
               </w:rPr>
-              <w:t>00</w:t>
+              <w:t>07</w:t>
             </w:r>
           </w:p>
         </w:tc>
@@ -3206,17 +3161,19 @@
               <w:jc w:val="center"/>
               <w:rPr>
                 <w:rFonts w:ascii="Calibri" w:eastAsia="Calibri" w:hAnsi="Calibri" w:cs="Calibri"/>
-                <w:sz w:val="26"/>
-                <w:szCs w:val="26"/>
-              </w:rPr>
-            </w:pPr>
-            <w:r>
-              <w:rPr>
-                <w:rFonts w:ascii="Calibri" w:eastAsia="Calibri" w:hAnsi="Calibri" w:cs="Calibri"/>
-                <w:sz w:val="26"/>
-                <w:szCs w:val="26"/>
-              </w:rPr>
-              <w:t>PANNA</w:t>
+                <w:b/>
+                <w:sz w:val="26"/>
+                <w:szCs w:val="26"/>
+              </w:rPr>
+            </w:pPr>
+            <w:r>
+              <w:rPr>
+                <w:rFonts w:ascii="Calibri" w:eastAsia="Calibri" w:hAnsi="Calibri" w:cs="Calibri"/>
+                <w:b/>
+                <w:sz w:val="26"/>
+                <w:szCs w:val="26"/>
+              </w:rPr>
+              <w:t>NA</w:t>
             </w:r>
           </w:p>
         </w:tc>
@@ -3241,6 +3198,7 @@
               <w:jc w:val="center"/>
               <w:rPr>
                 <w:rFonts w:ascii="Calibri" w:eastAsia="Calibri" w:hAnsi="Calibri" w:cs="Calibri"/>
+                <w:b/>
                 <w:sz w:val="26"/>
                 <w:szCs w:val="26"/>
               </w:rPr>
@@ -3268,17 +3226,19 @@
               <w:jc w:val="center"/>
               <w:rPr>
                 <w:rFonts w:ascii="Calibri" w:eastAsia="Calibri" w:hAnsi="Calibri" w:cs="Calibri"/>
-                <w:sz w:val="26"/>
-                <w:szCs w:val="26"/>
-              </w:rPr>
-            </w:pPr>
-            <w:r>
-              <w:rPr>
-                <w:rFonts w:ascii="Calibri" w:eastAsia="Calibri" w:hAnsi="Calibri" w:cs="Calibri"/>
-                <w:sz w:val="26"/>
-                <w:szCs w:val="26"/>
-              </w:rPr>
-              <w:t>GVZ</w:t>
+                <w:b/>
+                <w:sz w:val="26"/>
+                <w:szCs w:val="26"/>
+              </w:rPr>
+            </w:pPr>
+            <w:r>
+              <w:rPr>
+                <w:rFonts w:ascii="Calibri" w:eastAsia="Calibri" w:hAnsi="Calibri" w:cs="Calibri"/>
+                <w:b/>
+                <w:sz w:val="26"/>
+                <w:szCs w:val="26"/>
+              </w:rPr>
+              <w:t>NA</w:t>
             </w:r>
           </w:p>
         </w:tc>
@@ -3454,7 +3414,7 @@
                 <w:sz w:val="26"/>
                 <w:szCs w:val="26"/>
               </w:rPr>
-              <w:t>GAURAV</w:t>
+              <w:t>BLQ1</w:t>
             </w:r>
           </w:p>
         </w:tc>
@@ -3483,6 +3443,8 @@
                 <w:szCs w:val="26"/>
               </w:rPr>
             </w:pPr>
+            <w:bookmarkStart w:id="0" w:name="_GoBack"/>
+            <w:bookmarkEnd w:id="0"/>
           </w:p>
         </w:tc>
         <w:tc>
@@ -3682,13 +3644,15 @@
               <w:jc w:val="center"/>
               <w:rPr>
                 <w:rFonts w:ascii="Calibri" w:eastAsia="Calibri" w:hAnsi="Calibri" w:cs="Calibri"/>
-                <w:sz w:val="26"/>
-                <w:szCs w:val="26"/>
-              </w:rPr>
-            </w:pPr>
-            <w:r>
-              <w:rPr>
-                <w:rFonts w:ascii="Calibri" w:eastAsia="Calibri" w:hAnsi="Calibri" w:cs="Calibri"/>
+                <w:b/>
+                <w:sz w:val="26"/>
+                <w:szCs w:val="26"/>
+              </w:rPr>
+            </w:pPr>
+            <w:r>
+              <w:rPr>
+                <w:rFonts w:ascii="Calibri" w:eastAsia="Calibri" w:hAnsi="Calibri" w:cs="Calibri"/>
+                <w:b/>
                 <w:sz w:val="26"/>
                 <w:szCs w:val="26"/>
               </w:rPr>
@@ -3717,6 +3681,7 @@
               <w:jc w:val="center"/>
               <w:rPr>
                 <w:rFonts w:ascii="Calibri" w:eastAsia="Calibri" w:hAnsi="Calibri" w:cs="Calibri"/>
+                <w:b/>
                 <w:sz w:val="26"/>
                 <w:szCs w:val="26"/>
               </w:rPr>
@@ -3744,13 +3709,15 @@
               <w:jc w:val="center"/>
               <w:rPr>
                 <w:rFonts w:ascii="Calibri" w:eastAsia="Calibri" w:hAnsi="Calibri" w:cs="Calibri"/>
-                <w:sz w:val="26"/>
-                <w:szCs w:val="26"/>
-              </w:rPr>
-            </w:pPr>
-            <w:r>
-              <w:rPr>
-                <w:rFonts w:ascii="Calibri" w:eastAsia="Calibri" w:hAnsi="Calibri" w:cs="Calibri"/>
+                <w:b/>
+                <w:sz w:val="26"/>
+                <w:szCs w:val="26"/>
+              </w:rPr>
+            </w:pPr>
+            <w:r>
+              <w:rPr>
+                <w:rFonts w:ascii="Calibri" w:eastAsia="Calibri" w:hAnsi="Calibri" w:cs="Calibri"/>
+                <w:b/>
                 <w:sz w:val="26"/>
                 <w:szCs w:val="26"/>
               </w:rPr>
@@ -3930,7 +3897,7 @@
                 <w:sz w:val="26"/>
                 <w:szCs w:val="26"/>
               </w:rPr>
-              <w:t>DSF</w:t>
+              <w:t>BLQ1</w:t>
             </w:r>
           </w:p>
         </w:tc>
@@ -4133,15 +4100,7 @@
                 <w:sz w:val="26"/>
                 <w:szCs w:val="26"/>
               </w:rPr>
-              <w:t>13:0</w:t>
-            </w:r>
-            <w:r>
-              <w:rPr>
-                <w:rFonts w:ascii="Calibri" w:eastAsia="Calibri" w:hAnsi="Calibri" w:cs="Calibri"/>
-                <w:sz w:val="26"/>
-                <w:szCs w:val="26"/>
-              </w:rPr>
-              <w:t>0</w:t>
+              <w:t>13:00</w:t>
             </w:r>
           </w:p>
         </w:tc>
@@ -4176,7 +4135,7 @@
                 <w:sz w:val="26"/>
                 <w:szCs w:val="26"/>
               </w:rPr>
-              <w:t>PANNA</w:t>
+              <w:t>BLQ1</w:t>
             </w:r>
           </w:p>
         </w:tc>
@@ -4455,19 +4414,17 @@
               <w:jc w:val="center"/>
               <w:rPr>
                 <w:rFonts w:ascii="Calibri" w:eastAsia="Calibri" w:hAnsi="Calibri" w:cs="Calibri"/>
-                <w:b/>
-                <w:sz w:val="26"/>
-                <w:szCs w:val="26"/>
-              </w:rPr>
-            </w:pPr>
-            <w:r>
-              <w:rPr>
-                <w:rFonts w:ascii="Calibri" w:eastAsia="Calibri" w:hAnsi="Calibri" w:cs="Calibri"/>
-                <w:b/>
-                <w:sz w:val="26"/>
-                <w:szCs w:val="26"/>
-              </w:rPr>
-              <w:t>NA</w:t>
+                <w:sz w:val="26"/>
+                <w:szCs w:val="26"/>
+              </w:rPr>
+            </w:pPr>
+            <w:r>
+              <w:rPr>
+                <w:rFonts w:ascii="Calibri" w:eastAsia="Calibri" w:hAnsi="Calibri" w:cs="Calibri"/>
+                <w:sz w:val="26"/>
+                <w:szCs w:val="26"/>
+              </w:rPr>
+              <w:t>SHAKTI</w:t>
             </w:r>
           </w:p>
         </w:tc>
@@ -4492,7 +4449,6 @@
               <w:jc w:val="center"/>
               <w:rPr>
                 <w:rFonts w:ascii="Calibri" w:eastAsia="Calibri" w:hAnsi="Calibri" w:cs="Calibri"/>
-                <w:b/>
                 <w:sz w:val="26"/>
                 <w:szCs w:val="26"/>
               </w:rPr>
@@ -4520,19 +4476,17 @@
               <w:jc w:val="center"/>
               <w:rPr>
                 <w:rFonts w:ascii="Calibri" w:eastAsia="Calibri" w:hAnsi="Calibri" w:cs="Calibri"/>
-                <w:b/>
-                <w:sz w:val="26"/>
-                <w:szCs w:val="26"/>
-              </w:rPr>
-            </w:pPr>
-            <w:r>
-              <w:rPr>
-                <w:rFonts w:ascii="Calibri" w:eastAsia="Calibri" w:hAnsi="Calibri" w:cs="Calibri"/>
-                <w:b/>
-                <w:sz w:val="26"/>
-                <w:szCs w:val="26"/>
-              </w:rPr>
-              <w:t>NA</w:t>
+                <w:sz w:val="26"/>
+                <w:szCs w:val="26"/>
+              </w:rPr>
+            </w:pPr>
+            <w:r>
+              <w:rPr>
+                <w:rFonts w:ascii="Calibri" w:eastAsia="Calibri" w:hAnsi="Calibri" w:cs="Calibri"/>
+                <w:sz w:val="26"/>
+                <w:szCs w:val="26"/>
+              </w:rPr>
+              <w:t>HLY</w:t>
             </w:r>
           </w:p>
         </w:tc>
@@ -4704,7 +4658,7 @@
                 <w:sz w:val="26"/>
                 <w:szCs w:val="26"/>
               </w:rPr>
-              <w:t>ARMADA1</w:t>
+              <w:t>RATNA</w:t>
             </w:r>
           </w:p>
         </w:tc>
@@ -5140,15 +5094,7 @@
                 <w:sz w:val="26"/>
                 <w:szCs w:val="26"/>
               </w:rPr>
-              <w:t>11:0</w:t>
-            </w:r>
-            <w:r>
-              <w:rPr>
-                <w:rFonts w:ascii="Calibri" w:eastAsia="Calibri" w:hAnsi="Calibri" w:cs="Calibri"/>
-                <w:sz w:val="26"/>
-                <w:szCs w:val="26"/>
-              </w:rPr>
-              <w:t>5</w:t>
+              <w:t>11:05</w:t>
             </w:r>
           </w:p>
         </w:tc>
@@ -5183,7 +5129,7 @@
                 <w:sz w:val="26"/>
                 <w:szCs w:val="26"/>
               </w:rPr>
-              <w:t>ABAN4</w:t>
+              <w:t>UDAY</w:t>
             </w:r>
           </w:p>
         </w:tc>
@@ -5415,19 +5361,17 @@
               <w:jc w:val="center"/>
               <w:rPr>
                 <w:rFonts w:ascii="Calibri" w:eastAsia="Calibri" w:hAnsi="Calibri" w:cs="Calibri"/>
-                <w:b/>
-                <w:sz w:val="26"/>
-                <w:szCs w:val="26"/>
-              </w:rPr>
-            </w:pPr>
-            <w:r>
-              <w:rPr>
-                <w:rFonts w:ascii="Calibri" w:eastAsia="Calibri" w:hAnsi="Calibri" w:cs="Calibri"/>
-                <w:b/>
-                <w:sz w:val="26"/>
-                <w:szCs w:val="26"/>
-              </w:rPr>
-              <w:t>NA</w:t>
+                <w:sz w:val="26"/>
+                <w:szCs w:val="26"/>
+              </w:rPr>
+            </w:pPr>
+            <w:r>
+              <w:rPr>
+                <w:rFonts w:ascii="Calibri" w:eastAsia="Calibri" w:hAnsi="Calibri" w:cs="Calibri"/>
+                <w:sz w:val="26"/>
+                <w:szCs w:val="26"/>
+              </w:rPr>
+              <w:t>SHAKTI</w:t>
             </w:r>
           </w:p>
         </w:tc>
@@ -5452,7 +5396,6 @@
               <w:jc w:val="center"/>
               <w:rPr>
                 <w:rFonts w:ascii="Calibri" w:eastAsia="Calibri" w:hAnsi="Calibri" w:cs="Calibri"/>
-                <w:b/>
                 <w:sz w:val="26"/>
                 <w:szCs w:val="26"/>
               </w:rPr>
@@ -5480,19 +5423,17 @@
               <w:jc w:val="center"/>
               <w:rPr>
                 <w:rFonts w:ascii="Calibri" w:eastAsia="Calibri" w:hAnsi="Calibri" w:cs="Calibri"/>
-                <w:b/>
-                <w:sz w:val="26"/>
-                <w:szCs w:val="26"/>
-              </w:rPr>
-            </w:pPr>
-            <w:r>
-              <w:rPr>
-                <w:rFonts w:ascii="Calibri" w:eastAsia="Calibri" w:hAnsi="Calibri" w:cs="Calibri"/>
-                <w:b/>
-                <w:sz w:val="26"/>
-                <w:szCs w:val="26"/>
-              </w:rPr>
-              <w:t>NA</w:t>
+                <w:sz w:val="26"/>
+                <w:szCs w:val="26"/>
+              </w:rPr>
+            </w:pPr>
+            <w:r>
+              <w:rPr>
+                <w:rFonts w:ascii="Calibri" w:eastAsia="Calibri" w:hAnsi="Calibri" w:cs="Calibri"/>
+                <w:sz w:val="26"/>
+                <w:szCs w:val="26"/>
+              </w:rPr>
+              <w:t>HLV</w:t>
             </w:r>
           </w:p>
         </w:tc>
@@ -5720,7 +5661,7 @@
                 <w:sz w:val="26"/>
                 <w:szCs w:val="26"/>
               </w:rPr>
-              <w:t>VKDN1</w:t>
+              <w:t>J T ANGLE</w:t>
             </w:r>
           </w:p>
         </w:tc>
@@ -5955,7 +5896,7 @@
                 <w:sz w:val="26"/>
                 <w:szCs w:val="26"/>
               </w:rPr>
-              <w:t>ABAN8</w:t>
+              <w:t>SLQ</w:t>
             </w:r>
           </w:p>
         </w:tc>
@@ -6190,7 +6131,7 @@
                 <w:sz w:val="26"/>
                 <w:szCs w:val="26"/>
               </w:rPr>
-              <w:t>VKDN2</w:t>
+              <w:t>MNW/WIN</w:t>
             </w:r>
           </w:p>
         </w:tc>
@@ -6425,7 +6366,7 @@
                 <w:sz w:val="26"/>
                 <w:szCs w:val="26"/>
               </w:rPr>
-              <w:t>JTA</w:t>
+              <w:t>TRI-2</w:t>
             </w:r>
           </w:p>
         </w:tc>
@@ -6660,15 +6601,7 @@
                 <w:sz w:val="26"/>
                 <w:szCs w:val="26"/>
               </w:rPr>
-              <w:t>ADM10</w:t>
-            </w:r>
-            <w:r>
-              <w:rPr>
-                <w:rFonts w:ascii="Calibri" w:eastAsia="Calibri" w:hAnsi="Calibri" w:cs="Calibri"/>
-                <w:sz w:val="26"/>
-                <w:szCs w:val="26"/>
-              </w:rPr>
-              <w:t xml:space="preserve"> </w:t>
+              <w:t>NQO</w:t>
             </w:r>
           </w:p>
         </w:tc>
@@ -6903,7 +6836,15 @@
                 <w:sz w:val="26"/>
                 <w:szCs w:val="26"/>
               </w:rPr>
-              <w:t>CHITRA</w:t>
+              <w:t>ARMADA2</w:t>
+            </w:r>
+            <w:r>
+              <w:rPr>
+                <w:rFonts w:ascii="Calibri" w:eastAsia="Calibri" w:hAnsi="Calibri" w:cs="Calibri"/>
+                <w:sz w:val="26"/>
+                <w:szCs w:val="26"/>
+              </w:rPr>
+              <w:t xml:space="preserve"> </w:t>
             </w:r>
           </w:p>
         </w:tc>
@@ -6994,8 +6935,6 @@
                 <w:szCs w:val="26"/>
               </w:rPr>
             </w:pPr>
-            <w:bookmarkStart w:id="0" w:name="_GoBack"/>
-            <w:bookmarkEnd w:id="0"/>
           </w:p>
         </w:tc>
       </w:tr>
@@ -7033,7 +6972,7 @@
                 <w:b/>
                 <w:sz w:val="24"/>
               </w:rPr>
-              <w:t>WAITING:</w:t>
+              <w:t>WAITING:VIR-1</w:t>
             </w:r>
           </w:p>
         </w:tc>
@@ -7138,10 +7077,10 @@
       </w:pPr>
       <w:r>
         <w:object w:dxaOrig="1188" w:dyaOrig="900">
-          <v:rect id="_x0000_i1026" style="width:57.95pt;height:43.85pt" o:ole="" o:preferrelative="t" stroked="f">
+          <v:rect id="_x0000_i1026" style="width:58.3pt;height:43.7pt" o:ole="" o:preferrelative="t" stroked="f">
             <v:imagedata r:id="rId4" o:title=""/>
           </v:rect>
-          <o:OLEObject Type="Embed" ProgID="StaticMetafile" ShapeID="_x0000_i1026" DrawAspect="Content" ObjectID="_1849521955" r:id="rId6"/>
+          <o:OLEObject Type="Embed" ProgID="StaticMetafile" ShapeID="_x0000_i1026" DrawAspect="Content" ObjectID="_1849609972" r:id="rId6"/>
         </w:object>
       </w:r>
       <w:r>
@@ -7700,7 +7639,7 @@
                 <w:sz w:val="26"/>
                 <w:szCs w:val="26"/>
               </w:rPr>
-              <w:t>TAPTI [D]</w:t>
+              <w:t xml:space="preserve"> J STAR</w:t>
             </w:r>
           </w:p>
         </w:tc>
@@ -7924,6 +7863,14 @@
                 <w:szCs w:val="26"/>
               </w:rPr>
             </w:pPr>
+            <w:r>
+              <w:rPr>
+                <w:rFonts w:ascii="Calibri" w:eastAsia="Calibri" w:hAnsi="Calibri" w:cs="Calibri"/>
+                <w:sz w:val="26"/>
+                <w:szCs w:val="26"/>
+              </w:rPr>
+              <w:t>TAPTI</w:t>
+            </w:r>
           </w:p>
         </w:tc>
         <w:tc>
@@ -8147,6 +8094,14 @@
                 <w:szCs w:val="26"/>
               </w:rPr>
             </w:pPr>
+            <w:r>
+              <w:rPr>
+                <w:rFonts w:ascii="Calibri" w:eastAsia="Calibri" w:hAnsi="Calibri" w:cs="Calibri"/>
+                <w:sz w:val="26"/>
+                <w:szCs w:val="26"/>
+              </w:rPr>
+              <w:t>L/O</w:t>
+            </w:r>
           </w:p>
         </w:tc>
         <w:tc>

</xml_diff>

<commit_message>
Sync - 2026-08-31 17:19
</commit_message>
<xml_diff>
--- a/files/Daily_Helicopter_Schedule.docx
+++ b/files/Daily_Helicopter_Schedule.docx
@@ -2,114 +2,6 @@
 <file path=word/document.xml><?xml version="1.0" encoding="utf-8"?>
 <w:document xmlns:wpc="http://schemas.microsoft.com/office/word/2010/wordprocessingCanvas" xmlns:mc="http://schemas.openxmlformats.org/markup-compatibility/2006" xmlns:o="urn:schemas-microsoft-com:office:office" xmlns:r="http://schemas.openxmlformats.org/officeDocument/2006/relationships" xmlns:m="http://schemas.openxmlformats.org/officeDocument/2006/math" xmlns:v="urn:schemas-microsoft-com:vml" xmlns:wp14="http://schemas.microsoft.com/office/word/2010/wordprocessingDrawing" xmlns:wp="http://schemas.openxmlformats.org/drawingml/2006/wordprocessingDrawing" xmlns:w10="urn:schemas-microsoft-com:office:word" xmlns:w="http://schemas.openxmlformats.org/wordprocessingml/2006/main" xmlns:w14="http://schemas.microsoft.com/office/word/2010/wordml" xmlns:w15="http://schemas.microsoft.com/office/word/2012/wordml" xmlns:wpg="http://schemas.microsoft.com/office/word/2010/wordprocessingGroup" xmlns:wpi="http://schemas.microsoft.com/office/word/2010/wordprocessingInk" xmlns:wne="http://schemas.microsoft.com/office/word/2006/wordml" xmlns:wps="http://schemas.microsoft.com/office/word/2010/wordprocessingShape" mc:Ignorable="w14 w15 wp14">
   <w:body>
-    <w:p>
-      <w:pPr>
-        <w:pStyle w:val="Heading2"/>
-        <w:spacing w:before="0"/>
-        <w:ind w:left="-709" w:right="-1039"/>
-        <w:rPr>
-          <w:rFonts w:ascii="Times New Roman" w:hAnsi="Times New Roman" w:cs="Times New Roman"/>
-          <w:b/>
-          <w:color w:val="000000" w:themeColor="text1"/>
-        </w:rPr>
-      </w:pPr>
-      <w:r>
-        <w:object w:dxaOrig="1188" w:dyaOrig="900">
-          <v:rect id="_x0000_i1025" style="width:58.3pt;height:43.7pt" o:ole="" o:preferrelative="t" stroked="f">
-            <v:imagedata r:id="rId4" o:title=""/>
-          </v:rect>
-          <o:OLEObject Type="Embed" ProgID="StaticMetafile" ShapeID="_x0000_i1025" DrawAspect="Content" ObjectID="_1849609971" r:id="rId5"/>
-        </w:object>
-      </w:r>
-      <w:r>
-        <w:rPr>
-          <w:rFonts w:ascii="Times New Roman" w:hAnsi="Times New Roman" w:cs="Times New Roman"/>
-          <w:b/>
-          <w:color w:val="000000" w:themeColor="text1"/>
-        </w:rPr>
-        <w:t xml:space="preserve"> </w:t>
-      </w:r>
-      <w:r>
-        <w:rPr>
-          <w:rFonts w:ascii="Times New Roman" w:hAnsi="Times New Roman" w:cs="Times New Roman"/>
-          <w:b/>
-          <w:color w:val="000000" w:themeColor="text1"/>
-        </w:rPr>
-        <w:t>TENTATIVE</w:t>
-      </w:r>
-      <w:r>
-        <w:rPr>
-          <w:rFonts w:ascii="Times New Roman" w:hAnsi="Times New Roman" w:cs="Times New Roman"/>
-          <w:b/>
-          <w:color w:val="000000" w:themeColor="text1"/>
-        </w:rPr>
-        <w:t xml:space="preserve"> HELICOPTER FLYING SCHEDULE FOR </w:t>
-      </w:r>
-      <w:r>
-        <w:rPr>
-          <w:rFonts w:ascii="Times New Roman" w:hAnsi="Times New Roman" w:cs="Times New Roman"/>
-          <w:b/>
-          <w:color w:val="000000" w:themeColor="text1"/>
-        </w:rPr>
-        <w:t>31</w:t>
-      </w:r>
-      <w:r>
-        <w:rPr>
-          <w:rFonts w:ascii="Times New Roman" w:hAnsi="Times New Roman" w:cs="Times New Roman"/>
-          <w:b/>
-          <w:color w:val="000000" w:themeColor="text1"/>
-        </w:rPr>
-        <w:t>.08.2026</w:t>
-      </w:r>
-      <w:r>
-        <w:rPr>
-          <w:rFonts w:ascii="Times New Roman" w:hAnsi="Times New Roman" w:cs="Times New Roman"/>
-          <w:b/>
-          <w:color w:val="000000" w:themeColor="text1"/>
-        </w:rPr>
-        <w:t xml:space="preserve"> </w:t>
-      </w:r>
-      <w:r>
-        <w:rPr>
-          <w:rFonts w:ascii="Times New Roman" w:hAnsi="Times New Roman" w:cs="Times New Roman"/>
-          <w:b/>
-          <w:color w:val="000000" w:themeColor="text1"/>
-        </w:rPr>
-        <w:t>(</w:t>
-      </w:r>
-      <w:r>
-        <w:rPr>
-          <w:rFonts w:ascii="Times New Roman" w:hAnsi="Times New Roman" w:cs="Times New Roman"/>
-          <w:b/>
-          <w:color w:val="000000" w:themeColor="text1"/>
-        </w:rPr>
-        <w:t>MO</w:t>
-      </w:r>
-      <w:r>
-        <w:rPr>
-          <w:rFonts w:ascii="Times New Roman" w:hAnsi="Times New Roman" w:cs="Times New Roman"/>
-          <w:b/>
-          <w:color w:val="000000" w:themeColor="text1"/>
-        </w:rPr>
-        <w:t>N</w:t>
-      </w:r>
-      <w:r>
-        <w:rPr>
-          <w:rFonts w:ascii="Times New Roman" w:hAnsi="Times New Roman" w:cs="Times New Roman"/>
-          <w:b/>
-          <w:color w:val="000000" w:themeColor="text1"/>
-        </w:rPr>
-        <w:t>DAY</w:t>
-      </w:r>
-      <w:r>
-        <w:rPr>
-          <w:rFonts w:ascii="Times New Roman" w:hAnsi="Times New Roman" w:cs="Times New Roman"/>
-          <w:b/>
-          <w:color w:val="000000" w:themeColor="text1"/>
-        </w:rPr>
-        <w:t>)</w:t>
-      </w:r>
-    </w:p>
     <w:p>
       <w:pPr>
         <w:spacing w:after="0" w:line="240" w:lineRule="auto"/>
@@ -1452,7 +1344,7 @@
                 <w:sz w:val="26"/>
                 <w:szCs w:val="26"/>
               </w:rPr>
-              <w:t>NF[D]</w:t>
+              <w:t>NF (D)</w:t>
             </w:r>
           </w:p>
         </w:tc>
@@ -3414,7 +3306,7 @@
                 <w:sz w:val="26"/>
                 <w:szCs w:val="26"/>
               </w:rPr>
-              <w:t>BLQ1</w:t>
+              <w:t>PANNA</w:t>
             </w:r>
           </w:p>
         </w:tc>
@@ -3443,8 +3335,6 @@
                 <w:szCs w:val="26"/>
               </w:rPr>
             </w:pPr>
-            <w:bookmarkStart w:id="0" w:name="_GoBack"/>
-            <w:bookmarkEnd w:id="0"/>
           </w:p>
         </w:tc>
         <w:tc>
@@ -3472,14 +3362,6 @@
                 <w:szCs w:val="26"/>
               </w:rPr>
             </w:pPr>
-            <w:r>
-              <w:rPr>
-                <w:rFonts w:ascii="Calibri" w:eastAsia="Calibri" w:hAnsi="Calibri" w:cs="Calibri"/>
-                <w:sz w:val="26"/>
-                <w:szCs w:val="26"/>
-              </w:rPr>
-              <w:t>RRI</w:t>
-            </w:r>
           </w:p>
         </w:tc>
         <w:tc>
@@ -3953,14 +3835,8 @@
                 <w:szCs w:val="26"/>
               </w:rPr>
             </w:pPr>
-            <w:r>
-              <w:rPr>
-                <w:rFonts w:ascii="Calibri" w:eastAsia="Calibri" w:hAnsi="Calibri" w:cs="Calibri"/>
-                <w:sz w:val="26"/>
-                <w:szCs w:val="26"/>
-              </w:rPr>
-              <w:t>RRI</w:t>
-            </w:r>
+            <w:bookmarkStart w:id="0" w:name="_GoBack"/>
+            <w:bookmarkEnd w:id="0"/>
           </w:p>
         </w:tc>
         <w:tc>
@@ -4191,14 +4067,6 @@
                 <w:szCs w:val="26"/>
               </w:rPr>
             </w:pPr>
-            <w:r>
-              <w:rPr>
-                <w:rFonts w:ascii="Calibri" w:eastAsia="Calibri" w:hAnsi="Calibri" w:cs="Calibri"/>
-                <w:sz w:val="26"/>
-                <w:szCs w:val="26"/>
-              </w:rPr>
-              <w:t>RRI</w:t>
-            </w:r>
           </w:p>
         </w:tc>
         <w:tc>
@@ -4424,7 +4292,7 @@
                 <w:sz w:val="26"/>
                 <w:szCs w:val="26"/>
               </w:rPr>
-              <w:t>SHAKTI</w:t>
+              <w:t>NA</w:t>
             </w:r>
           </w:p>
         </w:tc>
@@ -4480,14 +4348,6 @@
                 <w:szCs w:val="26"/>
               </w:rPr>
             </w:pPr>
-            <w:r>
-              <w:rPr>
-                <w:rFonts w:ascii="Calibri" w:eastAsia="Calibri" w:hAnsi="Calibri" w:cs="Calibri"/>
-                <w:sz w:val="26"/>
-                <w:szCs w:val="26"/>
-              </w:rPr>
-              <w:t>HLY</w:t>
-            </w:r>
           </w:p>
         </w:tc>
         <w:tc>
@@ -4658,7 +4518,7 @@
                 <w:sz w:val="26"/>
                 <w:szCs w:val="26"/>
               </w:rPr>
-              <w:t>RATNA</w:t>
+              <w:t>R12A+R10A</w:t>
             </w:r>
           </w:p>
         </w:tc>
@@ -4714,14 +4574,6 @@
                 <w:szCs w:val="26"/>
               </w:rPr>
             </w:pPr>
-            <w:r>
-              <w:rPr>
-                <w:rFonts w:ascii="Calibri" w:eastAsia="Calibri" w:hAnsi="Calibri" w:cs="Calibri"/>
-                <w:sz w:val="26"/>
-                <w:szCs w:val="26"/>
-              </w:rPr>
-              <w:t>HLV</w:t>
-            </w:r>
           </w:p>
         </w:tc>
         <w:tc>
@@ -4950,15 +4802,6 @@
                 <w:szCs w:val="26"/>
               </w:rPr>
             </w:pPr>
-            <w:r>
-              <w:rPr>
-                <w:rFonts w:ascii="Calibri" w:eastAsia="Calibri" w:hAnsi="Calibri" w:cs="Calibri"/>
-                <w:b/>
-                <w:sz w:val="26"/>
-                <w:szCs w:val="26"/>
-              </w:rPr>
-              <w:t>NA</w:t>
-            </w:r>
           </w:p>
         </w:tc>
         <w:tc>
@@ -5129,7 +4972,7 @@
                 <w:sz w:val="26"/>
                 <w:szCs w:val="26"/>
               </w:rPr>
-              <w:t>UDAY</w:t>
+              <w:t>HRA</w:t>
             </w:r>
           </w:p>
         </w:tc>
@@ -5185,14 +5028,6 @@
                 <w:szCs w:val="26"/>
               </w:rPr>
             </w:pPr>
-            <w:r>
-              <w:rPr>
-                <w:rFonts w:ascii="Calibri" w:eastAsia="Calibri" w:hAnsi="Calibri" w:cs="Calibri"/>
-                <w:sz w:val="26"/>
-                <w:szCs w:val="26"/>
-              </w:rPr>
-              <w:t>HLV</w:t>
-            </w:r>
           </w:p>
         </w:tc>
         <w:tc>
@@ -5371,7 +5206,7 @@
                 <w:sz w:val="26"/>
                 <w:szCs w:val="26"/>
               </w:rPr>
-              <w:t>SHAKTI</w:t>
+              <w:t>NLM</w:t>
             </w:r>
           </w:p>
         </w:tc>
@@ -5427,14 +5262,6 @@
                 <w:szCs w:val="26"/>
               </w:rPr>
             </w:pPr>
-            <w:r>
-              <w:rPr>
-                <w:rFonts w:ascii="Calibri" w:eastAsia="Calibri" w:hAnsi="Calibri" w:cs="Calibri"/>
-                <w:sz w:val="26"/>
-                <w:szCs w:val="26"/>
-              </w:rPr>
-              <w:t>HLV</w:t>
-            </w:r>
           </w:p>
         </w:tc>
         <w:tc>
@@ -5661,7 +5488,7 @@
                 <w:sz w:val="26"/>
                 <w:szCs w:val="26"/>
               </w:rPr>
-              <w:t>J T ANGLE</w:t>
+              <w:t>ICP</w:t>
             </w:r>
           </w:p>
         </w:tc>
@@ -5717,14 +5544,6 @@
                 <w:szCs w:val="26"/>
               </w:rPr>
             </w:pPr>
-            <w:r>
-              <w:rPr>
-                <w:rFonts w:ascii="Calibri" w:eastAsia="Calibri" w:hAnsi="Calibri" w:cs="Calibri"/>
-                <w:sz w:val="26"/>
-                <w:szCs w:val="26"/>
-              </w:rPr>
-              <w:t>HLU</w:t>
-            </w:r>
           </w:p>
         </w:tc>
         <w:tc>
@@ -5896,7 +5715,7 @@
                 <w:sz w:val="26"/>
                 <w:szCs w:val="26"/>
               </w:rPr>
-              <w:t>SLQ</w:t>
+              <w:t>SHP</w:t>
             </w:r>
           </w:p>
         </w:tc>
@@ -5952,14 +5771,6 @@
                 <w:szCs w:val="26"/>
               </w:rPr>
             </w:pPr>
-            <w:r>
-              <w:rPr>
-                <w:rFonts w:ascii="Calibri" w:eastAsia="Calibri" w:hAnsi="Calibri" w:cs="Calibri"/>
-                <w:sz w:val="26"/>
-                <w:szCs w:val="26"/>
-              </w:rPr>
-              <w:t>HLH</w:t>
-            </w:r>
           </w:p>
         </w:tc>
         <w:tc>
@@ -6131,7 +5942,7 @@
                 <w:sz w:val="26"/>
                 <w:szCs w:val="26"/>
               </w:rPr>
-              <w:t>MNW/WIN</w:t>
+              <w:t>SLQ</w:t>
             </w:r>
           </w:p>
         </w:tc>
@@ -6187,14 +5998,6 @@
                 <w:szCs w:val="26"/>
               </w:rPr>
             </w:pPr>
-            <w:r>
-              <w:rPr>
-                <w:rFonts w:ascii="Calibri" w:eastAsia="Calibri" w:hAnsi="Calibri" w:cs="Calibri"/>
-                <w:sz w:val="26"/>
-                <w:szCs w:val="26"/>
-              </w:rPr>
-              <w:t>HNB</w:t>
-            </w:r>
           </w:p>
         </w:tc>
         <w:tc>
@@ -6366,7 +6169,7 @@
                 <w:sz w:val="26"/>
                 <w:szCs w:val="26"/>
               </w:rPr>
-              <w:t>TRI-2</w:t>
+              <w:t>SGAV</w:t>
             </w:r>
           </w:p>
         </w:tc>
@@ -6422,14 +6225,6 @@
                 <w:szCs w:val="26"/>
               </w:rPr>
             </w:pPr>
-            <w:r>
-              <w:rPr>
-                <w:rFonts w:ascii="Calibri" w:eastAsia="Calibri" w:hAnsi="Calibri" w:cs="Calibri"/>
-                <w:sz w:val="26"/>
-                <w:szCs w:val="26"/>
-              </w:rPr>
-              <w:t>HLU</w:t>
-            </w:r>
           </w:p>
         </w:tc>
         <w:tc>
@@ -6657,14 +6452,6 @@
                 <w:szCs w:val="26"/>
               </w:rPr>
             </w:pPr>
-            <w:r>
-              <w:rPr>
-                <w:rFonts w:ascii="Calibri" w:eastAsia="Calibri" w:hAnsi="Calibri" w:cs="Calibri"/>
-                <w:sz w:val="26"/>
-                <w:szCs w:val="26"/>
-              </w:rPr>
-              <w:t>HLH</w:t>
-            </w:r>
           </w:p>
         </w:tc>
         <w:tc>
@@ -6836,15 +6623,7 @@
                 <w:sz w:val="26"/>
                 <w:szCs w:val="26"/>
               </w:rPr>
-              <w:t>ARMADA2</w:t>
-            </w:r>
-            <w:r>
-              <w:rPr>
-                <w:rFonts w:ascii="Calibri" w:eastAsia="Calibri" w:hAnsi="Calibri" w:cs="Calibri"/>
-                <w:sz w:val="26"/>
-                <w:szCs w:val="26"/>
-              </w:rPr>
-              <w:t xml:space="preserve"> </w:t>
+              <w:t>SJOT</w:t>
             </w:r>
           </w:p>
         </w:tc>
@@ -6900,14 +6679,6 @@
                 <w:szCs w:val="26"/>
               </w:rPr>
             </w:pPr>
-            <w:r>
-              <w:rPr>
-                <w:rFonts w:ascii="Calibri" w:eastAsia="Calibri" w:hAnsi="Calibri" w:cs="Calibri"/>
-                <w:sz w:val="26"/>
-                <w:szCs w:val="26"/>
-              </w:rPr>
-              <w:t>HNB</w:t>
-            </w:r>
           </w:p>
         </w:tc>
         <w:tc>
@@ -7076,14 +6847,6 @@
         </w:rPr>
       </w:pPr>
       <w:r>
-        <w:object w:dxaOrig="1188" w:dyaOrig="900">
-          <v:rect id="_x0000_i1026" style="width:58.3pt;height:43.7pt" o:ole="" o:preferrelative="t" stroked="f">
-            <v:imagedata r:id="rId4" o:title=""/>
-          </v:rect>
-          <o:OLEObject Type="Embed" ProgID="StaticMetafile" ShapeID="_x0000_i1026" DrawAspect="Content" ObjectID="_1849609972" r:id="rId6"/>
-        </w:object>
-      </w:r>
-      <w:r>
         <w:tab/>
       </w:r>
       <w:r>
@@ -7130,13 +6893,13 @@
         <w:tblLook w:val="04A0" w:firstRow="1" w:lastRow="0" w:firstColumn="1" w:lastColumn="0" w:noHBand="0" w:noVBand="1"/>
       </w:tblPr>
       <w:tblGrid>
-        <w:gridCol w:w="663"/>
-        <w:gridCol w:w="1574"/>
-        <w:gridCol w:w="1417"/>
-        <w:gridCol w:w="1807"/>
-        <w:gridCol w:w="1496"/>
-        <w:gridCol w:w="783"/>
-        <w:gridCol w:w="1276"/>
+        <w:gridCol w:w="671"/>
+        <w:gridCol w:w="1604"/>
+        <w:gridCol w:w="1444"/>
+        <w:gridCol w:w="1842"/>
+        <w:gridCol w:w="1524"/>
+        <w:gridCol w:w="795"/>
+        <w:gridCol w:w="1300"/>
       </w:tblGrid>
       <w:tr>
         <w:tc>
@@ -7633,14 +7396,6 @@
                 <w:szCs w:val="26"/>
               </w:rPr>
             </w:pPr>
-            <w:r>
-              <w:rPr>
-                <w:rFonts w:ascii="Calibri" w:eastAsia="Calibri" w:hAnsi="Calibri" w:cs="Calibri"/>
-                <w:sz w:val="26"/>
-                <w:szCs w:val="26"/>
-              </w:rPr>
-              <w:t xml:space="preserve"> J STAR</w:t>
-            </w:r>
           </w:p>
         </w:tc>
         <w:tc>
@@ -7863,14 +7618,6 @@
                 <w:szCs w:val="26"/>
               </w:rPr>
             </w:pPr>
-            <w:r>
-              <w:rPr>
-                <w:rFonts w:ascii="Calibri" w:eastAsia="Calibri" w:hAnsi="Calibri" w:cs="Calibri"/>
-                <w:sz w:val="26"/>
-                <w:szCs w:val="26"/>
-              </w:rPr>
-              <w:t>TAPTI</w:t>
-            </w:r>
           </w:p>
         </w:tc>
         <w:tc>
@@ -8094,14 +7841,6 @@
                 <w:szCs w:val="26"/>
               </w:rPr>
             </w:pPr>
-            <w:r>
-              <w:rPr>
-                <w:rFonts w:ascii="Calibri" w:eastAsia="Calibri" w:hAnsi="Calibri" w:cs="Calibri"/>
-                <w:sz w:val="26"/>
-                <w:szCs w:val="26"/>
-              </w:rPr>
-              <w:t>L/O</w:t>
-            </w:r>
           </w:p>
         </w:tc>
         <w:tc>
@@ -8541,13 +8280,102 @@
       </w:pPr>
     </w:p>
     <w:sectPr>
+      <w:headerReference w:type="default" r:id="rId6"/>
       <w:pgSz w:w="11906" w:h="16838"/>
-      <w:pgMar w:top="568" w:right="1440" w:bottom="1440" w:left="1440" w:header="708" w:footer="708" w:gutter="0"/>
+      <w:pgMar w:top="568" w:right="1440" w:bottom="1134" w:left="1276" w:header="708" w:footer="708" w:gutter="0"/>
       <w:cols w:space="708"/>
       <w:docGrid w:linePitch="360"/>
     </w:sectPr>
   </w:body>
 </w:document>
+</file>
+
+<file path=word/endnotes.xml><?xml version="1.0" encoding="utf-8"?>
+<w:endnotes xmlns:wpc="http://schemas.microsoft.com/office/word/2010/wordprocessingCanvas" xmlns:mc="http://schemas.openxmlformats.org/markup-compatibility/2006" xmlns:o="urn:schemas-microsoft-com:office:office" xmlns:r="http://schemas.openxmlformats.org/officeDocument/2006/relationships" xmlns:m="http://schemas.openxmlformats.org/officeDocument/2006/math" xmlns:v="urn:schemas-microsoft-com:vml" xmlns:wp14="http://schemas.microsoft.com/office/word/2010/wordprocessingDrawing" xmlns:wp="http://schemas.openxmlformats.org/drawingml/2006/wordprocessingDrawing" xmlns:w10="urn:schemas-microsoft-com:office:word" xmlns:w="http://schemas.openxmlformats.org/wordprocessingml/2006/main" xmlns:w14="http://schemas.microsoft.com/office/word/2010/wordml" xmlns:w15="http://schemas.microsoft.com/office/word/2012/wordml" xmlns:wpg="http://schemas.microsoft.com/office/word/2010/wordprocessingGroup" xmlns:wpi="http://schemas.microsoft.com/office/word/2010/wordprocessingInk" xmlns:wne="http://schemas.microsoft.com/office/word/2006/wordml" xmlns:wps="http://schemas.microsoft.com/office/word/2010/wordprocessingShape" mc:Ignorable="w14 w15 wp14">
+  <w:endnote w:type="separator" w:id="-1">
+    <w:p>
+      <w:pPr>
+        <w:spacing w:after="0" w:line="240" w:lineRule="auto"/>
+      </w:pPr>
+      <w:r>
+        <w:separator/>
+      </w:r>
+    </w:p>
+  </w:endnote>
+  <w:endnote w:type="continuationSeparator" w:id="0">
+    <w:p>
+      <w:pPr>
+        <w:spacing w:after="0" w:line="240" w:lineRule="auto"/>
+      </w:pPr>
+      <w:r>
+        <w:continuationSeparator/>
+      </w:r>
+    </w:p>
+  </w:endnote>
+</w:endnotes>
+</file>
+
+<file path=word/footnotes.xml><?xml version="1.0" encoding="utf-8"?>
+<w:footnotes xmlns:wpc="http://schemas.microsoft.com/office/word/2010/wordprocessingCanvas" xmlns:mc="http://schemas.openxmlformats.org/markup-compatibility/2006" xmlns:o="urn:schemas-microsoft-com:office:office" xmlns:r="http://schemas.openxmlformats.org/officeDocument/2006/relationships" xmlns:m="http://schemas.openxmlformats.org/officeDocument/2006/math" xmlns:v="urn:schemas-microsoft-com:vml" xmlns:wp14="http://schemas.microsoft.com/office/word/2010/wordprocessingDrawing" xmlns:wp="http://schemas.openxmlformats.org/drawingml/2006/wordprocessingDrawing" xmlns:w10="urn:schemas-microsoft-com:office:word" xmlns:w="http://schemas.openxmlformats.org/wordprocessingml/2006/main" xmlns:w14="http://schemas.microsoft.com/office/word/2010/wordml" xmlns:w15="http://schemas.microsoft.com/office/word/2012/wordml" xmlns:wpg="http://schemas.microsoft.com/office/word/2010/wordprocessingGroup" xmlns:wpi="http://schemas.microsoft.com/office/word/2010/wordprocessingInk" xmlns:wne="http://schemas.microsoft.com/office/word/2006/wordml" xmlns:wps="http://schemas.microsoft.com/office/word/2010/wordprocessingShape" mc:Ignorable="w14 w15 wp14">
+  <w:footnote w:type="separator" w:id="-1">
+    <w:p>
+      <w:pPr>
+        <w:spacing w:after="0" w:line="240" w:lineRule="auto"/>
+      </w:pPr>
+      <w:r>
+        <w:separator/>
+      </w:r>
+    </w:p>
+  </w:footnote>
+  <w:footnote w:type="continuationSeparator" w:id="0">
+    <w:p>
+      <w:pPr>
+        <w:spacing w:after="0" w:line="240" w:lineRule="auto"/>
+      </w:pPr>
+      <w:r>
+        <w:continuationSeparator/>
+      </w:r>
+    </w:p>
+  </w:footnote>
+</w:footnotes>
+</file>
+
+<file path=word/header1.xml><?xml version="1.0" encoding="utf-8"?>
+<w:hdr xmlns:wpc="http://schemas.microsoft.com/office/word/2010/wordprocessingCanvas" xmlns:mc="http://schemas.openxmlformats.org/markup-compatibility/2006" xmlns:o="urn:schemas-microsoft-com:office:office" xmlns:r="http://schemas.openxmlformats.org/officeDocument/2006/relationships" xmlns:m="http://schemas.openxmlformats.org/officeDocument/2006/math" xmlns:v="urn:schemas-microsoft-com:vml" xmlns:wp14="http://schemas.microsoft.com/office/word/2010/wordprocessingDrawing" xmlns:wp="http://schemas.openxmlformats.org/drawingml/2006/wordprocessingDrawing" xmlns:w10="urn:schemas-microsoft-com:office:word" xmlns:w="http://schemas.openxmlformats.org/wordprocessingml/2006/main" xmlns:w14="http://schemas.microsoft.com/office/word/2010/wordml" xmlns:w15="http://schemas.microsoft.com/office/word/2012/wordml" xmlns:wpg="http://schemas.microsoft.com/office/word/2010/wordprocessingGroup" xmlns:wpi="http://schemas.microsoft.com/office/word/2010/wordprocessingInk" xmlns:wne="http://schemas.microsoft.com/office/word/2006/wordml" xmlns:wps="http://schemas.microsoft.com/office/word/2010/wordprocessingShape" mc:Ignorable="w14 w15 wp14">
+  <w:p>
+    <w:pPr>
+      <w:pStyle w:val="Header"/>
+      <w:ind w:left="-851"/>
+      <w:jc w:val="center"/>
+    </w:pPr>
+    <w:r>
+      <w:object w:dxaOrig="1188" w:dyaOrig="900">
+        <v:rect id="_x0000_i1025" style="width:54.75pt;height:39.75pt" o:ole="" o:preferrelative="t" stroked="f">
+          <v:imagedata r:id="rId1" o:title=""/>
+        </v:rect>
+        <o:OLEObject Type="Embed" ProgID="StaticMetafile" ShapeID="_x0000_i1025" DrawAspect="Content" ObjectID="_1849700344" r:id="rId2"/>
+      </w:object>
+    </w:r>
+    <w:r>
+      <w:t xml:space="preserve"> </w:t>
+    </w:r>
+    <w:r>
+      <w:rPr>
+        <w:rFonts w:ascii="Times New Roman" w:hAnsi="Times New Roman" w:cs="Times New Roman"/>
+        <w:b/>
+        <w:color w:val="000000" w:themeColor="text1"/>
+        <w:sz w:val="26"/>
+        <w:szCs w:val="26"/>
+      </w:rPr>
+      <w:t>TENTATIVE HELICOPTER FLYING SCHEDULE FOR 01.09.2026 (TUESDAY)</w:t>
+    </w:r>
+  </w:p>
+  <w:p>
+    <w:pPr>
+      <w:pStyle w:val="Header"/>
+    </w:pPr>
+  </w:p>
+</w:hdr>
 </file>
 
 <file path=word/styles.xml><?xml version="1.0" encoding="utf-8"?>
@@ -9040,6 +8868,50 @@
       <w:szCs w:val="18"/>
     </w:rPr>
   </w:style>
+  <w:style w:type="paragraph" w:styleId="Header">
+    <w:name w:val="header"/>
+    <w:basedOn w:val="Normal"/>
+    <w:link w:val="HeaderChar"/>
+    <w:uiPriority w:val="99"/>
+    <w:unhideWhenUsed/>
+    <w:rsid w:val="0078340B"/>
+    <w:pPr>
+      <w:tabs>
+        <w:tab w:val="center" w:pos="4513"/>
+        <w:tab w:val="right" w:pos="9026"/>
+      </w:tabs>
+      <w:spacing w:after="0" w:line="240" w:lineRule="auto"/>
+    </w:pPr>
+  </w:style>
+  <w:style w:type="character" w:customStyle="1" w:styleId="HeaderChar">
+    <w:name w:val="Header Char"/>
+    <w:basedOn w:val="DefaultParagraphFont"/>
+    <w:link w:val="Header"/>
+    <w:uiPriority w:val="99"/>
+    <w:rsid w:val="0078340B"/>
+  </w:style>
+  <w:style w:type="paragraph" w:styleId="Footer">
+    <w:name w:val="footer"/>
+    <w:basedOn w:val="Normal"/>
+    <w:link w:val="FooterChar"/>
+    <w:uiPriority w:val="99"/>
+    <w:unhideWhenUsed/>
+    <w:rsid w:val="0078340B"/>
+    <w:pPr>
+      <w:tabs>
+        <w:tab w:val="center" w:pos="4513"/>
+        <w:tab w:val="right" w:pos="9026"/>
+      </w:tabs>
+      <w:spacing w:after="0" w:line="240" w:lineRule="auto"/>
+    </w:pPr>
+  </w:style>
+  <w:style w:type="character" w:customStyle="1" w:styleId="FooterChar">
+    <w:name w:val="Footer Char"/>
+    <w:basedOn w:val="DefaultParagraphFont"/>
+    <w:link w:val="Footer"/>
+    <w:uiPriority w:val="99"/>
+    <w:rsid w:val="0078340B"/>
+  </w:style>
 </w:styles>
 </file>
 

</xml_diff>

<commit_message>
Sync - 2026-09-01 17:37
</commit_message>
<xml_diff>
--- a/files/Daily_Helicopter_Schedule.docx
+++ b/files/Daily_Helicopter_Schedule.docx
@@ -1888,7 +1888,17 @@
                 <w:sz w:val="26"/>
                 <w:szCs w:val="26"/>
               </w:rPr>
-              <w:t>:00</w:t>
+              <w:t>:</w:t>
+            </w:r>
+            <w:bookmarkStart w:id="0" w:name="_GoBack"/>
+            <w:bookmarkEnd w:id="0"/>
+            <w:r>
+              <w:rPr>
+                <w:rFonts w:ascii="Calibri" w:eastAsia="Calibri" w:hAnsi="Calibri" w:cs="Calibri"/>
+                <w:sz w:val="26"/>
+                <w:szCs w:val="26"/>
+              </w:rPr>
+              <w:t>00</w:t>
             </w:r>
           </w:p>
         </w:tc>
@@ -3306,7 +3316,7 @@
                 <w:sz w:val="26"/>
                 <w:szCs w:val="26"/>
               </w:rPr>
-              <w:t>PANNA</w:t>
+              <w:t>BLQ3</w:t>
             </w:r>
           </w:p>
         </w:tc>
@@ -3779,7 +3789,7 @@
                 <w:sz w:val="26"/>
                 <w:szCs w:val="26"/>
               </w:rPr>
-              <w:t>BLQ1</w:t>
+              <w:t>BLQ3</w:t>
             </w:r>
           </w:p>
         </w:tc>
@@ -3835,8 +3845,6 @@
                 <w:szCs w:val="26"/>
               </w:rPr>
             </w:pPr>
-            <w:bookmarkStart w:id="0" w:name="_GoBack"/>
-            <w:bookmarkEnd w:id="0"/>
           </w:p>
         </w:tc>
         <w:tc>
@@ -4011,7 +4019,7 @@
                 <w:sz w:val="26"/>
                 <w:szCs w:val="26"/>
               </w:rPr>
-              <w:t>BLQ1</w:t>
+              <w:t>HERA</w:t>
             </w:r>
           </w:p>
         </w:tc>
@@ -4518,7 +4526,15 @@
                 <w:sz w:val="26"/>
                 <w:szCs w:val="26"/>
               </w:rPr>
-              <w:t>R12A+R10A</w:t>
+              <w:t>VIR-1</w:t>
+            </w:r>
+            <w:r>
+              <w:rPr>
+                <w:rFonts w:ascii="Calibri" w:eastAsia="Calibri" w:hAnsi="Calibri" w:cs="Calibri"/>
+                <w:sz w:val="26"/>
+                <w:szCs w:val="26"/>
+              </w:rPr>
+              <w:t xml:space="preserve"> B\L</w:t>
             </w:r>
           </w:p>
         </w:tc>
@@ -4972,7 +4988,7 @@
                 <w:sz w:val="26"/>
                 <w:szCs w:val="26"/>
               </w:rPr>
-              <w:t>HRA</w:t>
+              <w:t>NLM</w:t>
             </w:r>
           </w:p>
         </w:tc>
@@ -5488,7 +5504,7 @@
                 <w:sz w:val="26"/>
                 <w:szCs w:val="26"/>
               </w:rPr>
-              <w:t>ICP</w:t>
+              <w:t>SRAT</w:t>
             </w:r>
           </w:p>
         </w:tc>
@@ -5715,7 +5731,7 @@
                 <w:sz w:val="26"/>
                 <w:szCs w:val="26"/>
               </w:rPr>
-              <w:t>SHP</w:t>
+              <w:t>B193</w:t>
             </w:r>
           </w:p>
         </w:tc>
@@ -5942,7 +5958,7 @@
                 <w:sz w:val="26"/>
                 <w:szCs w:val="26"/>
               </w:rPr>
-              <w:t>SLQ</w:t>
+              <w:t>SCA</w:t>
             </w:r>
           </w:p>
         </w:tc>
@@ -6169,7 +6185,7 @@
                 <w:sz w:val="26"/>
                 <w:szCs w:val="26"/>
               </w:rPr>
-              <w:t>SGAV</w:t>
+              <w:t>SSAK</w:t>
             </w:r>
           </w:p>
         </w:tc>
@@ -6396,7 +6412,7 @@
                 <w:sz w:val="26"/>
                 <w:szCs w:val="26"/>
               </w:rPr>
-              <w:t>NQO</w:t>
+              <w:t>SMRT</w:t>
             </w:r>
           </w:p>
         </w:tc>
@@ -6623,7 +6639,7 @@
                 <w:sz w:val="26"/>
                 <w:szCs w:val="26"/>
               </w:rPr>
-              <w:t>SJOT</w:t>
+              <w:t>MNW</w:t>
             </w:r>
           </w:p>
         </w:tc>
@@ -6743,7 +6759,22 @@
                 <w:b/>
                 <w:sz w:val="24"/>
               </w:rPr>
-              <w:t>WAITING:VIR-1</w:t>
+              <w:t>WAITING:</w:t>
+            </w:r>
+            <w:r>
+              <w:rPr>
+                <w:rFonts w:ascii="Calibri" w:eastAsia="Calibri" w:hAnsi="Calibri" w:cs="Calibri"/>
+                <w:b/>
+                <w:sz w:val="24"/>
+              </w:rPr>
+              <w:t xml:space="preserve"> </w:t>
+            </w:r>
+            <w:r>
+              <w:rPr>
+                <w:rFonts w:ascii="Calibri" w:eastAsia="Calibri" w:hAnsi="Calibri" w:cs="Calibri"/>
+                <w:sz w:val="24"/>
+              </w:rPr>
+              <w:t>AS1</w:t>
             </w:r>
           </w:p>
         </w:tc>
@@ -7396,6 +7427,14 @@
                 <w:szCs w:val="26"/>
               </w:rPr>
             </w:pPr>
+            <w:r>
+              <w:rPr>
+                <w:rFonts w:ascii="Calibri" w:eastAsia="Calibri" w:hAnsi="Calibri" w:cs="Calibri"/>
+                <w:sz w:val="26"/>
+                <w:szCs w:val="26"/>
+              </w:rPr>
+              <w:t>SJOT+CHRU</w:t>
+            </w:r>
           </w:p>
         </w:tc>
         <w:tc>
@@ -7618,6 +7657,14 @@
                 <w:szCs w:val="26"/>
               </w:rPr>
             </w:pPr>
+            <w:r>
+              <w:rPr>
+                <w:rFonts w:ascii="Calibri" w:eastAsia="Calibri" w:hAnsi="Calibri" w:cs="Calibri"/>
+                <w:sz w:val="26"/>
+                <w:szCs w:val="26"/>
+              </w:rPr>
+              <w:t>JIND</w:t>
+            </w:r>
           </w:p>
         </w:tc>
         <w:tc>
@@ -7841,6 +7888,14 @@
                 <w:szCs w:val="26"/>
               </w:rPr>
             </w:pPr>
+            <w:r>
+              <w:rPr>
+                <w:rFonts w:ascii="Calibri" w:eastAsia="Calibri" w:hAnsi="Calibri" w:cs="Calibri"/>
+                <w:sz w:val="26"/>
+                <w:szCs w:val="26"/>
+              </w:rPr>
+              <w:t>CHRU</w:t>
+            </w:r>
           </w:p>
         </w:tc>
         <w:tc>
@@ -8353,7 +8408,7 @@
         <v:rect id="_x0000_i1025" style="width:54.75pt;height:39.75pt" o:ole="" o:preferrelative="t" stroked="f">
           <v:imagedata r:id="rId1" o:title=""/>
         </v:rect>
-        <o:OLEObject Type="Embed" ProgID="StaticMetafile" ShapeID="_x0000_i1025" DrawAspect="Content" ObjectID="_1849700344" r:id="rId2"/>
+        <o:OLEObject Type="Embed" ProgID="StaticMetafile" ShapeID="_x0000_i1025" DrawAspect="Content" ObjectID="_1849787811" r:id="rId2"/>
       </w:object>
     </w:r>
     <w:r>
@@ -8367,7 +8422,47 @@
         <w:sz w:val="26"/>
         <w:szCs w:val="26"/>
       </w:rPr>
-      <w:t>TENTATIVE HELICOPTER FLYING SCHEDULE FOR 01.09.2026 (TUESDAY)</w:t>
+      <w:t>TENTATIVE H</w:t>
+    </w:r>
+    <w:r>
+      <w:rPr>
+        <w:rFonts w:ascii="Times New Roman" w:hAnsi="Times New Roman" w:cs="Times New Roman"/>
+        <w:b/>
+        <w:color w:val="000000" w:themeColor="text1"/>
+        <w:sz w:val="26"/>
+        <w:szCs w:val="26"/>
+      </w:rPr>
+      <w:t>ELICOPTER FLYING SCHEDULE FOR 02</w:t>
+    </w:r>
+    <w:r>
+      <w:rPr>
+        <w:rFonts w:ascii="Times New Roman" w:hAnsi="Times New Roman" w:cs="Times New Roman"/>
+        <w:b/>
+        <w:color w:val="000000" w:themeColor="text1"/>
+        <w:sz w:val="26"/>
+        <w:szCs w:val="26"/>
+      </w:rPr>
+      <w:t>.09.2026 (</w:t>
+    </w:r>
+    <w:r>
+      <w:rPr>
+        <w:rFonts w:ascii="Times New Roman" w:hAnsi="Times New Roman" w:cs="Times New Roman"/>
+        <w:b/>
+        <w:color w:val="000000" w:themeColor="text1"/>
+        <w:sz w:val="26"/>
+        <w:szCs w:val="26"/>
+      </w:rPr>
+      <w:t>WEDNES</w:t>
+    </w:r>
+    <w:r>
+      <w:rPr>
+        <w:rFonts w:ascii="Times New Roman" w:hAnsi="Times New Roman" w:cs="Times New Roman"/>
+        <w:b/>
+        <w:color w:val="000000" w:themeColor="text1"/>
+        <w:sz w:val="26"/>
+        <w:szCs w:val="26"/>
+      </w:rPr>
+      <w:t>DAY)</w:t>
     </w:r>
   </w:p>
   <w:p>

</xml_diff>

<commit_message>
Sync - 2026-09-01 18:07
</commit_message>
<xml_diff>
--- a/files/Daily_Helicopter_Schedule.docx
+++ b/files/Daily_Helicopter_Schedule.docx
@@ -1888,17 +1888,7 @@
                 <w:sz w:val="26"/>
                 <w:szCs w:val="26"/>
               </w:rPr>
-              <w:t>:</w:t>
-            </w:r>
-            <w:bookmarkStart w:id="0" w:name="_GoBack"/>
-            <w:bookmarkEnd w:id="0"/>
-            <w:r>
-              <w:rPr>
-                <w:rFonts w:ascii="Calibri" w:eastAsia="Calibri" w:hAnsi="Calibri" w:cs="Calibri"/>
-                <w:sz w:val="26"/>
-                <w:szCs w:val="26"/>
-              </w:rPr>
-              <w:t>00</w:t>
+              <w:t>:00</w:t>
             </w:r>
           </w:p>
         </w:tc>
@@ -6641,6 +6631,14 @@
               </w:rPr>
               <w:t>MNW</w:t>
             </w:r>
+            <w:r>
+              <w:rPr>
+                <w:rFonts w:ascii="Calibri" w:eastAsia="Calibri" w:hAnsi="Calibri" w:cs="Calibri"/>
+                <w:sz w:val="26"/>
+                <w:szCs w:val="26"/>
+              </w:rPr>
+              <w:t>+AS1</w:t>
+            </w:r>
           </w:p>
         </w:tc>
         <w:tc>
@@ -6769,13 +6767,8 @@
               </w:rPr>
               <w:t xml:space="preserve"> </w:t>
             </w:r>
-            <w:r>
-              <w:rPr>
-                <w:rFonts w:ascii="Calibri" w:eastAsia="Calibri" w:hAnsi="Calibri" w:cs="Calibri"/>
-                <w:sz w:val="24"/>
-              </w:rPr>
-              <w:t>AS1</w:t>
-            </w:r>
+            <w:bookmarkStart w:id="0" w:name="_GoBack"/>
+            <w:bookmarkEnd w:id="0"/>
           </w:p>
         </w:tc>
       </w:tr>
@@ -8408,7 +8401,7 @@
         <v:rect id="_x0000_i1025" style="width:54.75pt;height:39.75pt" o:ole="" o:preferrelative="t" stroked="f">
           <v:imagedata r:id="rId1" o:title=""/>
         </v:rect>
-        <o:OLEObject Type="Embed" ProgID="StaticMetafile" ShapeID="_x0000_i1025" DrawAspect="Content" ObjectID="_1849787811" r:id="rId2"/>
+        <o:OLEObject Type="Embed" ProgID="StaticMetafile" ShapeID="_x0000_i1025" DrawAspect="Content" ObjectID="_1849789636" r:id="rId2"/>
       </w:object>
     </w:r>
     <w:r>

</xml_diff>

<commit_message>
Sync - 2026-09-02 16:15
</commit_message>
<xml_diff>
--- a/files/Daily_Helicopter_Schedule.docx
+++ b/files/Daily_Helicopter_Schedule.docx
@@ -1096,6 +1096,14 @@
               </w:rPr>
               <w:t xml:space="preserve">SF (D) </w:t>
             </w:r>
+            <w:r>
+              <w:rPr>
+                <w:rFonts w:ascii="Calibri" w:eastAsia="Calibri" w:hAnsi="Calibri" w:cs="Calibri"/>
+                <w:sz w:val="26"/>
+                <w:szCs w:val="26"/>
+              </w:rPr>
+              <w:t>+NF[D]</w:t>
+            </w:r>
           </w:p>
         </w:tc>
         <w:tc>
@@ -1334,17 +1342,19 @@
               <w:jc w:val="center"/>
               <w:rPr>
                 <w:rFonts w:ascii="Calibri" w:eastAsia="Calibri" w:hAnsi="Calibri" w:cs="Calibri"/>
-                <w:sz w:val="26"/>
-                <w:szCs w:val="26"/>
-              </w:rPr>
-            </w:pPr>
-            <w:r>
-              <w:rPr>
-                <w:rFonts w:ascii="Calibri" w:eastAsia="Calibri" w:hAnsi="Calibri" w:cs="Calibri"/>
-                <w:sz w:val="26"/>
-                <w:szCs w:val="26"/>
-              </w:rPr>
-              <w:t>NF (D)</w:t>
+                <w:b/>
+                <w:sz w:val="26"/>
+                <w:szCs w:val="26"/>
+              </w:rPr>
+            </w:pPr>
+            <w:r>
+              <w:rPr>
+                <w:rFonts w:ascii="Calibri" w:eastAsia="Calibri" w:hAnsi="Calibri" w:cs="Calibri"/>
+                <w:b/>
+                <w:sz w:val="26"/>
+                <w:szCs w:val="26"/>
+              </w:rPr>
+              <w:t>NA</w:t>
             </w:r>
           </w:p>
         </w:tc>
@@ -1377,10 +1387,11 @@
             <w:r>
               <w:rPr>
                 <w:rFonts w:ascii="Calibri" w:eastAsia="Calibri" w:hAnsi="Calibri" w:cs="Calibri"/>
-                <w:sz w:val="26"/>
-                <w:szCs w:val="26"/>
-              </w:rPr>
-              <w:t>GVHL 169</w:t>
+                <w:b/>
+                <w:sz w:val="26"/>
+                <w:szCs w:val="26"/>
+              </w:rPr>
+              <w:t>NA</w:t>
             </w:r>
           </w:p>
         </w:tc>
@@ -1405,17 +1416,19 @@
               <w:jc w:val="center"/>
               <w:rPr>
                 <w:rFonts w:ascii="Calibri" w:eastAsia="Calibri" w:hAnsi="Calibri" w:cs="Calibri"/>
-                <w:sz w:val="26"/>
-                <w:szCs w:val="26"/>
-              </w:rPr>
-            </w:pPr>
-            <w:r>
-              <w:rPr>
-                <w:rFonts w:ascii="Calibri" w:eastAsia="Calibri" w:hAnsi="Calibri" w:cs="Calibri"/>
-                <w:sz w:val="26"/>
-                <w:szCs w:val="26"/>
-              </w:rPr>
-              <w:t>GVZ</w:t>
+                <w:b/>
+                <w:sz w:val="26"/>
+                <w:szCs w:val="26"/>
+              </w:rPr>
+            </w:pPr>
+            <w:r>
+              <w:rPr>
+                <w:rFonts w:ascii="Calibri" w:eastAsia="Calibri" w:hAnsi="Calibri" w:cs="Calibri"/>
+                <w:b/>
+                <w:sz w:val="26"/>
+                <w:szCs w:val="26"/>
+              </w:rPr>
+              <w:t>NA</w:t>
             </w:r>
           </w:p>
         </w:tc>
@@ -1450,7 +1463,7 @@
                 <w:sz w:val="26"/>
                 <w:szCs w:val="26"/>
               </w:rPr>
-              <w:t>05</w:t>
+              <w:t>00</w:t>
             </w:r>
           </w:p>
         </w:tc>
@@ -2519,7 +2532,7 @@
                 <w:sz w:val="26"/>
                 <w:szCs w:val="26"/>
               </w:rPr>
-              <w:t>RRF</w:t>
+              <w:t>RRI</w:t>
             </w:r>
           </w:p>
         </w:tc>
@@ -3061,39 +3074,46 @@
             <w:r>
               <w:rPr>
                 <w:rFonts w:ascii="Calibri" w:eastAsia="Calibri" w:hAnsi="Calibri" w:cs="Calibri"/>
+                <w:sz w:val="26"/>
+                <w:szCs w:val="26"/>
+              </w:rPr>
+              <w:t xml:space="preserve"> </w:t>
+            </w:r>
+            <w:r>
+              <w:rPr>
+                <w:rFonts w:ascii="Calibri" w:eastAsia="Calibri" w:hAnsi="Calibri" w:cs="Calibri"/>
+                <w:sz w:val="26"/>
+                <w:szCs w:val="26"/>
+              </w:rPr>
+              <w:t>HRA</w:t>
+            </w:r>
+          </w:p>
+        </w:tc>
+        <w:tc>
+          <w:tcPr>
+            <w:tcW w:w="1510" w:type="dxa"/>
+            <w:tcBorders>
+              <w:top w:val="single" w:sz="4" w:space="0" w:color="000000"/>
+              <w:left w:val="single" w:sz="4" w:space="0" w:color="000000"/>
+              <w:bottom w:val="single" w:sz="4" w:space="0" w:color="000000"/>
+              <w:right w:val="single" w:sz="4" w:space="0" w:color="000000"/>
+            </w:tcBorders>
+            <w:shd w:val="clear" w:color="000000" w:fill="FFFFFF"/>
+            <w:tcMar>
+              <w:left w:w="108" w:type="dxa"/>
+              <w:right w:w="108" w:type="dxa"/>
+            </w:tcMar>
+          </w:tcPr>
+          <w:p>
+            <w:pPr>
+              <w:spacing w:after="0" w:line="240" w:lineRule="auto"/>
+              <w:jc w:val="center"/>
+              <w:rPr>
+                <w:rFonts w:ascii="Calibri" w:eastAsia="Calibri" w:hAnsi="Calibri" w:cs="Calibri"/>
                 <w:b/>
                 <w:sz w:val="26"/>
                 <w:szCs w:val="26"/>
               </w:rPr>
-              <w:t>NA</w:t>
-            </w:r>
-          </w:p>
-        </w:tc>
-        <w:tc>
-          <w:tcPr>
-            <w:tcW w:w="1510" w:type="dxa"/>
-            <w:tcBorders>
-              <w:top w:val="single" w:sz="4" w:space="0" w:color="000000"/>
-              <w:left w:val="single" w:sz="4" w:space="0" w:color="000000"/>
-              <w:bottom w:val="single" w:sz="4" w:space="0" w:color="000000"/>
-              <w:right w:val="single" w:sz="4" w:space="0" w:color="000000"/>
-            </w:tcBorders>
-            <w:shd w:val="clear" w:color="000000" w:fill="FFFFFF"/>
-            <w:tcMar>
-              <w:left w:w="108" w:type="dxa"/>
-              <w:right w:w="108" w:type="dxa"/>
-            </w:tcMar>
-          </w:tcPr>
-          <w:p>
-            <w:pPr>
-              <w:spacing w:after="0" w:line="240" w:lineRule="auto"/>
-              <w:jc w:val="center"/>
-              <w:rPr>
-                <w:rFonts w:ascii="Calibri" w:eastAsia="Calibri" w:hAnsi="Calibri" w:cs="Calibri"/>
-                <w:b/>
-                <w:sz w:val="26"/>
-                <w:szCs w:val="26"/>
-              </w:rPr>
             </w:pPr>
           </w:p>
         </w:tc>
@@ -3118,20 +3138,10 @@
               <w:jc w:val="center"/>
               <w:rPr>
                 <w:rFonts w:ascii="Calibri" w:eastAsia="Calibri" w:hAnsi="Calibri" w:cs="Calibri"/>
-                <w:b/>
-                <w:sz w:val="26"/>
-                <w:szCs w:val="26"/>
-              </w:rPr>
-            </w:pPr>
-            <w:r>
-              <w:rPr>
-                <w:rFonts w:ascii="Calibri" w:eastAsia="Calibri" w:hAnsi="Calibri" w:cs="Calibri"/>
-                <w:b/>
-                <w:sz w:val="26"/>
-                <w:szCs w:val="26"/>
-              </w:rPr>
-              <w:t>NA</w:t>
-            </w:r>
+                <w:sz w:val="26"/>
+                <w:szCs w:val="26"/>
+              </w:rPr>
+            </w:pPr>
           </w:p>
         </w:tc>
         <w:tc>
@@ -3271,7 +3281,15 @@
                 <w:sz w:val="26"/>
                 <w:szCs w:val="26"/>
               </w:rPr>
-              <w:t>09:15</w:t>
+              <w:t>09:0</w:t>
+            </w:r>
+            <w:r>
+              <w:rPr>
+                <w:rFonts w:ascii="Calibri" w:eastAsia="Calibri" w:hAnsi="Calibri" w:cs="Calibri"/>
+                <w:sz w:val="26"/>
+                <w:szCs w:val="26"/>
+              </w:rPr>
+              <w:t>5</w:t>
             </w:r>
           </w:p>
         </w:tc>
@@ -3306,7 +3324,7 @@
                 <w:sz w:val="26"/>
                 <w:szCs w:val="26"/>
               </w:rPr>
-              <w:t>BLQ3</w:t>
+              <w:t>BLQ3[B/L]</w:t>
             </w:r>
           </w:p>
         </w:tc>
@@ -3501,7 +3519,7 @@
                 <w:sz w:val="26"/>
                 <w:szCs w:val="26"/>
               </w:rPr>
-              <w:t>09:30</w:t>
+              <w:t>11:05</w:t>
             </w:r>
           </w:p>
         </w:tc>
@@ -3526,48 +3544,46 @@
               <w:jc w:val="center"/>
               <w:rPr>
                 <w:rFonts w:ascii="Calibri" w:eastAsia="Calibri" w:hAnsi="Calibri" w:cs="Calibri"/>
+                <w:sz w:val="26"/>
+                <w:szCs w:val="26"/>
+              </w:rPr>
+            </w:pPr>
+            <w:r>
+              <w:rPr>
+                <w:rFonts w:ascii="Calibri" w:eastAsia="Calibri" w:hAnsi="Calibri" w:cs="Calibri"/>
+                <w:sz w:val="26"/>
+                <w:szCs w:val="26"/>
+              </w:rPr>
+              <w:t>HRA</w:t>
+            </w:r>
+          </w:p>
+        </w:tc>
+        <w:tc>
+          <w:tcPr>
+            <w:tcW w:w="1510" w:type="dxa"/>
+            <w:tcBorders>
+              <w:top w:val="single" w:sz="4" w:space="0" w:color="000000"/>
+              <w:left w:val="single" w:sz="4" w:space="0" w:color="000000"/>
+              <w:bottom w:val="single" w:sz="4" w:space="0" w:color="000000"/>
+              <w:right w:val="single" w:sz="4" w:space="0" w:color="000000"/>
+            </w:tcBorders>
+            <w:shd w:val="clear" w:color="000000" w:fill="FFFFFF"/>
+            <w:tcMar>
+              <w:left w:w="108" w:type="dxa"/>
+              <w:right w:w="108" w:type="dxa"/>
+            </w:tcMar>
+          </w:tcPr>
+          <w:p>
+            <w:pPr>
+              <w:spacing w:after="0" w:line="240" w:lineRule="auto"/>
+              <w:jc w:val="center"/>
+              <w:rPr>
+                <w:rFonts w:ascii="Calibri" w:eastAsia="Calibri" w:hAnsi="Calibri" w:cs="Calibri"/>
                 <w:b/>
                 <w:sz w:val="26"/>
                 <w:szCs w:val="26"/>
               </w:rPr>
             </w:pPr>
-            <w:r>
-              <w:rPr>
-                <w:rFonts w:ascii="Calibri" w:eastAsia="Calibri" w:hAnsi="Calibri" w:cs="Calibri"/>
-                <w:b/>
-                <w:sz w:val="26"/>
-                <w:szCs w:val="26"/>
-              </w:rPr>
-              <w:t>NA</w:t>
-            </w:r>
-          </w:p>
-        </w:tc>
-        <w:tc>
-          <w:tcPr>
-            <w:tcW w:w="1510" w:type="dxa"/>
-            <w:tcBorders>
-              <w:top w:val="single" w:sz="4" w:space="0" w:color="000000"/>
-              <w:left w:val="single" w:sz="4" w:space="0" w:color="000000"/>
-              <w:bottom w:val="single" w:sz="4" w:space="0" w:color="000000"/>
-              <w:right w:val="single" w:sz="4" w:space="0" w:color="000000"/>
-            </w:tcBorders>
-            <w:shd w:val="clear" w:color="000000" w:fill="FFFFFF"/>
-            <w:tcMar>
-              <w:left w:w="108" w:type="dxa"/>
-              <w:right w:w="108" w:type="dxa"/>
-            </w:tcMar>
-          </w:tcPr>
-          <w:p>
-            <w:pPr>
-              <w:spacing w:after="0" w:line="240" w:lineRule="auto"/>
-              <w:jc w:val="center"/>
-              <w:rPr>
-                <w:rFonts w:ascii="Calibri" w:eastAsia="Calibri" w:hAnsi="Calibri" w:cs="Calibri"/>
-                <w:b/>
-                <w:sz w:val="26"/>
-                <w:szCs w:val="26"/>
-              </w:rPr>
-            </w:pPr>
           </w:p>
         </w:tc>
         <w:tc>
@@ -3591,20 +3607,10 @@
               <w:jc w:val="center"/>
               <w:rPr>
                 <w:rFonts w:ascii="Calibri" w:eastAsia="Calibri" w:hAnsi="Calibri" w:cs="Calibri"/>
-                <w:b/>
-                <w:sz w:val="26"/>
-                <w:szCs w:val="26"/>
-              </w:rPr>
-            </w:pPr>
-            <w:r>
-              <w:rPr>
-                <w:rFonts w:ascii="Calibri" w:eastAsia="Calibri" w:hAnsi="Calibri" w:cs="Calibri"/>
-                <w:b/>
-                <w:sz w:val="26"/>
-                <w:szCs w:val="26"/>
-              </w:rPr>
-              <w:t>NA</w:t>
-            </w:r>
+                <w:sz w:val="26"/>
+                <w:szCs w:val="26"/>
+              </w:rPr>
+            </w:pPr>
           </w:p>
         </w:tc>
         <w:tc>
@@ -3744,7 +3750,7 @@
                 <w:sz w:val="26"/>
                 <w:szCs w:val="26"/>
               </w:rPr>
-              <w:t>11:15</w:t>
+              <w:t>11:00</w:t>
             </w:r>
           </w:p>
         </w:tc>
@@ -3779,7 +3785,7 @@
                 <w:sz w:val="26"/>
                 <w:szCs w:val="26"/>
               </w:rPr>
-              <w:t>BLQ3</w:t>
+              <w:t>FOSSIL</w:t>
             </w:r>
           </w:p>
         </w:tc>
@@ -3974,7 +3980,7 @@
                 <w:sz w:val="26"/>
                 <w:szCs w:val="26"/>
               </w:rPr>
-              <w:t>13:00</w:t>
+              <w:t>13:05</w:t>
             </w:r>
           </w:p>
         </w:tc>
@@ -4009,7 +4015,7 @@
                 <w:sz w:val="26"/>
                 <w:szCs w:val="26"/>
               </w:rPr>
-              <w:t>HERA</w:t>
+              <w:t>HRA</w:t>
             </w:r>
           </w:p>
         </w:tc>
@@ -4280,13 +4286,15 @@
               <w:jc w:val="center"/>
               <w:rPr>
                 <w:rFonts w:ascii="Calibri" w:eastAsia="Calibri" w:hAnsi="Calibri" w:cs="Calibri"/>
-                <w:sz w:val="26"/>
-                <w:szCs w:val="26"/>
-              </w:rPr>
-            </w:pPr>
-            <w:r>
-              <w:rPr>
-                <w:rFonts w:ascii="Calibri" w:eastAsia="Calibri" w:hAnsi="Calibri" w:cs="Calibri"/>
+                <w:b/>
+                <w:sz w:val="26"/>
+                <w:szCs w:val="26"/>
+              </w:rPr>
+            </w:pPr>
+            <w:r>
+              <w:rPr>
+                <w:rFonts w:ascii="Calibri" w:eastAsia="Calibri" w:hAnsi="Calibri" w:cs="Calibri"/>
+                <w:b/>
                 <w:sz w:val="26"/>
                 <w:szCs w:val="26"/>
               </w:rPr>
@@ -4516,15 +4524,7 @@
                 <w:sz w:val="26"/>
                 <w:szCs w:val="26"/>
               </w:rPr>
-              <w:t>VIR-1</w:t>
-            </w:r>
-            <w:r>
-              <w:rPr>
-                <w:rFonts w:ascii="Calibri" w:eastAsia="Calibri" w:hAnsi="Calibri" w:cs="Calibri"/>
-                <w:sz w:val="26"/>
-                <w:szCs w:val="26"/>
-              </w:rPr>
-              <w:t xml:space="preserve"> B\L</w:t>
+              <w:t>WIN</w:t>
             </w:r>
           </w:p>
         </w:tc>
@@ -4740,6 +4740,7 @@
               <w:jc w:val="center"/>
               <w:rPr>
                 <w:rFonts w:ascii="Calibri" w:eastAsia="Calibri" w:hAnsi="Calibri" w:cs="Calibri"/>
+                <w:b/>
                 <w:sz w:val="26"/>
                 <w:szCs w:val="26"/>
               </w:rPr>
@@ -4978,7 +4979,7 @@
                 <w:sz w:val="26"/>
                 <w:szCs w:val="26"/>
               </w:rPr>
-              <w:t>NLM</w:t>
+              <w:t>MNW</w:t>
             </w:r>
           </w:p>
         </w:tc>
@@ -5212,7 +5213,7 @@
                 <w:sz w:val="26"/>
                 <w:szCs w:val="26"/>
               </w:rPr>
-              <w:t>NLM</w:t>
+              <w:t>NA</w:t>
             </w:r>
           </w:p>
         </w:tc>
@@ -5494,7 +5495,7 @@
                 <w:sz w:val="26"/>
                 <w:szCs w:val="26"/>
               </w:rPr>
-              <w:t>SRAT</w:t>
+              <w:t>J EXPLR</w:t>
             </w:r>
           </w:p>
         </w:tc>
@@ -5550,6 +5551,8 @@
                 <w:szCs w:val="26"/>
               </w:rPr>
             </w:pPr>
+            <w:bookmarkStart w:id="0" w:name="_GoBack"/>
+            <w:bookmarkEnd w:id="0"/>
           </w:p>
         </w:tc>
         <w:tc>
@@ -5721,7 +5724,7 @@
                 <w:sz w:val="26"/>
                 <w:szCs w:val="26"/>
               </w:rPr>
-              <w:t>B193</w:t>
+              <w:t>SHQ</w:t>
             </w:r>
           </w:p>
         </w:tc>
@@ -5948,7 +5951,7 @@
                 <w:sz w:val="26"/>
                 <w:szCs w:val="26"/>
               </w:rPr>
-              <w:t>SCA</w:t>
+              <w:t>ICW</w:t>
             </w:r>
           </w:p>
         </w:tc>
@@ -6175,7 +6178,7 @@
                 <w:sz w:val="26"/>
                 <w:szCs w:val="26"/>
               </w:rPr>
-              <w:t>SSAK</w:t>
+              <w:t>TRI-2[L/O]</w:t>
             </w:r>
           </w:p>
         </w:tc>
@@ -6402,7 +6405,7 @@
                 <w:sz w:val="26"/>
                 <w:szCs w:val="26"/>
               </w:rPr>
-              <w:t>SMRT</w:t>
+              <w:t>UDAY</w:t>
             </w:r>
           </w:p>
         </w:tc>
@@ -6629,15 +6632,7 @@
                 <w:sz w:val="26"/>
                 <w:szCs w:val="26"/>
               </w:rPr>
-              <w:t>MNW</w:t>
-            </w:r>
-            <w:r>
-              <w:rPr>
-                <w:rFonts w:ascii="Calibri" w:eastAsia="Calibri" w:hAnsi="Calibri" w:cs="Calibri"/>
-                <w:sz w:val="26"/>
-                <w:szCs w:val="26"/>
-              </w:rPr>
-              <w:t>+AS1</w:t>
+              <w:t>J SUP</w:t>
             </w:r>
           </w:p>
         </w:tc>
@@ -6757,18 +6752,22 @@
                 <w:b/>
                 <w:sz w:val="24"/>
               </w:rPr>
-              <w:t>WAITING:</w:t>
-            </w:r>
-            <w:r>
-              <w:rPr>
-                <w:rFonts w:ascii="Calibri" w:eastAsia="Calibri" w:hAnsi="Calibri" w:cs="Calibri"/>
-                <w:b/>
+              <w:t xml:space="preserve">WAITING: </w:t>
+            </w:r>
+            <w:r>
+              <w:rPr>
+                <w:rFonts w:ascii="Calibri" w:eastAsia="Calibri" w:hAnsi="Calibri" w:cs="Calibri"/>
                 <w:sz w:val="24"/>
               </w:rPr>
-              <w:t xml:space="preserve"> </w:t>
-            </w:r>
-            <w:bookmarkStart w:id="0" w:name="_GoBack"/>
-            <w:bookmarkEnd w:id="0"/>
+              <w:t>SCHLR</w:t>
+            </w:r>
+            <w:r>
+              <w:rPr>
+                <w:rFonts w:ascii="Calibri" w:eastAsia="Calibri" w:hAnsi="Calibri" w:cs="Calibri"/>
+                <w:sz w:val="24"/>
+              </w:rPr>
+              <w:t>,DSF</w:t>
+            </w:r>
           </w:p>
         </w:tc>
       </w:tr>
@@ -7426,7 +7425,7 @@
                 <w:sz w:val="26"/>
                 <w:szCs w:val="26"/>
               </w:rPr>
-              <w:t>SJOT+CHRU</w:t>
+              <w:t>TAPTI</w:t>
             </w:r>
           </w:p>
         </w:tc>
@@ -7656,7 +7655,7 @@
                 <w:sz w:val="26"/>
                 <w:szCs w:val="26"/>
               </w:rPr>
-              <w:t>JIND</w:t>
+              <w:t>L/O</w:t>
             </w:r>
           </w:p>
         </w:tc>
@@ -7887,7 +7886,7 @@
                 <w:sz w:val="26"/>
                 <w:szCs w:val="26"/>
               </w:rPr>
-              <w:t>CHRU</w:t>
+              <w:t>L/O</w:t>
             </w:r>
           </w:p>
         </w:tc>
@@ -8398,10 +8397,10 @@
     </w:pPr>
     <w:r>
       <w:object w:dxaOrig="1188" w:dyaOrig="900">
-        <v:rect id="_x0000_i1025" style="width:54.75pt;height:39.75pt" o:ole="" o:preferrelative="t" stroked="f">
+        <v:rect id="_x0000_i1025" style="width:54.5pt;height:39.55pt" o:ole="" o:preferrelative="t" stroked="f">
           <v:imagedata r:id="rId1" o:title=""/>
         </v:rect>
-        <o:OLEObject Type="Embed" ProgID="StaticMetafile" ShapeID="_x0000_i1025" DrawAspect="Content" ObjectID="_1849789636" r:id="rId2"/>
+        <o:OLEObject Type="Embed" ProgID="StaticMetafile" ShapeID="_x0000_i1025" DrawAspect="Content" ObjectID="_1849870114" r:id="rId2"/>
       </w:object>
     </w:r>
     <w:r>
@@ -8425,7 +8424,7 @@
         <w:sz w:val="26"/>
         <w:szCs w:val="26"/>
       </w:rPr>
-      <w:t>ELICOPTER FLYING SCHEDULE FOR 02</w:t>
+      <w:t>ELICOPTER FLYING SCHEDULE FOR 03</w:t>
     </w:r>
     <w:r>
       <w:rPr>
@@ -8445,7 +8444,17 @@
         <w:sz w:val="26"/>
         <w:szCs w:val="26"/>
       </w:rPr>
-      <w:t>WEDNES</w:t>
+      <w:t>THUR</w:t>
+    </w:r>
+    <w:r>
+      <w:rPr>
+        <w:rFonts w:ascii="Times New Roman" w:hAnsi="Times New Roman" w:cs="Times New Roman"/>
+        <w:b/>
+        <w:color w:val="000000" w:themeColor="text1"/>
+        <w:sz w:val="26"/>
+        <w:szCs w:val="26"/>
+      </w:rPr>
+      <w:t>S</w:t>
     </w:r>
     <w:r>
       <w:rPr>

</xml_diff>

<commit_message>
Sync - 2026-09-03 15:49
</commit_message>
<xml_diff>
--- a/files/Daily_Helicopter_Schedule.docx
+++ b/files/Daily_Helicopter_Schedule.docx
@@ -1096,14 +1096,6 @@
               </w:rPr>
               <w:t xml:space="preserve">SF (D) </w:t>
             </w:r>
-            <w:r>
-              <w:rPr>
-                <w:rFonts w:ascii="Calibri" w:eastAsia="Calibri" w:hAnsi="Calibri" w:cs="Calibri"/>
-                <w:sz w:val="26"/>
-                <w:szCs w:val="26"/>
-              </w:rPr>
-              <w:t>+NF[D]</w:t>
-            </w:r>
           </w:p>
         </w:tc>
         <w:tc>
@@ -1350,48 +1342,46 @@
             <w:r>
               <w:rPr>
                 <w:rFonts w:ascii="Calibri" w:eastAsia="Calibri" w:hAnsi="Calibri" w:cs="Calibri"/>
+                <w:sz w:val="26"/>
+                <w:szCs w:val="26"/>
+              </w:rPr>
+              <w:t>NF[D]</w:t>
+            </w:r>
+          </w:p>
+        </w:tc>
+        <w:tc>
+          <w:tcPr>
+            <w:tcW w:w="1510" w:type="dxa"/>
+            <w:tcBorders>
+              <w:top w:val="single" w:sz="4" w:space="0" w:color="000000"/>
+              <w:left w:val="single" w:sz="4" w:space="0" w:color="000000"/>
+              <w:bottom w:val="single" w:sz="4" w:space="0" w:color="000000"/>
+              <w:right w:val="single" w:sz="4" w:space="0" w:color="000000"/>
+            </w:tcBorders>
+            <w:shd w:val="clear" w:color="000000" w:fill="FFFFFF"/>
+            <w:tcMar>
+              <w:left w:w="108" w:type="dxa"/>
+              <w:right w:w="108" w:type="dxa"/>
+            </w:tcMar>
+          </w:tcPr>
+          <w:p>
+            <w:pPr>
+              <w:spacing w:after="0" w:line="240" w:lineRule="auto"/>
+              <w:jc w:val="center"/>
+              <w:rPr>
+                <w:rFonts w:ascii="Calibri" w:eastAsia="Calibri" w:hAnsi="Calibri" w:cs="Calibri"/>
                 <w:b/>
                 <w:sz w:val="26"/>
                 <w:szCs w:val="26"/>
               </w:rPr>
-              <w:t>NA</w:t>
-            </w:r>
-          </w:p>
-        </w:tc>
-        <w:tc>
-          <w:tcPr>
-            <w:tcW w:w="1510" w:type="dxa"/>
-            <w:tcBorders>
-              <w:top w:val="single" w:sz="4" w:space="0" w:color="000000"/>
-              <w:left w:val="single" w:sz="4" w:space="0" w:color="000000"/>
-              <w:bottom w:val="single" w:sz="4" w:space="0" w:color="000000"/>
-              <w:right w:val="single" w:sz="4" w:space="0" w:color="000000"/>
-            </w:tcBorders>
-            <w:shd w:val="clear" w:color="000000" w:fill="FFFFFF"/>
-            <w:tcMar>
-              <w:left w:w="108" w:type="dxa"/>
-              <w:right w:w="108" w:type="dxa"/>
-            </w:tcMar>
-          </w:tcPr>
-          <w:p>
-            <w:pPr>
-              <w:spacing w:after="0" w:line="240" w:lineRule="auto"/>
-              <w:jc w:val="center"/>
-              <w:rPr>
-                <w:rFonts w:ascii="Calibri" w:eastAsia="Calibri" w:hAnsi="Calibri" w:cs="Calibri"/>
-                <w:b/>
-                <w:sz w:val="26"/>
-                <w:szCs w:val="26"/>
-              </w:rPr>
-            </w:pPr>
-            <w:r>
-              <w:rPr>
-                <w:rFonts w:ascii="Calibri" w:eastAsia="Calibri" w:hAnsi="Calibri" w:cs="Calibri"/>
-                <w:b/>
-                <w:sz w:val="26"/>
-                <w:szCs w:val="26"/>
-              </w:rPr>
-              <w:t>NA</w:t>
+            </w:pPr>
+            <w:r>
+              <w:rPr>
+                <w:rFonts w:ascii="Calibri" w:eastAsia="Calibri" w:hAnsi="Calibri" w:cs="Calibri"/>
+                <w:sz w:val="26"/>
+                <w:szCs w:val="26"/>
+              </w:rPr>
+              <w:t>GVHL 412</w:t>
             </w:r>
           </w:p>
         </w:tc>
@@ -1416,19 +1406,17 @@
               <w:jc w:val="center"/>
               <w:rPr>
                 <w:rFonts w:ascii="Calibri" w:eastAsia="Calibri" w:hAnsi="Calibri" w:cs="Calibri"/>
-                <w:b/>
-                <w:sz w:val="26"/>
-                <w:szCs w:val="26"/>
-              </w:rPr>
-            </w:pPr>
-            <w:r>
-              <w:rPr>
-                <w:rFonts w:ascii="Calibri" w:eastAsia="Calibri" w:hAnsi="Calibri" w:cs="Calibri"/>
-                <w:b/>
-                <w:sz w:val="26"/>
-                <w:szCs w:val="26"/>
-              </w:rPr>
-              <w:t>NA</w:t>
+                <w:sz w:val="26"/>
+                <w:szCs w:val="26"/>
+              </w:rPr>
+            </w:pPr>
+            <w:r>
+              <w:rPr>
+                <w:rFonts w:ascii="Calibri" w:eastAsia="Calibri" w:hAnsi="Calibri" w:cs="Calibri"/>
+                <w:sz w:val="26"/>
+                <w:szCs w:val="26"/>
+              </w:rPr>
+              <w:t>RRF</w:t>
             </w:r>
           </w:p>
         </w:tc>
@@ -1463,7 +1451,7 @@
                 <w:sz w:val="26"/>
                 <w:szCs w:val="26"/>
               </w:rPr>
-              <w:t>00</w:t>
+              <w:t>07</w:t>
             </w:r>
           </w:p>
         </w:tc>
@@ -3066,26 +3054,17 @@
               <w:jc w:val="center"/>
               <w:rPr>
                 <w:rFonts w:ascii="Calibri" w:eastAsia="Calibri" w:hAnsi="Calibri" w:cs="Calibri"/>
-                <w:b/>
-                <w:sz w:val="26"/>
-                <w:szCs w:val="26"/>
-              </w:rPr>
-            </w:pPr>
-            <w:r>
-              <w:rPr>
-                <w:rFonts w:ascii="Calibri" w:eastAsia="Calibri" w:hAnsi="Calibri" w:cs="Calibri"/>
-                <w:sz w:val="26"/>
-                <w:szCs w:val="26"/>
-              </w:rPr>
-              <w:t xml:space="preserve"> </w:t>
-            </w:r>
-            <w:r>
-              <w:rPr>
-                <w:rFonts w:ascii="Calibri" w:eastAsia="Calibri" w:hAnsi="Calibri" w:cs="Calibri"/>
-                <w:sz w:val="26"/>
-                <w:szCs w:val="26"/>
-              </w:rPr>
-              <w:t>HRA</w:t>
+                <w:sz w:val="26"/>
+                <w:szCs w:val="26"/>
+              </w:rPr>
+            </w:pPr>
+            <w:r>
+              <w:rPr>
+                <w:rFonts w:ascii="Calibri" w:eastAsia="Calibri" w:hAnsi="Calibri" w:cs="Calibri"/>
+                <w:sz w:val="26"/>
+                <w:szCs w:val="26"/>
+              </w:rPr>
+              <w:t>ADM 9</w:t>
             </w:r>
           </w:p>
         </w:tc>
@@ -3324,7 +3303,7 @@
                 <w:sz w:val="26"/>
                 <w:szCs w:val="26"/>
               </w:rPr>
-              <w:t>BLQ3[B/L]</w:t>
+              <w:t>NA</w:t>
             </w:r>
           </w:p>
         </w:tc>
@@ -3554,7 +3533,7 @@
                 <w:sz w:val="26"/>
                 <w:szCs w:val="26"/>
               </w:rPr>
-              <w:t>HRA</w:t>
+              <w:t>ADM 9</w:t>
             </w:r>
           </w:p>
         </w:tc>
@@ -3785,7 +3764,7 @@
                 <w:sz w:val="26"/>
                 <w:szCs w:val="26"/>
               </w:rPr>
-              <w:t>FOSSIL</w:t>
+              <w:t>NA</w:t>
             </w:r>
           </w:p>
         </w:tc>
@@ -4015,7 +3994,7 @@
                 <w:sz w:val="26"/>
                 <w:szCs w:val="26"/>
               </w:rPr>
-              <w:t>HRA</w:t>
+              <w:t>DSF</w:t>
             </w:r>
           </w:p>
         </w:tc>
@@ -4524,7 +4503,7 @@
                 <w:sz w:val="26"/>
                 <w:szCs w:val="26"/>
               </w:rPr>
-              <w:t>WIN</w:t>
+              <w:t>B193</w:t>
             </w:r>
           </w:p>
         </w:tc>
@@ -4979,7 +4958,7 @@
                 <w:sz w:val="26"/>
                 <w:szCs w:val="26"/>
               </w:rPr>
-              <w:t>MNW</w:t>
+              <w:t>GRV</w:t>
             </w:r>
           </w:p>
         </w:tc>
@@ -5495,7 +5474,7 @@
                 <w:sz w:val="26"/>
                 <w:szCs w:val="26"/>
               </w:rPr>
-              <w:t>J EXPLR</w:t>
+              <w:t>SLQ</w:t>
             </w:r>
           </w:p>
         </w:tc>
@@ -6178,7 +6157,15 @@
                 <w:sz w:val="26"/>
                 <w:szCs w:val="26"/>
               </w:rPr>
-              <w:t>TRI-2[L/O]</w:t>
+              <w:t>VKDN1</w:t>
+            </w:r>
+            <w:r>
+              <w:rPr>
+                <w:rFonts w:ascii="Calibri" w:eastAsia="Calibri" w:hAnsi="Calibri" w:cs="Calibri"/>
+                <w:sz w:val="26"/>
+                <w:szCs w:val="26"/>
+              </w:rPr>
+              <w:t>[B/L]</w:t>
             </w:r>
           </w:p>
         </w:tc>
@@ -6405,7 +6392,7 @@
                 <w:sz w:val="26"/>
                 <w:szCs w:val="26"/>
               </w:rPr>
-              <w:t>UDAY</w:t>
+              <w:t>JYOTI</w:t>
             </w:r>
           </w:p>
         </w:tc>
@@ -6632,7 +6619,15 @@
                 <w:sz w:val="26"/>
                 <w:szCs w:val="26"/>
               </w:rPr>
-              <w:t>J SUP</w:t>
+              <w:t>MNW</w:t>
+            </w:r>
+            <w:r>
+              <w:rPr>
+                <w:rFonts w:ascii="Calibri" w:eastAsia="Calibri" w:hAnsi="Calibri" w:cs="Calibri"/>
+                <w:sz w:val="26"/>
+                <w:szCs w:val="26"/>
+              </w:rPr>
+              <w:t>/NQO</w:t>
             </w:r>
           </w:p>
         </w:tc>
@@ -6766,7 +6761,14 @@
                 <w:rFonts w:ascii="Calibri" w:eastAsia="Calibri" w:hAnsi="Calibri" w:cs="Calibri"/>
                 <w:sz w:val="24"/>
               </w:rPr>
-              <w:t>,DSF</w:t>
+              <w:t>,CHITRA,FD9,DVDR,</w:t>
+            </w:r>
+            <w:r>
+              <w:rPr>
+                <w:rFonts w:ascii="Calibri" w:eastAsia="Calibri" w:hAnsi="Calibri" w:cs="Calibri"/>
+                <w:sz w:val="24"/>
+              </w:rPr>
+              <w:t>VKDN2</w:t>
             </w:r>
           </w:p>
         </w:tc>
@@ -7425,7 +7427,7 @@
                 <w:sz w:val="26"/>
                 <w:szCs w:val="26"/>
               </w:rPr>
-              <w:t>TAPTI</w:t>
+              <w:t>JYOTI</w:t>
             </w:r>
           </w:p>
         </w:tc>
@@ -7655,7 +7657,7 @@
                 <w:sz w:val="26"/>
                 <w:szCs w:val="26"/>
               </w:rPr>
-              <w:t>L/O</w:t>
+              <w:t>CET</w:t>
             </w:r>
           </w:p>
         </w:tc>
@@ -8400,7 +8402,7 @@
         <v:rect id="_x0000_i1025" style="width:54.5pt;height:39.55pt" o:ole="" o:preferrelative="t" stroked="f">
           <v:imagedata r:id="rId1" o:title=""/>
         </v:rect>
-        <o:OLEObject Type="Embed" ProgID="StaticMetafile" ShapeID="_x0000_i1025" DrawAspect="Content" ObjectID="_1849870114" r:id="rId2"/>
+        <o:OLEObject Type="Embed" ProgID="StaticMetafile" ShapeID="_x0000_i1025" DrawAspect="Content" ObjectID="_1849954686" r:id="rId2"/>
       </w:object>
     </w:r>
     <w:r>
@@ -8424,7 +8426,7 @@
         <w:sz w:val="26"/>
         <w:szCs w:val="26"/>
       </w:rPr>
-      <w:t>ELICOPTER FLYING SCHEDULE FOR 03</w:t>
+      <w:t>ELICOPTER FLYING SCHEDULE FOR 04</w:t>
     </w:r>
     <w:r>
       <w:rPr>
@@ -8444,17 +8446,7 @@
         <w:sz w:val="26"/>
         <w:szCs w:val="26"/>
       </w:rPr>
-      <w:t>THUR</w:t>
-    </w:r>
-    <w:r>
-      <w:rPr>
-        <w:rFonts w:ascii="Times New Roman" w:hAnsi="Times New Roman" w:cs="Times New Roman"/>
-        <w:b/>
-        <w:color w:val="000000" w:themeColor="text1"/>
-        <w:sz w:val="26"/>
-        <w:szCs w:val="26"/>
-      </w:rPr>
-      <w:t>S</w:t>
+      <w:t>FRI</w:t>
     </w:r>
     <w:r>
       <w:rPr>

</xml_diff>

<commit_message>
Sync - 2026-09-03 16:19
</commit_message>
<xml_diff>
--- a/files/Daily_Helicopter_Schedule.docx
+++ b/files/Daily_Helicopter_Schedule.docx
@@ -5530,8 +5530,6 @@
                 <w:szCs w:val="26"/>
               </w:rPr>
             </w:pPr>
-            <w:bookmarkStart w:id="0" w:name="_GoBack"/>
-            <w:bookmarkEnd w:id="0"/>
           </w:p>
         </w:tc>
         <w:tc>
@@ -6619,15 +6617,7 @@
                 <w:sz w:val="26"/>
                 <w:szCs w:val="26"/>
               </w:rPr>
-              <w:t>MNW</w:t>
-            </w:r>
-            <w:r>
-              <w:rPr>
-                <w:rFonts w:ascii="Calibri" w:eastAsia="Calibri" w:hAnsi="Calibri" w:cs="Calibri"/>
-                <w:sz w:val="26"/>
-                <w:szCs w:val="26"/>
-              </w:rPr>
-              <w:t>/NQO</w:t>
+              <w:t>MNW/NQO</w:t>
             </w:r>
           </w:p>
         </w:tc>
@@ -7427,7 +7417,7 @@
                 <w:sz w:val="26"/>
                 <w:szCs w:val="26"/>
               </w:rPr>
-              <w:t>JYOTI</w:t>
+              <w:t>NA</w:t>
             </w:r>
           </w:p>
         </w:tc>
@@ -7657,7 +7647,7 @@
                 <w:sz w:val="26"/>
                 <w:szCs w:val="26"/>
               </w:rPr>
-              <w:t>CET</w:t>
+              <w:t>NA</w:t>
             </w:r>
           </w:p>
         </w:tc>
@@ -7888,8 +7878,10 @@
                 <w:sz w:val="26"/>
                 <w:szCs w:val="26"/>
               </w:rPr>
-              <w:t>L/O</w:t>
-            </w:r>
+              <w:t>NA</w:t>
+            </w:r>
+            <w:bookmarkStart w:id="0" w:name="_GoBack"/>
+            <w:bookmarkEnd w:id="0"/>
           </w:p>
         </w:tc>
         <w:tc>
@@ -8113,6 +8105,14 @@
                 <w:szCs w:val="26"/>
               </w:rPr>
             </w:pPr>
+            <w:r>
+              <w:rPr>
+                <w:rFonts w:ascii="Calibri" w:eastAsia="Calibri" w:hAnsi="Calibri" w:cs="Calibri"/>
+                <w:sz w:val="26"/>
+                <w:szCs w:val="26"/>
+              </w:rPr>
+              <w:t>J STAR</w:t>
+            </w:r>
           </w:p>
         </w:tc>
         <w:tc>
@@ -8167,6 +8167,14 @@
                 <w:szCs w:val="26"/>
               </w:rPr>
             </w:pPr>
+            <w:r>
+              <w:rPr>
+                <w:rFonts w:ascii="Calibri" w:eastAsia="Calibri" w:hAnsi="Calibri" w:cs="Calibri"/>
+                <w:sz w:val="26"/>
+                <w:szCs w:val="26"/>
+              </w:rPr>
+              <w:t>GVX</w:t>
+            </w:r>
           </w:p>
         </w:tc>
         <w:tc>
@@ -8399,10 +8407,10 @@
     </w:pPr>
     <w:r>
       <w:object w:dxaOrig="1188" w:dyaOrig="900">
-        <v:rect id="_x0000_i1025" style="width:54.5pt;height:39.55pt" o:ole="" o:preferrelative="t" stroked="f">
+        <v:rect id="_x0000_i1025" style="width:54.75pt;height:39.55pt" o:ole="" o:preferrelative="t" stroked="f">
           <v:imagedata r:id="rId1" o:title=""/>
         </v:rect>
-        <o:OLEObject Type="Embed" ProgID="StaticMetafile" ShapeID="_x0000_i1025" DrawAspect="Content" ObjectID="_1849954686" r:id="rId2"/>
+        <o:OLEObject Type="Embed" ProgID="StaticMetafile" ShapeID="_x0000_i1025" DrawAspect="Content" ObjectID="_1849957218" r:id="rId2"/>
       </w:object>
     </w:r>
     <w:r>

</xml_diff>

<commit_message>
Sync - 2026-09-04 17:22
</commit_message>
<xml_diff>
--- a/files/Daily_Helicopter_Schedule.docx
+++ b/files/Daily_Helicopter_Schedule.docx
@@ -914,7 +914,7 @@
                 <w:sz w:val="26"/>
                 <w:szCs w:val="26"/>
               </w:rPr>
-              <w:t>RRK</w:t>
+              <w:t>RRO</w:t>
             </w:r>
           </w:p>
         </w:tc>
@@ -1164,7 +1164,7 @@
                 <w:sz w:val="26"/>
                 <w:szCs w:val="26"/>
               </w:rPr>
-              <w:t xml:space="preserve"> RRN</w:t>
+              <w:t>RRK</w:t>
             </w:r>
           </w:p>
         </w:tc>
@@ -1345,7 +1345,7 @@
                 <w:sz w:val="26"/>
                 <w:szCs w:val="26"/>
               </w:rPr>
-              <w:t>NF[D]</w:t>
+              <w:t>NF (D)</w:t>
             </w:r>
           </w:p>
         </w:tc>
@@ -1675,19 +1675,17 @@
               <w:jc w:val="center"/>
               <w:rPr>
                 <w:rFonts w:ascii="Calibri" w:eastAsia="Calibri" w:hAnsi="Calibri" w:cs="Calibri"/>
-                <w:b/>
-                <w:sz w:val="26"/>
-                <w:szCs w:val="26"/>
-              </w:rPr>
-            </w:pPr>
-            <w:r>
-              <w:rPr>
-                <w:rFonts w:ascii="Calibri" w:eastAsia="Calibri" w:hAnsi="Calibri" w:cs="Calibri"/>
-                <w:b/>
-                <w:sz w:val="26"/>
-                <w:szCs w:val="26"/>
-              </w:rPr>
-              <w:t>NA</w:t>
+                <w:sz w:val="26"/>
+                <w:szCs w:val="26"/>
+              </w:rPr>
+            </w:pPr>
+            <w:r>
+              <w:rPr>
+                <w:rFonts w:ascii="Calibri" w:eastAsia="Calibri" w:hAnsi="Calibri" w:cs="Calibri"/>
+                <w:sz w:val="26"/>
+                <w:szCs w:val="26"/>
+              </w:rPr>
+              <w:t>GVHL 169</w:t>
             </w:r>
           </w:p>
         </w:tc>
@@ -1712,19 +1710,17 @@
               <w:jc w:val="center"/>
               <w:rPr>
                 <w:rFonts w:ascii="Calibri" w:eastAsia="Calibri" w:hAnsi="Calibri" w:cs="Calibri"/>
-                <w:b/>
-                <w:sz w:val="26"/>
-                <w:szCs w:val="26"/>
-              </w:rPr>
-            </w:pPr>
-            <w:r>
-              <w:rPr>
-                <w:rFonts w:ascii="Calibri" w:eastAsia="Calibri" w:hAnsi="Calibri" w:cs="Calibri"/>
-                <w:b/>
-                <w:sz w:val="26"/>
-                <w:szCs w:val="26"/>
-              </w:rPr>
-              <w:t>NA</w:t>
+                <w:sz w:val="26"/>
+                <w:szCs w:val="26"/>
+              </w:rPr>
+            </w:pPr>
+            <w:r>
+              <w:rPr>
+                <w:rFonts w:ascii="Calibri" w:eastAsia="Calibri" w:hAnsi="Calibri" w:cs="Calibri"/>
+                <w:sz w:val="26"/>
+                <w:szCs w:val="26"/>
+              </w:rPr>
+              <w:t>RRL</w:t>
             </w:r>
           </w:p>
         </w:tc>
@@ -1767,7 +1763,7 @@
                 <w:sz w:val="26"/>
                 <w:szCs w:val="26"/>
               </w:rPr>
-              <w:t>0</w:t>
+              <w:t>6</w:t>
             </w:r>
           </w:p>
         </w:tc>
@@ -2263,7 +2259,7 @@
                 <w:sz w:val="26"/>
                 <w:szCs w:val="26"/>
               </w:rPr>
-              <w:t>RRL</w:t>
+              <w:t>RRN</w:t>
             </w:r>
           </w:p>
         </w:tc>
@@ -3064,7 +3060,7 @@
                 <w:sz w:val="26"/>
                 <w:szCs w:val="26"/>
               </w:rPr>
-              <w:t>ADM 9</w:t>
+              <w:t>NA</w:t>
             </w:r>
           </w:p>
         </w:tc>
@@ -3533,7 +3529,7 @@
                 <w:sz w:val="26"/>
                 <w:szCs w:val="26"/>
               </w:rPr>
-              <w:t>ADM 9</w:t>
+              <w:t>NA</w:t>
             </w:r>
           </w:p>
         </w:tc>
@@ -3994,7 +3990,7 @@
                 <w:sz w:val="26"/>
                 <w:szCs w:val="26"/>
               </w:rPr>
-              <w:t>DSF</w:t>
+              <w:t>NA</w:t>
             </w:r>
           </w:p>
         </w:tc>
@@ -4503,7 +4499,7 @@
                 <w:sz w:val="26"/>
                 <w:szCs w:val="26"/>
               </w:rPr>
-              <w:t>B193</w:t>
+              <w:t>SSAK</w:t>
             </w:r>
           </w:p>
         </w:tc>
@@ -4958,7 +4954,7 @@
                 <w:sz w:val="26"/>
                 <w:szCs w:val="26"/>
               </w:rPr>
-              <w:t>GRV</w:t>
+              <w:t>SUDA</w:t>
             </w:r>
           </w:p>
         </w:tc>
@@ -5192,7 +5188,7 @@
                 <w:sz w:val="26"/>
                 <w:szCs w:val="26"/>
               </w:rPr>
-              <w:t>NA</w:t>
+              <w:t>SMRT</w:t>
             </w:r>
           </w:p>
         </w:tc>
@@ -5474,7 +5470,7 @@
                 <w:sz w:val="26"/>
                 <w:szCs w:val="26"/>
               </w:rPr>
-              <w:t>SLQ</w:t>
+              <w:t>SRAT</w:t>
             </w:r>
           </w:p>
         </w:tc>
@@ -5701,7 +5697,7 @@
                 <w:sz w:val="26"/>
                 <w:szCs w:val="26"/>
               </w:rPr>
-              <w:t>SHQ</w:t>
+              <w:t>SCHAL</w:t>
             </w:r>
           </w:p>
         </w:tc>
@@ -5928,7 +5924,7 @@
                 <w:sz w:val="26"/>
                 <w:szCs w:val="26"/>
               </w:rPr>
-              <w:t>ICW</w:t>
+              <w:t>AD11</w:t>
             </w:r>
           </w:p>
         </w:tc>
@@ -6155,15 +6151,7 @@
                 <w:sz w:val="26"/>
                 <w:szCs w:val="26"/>
               </w:rPr>
-              <w:t>VKDN1</w:t>
-            </w:r>
-            <w:r>
-              <w:rPr>
-                <w:rFonts w:ascii="Calibri" w:eastAsia="Calibri" w:hAnsi="Calibri" w:cs="Calibri"/>
-                <w:sz w:val="26"/>
-                <w:szCs w:val="26"/>
-              </w:rPr>
-              <w:t>[B/L]</w:t>
+              <w:t>AS2</w:t>
             </w:r>
           </w:p>
         </w:tc>
@@ -6390,7 +6378,7 @@
                 <w:sz w:val="26"/>
                 <w:szCs w:val="26"/>
               </w:rPr>
-              <w:t>JYOTI</w:t>
+              <w:t>DVDR</w:t>
             </w:r>
           </w:p>
         </w:tc>
@@ -6617,7 +6605,7 @@
                 <w:sz w:val="26"/>
                 <w:szCs w:val="26"/>
               </w:rPr>
-              <w:t>MNW/NQO</w:t>
+              <w:t>FDIX</w:t>
             </w:r>
           </w:p>
         </w:tc>
@@ -6744,21 +6732,14 @@
                 <w:rFonts w:ascii="Calibri" w:eastAsia="Calibri" w:hAnsi="Calibri" w:cs="Calibri"/>
                 <w:sz w:val="24"/>
               </w:rPr>
-              <w:t>SCHLR</w:t>
+              <w:t>VKDN2</w:t>
             </w:r>
             <w:r>
               <w:rPr>
                 <w:rFonts w:ascii="Calibri" w:eastAsia="Calibri" w:hAnsi="Calibri" w:cs="Calibri"/>
                 <w:sz w:val="24"/>
               </w:rPr>
-              <w:t>,CHITRA,FD9,DVDR,</w:t>
-            </w:r>
-            <w:r>
-              <w:rPr>
-                <w:rFonts w:ascii="Calibri" w:eastAsia="Calibri" w:hAnsi="Calibri" w:cs="Calibri"/>
-                <w:sz w:val="24"/>
-              </w:rPr>
-              <w:t>VKDN2</w:t>
+              <w:t>, DISC-1,DEFOS.</w:t>
             </w:r>
           </w:p>
         </w:tc>
@@ -7417,7 +7398,7 @@
                 <w:sz w:val="26"/>
                 <w:szCs w:val="26"/>
               </w:rPr>
-              <w:t>NA</w:t>
+              <w:t>TCPP CC+PROD</w:t>
             </w:r>
           </w:p>
         </w:tc>
@@ -7647,7 +7628,7 @@
                 <w:sz w:val="26"/>
                 <w:szCs w:val="26"/>
               </w:rPr>
-              <w:t>NA</w:t>
+              <w:t>CHRU</w:t>
             </w:r>
           </w:p>
         </w:tc>
@@ -7878,7 +7859,7 @@
                 <w:sz w:val="26"/>
                 <w:szCs w:val="26"/>
               </w:rPr>
-              <w:t>NA</w:t>
+              <w:t>SJOT</w:t>
             </w:r>
             <w:bookmarkStart w:id="0" w:name="_GoBack"/>
             <w:bookmarkEnd w:id="0"/>
@@ -8105,14 +8086,6 @@
                 <w:szCs w:val="26"/>
               </w:rPr>
             </w:pPr>
-            <w:r>
-              <w:rPr>
-                <w:rFonts w:ascii="Calibri" w:eastAsia="Calibri" w:hAnsi="Calibri" w:cs="Calibri"/>
-                <w:sz w:val="26"/>
-                <w:szCs w:val="26"/>
-              </w:rPr>
-              <w:t>J STAR</w:t>
-            </w:r>
           </w:p>
         </w:tc>
         <w:tc>
@@ -8407,10 +8380,10 @@
     </w:pPr>
     <w:r>
       <w:object w:dxaOrig="1188" w:dyaOrig="900">
-        <v:rect id="_x0000_i1025" style="width:54.75pt;height:39.55pt" o:ole="" o:preferrelative="t" stroked="f">
+        <v:rect id="_x0000_i1025" style="width:54.75pt;height:39pt" o:ole="" o:preferrelative="t" stroked="f">
           <v:imagedata r:id="rId1" o:title=""/>
         </v:rect>
-        <o:OLEObject Type="Embed" ProgID="StaticMetafile" ShapeID="_x0000_i1025" DrawAspect="Content" ObjectID="_1849957218" r:id="rId2"/>
+        <o:OLEObject Type="Embed" ProgID="StaticMetafile" ShapeID="_x0000_i1025" DrawAspect="Content" ObjectID="_1850046296" r:id="rId2"/>
       </w:object>
     </w:r>
     <w:r>
@@ -8434,7 +8407,7 @@
         <w:sz w:val="26"/>
         <w:szCs w:val="26"/>
       </w:rPr>
-      <w:t>ELICOPTER FLYING SCHEDULE FOR 04</w:t>
+      <w:t>ELICOPTER FLYING SCHEDULE FOR 05</w:t>
     </w:r>
     <w:r>
       <w:rPr>
@@ -8454,7 +8427,7 @@
         <w:sz w:val="26"/>
         <w:szCs w:val="26"/>
       </w:rPr>
-      <w:t>FRI</w:t>
+      <w:t>SATUR</w:t>
     </w:r>
     <w:r>
       <w:rPr>

</xml_diff>

<commit_message>
Sync - 2026-09-05 17:54
</commit_message>
<xml_diff>
--- a/files/Daily_Helicopter_Schedule.docx
+++ b/files/Daily_Helicopter_Schedule.docx
@@ -629,7 +629,7 @@
                 <w:sz w:val="26"/>
                 <w:szCs w:val="26"/>
               </w:rPr>
-              <w:t>GVHL 412</w:t>
+              <w:t>NA</w:t>
             </w:r>
           </w:p>
         </w:tc>
@@ -664,7 +664,7 @@
                 <w:sz w:val="26"/>
                 <w:szCs w:val="26"/>
               </w:rPr>
-              <w:t>GVT</w:t>
+              <w:t>NA</w:t>
             </w:r>
           </w:p>
         </w:tc>
@@ -699,7 +699,15 @@
                 <w:sz w:val="26"/>
                 <w:szCs w:val="26"/>
               </w:rPr>
-              <w:t>08</w:t>
+              <w:t>0</w:t>
+            </w:r>
+            <w:r>
+              <w:rPr>
+                <w:rFonts w:ascii="Calibri" w:eastAsia="Calibri" w:hAnsi="Calibri" w:cs="Calibri"/>
+                <w:sz w:val="26"/>
+                <w:szCs w:val="26"/>
+              </w:rPr>
+              <w:t>0</w:t>
             </w:r>
           </w:p>
         </w:tc>
@@ -914,7 +922,7 @@
                 <w:sz w:val="26"/>
                 <w:szCs w:val="26"/>
               </w:rPr>
-              <w:t>RRO</w:t>
+              <w:t>RRK</w:t>
             </w:r>
           </w:p>
         </w:tc>
@@ -1164,7 +1172,7 @@
                 <w:sz w:val="26"/>
                 <w:szCs w:val="26"/>
               </w:rPr>
-              <w:t>RRK</w:t>
+              <w:t>RRL</w:t>
             </w:r>
           </w:p>
         </w:tc>
@@ -1458,7 +1466,7 @@
       </w:tr>
       <w:tr>
         <w:trPr>
-          <w:trHeight w:val="359"/>
+          <w:trHeight w:val="208"/>
         </w:trPr>
         <w:tc>
           <w:tcPr>
@@ -1682,10 +1690,11 @@
             <w:r>
               <w:rPr>
                 <w:rFonts w:ascii="Calibri" w:eastAsia="Calibri" w:hAnsi="Calibri" w:cs="Calibri"/>
-                <w:sz w:val="26"/>
-                <w:szCs w:val="26"/>
-              </w:rPr>
-              <w:t>GVHL 169</w:t>
+                <w:b/>
+                <w:sz w:val="26"/>
+                <w:szCs w:val="26"/>
+              </w:rPr>
+              <w:t>NA</w:t>
             </w:r>
           </w:p>
         </w:tc>
@@ -1717,10 +1726,11 @@
             <w:r>
               <w:rPr>
                 <w:rFonts w:ascii="Calibri" w:eastAsia="Calibri" w:hAnsi="Calibri" w:cs="Calibri"/>
-                <w:sz w:val="26"/>
-                <w:szCs w:val="26"/>
-              </w:rPr>
-              <w:t>RRL</w:t>
+                <w:b/>
+                <w:sz w:val="26"/>
+                <w:szCs w:val="26"/>
+              </w:rPr>
+              <w:t>NA</w:t>
             </w:r>
           </w:p>
         </w:tc>
@@ -1763,7 +1773,7 @@
                 <w:sz w:val="26"/>
                 <w:szCs w:val="26"/>
               </w:rPr>
-              <w:t>6</w:t>
+              <w:t>0</w:t>
             </w:r>
           </w:p>
         </w:tc>
@@ -3060,7 +3070,7 @@
                 <w:sz w:val="26"/>
                 <w:szCs w:val="26"/>
               </w:rPr>
-              <w:t>NA</w:t>
+              <w:t>PANNA</w:t>
             </w:r>
           </w:p>
         </w:tc>
@@ -3299,7 +3309,7 @@
                 <w:sz w:val="26"/>
                 <w:szCs w:val="26"/>
               </w:rPr>
-              <w:t>NA</w:t>
+              <w:t>ABN4</w:t>
             </w:r>
           </w:p>
         </w:tc>
@@ -3529,7 +3539,7 @@
                 <w:sz w:val="26"/>
                 <w:szCs w:val="26"/>
               </w:rPr>
-              <w:t>NA</w:t>
+              <w:t>PANNA</w:t>
             </w:r>
           </w:p>
         </w:tc>
@@ -3760,7 +3770,7 @@
                 <w:sz w:val="26"/>
                 <w:szCs w:val="26"/>
               </w:rPr>
-              <w:t>NA</w:t>
+              <w:t>JTAN</w:t>
             </w:r>
           </w:p>
         </w:tc>
@@ -3990,7 +4000,7 @@
                 <w:sz w:val="26"/>
                 <w:szCs w:val="26"/>
               </w:rPr>
-              <w:t>NA</w:t>
+              <w:t>HERA</w:t>
             </w:r>
           </w:p>
         </w:tc>
@@ -4499,7 +4509,7 @@
                 <w:sz w:val="26"/>
                 <w:szCs w:val="26"/>
               </w:rPr>
-              <w:t>SSAK</w:t>
+              <w:t>SGAV</w:t>
             </w:r>
           </w:p>
         </w:tc>
@@ -4954,7 +4964,7 @@
                 <w:sz w:val="26"/>
                 <w:szCs w:val="26"/>
               </w:rPr>
-              <w:t>SUDA</w:t>
+              <w:t>SMRT B\L</w:t>
             </w:r>
           </w:p>
         </w:tc>
@@ -5185,10 +5195,11 @@
             <w:r>
               <w:rPr>
                 <w:rFonts w:ascii="Calibri" w:eastAsia="Calibri" w:hAnsi="Calibri" w:cs="Calibri"/>
-                <w:sz w:val="26"/>
-                <w:szCs w:val="26"/>
-              </w:rPr>
-              <w:t>SMRT</w:t>
+                <w:b/>
+                <w:sz w:val="26"/>
+                <w:szCs w:val="26"/>
+              </w:rPr>
+              <w:t>NA</w:t>
             </w:r>
           </w:p>
         </w:tc>
@@ -5470,7 +5481,7 @@
                 <w:sz w:val="26"/>
                 <w:szCs w:val="26"/>
               </w:rPr>
-              <w:t>SRAT</w:t>
+              <w:t>DEFOS</w:t>
             </w:r>
           </w:p>
         </w:tc>
@@ -5526,6 +5537,8 @@
                 <w:szCs w:val="26"/>
               </w:rPr>
             </w:pPr>
+            <w:bookmarkStart w:id="0" w:name="_GoBack"/>
+            <w:bookmarkEnd w:id="0"/>
           </w:p>
         </w:tc>
         <w:tc>
@@ -5697,7 +5710,7 @@
                 <w:sz w:val="26"/>
                 <w:szCs w:val="26"/>
               </w:rPr>
-              <w:t>SCHAL</w:t>
+              <w:t>CHTR</w:t>
             </w:r>
           </w:p>
         </w:tc>
@@ -5924,7 +5937,7 @@
                 <w:sz w:val="26"/>
                 <w:szCs w:val="26"/>
               </w:rPr>
-              <w:t>AD11</w:t>
+              <w:t>DISC-1</w:t>
             </w:r>
           </w:p>
         </w:tc>
@@ -6151,7 +6164,7 @@
                 <w:sz w:val="26"/>
                 <w:szCs w:val="26"/>
               </w:rPr>
-              <w:t>AS2</w:t>
+              <w:t>AS1</w:t>
             </w:r>
           </w:p>
         </w:tc>
@@ -6378,7 +6391,7 @@
                 <w:sz w:val="26"/>
                 <w:szCs w:val="26"/>
               </w:rPr>
-              <w:t>DVDR</w:t>
+              <w:t>VND2</w:t>
             </w:r>
           </w:p>
         </w:tc>
@@ -6605,7 +6618,7 @@
                 <w:sz w:val="26"/>
                 <w:szCs w:val="26"/>
               </w:rPr>
-              <w:t>FDIX</w:t>
+              <w:t>TRI2</w:t>
             </w:r>
           </w:p>
         </w:tc>
@@ -6732,14 +6745,14 @@
                 <w:rFonts w:ascii="Calibri" w:eastAsia="Calibri" w:hAnsi="Calibri" w:cs="Calibri"/>
                 <w:sz w:val="24"/>
               </w:rPr>
-              <w:t>VKDN2</w:t>
+              <w:t>AD10, ABN8</w:t>
             </w:r>
             <w:r>
               <w:rPr>
                 <w:rFonts w:ascii="Calibri" w:eastAsia="Calibri" w:hAnsi="Calibri" w:cs="Calibri"/>
                 <w:sz w:val="24"/>
               </w:rPr>
-              <w:t>, DISC-1,DEFOS.</w:t>
+              <w:t>.</w:t>
             </w:r>
           </w:p>
         </w:tc>
@@ -7398,7 +7411,7 @@
                 <w:sz w:val="26"/>
                 <w:szCs w:val="26"/>
               </w:rPr>
-              <w:t>TCPP CC+PROD</w:t>
+              <w:t>SJOT</w:t>
             </w:r>
           </w:p>
         </w:tc>
@@ -7628,7 +7641,7 @@
                 <w:sz w:val="26"/>
                 <w:szCs w:val="26"/>
               </w:rPr>
-              <w:t>CHRU</w:t>
+              <w:t>TCPP CC+PROD</w:t>
             </w:r>
           </w:p>
         </w:tc>
@@ -7859,10 +7872,8 @@
                 <w:sz w:val="26"/>
                 <w:szCs w:val="26"/>
               </w:rPr>
-              <w:t>SJOT</w:t>
-            </w:r>
-            <w:bookmarkStart w:id="0" w:name="_GoBack"/>
-            <w:bookmarkEnd w:id="0"/>
+              <w:t>CHRU</w:t>
+            </w:r>
           </w:p>
         </w:tc>
         <w:tc>
@@ -8310,7 +8321,12 @@
       </w:pPr>
     </w:p>
     <w:sectPr>
-      <w:headerReference w:type="default" r:id="rId6"/>
+      <w:headerReference w:type="even" r:id="rId6"/>
+      <w:headerReference w:type="default" r:id="rId7"/>
+      <w:footerReference w:type="even" r:id="rId8"/>
+      <w:footerReference w:type="default" r:id="rId9"/>
+      <w:headerReference w:type="first" r:id="rId10"/>
+      <w:footerReference w:type="first" r:id="rId11"/>
       <w:pgSz w:w="11906" w:h="16838"/>
       <w:pgMar w:top="568" w:right="1440" w:bottom="1134" w:left="1276" w:header="708" w:footer="708" w:gutter="0"/>
       <w:cols w:space="708"/>
@@ -8345,6 +8361,36 @@
 </w:endnotes>
 </file>
 
+<file path=word/footer1.xml><?xml version="1.0" encoding="utf-8"?>
+<w:ftr xmlns:wpc="http://schemas.microsoft.com/office/word/2010/wordprocessingCanvas" xmlns:mc="http://schemas.openxmlformats.org/markup-compatibility/2006" xmlns:o="urn:schemas-microsoft-com:office:office" xmlns:r="http://schemas.openxmlformats.org/officeDocument/2006/relationships" xmlns:m="http://schemas.openxmlformats.org/officeDocument/2006/math" xmlns:v="urn:schemas-microsoft-com:vml" xmlns:wp14="http://schemas.microsoft.com/office/word/2010/wordprocessingDrawing" xmlns:wp="http://schemas.openxmlformats.org/drawingml/2006/wordprocessingDrawing" xmlns:w10="urn:schemas-microsoft-com:office:word" xmlns:w="http://schemas.openxmlformats.org/wordprocessingml/2006/main" xmlns:w14="http://schemas.microsoft.com/office/word/2010/wordml" xmlns:w15="http://schemas.microsoft.com/office/word/2012/wordml" xmlns:wpg="http://schemas.microsoft.com/office/word/2010/wordprocessingGroup" xmlns:wpi="http://schemas.microsoft.com/office/word/2010/wordprocessingInk" xmlns:wne="http://schemas.microsoft.com/office/word/2006/wordml" xmlns:wps="http://schemas.microsoft.com/office/word/2010/wordprocessingShape" mc:Ignorable="w14 w15 wp14">
+  <w:p>
+    <w:pPr>
+      <w:pStyle w:val="Footer"/>
+    </w:pPr>
+  </w:p>
+</w:ftr>
+</file>
+
+<file path=word/footer2.xml><?xml version="1.0" encoding="utf-8"?>
+<w:ftr xmlns:wpc="http://schemas.microsoft.com/office/word/2010/wordprocessingCanvas" xmlns:mc="http://schemas.openxmlformats.org/markup-compatibility/2006" xmlns:o="urn:schemas-microsoft-com:office:office" xmlns:r="http://schemas.openxmlformats.org/officeDocument/2006/relationships" xmlns:m="http://schemas.openxmlformats.org/officeDocument/2006/math" xmlns:v="urn:schemas-microsoft-com:vml" xmlns:wp14="http://schemas.microsoft.com/office/word/2010/wordprocessingDrawing" xmlns:wp="http://schemas.openxmlformats.org/drawingml/2006/wordprocessingDrawing" xmlns:w10="urn:schemas-microsoft-com:office:word" xmlns:w="http://schemas.openxmlformats.org/wordprocessingml/2006/main" xmlns:w14="http://schemas.microsoft.com/office/word/2010/wordml" xmlns:w15="http://schemas.microsoft.com/office/word/2012/wordml" xmlns:wpg="http://schemas.microsoft.com/office/word/2010/wordprocessingGroup" xmlns:wpi="http://schemas.microsoft.com/office/word/2010/wordprocessingInk" xmlns:wne="http://schemas.microsoft.com/office/word/2006/wordml" xmlns:wps="http://schemas.microsoft.com/office/word/2010/wordprocessingShape" mc:Ignorable="w14 w15 wp14">
+  <w:p>
+    <w:pPr>
+      <w:pStyle w:val="Footer"/>
+    </w:pPr>
+  </w:p>
+</w:ftr>
+</file>
+
+<file path=word/footer3.xml><?xml version="1.0" encoding="utf-8"?>
+<w:ftr xmlns:wpc="http://schemas.microsoft.com/office/word/2010/wordprocessingCanvas" xmlns:mc="http://schemas.openxmlformats.org/markup-compatibility/2006" xmlns:o="urn:schemas-microsoft-com:office:office" xmlns:r="http://schemas.openxmlformats.org/officeDocument/2006/relationships" xmlns:m="http://schemas.openxmlformats.org/officeDocument/2006/math" xmlns:v="urn:schemas-microsoft-com:vml" xmlns:wp14="http://schemas.microsoft.com/office/word/2010/wordprocessingDrawing" xmlns:wp="http://schemas.openxmlformats.org/drawingml/2006/wordprocessingDrawing" xmlns:w10="urn:schemas-microsoft-com:office:word" xmlns:w="http://schemas.openxmlformats.org/wordprocessingml/2006/main" xmlns:w14="http://schemas.microsoft.com/office/word/2010/wordml" xmlns:w15="http://schemas.microsoft.com/office/word/2012/wordml" xmlns:wpg="http://schemas.microsoft.com/office/word/2010/wordprocessingGroup" xmlns:wpi="http://schemas.microsoft.com/office/word/2010/wordprocessingInk" xmlns:wne="http://schemas.microsoft.com/office/word/2006/wordml" xmlns:wps="http://schemas.microsoft.com/office/word/2010/wordprocessingShape" mc:Ignorable="w14 w15 wp14">
+  <w:p>
+    <w:pPr>
+      <w:pStyle w:val="Footer"/>
+    </w:pPr>
+  </w:p>
+</w:ftr>
+</file>
+
 <file path=word/footnotes.xml><?xml version="1.0" encoding="utf-8"?>
 <w:footnotes xmlns:wpc="http://schemas.microsoft.com/office/word/2010/wordprocessingCanvas" xmlns:mc="http://schemas.openxmlformats.org/markup-compatibility/2006" xmlns:o="urn:schemas-microsoft-com:office:office" xmlns:r="http://schemas.openxmlformats.org/officeDocument/2006/relationships" xmlns:m="http://schemas.openxmlformats.org/officeDocument/2006/math" xmlns:v="urn:schemas-microsoft-com:vml" xmlns:wp14="http://schemas.microsoft.com/office/word/2010/wordprocessingDrawing" xmlns:wp="http://schemas.openxmlformats.org/drawingml/2006/wordprocessingDrawing" xmlns:w10="urn:schemas-microsoft-com:office:word" xmlns:w="http://schemas.openxmlformats.org/wordprocessingml/2006/main" xmlns:w14="http://schemas.microsoft.com/office/word/2010/wordml" xmlns:w15="http://schemas.microsoft.com/office/word/2012/wordml" xmlns:wpg="http://schemas.microsoft.com/office/word/2010/wordprocessingGroup" xmlns:wpi="http://schemas.microsoft.com/office/word/2010/wordprocessingInk" xmlns:wne="http://schemas.microsoft.com/office/word/2006/wordml" xmlns:wps="http://schemas.microsoft.com/office/word/2010/wordprocessingShape" mc:Ignorable="w14 w15 wp14">
   <w:footnote w:type="separator" w:id="-1">
@@ -8375,6 +8421,16 @@
   <w:p>
     <w:pPr>
       <w:pStyle w:val="Header"/>
+    </w:pPr>
+  </w:p>
+</w:hdr>
+</file>
+
+<file path=word/header2.xml><?xml version="1.0" encoding="utf-8"?>
+<w:hdr xmlns:wpc="http://schemas.microsoft.com/office/word/2010/wordprocessingCanvas" xmlns:mc="http://schemas.openxmlformats.org/markup-compatibility/2006" xmlns:o="urn:schemas-microsoft-com:office:office" xmlns:r="http://schemas.openxmlformats.org/officeDocument/2006/relationships" xmlns:m="http://schemas.openxmlformats.org/officeDocument/2006/math" xmlns:v="urn:schemas-microsoft-com:vml" xmlns:wp14="http://schemas.microsoft.com/office/word/2010/wordprocessingDrawing" xmlns:wp="http://schemas.openxmlformats.org/drawingml/2006/wordprocessingDrawing" xmlns:w10="urn:schemas-microsoft-com:office:word" xmlns:w="http://schemas.openxmlformats.org/wordprocessingml/2006/main" xmlns:w14="http://schemas.microsoft.com/office/word/2010/wordml" xmlns:w15="http://schemas.microsoft.com/office/word/2012/wordml" xmlns:wpg="http://schemas.microsoft.com/office/word/2010/wordprocessingGroup" xmlns:wpi="http://schemas.microsoft.com/office/word/2010/wordprocessingInk" xmlns:wne="http://schemas.microsoft.com/office/word/2006/wordml" xmlns:wps="http://schemas.microsoft.com/office/word/2010/wordprocessingShape" mc:Ignorable="w14 w15 wp14">
+  <w:p>
+    <w:pPr>
+      <w:pStyle w:val="Header"/>
       <w:ind w:left="-851"/>
       <w:jc w:val="center"/>
     </w:pPr>
@@ -8383,7 +8439,7 @@
         <v:rect id="_x0000_i1025" style="width:54.75pt;height:39pt" o:ole="" o:preferrelative="t" stroked="f">
           <v:imagedata r:id="rId1" o:title=""/>
         </v:rect>
-        <o:OLEObject Type="Embed" ProgID="StaticMetafile" ShapeID="_x0000_i1025" DrawAspect="Content" ObjectID="_1850046296" r:id="rId2"/>
+        <o:OLEObject Type="Embed" ProgID="StaticMetafile" ShapeID="_x0000_i1025" DrawAspect="Content" ObjectID="_1850135311" r:id="rId2"/>
       </w:object>
     </w:r>
     <w:r>
@@ -8407,7 +8463,17 @@
         <w:sz w:val="26"/>
         <w:szCs w:val="26"/>
       </w:rPr>
-      <w:t>ELICOPTER FLYING SCHEDULE FOR 05</w:t>
+      <w:t>ELICOPTER FLYING SCHEDULE FOR 0</w:t>
+    </w:r>
+    <w:r>
+      <w:rPr>
+        <w:rFonts w:ascii="Times New Roman" w:hAnsi="Times New Roman" w:cs="Times New Roman"/>
+        <w:b/>
+        <w:color w:val="000000" w:themeColor="text1"/>
+        <w:sz w:val="26"/>
+        <w:szCs w:val="26"/>
+      </w:rPr>
+      <w:t>6</w:t>
     </w:r>
     <w:r>
       <w:rPr>
@@ -8427,7 +8493,7 @@
         <w:sz w:val="26"/>
         <w:szCs w:val="26"/>
       </w:rPr>
-      <w:t>SATUR</w:t>
+      <w:t>SUN</w:t>
     </w:r>
     <w:r>
       <w:rPr>
@@ -8440,6 +8506,16 @@
       <w:t>DAY)</w:t>
     </w:r>
   </w:p>
+  <w:p>
+    <w:pPr>
+      <w:pStyle w:val="Header"/>
+    </w:pPr>
+  </w:p>
+</w:hdr>
+</file>
+
+<file path=word/header3.xml><?xml version="1.0" encoding="utf-8"?>
+<w:hdr xmlns:wpc="http://schemas.microsoft.com/office/word/2010/wordprocessingCanvas" xmlns:mc="http://schemas.openxmlformats.org/markup-compatibility/2006" xmlns:o="urn:schemas-microsoft-com:office:office" xmlns:r="http://schemas.openxmlformats.org/officeDocument/2006/relationships" xmlns:m="http://schemas.openxmlformats.org/officeDocument/2006/math" xmlns:v="urn:schemas-microsoft-com:vml" xmlns:wp14="http://schemas.microsoft.com/office/word/2010/wordprocessingDrawing" xmlns:wp="http://schemas.openxmlformats.org/drawingml/2006/wordprocessingDrawing" xmlns:w10="urn:schemas-microsoft-com:office:word" xmlns:w="http://schemas.openxmlformats.org/wordprocessingml/2006/main" xmlns:w14="http://schemas.microsoft.com/office/word/2010/wordml" xmlns:w15="http://schemas.microsoft.com/office/word/2012/wordml" xmlns:wpg="http://schemas.microsoft.com/office/word/2010/wordprocessingGroup" xmlns:wpi="http://schemas.microsoft.com/office/word/2010/wordprocessingInk" xmlns:wne="http://schemas.microsoft.com/office/word/2006/wordml" xmlns:wps="http://schemas.microsoft.com/office/word/2010/wordprocessingShape" mc:Ignorable="w14 w15 wp14">
   <w:p>
     <w:pPr>
       <w:pStyle w:val="Header"/>

</xml_diff>

<commit_message>
Sync - 2026-09-06 14:57
</commit_message>
<xml_diff>
--- a/files/Daily_Helicopter_Schedule.docx
+++ b/files/Daily_Helicopter_Schedule.docx
@@ -629,7 +629,7 @@
                 <w:sz w:val="26"/>
                 <w:szCs w:val="26"/>
               </w:rPr>
-              <w:t>NA</w:t>
+              <w:t>GVHL 412</w:t>
             </w:r>
           </w:p>
         </w:tc>
@@ -664,7 +664,7 @@
                 <w:sz w:val="26"/>
                 <w:szCs w:val="26"/>
               </w:rPr>
-              <w:t>NA</w:t>
+              <w:t>GVT</w:t>
             </w:r>
           </w:p>
         </w:tc>
@@ -707,7 +707,7 @@
                 <w:sz w:val="26"/>
                 <w:szCs w:val="26"/>
               </w:rPr>
-              <w:t>0</w:t>
+              <w:t>8</w:t>
             </w:r>
           </w:p>
         </w:tc>
@@ -1466,7 +1466,7 @@
       </w:tr>
       <w:tr>
         <w:trPr>
-          <w:trHeight w:val="208"/>
+          <w:trHeight w:val="359"/>
         </w:trPr>
         <w:tc>
           <w:tcPr>
@@ -3070,7 +3070,7 @@
                 <w:sz w:val="26"/>
                 <w:szCs w:val="26"/>
               </w:rPr>
-              <w:t>PANNA</w:t>
+              <w:t>VIR-1</w:t>
             </w:r>
           </w:p>
         </w:tc>
@@ -3306,10 +3306,11 @@
             <w:r>
               <w:rPr>
                 <w:rFonts w:ascii="Calibri" w:eastAsia="Calibri" w:hAnsi="Calibri" w:cs="Calibri"/>
-                <w:sz w:val="26"/>
-                <w:szCs w:val="26"/>
-              </w:rPr>
-              <w:t>ABN4</w:t>
+                <w:b/>
+                <w:sz w:val="26"/>
+                <w:szCs w:val="26"/>
+              </w:rPr>
+              <w:t>NA</w:t>
             </w:r>
           </w:p>
         </w:tc>
@@ -3539,7 +3540,7 @@
                 <w:sz w:val="26"/>
                 <w:szCs w:val="26"/>
               </w:rPr>
-              <w:t>PANNA</w:t>
+              <w:t>VIR-1</w:t>
             </w:r>
           </w:p>
         </w:tc>
@@ -3767,10 +3768,11 @@
             <w:r>
               <w:rPr>
                 <w:rFonts w:ascii="Calibri" w:eastAsia="Calibri" w:hAnsi="Calibri" w:cs="Calibri"/>
-                <w:sz w:val="26"/>
-                <w:szCs w:val="26"/>
-              </w:rPr>
-              <w:t>JTAN</w:t>
+                <w:b/>
+                <w:sz w:val="26"/>
+                <w:szCs w:val="26"/>
+              </w:rPr>
+              <w:t>NA</w:t>
             </w:r>
           </w:p>
         </w:tc>
@@ -4509,7 +4511,7 @@
                 <w:sz w:val="26"/>
                 <w:szCs w:val="26"/>
               </w:rPr>
-              <w:t>SGAV</w:t>
+              <w:t>SSAK</w:t>
             </w:r>
           </w:p>
         </w:tc>
@@ -4964,7 +4966,7 @@
                 <w:sz w:val="26"/>
                 <w:szCs w:val="26"/>
               </w:rPr>
-              <w:t>SMRT B\L</w:t>
+              <w:t>MNW</w:t>
             </w:r>
           </w:p>
         </w:tc>
@@ -5195,11 +5197,10 @@
             <w:r>
               <w:rPr>
                 <w:rFonts w:ascii="Calibri" w:eastAsia="Calibri" w:hAnsi="Calibri" w:cs="Calibri"/>
-                <w:b/>
-                <w:sz w:val="26"/>
-                <w:szCs w:val="26"/>
-              </w:rPr>
-              <w:t>NA</w:t>
+                <w:sz w:val="26"/>
+                <w:szCs w:val="26"/>
+              </w:rPr>
+              <w:t>SUDA</w:t>
             </w:r>
           </w:p>
         </w:tc>
@@ -5287,7 +5288,7 @@
       </w:tr>
       <w:tr>
         <w:trPr>
-          <w:trHeight w:val="359"/>
+          <w:trHeight w:val="260"/>
         </w:trPr>
         <w:tc>
           <w:tcPr>
@@ -5481,7 +5482,7 @@
                 <w:sz w:val="26"/>
                 <w:szCs w:val="26"/>
               </w:rPr>
-              <w:t>DEFOS</w:t>
+              <w:t>SRAT</w:t>
             </w:r>
           </w:p>
         </w:tc>
@@ -5710,7 +5711,7 @@
                 <w:sz w:val="26"/>
                 <w:szCs w:val="26"/>
               </w:rPr>
-              <w:t>CHTR</w:t>
+              <w:t>VND1</w:t>
             </w:r>
           </w:p>
         </w:tc>
@@ -5937,7 +5938,7 @@
                 <w:sz w:val="26"/>
                 <w:szCs w:val="26"/>
               </w:rPr>
-              <w:t>DISC-1</w:t>
+              <w:t>SLQ</w:t>
             </w:r>
           </w:p>
         </w:tc>
@@ -6164,7 +6165,7 @@
                 <w:sz w:val="26"/>
                 <w:szCs w:val="26"/>
               </w:rPr>
-              <w:t>AS1</w:t>
+              <w:t>ABN8</w:t>
             </w:r>
           </w:p>
         </w:tc>
@@ -6391,7 +6392,7 @@
                 <w:sz w:val="26"/>
                 <w:szCs w:val="26"/>
               </w:rPr>
-              <w:t>VND2</w:t>
+              <w:t>ADMR</w:t>
             </w:r>
           </w:p>
         </w:tc>
@@ -6618,7 +6619,7 @@
                 <w:sz w:val="26"/>
                 <w:szCs w:val="26"/>
               </w:rPr>
-              <w:t>TRI2</w:t>
+              <w:t>WIN+NQO</w:t>
             </w:r>
           </w:p>
         </w:tc>
@@ -6745,7 +6746,7 @@
                 <w:rFonts w:ascii="Calibri" w:eastAsia="Calibri" w:hAnsi="Calibri" w:cs="Calibri"/>
                 <w:sz w:val="24"/>
               </w:rPr>
-              <w:t>AD10, ABN8</w:t>
+              <w:t>AS2</w:t>
             </w:r>
             <w:r>
               <w:rPr>
@@ -7405,14 +7406,6 @@
                 <w:szCs w:val="26"/>
               </w:rPr>
             </w:pPr>
-            <w:r>
-              <w:rPr>
-                <w:rFonts w:ascii="Calibri" w:eastAsia="Calibri" w:hAnsi="Calibri" w:cs="Calibri"/>
-                <w:sz w:val="26"/>
-                <w:szCs w:val="26"/>
-              </w:rPr>
-              <w:t>SJOT</w:t>
-            </w:r>
           </w:p>
         </w:tc>
         <w:tc>
@@ -7635,14 +7628,6 @@
                 <w:szCs w:val="26"/>
               </w:rPr>
             </w:pPr>
-            <w:r>
-              <w:rPr>
-                <w:rFonts w:ascii="Calibri" w:eastAsia="Calibri" w:hAnsi="Calibri" w:cs="Calibri"/>
-                <w:sz w:val="26"/>
-                <w:szCs w:val="26"/>
-              </w:rPr>
-              <w:t>TCPP CC+PROD</w:t>
-            </w:r>
           </w:p>
         </w:tc>
         <w:tc>
@@ -7866,14 +7851,6 @@
                 <w:szCs w:val="26"/>
               </w:rPr>
             </w:pPr>
-            <w:r>
-              <w:rPr>
-                <w:rFonts w:ascii="Calibri" w:eastAsia="Calibri" w:hAnsi="Calibri" w:cs="Calibri"/>
-                <w:sz w:val="26"/>
-                <w:szCs w:val="26"/>
-              </w:rPr>
-              <w:t>CHRU</w:t>
-            </w:r>
           </w:p>
         </w:tc>
         <w:tc>
@@ -8321,12 +8298,7 @@
       </w:pPr>
     </w:p>
     <w:sectPr>
-      <w:headerReference w:type="even" r:id="rId6"/>
-      <w:headerReference w:type="default" r:id="rId7"/>
-      <w:footerReference w:type="even" r:id="rId8"/>
-      <w:footerReference w:type="default" r:id="rId9"/>
-      <w:headerReference w:type="first" r:id="rId10"/>
-      <w:footerReference w:type="first" r:id="rId11"/>
+      <w:headerReference w:type="default" r:id="rId6"/>
       <w:pgSz w:w="11906" w:h="16838"/>
       <w:pgMar w:top="568" w:right="1440" w:bottom="1134" w:left="1276" w:header="708" w:footer="708" w:gutter="0"/>
       <w:cols w:space="708"/>
@@ -8361,36 +8333,6 @@
 </w:endnotes>
 </file>
 
-<file path=word/footer1.xml><?xml version="1.0" encoding="utf-8"?>
-<w:ftr xmlns:wpc="http://schemas.microsoft.com/office/word/2010/wordprocessingCanvas" xmlns:mc="http://schemas.openxmlformats.org/markup-compatibility/2006" xmlns:o="urn:schemas-microsoft-com:office:office" xmlns:r="http://schemas.openxmlformats.org/officeDocument/2006/relationships" xmlns:m="http://schemas.openxmlformats.org/officeDocument/2006/math" xmlns:v="urn:schemas-microsoft-com:vml" xmlns:wp14="http://schemas.microsoft.com/office/word/2010/wordprocessingDrawing" xmlns:wp="http://schemas.openxmlformats.org/drawingml/2006/wordprocessingDrawing" xmlns:w10="urn:schemas-microsoft-com:office:word" xmlns:w="http://schemas.openxmlformats.org/wordprocessingml/2006/main" xmlns:w14="http://schemas.microsoft.com/office/word/2010/wordml" xmlns:w15="http://schemas.microsoft.com/office/word/2012/wordml" xmlns:wpg="http://schemas.microsoft.com/office/word/2010/wordprocessingGroup" xmlns:wpi="http://schemas.microsoft.com/office/word/2010/wordprocessingInk" xmlns:wne="http://schemas.microsoft.com/office/word/2006/wordml" xmlns:wps="http://schemas.microsoft.com/office/word/2010/wordprocessingShape" mc:Ignorable="w14 w15 wp14">
-  <w:p>
-    <w:pPr>
-      <w:pStyle w:val="Footer"/>
-    </w:pPr>
-  </w:p>
-</w:ftr>
-</file>
-
-<file path=word/footer2.xml><?xml version="1.0" encoding="utf-8"?>
-<w:ftr xmlns:wpc="http://schemas.microsoft.com/office/word/2010/wordprocessingCanvas" xmlns:mc="http://schemas.openxmlformats.org/markup-compatibility/2006" xmlns:o="urn:schemas-microsoft-com:office:office" xmlns:r="http://schemas.openxmlformats.org/officeDocument/2006/relationships" xmlns:m="http://schemas.openxmlformats.org/officeDocument/2006/math" xmlns:v="urn:schemas-microsoft-com:vml" xmlns:wp14="http://schemas.microsoft.com/office/word/2010/wordprocessingDrawing" xmlns:wp="http://schemas.openxmlformats.org/drawingml/2006/wordprocessingDrawing" xmlns:w10="urn:schemas-microsoft-com:office:word" xmlns:w="http://schemas.openxmlformats.org/wordprocessingml/2006/main" xmlns:w14="http://schemas.microsoft.com/office/word/2010/wordml" xmlns:w15="http://schemas.microsoft.com/office/word/2012/wordml" xmlns:wpg="http://schemas.microsoft.com/office/word/2010/wordprocessingGroup" xmlns:wpi="http://schemas.microsoft.com/office/word/2010/wordprocessingInk" xmlns:wne="http://schemas.microsoft.com/office/word/2006/wordml" xmlns:wps="http://schemas.microsoft.com/office/word/2010/wordprocessingShape" mc:Ignorable="w14 w15 wp14">
-  <w:p>
-    <w:pPr>
-      <w:pStyle w:val="Footer"/>
-    </w:pPr>
-  </w:p>
-</w:ftr>
-</file>
-
-<file path=word/footer3.xml><?xml version="1.0" encoding="utf-8"?>
-<w:ftr xmlns:wpc="http://schemas.microsoft.com/office/word/2010/wordprocessingCanvas" xmlns:mc="http://schemas.openxmlformats.org/markup-compatibility/2006" xmlns:o="urn:schemas-microsoft-com:office:office" xmlns:r="http://schemas.openxmlformats.org/officeDocument/2006/relationships" xmlns:m="http://schemas.openxmlformats.org/officeDocument/2006/math" xmlns:v="urn:schemas-microsoft-com:vml" xmlns:wp14="http://schemas.microsoft.com/office/word/2010/wordprocessingDrawing" xmlns:wp="http://schemas.openxmlformats.org/drawingml/2006/wordprocessingDrawing" xmlns:w10="urn:schemas-microsoft-com:office:word" xmlns:w="http://schemas.openxmlformats.org/wordprocessingml/2006/main" xmlns:w14="http://schemas.microsoft.com/office/word/2010/wordml" xmlns:w15="http://schemas.microsoft.com/office/word/2012/wordml" xmlns:wpg="http://schemas.microsoft.com/office/word/2010/wordprocessingGroup" xmlns:wpi="http://schemas.microsoft.com/office/word/2010/wordprocessingInk" xmlns:wne="http://schemas.microsoft.com/office/word/2006/wordml" xmlns:wps="http://schemas.microsoft.com/office/word/2010/wordprocessingShape" mc:Ignorable="w14 w15 wp14">
-  <w:p>
-    <w:pPr>
-      <w:pStyle w:val="Footer"/>
-    </w:pPr>
-  </w:p>
-</w:ftr>
-</file>
-
 <file path=word/footnotes.xml><?xml version="1.0" encoding="utf-8"?>
 <w:footnotes xmlns:wpc="http://schemas.microsoft.com/office/word/2010/wordprocessingCanvas" xmlns:mc="http://schemas.openxmlformats.org/markup-compatibility/2006" xmlns:o="urn:schemas-microsoft-com:office:office" xmlns:r="http://schemas.openxmlformats.org/officeDocument/2006/relationships" xmlns:m="http://schemas.openxmlformats.org/officeDocument/2006/math" xmlns:v="urn:schemas-microsoft-com:vml" xmlns:wp14="http://schemas.microsoft.com/office/word/2010/wordprocessingDrawing" xmlns:wp="http://schemas.openxmlformats.org/drawingml/2006/wordprocessingDrawing" xmlns:w10="urn:schemas-microsoft-com:office:word" xmlns:w="http://schemas.openxmlformats.org/wordprocessingml/2006/main" xmlns:w14="http://schemas.microsoft.com/office/word/2010/wordml" xmlns:w15="http://schemas.microsoft.com/office/word/2012/wordml" xmlns:wpg="http://schemas.microsoft.com/office/word/2010/wordprocessingGroup" xmlns:wpi="http://schemas.microsoft.com/office/word/2010/wordprocessingInk" xmlns:wne="http://schemas.microsoft.com/office/word/2006/wordml" xmlns:wps="http://schemas.microsoft.com/office/word/2010/wordprocessingShape" mc:Ignorable="w14 w15 wp14">
   <w:footnote w:type="separator" w:id="-1">
@@ -8421,16 +8363,6 @@
   <w:p>
     <w:pPr>
       <w:pStyle w:val="Header"/>
-    </w:pPr>
-  </w:p>
-</w:hdr>
-</file>
-
-<file path=word/header2.xml><?xml version="1.0" encoding="utf-8"?>
-<w:hdr xmlns:wpc="http://schemas.microsoft.com/office/word/2010/wordprocessingCanvas" xmlns:mc="http://schemas.openxmlformats.org/markup-compatibility/2006" xmlns:o="urn:schemas-microsoft-com:office:office" xmlns:r="http://schemas.openxmlformats.org/officeDocument/2006/relationships" xmlns:m="http://schemas.openxmlformats.org/officeDocument/2006/math" xmlns:v="urn:schemas-microsoft-com:vml" xmlns:wp14="http://schemas.microsoft.com/office/word/2010/wordprocessingDrawing" xmlns:wp="http://schemas.openxmlformats.org/drawingml/2006/wordprocessingDrawing" xmlns:w10="urn:schemas-microsoft-com:office:word" xmlns:w="http://schemas.openxmlformats.org/wordprocessingml/2006/main" xmlns:w14="http://schemas.microsoft.com/office/word/2010/wordml" xmlns:w15="http://schemas.microsoft.com/office/word/2012/wordml" xmlns:wpg="http://schemas.microsoft.com/office/word/2010/wordprocessingGroup" xmlns:wpi="http://schemas.microsoft.com/office/word/2010/wordprocessingInk" xmlns:wne="http://schemas.microsoft.com/office/word/2006/wordml" xmlns:wps="http://schemas.microsoft.com/office/word/2010/wordprocessingShape" mc:Ignorable="w14 w15 wp14">
-  <w:p>
-    <w:pPr>
-      <w:pStyle w:val="Header"/>
       <w:ind w:left="-851"/>
       <w:jc w:val="center"/>
     </w:pPr>
@@ -8439,7 +8371,7 @@
         <v:rect id="_x0000_i1025" style="width:54.75pt;height:39pt" o:ole="" o:preferrelative="t" stroked="f">
           <v:imagedata r:id="rId1" o:title=""/>
         </v:rect>
-        <o:OLEObject Type="Embed" ProgID="StaticMetafile" ShapeID="_x0000_i1025" DrawAspect="Content" ObjectID="_1850135311" r:id="rId2"/>
+        <o:OLEObject Type="Embed" ProgID="StaticMetafile" ShapeID="_x0000_i1025" DrawAspect="Content" ObjectID="_1850135329" r:id="rId2"/>
       </w:object>
     </w:r>
     <w:r>
@@ -8473,7 +8405,7 @@
         <w:sz w:val="26"/>
         <w:szCs w:val="26"/>
       </w:rPr>
-      <w:t>6</w:t>
+      <w:t>7</w:t>
     </w:r>
     <w:r>
       <w:rPr>
@@ -8493,7 +8425,7 @@
         <w:sz w:val="26"/>
         <w:szCs w:val="26"/>
       </w:rPr>
-      <w:t>SUN</w:t>
+      <w:t>MON</w:t>
     </w:r>
     <w:r>
       <w:rPr>
@@ -8506,16 +8438,6 @@
       <w:t>DAY)</w:t>
     </w:r>
   </w:p>
-  <w:p>
-    <w:pPr>
-      <w:pStyle w:val="Header"/>
-    </w:pPr>
-  </w:p>
-</w:hdr>
-</file>
-
-<file path=word/header3.xml><?xml version="1.0" encoding="utf-8"?>
-<w:hdr xmlns:wpc="http://schemas.microsoft.com/office/word/2010/wordprocessingCanvas" xmlns:mc="http://schemas.openxmlformats.org/markup-compatibility/2006" xmlns:o="urn:schemas-microsoft-com:office:office" xmlns:r="http://schemas.openxmlformats.org/officeDocument/2006/relationships" xmlns:m="http://schemas.openxmlformats.org/officeDocument/2006/math" xmlns:v="urn:schemas-microsoft-com:vml" xmlns:wp14="http://schemas.microsoft.com/office/word/2010/wordprocessingDrawing" xmlns:wp="http://schemas.openxmlformats.org/drawingml/2006/wordprocessingDrawing" xmlns:w10="urn:schemas-microsoft-com:office:word" xmlns:w="http://schemas.openxmlformats.org/wordprocessingml/2006/main" xmlns:w14="http://schemas.microsoft.com/office/word/2010/wordml" xmlns:w15="http://schemas.microsoft.com/office/word/2012/wordml" xmlns:wpg="http://schemas.microsoft.com/office/word/2010/wordprocessingGroup" xmlns:wpi="http://schemas.microsoft.com/office/word/2010/wordprocessingInk" xmlns:wne="http://schemas.microsoft.com/office/word/2006/wordml" xmlns:wps="http://schemas.microsoft.com/office/word/2010/wordprocessingShape" mc:Ignorable="w14 w15 wp14">
   <w:p>
     <w:pPr>
       <w:pStyle w:val="Header"/>

</xml_diff>

<commit_message>
Sync - 2026-09-06 15:27
</commit_message>
<xml_diff>
--- a/files/Daily_Helicopter_Schedule.docx
+++ b/files/Daily_Helicopter_Schedule.docx
@@ -3988,21 +3988,25 @@
           </w:tcPr>
           <w:p>
             <w:pPr>
-              <w:spacing w:after="0" w:line="240" w:lineRule="auto"/>
-              <w:jc w:val="center"/>
-              <w:rPr>
-                <w:rFonts w:ascii="Calibri" w:eastAsia="Calibri" w:hAnsi="Calibri" w:cs="Calibri"/>
-                <w:sz w:val="26"/>
-                <w:szCs w:val="26"/>
-              </w:rPr>
-            </w:pPr>
-            <w:r>
-              <w:rPr>
-                <w:rFonts w:ascii="Calibri" w:eastAsia="Calibri" w:hAnsi="Calibri" w:cs="Calibri"/>
-                <w:sz w:val="26"/>
-                <w:szCs w:val="26"/>
-              </w:rPr>
-              <w:t>HERA</w:t>
+              <w:tabs>
+                <w:tab w:val="left" w:pos="810"/>
+                <w:tab w:val="center" w:pos="1135"/>
+              </w:tabs>
+              <w:spacing w:after="0" w:line="240" w:lineRule="auto"/>
+              <w:jc w:val="center"/>
+              <w:rPr>
+                <w:rFonts w:ascii="Calibri" w:eastAsia="Calibri" w:hAnsi="Calibri" w:cs="Calibri"/>
+                <w:sz w:val="26"/>
+                <w:szCs w:val="26"/>
+              </w:rPr>
+            </w:pPr>
+            <w:r>
+              <w:rPr>
+                <w:rFonts w:ascii="Calibri" w:eastAsia="Calibri" w:hAnsi="Calibri" w:cs="Calibri"/>
+                <w:sz w:val="26"/>
+                <w:szCs w:val="26"/>
+              </w:rPr>
+              <w:t>ADM9</w:t>
             </w:r>
           </w:p>
         </w:tc>
@@ -5538,8 +5542,6 @@
                 <w:szCs w:val="26"/>
               </w:rPr>
             </w:pPr>
-            <w:bookmarkStart w:id="0" w:name="_GoBack"/>
-            <w:bookmarkEnd w:id="0"/>
           </w:p>
         </w:tc>
         <w:tc>
@@ -6392,7 +6394,17 @@
                 <w:sz w:val="26"/>
                 <w:szCs w:val="26"/>
               </w:rPr>
-              <w:t>ADMR</w:t>
+              <w:t>ADM</w:t>
+            </w:r>
+            <w:bookmarkStart w:id="0" w:name="_GoBack"/>
+            <w:bookmarkEnd w:id="0"/>
+            <w:r>
+              <w:rPr>
+                <w:rFonts w:ascii="Calibri" w:eastAsia="Calibri" w:hAnsi="Calibri" w:cs="Calibri"/>
+                <w:sz w:val="26"/>
+                <w:szCs w:val="26"/>
+              </w:rPr>
+              <w:t>10</w:t>
             </w:r>
           </w:p>
         </w:tc>
@@ -8371,7 +8383,7 @@
         <v:rect id="_x0000_i1025" style="width:54.75pt;height:39pt" o:ole="" o:preferrelative="t" stroked="f">
           <v:imagedata r:id="rId1" o:title=""/>
         </v:rect>
-        <o:OLEObject Type="Embed" ProgID="StaticMetafile" ShapeID="_x0000_i1025" DrawAspect="Content" ObjectID="_1850135329" r:id="rId2"/>
+        <o:OLEObject Type="Embed" ProgID="StaticMetafile" ShapeID="_x0000_i1025" DrawAspect="Content" ObjectID="_1850212610" r:id="rId2"/>
       </w:object>
     </w:r>
     <w:r>

</xml_diff>

<commit_message>
Sync - 2026-09-07 16:01
</commit_message>
<xml_diff>
--- a/files/Daily_Helicopter_Schedule.docx
+++ b/files/Daily_Helicopter_Schedule.docx
@@ -3070,7 +3070,7 @@
                 <w:sz w:val="26"/>
                 <w:szCs w:val="26"/>
               </w:rPr>
-              <w:t>VIR-1</w:t>
+              <w:t>KSPR</w:t>
             </w:r>
           </w:p>
         </w:tc>
@@ -3540,7 +3540,7 @@
                 <w:sz w:val="26"/>
                 <w:szCs w:val="26"/>
               </w:rPr>
-              <w:t>VIR-1</w:t>
+              <w:t>KSPR</w:t>
             </w:r>
           </w:p>
         </w:tc>
@@ -4006,7 +4006,7 @@
                 <w:sz w:val="26"/>
                 <w:szCs w:val="26"/>
               </w:rPr>
-              <w:t>ADM9</w:t>
+              <w:t>KSPR</w:t>
             </w:r>
           </w:p>
         </w:tc>
@@ -4515,7 +4515,7 @@
                 <w:sz w:val="26"/>
                 <w:szCs w:val="26"/>
               </w:rPr>
-              <w:t>SSAK</w:t>
+              <w:t>NQO</w:t>
             </w:r>
           </w:p>
         </w:tc>
@@ -4970,7 +4970,7 @@
                 <w:sz w:val="26"/>
                 <w:szCs w:val="26"/>
               </w:rPr>
-              <w:t>MNW</w:t>
+              <w:t>ICP</w:t>
             </w:r>
           </w:p>
         </w:tc>
@@ -5204,7 +5204,7 @@
                 <w:sz w:val="26"/>
                 <w:szCs w:val="26"/>
               </w:rPr>
-              <w:t>SUDA</w:t>
+              <w:t>HRA</w:t>
             </w:r>
           </w:p>
         </w:tc>
@@ -5486,7 +5486,7 @@
                 <w:sz w:val="26"/>
                 <w:szCs w:val="26"/>
               </w:rPr>
-              <w:t>SRAT</w:t>
+              <w:t>SUDA</w:t>
             </w:r>
           </w:p>
         </w:tc>
@@ -5713,7 +5713,7 @@
                 <w:sz w:val="26"/>
                 <w:szCs w:val="26"/>
               </w:rPr>
-              <w:t>VND1</w:t>
+              <w:t>SHP</w:t>
             </w:r>
           </w:p>
         </w:tc>
@@ -5940,7 +5940,7 @@
                 <w:sz w:val="26"/>
                 <w:szCs w:val="26"/>
               </w:rPr>
-              <w:t>SLQ</w:t>
+              <w:t>BHS</w:t>
             </w:r>
           </w:p>
         </w:tc>
@@ -6167,7 +6167,7 @@
                 <w:sz w:val="26"/>
                 <w:szCs w:val="26"/>
               </w:rPr>
-              <w:t>ABN8</w:t>
+              <w:t>VK-2</w:t>
             </w:r>
           </w:p>
         </w:tc>
@@ -6394,17 +6394,7 @@
                 <w:sz w:val="26"/>
                 <w:szCs w:val="26"/>
               </w:rPr>
-              <w:t>ADM</w:t>
-            </w:r>
-            <w:bookmarkStart w:id="0" w:name="_GoBack"/>
-            <w:bookmarkEnd w:id="0"/>
-            <w:r>
-              <w:rPr>
-                <w:rFonts w:ascii="Calibri" w:eastAsia="Calibri" w:hAnsi="Calibri" w:cs="Calibri"/>
-                <w:sz w:val="26"/>
-                <w:szCs w:val="26"/>
-              </w:rPr>
-              <w:t>10</w:t>
+              <w:t>SGAV</w:t>
             </w:r>
           </w:p>
         </w:tc>
@@ -6631,7 +6621,7 @@
                 <w:sz w:val="26"/>
                 <w:szCs w:val="26"/>
               </w:rPr>
-              <w:t>WIN+NQO</w:t>
+              <w:t>SJOT</w:t>
             </w:r>
           </w:p>
         </w:tc>
@@ -7418,6 +7408,14 @@
                 <w:szCs w:val="26"/>
               </w:rPr>
             </w:pPr>
+            <w:r>
+              <w:rPr>
+                <w:rFonts w:ascii="Calibri" w:eastAsia="Calibri" w:hAnsi="Calibri" w:cs="Calibri"/>
+                <w:sz w:val="26"/>
+                <w:szCs w:val="26"/>
+              </w:rPr>
+              <w:t>TAPTI</w:t>
+            </w:r>
           </w:p>
         </w:tc>
         <w:tc>
@@ -8216,6 +8214,8 @@
         </w:rPr>
         <w:tab/>
       </w:r>
+      <w:bookmarkStart w:id="0" w:name="_GoBack"/>
+      <w:bookmarkEnd w:id="0"/>
       <w:r>
         <w:rPr>
           <w:rFonts w:ascii="Calibri" w:eastAsia="Calibri" w:hAnsi="Calibri" w:cs="Calibri"/>
@@ -8383,7 +8383,7 @@
         <v:rect id="_x0000_i1025" style="width:54.75pt;height:39pt" o:ole="" o:preferrelative="t" stroked="f">
           <v:imagedata r:id="rId1" o:title=""/>
         </v:rect>
-        <o:OLEObject Type="Embed" ProgID="StaticMetafile" ShapeID="_x0000_i1025" DrawAspect="Content" ObjectID="_1850212610" r:id="rId2"/>
+        <o:OLEObject Type="Embed" ProgID="StaticMetafile" ShapeID="_x0000_i1025" DrawAspect="Content" ObjectID="_1850301204" r:id="rId2"/>
       </w:object>
     </w:r>
     <w:r>
@@ -8417,7 +8417,7 @@
         <w:sz w:val="26"/>
         <w:szCs w:val="26"/>
       </w:rPr>
-      <w:t>7</w:t>
+      <w:t>8</w:t>
     </w:r>
     <w:r>
       <w:rPr>
@@ -8437,7 +8437,7 @@
         <w:sz w:val="26"/>
         <w:szCs w:val="26"/>
       </w:rPr>
-      <w:t>MON</w:t>
+      <w:t>TUESDAY</w:t>
     </w:r>
     <w:r>
       <w:rPr>
@@ -8447,7 +8447,7 @@
         <w:sz w:val="26"/>
         <w:szCs w:val="26"/>
       </w:rPr>
-      <w:t>DAY)</w:t>
+      <w:t>)</w:t>
     </w:r>
   </w:p>
   <w:p>

</xml_diff>

<commit_message>
Sync - 2026-09-07 16:31
</commit_message>
<xml_diff>
--- a/files/Daily_Helicopter_Schedule.docx
+++ b/files/Daily_Helicopter_Schedule.docx
@@ -3070,7 +3070,7 @@
                 <w:sz w:val="26"/>
                 <w:szCs w:val="26"/>
               </w:rPr>
-              <w:t>KSPR</w:t>
+              <w:t>NEELAM</w:t>
             </w:r>
           </w:p>
         </w:tc>
@@ -5204,7 +5204,7 @@
                 <w:sz w:val="26"/>
                 <w:szCs w:val="26"/>
               </w:rPr>
-              <w:t>HRA</w:t>
+              <w:t>KSPR</w:t>
             </w:r>
           </w:p>
         </w:tc>
@@ -6788,6 +6788,8 @@
         </w:rPr>
         <w:t>NOTE:   ALL PRIVATE CC DELAY BY TWO DAYS</w:t>
       </w:r>
+      <w:bookmarkStart w:id="0" w:name="_GoBack"/>
+      <w:bookmarkEnd w:id="0"/>
     </w:p>
     <w:p>
       <w:pPr>
@@ -8214,8 +8216,6 @@
         </w:rPr>
         <w:tab/>
       </w:r>
-      <w:bookmarkStart w:id="0" w:name="_GoBack"/>
-      <w:bookmarkEnd w:id="0"/>
       <w:r>
         <w:rPr>
           <w:rFonts w:ascii="Calibri" w:eastAsia="Calibri" w:hAnsi="Calibri" w:cs="Calibri"/>
@@ -8380,10 +8380,10 @@
     </w:pPr>
     <w:r>
       <w:object w:dxaOrig="1188" w:dyaOrig="900">
-        <v:rect id="_x0000_i1025" style="width:54.75pt;height:39pt" o:ole="" o:preferrelative="t" stroked="f">
+        <v:rect id="_x0000_i1025" style="width:55.15pt;height:39.25pt" o:ole="" o:preferrelative="t" stroked="f">
           <v:imagedata r:id="rId1" o:title=""/>
         </v:rect>
-        <o:OLEObject Type="Embed" ProgID="StaticMetafile" ShapeID="_x0000_i1025" DrawAspect="Content" ObjectID="_1850301204" r:id="rId2"/>
+        <o:OLEObject Type="Embed" ProgID="StaticMetafile" ShapeID="_x0000_i1025" DrawAspect="Content" ObjectID="_1850303435" r:id="rId2"/>
       </w:object>
     </w:r>
     <w:r>

</xml_diff>

<commit_message>
Sync - 2026-09-08 18:04
</commit_message>
<xml_diff>
--- a/files/Daily_Helicopter_Schedule.docx
+++ b/files/Daily_Helicopter_Schedule.docx
@@ -1511,6 +1511,8 @@
               </w:rPr>
               <w:t xml:space="preserve"> </w:t>
             </w:r>
+            <w:bookmarkStart w:id="0" w:name="_GoBack"/>
+            <w:bookmarkEnd w:id="0"/>
           </w:p>
         </w:tc>
       </w:tr>
@@ -3070,7 +3072,7 @@
                 <w:sz w:val="26"/>
                 <w:szCs w:val="26"/>
               </w:rPr>
-              <w:t>NEELAM</w:t>
+              <w:t>NLM</w:t>
             </w:r>
           </w:p>
         </w:tc>
@@ -3540,7 +3542,7 @@
                 <w:sz w:val="26"/>
                 <w:szCs w:val="26"/>
               </w:rPr>
-              <w:t>KSPR</w:t>
+              <w:t>NLM</w:t>
             </w:r>
           </w:p>
         </w:tc>
@@ -4006,7 +4008,7 @@
                 <w:sz w:val="26"/>
                 <w:szCs w:val="26"/>
               </w:rPr>
-              <w:t>KSPR</w:t>
+              <w:t>NLM</w:t>
             </w:r>
           </w:p>
         </w:tc>
@@ -4515,7 +4517,7 @@
                 <w:sz w:val="26"/>
                 <w:szCs w:val="26"/>
               </w:rPr>
-              <w:t>NQO</w:t>
+              <w:t>AS2 B\L</w:t>
             </w:r>
           </w:p>
         </w:tc>
@@ -4970,7 +4972,7 @@
                 <w:sz w:val="26"/>
                 <w:szCs w:val="26"/>
               </w:rPr>
-              <w:t>ICP</w:t>
+              <w:t>SMRT</w:t>
             </w:r>
           </w:p>
         </w:tc>
@@ -5201,10 +5203,11 @@
             <w:r>
               <w:rPr>
                 <w:rFonts w:ascii="Calibri" w:eastAsia="Calibri" w:hAnsi="Calibri" w:cs="Calibri"/>
-                <w:sz w:val="26"/>
-                <w:szCs w:val="26"/>
-              </w:rPr>
-              <w:t>KSPR</w:t>
+                <w:b/>
+                <w:sz w:val="26"/>
+                <w:szCs w:val="26"/>
+              </w:rPr>
+              <w:t>NA</w:t>
             </w:r>
           </w:p>
         </w:tc>
@@ -5486,7 +5489,7 @@
                 <w:sz w:val="26"/>
                 <w:szCs w:val="26"/>
               </w:rPr>
-              <w:t>SUDA</w:t>
+              <w:t>SCA</w:t>
             </w:r>
           </w:p>
         </w:tc>
@@ -5713,7 +5716,7 @@
                 <w:sz w:val="26"/>
                 <w:szCs w:val="26"/>
               </w:rPr>
-              <w:t>SHP</w:t>
+              <w:t>SRAT</w:t>
             </w:r>
           </w:p>
         </w:tc>
@@ -5940,7 +5943,7 @@
                 <w:sz w:val="26"/>
                 <w:szCs w:val="26"/>
               </w:rPr>
-              <w:t>BHS</w:t>
+              <w:t>SSAK</w:t>
             </w:r>
           </w:p>
         </w:tc>
@@ -6167,7 +6170,7 @@
                 <w:sz w:val="26"/>
                 <w:szCs w:val="26"/>
               </w:rPr>
-              <w:t>VK-2</w:t>
+              <w:t>MNW</w:t>
             </w:r>
           </w:p>
         </w:tc>
@@ -6394,7 +6397,7 @@
                 <w:sz w:val="26"/>
                 <w:szCs w:val="26"/>
               </w:rPr>
-              <w:t>SGAV</w:t>
+              <w:t>AS1</w:t>
             </w:r>
           </w:p>
         </w:tc>
@@ -6621,7 +6624,7 @@
                 <w:sz w:val="26"/>
                 <w:szCs w:val="26"/>
               </w:rPr>
-              <w:t>SJOT</w:t>
+              <w:t>VND B\L</w:t>
             </w:r>
           </w:p>
         </w:tc>
@@ -6788,8 +6791,6 @@
         </w:rPr>
         <w:t>NOTE:   ALL PRIVATE CC DELAY BY TWO DAYS</w:t>
       </w:r>
-      <w:bookmarkStart w:id="0" w:name="_GoBack"/>
-      <w:bookmarkEnd w:id="0"/>
     </w:p>
     <w:p>
       <w:pPr>
@@ -7416,7 +7417,7 @@
                 <w:sz w:val="26"/>
                 <w:szCs w:val="26"/>
               </w:rPr>
-              <w:t>TAPTI</w:t>
+              <w:t>LB-LA</w:t>
             </w:r>
           </w:p>
         </w:tc>
@@ -7640,6 +7641,14 @@
                 <w:szCs w:val="26"/>
               </w:rPr>
             </w:pPr>
+            <w:r>
+              <w:rPr>
+                <w:rFonts w:ascii="Calibri" w:eastAsia="Calibri" w:hAnsi="Calibri" w:cs="Calibri"/>
+                <w:sz w:val="26"/>
+                <w:szCs w:val="26"/>
+              </w:rPr>
+              <w:t>CHRU</w:t>
+            </w:r>
           </w:p>
         </w:tc>
         <w:tc>
@@ -7863,6 +7872,14 @@
                 <w:szCs w:val="26"/>
               </w:rPr>
             </w:pPr>
+            <w:r>
+              <w:rPr>
+                <w:rFonts w:ascii="Calibri" w:eastAsia="Calibri" w:hAnsi="Calibri" w:cs="Calibri"/>
+                <w:sz w:val="26"/>
+                <w:szCs w:val="26"/>
+              </w:rPr>
+              <w:t>JIND</w:t>
+            </w:r>
           </w:p>
         </w:tc>
         <w:tc>
@@ -8380,10 +8397,10 @@
     </w:pPr>
     <w:r>
       <w:object w:dxaOrig="1188" w:dyaOrig="900">
-        <v:rect id="_x0000_i1025" style="width:55.15pt;height:39.25pt" o:ole="" o:preferrelative="t" stroked="f">
+        <v:rect id="_x0000_i1025" style="width:54.75pt;height:39pt" o:ole="" o:preferrelative="t" stroked="f">
           <v:imagedata r:id="rId1" o:title=""/>
         </v:rect>
-        <o:OLEObject Type="Embed" ProgID="StaticMetafile" ShapeID="_x0000_i1025" DrawAspect="Content" ObjectID="_1850303435" r:id="rId2"/>
+        <o:OLEObject Type="Embed" ProgID="StaticMetafile" ShapeID="_x0000_i1025" DrawAspect="Content" ObjectID="_1850394358" r:id="rId2"/>
       </w:object>
     </w:r>
     <w:r>
@@ -8417,7 +8434,7 @@
         <w:sz w:val="26"/>
         <w:szCs w:val="26"/>
       </w:rPr>
-      <w:t>8</w:t>
+      <w:t>9</w:t>
     </w:r>
     <w:r>
       <w:rPr>
@@ -8437,7 +8454,17 @@
         <w:sz w:val="26"/>
         <w:szCs w:val="26"/>
       </w:rPr>
-      <w:t>TUESDAY</w:t>
+      <w:t>WEDNES</w:t>
+    </w:r>
+    <w:r>
+      <w:rPr>
+        <w:rFonts w:ascii="Times New Roman" w:hAnsi="Times New Roman" w:cs="Times New Roman"/>
+        <w:b/>
+        <w:color w:val="000000" w:themeColor="text1"/>
+        <w:sz w:val="26"/>
+        <w:szCs w:val="26"/>
+      </w:rPr>
+      <w:t>DAY</w:t>
     </w:r>
     <w:r>
       <w:rPr>

</xml_diff>

<commit_message>
Sync - 2026-09-09 17:37
</commit_message>
<xml_diff>
--- a/files/Daily_Helicopter_Schedule.docx
+++ b/files/Daily_Helicopter_Schedule.docx
@@ -240,6 +240,18 @@
               <w:tab/>
             </w:r>
           </w:p>
+          <w:p>
+            <w:pPr>
+              <w:ind w:firstLine="720"/>
+              <w:rPr>
+                <w:rFonts w:ascii="Calibri" w:eastAsia="Calibri" w:hAnsi="Calibri" w:cs="Calibri"/>
+                <w:sz w:val="26"/>
+                <w:szCs w:val="26"/>
+              </w:rPr>
+            </w:pPr>
+            <w:bookmarkStart w:id="0" w:name="_GoBack"/>
+            <w:bookmarkEnd w:id="0"/>
+          </w:p>
         </w:tc>
         <w:tc>
           <w:tcPr>
@@ -1511,8 +1523,6 @@
               </w:rPr>
               <w:t xml:space="preserve"> </w:t>
             </w:r>
-            <w:bookmarkStart w:id="0" w:name="_GoBack"/>
-            <w:bookmarkEnd w:id="0"/>
           </w:p>
         </w:tc>
       </w:tr>
@@ -3072,7 +3082,7 @@
                 <w:sz w:val="26"/>
                 <w:szCs w:val="26"/>
               </w:rPr>
-              <w:t>NLM</w:t>
+              <w:t>BPB</w:t>
             </w:r>
           </w:p>
         </w:tc>
@@ -3308,11 +3318,10 @@
             <w:r>
               <w:rPr>
                 <w:rFonts w:ascii="Calibri" w:eastAsia="Calibri" w:hAnsi="Calibri" w:cs="Calibri"/>
-                <w:b/>
-                <w:sz w:val="26"/>
-                <w:szCs w:val="26"/>
-              </w:rPr>
-              <w:t>NA</w:t>
+                <w:sz w:val="26"/>
+                <w:szCs w:val="26"/>
+              </w:rPr>
+              <w:t>TRI2</w:t>
             </w:r>
           </w:p>
         </w:tc>
@@ -3542,7 +3551,7 @@
                 <w:sz w:val="26"/>
                 <w:szCs w:val="26"/>
               </w:rPr>
-              <w:t>NLM</w:t>
+              <w:t>BPB</w:t>
             </w:r>
           </w:p>
         </w:tc>
@@ -3770,11 +3779,10 @@
             <w:r>
               <w:rPr>
                 <w:rFonts w:ascii="Calibri" w:eastAsia="Calibri" w:hAnsi="Calibri" w:cs="Calibri"/>
-                <w:b/>
-                <w:sz w:val="26"/>
-                <w:szCs w:val="26"/>
-              </w:rPr>
-              <w:t>NA</w:t>
+                <w:sz w:val="26"/>
+                <w:szCs w:val="26"/>
+              </w:rPr>
+              <w:t>WIN</w:t>
             </w:r>
           </w:p>
         </w:tc>
@@ -4008,7 +4016,7 @@
                 <w:sz w:val="26"/>
                 <w:szCs w:val="26"/>
               </w:rPr>
-              <w:t>NLM</w:t>
+              <w:t>BPB</w:t>
             </w:r>
           </w:p>
         </w:tc>
@@ -4517,7 +4525,7 @@
                 <w:sz w:val="26"/>
                 <w:szCs w:val="26"/>
               </w:rPr>
-              <w:t>AS2 B\L</w:t>
+              <w:t>SUDA</w:t>
             </w:r>
           </w:p>
         </w:tc>
@@ -4972,7 +4980,7 @@
                 <w:sz w:val="26"/>
                 <w:szCs w:val="26"/>
               </w:rPr>
-              <w:t>SMRT</w:t>
+              <w:t>JSUP</w:t>
             </w:r>
           </w:p>
         </w:tc>
@@ -5203,11 +5211,10 @@
             <w:r>
               <w:rPr>
                 <w:rFonts w:ascii="Calibri" w:eastAsia="Calibri" w:hAnsi="Calibri" w:cs="Calibri"/>
-                <w:b/>
-                <w:sz w:val="26"/>
-                <w:szCs w:val="26"/>
-              </w:rPr>
-              <w:t>NA</w:t>
+                <w:sz w:val="26"/>
+                <w:szCs w:val="26"/>
+              </w:rPr>
+              <w:t>HERA</w:t>
             </w:r>
           </w:p>
         </w:tc>
@@ -5489,7 +5496,7 @@
                 <w:sz w:val="26"/>
                 <w:szCs w:val="26"/>
               </w:rPr>
-              <w:t>SCA</w:t>
+              <w:t>SCHAL</w:t>
             </w:r>
           </w:p>
         </w:tc>
@@ -5716,7 +5723,7 @@
                 <w:sz w:val="26"/>
                 <w:szCs w:val="26"/>
               </w:rPr>
-              <w:t>SRAT</w:t>
+              <w:t>SHQ</w:t>
             </w:r>
           </w:p>
         </w:tc>
@@ -5943,7 +5950,7 @@
                 <w:sz w:val="26"/>
                 <w:szCs w:val="26"/>
               </w:rPr>
-              <w:t>SSAK</w:t>
+              <w:t>MNW</w:t>
             </w:r>
           </w:p>
         </w:tc>
@@ -6170,7 +6177,7 @@
                 <w:sz w:val="26"/>
                 <w:szCs w:val="26"/>
               </w:rPr>
-              <w:t>MNW</w:t>
+              <w:t>ICP</w:t>
             </w:r>
           </w:p>
         </w:tc>
@@ -6397,7 +6404,7 @@
                 <w:sz w:val="26"/>
                 <w:szCs w:val="26"/>
               </w:rPr>
-              <w:t>AS1</w:t>
+              <w:t>JSUP</w:t>
             </w:r>
           </w:p>
         </w:tc>
@@ -6624,7 +6631,7 @@
                 <w:sz w:val="26"/>
                 <w:szCs w:val="26"/>
               </w:rPr>
-              <w:t>VND B\L</w:t>
+              <w:t>VND1</w:t>
             </w:r>
           </w:p>
         </w:tc>
@@ -6744,14 +6751,29 @@
                 <w:b/>
                 <w:sz w:val="24"/>
               </w:rPr>
-              <w:t xml:space="preserve">WAITING: </w:t>
-            </w:r>
-            <w:r>
-              <w:rPr>
-                <w:rFonts w:ascii="Calibri" w:eastAsia="Calibri" w:hAnsi="Calibri" w:cs="Calibri"/>
+              <w:t>WAITING:</w:t>
+            </w:r>
+            <w:r>
+              <w:rPr>
+                <w:rFonts w:ascii="Calibri" w:eastAsia="Calibri" w:hAnsi="Calibri" w:cs="Calibri"/>
+                <w:b/>
                 <w:sz w:val="24"/>
               </w:rPr>
-              <w:t>AS2</w:t>
+              <w:t xml:space="preserve"> </w:t>
+            </w:r>
+            <w:r>
+              <w:rPr>
+                <w:rFonts w:ascii="Calibri" w:eastAsia="Calibri" w:hAnsi="Calibri" w:cs="Calibri"/>
+                <w:sz w:val="24"/>
+              </w:rPr>
+              <w:t>DSFN</w:t>
+            </w:r>
+            <w:r>
+              <w:rPr>
+                <w:rFonts w:ascii="Calibri" w:eastAsia="Calibri" w:hAnsi="Calibri" w:cs="Calibri"/>
+                <w:sz w:val="24"/>
+              </w:rPr>
+              <w:t>, JXLR</w:t>
             </w:r>
             <w:r>
               <w:rPr>
@@ -7417,7 +7439,7 @@
                 <w:sz w:val="26"/>
                 <w:szCs w:val="26"/>
               </w:rPr>
-              <w:t>LB-LA</w:t>
+              <w:t>JSTAR/CHARU</w:t>
             </w:r>
           </w:p>
         </w:tc>
@@ -7641,14 +7663,6 @@
                 <w:szCs w:val="26"/>
               </w:rPr>
             </w:pPr>
-            <w:r>
-              <w:rPr>
-                <w:rFonts w:ascii="Calibri" w:eastAsia="Calibri" w:hAnsi="Calibri" w:cs="Calibri"/>
-                <w:sz w:val="26"/>
-                <w:szCs w:val="26"/>
-              </w:rPr>
-              <w:t>CHRU</w:t>
-            </w:r>
           </w:p>
         </w:tc>
         <w:tc>
@@ -7872,14 +7886,6 @@
                 <w:szCs w:val="26"/>
               </w:rPr>
             </w:pPr>
-            <w:r>
-              <w:rPr>
-                <w:rFonts w:ascii="Calibri" w:eastAsia="Calibri" w:hAnsi="Calibri" w:cs="Calibri"/>
-                <w:sz w:val="26"/>
-                <w:szCs w:val="26"/>
-              </w:rPr>
-              <w:t>JIND</w:t>
-            </w:r>
           </w:p>
         </w:tc>
         <w:tc>
@@ -8103,6 +8109,14 @@
                 <w:szCs w:val="26"/>
               </w:rPr>
             </w:pPr>
+            <w:r>
+              <w:rPr>
+                <w:rFonts w:ascii="Calibri" w:eastAsia="Calibri" w:hAnsi="Calibri" w:cs="Calibri"/>
+                <w:sz w:val="26"/>
+                <w:szCs w:val="26"/>
+              </w:rPr>
+              <w:t>TCPP CC</w:t>
+            </w:r>
           </w:p>
         </w:tc>
         <w:tc>
@@ -8394,13 +8408,20 @@
       <w:pStyle w:val="Header"/>
       <w:ind w:left="-851"/>
       <w:jc w:val="center"/>
+      <w:rPr>
+        <w:rFonts w:ascii="Times New Roman" w:hAnsi="Times New Roman" w:cs="Times New Roman"/>
+        <w:b/>
+        <w:color w:val="000000" w:themeColor="text1"/>
+        <w:sz w:val="26"/>
+        <w:szCs w:val="26"/>
+      </w:rPr>
     </w:pPr>
     <w:r>
       <w:object w:dxaOrig="1188" w:dyaOrig="900">
         <v:rect id="_x0000_i1025" style="width:54.75pt;height:39pt" o:ole="" o:preferrelative="t" stroked="f">
           <v:imagedata r:id="rId1" o:title=""/>
         </v:rect>
-        <o:OLEObject Type="Embed" ProgID="StaticMetafile" ShapeID="_x0000_i1025" DrawAspect="Content" ObjectID="_1850394358" r:id="rId2"/>
+        <o:OLEObject Type="Embed" ProgID="StaticMetafile" ShapeID="_x0000_i1025" DrawAspect="Content" ObjectID="_1850480233" r:id="rId2"/>
       </w:object>
     </w:r>
     <w:r>
@@ -8424,7 +8445,7 @@
         <w:sz w:val="26"/>
         <w:szCs w:val="26"/>
       </w:rPr>
-      <w:t>ELICOPTER FLYING SCHEDULE FOR 0</w:t>
+      <w:t xml:space="preserve">ELICOPTER FLYING SCHEDULE FOR </w:t>
     </w:r>
     <w:r>
       <w:rPr>
@@ -8434,7 +8455,7 @@
         <w:sz w:val="26"/>
         <w:szCs w:val="26"/>
       </w:rPr>
-      <w:t>9</w:t>
+      <w:t>10</w:t>
     </w:r>
     <w:r>
       <w:rPr>
@@ -8454,7 +8475,17 @@
         <w:sz w:val="26"/>
         <w:szCs w:val="26"/>
       </w:rPr>
-      <w:t>WEDNES</w:t>
+      <w:t>THUR</w:t>
+    </w:r>
+    <w:r>
+      <w:rPr>
+        <w:rFonts w:ascii="Times New Roman" w:hAnsi="Times New Roman" w:cs="Times New Roman"/>
+        <w:b/>
+        <w:color w:val="000000" w:themeColor="text1"/>
+        <w:sz w:val="26"/>
+        <w:szCs w:val="26"/>
+      </w:rPr>
+      <w:t>S</w:t>
     </w:r>
     <w:r>
       <w:rPr>

</xml_diff>

<commit_message>
Sync - 2026-09-10 16:10
</commit_message>
<xml_diff>
--- a/files/Daily_Helicopter_Schedule.docx
+++ b/files/Daily_Helicopter_Schedule.docx
@@ -249,8 +249,6 @@
                 <w:szCs w:val="26"/>
               </w:rPr>
             </w:pPr>
-            <w:bookmarkStart w:id="0" w:name="_GoBack"/>
-            <w:bookmarkEnd w:id="0"/>
           </w:p>
         </w:tc>
         <w:tc>
@@ -1706,7 +1704,7 @@
                 <w:sz w:val="26"/>
                 <w:szCs w:val="26"/>
               </w:rPr>
-              <w:t>NA</w:t>
+              <w:t>HELIGO</w:t>
             </w:r>
           </w:p>
         </w:tc>
@@ -1742,7 +1740,7 @@
                 <w:sz w:val="26"/>
                 <w:szCs w:val="26"/>
               </w:rPr>
-              <w:t>NA</w:t>
+              <w:t>HLW</w:t>
             </w:r>
           </w:p>
         </w:tc>
@@ -1785,7 +1783,7 @@
                 <w:sz w:val="26"/>
                 <w:szCs w:val="26"/>
               </w:rPr>
-              <w:t>0</w:t>
+              <w:t>7</w:t>
             </w:r>
           </w:p>
         </w:tc>
@@ -3321,7 +3319,7 @@
                 <w:sz w:val="26"/>
                 <w:szCs w:val="26"/>
               </w:rPr>
-              <w:t>TRI2</w:t>
+              <w:t>NF(SPCL)</w:t>
             </w:r>
           </w:p>
         </w:tc>
@@ -3782,7 +3780,7 @@
                 <w:sz w:val="26"/>
                 <w:szCs w:val="26"/>
               </w:rPr>
-              <w:t>WIN</w:t>
+              <w:t>SF (SPCL)</w:t>
             </w:r>
           </w:p>
         </w:tc>
@@ -4299,7 +4297,7 @@
                 <w:sz w:val="26"/>
                 <w:szCs w:val="26"/>
               </w:rPr>
-              <w:t>NA</w:t>
+              <w:t>TBD</w:t>
             </w:r>
           </w:p>
         </w:tc>
@@ -4355,6 +4353,14 @@
                 <w:szCs w:val="26"/>
               </w:rPr>
             </w:pPr>
+            <w:r>
+              <w:rPr>
+                <w:rFonts w:ascii="Calibri" w:eastAsia="Calibri" w:hAnsi="Calibri" w:cs="Calibri"/>
+                <w:sz w:val="26"/>
+                <w:szCs w:val="26"/>
+              </w:rPr>
+              <w:t>HLW</w:t>
+            </w:r>
           </w:p>
         </w:tc>
         <w:tc>
@@ -4525,7 +4531,7 @@
                 <w:sz w:val="26"/>
                 <w:szCs w:val="26"/>
               </w:rPr>
-              <w:t>SUDA</w:t>
+              <w:t>SSAK</w:t>
             </w:r>
           </w:p>
         </w:tc>
@@ -4980,7 +4986,7 @@
                 <w:sz w:val="26"/>
                 <w:szCs w:val="26"/>
               </w:rPr>
-              <w:t>JSUP</w:t>
+              <w:t>ADM09</w:t>
             </w:r>
           </w:p>
         </w:tc>
@@ -5214,7 +5220,7 @@
                 <w:sz w:val="26"/>
                 <w:szCs w:val="26"/>
               </w:rPr>
-              <w:t>HERA</w:t>
+              <w:t>DSFN</w:t>
             </w:r>
           </w:p>
         </w:tc>
@@ -5496,7 +5502,7 @@
                 <w:sz w:val="26"/>
                 <w:szCs w:val="26"/>
               </w:rPr>
-              <w:t>SCHAL</w:t>
+              <w:t>JXLR</w:t>
             </w:r>
           </w:p>
         </w:tc>
@@ -5552,6 +5558,14 @@
                 <w:szCs w:val="26"/>
               </w:rPr>
             </w:pPr>
+            <w:r>
+              <w:rPr>
+                <w:rFonts w:ascii="Calibri" w:eastAsia="Calibri" w:hAnsi="Calibri" w:cs="Calibri"/>
+                <w:sz w:val="26"/>
+                <w:szCs w:val="26"/>
+              </w:rPr>
+              <w:t>HLU</w:t>
+            </w:r>
           </w:p>
         </w:tc>
         <w:tc>
@@ -5723,7 +5737,7 @@
                 <w:sz w:val="26"/>
                 <w:szCs w:val="26"/>
               </w:rPr>
-              <w:t>SHQ</w:t>
+              <w:t>SGAV</w:t>
             </w:r>
           </w:p>
         </w:tc>
@@ -5779,6 +5793,14 @@
                 <w:szCs w:val="26"/>
               </w:rPr>
             </w:pPr>
+            <w:r>
+              <w:rPr>
+                <w:rFonts w:ascii="Calibri" w:eastAsia="Calibri" w:hAnsi="Calibri" w:cs="Calibri"/>
+                <w:sz w:val="26"/>
+                <w:szCs w:val="26"/>
+              </w:rPr>
+              <w:t>HLH</w:t>
+            </w:r>
           </w:p>
         </w:tc>
         <w:tc>
@@ -5950,7 +5972,7 @@
                 <w:sz w:val="26"/>
                 <w:szCs w:val="26"/>
               </w:rPr>
-              <w:t>MNW</w:t>
+              <w:t>SJOT</w:t>
             </w:r>
           </w:p>
         </w:tc>
@@ -6006,6 +6028,14 @@
                 <w:szCs w:val="26"/>
               </w:rPr>
             </w:pPr>
+            <w:r>
+              <w:rPr>
+                <w:rFonts w:ascii="Calibri" w:eastAsia="Calibri" w:hAnsi="Calibri" w:cs="Calibri"/>
+                <w:sz w:val="26"/>
+                <w:szCs w:val="26"/>
+              </w:rPr>
+              <w:t>HNB</w:t>
+            </w:r>
           </w:p>
         </w:tc>
         <w:tc>
@@ -6177,7 +6207,7 @@
                 <w:sz w:val="26"/>
                 <w:szCs w:val="26"/>
               </w:rPr>
-              <w:t>ICP</w:t>
+              <w:t>SCHAL</w:t>
             </w:r>
           </w:p>
         </w:tc>
@@ -6233,6 +6263,14 @@
                 <w:szCs w:val="26"/>
               </w:rPr>
             </w:pPr>
+            <w:r>
+              <w:rPr>
+                <w:rFonts w:ascii="Calibri" w:eastAsia="Calibri" w:hAnsi="Calibri" w:cs="Calibri"/>
+                <w:sz w:val="26"/>
+                <w:szCs w:val="26"/>
+              </w:rPr>
+              <w:t>HLU</w:t>
+            </w:r>
           </w:p>
         </w:tc>
         <w:tc>
@@ -6404,7 +6442,7 @@
                 <w:sz w:val="26"/>
                 <w:szCs w:val="26"/>
               </w:rPr>
-              <w:t>JSUP</w:t>
+              <w:t>JXLR</w:t>
             </w:r>
           </w:p>
         </w:tc>
@@ -6460,6 +6498,14 @@
                 <w:szCs w:val="26"/>
               </w:rPr>
             </w:pPr>
+            <w:r>
+              <w:rPr>
+                <w:rFonts w:ascii="Calibri" w:eastAsia="Calibri" w:hAnsi="Calibri" w:cs="Calibri"/>
+                <w:sz w:val="26"/>
+                <w:szCs w:val="26"/>
+              </w:rPr>
+              <w:t>HLH</w:t>
+            </w:r>
           </w:p>
         </w:tc>
         <w:tc>
@@ -6631,7 +6677,7 @@
                 <w:sz w:val="26"/>
                 <w:szCs w:val="26"/>
               </w:rPr>
-              <w:t>VND1</w:t>
+              <w:t>SF (SPCL)</w:t>
             </w:r>
           </w:p>
         </w:tc>
@@ -6687,6 +6733,14 @@
                 <w:szCs w:val="26"/>
               </w:rPr>
             </w:pPr>
+            <w:r>
+              <w:rPr>
+                <w:rFonts w:ascii="Calibri" w:eastAsia="Calibri" w:hAnsi="Calibri" w:cs="Calibri"/>
+                <w:sz w:val="26"/>
+                <w:szCs w:val="26"/>
+              </w:rPr>
+              <w:t>HNB</w:t>
+            </w:r>
           </w:p>
         </w:tc>
         <w:tc>
@@ -6761,20 +6815,8 @@
               </w:rPr>
               <w:t xml:space="preserve"> </w:t>
             </w:r>
-            <w:r>
-              <w:rPr>
-                <w:rFonts w:ascii="Calibri" w:eastAsia="Calibri" w:hAnsi="Calibri" w:cs="Calibri"/>
-                <w:sz w:val="24"/>
-              </w:rPr>
-              <w:t>DSFN</w:t>
-            </w:r>
-            <w:r>
-              <w:rPr>
-                <w:rFonts w:ascii="Calibri" w:eastAsia="Calibri" w:hAnsi="Calibri" w:cs="Calibri"/>
-                <w:sz w:val="24"/>
-              </w:rPr>
-              <w:t>, JXLR</w:t>
-            </w:r>
+            <w:bookmarkStart w:id="0" w:name="_GoBack"/>
+            <w:bookmarkEnd w:id="0"/>
             <w:r>
               <w:rPr>
                 <w:rFonts w:ascii="Calibri" w:eastAsia="Calibri" w:hAnsi="Calibri" w:cs="Calibri"/>
@@ -6811,7 +6853,31 @@
           <w:b/>
           <w:sz w:val="24"/>
         </w:rPr>
-        <w:t>NOTE:   ALL PRIVATE CC DELAY BY TWO DAYS</w:t>
+        <w:t>NO</w:t>
+      </w:r>
+      <w:r>
+        <w:rPr>
+          <w:rFonts w:ascii="Calibri" w:eastAsia="Calibri" w:hAnsi="Calibri" w:cs="Calibri"/>
+          <w:b/>
+          <w:sz w:val="24"/>
+        </w:rPr>
+        <w:t xml:space="preserve">TE:   ALL PRIVATE CC DELAY BY </w:t>
+      </w:r>
+      <w:r>
+        <w:rPr>
+          <w:rFonts w:ascii="Calibri" w:eastAsia="Calibri" w:hAnsi="Calibri" w:cs="Calibri"/>
+          <w:b/>
+          <w:sz w:val="24"/>
+        </w:rPr>
+        <w:t>O</w:t>
+      </w:r>
+      <w:r>
+        <w:rPr>
+          <w:rFonts w:ascii="Calibri" w:eastAsia="Calibri" w:hAnsi="Calibri" w:cs="Calibri"/>
+          <w:b/>
+          <w:sz w:val="24"/>
+        </w:rPr>
+        <w:t>NE DAY</w:t>
       </w:r>
     </w:p>
     <w:p>
@@ -7433,14 +7499,6 @@
                 <w:szCs w:val="26"/>
               </w:rPr>
             </w:pPr>
-            <w:r>
-              <w:rPr>
-                <w:rFonts w:ascii="Calibri" w:eastAsia="Calibri" w:hAnsi="Calibri" w:cs="Calibri"/>
-                <w:sz w:val="26"/>
-                <w:szCs w:val="26"/>
-              </w:rPr>
-              <w:t>JSTAR/CHARU</w:t>
-            </w:r>
           </w:p>
         </w:tc>
         <w:tc>
@@ -8109,14 +8167,6 @@
                 <w:szCs w:val="26"/>
               </w:rPr>
             </w:pPr>
-            <w:r>
-              <w:rPr>
-                <w:rFonts w:ascii="Calibri" w:eastAsia="Calibri" w:hAnsi="Calibri" w:cs="Calibri"/>
-                <w:sz w:val="26"/>
-                <w:szCs w:val="26"/>
-              </w:rPr>
-              <w:t>TCPP CC</w:t>
-            </w:r>
           </w:p>
         </w:tc>
         <w:tc>
@@ -8421,7 +8471,7 @@
         <v:rect id="_x0000_i1025" style="width:54.75pt;height:39pt" o:ole="" o:preferrelative="t" stroked="f">
           <v:imagedata r:id="rId1" o:title=""/>
         </v:rect>
-        <o:OLEObject Type="Embed" ProgID="StaticMetafile" ShapeID="_x0000_i1025" DrawAspect="Content" ObjectID="_1850480233" r:id="rId2"/>
+        <o:OLEObject Type="Embed" ProgID="StaticMetafile" ShapeID="_x0000_i1025" DrawAspect="Content" ObjectID="_1850561434" r:id="rId2"/>
       </w:object>
     </w:r>
     <w:r>
@@ -8455,7 +8505,7 @@
         <w:sz w:val="26"/>
         <w:szCs w:val="26"/>
       </w:rPr>
-      <w:t>10</w:t>
+      <w:t>11</w:t>
     </w:r>
     <w:r>
       <w:rPr>
@@ -8475,17 +8525,7 @@
         <w:sz w:val="26"/>
         <w:szCs w:val="26"/>
       </w:rPr>
-      <w:t>THUR</w:t>
-    </w:r>
-    <w:r>
-      <w:rPr>
-        <w:rFonts w:ascii="Times New Roman" w:hAnsi="Times New Roman" w:cs="Times New Roman"/>
-        <w:b/>
-        <w:color w:val="000000" w:themeColor="text1"/>
-        <w:sz w:val="26"/>
-        <w:szCs w:val="26"/>
-      </w:rPr>
-      <w:t>S</w:t>
+      <w:t>FRI</w:t>
     </w:r>
     <w:r>
       <w:rPr>

</xml_diff>

<commit_message>
Sync - 2026-09-11 16:43
</commit_message>
<xml_diff>
--- a/files/Daily_Helicopter_Schedule.docx
+++ b/files/Daily_Helicopter_Schedule.docx
@@ -639,7 +639,7 @@
                 <w:sz w:val="26"/>
                 <w:szCs w:val="26"/>
               </w:rPr>
-              <w:t>GVHL 412</w:t>
+              <w:t>HELIGO 145</w:t>
             </w:r>
           </w:p>
         </w:tc>
@@ -674,7 +674,7 @@
                 <w:sz w:val="26"/>
                 <w:szCs w:val="26"/>
               </w:rPr>
-              <w:t>GVT</w:t>
+              <w:t>HLW</w:t>
             </w:r>
           </w:p>
         </w:tc>
@@ -1704,7 +1704,7 @@
                 <w:sz w:val="26"/>
                 <w:szCs w:val="26"/>
               </w:rPr>
-              <w:t>HELIGO</w:t>
+              <w:t xml:space="preserve">GVHL </w:t>
             </w:r>
           </w:p>
         </w:tc>
@@ -1740,7 +1740,7 @@
                 <w:sz w:val="26"/>
                 <w:szCs w:val="26"/>
               </w:rPr>
-              <w:t>HLW</w:t>
+              <w:t>RRO</w:t>
             </w:r>
           </w:p>
         </w:tc>
@@ -3080,7 +3080,7 @@
                 <w:sz w:val="26"/>
                 <w:szCs w:val="26"/>
               </w:rPr>
-              <w:t>BPB</w:t>
+              <w:t>FD09</w:t>
             </w:r>
           </w:p>
         </w:tc>
@@ -3319,7 +3319,7 @@
                 <w:sz w:val="26"/>
                 <w:szCs w:val="26"/>
               </w:rPr>
-              <w:t>NF(SPCL)</w:t>
+              <w:t>SF (SPCL)</w:t>
             </w:r>
           </w:p>
         </w:tc>
@@ -3549,8 +3549,10 @@
                 <w:sz w:val="26"/>
                 <w:szCs w:val="26"/>
               </w:rPr>
-              <w:t>BPB</w:t>
-            </w:r>
+              <w:t>DVDR</w:t>
+            </w:r>
+            <w:bookmarkStart w:id="0" w:name="_GoBack"/>
+            <w:bookmarkEnd w:id="0"/>
           </w:p>
         </w:tc>
         <w:tc>
@@ -3780,7 +3782,7 @@
                 <w:sz w:val="26"/>
                 <w:szCs w:val="26"/>
               </w:rPr>
-              <w:t>SF (SPCL)</w:t>
+              <w:t>DEFOS</w:t>
             </w:r>
           </w:p>
         </w:tc>
@@ -4008,14 +4010,6 @@
                 <w:szCs w:val="26"/>
               </w:rPr>
             </w:pPr>
-            <w:r>
-              <w:rPr>
-                <w:rFonts w:ascii="Calibri" w:eastAsia="Calibri" w:hAnsi="Calibri" w:cs="Calibri"/>
-                <w:sz w:val="26"/>
-                <w:szCs w:val="26"/>
-              </w:rPr>
-              <w:t>BPB</w:t>
-            </w:r>
           </w:p>
         </w:tc>
         <w:tc>
@@ -4297,7 +4291,7 @@
                 <w:sz w:val="26"/>
                 <w:szCs w:val="26"/>
               </w:rPr>
-              <w:t>TBD</w:t>
+              <w:t>NA</w:t>
             </w:r>
           </w:p>
         </w:tc>
@@ -4353,14 +4347,6 @@
                 <w:szCs w:val="26"/>
               </w:rPr>
             </w:pPr>
-            <w:r>
-              <w:rPr>
-                <w:rFonts w:ascii="Calibri" w:eastAsia="Calibri" w:hAnsi="Calibri" w:cs="Calibri"/>
-                <w:sz w:val="26"/>
-                <w:szCs w:val="26"/>
-              </w:rPr>
-              <w:t>HLW</w:t>
-            </w:r>
           </w:p>
         </w:tc>
         <w:tc>
@@ -4531,7 +4517,7 @@
                 <w:sz w:val="26"/>
                 <w:szCs w:val="26"/>
               </w:rPr>
-              <w:t>SSAK</w:t>
+              <w:t>FPSO2</w:t>
             </w:r>
           </w:p>
         </w:tc>
@@ -4986,7 +4972,7 @@
                 <w:sz w:val="26"/>
                 <w:szCs w:val="26"/>
               </w:rPr>
-              <w:t>ADM09</w:t>
+              <w:t>SMRT</w:t>
             </w:r>
           </w:p>
         </w:tc>
@@ -5214,14 +5200,6 @@
                 <w:szCs w:val="26"/>
               </w:rPr>
             </w:pPr>
-            <w:r>
-              <w:rPr>
-                <w:rFonts w:ascii="Calibri" w:eastAsia="Calibri" w:hAnsi="Calibri" w:cs="Calibri"/>
-                <w:sz w:val="26"/>
-                <w:szCs w:val="26"/>
-              </w:rPr>
-              <w:t>DSFN</w:t>
-            </w:r>
           </w:p>
         </w:tc>
         <w:tc>
@@ -5502,7 +5480,7 @@
                 <w:sz w:val="26"/>
                 <w:szCs w:val="26"/>
               </w:rPr>
-              <w:t>JXLR</w:t>
+              <w:t>SRAT</w:t>
             </w:r>
           </w:p>
         </w:tc>
@@ -5737,7 +5715,7 @@
                 <w:sz w:val="26"/>
                 <w:szCs w:val="26"/>
               </w:rPr>
-              <w:t>SGAV</w:t>
+              <w:t>SUDA</w:t>
             </w:r>
           </w:p>
         </w:tc>
@@ -5972,7 +5950,7 @@
                 <w:sz w:val="26"/>
                 <w:szCs w:val="26"/>
               </w:rPr>
-              <w:t>SJOT</w:t>
+              <w:t>DVDR</w:t>
             </w:r>
           </w:p>
         </w:tc>
@@ -6207,7 +6185,7 @@
                 <w:sz w:val="26"/>
                 <w:szCs w:val="26"/>
               </w:rPr>
-              <w:t>SCHAL</w:t>
+              <w:t>DFOS</w:t>
             </w:r>
           </w:p>
         </w:tc>
@@ -6442,7 +6420,7 @@
                 <w:sz w:val="26"/>
                 <w:szCs w:val="26"/>
               </w:rPr>
-              <w:t>JXLR</w:t>
+              <w:t>DISC1</w:t>
             </w:r>
           </w:p>
         </w:tc>
@@ -6677,7 +6655,7 @@
                 <w:sz w:val="26"/>
                 <w:szCs w:val="26"/>
               </w:rPr>
-              <w:t>SF (SPCL)</w:t>
+              <w:t>FD09</w:t>
             </w:r>
           </w:p>
         </w:tc>
@@ -6815,8 +6793,6 @@
               </w:rPr>
               <w:t xml:space="preserve"> </w:t>
             </w:r>
-            <w:bookmarkStart w:id="0" w:name="_GoBack"/>
-            <w:bookmarkEnd w:id="0"/>
             <w:r>
               <w:rPr>
                 <w:rFonts w:ascii="Calibri" w:eastAsia="Calibri" w:hAnsi="Calibri" w:cs="Calibri"/>
@@ -8471,7 +8447,7 @@
         <v:rect id="_x0000_i1025" style="width:54.75pt;height:39pt" o:ole="" o:preferrelative="t" stroked="f">
           <v:imagedata r:id="rId1" o:title=""/>
         </v:rect>
-        <o:OLEObject Type="Embed" ProgID="StaticMetafile" ShapeID="_x0000_i1025" DrawAspect="Content" ObjectID="_1850561434" r:id="rId2"/>
+        <o:OLEObject Type="Embed" ProgID="StaticMetafile" ShapeID="_x0000_i1025" DrawAspect="Content" ObjectID="_1850649705" r:id="rId2"/>
       </w:object>
     </w:r>
     <w:r>
@@ -8505,7 +8481,7 @@
         <w:sz w:val="26"/>
         <w:szCs w:val="26"/>
       </w:rPr>
-      <w:t>11</w:t>
+      <w:t>12</w:t>
     </w:r>
     <w:r>
       <w:rPr>
@@ -8525,7 +8501,7 @@
         <w:sz w:val="26"/>
         <w:szCs w:val="26"/>
       </w:rPr>
-      <w:t>FRI</w:t>
+      <w:t>SATUR</w:t>
     </w:r>
     <w:r>
       <w:rPr>

</xml_diff>

<commit_message>
Sync - 2026-09-12 17:16
</commit_message>
<xml_diff>
--- a/files/Daily_Helicopter_Schedule.docx
+++ b/files/Daily_Helicopter_Schedule.docx
@@ -19,7 +19,7 @@
     </w:p>
     <w:tbl>
       <w:tblPr>
-        <w:tblW w:w="10242" w:type="dxa"/>
+        <w:tblW w:w="10151" w:type="dxa"/>
         <w:tblInd w:w="-431" w:type="dxa"/>
         <w:tblCellMar>
           <w:left w:w="10" w:type="dxa"/>
@@ -28,13 +28,13 @@
         <w:tblLook w:val="04A0" w:firstRow="1" w:lastRow="0" w:firstColumn="1" w:lastColumn="0" w:noHBand="0" w:noVBand="1"/>
       </w:tblPr>
       <w:tblGrid>
-        <w:gridCol w:w="710"/>
-        <w:gridCol w:w="1559"/>
-        <w:gridCol w:w="1418"/>
-        <w:gridCol w:w="2486"/>
-        <w:gridCol w:w="1510"/>
-        <w:gridCol w:w="1285"/>
-        <w:gridCol w:w="1274"/>
+        <w:gridCol w:w="706"/>
+        <w:gridCol w:w="1555"/>
+        <w:gridCol w:w="1413"/>
+        <w:gridCol w:w="2442"/>
+        <w:gridCol w:w="1504"/>
+        <w:gridCol w:w="1261"/>
+        <w:gridCol w:w="1270"/>
       </w:tblGrid>
       <w:tr>
         <w:trPr>
@@ -302,7 +302,7 @@
         </w:tc>
         <w:tc>
           <w:tcPr>
-            <w:tcW w:w="1285" w:type="dxa"/>
+            <w:tcW w:w="1194" w:type="dxa"/>
             <w:tcBorders>
               <w:top w:val="single" w:sz="4" w:space="0" w:color="000000"/>
               <w:left w:val="single" w:sz="4" w:space="0" w:color="000000"/>
@@ -415,7 +415,7 @@
         </w:trPr>
         <w:tc>
           <w:tcPr>
-            <w:tcW w:w="10242" w:type="dxa"/>
+            <w:tcW w:w="10151" w:type="dxa"/>
             <w:gridSpan w:val="7"/>
             <w:tcBorders>
               <w:top w:val="single" w:sz="4" w:space="0" w:color="000000"/>
@@ -645,7 +645,7 @@
         </w:tc>
         <w:tc>
           <w:tcPr>
-            <w:tcW w:w="1285" w:type="dxa"/>
+            <w:tcW w:w="1194" w:type="dxa"/>
             <w:tcBorders>
               <w:top w:val="single" w:sz="4" w:space="0" w:color="000000"/>
               <w:left w:val="single" w:sz="4" w:space="0" w:color="000000"/>
@@ -903,7 +903,7 @@
         </w:tc>
         <w:tc>
           <w:tcPr>
-            <w:tcW w:w="1285" w:type="dxa"/>
+            <w:tcW w:w="1194" w:type="dxa"/>
             <w:tcBorders>
               <w:top w:val="single" w:sz="4" w:space="0" w:color="000000"/>
               <w:left w:val="single" w:sz="4" w:space="0" w:color="000000"/>
@@ -1153,7 +1153,7 @@
         </w:tc>
         <w:tc>
           <w:tcPr>
-            <w:tcW w:w="1285" w:type="dxa"/>
+            <w:tcW w:w="1194" w:type="dxa"/>
             <w:tcBorders>
               <w:top w:val="single" w:sz="4" w:space="0" w:color="000000"/>
               <w:left w:val="single" w:sz="4" w:space="0" w:color="000000"/>
@@ -1405,37 +1405,39 @@
         </w:tc>
         <w:tc>
           <w:tcPr>
-            <w:tcW w:w="1285" w:type="dxa"/>
-            <w:tcBorders>
-              <w:top w:val="single" w:sz="4" w:space="0" w:color="000000"/>
-              <w:left w:val="single" w:sz="4" w:space="0" w:color="000000"/>
-              <w:bottom w:val="single" w:sz="4" w:space="0" w:color="000000"/>
-              <w:right w:val="single" w:sz="4" w:space="0" w:color="000000"/>
-            </w:tcBorders>
-            <w:shd w:val="clear" w:color="000000" w:fill="FFFFFF"/>
-            <w:tcMar>
-              <w:left w:w="108" w:type="dxa"/>
-              <w:right w:w="108" w:type="dxa"/>
-            </w:tcMar>
-          </w:tcPr>
-          <w:p>
-            <w:pPr>
-              <w:spacing w:after="0" w:line="240" w:lineRule="auto"/>
-              <w:jc w:val="center"/>
-              <w:rPr>
-                <w:rFonts w:ascii="Calibri" w:eastAsia="Calibri" w:hAnsi="Calibri" w:cs="Calibri"/>
-                <w:sz w:val="26"/>
-                <w:szCs w:val="26"/>
-              </w:rPr>
-            </w:pPr>
-            <w:r>
-              <w:rPr>
-                <w:rFonts w:ascii="Calibri" w:eastAsia="Calibri" w:hAnsi="Calibri" w:cs="Calibri"/>
-                <w:sz w:val="26"/>
-                <w:szCs w:val="26"/>
-              </w:rPr>
-              <w:t>RRF</w:t>
-            </w:r>
+            <w:tcW w:w="1194" w:type="dxa"/>
+            <w:tcBorders>
+              <w:top w:val="single" w:sz="4" w:space="0" w:color="000000"/>
+              <w:left w:val="single" w:sz="4" w:space="0" w:color="000000"/>
+              <w:bottom w:val="single" w:sz="4" w:space="0" w:color="000000"/>
+              <w:right w:val="single" w:sz="4" w:space="0" w:color="000000"/>
+            </w:tcBorders>
+            <w:shd w:val="clear" w:color="000000" w:fill="FFFFFF"/>
+            <w:tcMar>
+              <w:left w:w="108" w:type="dxa"/>
+              <w:right w:w="108" w:type="dxa"/>
+            </w:tcMar>
+          </w:tcPr>
+          <w:p>
+            <w:pPr>
+              <w:spacing w:after="0" w:line="240" w:lineRule="auto"/>
+              <w:jc w:val="center"/>
+              <w:rPr>
+                <w:rFonts w:ascii="Calibri" w:eastAsia="Calibri" w:hAnsi="Calibri" w:cs="Calibri"/>
+                <w:sz w:val="26"/>
+                <w:szCs w:val="26"/>
+              </w:rPr>
+            </w:pPr>
+            <w:r>
+              <w:rPr>
+                <w:rFonts w:ascii="Calibri" w:eastAsia="Calibri" w:hAnsi="Calibri" w:cs="Calibri"/>
+                <w:sz w:val="26"/>
+                <w:szCs w:val="26"/>
+              </w:rPr>
+              <w:t>RRJ</w:t>
+            </w:r>
+            <w:bookmarkStart w:id="0" w:name="_GoBack"/>
+            <w:bookmarkEnd w:id="0"/>
           </w:p>
         </w:tc>
         <w:tc>
@@ -1480,7 +1482,7 @@
         </w:trPr>
         <w:tc>
           <w:tcPr>
-            <w:tcW w:w="10242" w:type="dxa"/>
+            <w:tcW w:w="10151" w:type="dxa"/>
             <w:gridSpan w:val="7"/>
             <w:tcBorders>
               <w:top w:val="single" w:sz="4" w:space="0" w:color="000000"/>
@@ -1700,17 +1702,24 @@
             <w:r>
               <w:rPr>
                 <w:rFonts w:ascii="Calibri" w:eastAsia="Calibri" w:hAnsi="Calibri" w:cs="Calibri"/>
-                <w:b/>
                 <w:sz w:val="26"/>
                 <w:szCs w:val="26"/>
               </w:rPr>
               <w:t xml:space="preserve">GVHL </w:t>
             </w:r>
-          </w:p>
-        </w:tc>
-        <w:tc>
-          <w:tcPr>
-            <w:tcW w:w="1285" w:type="dxa"/>
+            <w:r>
+              <w:rPr>
+                <w:rFonts w:ascii="Calibri" w:eastAsia="Calibri" w:hAnsi="Calibri" w:cs="Calibri"/>
+                <w:sz w:val="26"/>
+                <w:szCs w:val="26"/>
+              </w:rPr>
+              <w:t>169</w:t>
+            </w:r>
+          </w:p>
+        </w:tc>
+        <w:tc>
+          <w:tcPr>
+            <w:tcW w:w="1194" w:type="dxa"/>
             <w:tcBorders>
               <w:top w:val="single" w:sz="4" w:space="0" w:color="000000"/>
               <w:left w:val="single" w:sz="4" w:space="0" w:color="000000"/>
@@ -1736,7 +1745,6 @@
             <w:r>
               <w:rPr>
                 <w:rFonts w:ascii="Calibri" w:eastAsia="Calibri" w:hAnsi="Calibri" w:cs="Calibri"/>
-                <w:b/>
                 <w:sz w:val="26"/>
                 <w:szCs w:val="26"/>
               </w:rPr>
@@ -1993,7 +2001,7 @@
         </w:tc>
         <w:tc>
           <w:tcPr>
-            <w:tcW w:w="1285" w:type="dxa"/>
+            <w:tcW w:w="1194" w:type="dxa"/>
             <w:tcBorders>
               <w:top w:val="single" w:sz="4" w:space="0" w:color="000000"/>
               <w:left w:val="single" w:sz="4" w:space="0" w:color="000000"/>
@@ -2250,7 +2258,7 @@
         </w:tc>
         <w:tc>
           <w:tcPr>
-            <w:tcW w:w="1285" w:type="dxa"/>
+            <w:tcW w:w="1194" w:type="dxa"/>
             <w:tcBorders>
               <w:top w:val="single" w:sz="4" w:space="0" w:color="000000"/>
               <w:left w:val="single" w:sz="4" w:space="0" w:color="000000"/>
@@ -2507,7 +2515,7 @@
         </w:tc>
         <w:tc>
           <w:tcPr>
-            <w:tcW w:w="1285" w:type="dxa"/>
+            <w:tcW w:w="1194" w:type="dxa"/>
             <w:tcBorders>
               <w:top w:val="single" w:sz="4" w:space="0" w:color="000000"/>
               <w:left w:val="single" w:sz="4" w:space="0" w:color="000000"/>
@@ -2582,7 +2590,7 @@
         </w:trPr>
         <w:tc>
           <w:tcPr>
-            <w:tcW w:w="10242" w:type="dxa"/>
+            <w:tcW w:w="10151" w:type="dxa"/>
             <w:gridSpan w:val="7"/>
             <w:tcBorders>
               <w:top w:val="single" w:sz="4" w:space="0" w:color="000000"/>
@@ -2807,7 +2815,7 @@
         </w:tc>
         <w:tc>
           <w:tcPr>
-            <w:tcW w:w="1285" w:type="dxa"/>
+            <w:tcW w:w="1194" w:type="dxa"/>
             <w:tcBorders>
               <w:top w:val="single" w:sz="4" w:space="0" w:color="000000"/>
               <w:left w:val="single" w:sz="4" w:space="0" w:color="000000"/>
@@ -2882,7 +2890,7 @@
         </w:trPr>
         <w:tc>
           <w:tcPr>
-            <w:tcW w:w="10242" w:type="dxa"/>
+            <w:tcW w:w="10151" w:type="dxa"/>
             <w:gridSpan w:val="7"/>
             <w:tcBorders>
               <w:top w:val="single" w:sz="4" w:space="0" w:color="000000"/>
@@ -3080,7 +3088,7 @@
                 <w:sz w:val="26"/>
                 <w:szCs w:val="26"/>
               </w:rPr>
-              <w:t>FD09</w:t>
+              <w:t>ABN4</w:t>
             </w:r>
           </w:p>
         </w:tc>
@@ -3114,7 +3122,7 @@
         </w:tc>
         <w:tc>
           <w:tcPr>
-            <w:tcW w:w="1285" w:type="dxa"/>
+            <w:tcW w:w="1194" w:type="dxa"/>
             <w:tcBorders>
               <w:top w:val="single" w:sz="4" w:space="0" w:color="000000"/>
               <w:left w:val="single" w:sz="4" w:space="0" w:color="000000"/>
@@ -3316,10 +3324,11 @@
             <w:r>
               <w:rPr>
                 <w:rFonts w:ascii="Calibri" w:eastAsia="Calibri" w:hAnsi="Calibri" w:cs="Calibri"/>
-                <w:sz w:val="26"/>
-                <w:szCs w:val="26"/>
-              </w:rPr>
-              <w:t>SF (SPCL)</w:t>
+                <w:b/>
+                <w:sz w:val="26"/>
+                <w:szCs w:val="26"/>
+              </w:rPr>
+              <w:t>NA</w:t>
             </w:r>
           </w:p>
         </w:tc>
@@ -3352,7 +3361,7 @@
         </w:tc>
         <w:tc>
           <w:tcPr>
-            <w:tcW w:w="1285" w:type="dxa"/>
+            <w:tcW w:w="1194" w:type="dxa"/>
             <w:tcBorders>
               <w:top w:val="single" w:sz="4" w:space="0" w:color="000000"/>
               <w:left w:val="single" w:sz="4" w:space="0" w:color="000000"/>
@@ -3514,7 +3523,15 @@
                 <w:sz w:val="26"/>
                 <w:szCs w:val="26"/>
               </w:rPr>
-              <w:t>11:05</w:t>
+              <w:t>11:0</w:t>
+            </w:r>
+            <w:r>
+              <w:rPr>
+                <w:rFonts w:ascii="Calibri" w:eastAsia="Calibri" w:hAnsi="Calibri" w:cs="Calibri"/>
+                <w:sz w:val="26"/>
+                <w:szCs w:val="26"/>
+              </w:rPr>
+              <w:t>0</w:t>
             </w:r>
           </w:p>
         </w:tc>
@@ -3549,10 +3566,8 @@
                 <w:sz w:val="26"/>
                 <w:szCs w:val="26"/>
               </w:rPr>
-              <w:t>DVDR</w:t>
-            </w:r>
-            <w:bookmarkStart w:id="0" w:name="_GoBack"/>
-            <w:bookmarkEnd w:id="0"/>
+              <w:t>ABN8</w:t>
+            </w:r>
           </w:p>
         </w:tc>
         <w:tc>
@@ -3585,7 +3600,7 @@
         </w:tc>
         <w:tc>
           <w:tcPr>
-            <w:tcW w:w="1285" w:type="dxa"/>
+            <w:tcW w:w="1194" w:type="dxa"/>
             <w:tcBorders>
               <w:top w:val="single" w:sz="4" w:space="0" w:color="000000"/>
               <w:left w:val="single" w:sz="4" w:space="0" w:color="000000"/>
@@ -3747,7 +3762,7 @@
                 <w:sz w:val="26"/>
                 <w:szCs w:val="26"/>
               </w:rPr>
-              <w:t>11:00</w:t>
+              <w:t>11:05</w:t>
             </w:r>
           </w:p>
         </w:tc>
@@ -3779,10 +3794,11 @@
             <w:r>
               <w:rPr>
                 <w:rFonts w:ascii="Calibri" w:eastAsia="Calibri" w:hAnsi="Calibri" w:cs="Calibri"/>
-                <w:sz w:val="26"/>
-                <w:szCs w:val="26"/>
-              </w:rPr>
-              <w:t>DEFOS</w:t>
+                <w:b/>
+                <w:sz w:val="26"/>
+                <w:szCs w:val="26"/>
+              </w:rPr>
+              <w:t>NA</w:t>
             </w:r>
           </w:p>
         </w:tc>
@@ -3815,7 +3831,7 @@
         </w:tc>
         <w:tc>
           <w:tcPr>
-            <w:tcW w:w="1285" w:type="dxa"/>
+            <w:tcW w:w="1194" w:type="dxa"/>
             <w:tcBorders>
               <w:top w:val="single" w:sz="4" w:space="0" w:color="000000"/>
               <w:left w:val="single" w:sz="4" w:space="0" w:color="000000"/>
@@ -4010,6 +4026,15 @@
                 <w:szCs w:val="26"/>
               </w:rPr>
             </w:pPr>
+            <w:r>
+              <w:rPr>
+                <w:rFonts w:ascii="Calibri" w:eastAsia="Calibri" w:hAnsi="Calibri" w:cs="Calibri"/>
+                <w:b/>
+                <w:sz w:val="26"/>
+                <w:szCs w:val="26"/>
+              </w:rPr>
+              <w:t>NA</w:t>
+            </w:r>
           </w:p>
         </w:tc>
         <w:tc>
@@ -4041,7 +4066,7 @@
         </w:tc>
         <w:tc>
           <w:tcPr>
-            <w:tcW w:w="1285" w:type="dxa"/>
+            <w:tcW w:w="1194" w:type="dxa"/>
             <w:tcBorders>
               <w:top w:val="single" w:sz="4" w:space="0" w:color="000000"/>
               <w:left w:val="single" w:sz="4" w:space="0" w:color="000000"/>
@@ -4100,7 +4125,7 @@
         </w:trPr>
         <w:tc>
           <w:tcPr>
-            <w:tcW w:w="10242" w:type="dxa"/>
+            <w:tcW w:w="10151" w:type="dxa"/>
             <w:gridSpan w:val="7"/>
             <w:tcBorders>
               <w:top w:val="single" w:sz="4" w:space="0" w:color="000000"/>
@@ -4324,7 +4349,7 @@
         </w:tc>
         <w:tc>
           <w:tcPr>
-            <w:tcW w:w="1285" w:type="dxa"/>
+            <w:tcW w:w="1194" w:type="dxa"/>
             <w:tcBorders>
               <w:top w:val="single" w:sz="4" w:space="0" w:color="000000"/>
               <w:left w:val="single" w:sz="4" w:space="0" w:color="000000"/>
@@ -4517,7 +4542,7 @@
                 <w:sz w:val="26"/>
                 <w:szCs w:val="26"/>
               </w:rPr>
-              <w:t>FPSO2</w:t>
+              <w:t>SGAV</w:t>
             </w:r>
           </w:p>
         </w:tc>
@@ -4550,7 +4575,7 @@
         </w:tc>
         <w:tc>
           <w:tcPr>
-            <w:tcW w:w="1285" w:type="dxa"/>
+            <w:tcW w:w="1194" w:type="dxa"/>
             <w:tcBorders>
               <w:top w:val="single" w:sz="4" w:space="0" w:color="000000"/>
               <w:left w:val="single" w:sz="4" w:space="0" w:color="000000"/>
@@ -4778,7 +4803,7 @@
         </w:tc>
         <w:tc>
           <w:tcPr>
-            <w:tcW w:w="1285" w:type="dxa"/>
+            <w:tcW w:w="1194" w:type="dxa"/>
             <w:tcBorders>
               <w:top w:val="single" w:sz="4" w:space="0" w:color="000000"/>
               <w:left w:val="single" w:sz="4" w:space="0" w:color="000000"/>
@@ -4972,7 +4997,7 @@
                 <w:sz w:val="26"/>
                 <w:szCs w:val="26"/>
               </w:rPr>
-              <w:t>SMRT</w:t>
+              <w:t>PANNA</w:t>
             </w:r>
           </w:p>
         </w:tc>
@@ -5005,7 +5030,7 @@
         </w:tc>
         <w:tc>
           <w:tcPr>
-            <w:tcW w:w="1285" w:type="dxa"/>
+            <w:tcW w:w="1194" w:type="dxa"/>
             <w:tcBorders>
               <w:top w:val="single" w:sz="4" w:space="0" w:color="000000"/>
               <w:left w:val="single" w:sz="4" w:space="0" w:color="000000"/>
@@ -5200,6 +5225,15 @@
                 <w:szCs w:val="26"/>
               </w:rPr>
             </w:pPr>
+            <w:r>
+              <w:rPr>
+                <w:rFonts w:ascii="Calibri" w:eastAsia="Calibri" w:hAnsi="Calibri" w:cs="Calibri"/>
+                <w:b/>
+                <w:sz w:val="26"/>
+                <w:szCs w:val="26"/>
+              </w:rPr>
+              <w:t>NA</w:t>
+            </w:r>
           </w:p>
         </w:tc>
         <w:tc>
@@ -5231,7 +5265,7 @@
         </w:tc>
         <w:tc>
           <w:tcPr>
-            <w:tcW w:w="1285" w:type="dxa"/>
+            <w:tcW w:w="1194" w:type="dxa"/>
             <w:tcBorders>
               <w:top w:val="single" w:sz="4" w:space="0" w:color="000000"/>
               <w:left w:val="single" w:sz="4" w:space="0" w:color="000000"/>
@@ -5290,7 +5324,7 @@
         </w:trPr>
         <w:tc>
           <w:tcPr>
-            <w:tcW w:w="10242" w:type="dxa"/>
+            <w:tcW w:w="10151" w:type="dxa"/>
             <w:gridSpan w:val="7"/>
             <w:tcBorders>
               <w:top w:val="single" w:sz="4" w:space="0" w:color="000000"/>
@@ -5480,7 +5514,7 @@
                 <w:sz w:val="26"/>
                 <w:szCs w:val="26"/>
               </w:rPr>
-              <w:t>SRAT</w:t>
+              <w:t>AS1</w:t>
             </w:r>
           </w:p>
         </w:tc>
@@ -5513,37 +5547,29 @@
         </w:tc>
         <w:tc>
           <w:tcPr>
-            <w:tcW w:w="1285" w:type="dxa"/>
-            <w:tcBorders>
-              <w:top w:val="single" w:sz="4" w:space="0" w:color="000000"/>
-              <w:left w:val="single" w:sz="4" w:space="0" w:color="000000"/>
-              <w:bottom w:val="single" w:sz="4" w:space="0" w:color="000000"/>
-              <w:right w:val="single" w:sz="4" w:space="0" w:color="000000"/>
-            </w:tcBorders>
-            <w:shd w:val="clear" w:color="000000" w:fill="FFFFFF"/>
-            <w:tcMar>
-              <w:left w:w="108" w:type="dxa"/>
-              <w:right w:w="108" w:type="dxa"/>
-            </w:tcMar>
-          </w:tcPr>
-          <w:p>
-            <w:pPr>
-              <w:spacing w:after="0" w:line="240" w:lineRule="auto"/>
-              <w:jc w:val="center"/>
-              <w:rPr>
-                <w:rFonts w:ascii="Calibri" w:eastAsia="Calibri" w:hAnsi="Calibri" w:cs="Calibri"/>
-                <w:sz w:val="26"/>
-                <w:szCs w:val="26"/>
-              </w:rPr>
-            </w:pPr>
-            <w:r>
-              <w:rPr>
-                <w:rFonts w:ascii="Calibri" w:eastAsia="Calibri" w:hAnsi="Calibri" w:cs="Calibri"/>
-                <w:sz w:val="26"/>
-                <w:szCs w:val="26"/>
-              </w:rPr>
-              <w:t>HLU</w:t>
-            </w:r>
+            <w:tcW w:w="1194" w:type="dxa"/>
+            <w:tcBorders>
+              <w:top w:val="single" w:sz="4" w:space="0" w:color="000000"/>
+              <w:left w:val="single" w:sz="4" w:space="0" w:color="000000"/>
+              <w:bottom w:val="single" w:sz="4" w:space="0" w:color="000000"/>
+              <w:right w:val="single" w:sz="4" w:space="0" w:color="000000"/>
+            </w:tcBorders>
+            <w:shd w:val="clear" w:color="000000" w:fill="FFFFFF"/>
+            <w:tcMar>
+              <w:left w:w="108" w:type="dxa"/>
+              <w:right w:w="108" w:type="dxa"/>
+            </w:tcMar>
+          </w:tcPr>
+          <w:p>
+            <w:pPr>
+              <w:spacing w:after="0" w:line="240" w:lineRule="auto"/>
+              <w:jc w:val="center"/>
+              <w:rPr>
+                <w:rFonts w:ascii="Calibri" w:eastAsia="Calibri" w:hAnsi="Calibri" w:cs="Calibri"/>
+                <w:sz w:val="26"/>
+                <w:szCs w:val="26"/>
+              </w:rPr>
+            </w:pPr>
           </w:p>
         </w:tc>
         <w:tc>
@@ -5715,7 +5741,7 @@
                 <w:sz w:val="26"/>
                 <w:szCs w:val="26"/>
               </w:rPr>
-              <w:t>SUDA</w:t>
+              <w:t>VND1</w:t>
             </w:r>
           </w:p>
         </w:tc>
@@ -5748,37 +5774,29 @@
         </w:tc>
         <w:tc>
           <w:tcPr>
-            <w:tcW w:w="1285" w:type="dxa"/>
-            <w:tcBorders>
-              <w:top w:val="single" w:sz="4" w:space="0" w:color="000000"/>
-              <w:left w:val="single" w:sz="4" w:space="0" w:color="000000"/>
-              <w:bottom w:val="single" w:sz="4" w:space="0" w:color="000000"/>
-              <w:right w:val="single" w:sz="4" w:space="0" w:color="000000"/>
-            </w:tcBorders>
-            <w:shd w:val="clear" w:color="000000" w:fill="FFFFFF"/>
-            <w:tcMar>
-              <w:left w:w="108" w:type="dxa"/>
-              <w:right w:w="108" w:type="dxa"/>
-            </w:tcMar>
-          </w:tcPr>
-          <w:p>
-            <w:pPr>
-              <w:spacing w:after="0" w:line="240" w:lineRule="auto"/>
-              <w:jc w:val="center"/>
-              <w:rPr>
-                <w:rFonts w:ascii="Calibri" w:eastAsia="Calibri" w:hAnsi="Calibri" w:cs="Calibri"/>
-                <w:sz w:val="26"/>
-                <w:szCs w:val="26"/>
-              </w:rPr>
-            </w:pPr>
-            <w:r>
-              <w:rPr>
-                <w:rFonts w:ascii="Calibri" w:eastAsia="Calibri" w:hAnsi="Calibri" w:cs="Calibri"/>
-                <w:sz w:val="26"/>
-                <w:szCs w:val="26"/>
-              </w:rPr>
-              <w:t>HLH</w:t>
-            </w:r>
+            <w:tcW w:w="1194" w:type="dxa"/>
+            <w:tcBorders>
+              <w:top w:val="single" w:sz="4" w:space="0" w:color="000000"/>
+              <w:left w:val="single" w:sz="4" w:space="0" w:color="000000"/>
+              <w:bottom w:val="single" w:sz="4" w:space="0" w:color="000000"/>
+              <w:right w:val="single" w:sz="4" w:space="0" w:color="000000"/>
+            </w:tcBorders>
+            <w:shd w:val="clear" w:color="000000" w:fill="FFFFFF"/>
+            <w:tcMar>
+              <w:left w:w="108" w:type="dxa"/>
+              <w:right w:w="108" w:type="dxa"/>
+            </w:tcMar>
+          </w:tcPr>
+          <w:p>
+            <w:pPr>
+              <w:spacing w:after="0" w:line="240" w:lineRule="auto"/>
+              <w:jc w:val="center"/>
+              <w:rPr>
+                <w:rFonts w:ascii="Calibri" w:eastAsia="Calibri" w:hAnsi="Calibri" w:cs="Calibri"/>
+                <w:sz w:val="26"/>
+                <w:szCs w:val="26"/>
+              </w:rPr>
+            </w:pPr>
           </w:p>
         </w:tc>
         <w:tc>
@@ -5950,7 +5968,7 @@
                 <w:sz w:val="26"/>
                 <w:szCs w:val="26"/>
               </w:rPr>
-              <w:t>DVDR</w:t>
+              <w:t>JTAN</w:t>
             </w:r>
           </w:p>
         </w:tc>
@@ -5983,37 +6001,29 @@
         </w:tc>
         <w:tc>
           <w:tcPr>
-            <w:tcW w:w="1285" w:type="dxa"/>
-            <w:tcBorders>
-              <w:top w:val="single" w:sz="4" w:space="0" w:color="000000"/>
-              <w:left w:val="single" w:sz="4" w:space="0" w:color="000000"/>
-              <w:bottom w:val="single" w:sz="4" w:space="0" w:color="000000"/>
-              <w:right w:val="single" w:sz="4" w:space="0" w:color="000000"/>
-            </w:tcBorders>
-            <w:shd w:val="clear" w:color="000000" w:fill="FFFFFF"/>
-            <w:tcMar>
-              <w:left w:w="108" w:type="dxa"/>
-              <w:right w:w="108" w:type="dxa"/>
-            </w:tcMar>
-          </w:tcPr>
-          <w:p>
-            <w:pPr>
-              <w:spacing w:after="0" w:line="240" w:lineRule="auto"/>
-              <w:jc w:val="center"/>
-              <w:rPr>
-                <w:rFonts w:ascii="Calibri" w:eastAsia="Calibri" w:hAnsi="Calibri" w:cs="Calibri"/>
-                <w:sz w:val="26"/>
-                <w:szCs w:val="26"/>
-              </w:rPr>
-            </w:pPr>
-            <w:r>
-              <w:rPr>
-                <w:rFonts w:ascii="Calibri" w:eastAsia="Calibri" w:hAnsi="Calibri" w:cs="Calibri"/>
-                <w:sz w:val="26"/>
-                <w:szCs w:val="26"/>
-              </w:rPr>
-              <w:t>HNB</w:t>
-            </w:r>
+            <w:tcW w:w="1194" w:type="dxa"/>
+            <w:tcBorders>
+              <w:top w:val="single" w:sz="4" w:space="0" w:color="000000"/>
+              <w:left w:val="single" w:sz="4" w:space="0" w:color="000000"/>
+              <w:bottom w:val="single" w:sz="4" w:space="0" w:color="000000"/>
+              <w:right w:val="single" w:sz="4" w:space="0" w:color="000000"/>
+            </w:tcBorders>
+            <w:shd w:val="clear" w:color="000000" w:fill="FFFFFF"/>
+            <w:tcMar>
+              <w:left w:w="108" w:type="dxa"/>
+              <w:right w:w="108" w:type="dxa"/>
+            </w:tcMar>
+          </w:tcPr>
+          <w:p>
+            <w:pPr>
+              <w:spacing w:after="0" w:line="240" w:lineRule="auto"/>
+              <w:jc w:val="center"/>
+              <w:rPr>
+                <w:rFonts w:ascii="Calibri" w:eastAsia="Calibri" w:hAnsi="Calibri" w:cs="Calibri"/>
+                <w:sz w:val="26"/>
+                <w:szCs w:val="26"/>
+              </w:rPr>
+            </w:pPr>
           </w:p>
         </w:tc>
         <w:tc>
@@ -6185,7 +6195,7 @@
                 <w:sz w:val="26"/>
                 <w:szCs w:val="26"/>
               </w:rPr>
-              <w:t>DFOS</w:t>
+              <w:t>AD11</w:t>
             </w:r>
           </w:p>
         </w:tc>
@@ -6218,37 +6228,29 @@
         </w:tc>
         <w:tc>
           <w:tcPr>
-            <w:tcW w:w="1285" w:type="dxa"/>
-            <w:tcBorders>
-              <w:top w:val="single" w:sz="4" w:space="0" w:color="000000"/>
-              <w:left w:val="single" w:sz="4" w:space="0" w:color="000000"/>
-              <w:bottom w:val="single" w:sz="4" w:space="0" w:color="000000"/>
-              <w:right w:val="single" w:sz="4" w:space="0" w:color="000000"/>
-            </w:tcBorders>
-            <w:shd w:val="clear" w:color="000000" w:fill="FFFFFF"/>
-            <w:tcMar>
-              <w:left w:w="108" w:type="dxa"/>
-              <w:right w:w="108" w:type="dxa"/>
-            </w:tcMar>
-          </w:tcPr>
-          <w:p>
-            <w:pPr>
-              <w:spacing w:after="0" w:line="240" w:lineRule="auto"/>
-              <w:jc w:val="center"/>
-              <w:rPr>
-                <w:rFonts w:ascii="Calibri" w:eastAsia="Calibri" w:hAnsi="Calibri" w:cs="Calibri"/>
-                <w:sz w:val="26"/>
-                <w:szCs w:val="26"/>
-              </w:rPr>
-            </w:pPr>
-            <w:r>
-              <w:rPr>
-                <w:rFonts w:ascii="Calibri" w:eastAsia="Calibri" w:hAnsi="Calibri" w:cs="Calibri"/>
-                <w:sz w:val="26"/>
-                <w:szCs w:val="26"/>
-              </w:rPr>
-              <w:t>HLU</w:t>
-            </w:r>
+            <w:tcW w:w="1194" w:type="dxa"/>
+            <w:tcBorders>
+              <w:top w:val="single" w:sz="4" w:space="0" w:color="000000"/>
+              <w:left w:val="single" w:sz="4" w:space="0" w:color="000000"/>
+              <w:bottom w:val="single" w:sz="4" w:space="0" w:color="000000"/>
+              <w:right w:val="single" w:sz="4" w:space="0" w:color="000000"/>
+            </w:tcBorders>
+            <w:shd w:val="clear" w:color="000000" w:fill="FFFFFF"/>
+            <w:tcMar>
+              <w:left w:w="108" w:type="dxa"/>
+              <w:right w:w="108" w:type="dxa"/>
+            </w:tcMar>
+          </w:tcPr>
+          <w:p>
+            <w:pPr>
+              <w:spacing w:after="0" w:line="240" w:lineRule="auto"/>
+              <w:jc w:val="center"/>
+              <w:rPr>
+                <w:rFonts w:ascii="Calibri" w:eastAsia="Calibri" w:hAnsi="Calibri" w:cs="Calibri"/>
+                <w:sz w:val="26"/>
+                <w:szCs w:val="26"/>
+              </w:rPr>
+            </w:pPr>
           </w:p>
         </w:tc>
         <w:tc>
@@ -6420,7 +6422,7 @@
                 <w:sz w:val="26"/>
                 <w:szCs w:val="26"/>
               </w:rPr>
-              <w:t>DISC1</w:t>
+              <w:t>CHTR</w:t>
             </w:r>
           </w:p>
         </w:tc>
@@ -6453,37 +6455,29 @@
         </w:tc>
         <w:tc>
           <w:tcPr>
-            <w:tcW w:w="1285" w:type="dxa"/>
-            <w:tcBorders>
-              <w:top w:val="single" w:sz="4" w:space="0" w:color="000000"/>
-              <w:left w:val="single" w:sz="4" w:space="0" w:color="000000"/>
-              <w:bottom w:val="single" w:sz="4" w:space="0" w:color="000000"/>
-              <w:right w:val="single" w:sz="4" w:space="0" w:color="000000"/>
-            </w:tcBorders>
-            <w:shd w:val="clear" w:color="000000" w:fill="FFFFFF"/>
-            <w:tcMar>
-              <w:left w:w="108" w:type="dxa"/>
-              <w:right w:w="108" w:type="dxa"/>
-            </w:tcMar>
-          </w:tcPr>
-          <w:p>
-            <w:pPr>
-              <w:spacing w:after="0" w:line="240" w:lineRule="auto"/>
-              <w:jc w:val="center"/>
-              <w:rPr>
-                <w:rFonts w:ascii="Calibri" w:eastAsia="Calibri" w:hAnsi="Calibri" w:cs="Calibri"/>
-                <w:sz w:val="26"/>
-                <w:szCs w:val="26"/>
-              </w:rPr>
-            </w:pPr>
-            <w:r>
-              <w:rPr>
-                <w:rFonts w:ascii="Calibri" w:eastAsia="Calibri" w:hAnsi="Calibri" w:cs="Calibri"/>
-                <w:sz w:val="26"/>
-                <w:szCs w:val="26"/>
-              </w:rPr>
-              <w:t>HLH</w:t>
-            </w:r>
+            <w:tcW w:w="1194" w:type="dxa"/>
+            <w:tcBorders>
+              <w:top w:val="single" w:sz="4" w:space="0" w:color="000000"/>
+              <w:left w:val="single" w:sz="4" w:space="0" w:color="000000"/>
+              <w:bottom w:val="single" w:sz="4" w:space="0" w:color="000000"/>
+              <w:right w:val="single" w:sz="4" w:space="0" w:color="000000"/>
+            </w:tcBorders>
+            <w:shd w:val="clear" w:color="000000" w:fill="FFFFFF"/>
+            <w:tcMar>
+              <w:left w:w="108" w:type="dxa"/>
+              <w:right w:w="108" w:type="dxa"/>
+            </w:tcMar>
+          </w:tcPr>
+          <w:p>
+            <w:pPr>
+              <w:spacing w:after="0" w:line="240" w:lineRule="auto"/>
+              <w:jc w:val="center"/>
+              <w:rPr>
+                <w:rFonts w:ascii="Calibri" w:eastAsia="Calibri" w:hAnsi="Calibri" w:cs="Calibri"/>
+                <w:sz w:val="26"/>
+                <w:szCs w:val="26"/>
+              </w:rPr>
+            </w:pPr>
           </w:p>
         </w:tc>
         <w:tc>
@@ -6655,7 +6649,7 @@
                 <w:sz w:val="26"/>
                 <w:szCs w:val="26"/>
               </w:rPr>
-              <w:t>FD09</w:t>
+              <w:t>VND2</w:t>
             </w:r>
           </w:p>
         </w:tc>
@@ -6688,37 +6682,29 @@
         </w:tc>
         <w:tc>
           <w:tcPr>
-            <w:tcW w:w="1285" w:type="dxa"/>
-            <w:tcBorders>
-              <w:top w:val="single" w:sz="4" w:space="0" w:color="000000"/>
-              <w:left w:val="single" w:sz="4" w:space="0" w:color="000000"/>
-              <w:bottom w:val="single" w:sz="4" w:space="0" w:color="000000"/>
-              <w:right w:val="single" w:sz="4" w:space="0" w:color="000000"/>
-            </w:tcBorders>
-            <w:shd w:val="clear" w:color="000000" w:fill="FFFFFF"/>
-            <w:tcMar>
-              <w:left w:w="108" w:type="dxa"/>
-              <w:right w:w="108" w:type="dxa"/>
-            </w:tcMar>
-          </w:tcPr>
-          <w:p>
-            <w:pPr>
-              <w:spacing w:after="0" w:line="240" w:lineRule="auto"/>
-              <w:jc w:val="center"/>
-              <w:rPr>
-                <w:rFonts w:ascii="Calibri" w:eastAsia="Calibri" w:hAnsi="Calibri" w:cs="Calibri"/>
-                <w:sz w:val="26"/>
-                <w:szCs w:val="26"/>
-              </w:rPr>
-            </w:pPr>
-            <w:r>
-              <w:rPr>
-                <w:rFonts w:ascii="Calibri" w:eastAsia="Calibri" w:hAnsi="Calibri" w:cs="Calibri"/>
-                <w:sz w:val="26"/>
-                <w:szCs w:val="26"/>
-              </w:rPr>
-              <w:t>HNB</w:t>
-            </w:r>
+            <w:tcW w:w="1194" w:type="dxa"/>
+            <w:tcBorders>
+              <w:top w:val="single" w:sz="4" w:space="0" w:color="000000"/>
+              <w:left w:val="single" w:sz="4" w:space="0" w:color="000000"/>
+              <w:bottom w:val="single" w:sz="4" w:space="0" w:color="000000"/>
+              <w:right w:val="single" w:sz="4" w:space="0" w:color="000000"/>
+            </w:tcBorders>
+            <w:shd w:val="clear" w:color="000000" w:fill="FFFFFF"/>
+            <w:tcMar>
+              <w:left w:w="108" w:type="dxa"/>
+              <w:right w:w="108" w:type="dxa"/>
+            </w:tcMar>
+          </w:tcPr>
+          <w:p>
+            <w:pPr>
+              <w:spacing w:after="0" w:line="240" w:lineRule="auto"/>
+              <w:jc w:val="center"/>
+              <w:rPr>
+                <w:rFonts w:ascii="Calibri" w:eastAsia="Calibri" w:hAnsi="Calibri" w:cs="Calibri"/>
+                <w:sz w:val="26"/>
+                <w:szCs w:val="26"/>
+              </w:rPr>
+            </w:pPr>
           </w:p>
         </w:tc>
         <w:tc>
@@ -6755,7 +6741,7 @@
         </w:trPr>
         <w:tc>
           <w:tcPr>
-            <w:tcW w:w="10242" w:type="dxa"/>
+            <w:tcW w:w="10151" w:type="dxa"/>
             <w:gridSpan w:val="7"/>
             <w:tcBorders>
               <w:top w:val="single" w:sz="4" w:space="0" w:color="000000"/>
@@ -6804,16 +6790,6 @@
         </w:tc>
       </w:tr>
     </w:tbl>
-    <w:p>
-      <w:pPr>
-        <w:spacing w:after="0" w:line="240" w:lineRule="auto"/>
-        <w:rPr>
-          <w:rFonts w:ascii="Calibri" w:eastAsia="Calibri" w:hAnsi="Calibri" w:cs="Calibri"/>
-          <w:b/>
-          <w:sz w:val="24"/>
-        </w:rPr>
-      </w:pPr>
-    </w:p>
     <w:p>
       <w:pPr>
         <w:spacing w:after="0" w:line="240" w:lineRule="auto"/>
@@ -7475,6 +7451,14 @@
                 <w:szCs w:val="26"/>
               </w:rPr>
             </w:pPr>
+            <w:r>
+              <w:rPr>
+                <w:rFonts w:ascii="Calibri" w:eastAsia="Calibri" w:hAnsi="Calibri" w:cs="Calibri"/>
+                <w:sz w:val="26"/>
+                <w:szCs w:val="26"/>
+              </w:rPr>
+              <w:t>JIND</w:t>
+            </w:r>
           </w:p>
         </w:tc>
         <w:tc>
@@ -7697,6 +7681,14 @@
                 <w:szCs w:val="26"/>
               </w:rPr>
             </w:pPr>
+            <w:r>
+              <w:rPr>
+                <w:rFonts w:ascii="Calibri" w:eastAsia="Calibri" w:hAnsi="Calibri" w:cs="Calibri"/>
+                <w:sz w:val="26"/>
+                <w:szCs w:val="26"/>
+              </w:rPr>
+              <w:t>TCPP CC+PROD</w:t>
+            </w:r>
           </w:p>
         </w:tc>
         <w:tc>
@@ -8367,7 +8359,12 @@
       </w:pPr>
     </w:p>
     <w:sectPr>
-      <w:headerReference w:type="default" r:id="rId6"/>
+      <w:headerReference w:type="even" r:id="rId6"/>
+      <w:headerReference w:type="default" r:id="rId7"/>
+      <w:footerReference w:type="even" r:id="rId8"/>
+      <w:footerReference w:type="default" r:id="rId9"/>
+      <w:headerReference w:type="first" r:id="rId10"/>
+      <w:footerReference w:type="first" r:id="rId11"/>
       <w:pgSz w:w="11906" w:h="16838"/>
       <w:pgMar w:top="568" w:right="1440" w:bottom="1134" w:left="1276" w:header="708" w:footer="708" w:gutter="0"/>
       <w:cols w:space="708"/>
@@ -8402,6 +8399,36 @@
 </w:endnotes>
 </file>
 
+<file path=word/footer1.xml><?xml version="1.0" encoding="utf-8"?>
+<w:ftr xmlns:wpc="http://schemas.microsoft.com/office/word/2010/wordprocessingCanvas" xmlns:mc="http://schemas.openxmlformats.org/markup-compatibility/2006" xmlns:o="urn:schemas-microsoft-com:office:office" xmlns:r="http://schemas.openxmlformats.org/officeDocument/2006/relationships" xmlns:m="http://schemas.openxmlformats.org/officeDocument/2006/math" xmlns:v="urn:schemas-microsoft-com:vml" xmlns:wp14="http://schemas.microsoft.com/office/word/2010/wordprocessingDrawing" xmlns:wp="http://schemas.openxmlformats.org/drawingml/2006/wordprocessingDrawing" xmlns:w10="urn:schemas-microsoft-com:office:word" xmlns:w="http://schemas.openxmlformats.org/wordprocessingml/2006/main" xmlns:w14="http://schemas.microsoft.com/office/word/2010/wordml" xmlns:w15="http://schemas.microsoft.com/office/word/2012/wordml" xmlns:wpg="http://schemas.microsoft.com/office/word/2010/wordprocessingGroup" xmlns:wpi="http://schemas.microsoft.com/office/word/2010/wordprocessingInk" xmlns:wne="http://schemas.microsoft.com/office/word/2006/wordml" xmlns:wps="http://schemas.microsoft.com/office/word/2010/wordprocessingShape" mc:Ignorable="w14 w15 wp14">
+  <w:p>
+    <w:pPr>
+      <w:pStyle w:val="Footer"/>
+    </w:pPr>
+  </w:p>
+</w:ftr>
+</file>
+
+<file path=word/footer2.xml><?xml version="1.0" encoding="utf-8"?>
+<w:ftr xmlns:wpc="http://schemas.microsoft.com/office/word/2010/wordprocessingCanvas" xmlns:mc="http://schemas.openxmlformats.org/markup-compatibility/2006" xmlns:o="urn:schemas-microsoft-com:office:office" xmlns:r="http://schemas.openxmlformats.org/officeDocument/2006/relationships" xmlns:m="http://schemas.openxmlformats.org/officeDocument/2006/math" xmlns:v="urn:schemas-microsoft-com:vml" xmlns:wp14="http://schemas.microsoft.com/office/word/2010/wordprocessingDrawing" xmlns:wp="http://schemas.openxmlformats.org/drawingml/2006/wordprocessingDrawing" xmlns:w10="urn:schemas-microsoft-com:office:word" xmlns:w="http://schemas.openxmlformats.org/wordprocessingml/2006/main" xmlns:w14="http://schemas.microsoft.com/office/word/2010/wordml" xmlns:w15="http://schemas.microsoft.com/office/word/2012/wordml" xmlns:wpg="http://schemas.microsoft.com/office/word/2010/wordprocessingGroup" xmlns:wpi="http://schemas.microsoft.com/office/word/2010/wordprocessingInk" xmlns:wne="http://schemas.microsoft.com/office/word/2006/wordml" xmlns:wps="http://schemas.microsoft.com/office/word/2010/wordprocessingShape" mc:Ignorable="w14 w15 wp14">
+  <w:p>
+    <w:pPr>
+      <w:pStyle w:val="Footer"/>
+    </w:pPr>
+  </w:p>
+</w:ftr>
+</file>
+
+<file path=word/footer3.xml><?xml version="1.0" encoding="utf-8"?>
+<w:ftr xmlns:wpc="http://schemas.microsoft.com/office/word/2010/wordprocessingCanvas" xmlns:mc="http://schemas.openxmlformats.org/markup-compatibility/2006" xmlns:o="urn:schemas-microsoft-com:office:office" xmlns:r="http://schemas.openxmlformats.org/officeDocument/2006/relationships" xmlns:m="http://schemas.openxmlformats.org/officeDocument/2006/math" xmlns:v="urn:schemas-microsoft-com:vml" xmlns:wp14="http://schemas.microsoft.com/office/word/2010/wordprocessingDrawing" xmlns:wp="http://schemas.openxmlformats.org/drawingml/2006/wordprocessingDrawing" xmlns:w10="urn:schemas-microsoft-com:office:word" xmlns:w="http://schemas.openxmlformats.org/wordprocessingml/2006/main" xmlns:w14="http://schemas.microsoft.com/office/word/2010/wordml" xmlns:w15="http://schemas.microsoft.com/office/word/2012/wordml" xmlns:wpg="http://schemas.microsoft.com/office/word/2010/wordprocessingGroup" xmlns:wpi="http://schemas.microsoft.com/office/word/2010/wordprocessingInk" xmlns:wne="http://schemas.microsoft.com/office/word/2006/wordml" xmlns:wps="http://schemas.microsoft.com/office/word/2010/wordprocessingShape" mc:Ignorable="w14 w15 wp14">
+  <w:p>
+    <w:pPr>
+      <w:pStyle w:val="Footer"/>
+    </w:pPr>
+  </w:p>
+</w:ftr>
+</file>
+
 <file path=word/footnotes.xml><?xml version="1.0" encoding="utf-8"?>
 <w:footnotes xmlns:wpc="http://schemas.microsoft.com/office/word/2010/wordprocessingCanvas" xmlns:mc="http://schemas.openxmlformats.org/markup-compatibility/2006" xmlns:o="urn:schemas-microsoft-com:office:office" xmlns:r="http://schemas.openxmlformats.org/officeDocument/2006/relationships" xmlns:m="http://schemas.openxmlformats.org/officeDocument/2006/math" xmlns:v="urn:schemas-microsoft-com:vml" xmlns:wp14="http://schemas.microsoft.com/office/word/2010/wordprocessingDrawing" xmlns:wp="http://schemas.openxmlformats.org/drawingml/2006/wordprocessingDrawing" xmlns:w10="urn:schemas-microsoft-com:office:word" xmlns:w="http://schemas.openxmlformats.org/wordprocessingml/2006/main" xmlns:w14="http://schemas.microsoft.com/office/word/2010/wordml" xmlns:w15="http://schemas.microsoft.com/office/word/2012/wordml" xmlns:wpg="http://schemas.microsoft.com/office/word/2010/wordprocessingGroup" xmlns:wpi="http://schemas.microsoft.com/office/word/2010/wordprocessingInk" xmlns:wne="http://schemas.microsoft.com/office/word/2006/wordml" xmlns:wps="http://schemas.microsoft.com/office/word/2010/wordprocessingShape" mc:Ignorable="w14 w15 wp14">
   <w:footnote w:type="separator" w:id="-1">
@@ -8432,6 +8459,16 @@
   <w:p>
     <w:pPr>
       <w:pStyle w:val="Header"/>
+    </w:pPr>
+  </w:p>
+</w:hdr>
+</file>
+
+<file path=word/header2.xml><?xml version="1.0" encoding="utf-8"?>
+<w:hdr xmlns:wpc="http://schemas.microsoft.com/office/word/2010/wordprocessingCanvas" xmlns:mc="http://schemas.openxmlformats.org/markup-compatibility/2006" xmlns:o="urn:schemas-microsoft-com:office:office" xmlns:r="http://schemas.openxmlformats.org/officeDocument/2006/relationships" xmlns:m="http://schemas.openxmlformats.org/officeDocument/2006/math" xmlns:v="urn:schemas-microsoft-com:vml" xmlns:wp14="http://schemas.microsoft.com/office/word/2010/wordprocessingDrawing" xmlns:wp="http://schemas.openxmlformats.org/drawingml/2006/wordprocessingDrawing" xmlns:w10="urn:schemas-microsoft-com:office:word" xmlns:w="http://schemas.openxmlformats.org/wordprocessingml/2006/main" xmlns:w14="http://schemas.microsoft.com/office/word/2010/wordml" xmlns:w15="http://schemas.microsoft.com/office/word/2012/wordml" xmlns:wpg="http://schemas.microsoft.com/office/word/2010/wordprocessingGroup" xmlns:wpi="http://schemas.microsoft.com/office/word/2010/wordprocessingInk" xmlns:wne="http://schemas.microsoft.com/office/word/2006/wordml" xmlns:wps="http://schemas.microsoft.com/office/word/2010/wordprocessingShape" mc:Ignorable="w14 w15 wp14">
+  <w:p>
+    <w:pPr>
+      <w:pStyle w:val="Header"/>
       <w:ind w:left="-851"/>
       <w:jc w:val="center"/>
       <w:rPr>
@@ -8444,10 +8481,10 @@
     </w:pPr>
     <w:r>
       <w:object w:dxaOrig="1188" w:dyaOrig="900">
-        <v:rect id="_x0000_i1025" style="width:54.75pt;height:39pt" o:ole="" o:preferrelative="t" stroked="f">
+        <v:rect id="_x0000_i1025" style="width:54.4pt;height:39.35pt" o:ole="" o:preferrelative="t" stroked="f">
           <v:imagedata r:id="rId1" o:title=""/>
         </v:rect>
-        <o:OLEObject Type="Embed" ProgID="StaticMetafile" ShapeID="_x0000_i1025" DrawAspect="Content" ObjectID="_1850649705" r:id="rId2"/>
+        <o:OLEObject Type="Embed" ProgID="StaticMetafile" ShapeID="_x0000_i1025" DrawAspect="Content" ObjectID="_1850734524" r:id="rId2"/>
       </w:object>
     </w:r>
     <w:r>
@@ -8481,7 +8518,7 @@
         <w:sz w:val="26"/>
         <w:szCs w:val="26"/>
       </w:rPr>
-      <w:t>12</w:t>
+      <w:t>13</w:t>
     </w:r>
     <w:r>
       <w:rPr>
@@ -8501,7 +8538,17 @@
         <w:sz w:val="26"/>
         <w:szCs w:val="26"/>
       </w:rPr>
-      <w:t>SATUR</w:t>
+      <w:t>S</w:t>
+    </w:r>
+    <w:r>
+      <w:rPr>
+        <w:rFonts w:ascii="Times New Roman" w:hAnsi="Times New Roman" w:cs="Times New Roman"/>
+        <w:b/>
+        <w:color w:val="000000" w:themeColor="text1"/>
+        <w:sz w:val="26"/>
+        <w:szCs w:val="26"/>
+      </w:rPr>
+      <w:t>UN</w:t>
     </w:r>
     <w:r>
       <w:rPr>
@@ -8524,6 +8571,16 @@
       <w:t>)</w:t>
     </w:r>
   </w:p>
+  <w:p>
+    <w:pPr>
+      <w:pStyle w:val="Header"/>
+    </w:pPr>
+  </w:p>
+</w:hdr>
+</file>
+
+<file path=word/header3.xml><?xml version="1.0" encoding="utf-8"?>
+<w:hdr xmlns:wpc="http://schemas.microsoft.com/office/word/2010/wordprocessingCanvas" xmlns:mc="http://schemas.openxmlformats.org/markup-compatibility/2006" xmlns:o="urn:schemas-microsoft-com:office:office" xmlns:r="http://schemas.openxmlformats.org/officeDocument/2006/relationships" xmlns:m="http://schemas.openxmlformats.org/officeDocument/2006/math" xmlns:v="urn:schemas-microsoft-com:vml" xmlns:wp14="http://schemas.microsoft.com/office/word/2010/wordprocessingDrawing" xmlns:wp="http://schemas.openxmlformats.org/drawingml/2006/wordprocessingDrawing" xmlns:w10="urn:schemas-microsoft-com:office:word" xmlns:w="http://schemas.openxmlformats.org/wordprocessingml/2006/main" xmlns:w14="http://schemas.microsoft.com/office/word/2010/wordml" xmlns:w15="http://schemas.microsoft.com/office/word/2012/wordml" xmlns:wpg="http://schemas.microsoft.com/office/word/2010/wordprocessingGroup" xmlns:wpi="http://schemas.microsoft.com/office/word/2010/wordprocessingInk" xmlns:wne="http://schemas.microsoft.com/office/word/2006/wordml" xmlns:wps="http://schemas.microsoft.com/office/word/2010/wordprocessingShape" mc:Ignorable="w14 w15 wp14">
   <w:p>
     <w:pPr>
       <w:pStyle w:val="Header"/>

</xml_diff>